<commit_message>
Semana 4 al 8 de mayo: Definición de matriz de responsabilidades
</commit_message>
<xml_diff>
--- a/BITACORA.docx
+++ b/BITACORA.docx
@@ -736,7 +736,6 @@
           <w:docPartUnique/>
         </w:docPartObj>
       </w:sdtPr>
-      <w:sdtEndPr/>
       <w:sdtContent>
         <w:p>
           <w:pPr>
@@ -14009,6 +14008,7 @@
                 <w:sz w:val="24"/>
                 <w:szCs w:val="24"/>
               </w:rPr>
+              <w:lastRenderedPageBreak/>
               <w:t xml:space="preserve">experiencia de usuario (UX/UI) </w:t>
             </w:r>
           </w:p>
@@ -14084,6 +14084,7 @@
                 <w:sz w:val="24"/>
                 <w:szCs w:val="24"/>
               </w:rPr>
+              <w:lastRenderedPageBreak/>
               <w:t>Documento con requerimientos</w:t>
             </w:r>
           </w:p>
@@ -15339,6 +15340,7 @@
                 <w:sz w:val="24"/>
                 <w:szCs w:val="24"/>
               </w:rPr>
+              <w:lastRenderedPageBreak/>
               <w:t>Revisión de requisitos</w:t>
             </w:r>
           </w:p>
@@ -15930,8 +15932,2799 @@
         <w:jc w:val="both"/>
         <w:outlineLvl w:val="0"/>
       </w:pPr>
+      <w:r>
+        <w:lastRenderedPageBreak/>
+        <w:t xml:space="preserve">Semana </w:t>
+      </w:r>
+      <w:r>
+        <w:t>del 4 de mayo al 8 de mayo</w:t>
+      </w:r>
+    </w:p>
+    <w:p>
+      <w:r>
+        <w:rPr>
+          <w:b/>
+          <w:bCs/>
+        </w:rPr>
+        <w:t>Objetivo:</w:t>
+      </w:r>
+      <w:r>
+        <w:t xml:space="preserve"> </w:t>
+      </w:r>
+      <w:r>
+        <w:t xml:space="preserve">Definir </w:t>
+      </w:r>
+      <w:r>
+        <w:t>matriz de responsabilidades</w:t>
+      </w:r>
+      <w:r>
+        <w:t>.</w:t>
+      </w:r>
+    </w:p>
+    <w:tbl>
+      <w:tblPr>
+        <w:tblStyle w:val="Tablaconcuadrcula"/>
+        <w:tblW w:w="9634" w:type="dxa"/>
+        <w:jc w:val="center"/>
+        <w:tblBorders>
+          <w:top w:val="single" w:sz="4" w:space="0" w:color="7F7F7F" w:themeColor="text1" w:themeTint="80"/>
+          <w:left w:val="single" w:sz="4" w:space="0" w:color="7F7F7F" w:themeColor="text1" w:themeTint="80"/>
+          <w:bottom w:val="single" w:sz="4" w:space="0" w:color="7F7F7F" w:themeColor="text1" w:themeTint="80"/>
+          <w:right w:val="single" w:sz="4" w:space="0" w:color="7F7F7F" w:themeColor="text1" w:themeTint="80"/>
+          <w:insideH w:val="single" w:sz="4" w:space="0" w:color="7F7F7F" w:themeColor="text1" w:themeTint="80"/>
+        </w:tblBorders>
+        <w:tblCellMar>
+          <w:top w:w="57" w:type="dxa"/>
+          <w:bottom w:w="57" w:type="dxa"/>
+        </w:tblCellMar>
+        <w:tblLook w:val="04A0" w:firstRow="1" w:lastRow="0" w:firstColumn="1" w:lastColumn="0" w:noHBand="0" w:noVBand="1"/>
+      </w:tblPr>
+      <w:tblGrid>
+        <w:gridCol w:w="5098"/>
+        <w:gridCol w:w="4536"/>
+      </w:tblGrid>
+      <w:tr>
+        <w:trPr>
+          <w:trHeight w:val="583"/>
+          <w:jc w:val="center"/>
+        </w:trPr>
+        <w:tc>
+          <w:tcPr>
+            <w:tcW w:w="9634" w:type="dxa"/>
+            <w:gridSpan w:val="2"/>
+            <w:shd w:val="clear" w:color="auto" w:fill="262626" w:themeFill="text1" w:themeFillTint="D9"/>
+            <w:vAlign w:val="center"/>
+          </w:tcPr>
+          <w:p>
+            <w:pPr>
+              <w:pStyle w:val="Ttulo2"/>
+              <w:rPr>
+                <w:rFonts w:ascii="Aptos" w:hAnsi="Aptos"/>
+                <w:b/>
+                <w:bCs/>
+                <w:color w:val="FFFFFF" w:themeColor="background1"/>
+                <w:sz w:val="28"/>
+                <w:szCs w:val="28"/>
+              </w:rPr>
+            </w:pPr>
+            <w:r>
+              <w:rPr>
+                <w:rFonts w:ascii="Aptos" w:hAnsi="Aptos"/>
+                <w:b/>
+                <w:bCs/>
+                <w:color w:val="FFFFFF" w:themeColor="background1"/>
+                <w:sz w:val="28"/>
+                <w:szCs w:val="28"/>
+              </w:rPr>
+              <w:t>Día 1: Definición de Requerimientos</w:t>
+            </w:r>
+          </w:p>
+        </w:tc>
+      </w:tr>
+      <w:tr>
+        <w:trPr>
+          <w:jc w:val="center"/>
+        </w:trPr>
+        <w:tc>
+          <w:tcPr>
+            <w:tcW w:w="9634" w:type="dxa"/>
+            <w:gridSpan w:val="2"/>
+            <w:vAlign w:val="center"/>
+          </w:tcPr>
+          <w:p>
+            <w:pPr>
+              <w:rPr>
+                <w:rFonts w:ascii="Arial" w:hAnsi="Arial" w:cs="Arial"/>
+                <w:sz w:val="24"/>
+                <w:szCs w:val="24"/>
+              </w:rPr>
+            </w:pPr>
+            <w:r>
+              <w:rPr>
+                <w:rFonts w:ascii="Arial" w:hAnsi="Arial" w:cs="Arial"/>
+                <w:b/>
+                <w:bCs/>
+                <w:sz w:val="24"/>
+                <w:szCs w:val="24"/>
+              </w:rPr>
+              <w:t xml:space="preserve">Nombre del Proyecto: </w:t>
+            </w:r>
+            <w:r>
+              <w:rPr>
+                <w:rFonts w:ascii="Arial" w:hAnsi="Arial" w:cs="Arial"/>
+                <w:sz w:val="24"/>
+                <w:szCs w:val="24"/>
+              </w:rPr>
+              <w:t>Portafolio Digital de Arquitecto</w:t>
+            </w:r>
+          </w:p>
+        </w:tc>
+      </w:tr>
+      <w:tr>
+        <w:trPr>
+          <w:jc w:val="center"/>
+        </w:trPr>
+        <w:tc>
+          <w:tcPr>
+            <w:tcW w:w="5098" w:type="dxa"/>
+            <w:vAlign w:val="center"/>
+          </w:tcPr>
+          <w:p>
+            <w:pPr>
+              <w:rPr>
+                <w:rFonts w:ascii="Arial" w:hAnsi="Arial" w:cs="Arial"/>
+                <w:b/>
+                <w:bCs/>
+                <w:sz w:val="24"/>
+                <w:szCs w:val="24"/>
+              </w:rPr>
+            </w:pPr>
+            <w:r>
+              <w:rPr>
+                <w:rFonts w:ascii="Arial" w:hAnsi="Arial" w:cs="Arial"/>
+                <w:b/>
+                <w:bCs/>
+                <w:sz w:val="24"/>
+                <w:szCs w:val="24"/>
+              </w:rPr>
+              <w:t xml:space="preserve">Equipo No.: </w:t>
+            </w:r>
+            <w:r>
+              <w:rPr>
+                <w:rFonts w:ascii="Arial" w:hAnsi="Arial" w:cs="Arial"/>
+                <w:b/>
+                <w:bCs/>
+                <w:sz w:val="24"/>
+                <w:szCs w:val="24"/>
+              </w:rPr>
+              <w:tab/>
+            </w:r>
+            <w:r>
+              <w:rPr>
+                <w:rFonts w:ascii="Arial" w:hAnsi="Arial" w:cs="Arial"/>
+                <w:sz w:val="24"/>
+                <w:szCs w:val="24"/>
+              </w:rPr>
+              <w:t>6</w:t>
+            </w:r>
+          </w:p>
+        </w:tc>
+        <w:tc>
+          <w:tcPr>
+            <w:tcW w:w="4536" w:type="dxa"/>
+            <w:vAlign w:val="center"/>
+          </w:tcPr>
+          <w:p>
+            <w:pPr>
+              <w:rPr>
+                <w:rFonts w:ascii="Arial" w:hAnsi="Arial" w:cs="Arial"/>
+                <w:b/>
+                <w:bCs/>
+                <w:sz w:val="24"/>
+                <w:szCs w:val="24"/>
+              </w:rPr>
+            </w:pPr>
+            <w:r>
+              <w:rPr>
+                <w:rFonts w:ascii="Arial" w:hAnsi="Arial" w:cs="Arial"/>
+                <w:b/>
+                <w:bCs/>
+                <w:sz w:val="24"/>
+                <w:szCs w:val="24"/>
+              </w:rPr>
+              <w:t>Fecha:</w:t>
+            </w:r>
+            <w:r>
+              <w:rPr>
+                <w:rFonts w:ascii="Arial" w:hAnsi="Arial" w:cs="Arial"/>
+                <w:b/>
+                <w:bCs/>
+                <w:sz w:val="24"/>
+                <w:szCs w:val="24"/>
+              </w:rPr>
+              <w:t xml:space="preserve"> </w:t>
+            </w:r>
+            <w:r>
+              <w:rPr>
+                <w:rFonts w:ascii="Arial" w:hAnsi="Arial" w:cs="Arial"/>
+                <w:sz w:val="24"/>
+                <w:szCs w:val="24"/>
+              </w:rPr>
+              <w:t>0</w:t>
+            </w:r>
+            <w:r>
+              <w:rPr>
+                <w:rFonts w:ascii="Arial" w:hAnsi="Arial" w:cs="Arial"/>
+                <w:sz w:val="24"/>
+                <w:szCs w:val="24"/>
+              </w:rPr>
+              <w:t>1</w:t>
+            </w:r>
+            <w:r>
+              <w:rPr>
+                <w:rFonts w:ascii="Arial" w:hAnsi="Arial" w:cs="Arial"/>
+                <w:sz w:val="24"/>
+                <w:szCs w:val="24"/>
+              </w:rPr>
+              <w:t>/0</w:t>
+            </w:r>
+            <w:r>
+              <w:rPr>
+                <w:rFonts w:ascii="Arial" w:hAnsi="Arial" w:cs="Arial"/>
+                <w:sz w:val="24"/>
+                <w:szCs w:val="24"/>
+              </w:rPr>
+              <w:t>4</w:t>
+            </w:r>
+            <w:r>
+              <w:rPr>
+                <w:rFonts w:ascii="Arial" w:hAnsi="Arial" w:cs="Arial"/>
+                <w:sz w:val="24"/>
+                <w:szCs w:val="24"/>
+              </w:rPr>
+              <w:t>/202</w:t>
+            </w:r>
+            <w:r>
+              <w:rPr>
+                <w:rFonts w:ascii="Arial" w:hAnsi="Arial" w:cs="Arial"/>
+                <w:sz w:val="24"/>
+                <w:szCs w:val="24"/>
+              </w:rPr>
+              <w:t>6</w:t>
+            </w:r>
+          </w:p>
+        </w:tc>
+      </w:tr>
+      <w:tr>
+        <w:trPr>
+          <w:jc w:val="center"/>
+        </w:trPr>
+        <w:tc>
+          <w:tcPr>
+            <w:tcW w:w="5098" w:type="dxa"/>
+            <w:vAlign w:val="center"/>
+          </w:tcPr>
+          <w:p>
+            <w:pPr>
+              <w:rPr>
+                <w:rFonts w:ascii="Arial" w:hAnsi="Arial" w:cs="Arial"/>
+                <w:b/>
+                <w:bCs/>
+                <w:sz w:val="24"/>
+                <w:szCs w:val="24"/>
+              </w:rPr>
+            </w:pPr>
+            <w:r>
+              <w:rPr>
+                <w:rFonts w:ascii="Arial" w:hAnsi="Arial" w:cs="Arial"/>
+                <w:b/>
+                <w:bCs/>
+                <w:sz w:val="24"/>
+                <w:szCs w:val="24"/>
+              </w:rPr>
+              <w:t xml:space="preserve">Número de sesión / Día de trabajo: </w:t>
+            </w:r>
+            <w:r>
+              <w:rPr>
+                <w:rFonts w:ascii="Arial" w:hAnsi="Arial" w:cs="Arial"/>
+                <w:sz w:val="24"/>
+                <w:szCs w:val="24"/>
+              </w:rPr>
+              <w:t>1</w:t>
+            </w:r>
+          </w:p>
+        </w:tc>
+        <w:tc>
+          <w:tcPr>
+            <w:tcW w:w="4536" w:type="dxa"/>
+            <w:vAlign w:val="center"/>
+          </w:tcPr>
+          <w:p>
+            <w:pPr>
+              <w:rPr>
+                <w:rFonts w:ascii="Arial" w:hAnsi="Arial" w:cs="Arial"/>
+                <w:b/>
+                <w:bCs/>
+                <w:sz w:val="24"/>
+                <w:szCs w:val="24"/>
+              </w:rPr>
+            </w:pPr>
+            <w:r>
+              <w:rPr>
+                <w:rFonts w:ascii="Arial" w:hAnsi="Arial" w:cs="Arial"/>
+                <w:b/>
+                <w:bCs/>
+                <w:sz w:val="24"/>
+                <w:szCs w:val="24"/>
+              </w:rPr>
+              <w:t xml:space="preserve">Modalidad: </w:t>
+            </w:r>
+            <w:r>
+              <w:rPr>
+                <w:rFonts w:ascii="Arial" w:hAnsi="Arial" w:cs="Arial"/>
+                <w:sz w:val="24"/>
+                <w:szCs w:val="24"/>
+              </w:rPr>
+              <w:t xml:space="preserve">Presencial / </w:t>
+            </w:r>
+            <w:r>
+              <w:rPr>
+                <w:rFonts w:ascii="Arial" w:hAnsi="Arial" w:cs="Arial"/>
+                <w:sz w:val="24"/>
+                <w:szCs w:val="24"/>
+                <w:shd w:val="clear" w:color="auto" w:fill="F5E4A9" w:themeFill="accent3" w:themeFillTint="66"/>
+              </w:rPr>
+              <w:t>Virtual</w:t>
+            </w:r>
+            <w:r>
+              <w:rPr>
+                <w:rFonts w:ascii="Arial" w:hAnsi="Arial" w:cs="Arial"/>
+                <w:sz w:val="24"/>
+                <w:szCs w:val="24"/>
+              </w:rPr>
+              <w:t xml:space="preserve"> / </w:t>
+            </w:r>
+            <w:r>
+              <w:rPr>
+                <w:rFonts w:ascii="Arial" w:hAnsi="Arial" w:cs="Arial"/>
+                <w:sz w:val="24"/>
+                <w:szCs w:val="24"/>
+                <w:shd w:val="clear" w:color="auto" w:fill="D9D9D9" w:themeFill="background1" w:themeFillShade="D9"/>
+              </w:rPr>
+              <w:t>Mixto</w:t>
+            </w:r>
+          </w:p>
+        </w:tc>
+      </w:tr>
+      <w:tr>
+        <w:trPr>
+          <w:jc w:val="center"/>
+        </w:trPr>
+        <w:tc>
+          <w:tcPr>
+            <w:tcW w:w="9634" w:type="dxa"/>
+            <w:gridSpan w:val="2"/>
+            <w:vAlign w:val="center"/>
+          </w:tcPr>
+          <w:p>
+            <w:pPr>
+              <w:rPr>
+                <w:rFonts w:ascii="Arial" w:hAnsi="Arial" w:cs="Arial"/>
+                <w:b/>
+                <w:bCs/>
+                <w:sz w:val="24"/>
+                <w:szCs w:val="24"/>
+              </w:rPr>
+            </w:pPr>
+            <w:r>
+              <w:rPr>
+                <w:rFonts w:ascii="Arial" w:hAnsi="Arial" w:cs="Arial"/>
+                <w:b/>
+                <w:bCs/>
+                <w:sz w:val="24"/>
+                <w:szCs w:val="24"/>
+              </w:rPr>
+              <w:t>Duración de la sesión:</w:t>
+            </w:r>
+            <w:r>
+              <w:rPr>
+                <w:rFonts w:ascii="Arial" w:hAnsi="Arial" w:cs="Arial"/>
+                <w:b/>
+                <w:bCs/>
+                <w:sz w:val="24"/>
+                <w:szCs w:val="24"/>
+              </w:rPr>
+              <w:t xml:space="preserve"> </w:t>
+            </w:r>
+            <w:r>
+              <w:rPr>
+                <w:rFonts w:ascii="Arial" w:hAnsi="Arial" w:cs="Arial"/>
+                <w:sz w:val="24"/>
+                <w:szCs w:val="24"/>
+              </w:rPr>
+              <w:t xml:space="preserve">1 </w:t>
+            </w:r>
+            <w:proofErr w:type="spellStart"/>
+            <w:r>
+              <w:rPr>
+                <w:rFonts w:ascii="Arial" w:hAnsi="Arial" w:cs="Arial"/>
+                <w:sz w:val="24"/>
+                <w:szCs w:val="24"/>
+              </w:rPr>
+              <w:t>hr</w:t>
+            </w:r>
+            <w:proofErr w:type="spellEnd"/>
+            <w:r>
+              <w:rPr>
+                <w:rFonts w:ascii="Arial" w:hAnsi="Arial" w:cs="Arial"/>
+                <w:sz w:val="24"/>
+                <w:szCs w:val="24"/>
+              </w:rPr>
+              <w:t xml:space="preserve"> 30 minutos</w:t>
+            </w:r>
+          </w:p>
+        </w:tc>
+      </w:tr>
+    </w:tbl>
+    <w:p>
+      <w:pPr>
+        <w:rPr>
+          <w:rFonts w:ascii="Arial" w:hAnsi="Arial" w:cs="Arial"/>
+          <w:sz w:val="24"/>
+          <w:szCs w:val="24"/>
+        </w:rPr>
+      </w:pPr>
+    </w:p>
+    <w:p>
+      <w:pPr>
+        <w:pStyle w:val="titulo1"/>
+        <w:outlineLvl w:val="2"/>
+        <w:rPr>
+          <w:sz w:val="32"/>
+          <w:szCs w:val="72"/>
+        </w:rPr>
+      </w:pPr>
+      <w:r>
+        <w:rPr>
+          <w:sz w:val="32"/>
+          <w:szCs w:val="72"/>
+        </w:rPr>
+        <w:t>Asistencia y Participación</w:t>
+      </w:r>
+    </w:p>
+    <w:tbl>
+      <w:tblPr>
+        <w:tblStyle w:val="Tablaconcuadrcula"/>
+        <w:tblW w:w="10281" w:type="dxa"/>
+        <w:jc w:val="center"/>
+        <w:tblBorders>
+          <w:top w:val="single" w:sz="4" w:space="0" w:color="7F7F7F" w:themeColor="text1" w:themeTint="80"/>
+          <w:left w:val="single" w:sz="4" w:space="0" w:color="7F7F7F" w:themeColor="text1" w:themeTint="80"/>
+          <w:bottom w:val="single" w:sz="4" w:space="0" w:color="7F7F7F" w:themeColor="text1" w:themeTint="80"/>
+          <w:right w:val="single" w:sz="4" w:space="0" w:color="7F7F7F" w:themeColor="text1" w:themeTint="80"/>
+          <w:insideH w:val="single" w:sz="4" w:space="0" w:color="7F7F7F" w:themeColor="text1" w:themeTint="80"/>
+          <w:insideV w:val="single" w:sz="4" w:space="0" w:color="7F7F7F" w:themeColor="text1" w:themeTint="80"/>
+        </w:tblBorders>
+        <w:tblCellMar>
+          <w:top w:w="57" w:type="dxa"/>
+          <w:bottom w:w="57" w:type="dxa"/>
+        </w:tblCellMar>
+        <w:tblLook w:val="04A0" w:firstRow="1" w:lastRow="0" w:firstColumn="1" w:lastColumn="0" w:noHBand="0" w:noVBand="1"/>
+      </w:tblPr>
+      <w:tblGrid>
+        <w:gridCol w:w="1538"/>
+        <w:gridCol w:w="1791"/>
+        <w:gridCol w:w="1563"/>
+        <w:gridCol w:w="3061"/>
+        <w:gridCol w:w="2328"/>
+      </w:tblGrid>
+      <w:tr>
+        <w:trPr>
+          <w:jc w:val="center"/>
+        </w:trPr>
+        <w:tc>
+          <w:tcPr>
+            <w:tcW w:w="1538" w:type="dxa"/>
+            <w:shd w:val="clear" w:color="auto" w:fill="262626" w:themeFill="text1" w:themeFillTint="D9"/>
+            <w:vAlign w:val="center"/>
+          </w:tcPr>
+          <w:p>
+            <w:pPr>
+              <w:jc w:val="center"/>
+              <w:rPr>
+                <w:rFonts w:ascii="Arial" w:hAnsi="Arial" w:cs="Arial"/>
+                <w:b/>
+                <w:bCs/>
+                <w:sz w:val="24"/>
+                <w:szCs w:val="24"/>
+              </w:rPr>
+            </w:pPr>
+            <w:r>
+              <w:rPr>
+                <w:rFonts w:ascii="Arial" w:hAnsi="Arial" w:cs="Arial"/>
+                <w:b/>
+                <w:bCs/>
+                <w:sz w:val="24"/>
+                <w:szCs w:val="24"/>
+              </w:rPr>
+              <w:t>Integrante</w:t>
+            </w:r>
+          </w:p>
+        </w:tc>
+        <w:tc>
+          <w:tcPr>
+            <w:tcW w:w="1791" w:type="dxa"/>
+            <w:shd w:val="clear" w:color="auto" w:fill="262626" w:themeFill="text1" w:themeFillTint="D9"/>
+            <w:vAlign w:val="center"/>
+          </w:tcPr>
+          <w:p>
+            <w:pPr>
+              <w:jc w:val="center"/>
+              <w:rPr>
+                <w:rFonts w:ascii="Arial" w:hAnsi="Arial" w:cs="Arial"/>
+                <w:b/>
+                <w:bCs/>
+                <w:sz w:val="24"/>
+                <w:szCs w:val="24"/>
+              </w:rPr>
+            </w:pPr>
+            <w:r>
+              <w:rPr>
+                <w:rFonts w:ascii="Arial" w:hAnsi="Arial" w:cs="Arial"/>
+                <w:b/>
+                <w:bCs/>
+                <w:sz w:val="24"/>
+                <w:szCs w:val="24"/>
+              </w:rPr>
+              <w:t>Rol</w:t>
+            </w:r>
+          </w:p>
+        </w:tc>
+        <w:tc>
+          <w:tcPr>
+            <w:tcW w:w="1563" w:type="dxa"/>
+            <w:shd w:val="clear" w:color="auto" w:fill="262626" w:themeFill="text1" w:themeFillTint="D9"/>
+            <w:vAlign w:val="center"/>
+          </w:tcPr>
+          <w:p>
+            <w:pPr>
+              <w:jc w:val="center"/>
+              <w:rPr>
+                <w:rFonts w:ascii="Arial" w:hAnsi="Arial" w:cs="Arial"/>
+                <w:b/>
+                <w:bCs/>
+                <w:sz w:val="24"/>
+                <w:szCs w:val="24"/>
+              </w:rPr>
+            </w:pPr>
+            <w:r>
+              <w:rPr>
+                <w:rFonts w:ascii="Arial" w:hAnsi="Arial" w:cs="Arial"/>
+                <w:b/>
+                <w:bCs/>
+                <w:sz w:val="24"/>
+                <w:szCs w:val="24"/>
+              </w:rPr>
+              <w:t>Asistencia (Sí/No)</w:t>
+            </w:r>
+          </w:p>
+        </w:tc>
+        <w:tc>
+          <w:tcPr>
+            <w:tcW w:w="3061" w:type="dxa"/>
+            <w:shd w:val="clear" w:color="auto" w:fill="262626" w:themeFill="text1" w:themeFillTint="D9"/>
+            <w:vAlign w:val="center"/>
+          </w:tcPr>
+          <w:p>
+            <w:pPr>
+              <w:jc w:val="center"/>
+              <w:rPr>
+                <w:rFonts w:ascii="Arial" w:hAnsi="Arial" w:cs="Arial"/>
+                <w:b/>
+                <w:bCs/>
+                <w:sz w:val="24"/>
+                <w:szCs w:val="24"/>
+              </w:rPr>
+            </w:pPr>
+            <w:r>
+              <w:rPr>
+                <w:rFonts w:ascii="Arial" w:hAnsi="Arial" w:cs="Arial"/>
+                <w:b/>
+                <w:bCs/>
+                <w:sz w:val="24"/>
+                <w:szCs w:val="24"/>
+              </w:rPr>
+              <w:t>Actividades</w:t>
+            </w:r>
+          </w:p>
+        </w:tc>
+        <w:tc>
+          <w:tcPr>
+            <w:tcW w:w="2328" w:type="dxa"/>
+            <w:shd w:val="clear" w:color="auto" w:fill="262626" w:themeFill="text1" w:themeFillTint="D9"/>
+            <w:vAlign w:val="center"/>
+          </w:tcPr>
+          <w:p>
+            <w:pPr>
+              <w:jc w:val="center"/>
+              <w:rPr>
+                <w:rFonts w:ascii="Arial" w:hAnsi="Arial" w:cs="Arial"/>
+                <w:b/>
+                <w:bCs/>
+                <w:sz w:val="24"/>
+                <w:szCs w:val="24"/>
+              </w:rPr>
+            </w:pPr>
+            <w:r>
+              <w:rPr>
+                <w:rFonts w:ascii="Arial" w:hAnsi="Arial" w:cs="Arial"/>
+                <w:b/>
+                <w:bCs/>
+                <w:sz w:val="24"/>
+                <w:szCs w:val="24"/>
+              </w:rPr>
+              <w:t>Entregables Esperados</w:t>
+            </w:r>
+          </w:p>
+        </w:tc>
+      </w:tr>
+      <w:tr>
+        <w:trPr>
+          <w:jc w:val="center"/>
+        </w:trPr>
+        <w:tc>
+          <w:tcPr>
+            <w:tcW w:w="1538" w:type="dxa"/>
+            <w:vAlign w:val="center"/>
+          </w:tcPr>
+          <w:p>
+            <w:pPr>
+              <w:rPr>
+                <w:rFonts w:ascii="Arial" w:hAnsi="Arial" w:cs="Arial"/>
+                <w:sz w:val="24"/>
+                <w:szCs w:val="24"/>
+              </w:rPr>
+            </w:pPr>
+            <w:r>
+              <w:rPr>
+                <w:rFonts w:ascii="Arial" w:hAnsi="Arial" w:cs="Arial"/>
+                <w:sz w:val="24"/>
+                <w:szCs w:val="24"/>
+              </w:rPr>
+              <w:t>María Fernanda Barrón Álvarez</w:t>
+            </w:r>
+          </w:p>
+        </w:tc>
+        <w:tc>
+          <w:tcPr>
+            <w:tcW w:w="1791" w:type="dxa"/>
+            <w:vAlign w:val="center"/>
+          </w:tcPr>
+          <w:p>
+            <w:pPr>
+              <w:rPr>
+                <w:rFonts w:ascii="Arial" w:hAnsi="Arial" w:cs="Arial"/>
+                <w:sz w:val="24"/>
+                <w:szCs w:val="24"/>
+              </w:rPr>
+            </w:pPr>
+            <w:r>
+              <w:rPr>
+                <w:rFonts w:ascii="Arial" w:hAnsi="Arial" w:cs="Arial"/>
+                <w:sz w:val="24"/>
+                <w:szCs w:val="24"/>
+              </w:rPr>
+              <w:t>Project Manager</w:t>
+            </w:r>
+          </w:p>
+        </w:tc>
+        <w:tc>
+          <w:tcPr>
+            <w:tcW w:w="1563" w:type="dxa"/>
+            <w:vAlign w:val="center"/>
+          </w:tcPr>
+          <w:p>
+            <w:pPr>
+              <w:rPr>
+                <w:rFonts w:ascii="Arial" w:hAnsi="Arial" w:cs="Arial"/>
+                <w:sz w:val="24"/>
+                <w:szCs w:val="24"/>
+              </w:rPr>
+            </w:pPr>
+            <w:r>
+              <w:rPr>
+                <w:rFonts w:ascii="Arial" w:hAnsi="Arial" w:cs="Arial"/>
+                <w:sz w:val="24"/>
+                <w:szCs w:val="24"/>
+              </w:rPr>
+              <w:t>Sí</w:t>
+            </w:r>
+          </w:p>
+        </w:tc>
+        <w:tc>
+          <w:tcPr>
+            <w:tcW w:w="3061" w:type="dxa"/>
+            <w:vAlign w:val="center"/>
+          </w:tcPr>
+          <w:p>
+            <w:pPr>
+              <w:pStyle w:val="Prrafodelista"/>
+              <w:numPr>
+                <w:ilvl w:val="0"/>
+                <w:numId w:val="55"/>
+              </w:numPr>
+              <w:ind w:left="270" w:hanging="247"/>
+              <w:rPr>
+                <w:rFonts w:ascii="Arial" w:hAnsi="Arial" w:cs="Arial"/>
+                <w:sz w:val="24"/>
+                <w:szCs w:val="24"/>
+              </w:rPr>
+            </w:pPr>
+            <w:r>
+              <w:rPr>
+                <w:rFonts w:ascii="Arial" w:hAnsi="Arial" w:cs="Arial"/>
+                <w:sz w:val="24"/>
+                <w:szCs w:val="24"/>
+              </w:rPr>
+              <w:t xml:space="preserve">Contacto con cliente para reafirmar expectativas. </w:t>
+            </w:r>
+          </w:p>
+          <w:p>
+            <w:pPr>
+              <w:pStyle w:val="Prrafodelista"/>
+              <w:numPr>
+                <w:ilvl w:val="0"/>
+                <w:numId w:val="55"/>
+              </w:numPr>
+              <w:ind w:left="246" w:hanging="218"/>
+              <w:rPr>
+                <w:rFonts w:ascii="Arial" w:hAnsi="Arial" w:cs="Arial"/>
+                <w:sz w:val="24"/>
+                <w:szCs w:val="24"/>
+              </w:rPr>
+            </w:pPr>
+            <w:r>
+              <w:rPr>
+                <w:rFonts w:ascii="Arial" w:hAnsi="Arial" w:cs="Arial"/>
+                <w:sz w:val="24"/>
+                <w:szCs w:val="24"/>
+              </w:rPr>
+              <w:t>Identificación de objetivos del portafolio web.</w:t>
+            </w:r>
+          </w:p>
+          <w:p>
+            <w:pPr>
+              <w:pStyle w:val="Prrafodelista"/>
+              <w:numPr>
+                <w:ilvl w:val="0"/>
+                <w:numId w:val="55"/>
+              </w:numPr>
+              <w:ind w:left="246" w:hanging="218"/>
+              <w:rPr>
+                <w:rFonts w:ascii="Arial" w:hAnsi="Arial" w:cs="Arial"/>
+                <w:sz w:val="24"/>
+                <w:szCs w:val="24"/>
+              </w:rPr>
+            </w:pPr>
+            <w:r>
+              <w:rPr>
+                <w:rFonts w:ascii="Arial" w:hAnsi="Arial" w:cs="Arial"/>
+                <w:sz w:val="24"/>
+                <w:szCs w:val="24"/>
+              </w:rPr>
+              <w:t>Coordinación del equipo y asignación de tareas.</w:t>
+            </w:r>
+          </w:p>
+          <w:p>
+            <w:pPr>
+              <w:pStyle w:val="Prrafodelista"/>
+              <w:numPr>
+                <w:ilvl w:val="0"/>
+                <w:numId w:val="55"/>
+              </w:numPr>
+              <w:ind w:left="246" w:hanging="218"/>
+              <w:rPr>
+                <w:rFonts w:ascii="Arial" w:hAnsi="Arial" w:cs="Arial"/>
+                <w:sz w:val="24"/>
+                <w:szCs w:val="24"/>
+              </w:rPr>
+            </w:pPr>
+            <w:r>
+              <w:rPr>
+                <w:rFonts w:ascii="Arial" w:hAnsi="Arial" w:cs="Arial"/>
+                <w:sz w:val="24"/>
+                <w:szCs w:val="24"/>
+              </w:rPr>
+              <w:t>Revisión y validación de los requerimientos funcionales.</w:t>
+            </w:r>
+          </w:p>
+          <w:p>
+            <w:pPr>
+              <w:pStyle w:val="Prrafodelista"/>
+              <w:numPr>
+                <w:ilvl w:val="0"/>
+                <w:numId w:val="55"/>
+              </w:numPr>
+              <w:ind w:left="246" w:hanging="218"/>
+              <w:rPr>
+                <w:rFonts w:ascii="Arial" w:hAnsi="Arial" w:cs="Arial"/>
+                <w:sz w:val="24"/>
+                <w:szCs w:val="24"/>
+              </w:rPr>
+            </w:pPr>
+            <w:r>
+              <w:rPr>
+                <w:rFonts w:ascii="Arial" w:hAnsi="Arial" w:cs="Arial"/>
+                <w:sz w:val="24"/>
+                <w:szCs w:val="24"/>
+              </w:rPr>
+              <w:t>Revisión y validación de los requerimientos no funcionales.</w:t>
+            </w:r>
+          </w:p>
+        </w:tc>
+        <w:tc>
+          <w:tcPr>
+            <w:tcW w:w="2328" w:type="dxa"/>
+            <w:vAlign w:val="center"/>
+          </w:tcPr>
+          <w:p>
+            <w:pPr>
+              <w:pStyle w:val="Prrafodelista"/>
+              <w:numPr>
+                <w:ilvl w:val="0"/>
+                <w:numId w:val="55"/>
+              </w:numPr>
+              <w:ind w:left="219" w:hanging="219"/>
+              <w:rPr>
+                <w:rFonts w:ascii="Arial" w:hAnsi="Arial" w:cs="Arial"/>
+                <w:sz w:val="24"/>
+                <w:szCs w:val="24"/>
+              </w:rPr>
+            </w:pPr>
+            <w:r>
+              <w:rPr>
+                <w:rFonts w:ascii="Arial" w:hAnsi="Arial" w:cs="Arial"/>
+                <w:sz w:val="24"/>
+                <w:szCs w:val="24"/>
+              </w:rPr>
+              <w:t>Bitácora</w:t>
+            </w:r>
+          </w:p>
+          <w:p>
+            <w:pPr>
+              <w:pStyle w:val="Prrafodelista"/>
+              <w:numPr>
+                <w:ilvl w:val="0"/>
+                <w:numId w:val="55"/>
+              </w:numPr>
+              <w:ind w:left="219" w:hanging="219"/>
+              <w:rPr>
+                <w:rFonts w:ascii="Arial" w:hAnsi="Arial" w:cs="Arial"/>
+                <w:sz w:val="24"/>
+                <w:szCs w:val="24"/>
+              </w:rPr>
+            </w:pPr>
+            <w:r>
+              <w:rPr>
+                <w:rFonts w:ascii="Arial" w:hAnsi="Arial" w:cs="Arial"/>
+                <w:sz w:val="24"/>
+                <w:szCs w:val="24"/>
+              </w:rPr>
+              <w:t>Documento con requerimientos</w:t>
+            </w:r>
+          </w:p>
+        </w:tc>
+      </w:tr>
+      <w:tr>
+        <w:trPr>
+          <w:jc w:val="center"/>
+        </w:trPr>
+        <w:tc>
+          <w:tcPr>
+            <w:tcW w:w="1538" w:type="dxa"/>
+            <w:vAlign w:val="center"/>
+          </w:tcPr>
+          <w:p>
+            <w:pPr>
+              <w:rPr>
+                <w:rFonts w:ascii="Arial" w:hAnsi="Arial" w:cs="Arial"/>
+                <w:sz w:val="24"/>
+                <w:szCs w:val="24"/>
+              </w:rPr>
+            </w:pPr>
+            <w:r>
+              <w:rPr>
+                <w:rFonts w:ascii="Arial" w:hAnsi="Arial" w:cs="Arial"/>
+                <w:sz w:val="24"/>
+                <w:szCs w:val="24"/>
+              </w:rPr>
+              <w:t xml:space="preserve">Leslie Miroslava Benítez </w:t>
+            </w:r>
+          </w:p>
+          <w:p>
+            <w:pPr>
+              <w:rPr>
+                <w:rFonts w:ascii="Arial" w:hAnsi="Arial" w:cs="Arial"/>
+                <w:sz w:val="24"/>
+                <w:szCs w:val="24"/>
+              </w:rPr>
+            </w:pPr>
+            <w:r>
+              <w:rPr>
+                <w:rFonts w:ascii="Arial" w:hAnsi="Arial" w:cs="Arial"/>
+                <w:sz w:val="24"/>
+                <w:szCs w:val="24"/>
+              </w:rPr>
+              <w:t>Marín</w:t>
+            </w:r>
+          </w:p>
+        </w:tc>
+        <w:tc>
+          <w:tcPr>
+            <w:tcW w:w="1791" w:type="dxa"/>
+            <w:vAlign w:val="center"/>
+          </w:tcPr>
+          <w:p>
+            <w:pPr>
+              <w:rPr>
+                <w:rFonts w:ascii="Arial" w:hAnsi="Arial" w:cs="Arial"/>
+                <w:sz w:val="24"/>
+                <w:szCs w:val="24"/>
+              </w:rPr>
+            </w:pPr>
+            <w:r>
+              <w:rPr>
+                <w:rFonts w:ascii="Arial" w:hAnsi="Arial" w:cs="Arial"/>
+                <w:sz w:val="24"/>
+                <w:szCs w:val="24"/>
+              </w:rPr>
+              <w:t xml:space="preserve">Desarrolladora </w:t>
+            </w:r>
+            <w:proofErr w:type="spellStart"/>
+            <w:r>
+              <w:rPr>
+                <w:rFonts w:ascii="Arial" w:hAnsi="Arial" w:cs="Arial"/>
+                <w:sz w:val="24"/>
+                <w:szCs w:val="24"/>
+              </w:rPr>
+              <w:t>frontend</w:t>
+            </w:r>
+            <w:proofErr w:type="spellEnd"/>
+          </w:p>
+        </w:tc>
+        <w:tc>
+          <w:tcPr>
+            <w:tcW w:w="1563" w:type="dxa"/>
+            <w:vAlign w:val="center"/>
+          </w:tcPr>
+          <w:p>
+            <w:pPr>
+              <w:rPr>
+                <w:rFonts w:ascii="Arial" w:hAnsi="Arial" w:cs="Arial"/>
+                <w:sz w:val="24"/>
+                <w:szCs w:val="24"/>
+              </w:rPr>
+            </w:pPr>
+            <w:r>
+              <w:rPr>
+                <w:rFonts w:ascii="Arial" w:hAnsi="Arial" w:cs="Arial"/>
+                <w:sz w:val="24"/>
+                <w:szCs w:val="24"/>
+              </w:rPr>
+              <w:t>Sí</w:t>
+            </w:r>
+          </w:p>
+        </w:tc>
+        <w:tc>
+          <w:tcPr>
+            <w:tcW w:w="3061" w:type="dxa"/>
+            <w:vAlign w:val="center"/>
+          </w:tcPr>
+          <w:p>
+            <w:pPr>
+              <w:pStyle w:val="Prrafodelista"/>
+              <w:numPr>
+                <w:ilvl w:val="0"/>
+                <w:numId w:val="55"/>
+              </w:numPr>
+              <w:ind w:left="270" w:hanging="184"/>
+              <w:rPr>
+                <w:rFonts w:ascii="Arial" w:hAnsi="Arial" w:cs="Arial"/>
+                <w:sz w:val="24"/>
+                <w:szCs w:val="24"/>
+              </w:rPr>
+            </w:pPr>
+            <w:r>
+              <w:rPr>
+                <w:rFonts w:ascii="Arial" w:hAnsi="Arial" w:cs="Arial"/>
+                <w:sz w:val="24"/>
+                <w:szCs w:val="24"/>
+              </w:rPr>
+              <w:t xml:space="preserve">Análisis de la interfaz de usuario del portafolio. </w:t>
+            </w:r>
+          </w:p>
+          <w:p>
+            <w:pPr>
+              <w:pStyle w:val="Prrafodelista"/>
+              <w:numPr>
+                <w:ilvl w:val="0"/>
+                <w:numId w:val="55"/>
+              </w:numPr>
+              <w:ind w:left="270" w:hanging="184"/>
+              <w:rPr>
+                <w:rFonts w:ascii="Arial" w:hAnsi="Arial" w:cs="Arial"/>
+                <w:sz w:val="24"/>
+                <w:szCs w:val="24"/>
+              </w:rPr>
+            </w:pPr>
+            <w:r>
+              <w:rPr>
+                <w:rFonts w:ascii="Arial" w:hAnsi="Arial" w:cs="Arial"/>
+                <w:sz w:val="24"/>
+                <w:szCs w:val="24"/>
+              </w:rPr>
+              <w:t xml:space="preserve">Identificación de elementos visuales y de interacción. </w:t>
+            </w:r>
+          </w:p>
+          <w:p>
+            <w:pPr>
+              <w:pStyle w:val="Prrafodelista"/>
+              <w:numPr>
+                <w:ilvl w:val="0"/>
+                <w:numId w:val="55"/>
+              </w:numPr>
+              <w:ind w:left="270" w:hanging="184"/>
+              <w:rPr>
+                <w:rFonts w:ascii="Arial" w:hAnsi="Arial" w:cs="Arial"/>
+                <w:sz w:val="24"/>
+                <w:szCs w:val="24"/>
+              </w:rPr>
+            </w:pPr>
+            <w:r>
+              <w:rPr>
+                <w:rFonts w:ascii="Arial" w:hAnsi="Arial" w:cs="Arial"/>
+                <w:sz w:val="24"/>
+                <w:szCs w:val="24"/>
+              </w:rPr>
+              <w:t xml:space="preserve">Definición de requerimientos relacionados con: </w:t>
+            </w:r>
+          </w:p>
+          <w:p>
+            <w:pPr>
+              <w:numPr>
+                <w:ilvl w:val="2"/>
+                <w:numId w:val="55"/>
+              </w:numPr>
+              <w:ind w:left="837"/>
+              <w:rPr>
+                <w:rFonts w:ascii="Arial" w:hAnsi="Arial" w:cs="Arial"/>
+                <w:sz w:val="24"/>
+                <w:szCs w:val="24"/>
+              </w:rPr>
+            </w:pPr>
+            <w:r>
+              <w:rPr>
+                <w:rFonts w:ascii="Arial" w:hAnsi="Arial" w:cs="Arial"/>
+                <w:sz w:val="24"/>
+                <w:szCs w:val="24"/>
+              </w:rPr>
+              <w:t xml:space="preserve">navegación </w:t>
+            </w:r>
+          </w:p>
+          <w:p>
+            <w:pPr>
+              <w:numPr>
+                <w:ilvl w:val="2"/>
+                <w:numId w:val="55"/>
+              </w:numPr>
+              <w:ind w:left="837"/>
+              <w:rPr>
+                <w:rFonts w:ascii="Arial" w:hAnsi="Arial" w:cs="Arial"/>
+                <w:sz w:val="24"/>
+                <w:szCs w:val="24"/>
+              </w:rPr>
+            </w:pPr>
+            <w:r>
+              <w:rPr>
+                <w:rFonts w:ascii="Arial" w:hAnsi="Arial" w:cs="Arial"/>
+                <w:sz w:val="24"/>
+                <w:szCs w:val="24"/>
+              </w:rPr>
+              <w:t xml:space="preserve">animaciones </w:t>
+            </w:r>
+          </w:p>
+          <w:p>
+            <w:pPr>
+              <w:numPr>
+                <w:ilvl w:val="2"/>
+                <w:numId w:val="55"/>
+              </w:numPr>
+              <w:ind w:left="837"/>
+              <w:rPr>
+                <w:rFonts w:ascii="Arial" w:hAnsi="Arial" w:cs="Arial"/>
+                <w:sz w:val="24"/>
+                <w:szCs w:val="24"/>
+              </w:rPr>
+            </w:pPr>
+            <w:r>
+              <w:rPr>
+                <w:rFonts w:ascii="Arial" w:hAnsi="Arial" w:cs="Arial"/>
+                <w:sz w:val="24"/>
+                <w:szCs w:val="24"/>
+              </w:rPr>
+              <w:t xml:space="preserve">visualización de proyectos </w:t>
+            </w:r>
+          </w:p>
+          <w:p>
+            <w:pPr>
+              <w:numPr>
+                <w:ilvl w:val="0"/>
+                <w:numId w:val="55"/>
+              </w:numPr>
+              <w:ind w:left="270" w:hanging="184"/>
+              <w:rPr>
+                <w:rFonts w:ascii="Arial" w:hAnsi="Arial" w:cs="Arial"/>
+                <w:sz w:val="24"/>
+                <w:szCs w:val="24"/>
+              </w:rPr>
+            </w:pPr>
+            <w:r>
+              <w:rPr>
+                <w:rFonts w:ascii="Arial" w:hAnsi="Arial" w:cs="Arial"/>
+                <w:sz w:val="24"/>
+                <w:szCs w:val="24"/>
+              </w:rPr>
+              <w:lastRenderedPageBreak/>
+              <w:t xml:space="preserve">experiencia de usuario (UX/UI) </w:t>
+            </w:r>
+          </w:p>
+          <w:p>
+            <w:pPr>
+              <w:pStyle w:val="Prrafodelista"/>
+              <w:numPr>
+                <w:ilvl w:val="0"/>
+                <w:numId w:val="55"/>
+              </w:numPr>
+              <w:ind w:left="270" w:hanging="184"/>
+              <w:rPr>
+                <w:rFonts w:ascii="Arial" w:hAnsi="Arial" w:cs="Arial"/>
+                <w:sz w:val="24"/>
+                <w:szCs w:val="24"/>
+              </w:rPr>
+            </w:pPr>
+            <w:r>
+              <w:rPr>
+                <w:rFonts w:ascii="Arial" w:hAnsi="Arial" w:cs="Arial"/>
+                <w:sz w:val="24"/>
+                <w:szCs w:val="24"/>
+              </w:rPr>
+              <w:t xml:space="preserve">Propuesta de comportamiento responsivo. </w:t>
+            </w:r>
+          </w:p>
+          <w:p>
+            <w:pPr>
+              <w:pStyle w:val="Prrafodelista"/>
+              <w:numPr>
+                <w:ilvl w:val="0"/>
+                <w:numId w:val="55"/>
+              </w:numPr>
+              <w:ind w:left="270" w:hanging="184"/>
+              <w:rPr>
+                <w:rFonts w:ascii="Arial" w:hAnsi="Arial" w:cs="Arial"/>
+                <w:sz w:val="24"/>
+                <w:szCs w:val="24"/>
+              </w:rPr>
+            </w:pPr>
+            <w:r>
+              <w:rPr>
+                <w:rFonts w:ascii="Arial" w:hAnsi="Arial" w:cs="Arial"/>
+                <w:sz w:val="24"/>
+                <w:szCs w:val="24"/>
+              </w:rPr>
+              <w:t>Apoyo en la redacción de requerimientos funcionales.</w:t>
+            </w:r>
+          </w:p>
+        </w:tc>
+        <w:tc>
+          <w:tcPr>
+            <w:tcW w:w="2328" w:type="dxa"/>
+            <w:vAlign w:val="center"/>
+          </w:tcPr>
+          <w:p>
+            <w:pPr>
+              <w:pStyle w:val="Prrafodelista"/>
+              <w:numPr>
+                <w:ilvl w:val="0"/>
+                <w:numId w:val="55"/>
+              </w:numPr>
+              <w:ind w:left="219" w:hanging="218"/>
+              <w:rPr>
+                <w:rFonts w:ascii="Arial" w:hAnsi="Arial" w:cs="Arial"/>
+                <w:sz w:val="24"/>
+                <w:szCs w:val="24"/>
+              </w:rPr>
+            </w:pPr>
+            <w:r>
+              <w:rPr>
+                <w:rFonts w:ascii="Arial" w:hAnsi="Arial" w:cs="Arial"/>
+                <w:sz w:val="24"/>
+                <w:szCs w:val="24"/>
+              </w:rPr>
+              <w:lastRenderedPageBreak/>
+              <w:t>Documento con requerimientos</w:t>
+            </w:r>
+          </w:p>
+        </w:tc>
+      </w:tr>
+      <w:tr>
+        <w:trPr>
+          <w:jc w:val="center"/>
+        </w:trPr>
+        <w:tc>
+          <w:tcPr>
+            <w:tcW w:w="1538" w:type="dxa"/>
+            <w:vAlign w:val="center"/>
+          </w:tcPr>
+          <w:p>
+            <w:pPr>
+              <w:rPr>
+                <w:rFonts w:ascii="Arial" w:hAnsi="Arial" w:cs="Arial"/>
+                <w:sz w:val="24"/>
+                <w:szCs w:val="24"/>
+              </w:rPr>
+            </w:pPr>
+            <w:r>
+              <w:rPr>
+                <w:rFonts w:ascii="Arial" w:hAnsi="Arial" w:cs="Arial"/>
+                <w:sz w:val="24"/>
+                <w:szCs w:val="24"/>
+              </w:rPr>
+              <w:t>Leonardo Merino Garfias</w:t>
+            </w:r>
+          </w:p>
+        </w:tc>
+        <w:tc>
+          <w:tcPr>
+            <w:tcW w:w="1791" w:type="dxa"/>
+            <w:vAlign w:val="center"/>
+          </w:tcPr>
+          <w:p>
+            <w:pPr>
+              <w:rPr>
+                <w:rFonts w:ascii="Arial" w:hAnsi="Arial" w:cs="Arial"/>
+                <w:sz w:val="24"/>
+                <w:szCs w:val="24"/>
+              </w:rPr>
+            </w:pPr>
+            <w:r>
+              <w:rPr>
+                <w:rFonts w:ascii="Arial" w:hAnsi="Arial" w:cs="Arial"/>
+                <w:sz w:val="24"/>
+                <w:szCs w:val="24"/>
+              </w:rPr>
+              <w:t xml:space="preserve">Desarrollador </w:t>
+            </w:r>
+            <w:proofErr w:type="spellStart"/>
+            <w:r>
+              <w:rPr>
+                <w:rFonts w:ascii="Arial" w:hAnsi="Arial" w:cs="Arial"/>
+                <w:sz w:val="24"/>
+                <w:szCs w:val="24"/>
+              </w:rPr>
+              <w:t>backend</w:t>
+            </w:r>
+            <w:proofErr w:type="spellEnd"/>
+          </w:p>
+        </w:tc>
+        <w:tc>
+          <w:tcPr>
+            <w:tcW w:w="1563" w:type="dxa"/>
+            <w:vAlign w:val="center"/>
+          </w:tcPr>
+          <w:p>
+            <w:pPr>
+              <w:rPr>
+                <w:rFonts w:ascii="Arial" w:hAnsi="Arial" w:cs="Arial"/>
+                <w:sz w:val="24"/>
+                <w:szCs w:val="24"/>
+              </w:rPr>
+            </w:pPr>
+            <w:r>
+              <w:rPr>
+                <w:rFonts w:ascii="Arial" w:hAnsi="Arial" w:cs="Arial"/>
+                <w:sz w:val="24"/>
+                <w:szCs w:val="24"/>
+              </w:rPr>
+              <w:t>Sí</w:t>
+            </w:r>
+          </w:p>
+        </w:tc>
+        <w:tc>
+          <w:tcPr>
+            <w:tcW w:w="3061" w:type="dxa"/>
+            <w:vAlign w:val="center"/>
+          </w:tcPr>
+          <w:p>
+            <w:pPr>
+              <w:pStyle w:val="Prrafodelista"/>
+              <w:numPr>
+                <w:ilvl w:val="0"/>
+                <w:numId w:val="55"/>
+              </w:numPr>
+              <w:ind w:left="246" w:hanging="218"/>
+              <w:rPr>
+                <w:rFonts w:ascii="Arial" w:hAnsi="Arial" w:cs="Arial"/>
+                <w:sz w:val="24"/>
+                <w:szCs w:val="24"/>
+              </w:rPr>
+            </w:pPr>
+            <w:r>
+              <w:rPr>
+                <w:rFonts w:ascii="Arial" w:hAnsi="Arial" w:cs="Arial"/>
+                <w:sz w:val="24"/>
+                <w:szCs w:val="24"/>
+              </w:rPr>
+              <w:t>Análisis de necesidades técnicas del sistema.</w:t>
+            </w:r>
+          </w:p>
+          <w:p>
+            <w:pPr>
+              <w:pStyle w:val="Prrafodelista"/>
+              <w:numPr>
+                <w:ilvl w:val="0"/>
+                <w:numId w:val="55"/>
+              </w:numPr>
+              <w:ind w:left="246" w:hanging="218"/>
+              <w:rPr>
+                <w:rFonts w:ascii="Arial" w:hAnsi="Arial" w:cs="Arial"/>
+                <w:sz w:val="24"/>
+                <w:szCs w:val="24"/>
+              </w:rPr>
+            </w:pPr>
+            <w:r>
+              <w:rPr>
+                <w:rFonts w:ascii="Arial" w:hAnsi="Arial" w:cs="Arial"/>
+                <w:sz w:val="24"/>
+                <w:szCs w:val="24"/>
+              </w:rPr>
+              <w:t>Identificación de requerimientos no funcionales:</w:t>
+            </w:r>
+          </w:p>
+          <w:p>
+            <w:pPr>
+              <w:pStyle w:val="Prrafodelista"/>
+              <w:numPr>
+                <w:ilvl w:val="1"/>
+                <w:numId w:val="57"/>
+              </w:numPr>
+              <w:ind w:left="840"/>
+              <w:rPr>
+                <w:rFonts w:ascii="Arial" w:hAnsi="Arial" w:cs="Arial"/>
+                <w:sz w:val="24"/>
+                <w:szCs w:val="24"/>
+              </w:rPr>
+            </w:pPr>
+            <w:r>
+              <w:rPr>
+                <w:rFonts w:ascii="Arial" w:hAnsi="Arial" w:cs="Arial"/>
+                <w:sz w:val="24"/>
+                <w:szCs w:val="24"/>
+              </w:rPr>
+              <w:t>rendimiento</w:t>
+            </w:r>
+          </w:p>
+          <w:p>
+            <w:pPr>
+              <w:pStyle w:val="Prrafodelista"/>
+              <w:numPr>
+                <w:ilvl w:val="1"/>
+                <w:numId w:val="57"/>
+              </w:numPr>
+              <w:ind w:left="840"/>
+              <w:rPr>
+                <w:rFonts w:ascii="Arial" w:hAnsi="Arial" w:cs="Arial"/>
+                <w:sz w:val="24"/>
+                <w:szCs w:val="24"/>
+              </w:rPr>
+            </w:pPr>
+            <w:r>
+              <w:rPr>
+                <w:rFonts w:ascii="Arial" w:hAnsi="Arial" w:cs="Arial"/>
+                <w:sz w:val="24"/>
+                <w:szCs w:val="24"/>
+              </w:rPr>
+              <w:t>seguridad</w:t>
+            </w:r>
+          </w:p>
+          <w:p>
+            <w:pPr>
+              <w:pStyle w:val="Prrafodelista"/>
+              <w:numPr>
+                <w:ilvl w:val="1"/>
+                <w:numId w:val="57"/>
+              </w:numPr>
+              <w:ind w:left="840"/>
+              <w:rPr>
+                <w:rFonts w:ascii="Arial" w:hAnsi="Arial" w:cs="Arial"/>
+                <w:sz w:val="24"/>
+                <w:szCs w:val="24"/>
+              </w:rPr>
+            </w:pPr>
+            <w:r>
+              <w:rPr>
+                <w:rFonts w:ascii="Arial" w:hAnsi="Arial" w:cs="Arial"/>
+                <w:sz w:val="24"/>
+                <w:szCs w:val="24"/>
+              </w:rPr>
+              <w:t>disponibilidad</w:t>
+            </w:r>
+          </w:p>
+          <w:p>
+            <w:pPr>
+              <w:pStyle w:val="Prrafodelista"/>
+              <w:numPr>
+                <w:ilvl w:val="0"/>
+                <w:numId w:val="55"/>
+              </w:numPr>
+              <w:ind w:left="246" w:hanging="218"/>
+              <w:rPr>
+                <w:rFonts w:ascii="Arial" w:hAnsi="Arial" w:cs="Arial"/>
+                <w:sz w:val="24"/>
+                <w:szCs w:val="24"/>
+              </w:rPr>
+            </w:pPr>
+            <w:r>
+              <w:rPr>
+                <w:rFonts w:ascii="Arial" w:hAnsi="Arial" w:cs="Arial"/>
+                <w:sz w:val="24"/>
+                <w:szCs w:val="24"/>
+              </w:rPr>
+              <w:t>Definición de aspectos de manejo de datos (contacto, formularios).</w:t>
+            </w:r>
+          </w:p>
+          <w:p>
+            <w:pPr>
+              <w:pStyle w:val="Prrafodelista"/>
+              <w:numPr>
+                <w:ilvl w:val="0"/>
+                <w:numId w:val="55"/>
+              </w:numPr>
+              <w:ind w:left="246" w:hanging="218"/>
+              <w:rPr>
+                <w:rFonts w:ascii="Arial" w:hAnsi="Arial" w:cs="Arial"/>
+                <w:sz w:val="24"/>
+                <w:szCs w:val="24"/>
+              </w:rPr>
+            </w:pPr>
+            <w:r>
+              <w:rPr>
+                <w:rFonts w:ascii="Arial" w:hAnsi="Arial" w:cs="Arial"/>
+                <w:sz w:val="24"/>
+                <w:szCs w:val="24"/>
+              </w:rPr>
+              <w:t>Evaluación de compatibilidad y estructura del sistema.</w:t>
+            </w:r>
+          </w:p>
+          <w:p>
+            <w:pPr>
+              <w:pStyle w:val="Prrafodelista"/>
+              <w:numPr>
+                <w:ilvl w:val="0"/>
+                <w:numId w:val="55"/>
+              </w:numPr>
+              <w:ind w:left="246" w:hanging="218"/>
+              <w:rPr>
+                <w:rFonts w:ascii="Arial" w:hAnsi="Arial" w:cs="Arial"/>
+                <w:sz w:val="24"/>
+                <w:szCs w:val="24"/>
+              </w:rPr>
+            </w:pPr>
+            <w:r>
+              <w:rPr>
+                <w:rFonts w:ascii="Arial" w:hAnsi="Arial" w:cs="Arial"/>
+                <w:sz w:val="24"/>
+                <w:szCs w:val="24"/>
+              </w:rPr>
+              <w:t>Apoyo en la redacción de requerimientos no funcionales.</w:t>
+            </w:r>
+          </w:p>
+        </w:tc>
+        <w:tc>
+          <w:tcPr>
+            <w:tcW w:w="2328" w:type="dxa"/>
+            <w:vAlign w:val="center"/>
+          </w:tcPr>
+          <w:p>
+            <w:pPr>
+              <w:pStyle w:val="Prrafodelista"/>
+              <w:numPr>
+                <w:ilvl w:val="0"/>
+                <w:numId w:val="55"/>
+              </w:numPr>
+              <w:ind w:left="349" w:hanging="248"/>
+              <w:rPr>
+                <w:rFonts w:ascii="Arial" w:hAnsi="Arial" w:cs="Arial"/>
+                <w:sz w:val="24"/>
+                <w:szCs w:val="24"/>
+              </w:rPr>
+            </w:pPr>
+            <w:r>
+              <w:rPr>
+                <w:rFonts w:ascii="Arial" w:hAnsi="Arial" w:cs="Arial"/>
+                <w:sz w:val="24"/>
+                <w:szCs w:val="24"/>
+              </w:rPr>
+              <w:t>Documento con requerimientos</w:t>
+            </w:r>
+          </w:p>
+        </w:tc>
+      </w:tr>
+    </w:tbl>
+    <w:p>
+      <w:pPr>
+        <w:rPr>
+          <w:rFonts w:ascii="Arial" w:hAnsi="Arial" w:cs="Arial"/>
+          <w:sz w:val="24"/>
+          <w:szCs w:val="24"/>
+        </w:rPr>
+      </w:pPr>
+    </w:p>
+    <w:p>
+      <w:pPr>
+        <w:pStyle w:val="titulo1"/>
+        <w:outlineLvl w:val="2"/>
+        <w:rPr>
+          <w:sz w:val="32"/>
+          <w:szCs w:val="72"/>
+        </w:rPr>
+      </w:pPr>
+      <w:r>
+        <w:rPr>
+          <w:sz w:val="32"/>
+          <w:szCs w:val="72"/>
+        </w:rPr>
+        <w:t>A</w:t>
+      </w:r>
+      <w:r>
+        <w:rPr>
+          <w:sz w:val="32"/>
+          <w:szCs w:val="72"/>
+        </w:rPr>
+        <w:t>ctividades Ejecutadas</w:t>
+      </w:r>
+    </w:p>
+    <w:tbl>
+      <w:tblPr>
+        <w:tblStyle w:val="Tablaconcuadrcula"/>
+        <w:tblW w:w="10124" w:type="dxa"/>
+        <w:jc w:val="center"/>
+        <w:tblBorders>
+          <w:top w:val="single" w:sz="4" w:space="0" w:color="7F7F7F" w:themeColor="text1" w:themeTint="80"/>
+          <w:left w:val="single" w:sz="4" w:space="0" w:color="7F7F7F" w:themeColor="text1" w:themeTint="80"/>
+          <w:bottom w:val="single" w:sz="4" w:space="0" w:color="7F7F7F" w:themeColor="text1" w:themeTint="80"/>
+          <w:right w:val="single" w:sz="4" w:space="0" w:color="7F7F7F" w:themeColor="text1" w:themeTint="80"/>
+          <w:insideH w:val="single" w:sz="4" w:space="0" w:color="7F7F7F" w:themeColor="text1" w:themeTint="80"/>
+          <w:insideV w:val="single" w:sz="4" w:space="0" w:color="7F7F7F" w:themeColor="text1" w:themeTint="80"/>
+        </w:tblBorders>
+        <w:tblCellMar>
+          <w:top w:w="57" w:type="dxa"/>
+          <w:bottom w:w="57" w:type="dxa"/>
+        </w:tblCellMar>
+        <w:tblLook w:val="04A0" w:firstRow="1" w:lastRow="0" w:firstColumn="1" w:lastColumn="0" w:noHBand="0" w:noVBand="1"/>
+      </w:tblPr>
+      <w:tblGrid>
+        <w:gridCol w:w="2955"/>
+        <w:gridCol w:w="2004"/>
+        <w:gridCol w:w="1150"/>
+        <w:gridCol w:w="1535"/>
+        <w:gridCol w:w="2480"/>
+      </w:tblGrid>
+      <w:tr>
+        <w:trPr>
+          <w:jc w:val="center"/>
+        </w:trPr>
+        <w:tc>
+          <w:tcPr>
+            <w:tcW w:w="2955" w:type="dxa"/>
+            <w:shd w:val="clear" w:color="auto" w:fill="262626" w:themeFill="text1" w:themeFillTint="D9"/>
+            <w:vAlign w:val="center"/>
+          </w:tcPr>
+          <w:p>
+            <w:pPr>
+              <w:jc w:val="center"/>
+              <w:rPr>
+                <w:rFonts w:ascii="Arial" w:hAnsi="Arial" w:cs="Arial"/>
+                <w:b/>
+                <w:bCs/>
+                <w:sz w:val="24"/>
+                <w:szCs w:val="24"/>
+              </w:rPr>
+            </w:pPr>
+            <w:r>
+              <w:rPr>
+                <w:rFonts w:ascii="Arial" w:hAnsi="Arial" w:cs="Arial"/>
+                <w:b/>
+                <w:bCs/>
+                <w:sz w:val="24"/>
+                <w:szCs w:val="24"/>
+              </w:rPr>
+              <w:t>Actividad</w:t>
+            </w:r>
+          </w:p>
+        </w:tc>
+        <w:tc>
+          <w:tcPr>
+            <w:tcW w:w="2004" w:type="dxa"/>
+            <w:shd w:val="clear" w:color="auto" w:fill="262626" w:themeFill="text1" w:themeFillTint="D9"/>
+            <w:vAlign w:val="center"/>
+          </w:tcPr>
+          <w:p>
+            <w:pPr>
+              <w:jc w:val="center"/>
+              <w:rPr>
+                <w:rFonts w:ascii="Arial" w:hAnsi="Arial" w:cs="Arial"/>
+                <w:b/>
+                <w:bCs/>
+                <w:sz w:val="24"/>
+                <w:szCs w:val="24"/>
+              </w:rPr>
+            </w:pPr>
+            <w:r>
+              <w:rPr>
+                <w:rFonts w:ascii="Arial" w:hAnsi="Arial" w:cs="Arial"/>
+                <w:b/>
+                <w:bCs/>
+                <w:sz w:val="24"/>
+                <w:szCs w:val="24"/>
+              </w:rPr>
+              <w:t>Responsable(s)</w:t>
+            </w:r>
+          </w:p>
+        </w:tc>
+        <w:tc>
+          <w:tcPr>
+            <w:tcW w:w="1150" w:type="dxa"/>
+            <w:shd w:val="clear" w:color="auto" w:fill="262626" w:themeFill="text1" w:themeFillTint="D9"/>
+            <w:vAlign w:val="center"/>
+          </w:tcPr>
+          <w:p>
+            <w:pPr>
+              <w:jc w:val="center"/>
+              <w:rPr>
+                <w:rFonts w:ascii="Arial" w:hAnsi="Arial" w:cs="Arial"/>
+                <w:b/>
+                <w:bCs/>
+                <w:sz w:val="24"/>
+                <w:szCs w:val="24"/>
+              </w:rPr>
+            </w:pPr>
+            <w:proofErr w:type="spellStart"/>
+            <w:r>
+              <w:rPr>
+                <w:rFonts w:ascii="Arial" w:hAnsi="Arial" w:cs="Arial"/>
+                <w:b/>
+                <w:bCs/>
+                <w:sz w:val="24"/>
+                <w:szCs w:val="24"/>
+              </w:rPr>
+              <w:t>Hr</w:t>
+            </w:r>
+            <w:proofErr w:type="spellEnd"/>
+            <w:r>
+              <w:rPr>
+                <w:rFonts w:ascii="Arial" w:hAnsi="Arial" w:cs="Arial"/>
+                <w:b/>
+                <w:bCs/>
+                <w:sz w:val="24"/>
+                <w:szCs w:val="24"/>
+              </w:rPr>
+              <w:t xml:space="preserve">. </w:t>
+            </w:r>
+            <w:proofErr w:type="spellStart"/>
+            <w:r>
+              <w:rPr>
+                <w:rFonts w:ascii="Arial" w:hAnsi="Arial" w:cs="Arial"/>
+                <w:b/>
+                <w:bCs/>
+                <w:sz w:val="24"/>
+                <w:szCs w:val="24"/>
+              </w:rPr>
+              <w:t>Ini</w:t>
+            </w:r>
+            <w:proofErr w:type="spellEnd"/>
+          </w:p>
+        </w:tc>
+        <w:tc>
+          <w:tcPr>
+            <w:tcW w:w="1535" w:type="dxa"/>
+            <w:shd w:val="clear" w:color="auto" w:fill="262626" w:themeFill="text1" w:themeFillTint="D9"/>
+            <w:vAlign w:val="center"/>
+          </w:tcPr>
+          <w:p>
+            <w:pPr>
+              <w:jc w:val="center"/>
+              <w:rPr>
+                <w:rFonts w:ascii="Arial" w:hAnsi="Arial" w:cs="Arial"/>
+                <w:b/>
+                <w:bCs/>
+                <w:sz w:val="24"/>
+                <w:szCs w:val="24"/>
+              </w:rPr>
+            </w:pPr>
+            <w:proofErr w:type="spellStart"/>
+            <w:r>
+              <w:rPr>
+                <w:rFonts w:ascii="Arial" w:hAnsi="Arial" w:cs="Arial"/>
+                <w:b/>
+                <w:bCs/>
+                <w:sz w:val="24"/>
+                <w:szCs w:val="24"/>
+              </w:rPr>
+              <w:t>Hr</w:t>
+            </w:r>
+            <w:proofErr w:type="spellEnd"/>
+            <w:r>
+              <w:rPr>
+                <w:rFonts w:ascii="Arial" w:hAnsi="Arial" w:cs="Arial"/>
+                <w:b/>
+                <w:bCs/>
+                <w:sz w:val="24"/>
+                <w:szCs w:val="24"/>
+              </w:rPr>
+              <w:t>. fin</w:t>
+            </w:r>
+          </w:p>
+        </w:tc>
+        <w:tc>
+          <w:tcPr>
+            <w:tcW w:w="2480" w:type="dxa"/>
+            <w:shd w:val="clear" w:color="auto" w:fill="262626" w:themeFill="text1" w:themeFillTint="D9"/>
+            <w:vAlign w:val="center"/>
+          </w:tcPr>
+          <w:p>
+            <w:pPr>
+              <w:jc w:val="center"/>
+              <w:rPr>
+                <w:rFonts w:ascii="Arial" w:hAnsi="Arial" w:cs="Arial"/>
+                <w:b/>
+                <w:bCs/>
+                <w:sz w:val="24"/>
+                <w:szCs w:val="24"/>
+              </w:rPr>
+            </w:pPr>
+            <w:r>
+              <w:rPr>
+                <w:rFonts w:ascii="Arial" w:hAnsi="Arial" w:cs="Arial"/>
+                <w:b/>
+                <w:bCs/>
+                <w:sz w:val="24"/>
+                <w:szCs w:val="24"/>
+              </w:rPr>
+              <w:t>Estado (Completado / En proceso / Pendiente)</w:t>
+            </w:r>
+          </w:p>
+        </w:tc>
+      </w:tr>
+      <w:tr>
+        <w:trPr>
+          <w:jc w:val="center"/>
+        </w:trPr>
+        <w:tc>
+          <w:tcPr>
+            <w:tcW w:w="2955" w:type="dxa"/>
+          </w:tcPr>
+          <w:p>
+            <w:pPr>
+              <w:rPr>
+                <w:rFonts w:ascii="Arial" w:hAnsi="Arial" w:cs="Arial"/>
+                <w:sz w:val="24"/>
+                <w:szCs w:val="24"/>
+              </w:rPr>
+            </w:pPr>
+            <w:r>
+              <w:rPr>
+                <w:rFonts w:ascii="Arial" w:hAnsi="Arial" w:cs="Arial"/>
+                <w:sz w:val="24"/>
+                <w:szCs w:val="24"/>
+              </w:rPr>
+              <w:t>Bitácora</w:t>
+            </w:r>
+          </w:p>
+        </w:tc>
+        <w:tc>
+          <w:tcPr>
+            <w:tcW w:w="2004" w:type="dxa"/>
+          </w:tcPr>
+          <w:p>
+            <w:pPr>
+              <w:rPr>
+                <w:rFonts w:ascii="Arial" w:hAnsi="Arial" w:cs="Arial"/>
+                <w:sz w:val="24"/>
+                <w:szCs w:val="24"/>
+              </w:rPr>
+            </w:pPr>
+            <w:r>
+              <w:rPr>
+                <w:rFonts w:ascii="Arial" w:hAnsi="Arial" w:cs="Arial"/>
+                <w:sz w:val="24"/>
+                <w:szCs w:val="24"/>
+              </w:rPr>
+              <w:t>María Fernanda Barrón Álvarez</w:t>
+            </w:r>
+          </w:p>
+        </w:tc>
+        <w:tc>
+          <w:tcPr>
+            <w:tcW w:w="1150" w:type="dxa"/>
+          </w:tcPr>
+          <w:p>
+            <w:pPr>
+              <w:rPr>
+                <w:rFonts w:ascii="Arial" w:hAnsi="Arial" w:cs="Arial"/>
+                <w:sz w:val="24"/>
+                <w:szCs w:val="24"/>
+              </w:rPr>
+            </w:pPr>
+            <w:r>
+              <w:rPr>
+                <w:rFonts w:ascii="Arial" w:hAnsi="Arial" w:cs="Arial"/>
+                <w:sz w:val="24"/>
+                <w:szCs w:val="24"/>
+              </w:rPr>
+              <w:t>8:30pm</w:t>
+            </w:r>
+          </w:p>
+        </w:tc>
+        <w:tc>
+          <w:tcPr>
+            <w:tcW w:w="1535" w:type="dxa"/>
+          </w:tcPr>
+          <w:p>
+            <w:pPr>
+              <w:rPr>
+                <w:rFonts w:ascii="Arial" w:hAnsi="Arial" w:cs="Arial"/>
+                <w:sz w:val="24"/>
+                <w:szCs w:val="24"/>
+              </w:rPr>
+            </w:pPr>
+            <w:r>
+              <w:rPr>
+                <w:rFonts w:ascii="Arial" w:hAnsi="Arial" w:cs="Arial"/>
+                <w:sz w:val="24"/>
+                <w:szCs w:val="24"/>
+              </w:rPr>
+              <w:t>9:00pm</w:t>
+            </w:r>
+          </w:p>
+        </w:tc>
+        <w:tc>
+          <w:tcPr>
+            <w:tcW w:w="2480" w:type="dxa"/>
+          </w:tcPr>
+          <w:p>
+            <w:pPr>
+              <w:rPr>
+                <w:rFonts w:ascii="Arial" w:hAnsi="Arial" w:cs="Arial"/>
+                <w:sz w:val="24"/>
+                <w:szCs w:val="24"/>
+              </w:rPr>
+            </w:pPr>
+            <w:r>
+              <w:rPr>
+                <w:rFonts w:ascii="Arial" w:hAnsi="Arial" w:cs="Arial"/>
+                <w:sz w:val="24"/>
+                <w:szCs w:val="24"/>
+              </w:rPr>
+              <w:t>Completado</w:t>
+            </w:r>
+          </w:p>
+        </w:tc>
+      </w:tr>
+      <w:tr>
+        <w:trPr>
+          <w:jc w:val="center"/>
+        </w:trPr>
+        <w:tc>
+          <w:tcPr>
+            <w:tcW w:w="2955" w:type="dxa"/>
+          </w:tcPr>
+          <w:p>
+            <w:pPr>
+              <w:rPr>
+                <w:rFonts w:ascii="Arial" w:hAnsi="Arial" w:cs="Arial"/>
+                <w:sz w:val="24"/>
+                <w:szCs w:val="24"/>
+              </w:rPr>
+            </w:pPr>
+            <w:r>
+              <w:rPr>
+                <w:rFonts w:ascii="Arial" w:hAnsi="Arial" w:cs="Arial"/>
+                <w:sz w:val="24"/>
+                <w:szCs w:val="24"/>
+              </w:rPr>
+              <w:t>Comunicación con cliente</w:t>
+            </w:r>
+          </w:p>
+        </w:tc>
+        <w:tc>
+          <w:tcPr>
+            <w:tcW w:w="2004" w:type="dxa"/>
+          </w:tcPr>
+          <w:p>
+            <w:pPr>
+              <w:rPr>
+                <w:rFonts w:ascii="Arial" w:hAnsi="Arial" w:cs="Arial"/>
+                <w:sz w:val="24"/>
+                <w:szCs w:val="24"/>
+              </w:rPr>
+            </w:pPr>
+            <w:r>
+              <w:rPr>
+                <w:rFonts w:ascii="Arial" w:hAnsi="Arial" w:cs="Arial"/>
+                <w:sz w:val="24"/>
+                <w:szCs w:val="24"/>
+              </w:rPr>
+              <w:t>María Fernanda Barrón Álvarez</w:t>
+            </w:r>
+          </w:p>
+          <w:p>
+            <w:pPr>
+              <w:rPr>
+                <w:rFonts w:ascii="Arial" w:hAnsi="Arial" w:cs="Arial"/>
+                <w:sz w:val="24"/>
+                <w:szCs w:val="24"/>
+              </w:rPr>
+            </w:pPr>
+          </w:p>
+        </w:tc>
+        <w:tc>
+          <w:tcPr>
+            <w:tcW w:w="1150" w:type="dxa"/>
+          </w:tcPr>
+          <w:p>
+            <w:pPr>
+              <w:rPr>
+                <w:rFonts w:ascii="Arial" w:hAnsi="Arial" w:cs="Arial"/>
+                <w:sz w:val="24"/>
+                <w:szCs w:val="24"/>
+              </w:rPr>
+            </w:pPr>
+            <w:r>
+              <w:rPr>
+                <w:rFonts w:ascii="Arial" w:hAnsi="Arial" w:cs="Arial"/>
+                <w:sz w:val="24"/>
+                <w:szCs w:val="24"/>
+              </w:rPr>
+              <w:t>10:00am</w:t>
+            </w:r>
+          </w:p>
+        </w:tc>
+        <w:tc>
+          <w:tcPr>
+            <w:tcW w:w="1535" w:type="dxa"/>
+          </w:tcPr>
+          <w:p>
+            <w:pPr>
+              <w:rPr>
+                <w:rFonts w:ascii="Arial" w:hAnsi="Arial" w:cs="Arial"/>
+                <w:sz w:val="24"/>
+                <w:szCs w:val="24"/>
+              </w:rPr>
+            </w:pPr>
+            <w:r>
+              <w:rPr>
+                <w:rFonts w:ascii="Arial" w:hAnsi="Arial" w:cs="Arial"/>
+                <w:sz w:val="24"/>
+                <w:szCs w:val="24"/>
+              </w:rPr>
+              <w:t>10:30am</w:t>
+            </w:r>
+          </w:p>
+        </w:tc>
+        <w:tc>
+          <w:tcPr>
+            <w:tcW w:w="2480" w:type="dxa"/>
+          </w:tcPr>
+          <w:p>
+            <w:pPr>
+              <w:rPr>
+                <w:rFonts w:ascii="Arial" w:hAnsi="Arial" w:cs="Arial"/>
+                <w:sz w:val="24"/>
+                <w:szCs w:val="24"/>
+              </w:rPr>
+            </w:pPr>
+            <w:r>
+              <w:rPr>
+                <w:rFonts w:ascii="Arial" w:hAnsi="Arial" w:cs="Arial"/>
+                <w:sz w:val="24"/>
+                <w:szCs w:val="24"/>
+              </w:rPr>
+              <w:t>Completado</w:t>
+            </w:r>
+          </w:p>
+        </w:tc>
+      </w:tr>
+      <w:tr>
+        <w:trPr>
+          <w:jc w:val="center"/>
+        </w:trPr>
+        <w:tc>
+          <w:tcPr>
+            <w:tcW w:w="2955" w:type="dxa"/>
+          </w:tcPr>
+          <w:p>
+            <w:pPr>
+              <w:rPr>
+                <w:rFonts w:ascii="Arial" w:hAnsi="Arial" w:cs="Arial"/>
+                <w:sz w:val="24"/>
+                <w:szCs w:val="24"/>
+              </w:rPr>
+            </w:pPr>
+            <w:r>
+              <w:rPr>
+                <w:rFonts w:ascii="Arial" w:hAnsi="Arial" w:cs="Arial"/>
+                <w:sz w:val="24"/>
+                <w:szCs w:val="24"/>
+              </w:rPr>
+              <w:t xml:space="preserve">Análisis de </w:t>
+            </w:r>
+            <w:r>
+              <w:rPr>
+                <w:rFonts w:ascii="Arial" w:hAnsi="Arial" w:cs="Arial"/>
+                <w:sz w:val="24"/>
+                <w:szCs w:val="24"/>
+              </w:rPr>
+              <w:t>requerimientos funciones</w:t>
+            </w:r>
+          </w:p>
+        </w:tc>
+        <w:tc>
+          <w:tcPr>
+            <w:tcW w:w="2004" w:type="dxa"/>
+          </w:tcPr>
+          <w:p>
+            <w:pPr>
+              <w:rPr>
+                <w:rFonts w:ascii="Arial" w:hAnsi="Arial" w:cs="Arial"/>
+                <w:sz w:val="24"/>
+                <w:szCs w:val="24"/>
+              </w:rPr>
+            </w:pPr>
+            <w:r>
+              <w:rPr>
+                <w:rFonts w:ascii="Arial" w:hAnsi="Arial" w:cs="Arial"/>
+                <w:sz w:val="24"/>
+                <w:szCs w:val="24"/>
+              </w:rPr>
+              <w:t>Leonardo Merino Garfias</w:t>
+            </w:r>
+          </w:p>
+        </w:tc>
+        <w:tc>
+          <w:tcPr>
+            <w:tcW w:w="1150" w:type="dxa"/>
+          </w:tcPr>
+          <w:p>
+            <w:pPr>
+              <w:rPr>
+                <w:rFonts w:ascii="Arial" w:hAnsi="Arial" w:cs="Arial"/>
+                <w:sz w:val="24"/>
+                <w:szCs w:val="24"/>
+              </w:rPr>
+            </w:pPr>
+            <w:r>
+              <w:rPr>
+                <w:rFonts w:ascii="Arial" w:hAnsi="Arial" w:cs="Arial"/>
+                <w:sz w:val="24"/>
+                <w:szCs w:val="24"/>
+              </w:rPr>
+              <w:t>7:00pm</w:t>
+            </w:r>
+          </w:p>
+        </w:tc>
+        <w:tc>
+          <w:tcPr>
+            <w:tcW w:w="1535" w:type="dxa"/>
+          </w:tcPr>
+          <w:p>
+            <w:pPr>
+              <w:rPr>
+                <w:rFonts w:ascii="Arial" w:hAnsi="Arial" w:cs="Arial"/>
+                <w:sz w:val="24"/>
+                <w:szCs w:val="24"/>
+              </w:rPr>
+            </w:pPr>
+            <w:r>
+              <w:rPr>
+                <w:rFonts w:ascii="Arial" w:hAnsi="Arial" w:cs="Arial"/>
+                <w:sz w:val="24"/>
+                <w:szCs w:val="24"/>
+              </w:rPr>
+              <w:t>8:20pm</w:t>
+            </w:r>
+          </w:p>
+        </w:tc>
+        <w:tc>
+          <w:tcPr>
+            <w:tcW w:w="2480" w:type="dxa"/>
+          </w:tcPr>
+          <w:p>
+            <w:pPr>
+              <w:rPr>
+                <w:rFonts w:ascii="Arial" w:hAnsi="Arial" w:cs="Arial"/>
+                <w:sz w:val="24"/>
+                <w:szCs w:val="24"/>
+              </w:rPr>
+            </w:pPr>
+            <w:r>
+              <w:rPr>
+                <w:rFonts w:ascii="Arial" w:hAnsi="Arial" w:cs="Arial"/>
+                <w:sz w:val="24"/>
+                <w:szCs w:val="24"/>
+              </w:rPr>
+              <w:t>Completado</w:t>
+            </w:r>
+          </w:p>
+        </w:tc>
+      </w:tr>
+      <w:tr>
+        <w:trPr>
+          <w:jc w:val="center"/>
+        </w:trPr>
+        <w:tc>
+          <w:tcPr>
+            <w:tcW w:w="2955" w:type="dxa"/>
+          </w:tcPr>
+          <w:p>
+            <w:pPr>
+              <w:rPr>
+                <w:rFonts w:ascii="Arial" w:hAnsi="Arial" w:cs="Arial"/>
+                <w:sz w:val="24"/>
+                <w:szCs w:val="24"/>
+              </w:rPr>
+            </w:pPr>
+            <w:r>
+              <w:rPr>
+                <w:rFonts w:ascii="Arial" w:hAnsi="Arial" w:cs="Arial"/>
+                <w:sz w:val="24"/>
+                <w:szCs w:val="24"/>
+              </w:rPr>
+              <w:t>Análisis de re</w:t>
+            </w:r>
+            <w:r>
+              <w:rPr>
+                <w:rFonts w:ascii="Arial" w:hAnsi="Arial" w:cs="Arial"/>
+                <w:sz w:val="24"/>
+                <w:szCs w:val="24"/>
+              </w:rPr>
+              <w:t>querimientos no funcionales</w:t>
+            </w:r>
+          </w:p>
+        </w:tc>
+        <w:tc>
+          <w:tcPr>
+            <w:tcW w:w="2004" w:type="dxa"/>
+          </w:tcPr>
+          <w:p>
+            <w:pPr>
+              <w:rPr>
+                <w:rFonts w:ascii="Arial" w:hAnsi="Arial" w:cs="Arial"/>
+                <w:sz w:val="24"/>
+                <w:szCs w:val="24"/>
+              </w:rPr>
+            </w:pPr>
+            <w:r>
+              <w:rPr>
+                <w:rFonts w:ascii="Arial" w:hAnsi="Arial" w:cs="Arial"/>
+                <w:sz w:val="24"/>
+                <w:szCs w:val="24"/>
+              </w:rPr>
+              <w:t>Leslie Miroslava Benítez Marín</w:t>
+            </w:r>
+          </w:p>
+        </w:tc>
+        <w:tc>
+          <w:tcPr>
+            <w:tcW w:w="1150" w:type="dxa"/>
+          </w:tcPr>
+          <w:p>
+            <w:pPr>
+              <w:rPr>
+                <w:rFonts w:ascii="Arial" w:hAnsi="Arial" w:cs="Arial"/>
+                <w:sz w:val="24"/>
+                <w:szCs w:val="24"/>
+              </w:rPr>
+            </w:pPr>
+            <w:r>
+              <w:rPr>
+                <w:rFonts w:ascii="Arial" w:hAnsi="Arial" w:cs="Arial"/>
+                <w:sz w:val="24"/>
+                <w:szCs w:val="24"/>
+              </w:rPr>
+              <w:t>7:00pm</w:t>
+            </w:r>
+          </w:p>
+        </w:tc>
+        <w:tc>
+          <w:tcPr>
+            <w:tcW w:w="1535" w:type="dxa"/>
+          </w:tcPr>
+          <w:p>
+            <w:pPr>
+              <w:rPr>
+                <w:rFonts w:ascii="Arial" w:hAnsi="Arial" w:cs="Arial"/>
+                <w:sz w:val="24"/>
+                <w:szCs w:val="24"/>
+              </w:rPr>
+            </w:pPr>
+            <w:r>
+              <w:rPr>
+                <w:rFonts w:ascii="Arial" w:hAnsi="Arial" w:cs="Arial"/>
+                <w:sz w:val="24"/>
+                <w:szCs w:val="24"/>
+              </w:rPr>
+              <w:t>8:20pm</w:t>
+            </w:r>
+          </w:p>
+        </w:tc>
+        <w:tc>
+          <w:tcPr>
+            <w:tcW w:w="2480" w:type="dxa"/>
+          </w:tcPr>
+          <w:p>
+            <w:pPr>
+              <w:rPr>
+                <w:rFonts w:ascii="Arial" w:hAnsi="Arial" w:cs="Arial"/>
+                <w:sz w:val="24"/>
+                <w:szCs w:val="24"/>
+              </w:rPr>
+            </w:pPr>
+            <w:r>
+              <w:rPr>
+                <w:rFonts w:ascii="Arial" w:hAnsi="Arial" w:cs="Arial"/>
+                <w:sz w:val="24"/>
+                <w:szCs w:val="24"/>
+              </w:rPr>
+              <w:t>Completado</w:t>
+            </w:r>
+          </w:p>
+        </w:tc>
+      </w:tr>
+      <w:tr>
+        <w:trPr>
+          <w:jc w:val="center"/>
+        </w:trPr>
+        <w:tc>
+          <w:tcPr>
+            <w:tcW w:w="2955" w:type="dxa"/>
+          </w:tcPr>
+          <w:p>
+            <w:pPr>
+              <w:rPr>
+                <w:rFonts w:ascii="Arial" w:hAnsi="Arial" w:cs="Arial"/>
+                <w:sz w:val="24"/>
+                <w:szCs w:val="24"/>
+              </w:rPr>
+            </w:pPr>
+            <w:r>
+              <w:rPr>
+                <w:rFonts w:ascii="Arial" w:hAnsi="Arial" w:cs="Arial"/>
+                <w:sz w:val="24"/>
+                <w:szCs w:val="24"/>
+              </w:rPr>
+              <w:lastRenderedPageBreak/>
+              <w:t>Revisión de requisitos</w:t>
+            </w:r>
+          </w:p>
+        </w:tc>
+        <w:tc>
+          <w:tcPr>
+            <w:tcW w:w="2004" w:type="dxa"/>
+          </w:tcPr>
+          <w:p>
+            <w:pPr>
+              <w:rPr>
+                <w:rFonts w:ascii="Arial" w:hAnsi="Arial" w:cs="Arial"/>
+                <w:sz w:val="24"/>
+                <w:szCs w:val="24"/>
+              </w:rPr>
+            </w:pPr>
+            <w:r>
+              <w:rPr>
+                <w:rFonts w:ascii="Arial" w:hAnsi="Arial" w:cs="Arial"/>
+                <w:sz w:val="24"/>
+                <w:szCs w:val="24"/>
+              </w:rPr>
+              <w:t>María Fernanda Barrón Álvarez</w:t>
+            </w:r>
+          </w:p>
+        </w:tc>
+        <w:tc>
+          <w:tcPr>
+            <w:tcW w:w="1150" w:type="dxa"/>
+          </w:tcPr>
+          <w:p>
+            <w:pPr>
+              <w:rPr>
+                <w:rFonts w:ascii="Arial" w:hAnsi="Arial" w:cs="Arial"/>
+                <w:sz w:val="24"/>
+                <w:szCs w:val="24"/>
+              </w:rPr>
+            </w:pPr>
+            <w:r>
+              <w:rPr>
+                <w:rFonts w:ascii="Arial" w:hAnsi="Arial" w:cs="Arial"/>
+                <w:sz w:val="24"/>
+                <w:szCs w:val="24"/>
+              </w:rPr>
+              <w:t>8:20pm</w:t>
+            </w:r>
+          </w:p>
+        </w:tc>
+        <w:tc>
+          <w:tcPr>
+            <w:tcW w:w="1535" w:type="dxa"/>
+          </w:tcPr>
+          <w:p>
+            <w:pPr>
+              <w:rPr>
+                <w:rFonts w:ascii="Arial" w:hAnsi="Arial" w:cs="Arial"/>
+                <w:sz w:val="24"/>
+                <w:szCs w:val="24"/>
+              </w:rPr>
+            </w:pPr>
+            <w:r>
+              <w:rPr>
+                <w:rFonts w:ascii="Arial" w:hAnsi="Arial" w:cs="Arial"/>
+                <w:sz w:val="24"/>
+                <w:szCs w:val="24"/>
+              </w:rPr>
+              <w:t>8:30pm</w:t>
+            </w:r>
+          </w:p>
+        </w:tc>
+        <w:tc>
+          <w:tcPr>
+            <w:tcW w:w="2480" w:type="dxa"/>
+          </w:tcPr>
+          <w:p>
+            <w:pPr>
+              <w:rPr>
+                <w:rFonts w:ascii="Arial" w:hAnsi="Arial" w:cs="Arial"/>
+                <w:sz w:val="24"/>
+                <w:szCs w:val="24"/>
+              </w:rPr>
+            </w:pPr>
+            <w:r>
+              <w:rPr>
+                <w:rFonts w:ascii="Arial" w:hAnsi="Arial" w:cs="Arial"/>
+                <w:sz w:val="24"/>
+                <w:szCs w:val="24"/>
+              </w:rPr>
+              <w:t>Completado</w:t>
+            </w:r>
+          </w:p>
+        </w:tc>
+      </w:tr>
+      <w:tr>
+        <w:trPr>
+          <w:jc w:val="center"/>
+        </w:trPr>
+        <w:tc>
+          <w:tcPr>
+            <w:tcW w:w="2955" w:type="dxa"/>
+          </w:tcPr>
+          <w:p>
+            <w:pPr>
+              <w:rPr>
+                <w:rFonts w:ascii="Arial" w:hAnsi="Arial" w:cs="Arial"/>
+                <w:sz w:val="24"/>
+                <w:szCs w:val="24"/>
+              </w:rPr>
+            </w:pPr>
+            <w:r>
+              <w:rPr>
+                <w:rFonts w:ascii="Arial" w:hAnsi="Arial" w:cs="Arial"/>
+                <w:sz w:val="24"/>
+                <w:szCs w:val="24"/>
+              </w:rPr>
+              <w:t xml:space="preserve">Elaborar documento con </w:t>
+            </w:r>
+            <w:proofErr w:type="spellStart"/>
+            <w:r>
+              <w:rPr>
+                <w:rFonts w:ascii="Arial" w:hAnsi="Arial" w:cs="Arial"/>
+                <w:sz w:val="24"/>
+                <w:szCs w:val="24"/>
+              </w:rPr>
+              <w:t>requisistos</w:t>
+            </w:r>
+            <w:proofErr w:type="spellEnd"/>
+          </w:p>
+        </w:tc>
+        <w:tc>
+          <w:tcPr>
+            <w:tcW w:w="2004" w:type="dxa"/>
+          </w:tcPr>
+          <w:p>
+            <w:pPr>
+              <w:rPr>
+                <w:rFonts w:ascii="Arial" w:hAnsi="Arial" w:cs="Arial"/>
+                <w:sz w:val="24"/>
+                <w:szCs w:val="24"/>
+              </w:rPr>
+            </w:pPr>
+            <w:r>
+              <w:rPr>
+                <w:rFonts w:ascii="Arial" w:hAnsi="Arial" w:cs="Arial"/>
+                <w:sz w:val="24"/>
+                <w:szCs w:val="24"/>
+              </w:rPr>
+              <w:t>María Fernanda Barrón Álvarez</w:t>
+            </w:r>
+          </w:p>
+          <w:p>
+            <w:pPr>
+              <w:rPr>
+                <w:rFonts w:ascii="Arial" w:hAnsi="Arial" w:cs="Arial"/>
+                <w:sz w:val="24"/>
+                <w:szCs w:val="24"/>
+              </w:rPr>
+            </w:pPr>
+          </w:p>
+          <w:p>
+            <w:pPr>
+              <w:rPr>
+                <w:rFonts w:ascii="Arial" w:hAnsi="Arial" w:cs="Arial"/>
+                <w:sz w:val="24"/>
+                <w:szCs w:val="24"/>
+              </w:rPr>
+            </w:pPr>
+            <w:r>
+              <w:rPr>
+                <w:rFonts w:ascii="Arial" w:hAnsi="Arial" w:cs="Arial"/>
+                <w:sz w:val="24"/>
+                <w:szCs w:val="24"/>
+              </w:rPr>
+              <w:t>Leslie Miroslava Benítez Marín</w:t>
+            </w:r>
+          </w:p>
+          <w:p>
+            <w:pPr>
+              <w:rPr>
+                <w:rFonts w:ascii="Arial" w:hAnsi="Arial" w:cs="Arial"/>
+                <w:sz w:val="24"/>
+                <w:szCs w:val="24"/>
+              </w:rPr>
+            </w:pPr>
+          </w:p>
+          <w:p>
+            <w:pPr>
+              <w:rPr>
+                <w:rFonts w:ascii="Arial" w:hAnsi="Arial" w:cs="Arial"/>
+                <w:sz w:val="24"/>
+                <w:szCs w:val="24"/>
+              </w:rPr>
+            </w:pPr>
+            <w:r>
+              <w:rPr>
+                <w:rFonts w:ascii="Arial" w:hAnsi="Arial" w:cs="Arial"/>
+                <w:sz w:val="24"/>
+                <w:szCs w:val="24"/>
+              </w:rPr>
+              <w:t>Leonardo Merino Garfias</w:t>
+            </w:r>
+          </w:p>
+        </w:tc>
+        <w:tc>
+          <w:tcPr>
+            <w:tcW w:w="1150" w:type="dxa"/>
+          </w:tcPr>
+          <w:p>
+            <w:pPr>
+              <w:rPr>
+                <w:rFonts w:ascii="Arial" w:hAnsi="Arial" w:cs="Arial"/>
+                <w:sz w:val="24"/>
+                <w:szCs w:val="24"/>
+              </w:rPr>
+            </w:pPr>
+            <w:r>
+              <w:rPr>
+                <w:rFonts w:ascii="Arial" w:hAnsi="Arial" w:cs="Arial"/>
+                <w:sz w:val="24"/>
+                <w:szCs w:val="24"/>
+              </w:rPr>
+              <w:t>7:00pm</w:t>
+            </w:r>
+          </w:p>
+        </w:tc>
+        <w:tc>
+          <w:tcPr>
+            <w:tcW w:w="1535" w:type="dxa"/>
+          </w:tcPr>
+          <w:p>
+            <w:pPr>
+              <w:rPr>
+                <w:rFonts w:ascii="Arial" w:hAnsi="Arial" w:cs="Arial"/>
+                <w:sz w:val="24"/>
+                <w:szCs w:val="24"/>
+              </w:rPr>
+            </w:pPr>
+            <w:r>
+              <w:rPr>
+                <w:rFonts w:ascii="Arial" w:hAnsi="Arial" w:cs="Arial"/>
+                <w:sz w:val="24"/>
+                <w:szCs w:val="24"/>
+              </w:rPr>
+              <w:t>8:20pm</w:t>
+            </w:r>
+          </w:p>
+        </w:tc>
+        <w:tc>
+          <w:tcPr>
+            <w:tcW w:w="2480" w:type="dxa"/>
+          </w:tcPr>
+          <w:p>
+            <w:pPr>
+              <w:rPr>
+                <w:rFonts w:ascii="Arial" w:hAnsi="Arial" w:cs="Arial"/>
+                <w:sz w:val="24"/>
+                <w:szCs w:val="24"/>
+              </w:rPr>
+            </w:pPr>
+            <w:r>
+              <w:rPr>
+                <w:rFonts w:ascii="Arial" w:hAnsi="Arial" w:cs="Arial"/>
+                <w:sz w:val="24"/>
+                <w:szCs w:val="24"/>
+              </w:rPr>
+              <w:t>Completado</w:t>
+            </w:r>
+          </w:p>
+        </w:tc>
+      </w:tr>
+    </w:tbl>
+    <w:p/>
+    <w:p>
+      <w:pPr>
+        <w:pStyle w:val="titulo1"/>
+        <w:outlineLvl w:val="2"/>
+        <w:rPr>
+          <w:sz w:val="32"/>
+          <w:szCs w:val="72"/>
+        </w:rPr>
+      </w:pPr>
+      <w:r>
+        <w:rPr>
+          <w:sz w:val="32"/>
+          <w:szCs w:val="72"/>
+        </w:rPr>
+        <w:t>Gestión de Riesgos e Incidencias</w:t>
+      </w:r>
+    </w:p>
+    <w:tbl>
+      <w:tblPr>
+        <w:tblStyle w:val="Tablaconcuadrcula"/>
+        <w:tblW w:w="9634" w:type="dxa"/>
+        <w:jc w:val="center"/>
+        <w:tblCellMar>
+          <w:top w:w="57" w:type="dxa"/>
+          <w:bottom w:w="57" w:type="dxa"/>
+        </w:tblCellMar>
+        <w:tblLook w:val="04A0" w:firstRow="1" w:lastRow="0" w:firstColumn="1" w:lastColumn="0" w:noHBand="0" w:noVBand="1"/>
+      </w:tblPr>
+      <w:tblGrid>
+        <w:gridCol w:w="2942"/>
+        <w:gridCol w:w="2943"/>
+        <w:gridCol w:w="3749"/>
+      </w:tblGrid>
+      <w:tr>
+        <w:trPr>
+          <w:jc w:val="center"/>
+        </w:trPr>
+        <w:tc>
+          <w:tcPr>
+            <w:tcW w:w="2942" w:type="dxa"/>
+            <w:tcBorders>
+              <w:top w:val="single" w:sz="4" w:space="0" w:color="7F7F7F" w:themeColor="text1" w:themeTint="80"/>
+              <w:left w:val="single" w:sz="4" w:space="0" w:color="7F7F7F" w:themeColor="text1" w:themeTint="80"/>
+              <w:bottom w:val="single" w:sz="4" w:space="0" w:color="7F7F7F" w:themeColor="text1" w:themeTint="80"/>
+              <w:right w:val="single" w:sz="4" w:space="0" w:color="7F7F7F" w:themeColor="text1" w:themeTint="80"/>
+            </w:tcBorders>
+            <w:shd w:val="clear" w:color="auto" w:fill="262626" w:themeFill="text1" w:themeFillTint="D9"/>
+            <w:vAlign w:val="center"/>
+          </w:tcPr>
+          <w:p>
+            <w:pPr>
+              <w:jc w:val="center"/>
+              <w:rPr>
+                <w:rFonts w:ascii="Arial" w:hAnsi="Arial" w:cs="Arial"/>
+                <w:b/>
+                <w:bCs/>
+                <w:sz w:val="24"/>
+                <w:szCs w:val="24"/>
+              </w:rPr>
+            </w:pPr>
+            <w:r>
+              <w:rPr>
+                <w:rFonts w:ascii="Arial" w:hAnsi="Arial" w:cs="Arial"/>
+                <w:b/>
+                <w:bCs/>
+                <w:sz w:val="24"/>
+                <w:szCs w:val="24"/>
+              </w:rPr>
+              <w:t>Riesgo / Problema detectado</w:t>
+            </w:r>
+          </w:p>
+        </w:tc>
+        <w:tc>
+          <w:tcPr>
+            <w:tcW w:w="2943" w:type="dxa"/>
+            <w:tcBorders>
+              <w:top w:val="single" w:sz="4" w:space="0" w:color="7F7F7F" w:themeColor="text1" w:themeTint="80"/>
+              <w:left w:val="single" w:sz="4" w:space="0" w:color="7F7F7F" w:themeColor="text1" w:themeTint="80"/>
+              <w:bottom w:val="single" w:sz="4" w:space="0" w:color="7F7F7F" w:themeColor="text1" w:themeTint="80"/>
+              <w:right w:val="single" w:sz="4" w:space="0" w:color="7F7F7F" w:themeColor="text1" w:themeTint="80"/>
+            </w:tcBorders>
+            <w:shd w:val="clear" w:color="auto" w:fill="262626" w:themeFill="text1" w:themeFillTint="D9"/>
+            <w:vAlign w:val="center"/>
+          </w:tcPr>
+          <w:p>
+            <w:pPr>
+              <w:jc w:val="center"/>
+              <w:rPr>
+                <w:rFonts w:ascii="Arial" w:hAnsi="Arial" w:cs="Arial"/>
+                <w:b/>
+                <w:bCs/>
+                <w:sz w:val="24"/>
+                <w:szCs w:val="24"/>
+              </w:rPr>
+            </w:pPr>
+            <w:r>
+              <w:rPr>
+                <w:rFonts w:ascii="Arial" w:hAnsi="Arial" w:cs="Arial"/>
+                <w:b/>
+                <w:bCs/>
+                <w:sz w:val="24"/>
+                <w:szCs w:val="24"/>
+              </w:rPr>
+              <w:t>Impacto en alcance/tiempo/costo</w:t>
+            </w:r>
+          </w:p>
+        </w:tc>
+        <w:tc>
+          <w:tcPr>
+            <w:tcW w:w="3749" w:type="dxa"/>
+            <w:tcBorders>
+              <w:top w:val="single" w:sz="4" w:space="0" w:color="7F7F7F" w:themeColor="text1" w:themeTint="80"/>
+              <w:left w:val="single" w:sz="4" w:space="0" w:color="7F7F7F" w:themeColor="text1" w:themeTint="80"/>
+              <w:bottom w:val="single" w:sz="4" w:space="0" w:color="7F7F7F" w:themeColor="text1" w:themeTint="80"/>
+              <w:right w:val="single" w:sz="4" w:space="0" w:color="7F7F7F" w:themeColor="text1" w:themeTint="80"/>
+            </w:tcBorders>
+            <w:shd w:val="clear" w:color="auto" w:fill="262626" w:themeFill="text1" w:themeFillTint="D9"/>
+            <w:vAlign w:val="center"/>
+          </w:tcPr>
+          <w:p>
+            <w:pPr>
+              <w:jc w:val="center"/>
+              <w:rPr>
+                <w:rFonts w:ascii="Arial" w:hAnsi="Arial" w:cs="Arial"/>
+                <w:b/>
+                <w:bCs/>
+                <w:sz w:val="24"/>
+                <w:szCs w:val="24"/>
+              </w:rPr>
+            </w:pPr>
+            <w:r>
+              <w:rPr>
+                <w:rFonts w:ascii="Arial" w:hAnsi="Arial" w:cs="Arial"/>
+                <w:b/>
+                <w:bCs/>
+                <w:sz w:val="24"/>
+                <w:szCs w:val="24"/>
+              </w:rPr>
+              <w:t>Acción correctiva o preventiva</w:t>
+            </w:r>
+          </w:p>
+        </w:tc>
+      </w:tr>
+      <w:tr>
+        <w:trPr>
+          <w:jc w:val="center"/>
+        </w:trPr>
+        <w:tc>
+          <w:tcPr>
+            <w:tcW w:w="2942" w:type="dxa"/>
+            <w:tcBorders>
+              <w:top w:val="single" w:sz="4" w:space="0" w:color="7F7F7F" w:themeColor="text1" w:themeTint="80"/>
+            </w:tcBorders>
+          </w:tcPr>
+          <w:p>
+            <w:pPr>
+              <w:rPr>
+                <w:rFonts w:ascii="Arial" w:hAnsi="Arial" w:cs="Arial"/>
+                <w:sz w:val="24"/>
+                <w:szCs w:val="24"/>
+              </w:rPr>
+            </w:pPr>
+            <w:r>
+              <w:rPr>
+                <w:rFonts w:ascii="Arial" w:hAnsi="Arial" w:cs="Arial"/>
+                <w:sz w:val="24"/>
+                <w:szCs w:val="24"/>
+              </w:rPr>
+              <w:t xml:space="preserve">Tiempo de renderizado en algunos archivos. </w:t>
+            </w:r>
+          </w:p>
+        </w:tc>
+        <w:tc>
+          <w:tcPr>
+            <w:tcW w:w="2943" w:type="dxa"/>
+            <w:tcBorders>
+              <w:top w:val="single" w:sz="4" w:space="0" w:color="7F7F7F" w:themeColor="text1" w:themeTint="80"/>
+            </w:tcBorders>
+          </w:tcPr>
+          <w:p>
+            <w:pPr>
+              <w:jc w:val="center"/>
+              <w:rPr>
+                <w:rFonts w:ascii="Arial" w:hAnsi="Arial" w:cs="Arial"/>
+                <w:sz w:val="24"/>
+                <w:szCs w:val="24"/>
+              </w:rPr>
+            </w:pPr>
+            <w:r>
+              <w:rPr>
+                <w:rFonts w:ascii="Arial" w:hAnsi="Arial" w:cs="Arial"/>
+                <w:sz w:val="24"/>
+                <w:szCs w:val="24"/>
+              </w:rPr>
+              <w:t>Alcance</w:t>
+            </w:r>
+          </w:p>
+        </w:tc>
+        <w:tc>
+          <w:tcPr>
+            <w:tcW w:w="3749" w:type="dxa"/>
+            <w:tcBorders>
+              <w:top w:val="single" w:sz="4" w:space="0" w:color="7F7F7F" w:themeColor="text1" w:themeTint="80"/>
+            </w:tcBorders>
+          </w:tcPr>
+          <w:p>
+            <w:pPr>
+              <w:rPr>
+                <w:rFonts w:ascii="Arial" w:hAnsi="Arial" w:cs="Arial"/>
+                <w:sz w:val="24"/>
+                <w:szCs w:val="24"/>
+              </w:rPr>
+            </w:pPr>
+            <w:r>
+              <w:rPr>
+                <w:rFonts w:ascii="Arial" w:hAnsi="Arial" w:cs="Arial"/>
+                <w:sz w:val="24"/>
+                <w:szCs w:val="24"/>
+              </w:rPr>
+              <w:t xml:space="preserve">Conocimiento de extensión y manejo de archivos que trabaja el cliente. </w:t>
+            </w:r>
+          </w:p>
+        </w:tc>
+      </w:tr>
+    </w:tbl>
+    <w:p/>
+    <w:p>
+      <w:r>
+        <w:br w:type="page"/>
+      </w:r>
+    </w:p>
+    <w:p>
+      <w:pPr>
+        <w:pStyle w:val="Ttulo0"/>
+        <w:jc w:val="both"/>
+        <w:outlineLvl w:val="0"/>
+      </w:pPr>
       <w:bookmarkStart w:id="25" w:name="_Toc226054387"/>
       <w:r>
+        <w:lastRenderedPageBreak/>
         <w:t>Referencias</w:t>
       </w:r>
       <w:bookmarkEnd w:id="25"/>
@@ -16034,7 +18827,6 @@
         <w:docPartUnique/>
       </w:docPartObj>
     </w:sdtPr>
-    <w:sdtEndPr/>
     <w:sdtContent>
       <w:p>
         <w:pPr>
@@ -22811,6 +25603,7 @@
   <w:style w:type="character" w:default="1" w:styleId="Fuentedeprrafopredeter">
     <w:name w:val="Default Paragraph Font"/>
     <w:uiPriority w:val="1"/>
+    <w:semiHidden/>
     <w:unhideWhenUsed/>
   </w:style>
   <w:style w:type="table" w:default="1" w:styleId="Tablanormal">

</xml_diff>

<commit_message>
:memo: Modificando documentación final. Resumen ejecutivo y Descripción de proyecto.
</commit_message>
<xml_diff>
--- a/BITACORA.docx
+++ b/BITACORA.docx
@@ -3172,7 +3172,7 @@
                 <w:noProof/>
                 <w:webHidden/>
               </w:rPr>
-              <w:t>17</w:t>
+              <w:t>19</w:t>
             </w:r>
             <w:r>
               <w:rPr>
@@ -17916,6 +17916,7 @@
           <w:sz w:val="32"/>
           <w:szCs w:val="72"/>
         </w:rPr>
+        <w:lastRenderedPageBreak/>
         <w:t>A</w:t>
       </w:r>
       <w:r>
@@ -18806,6 +18807,7 @@
                 <w:sz w:val="28"/>
                 <w:szCs w:val="28"/>
               </w:rPr>
+              <w:lastRenderedPageBreak/>
               <w:t xml:space="preserve">Día </w:t>
             </w:r>
             <w:r>
@@ -20551,6 +20553,7 @@
                 <w:sz w:val="24"/>
                 <w:szCs w:val="24"/>
               </w:rPr>
+              <w:lastRenderedPageBreak/>
               <w:t>Integración de referencias y formato final</w:t>
             </w:r>
           </w:p>
@@ -21207,6 +21210,2319 @@
       </w:tr>
     </w:tbl>
     <w:p/>
+    <w:p>
+      <w:r>
+        <w:br w:type="page"/>
+      </w:r>
+    </w:p>
+    <w:p>
+      <w:pPr>
+        <w:pStyle w:val="Ttulo0"/>
+        <w:jc w:val="both"/>
+        <w:outlineLvl w:val="0"/>
+      </w:pPr>
+      <w:r>
+        <w:lastRenderedPageBreak/>
+        <w:t xml:space="preserve">Semana del </w:t>
+      </w:r>
+      <w:r>
+        <w:t>11</w:t>
+      </w:r>
+      <w:r>
+        <w:t xml:space="preserve"> de mayo al </w:t>
+      </w:r>
+      <w:r>
+        <w:t>15</w:t>
+      </w:r>
+      <w:r>
+        <w:t xml:space="preserve"> de mayo</w:t>
+      </w:r>
+    </w:p>
+    <w:p>
+      <w:r>
+        <w:rPr>
+          <w:b/>
+          <w:bCs/>
+        </w:rPr>
+        <w:t>Objetivo:</w:t>
+      </w:r>
+      <w:r>
+        <w:t xml:space="preserve"> </w:t>
+      </w:r>
+      <w:r>
+        <w:t>Comenzar documentación final</w:t>
+      </w:r>
+      <w:r>
+        <w:t>.</w:t>
+      </w:r>
+    </w:p>
+    <w:tbl>
+      <w:tblPr>
+        <w:tblStyle w:val="Tablaconcuadrcula"/>
+        <w:tblW w:w="9634" w:type="dxa"/>
+        <w:jc w:val="center"/>
+        <w:tblBorders>
+          <w:top w:val="single" w:sz="4" w:space="0" w:color="7F7F7F" w:themeColor="text1" w:themeTint="80"/>
+          <w:left w:val="single" w:sz="4" w:space="0" w:color="7F7F7F" w:themeColor="text1" w:themeTint="80"/>
+          <w:bottom w:val="single" w:sz="4" w:space="0" w:color="7F7F7F" w:themeColor="text1" w:themeTint="80"/>
+          <w:right w:val="single" w:sz="4" w:space="0" w:color="7F7F7F" w:themeColor="text1" w:themeTint="80"/>
+          <w:insideH w:val="single" w:sz="4" w:space="0" w:color="7F7F7F" w:themeColor="text1" w:themeTint="80"/>
+        </w:tblBorders>
+        <w:tblCellMar>
+          <w:top w:w="57" w:type="dxa"/>
+          <w:bottom w:w="57" w:type="dxa"/>
+        </w:tblCellMar>
+        <w:tblLook w:val="04A0" w:firstRow="1" w:lastRow="0" w:firstColumn="1" w:lastColumn="0" w:noHBand="0" w:noVBand="1"/>
+      </w:tblPr>
+      <w:tblGrid>
+        <w:gridCol w:w="5098"/>
+        <w:gridCol w:w="4536"/>
+      </w:tblGrid>
+      <w:tr>
+        <w:trPr>
+          <w:trHeight w:val="583"/>
+          <w:jc w:val="center"/>
+        </w:trPr>
+        <w:tc>
+          <w:tcPr>
+            <w:tcW w:w="9634" w:type="dxa"/>
+            <w:gridSpan w:val="2"/>
+            <w:shd w:val="clear" w:color="auto" w:fill="262626" w:themeFill="text1" w:themeFillTint="D9"/>
+            <w:vAlign w:val="center"/>
+          </w:tcPr>
+          <w:p>
+            <w:pPr>
+              <w:pStyle w:val="Ttulo2"/>
+              <w:rPr>
+                <w:rFonts w:ascii="Aptos" w:hAnsi="Aptos"/>
+                <w:b/>
+                <w:bCs/>
+                <w:color w:val="FFFFFF" w:themeColor="background1"/>
+                <w:sz w:val="28"/>
+                <w:szCs w:val="28"/>
+              </w:rPr>
+            </w:pPr>
+            <w:r>
+              <w:rPr>
+                <w:rFonts w:ascii="Aptos" w:hAnsi="Aptos"/>
+                <w:b/>
+                <w:bCs/>
+                <w:color w:val="FFFFFF" w:themeColor="background1"/>
+                <w:sz w:val="28"/>
+                <w:szCs w:val="28"/>
+              </w:rPr>
+              <w:t>Día 1: E</w:t>
+            </w:r>
+            <w:r>
+              <w:rPr>
+                <w:rFonts w:ascii="Aptos" w:hAnsi="Aptos"/>
+                <w:b/>
+                <w:bCs/>
+                <w:color w:val="FFFFFF" w:themeColor="background1"/>
+                <w:sz w:val="28"/>
+                <w:szCs w:val="28"/>
+              </w:rPr>
+              <w:t>laboración de la Matriz de Responsabilidades</w:t>
+            </w:r>
+          </w:p>
+        </w:tc>
+      </w:tr>
+      <w:tr>
+        <w:trPr>
+          <w:jc w:val="center"/>
+        </w:trPr>
+        <w:tc>
+          <w:tcPr>
+            <w:tcW w:w="9634" w:type="dxa"/>
+            <w:gridSpan w:val="2"/>
+            <w:vAlign w:val="center"/>
+          </w:tcPr>
+          <w:p>
+            <w:pPr>
+              <w:rPr>
+                <w:rFonts w:ascii="Arial" w:hAnsi="Arial" w:cs="Arial"/>
+                <w:sz w:val="24"/>
+                <w:szCs w:val="24"/>
+              </w:rPr>
+            </w:pPr>
+            <w:r>
+              <w:rPr>
+                <w:rFonts w:ascii="Arial" w:hAnsi="Arial" w:cs="Arial"/>
+                <w:b/>
+                <w:bCs/>
+                <w:sz w:val="24"/>
+                <w:szCs w:val="24"/>
+              </w:rPr>
+              <w:t xml:space="preserve">Nombre del Proyecto: </w:t>
+            </w:r>
+            <w:r>
+              <w:rPr>
+                <w:rFonts w:ascii="Arial" w:hAnsi="Arial" w:cs="Arial"/>
+                <w:sz w:val="24"/>
+                <w:szCs w:val="24"/>
+              </w:rPr>
+              <w:t>Portafolio Digital de Arquitecto</w:t>
+            </w:r>
+          </w:p>
+        </w:tc>
+      </w:tr>
+      <w:tr>
+        <w:trPr>
+          <w:jc w:val="center"/>
+        </w:trPr>
+        <w:tc>
+          <w:tcPr>
+            <w:tcW w:w="5098" w:type="dxa"/>
+            <w:vAlign w:val="center"/>
+          </w:tcPr>
+          <w:p>
+            <w:pPr>
+              <w:rPr>
+                <w:rFonts w:ascii="Arial" w:hAnsi="Arial" w:cs="Arial"/>
+                <w:b/>
+                <w:bCs/>
+                <w:sz w:val="24"/>
+                <w:szCs w:val="24"/>
+              </w:rPr>
+            </w:pPr>
+            <w:r>
+              <w:rPr>
+                <w:rFonts w:ascii="Arial" w:hAnsi="Arial" w:cs="Arial"/>
+                <w:b/>
+                <w:bCs/>
+                <w:sz w:val="24"/>
+                <w:szCs w:val="24"/>
+              </w:rPr>
+              <w:t xml:space="preserve">Equipo No.: </w:t>
+            </w:r>
+            <w:r>
+              <w:rPr>
+                <w:rFonts w:ascii="Arial" w:hAnsi="Arial" w:cs="Arial"/>
+                <w:b/>
+                <w:bCs/>
+                <w:sz w:val="24"/>
+                <w:szCs w:val="24"/>
+              </w:rPr>
+              <w:tab/>
+            </w:r>
+            <w:r>
+              <w:rPr>
+                <w:rFonts w:ascii="Arial" w:hAnsi="Arial" w:cs="Arial"/>
+                <w:sz w:val="24"/>
+                <w:szCs w:val="24"/>
+              </w:rPr>
+              <w:t>6</w:t>
+            </w:r>
+          </w:p>
+        </w:tc>
+        <w:tc>
+          <w:tcPr>
+            <w:tcW w:w="4536" w:type="dxa"/>
+            <w:vAlign w:val="center"/>
+          </w:tcPr>
+          <w:p>
+            <w:pPr>
+              <w:rPr>
+                <w:rFonts w:ascii="Arial" w:hAnsi="Arial" w:cs="Arial"/>
+                <w:b/>
+                <w:bCs/>
+                <w:sz w:val="24"/>
+                <w:szCs w:val="24"/>
+              </w:rPr>
+            </w:pPr>
+            <w:r>
+              <w:rPr>
+                <w:rFonts w:ascii="Arial" w:hAnsi="Arial" w:cs="Arial"/>
+                <w:b/>
+                <w:bCs/>
+                <w:sz w:val="24"/>
+                <w:szCs w:val="24"/>
+              </w:rPr>
+              <w:t>Fecha:</w:t>
+            </w:r>
+            <w:r>
+              <w:rPr>
+                <w:rFonts w:ascii="Arial" w:hAnsi="Arial" w:cs="Arial"/>
+                <w:b/>
+                <w:bCs/>
+                <w:sz w:val="24"/>
+                <w:szCs w:val="24"/>
+              </w:rPr>
+              <w:t xml:space="preserve"> </w:t>
+            </w:r>
+            <w:r>
+              <w:rPr>
+                <w:rFonts w:ascii="Arial" w:hAnsi="Arial" w:cs="Arial"/>
+                <w:sz w:val="24"/>
+                <w:szCs w:val="24"/>
+              </w:rPr>
+              <w:t>12</w:t>
+            </w:r>
+            <w:r>
+              <w:rPr>
+                <w:rFonts w:ascii="Arial" w:hAnsi="Arial" w:cs="Arial"/>
+                <w:sz w:val="24"/>
+                <w:szCs w:val="24"/>
+              </w:rPr>
+              <w:t>/0</w:t>
+            </w:r>
+            <w:r>
+              <w:rPr>
+                <w:rFonts w:ascii="Arial" w:hAnsi="Arial" w:cs="Arial"/>
+                <w:sz w:val="24"/>
+                <w:szCs w:val="24"/>
+              </w:rPr>
+              <w:t>5</w:t>
+            </w:r>
+            <w:r>
+              <w:rPr>
+                <w:rFonts w:ascii="Arial" w:hAnsi="Arial" w:cs="Arial"/>
+                <w:sz w:val="24"/>
+                <w:szCs w:val="24"/>
+              </w:rPr>
+              <w:t>/202</w:t>
+            </w:r>
+            <w:r>
+              <w:rPr>
+                <w:rFonts w:ascii="Arial" w:hAnsi="Arial" w:cs="Arial"/>
+                <w:sz w:val="24"/>
+                <w:szCs w:val="24"/>
+              </w:rPr>
+              <w:t>6</w:t>
+            </w:r>
+          </w:p>
+        </w:tc>
+      </w:tr>
+      <w:tr>
+        <w:trPr>
+          <w:jc w:val="center"/>
+        </w:trPr>
+        <w:tc>
+          <w:tcPr>
+            <w:tcW w:w="5098" w:type="dxa"/>
+            <w:vAlign w:val="center"/>
+          </w:tcPr>
+          <w:p>
+            <w:pPr>
+              <w:rPr>
+                <w:rFonts w:ascii="Arial" w:hAnsi="Arial" w:cs="Arial"/>
+                <w:b/>
+                <w:bCs/>
+                <w:sz w:val="24"/>
+                <w:szCs w:val="24"/>
+              </w:rPr>
+            </w:pPr>
+            <w:r>
+              <w:rPr>
+                <w:rFonts w:ascii="Arial" w:hAnsi="Arial" w:cs="Arial"/>
+                <w:b/>
+                <w:bCs/>
+                <w:sz w:val="24"/>
+                <w:szCs w:val="24"/>
+              </w:rPr>
+              <w:t xml:space="preserve">Número de sesión / Día de trabajo: </w:t>
+            </w:r>
+            <w:r>
+              <w:rPr>
+                <w:rFonts w:ascii="Arial" w:hAnsi="Arial" w:cs="Arial"/>
+                <w:sz w:val="24"/>
+                <w:szCs w:val="24"/>
+              </w:rPr>
+              <w:t>1</w:t>
+            </w:r>
+          </w:p>
+        </w:tc>
+        <w:tc>
+          <w:tcPr>
+            <w:tcW w:w="4536" w:type="dxa"/>
+            <w:vAlign w:val="center"/>
+          </w:tcPr>
+          <w:p>
+            <w:pPr>
+              <w:rPr>
+                <w:rFonts w:ascii="Arial" w:hAnsi="Arial" w:cs="Arial"/>
+                <w:b/>
+                <w:bCs/>
+                <w:sz w:val="24"/>
+                <w:szCs w:val="24"/>
+              </w:rPr>
+            </w:pPr>
+            <w:r>
+              <w:rPr>
+                <w:rFonts w:ascii="Arial" w:hAnsi="Arial" w:cs="Arial"/>
+                <w:b/>
+                <w:bCs/>
+                <w:sz w:val="24"/>
+                <w:szCs w:val="24"/>
+              </w:rPr>
+              <w:t xml:space="preserve">Modalidad: </w:t>
+            </w:r>
+            <w:r>
+              <w:rPr>
+                <w:rFonts w:ascii="Arial" w:hAnsi="Arial" w:cs="Arial"/>
+                <w:sz w:val="24"/>
+                <w:szCs w:val="24"/>
+                <w:shd w:val="clear" w:color="auto" w:fill="F5E4A9" w:themeFill="accent3" w:themeFillTint="66"/>
+              </w:rPr>
+              <w:t>Presencial</w:t>
+            </w:r>
+            <w:r>
+              <w:rPr>
+                <w:rFonts w:ascii="Arial" w:hAnsi="Arial" w:cs="Arial"/>
+                <w:sz w:val="24"/>
+                <w:szCs w:val="24"/>
+              </w:rPr>
+              <w:t xml:space="preserve"> / </w:t>
+            </w:r>
+            <w:r>
+              <w:rPr>
+                <w:rFonts w:ascii="Arial" w:hAnsi="Arial" w:cs="Arial"/>
+                <w:sz w:val="24"/>
+                <w:szCs w:val="24"/>
+              </w:rPr>
+              <w:t>Virtual</w:t>
+            </w:r>
+            <w:r>
+              <w:rPr>
+                <w:rFonts w:ascii="Arial" w:hAnsi="Arial" w:cs="Arial"/>
+                <w:sz w:val="24"/>
+                <w:szCs w:val="24"/>
+              </w:rPr>
+              <w:t xml:space="preserve"> / </w:t>
+            </w:r>
+            <w:r>
+              <w:rPr>
+                <w:rFonts w:ascii="Arial" w:hAnsi="Arial" w:cs="Arial"/>
+                <w:sz w:val="24"/>
+                <w:szCs w:val="24"/>
+              </w:rPr>
+              <w:t>Mixto</w:t>
+            </w:r>
+          </w:p>
+        </w:tc>
+      </w:tr>
+      <w:tr>
+        <w:trPr>
+          <w:jc w:val="center"/>
+        </w:trPr>
+        <w:tc>
+          <w:tcPr>
+            <w:tcW w:w="9634" w:type="dxa"/>
+            <w:gridSpan w:val="2"/>
+            <w:vAlign w:val="center"/>
+          </w:tcPr>
+          <w:p>
+            <w:pPr>
+              <w:rPr>
+                <w:rFonts w:ascii="Arial" w:hAnsi="Arial" w:cs="Arial"/>
+                <w:b/>
+                <w:bCs/>
+                <w:sz w:val="24"/>
+                <w:szCs w:val="24"/>
+              </w:rPr>
+            </w:pPr>
+            <w:r>
+              <w:rPr>
+                <w:rFonts w:ascii="Arial" w:hAnsi="Arial" w:cs="Arial"/>
+                <w:b/>
+                <w:bCs/>
+                <w:sz w:val="24"/>
+                <w:szCs w:val="24"/>
+              </w:rPr>
+              <w:t>Duración de la sesión:</w:t>
+            </w:r>
+            <w:r>
+              <w:rPr>
+                <w:rFonts w:ascii="Arial" w:hAnsi="Arial" w:cs="Arial"/>
+                <w:b/>
+                <w:bCs/>
+                <w:sz w:val="24"/>
+                <w:szCs w:val="24"/>
+              </w:rPr>
+              <w:t xml:space="preserve"> </w:t>
+            </w:r>
+            <w:r>
+              <w:rPr>
+                <w:rFonts w:ascii="Arial" w:hAnsi="Arial" w:cs="Arial"/>
+                <w:sz w:val="24"/>
+                <w:szCs w:val="24"/>
+              </w:rPr>
+              <w:t xml:space="preserve">1 </w:t>
+            </w:r>
+            <w:proofErr w:type="spellStart"/>
+            <w:r>
+              <w:rPr>
+                <w:rFonts w:ascii="Arial" w:hAnsi="Arial" w:cs="Arial"/>
+                <w:sz w:val="24"/>
+                <w:szCs w:val="24"/>
+              </w:rPr>
+              <w:t>hr</w:t>
+            </w:r>
+            <w:proofErr w:type="spellEnd"/>
+          </w:p>
+        </w:tc>
+      </w:tr>
+    </w:tbl>
+    <w:p>
+      <w:pPr>
+        <w:rPr>
+          <w:rFonts w:ascii="Arial" w:hAnsi="Arial" w:cs="Arial"/>
+          <w:sz w:val="24"/>
+          <w:szCs w:val="24"/>
+        </w:rPr>
+      </w:pPr>
+    </w:p>
+    <w:p>
+      <w:pPr>
+        <w:pStyle w:val="titulo1"/>
+        <w:outlineLvl w:val="2"/>
+        <w:rPr>
+          <w:sz w:val="32"/>
+          <w:szCs w:val="72"/>
+        </w:rPr>
+      </w:pPr>
+      <w:r>
+        <w:rPr>
+          <w:sz w:val="32"/>
+          <w:szCs w:val="72"/>
+        </w:rPr>
+        <w:t>Asistencia y Participación</w:t>
+      </w:r>
+    </w:p>
+    <w:tbl>
+      <w:tblPr>
+        <w:tblStyle w:val="Tablaconcuadrcula"/>
+        <w:tblW w:w="10281" w:type="dxa"/>
+        <w:jc w:val="center"/>
+        <w:tblBorders>
+          <w:top w:val="single" w:sz="4" w:space="0" w:color="7F7F7F" w:themeColor="text1" w:themeTint="80"/>
+          <w:left w:val="single" w:sz="4" w:space="0" w:color="7F7F7F" w:themeColor="text1" w:themeTint="80"/>
+          <w:bottom w:val="single" w:sz="4" w:space="0" w:color="7F7F7F" w:themeColor="text1" w:themeTint="80"/>
+          <w:right w:val="single" w:sz="4" w:space="0" w:color="7F7F7F" w:themeColor="text1" w:themeTint="80"/>
+          <w:insideH w:val="single" w:sz="4" w:space="0" w:color="7F7F7F" w:themeColor="text1" w:themeTint="80"/>
+          <w:insideV w:val="single" w:sz="4" w:space="0" w:color="7F7F7F" w:themeColor="text1" w:themeTint="80"/>
+        </w:tblBorders>
+        <w:tblCellMar>
+          <w:top w:w="57" w:type="dxa"/>
+          <w:bottom w:w="57" w:type="dxa"/>
+        </w:tblCellMar>
+        <w:tblLook w:val="04A0" w:firstRow="1" w:lastRow="0" w:firstColumn="1" w:lastColumn="0" w:noHBand="0" w:noVBand="1"/>
+      </w:tblPr>
+      <w:tblGrid>
+        <w:gridCol w:w="1538"/>
+        <w:gridCol w:w="1791"/>
+        <w:gridCol w:w="1563"/>
+        <w:gridCol w:w="3061"/>
+        <w:gridCol w:w="2328"/>
+      </w:tblGrid>
+      <w:tr>
+        <w:trPr>
+          <w:jc w:val="center"/>
+        </w:trPr>
+        <w:tc>
+          <w:tcPr>
+            <w:tcW w:w="1538" w:type="dxa"/>
+            <w:shd w:val="clear" w:color="auto" w:fill="262626" w:themeFill="text1" w:themeFillTint="D9"/>
+            <w:vAlign w:val="center"/>
+          </w:tcPr>
+          <w:p>
+            <w:pPr>
+              <w:jc w:val="center"/>
+              <w:rPr>
+                <w:rFonts w:ascii="Arial" w:hAnsi="Arial" w:cs="Arial"/>
+                <w:b/>
+                <w:bCs/>
+                <w:sz w:val="24"/>
+                <w:szCs w:val="24"/>
+              </w:rPr>
+            </w:pPr>
+            <w:r>
+              <w:rPr>
+                <w:rFonts w:ascii="Arial" w:hAnsi="Arial" w:cs="Arial"/>
+                <w:b/>
+                <w:bCs/>
+                <w:sz w:val="24"/>
+                <w:szCs w:val="24"/>
+              </w:rPr>
+              <w:t>Integrante</w:t>
+            </w:r>
+          </w:p>
+        </w:tc>
+        <w:tc>
+          <w:tcPr>
+            <w:tcW w:w="1791" w:type="dxa"/>
+            <w:shd w:val="clear" w:color="auto" w:fill="262626" w:themeFill="text1" w:themeFillTint="D9"/>
+            <w:vAlign w:val="center"/>
+          </w:tcPr>
+          <w:p>
+            <w:pPr>
+              <w:jc w:val="center"/>
+              <w:rPr>
+                <w:rFonts w:ascii="Arial" w:hAnsi="Arial" w:cs="Arial"/>
+                <w:b/>
+                <w:bCs/>
+                <w:sz w:val="24"/>
+                <w:szCs w:val="24"/>
+              </w:rPr>
+            </w:pPr>
+            <w:r>
+              <w:rPr>
+                <w:rFonts w:ascii="Arial" w:hAnsi="Arial" w:cs="Arial"/>
+                <w:b/>
+                <w:bCs/>
+                <w:sz w:val="24"/>
+                <w:szCs w:val="24"/>
+              </w:rPr>
+              <w:t>Rol</w:t>
+            </w:r>
+          </w:p>
+        </w:tc>
+        <w:tc>
+          <w:tcPr>
+            <w:tcW w:w="1563" w:type="dxa"/>
+            <w:shd w:val="clear" w:color="auto" w:fill="262626" w:themeFill="text1" w:themeFillTint="D9"/>
+            <w:vAlign w:val="center"/>
+          </w:tcPr>
+          <w:p>
+            <w:pPr>
+              <w:jc w:val="center"/>
+              <w:rPr>
+                <w:rFonts w:ascii="Arial" w:hAnsi="Arial" w:cs="Arial"/>
+                <w:b/>
+                <w:bCs/>
+                <w:sz w:val="24"/>
+                <w:szCs w:val="24"/>
+              </w:rPr>
+            </w:pPr>
+            <w:r>
+              <w:rPr>
+                <w:rFonts w:ascii="Arial" w:hAnsi="Arial" w:cs="Arial"/>
+                <w:b/>
+                <w:bCs/>
+                <w:sz w:val="24"/>
+                <w:szCs w:val="24"/>
+              </w:rPr>
+              <w:t>Asistencia (Sí/No)</w:t>
+            </w:r>
+          </w:p>
+        </w:tc>
+        <w:tc>
+          <w:tcPr>
+            <w:tcW w:w="3061" w:type="dxa"/>
+            <w:shd w:val="clear" w:color="auto" w:fill="262626" w:themeFill="text1" w:themeFillTint="D9"/>
+            <w:vAlign w:val="center"/>
+          </w:tcPr>
+          <w:p>
+            <w:pPr>
+              <w:jc w:val="center"/>
+              <w:rPr>
+                <w:rFonts w:ascii="Arial" w:hAnsi="Arial" w:cs="Arial"/>
+                <w:b/>
+                <w:bCs/>
+                <w:sz w:val="24"/>
+                <w:szCs w:val="24"/>
+              </w:rPr>
+            </w:pPr>
+            <w:r>
+              <w:rPr>
+                <w:rFonts w:ascii="Arial" w:hAnsi="Arial" w:cs="Arial"/>
+                <w:b/>
+                <w:bCs/>
+                <w:sz w:val="24"/>
+                <w:szCs w:val="24"/>
+              </w:rPr>
+              <w:t>Actividades</w:t>
+            </w:r>
+          </w:p>
+        </w:tc>
+        <w:tc>
+          <w:tcPr>
+            <w:tcW w:w="2328" w:type="dxa"/>
+            <w:shd w:val="clear" w:color="auto" w:fill="262626" w:themeFill="text1" w:themeFillTint="D9"/>
+            <w:vAlign w:val="center"/>
+          </w:tcPr>
+          <w:p>
+            <w:pPr>
+              <w:jc w:val="center"/>
+              <w:rPr>
+                <w:rFonts w:ascii="Arial" w:hAnsi="Arial" w:cs="Arial"/>
+                <w:b/>
+                <w:bCs/>
+                <w:sz w:val="24"/>
+                <w:szCs w:val="24"/>
+              </w:rPr>
+            </w:pPr>
+            <w:r>
+              <w:rPr>
+                <w:rFonts w:ascii="Arial" w:hAnsi="Arial" w:cs="Arial"/>
+                <w:b/>
+                <w:bCs/>
+                <w:sz w:val="24"/>
+                <w:szCs w:val="24"/>
+              </w:rPr>
+              <w:t>Entregables Esperados</w:t>
+            </w:r>
+          </w:p>
+        </w:tc>
+      </w:tr>
+      <w:tr>
+        <w:trPr>
+          <w:jc w:val="center"/>
+        </w:trPr>
+        <w:tc>
+          <w:tcPr>
+            <w:tcW w:w="1538" w:type="dxa"/>
+            <w:vAlign w:val="center"/>
+          </w:tcPr>
+          <w:p>
+            <w:pPr>
+              <w:rPr>
+                <w:rFonts w:ascii="Arial" w:hAnsi="Arial" w:cs="Arial"/>
+                <w:sz w:val="24"/>
+                <w:szCs w:val="24"/>
+              </w:rPr>
+            </w:pPr>
+            <w:r>
+              <w:rPr>
+                <w:rFonts w:ascii="Arial" w:hAnsi="Arial" w:cs="Arial"/>
+                <w:sz w:val="24"/>
+                <w:szCs w:val="24"/>
+              </w:rPr>
+              <w:t>María Fernanda Barrón Álvarez</w:t>
+            </w:r>
+          </w:p>
+        </w:tc>
+        <w:tc>
+          <w:tcPr>
+            <w:tcW w:w="1791" w:type="dxa"/>
+            <w:vAlign w:val="center"/>
+          </w:tcPr>
+          <w:p>
+            <w:pPr>
+              <w:rPr>
+                <w:rFonts w:ascii="Arial" w:hAnsi="Arial" w:cs="Arial"/>
+                <w:sz w:val="24"/>
+                <w:szCs w:val="24"/>
+              </w:rPr>
+            </w:pPr>
+            <w:r>
+              <w:rPr>
+                <w:rFonts w:ascii="Arial" w:hAnsi="Arial" w:cs="Arial"/>
+                <w:sz w:val="24"/>
+                <w:szCs w:val="24"/>
+              </w:rPr>
+              <w:t>Project Manager</w:t>
+            </w:r>
+          </w:p>
+        </w:tc>
+        <w:tc>
+          <w:tcPr>
+            <w:tcW w:w="1563" w:type="dxa"/>
+            <w:vAlign w:val="center"/>
+          </w:tcPr>
+          <w:p>
+            <w:pPr>
+              <w:rPr>
+                <w:rFonts w:ascii="Arial" w:hAnsi="Arial" w:cs="Arial"/>
+                <w:sz w:val="24"/>
+                <w:szCs w:val="24"/>
+              </w:rPr>
+            </w:pPr>
+            <w:r>
+              <w:rPr>
+                <w:rFonts w:ascii="Arial" w:hAnsi="Arial" w:cs="Arial"/>
+                <w:sz w:val="24"/>
+                <w:szCs w:val="24"/>
+              </w:rPr>
+              <w:t>Sí</w:t>
+            </w:r>
+          </w:p>
+        </w:tc>
+        <w:tc>
+          <w:tcPr>
+            <w:tcW w:w="3061" w:type="dxa"/>
+            <w:vAlign w:val="center"/>
+          </w:tcPr>
+          <w:p>
+            <w:pPr>
+              <w:pStyle w:val="Prrafodelista"/>
+              <w:numPr>
+                <w:ilvl w:val="0"/>
+                <w:numId w:val="55"/>
+              </w:numPr>
+              <w:ind w:left="246" w:hanging="218"/>
+              <w:rPr>
+                <w:rFonts w:ascii="Arial" w:hAnsi="Arial" w:cs="Arial"/>
+                <w:sz w:val="24"/>
+                <w:szCs w:val="24"/>
+              </w:rPr>
+            </w:pPr>
+            <w:r>
+              <w:rPr>
+                <w:rFonts w:ascii="Arial" w:hAnsi="Arial" w:cs="Arial"/>
+                <w:sz w:val="24"/>
+                <w:szCs w:val="24"/>
+              </w:rPr>
+              <w:t xml:space="preserve">Adición de </w:t>
+            </w:r>
+            <w:r>
+              <w:rPr>
+                <w:rFonts w:ascii="Arial" w:hAnsi="Arial" w:cs="Arial"/>
+                <w:sz w:val="24"/>
+                <w:szCs w:val="24"/>
+              </w:rPr>
+              <w:t>Resumen ejecutivo y Descripción del proyecto a la documentación final</w:t>
+            </w:r>
+          </w:p>
+        </w:tc>
+        <w:tc>
+          <w:tcPr>
+            <w:tcW w:w="2328" w:type="dxa"/>
+            <w:vAlign w:val="center"/>
+          </w:tcPr>
+          <w:p>
+            <w:pPr>
+              <w:pStyle w:val="Prrafodelista"/>
+              <w:numPr>
+                <w:ilvl w:val="0"/>
+                <w:numId w:val="55"/>
+              </w:numPr>
+              <w:ind w:left="219" w:hanging="219"/>
+              <w:rPr>
+                <w:rFonts w:ascii="Arial" w:hAnsi="Arial" w:cs="Arial"/>
+                <w:sz w:val="24"/>
+                <w:szCs w:val="24"/>
+              </w:rPr>
+            </w:pPr>
+            <w:r>
+              <w:rPr>
+                <w:rFonts w:ascii="Arial" w:hAnsi="Arial" w:cs="Arial"/>
+                <w:sz w:val="24"/>
+                <w:szCs w:val="24"/>
+              </w:rPr>
+              <w:t xml:space="preserve">Documento </w:t>
+            </w:r>
+            <w:r>
+              <w:rPr>
+                <w:rFonts w:ascii="Arial" w:hAnsi="Arial" w:cs="Arial"/>
+                <w:sz w:val="24"/>
+                <w:szCs w:val="24"/>
+              </w:rPr>
+              <w:t xml:space="preserve">final </w:t>
+            </w:r>
+            <w:r>
+              <w:rPr>
+                <w:rFonts w:ascii="Arial" w:hAnsi="Arial" w:cs="Arial"/>
+                <w:sz w:val="24"/>
+                <w:szCs w:val="24"/>
+              </w:rPr>
+              <w:t xml:space="preserve">con puntos 1 y 2. </w:t>
+            </w:r>
+            <w:r>
+              <w:rPr>
+                <w:rFonts w:ascii="Arial" w:hAnsi="Arial" w:cs="Arial"/>
+                <w:sz w:val="24"/>
+                <w:szCs w:val="24"/>
+              </w:rPr>
+              <w:t xml:space="preserve"> </w:t>
+            </w:r>
+          </w:p>
+        </w:tc>
+      </w:tr>
+      <w:tr>
+        <w:trPr>
+          <w:jc w:val="center"/>
+        </w:trPr>
+        <w:tc>
+          <w:tcPr>
+            <w:tcW w:w="1538" w:type="dxa"/>
+            <w:vAlign w:val="center"/>
+          </w:tcPr>
+          <w:p>
+            <w:pPr>
+              <w:rPr>
+                <w:rFonts w:ascii="Arial" w:hAnsi="Arial" w:cs="Arial"/>
+                <w:sz w:val="24"/>
+                <w:szCs w:val="24"/>
+              </w:rPr>
+            </w:pPr>
+            <w:r>
+              <w:rPr>
+                <w:rFonts w:ascii="Arial" w:hAnsi="Arial" w:cs="Arial"/>
+                <w:sz w:val="24"/>
+                <w:szCs w:val="24"/>
+              </w:rPr>
+              <w:t xml:space="preserve">Leslie Miroslava Benítez </w:t>
+            </w:r>
+          </w:p>
+          <w:p>
+            <w:pPr>
+              <w:rPr>
+                <w:rFonts w:ascii="Arial" w:hAnsi="Arial" w:cs="Arial"/>
+                <w:sz w:val="24"/>
+                <w:szCs w:val="24"/>
+              </w:rPr>
+            </w:pPr>
+            <w:r>
+              <w:rPr>
+                <w:rFonts w:ascii="Arial" w:hAnsi="Arial" w:cs="Arial"/>
+                <w:sz w:val="24"/>
+                <w:szCs w:val="24"/>
+              </w:rPr>
+              <w:t>Marín</w:t>
+            </w:r>
+          </w:p>
+        </w:tc>
+        <w:tc>
+          <w:tcPr>
+            <w:tcW w:w="1791" w:type="dxa"/>
+            <w:vAlign w:val="center"/>
+          </w:tcPr>
+          <w:p>
+            <w:pPr>
+              <w:rPr>
+                <w:rFonts w:ascii="Arial" w:hAnsi="Arial" w:cs="Arial"/>
+                <w:sz w:val="24"/>
+                <w:szCs w:val="24"/>
+              </w:rPr>
+            </w:pPr>
+            <w:r>
+              <w:rPr>
+                <w:rFonts w:ascii="Arial" w:hAnsi="Arial" w:cs="Arial"/>
+                <w:sz w:val="24"/>
+                <w:szCs w:val="24"/>
+              </w:rPr>
+              <w:t xml:space="preserve">Desarrolladora </w:t>
+            </w:r>
+            <w:proofErr w:type="spellStart"/>
+            <w:r>
+              <w:rPr>
+                <w:rFonts w:ascii="Arial" w:hAnsi="Arial" w:cs="Arial"/>
+                <w:sz w:val="24"/>
+                <w:szCs w:val="24"/>
+              </w:rPr>
+              <w:t>frontend</w:t>
+            </w:r>
+            <w:proofErr w:type="spellEnd"/>
+          </w:p>
+        </w:tc>
+        <w:tc>
+          <w:tcPr>
+            <w:tcW w:w="1563" w:type="dxa"/>
+            <w:vAlign w:val="center"/>
+          </w:tcPr>
+          <w:p>
+            <w:pPr>
+              <w:rPr>
+                <w:rFonts w:ascii="Arial" w:hAnsi="Arial" w:cs="Arial"/>
+                <w:sz w:val="24"/>
+                <w:szCs w:val="24"/>
+              </w:rPr>
+            </w:pPr>
+            <w:r>
+              <w:rPr>
+                <w:rFonts w:ascii="Arial" w:hAnsi="Arial" w:cs="Arial"/>
+                <w:sz w:val="24"/>
+                <w:szCs w:val="24"/>
+              </w:rPr>
+              <w:t>Sí</w:t>
+            </w:r>
+          </w:p>
+        </w:tc>
+        <w:tc>
+          <w:tcPr>
+            <w:tcW w:w="3061" w:type="dxa"/>
+            <w:vAlign w:val="center"/>
+          </w:tcPr>
+          <w:p>
+            <w:pPr>
+              <w:pStyle w:val="Prrafodelista"/>
+              <w:numPr>
+                <w:ilvl w:val="0"/>
+                <w:numId w:val="55"/>
+              </w:numPr>
+              <w:ind w:left="270" w:hanging="184"/>
+              <w:rPr>
+                <w:rFonts w:ascii="Arial" w:hAnsi="Arial" w:cs="Arial"/>
+                <w:sz w:val="24"/>
+                <w:szCs w:val="24"/>
+              </w:rPr>
+            </w:pPr>
+            <w:r>
+              <w:rPr>
+                <w:rFonts w:ascii="Arial" w:hAnsi="Arial" w:cs="Arial"/>
+                <w:sz w:val="24"/>
+                <w:szCs w:val="24"/>
+              </w:rPr>
+              <w:t xml:space="preserve">Análisis </w:t>
+            </w:r>
+            <w:r>
+              <w:rPr>
+                <w:rFonts w:ascii="Arial" w:hAnsi="Arial" w:cs="Arial"/>
+                <w:sz w:val="24"/>
+                <w:szCs w:val="24"/>
+              </w:rPr>
+              <w:t>y modificación</w:t>
+            </w:r>
+            <w:r>
+              <w:rPr>
+                <w:rFonts w:ascii="Arial" w:hAnsi="Arial" w:cs="Arial"/>
+                <w:sz w:val="24"/>
+                <w:szCs w:val="24"/>
+              </w:rPr>
+              <w:t xml:space="preserve"> (de documentación)</w:t>
+            </w:r>
+            <w:r>
+              <w:rPr>
+                <w:rFonts w:ascii="Arial" w:hAnsi="Arial" w:cs="Arial"/>
+                <w:sz w:val="24"/>
+                <w:szCs w:val="24"/>
+              </w:rPr>
+              <w:t xml:space="preserve"> de </w:t>
+            </w:r>
+            <w:proofErr w:type="spellStart"/>
+            <w:r>
+              <w:rPr>
+                <w:rFonts w:ascii="Arial" w:hAnsi="Arial" w:cs="Arial"/>
+                <w:sz w:val="24"/>
+                <w:szCs w:val="24"/>
+              </w:rPr>
+              <w:t>stack</w:t>
+            </w:r>
+            <w:proofErr w:type="spellEnd"/>
+            <w:r>
+              <w:rPr>
+                <w:rFonts w:ascii="Arial" w:hAnsi="Arial" w:cs="Arial"/>
+                <w:sz w:val="24"/>
+                <w:szCs w:val="24"/>
+              </w:rPr>
+              <w:t xml:space="preserve"> para </w:t>
+            </w:r>
+            <w:proofErr w:type="spellStart"/>
+            <w:r>
+              <w:rPr>
+                <w:rFonts w:ascii="Arial" w:hAnsi="Arial" w:cs="Arial"/>
+                <w:sz w:val="24"/>
+                <w:szCs w:val="24"/>
+              </w:rPr>
+              <w:t>frontend</w:t>
+            </w:r>
+            <w:proofErr w:type="spellEnd"/>
+            <w:r>
+              <w:rPr>
+                <w:rFonts w:ascii="Arial" w:hAnsi="Arial" w:cs="Arial"/>
+                <w:sz w:val="24"/>
+                <w:szCs w:val="24"/>
+              </w:rPr>
+              <w:t xml:space="preserve"> </w:t>
+            </w:r>
+          </w:p>
+        </w:tc>
+        <w:tc>
+          <w:tcPr>
+            <w:tcW w:w="2328" w:type="dxa"/>
+            <w:vAlign w:val="center"/>
+          </w:tcPr>
+          <w:p>
+            <w:pPr>
+              <w:pStyle w:val="Prrafodelista"/>
+              <w:numPr>
+                <w:ilvl w:val="0"/>
+                <w:numId w:val="55"/>
+              </w:numPr>
+              <w:ind w:left="219" w:hanging="218"/>
+              <w:rPr>
+                <w:rFonts w:ascii="Arial" w:hAnsi="Arial" w:cs="Arial"/>
+                <w:sz w:val="24"/>
+                <w:szCs w:val="24"/>
+              </w:rPr>
+            </w:pPr>
+            <w:r>
+              <w:rPr>
+                <w:rFonts w:ascii="Arial" w:hAnsi="Arial" w:cs="Arial"/>
+                <w:sz w:val="24"/>
+                <w:szCs w:val="24"/>
+              </w:rPr>
+              <w:t>Parte de documentación</w:t>
+            </w:r>
+          </w:p>
+        </w:tc>
+      </w:tr>
+      <w:tr>
+        <w:trPr>
+          <w:jc w:val="center"/>
+        </w:trPr>
+        <w:tc>
+          <w:tcPr>
+            <w:tcW w:w="1538" w:type="dxa"/>
+            <w:vAlign w:val="center"/>
+          </w:tcPr>
+          <w:p>
+            <w:pPr>
+              <w:rPr>
+                <w:rFonts w:ascii="Arial" w:hAnsi="Arial" w:cs="Arial"/>
+                <w:sz w:val="24"/>
+                <w:szCs w:val="24"/>
+              </w:rPr>
+            </w:pPr>
+            <w:r>
+              <w:rPr>
+                <w:rFonts w:ascii="Arial" w:hAnsi="Arial" w:cs="Arial"/>
+                <w:sz w:val="24"/>
+                <w:szCs w:val="24"/>
+              </w:rPr>
+              <w:t>Leonardo Merino Garfias</w:t>
+            </w:r>
+          </w:p>
+        </w:tc>
+        <w:tc>
+          <w:tcPr>
+            <w:tcW w:w="1791" w:type="dxa"/>
+            <w:vAlign w:val="center"/>
+          </w:tcPr>
+          <w:p>
+            <w:pPr>
+              <w:rPr>
+                <w:rFonts w:ascii="Arial" w:hAnsi="Arial" w:cs="Arial"/>
+                <w:sz w:val="24"/>
+                <w:szCs w:val="24"/>
+              </w:rPr>
+            </w:pPr>
+            <w:r>
+              <w:rPr>
+                <w:rFonts w:ascii="Arial" w:hAnsi="Arial" w:cs="Arial"/>
+                <w:sz w:val="24"/>
+                <w:szCs w:val="24"/>
+              </w:rPr>
+              <w:t xml:space="preserve">Desarrollador </w:t>
+            </w:r>
+            <w:proofErr w:type="spellStart"/>
+            <w:r>
+              <w:rPr>
+                <w:rFonts w:ascii="Arial" w:hAnsi="Arial" w:cs="Arial"/>
+                <w:sz w:val="24"/>
+                <w:szCs w:val="24"/>
+              </w:rPr>
+              <w:t>backend</w:t>
+            </w:r>
+            <w:proofErr w:type="spellEnd"/>
+          </w:p>
+        </w:tc>
+        <w:tc>
+          <w:tcPr>
+            <w:tcW w:w="1563" w:type="dxa"/>
+            <w:vAlign w:val="center"/>
+          </w:tcPr>
+          <w:p>
+            <w:pPr>
+              <w:rPr>
+                <w:rFonts w:ascii="Arial" w:hAnsi="Arial" w:cs="Arial"/>
+                <w:sz w:val="24"/>
+                <w:szCs w:val="24"/>
+              </w:rPr>
+            </w:pPr>
+            <w:r>
+              <w:rPr>
+                <w:rFonts w:ascii="Arial" w:hAnsi="Arial" w:cs="Arial"/>
+                <w:sz w:val="24"/>
+                <w:szCs w:val="24"/>
+              </w:rPr>
+              <w:t>Sí</w:t>
+            </w:r>
+          </w:p>
+        </w:tc>
+        <w:tc>
+          <w:tcPr>
+            <w:tcW w:w="3061" w:type="dxa"/>
+            <w:vAlign w:val="center"/>
+          </w:tcPr>
+          <w:p>
+            <w:pPr>
+              <w:pStyle w:val="Prrafodelista"/>
+              <w:numPr>
+                <w:ilvl w:val="0"/>
+                <w:numId w:val="55"/>
+              </w:numPr>
+              <w:ind w:left="246" w:hanging="218"/>
+              <w:rPr>
+                <w:rFonts w:ascii="Arial" w:hAnsi="Arial" w:cs="Arial"/>
+                <w:sz w:val="24"/>
+                <w:szCs w:val="24"/>
+              </w:rPr>
+            </w:pPr>
+            <w:r>
+              <w:rPr>
+                <w:rFonts w:ascii="Arial" w:hAnsi="Arial" w:cs="Arial"/>
+                <w:sz w:val="24"/>
+                <w:szCs w:val="24"/>
+              </w:rPr>
+              <w:t>Análisis y modificación</w:t>
+            </w:r>
+            <w:r>
+              <w:rPr>
+                <w:rFonts w:ascii="Arial" w:hAnsi="Arial" w:cs="Arial"/>
+                <w:sz w:val="24"/>
+                <w:szCs w:val="24"/>
+              </w:rPr>
+              <w:t xml:space="preserve"> </w:t>
+            </w:r>
+            <w:r>
+              <w:rPr>
+                <w:rFonts w:ascii="Arial" w:hAnsi="Arial" w:cs="Arial"/>
+                <w:sz w:val="24"/>
+                <w:szCs w:val="24"/>
+              </w:rPr>
+              <w:t>(de documentación)</w:t>
+            </w:r>
+            <w:r>
+              <w:rPr>
+                <w:rFonts w:ascii="Arial" w:hAnsi="Arial" w:cs="Arial"/>
+                <w:sz w:val="24"/>
+                <w:szCs w:val="24"/>
+              </w:rPr>
+              <w:t xml:space="preserve"> de </w:t>
+            </w:r>
+            <w:proofErr w:type="spellStart"/>
+            <w:r>
+              <w:rPr>
+                <w:rFonts w:ascii="Arial" w:hAnsi="Arial" w:cs="Arial"/>
+                <w:sz w:val="24"/>
+                <w:szCs w:val="24"/>
+              </w:rPr>
+              <w:t>stack</w:t>
+            </w:r>
+            <w:proofErr w:type="spellEnd"/>
+            <w:r>
+              <w:rPr>
+                <w:rFonts w:ascii="Arial" w:hAnsi="Arial" w:cs="Arial"/>
+                <w:sz w:val="24"/>
+                <w:szCs w:val="24"/>
+              </w:rPr>
+              <w:t xml:space="preserve"> para </w:t>
+            </w:r>
+            <w:proofErr w:type="spellStart"/>
+            <w:r>
+              <w:rPr>
+                <w:rFonts w:ascii="Arial" w:hAnsi="Arial" w:cs="Arial"/>
+                <w:sz w:val="24"/>
+                <w:szCs w:val="24"/>
+              </w:rPr>
+              <w:t>backend</w:t>
+            </w:r>
+            <w:proofErr w:type="spellEnd"/>
+          </w:p>
+        </w:tc>
+        <w:tc>
+          <w:tcPr>
+            <w:tcW w:w="2328" w:type="dxa"/>
+            <w:vAlign w:val="center"/>
+          </w:tcPr>
+          <w:p>
+            <w:pPr>
+              <w:pStyle w:val="Prrafodelista"/>
+              <w:numPr>
+                <w:ilvl w:val="0"/>
+                <w:numId w:val="55"/>
+              </w:numPr>
+              <w:ind w:left="349" w:hanging="248"/>
+              <w:rPr>
+                <w:rFonts w:ascii="Arial" w:hAnsi="Arial" w:cs="Arial"/>
+                <w:sz w:val="24"/>
+                <w:szCs w:val="24"/>
+              </w:rPr>
+            </w:pPr>
+            <w:r>
+              <w:rPr>
+                <w:rFonts w:ascii="Arial" w:hAnsi="Arial" w:cs="Arial"/>
+                <w:sz w:val="24"/>
+                <w:szCs w:val="24"/>
+              </w:rPr>
+              <w:t>Parte de documentación</w:t>
+            </w:r>
+          </w:p>
+        </w:tc>
+      </w:tr>
+    </w:tbl>
+    <w:p>
+      <w:pPr>
+        <w:rPr>
+          <w:rFonts w:ascii="Arial" w:hAnsi="Arial" w:cs="Arial"/>
+          <w:sz w:val="24"/>
+          <w:szCs w:val="24"/>
+        </w:rPr>
+      </w:pPr>
+    </w:p>
+    <w:p>
+      <w:pPr>
+        <w:pStyle w:val="titulo1"/>
+        <w:outlineLvl w:val="2"/>
+        <w:rPr>
+          <w:sz w:val="32"/>
+          <w:szCs w:val="72"/>
+        </w:rPr>
+      </w:pPr>
+      <w:r>
+        <w:rPr>
+          <w:sz w:val="32"/>
+          <w:szCs w:val="72"/>
+        </w:rPr>
+        <w:t>A</w:t>
+      </w:r>
+      <w:r>
+        <w:rPr>
+          <w:sz w:val="32"/>
+          <w:szCs w:val="72"/>
+        </w:rPr>
+        <w:t>ctividades Ejecutadas</w:t>
+      </w:r>
+    </w:p>
+    <w:tbl>
+      <w:tblPr>
+        <w:tblStyle w:val="Tablaconcuadrcula"/>
+        <w:tblW w:w="10124" w:type="dxa"/>
+        <w:jc w:val="center"/>
+        <w:tblBorders>
+          <w:top w:val="single" w:sz="4" w:space="0" w:color="7F7F7F" w:themeColor="text1" w:themeTint="80"/>
+          <w:left w:val="single" w:sz="4" w:space="0" w:color="7F7F7F" w:themeColor="text1" w:themeTint="80"/>
+          <w:bottom w:val="single" w:sz="4" w:space="0" w:color="7F7F7F" w:themeColor="text1" w:themeTint="80"/>
+          <w:right w:val="single" w:sz="4" w:space="0" w:color="7F7F7F" w:themeColor="text1" w:themeTint="80"/>
+          <w:insideH w:val="single" w:sz="4" w:space="0" w:color="7F7F7F" w:themeColor="text1" w:themeTint="80"/>
+          <w:insideV w:val="single" w:sz="4" w:space="0" w:color="7F7F7F" w:themeColor="text1" w:themeTint="80"/>
+        </w:tblBorders>
+        <w:tblCellMar>
+          <w:top w:w="57" w:type="dxa"/>
+          <w:bottom w:w="57" w:type="dxa"/>
+        </w:tblCellMar>
+        <w:tblLook w:val="04A0" w:firstRow="1" w:lastRow="0" w:firstColumn="1" w:lastColumn="0" w:noHBand="0" w:noVBand="1"/>
+      </w:tblPr>
+      <w:tblGrid>
+        <w:gridCol w:w="2955"/>
+        <w:gridCol w:w="2004"/>
+        <w:gridCol w:w="1150"/>
+        <w:gridCol w:w="1535"/>
+        <w:gridCol w:w="2480"/>
+      </w:tblGrid>
+      <w:tr>
+        <w:trPr>
+          <w:jc w:val="center"/>
+        </w:trPr>
+        <w:tc>
+          <w:tcPr>
+            <w:tcW w:w="2955" w:type="dxa"/>
+            <w:shd w:val="clear" w:color="auto" w:fill="262626" w:themeFill="text1" w:themeFillTint="D9"/>
+            <w:vAlign w:val="center"/>
+          </w:tcPr>
+          <w:p>
+            <w:pPr>
+              <w:jc w:val="center"/>
+              <w:rPr>
+                <w:rFonts w:ascii="Arial" w:hAnsi="Arial" w:cs="Arial"/>
+                <w:b/>
+                <w:bCs/>
+                <w:sz w:val="24"/>
+                <w:szCs w:val="24"/>
+              </w:rPr>
+            </w:pPr>
+            <w:r>
+              <w:rPr>
+                <w:rFonts w:ascii="Arial" w:hAnsi="Arial" w:cs="Arial"/>
+                <w:b/>
+                <w:bCs/>
+                <w:sz w:val="24"/>
+                <w:szCs w:val="24"/>
+              </w:rPr>
+              <w:t>Actividad</w:t>
+            </w:r>
+          </w:p>
+        </w:tc>
+        <w:tc>
+          <w:tcPr>
+            <w:tcW w:w="2004" w:type="dxa"/>
+            <w:shd w:val="clear" w:color="auto" w:fill="262626" w:themeFill="text1" w:themeFillTint="D9"/>
+            <w:vAlign w:val="center"/>
+          </w:tcPr>
+          <w:p>
+            <w:pPr>
+              <w:jc w:val="center"/>
+              <w:rPr>
+                <w:rFonts w:ascii="Arial" w:hAnsi="Arial" w:cs="Arial"/>
+                <w:b/>
+                <w:bCs/>
+                <w:sz w:val="24"/>
+                <w:szCs w:val="24"/>
+              </w:rPr>
+            </w:pPr>
+            <w:r>
+              <w:rPr>
+                <w:rFonts w:ascii="Arial" w:hAnsi="Arial" w:cs="Arial"/>
+                <w:b/>
+                <w:bCs/>
+                <w:sz w:val="24"/>
+                <w:szCs w:val="24"/>
+              </w:rPr>
+              <w:t>Responsable(s)</w:t>
+            </w:r>
+          </w:p>
+        </w:tc>
+        <w:tc>
+          <w:tcPr>
+            <w:tcW w:w="1150" w:type="dxa"/>
+            <w:shd w:val="clear" w:color="auto" w:fill="262626" w:themeFill="text1" w:themeFillTint="D9"/>
+            <w:vAlign w:val="center"/>
+          </w:tcPr>
+          <w:p>
+            <w:pPr>
+              <w:jc w:val="center"/>
+              <w:rPr>
+                <w:rFonts w:ascii="Arial" w:hAnsi="Arial" w:cs="Arial"/>
+                <w:b/>
+                <w:bCs/>
+                <w:sz w:val="24"/>
+                <w:szCs w:val="24"/>
+              </w:rPr>
+            </w:pPr>
+            <w:proofErr w:type="spellStart"/>
+            <w:r>
+              <w:rPr>
+                <w:rFonts w:ascii="Arial" w:hAnsi="Arial" w:cs="Arial"/>
+                <w:b/>
+                <w:bCs/>
+                <w:sz w:val="24"/>
+                <w:szCs w:val="24"/>
+              </w:rPr>
+              <w:t>Hr</w:t>
+            </w:r>
+            <w:proofErr w:type="spellEnd"/>
+            <w:r>
+              <w:rPr>
+                <w:rFonts w:ascii="Arial" w:hAnsi="Arial" w:cs="Arial"/>
+                <w:b/>
+                <w:bCs/>
+                <w:sz w:val="24"/>
+                <w:szCs w:val="24"/>
+              </w:rPr>
+              <w:t xml:space="preserve">. </w:t>
+            </w:r>
+            <w:proofErr w:type="spellStart"/>
+            <w:r>
+              <w:rPr>
+                <w:rFonts w:ascii="Arial" w:hAnsi="Arial" w:cs="Arial"/>
+                <w:b/>
+                <w:bCs/>
+                <w:sz w:val="24"/>
+                <w:szCs w:val="24"/>
+              </w:rPr>
+              <w:t>Ini</w:t>
+            </w:r>
+            <w:proofErr w:type="spellEnd"/>
+          </w:p>
+        </w:tc>
+        <w:tc>
+          <w:tcPr>
+            <w:tcW w:w="1535" w:type="dxa"/>
+            <w:shd w:val="clear" w:color="auto" w:fill="262626" w:themeFill="text1" w:themeFillTint="D9"/>
+            <w:vAlign w:val="center"/>
+          </w:tcPr>
+          <w:p>
+            <w:pPr>
+              <w:jc w:val="center"/>
+              <w:rPr>
+                <w:rFonts w:ascii="Arial" w:hAnsi="Arial" w:cs="Arial"/>
+                <w:b/>
+                <w:bCs/>
+                <w:sz w:val="24"/>
+                <w:szCs w:val="24"/>
+              </w:rPr>
+            </w:pPr>
+            <w:proofErr w:type="spellStart"/>
+            <w:r>
+              <w:rPr>
+                <w:rFonts w:ascii="Arial" w:hAnsi="Arial" w:cs="Arial"/>
+                <w:b/>
+                <w:bCs/>
+                <w:sz w:val="24"/>
+                <w:szCs w:val="24"/>
+              </w:rPr>
+              <w:t>Hr</w:t>
+            </w:r>
+            <w:proofErr w:type="spellEnd"/>
+            <w:r>
+              <w:rPr>
+                <w:rFonts w:ascii="Arial" w:hAnsi="Arial" w:cs="Arial"/>
+                <w:b/>
+                <w:bCs/>
+                <w:sz w:val="24"/>
+                <w:szCs w:val="24"/>
+              </w:rPr>
+              <w:t>. fin</w:t>
+            </w:r>
+          </w:p>
+        </w:tc>
+        <w:tc>
+          <w:tcPr>
+            <w:tcW w:w="2480" w:type="dxa"/>
+            <w:shd w:val="clear" w:color="auto" w:fill="262626" w:themeFill="text1" w:themeFillTint="D9"/>
+            <w:vAlign w:val="center"/>
+          </w:tcPr>
+          <w:p>
+            <w:pPr>
+              <w:jc w:val="center"/>
+              <w:rPr>
+                <w:rFonts w:ascii="Arial" w:hAnsi="Arial" w:cs="Arial"/>
+                <w:b/>
+                <w:bCs/>
+                <w:sz w:val="24"/>
+                <w:szCs w:val="24"/>
+              </w:rPr>
+            </w:pPr>
+            <w:r>
+              <w:rPr>
+                <w:rFonts w:ascii="Arial" w:hAnsi="Arial" w:cs="Arial"/>
+                <w:b/>
+                <w:bCs/>
+                <w:sz w:val="24"/>
+                <w:szCs w:val="24"/>
+              </w:rPr>
+              <w:t>Estado (Completado / En proceso / Pendiente)</w:t>
+            </w:r>
+          </w:p>
+        </w:tc>
+      </w:tr>
+      <w:tr>
+        <w:trPr>
+          <w:jc w:val="center"/>
+        </w:trPr>
+        <w:tc>
+          <w:tcPr>
+            <w:tcW w:w="2955" w:type="dxa"/>
+            <w:vAlign w:val="center"/>
+          </w:tcPr>
+          <w:p>
+            <w:pPr>
+              <w:rPr>
+                <w:rFonts w:ascii="Arial" w:hAnsi="Arial" w:cs="Arial"/>
+                <w:sz w:val="24"/>
+                <w:szCs w:val="24"/>
+              </w:rPr>
+            </w:pPr>
+            <w:r>
+              <w:rPr>
+                <w:rFonts w:ascii="Arial" w:hAnsi="Arial" w:cs="Arial"/>
+                <w:sz w:val="24"/>
+                <w:szCs w:val="24"/>
+              </w:rPr>
+              <w:t>Modificación de documentación final</w:t>
+            </w:r>
+          </w:p>
+        </w:tc>
+        <w:tc>
+          <w:tcPr>
+            <w:tcW w:w="2004" w:type="dxa"/>
+            <w:vAlign w:val="center"/>
+          </w:tcPr>
+          <w:p>
+            <w:pPr>
+              <w:rPr>
+                <w:rFonts w:ascii="Arial" w:hAnsi="Arial" w:cs="Arial"/>
+                <w:sz w:val="24"/>
+                <w:szCs w:val="24"/>
+              </w:rPr>
+            </w:pPr>
+            <w:r>
+              <w:rPr>
+                <w:rFonts w:ascii="Arial" w:hAnsi="Arial" w:cs="Arial"/>
+                <w:sz w:val="24"/>
+                <w:szCs w:val="24"/>
+              </w:rPr>
+              <w:t>María Fernanda Barrón Álvarez</w:t>
+            </w:r>
+          </w:p>
+        </w:tc>
+        <w:tc>
+          <w:tcPr>
+            <w:tcW w:w="1150" w:type="dxa"/>
+            <w:vAlign w:val="center"/>
+          </w:tcPr>
+          <w:p>
+            <w:pPr>
+              <w:rPr>
+                <w:rFonts w:ascii="Arial" w:hAnsi="Arial" w:cs="Arial"/>
+                <w:sz w:val="24"/>
+                <w:szCs w:val="24"/>
+              </w:rPr>
+            </w:pPr>
+            <w:r>
+              <w:rPr>
+                <w:rFonts w:ascii="Arial" w:hAnsi="Arial" w:cs="Arial"/>
+                <w:sz w:val="24"/>
+                <w:szCs w:val="24"/>
+              </w:rPr>
+              <w:t>8</w:t>
+            </w:r>
+            <w:r>
+              <w:rPr>
+                <w:rFonts w:ascii="Arial" w:hAnsi="Arial" w:cs="Arial"/>
+                <w:sz w:val="24"/>
+                <w:szCs w:val="24"/>
+              </w:rPr>
+              <w:t>:</w:t>
+            </w:r>
+            <w:r>
+              <w:rPr>
+                <w:rFonts w:ascii="Arial" w:hAnsi="Arial" w:cs="Arial"/>
+                <w:sz w:val="24"/>
+                <w:szCs w:val="24"/>
+              </w:rPr>
+              <w:t>1</w:t>
+            </w:r>
+            <w:r>
+              <w:rPr>
+                <w:rFonts w:ascii="Arial" w:hAnsi="Arial" w:cs="Arial"/>
+                <w:sz w:val="24"/>
+                <w:szCs w:val="24"/>
+              </w:rPr>
+              <w:t>0</w:t>
+            </w:r>
+            <w:r>
+              <w:rPr>
+                <w:rFonts w:ascii="Arial" w:hAnsi="Arial" w:cs="Arial"/>
+                <w:sz w:val="24"/>
+                <w:szCs w:val="24"/>
+              </w:rPr>
+              <w:t>a</w:t>
+            </w:r>
+            <w:r>
+              <w:rPr>
+                <w:rFonts w:ascii="Arial" w:hAnsi="Arial" w:cs="Arial"/>
+                <w:sz w:val="24"/>
+                <w:szCs w:val="24"/>
+              </w:rPr>
+              <w:t>m</w:t>
+            </w:r>
+          </w:p>
+        </w:tc>
+        <w:tc>
+          <w:tcPr>
+            <w:tcW w:w="1535" w:type="dxa"/>
+            <w:vAlign w:val="center"/>
+          </w:tcPr>
+          <w:p>
+            <w:pPr>
+              <w:rPr>
+                <w:rFonts w:ascii="Arial" w:hAnsi="Arial" w:cs="Arial"/>
+                <w:sz w:val="24"/>
+                <w:szCs w:val="24"/>
+              </w:rPr>
+            </w:pPr>
+            <w:r>
+              <w:rPr>
+                <w:rFonts w:ascii="Arial" w:hAnsi="Arial" w:cs="Arial"/>
+                <w:sz w:val="24"/>
+                <w:szCs w:val="24"/>
+              </w:rPr>
+              <w:t>9</w:t>
+            </w:r>
+            <w:r>
+              <w:rPr>
+                <w:rFonts w:ascii="Arial" w:hAnsi="Arial" w:cs="Arial"/>
+                <w:sz w:val="24"/>
+                <w:szCs w:val="24"/>
+              </w:rPr>
+              <w:t>:</w:t>
+            </w:r>
+            <w:r>
+              <w:rPr>
+                <w:rFonts w:ascii="Arial" w:hAnsi="Arial" w:cs="Arial"/>
+                <w:sz w:val="24"/>
+                <w:szCs w:val="24"/>
+              </w:rPr>
+              <w:t>0</w:t>
+            </w:r>
+            <w:r>
+              <w:rPr>
+                <w:rFonts w:ascii="Arial" w:hAnsi="Arial" w:cs="Arial"/>
+                <w:sz w:val="24"/>
+                <w:szCs w:val="24"/>
+              </w:rPr>
+              <w:t>0</w:t>
+            </w:r>
+            <w:r>
+              <w:rPr>
+                <w:rFonts w:ascii="Arial" w:hAnsi="Arial" w:cs="Arial"/>
+                <w:sz w:val="24"/>
+                <w:szCs w:val="24"/>
+              </w:rPr>
+              <w:t>a</w:t>
+            </w:r>
+            <w:r>
+              <w:rPr>
+                <w:rFonts w:ascii="Arial" w:hAnsi="Arial" w:cs="Arial"/>
+                <w:sz w:val="24"/>
+                <w:szCs w:val="24"/>
+              </w:rPr>
+              <w:t>m</w:t>
+            </w:r>
+          </w:p>
+        </w:tc>
+        <w:tc>
+          <w:tcPr>
+            <w:tcW w:w="2480" w:type="dxa"/>
+            <w:vAlign w:val="center"/>
+          </w:tcPr>
+          <w:p>
+            <w:pPr>
+              <w:rPr>
+                <w:rFonts w:ascii="Arial" w:hAnsi="Arial" w:cs="Arial"/>
+                <w:sz w:val="24"/>
+                <w:szCs w:val="24"/>
+              </w:rPr>
+            </w:pPr>
+            <w:r>
+              <w:rPr>
+                <w:rFonts w:ascii="Arial" w:hAnsi="Arial" w:cs="Arial"/>
+                <w:sz w:val="24"/>
+                <w:szCs w:val="24"/>
+              </w:rPr>
+              <w:t>Completado</w:t>
+            </w:r>
+          </w:p>
+        </w:tc>
+      </w:tr>
+      <w:tr>
+        <w:trPr>
+          <w:jc w:val="center"/>
+        </w:trPr>
+        <w:tc>
+          <w:tcPr>
+            <w:tcW w:w="2955" w:type="dxa"/>
+            <w:vAlign w:val="center"/>
+          </w:tcPr>
+          <w:p>
+            <w:pPr>
+              <w:rPr>
+                <w:rFonts w:ascii="Arial" w:hAnsi="Arial" w:cs="Arial"/>
+                <w:sz w:val="24"/>
+                <w:szCs w:val="24"/>
+              </w:rPr>
+            </w:pPr>
+            <w:r>
+              <w:rPr>
+                <w:rFonts w:ascii="Arial" w:hAnsi="Arial" w:cs="Arial"/>
+                <w:sz w:val="24"/>
+                <w:szCs w:val="24"/>
+              </w:rPr>
+              <w:t xml:space="preserve">Análisis y modificación de </w:t>
+            </w:r>
+            <w:proofErr w:type="spellStart"/>
+            <w:r>
+              <w:rPr>
+                <w:rFonts w:ascii="Arial" w:hAnsi="Arial" w:cs="Arial"/>
+                <w:sz w:val="24"/>
+                <w:szCs w:val="24"/>
+              </w:rPr>
+              <w:t>stack</w:t>
+            </w:r>
+            <w:proofErr w:type="spellEnd"/>
+            <w:r>
+              <w:rPr>
+                <w:rFonts w:ascii="Arial" w:hAnsi="Arial" w:cs="Arial"/>
+                <w:sz w:val="24"/>
+                <w:szCs w:val="24"/>
+              </w:rPr>
+              <w:t xml:space="preserve"> para </w:t>
+            </w:r>
+            <w:proofErr w:type="spellStart"/>
+            <w:r>
+              <w:rPr>
+                <w:rFonts w:ascii="Arial" w:hAnsi="Arial" w:cs="Arial"/>
+                <w:sz w:val="24"/>
+                <w:szCs w:val="24"/>
+              </w:rPr>
+              <w:t>frontend</w:t>
+            </w:r>
+            <w:proofErr w:type="spellEnd"/>
+          </w:p>
+        </w:tc>
+        <w:tc>
+          <w:tcPr>
+            <w:tcW w:w="2004" w:type="dxa"/>
+            <w:vAlign w:val="center"/>
+          </w:tcPr>
+          <w:p>
+            <w:pPr>
+              <w:rPr>
+                <w:rFonts w:ascii="Arial" w:hAnsi="Arial" w:cs="Arial"/>
+                <w:sz w:val="24"/>
+                <w:szCs w:val="24"/>
+              </w:rPr>
+            </w:pPr>
+            <w:r>
+              <w:rPr>
+                <w:rFonts w:ascii="Arial" w:hAnsi="Arial" w:cs="Arial"/>
+                <w:sz w:val="24"/>
+                <w:szCs w:val="24"/>
+              </w:rPr>
+              <w:t>Leslie Miroslava Benítez Marín</w:t>
+            </w:r>
+          </w:p>
+        </w:tc>
+        <w:tc>
+          <w:tcPr>
+            <w:tcW w:w="1150" w:type="dxa"/>
+            <w:vAlign w:val="center"/>
+          </w:tcPr>
+          <w:p>
+            <w:pPr>
+              <w:rPr>
+                <w:rFonts w:ascii="Arial" w:hAnsi="Arial" w:cs="Arial"/>
+                <w:sz w:val="24"/>
+                <w:szCs w:val="24"/>
+              </w:rPr>
+            </w:pPr>
+            <w:r>
+              <w:rPr>
+                <w:rFonts w:ascii="Arial" w:hAnsi="Arial" w:cs="Arial"/>
+                <w:sz w:val="24"/>
+                <w:szCs w:val="24"/>
+              </w:rPr>
+              <w:t>8</w:t>
+            </w:r>
+            <w:r>
+              <w:rPr>
+                <w:rFonts w:ascii="Arial" w:hAnsi="Arial" w:cs="Arial"/>
+                <w:sz w:val="24"/>
+                <w:szCs w:val="24"/>
+              </w:rPr>
+              <w:t>:</w:t>
+            </w:r>
+            <w:r>
+              <w:rPr>
+                <w:rFonts w:ascii="Arial" w:hAnsi="Arial" w:cs="Arial"/>
+                <w:sz w:val="24"/>
+                <w:szCs w:val="24"/>
+              </w:rPr>
+              <w:t>1</w:t>
+            </w:r>
+            <w:r>
+              <w:rPr>
+                <w:rFonts w:ascii="Arial" w:hAnsi="Arial" w:cs="Arial"/>
+                <w:sz w:val="24"/>
+                <w:szCs w:val="24"/>
+              </w:rPr>
+              <w:t>0</w:t>
+            </w:r>
+            <w:r>
+              <w:rPr>
+                <w:rFonts w:ascii="Arial" w:hAnsi="Arial" w:cs="Arial"/>
+                <w:sz w:val="24"/>
+                <w:szCs w:val="24"/>
+              </w:rPr>
+              <w:t>a</w:t>
+            </w:r>
+            <w:r>
+              <w:rPr>
+                <w:rFonts w:ascii="Arial" w:hAnsi="Arial" w:cs="Arial"/>
+                <w:sz w:val="24"/>
+                <w:szCs w:val="24"/>
+              </w:rPr>
+              <w:t>m</w:t>
+            </w:r>
+          </w:p>
+        </w:tc>
+        <w:tc>
+          <w:tcPr>
+            <w:tcW w:w="1535" w:type="dxa"/>
+            <w:vAlign w:val="center"/>
+          </w:tcPr>
+          <w:p>
+            <w:pPr>
+              <w:rPr>
+                <w:rFonts w:ascii="Arial" w:hAnsi="Arial" w:cs="Arial"/>
+                <w:sz w:val="24"/>
+                <w:szCs w:val="24"/>
+              </w:rPr>
+            </w:pPr>
+            <w:r>
+              <w:rPr>
+                <w:rFonts w:ascii="Arial" w:hAnsi="Arial" w:cs="Arial"/>
+                <w:sz w:val="24"/>
+                <w:szCs w:val="24"/>
+              </w:rPr>
+              <w:t>9</w:t>
+            </w:r>
+            <w:r>
+              <w:rPr>
+                <w:rFonts w:ascii="Arial" w:hAnsi="Arial" w:cs="Arial"/>
+                <w:sz w:val="24"/>
+                <w:szCs w:val="24"/>
+              </w:rPr>
+              <w:t>:00</w:t>
+            </w:r>
+            <w:r>
+              <w:rPr>
+                <w:rFonts w:ascii="Arial" w:hAnsi="Arial" w:cs="Arial"/>
+                <w:sz w:val="24"/>
+                <w:szCs w:val="24"/>
+              </w:rPr>
+              <w:t>a</w:t>
+            </w:r>
+            <w:r>
+              <w:rPr>
+                <w:rFonts w:ascii="Arial" w:hAnsi="Arial" w:cs="Arial"/>
+                <w:sz w:val="24"/>
+                <w:szCs w:val="24"/>
+              </w:rPr>
+              <w:t>m</w:t>
+            </w:r>
+          </w:p>
+        </w:tc>
+        <w:tc>
+          <w:tcPr>
+            <w:tcW w:w="2480" w:type="dxa"/>
+            <w:vAlign w:val="center"/>
+          </w:tcPr>
+          <w:p>
+            <w:pPr>
+              <w:rPr>
+                <w:rFonts w:ascii="Arial" w:hAnsi="Arial" w:cs="Arial"/>
+                <w:sz w:val="24"/>
+                <w:szCs w:val="24"/>
+              </w:rPr>
+            </w:pPr>
+            <w:r>
+              <w:rPr>
+                <w:rFonts w:ascii="Arial" w:hAnsi="Arial" w:cs="Arial"/>
+                <w:sz w:val="24"/>
+                <w:szCs w:val="24"/>
+              </w:rPr>
+              <w:t>Completado</w:t>
+            </w:r>
+          </w:p>
+        </w:tc>
+      </w:tr>
+      <w:tr>
+        <w:trPr>
+          <w:jc w:val="center"/>
+        </w:trPr>
+        <w:tc>
+          <w:tcPr>
+            <w:tcW w:w="2955" w:type="dxa"/>
+            <w:vAlign w:val="center"/>
+          </w:tcPr>
+          <w:p>
+            <w:pPr>
+              <w:rPr>
+                <w:rFonts w:ascii="Arial" w:hAnsi="Arial" w:cs="Arial"/>
+                <w:sz w:val="24"/>
+                <w:szCs w:val="24"/>
+              </w:rPr>
+            </w:pPr>
+            <w:r>
+              <w:rPr>
+                <w:rFonts w:ascii="Arial" w:hAnsi="Arial" w:cs="Arial"/>
+                <w:sz w:val="24"/>
+                <w:szCs w:val="24"/>
+              </w:rPr>
+              <w:t xml:space="preserve">Análisis y modificación de </w:t>
+            </w:r>
+            <w:proofErr w:type="spellStart"/>
+            <w:r>
+              <w:rPr>
+                <w:rFonts w:ascii="Arial" w:hAnsi="Arial" w:cs="Arial"/>
+                <w:sz w:val="24"/>
+                <w:szCs w:val="24"/>
+              </w:rPr>
+              <w:t>stack</w:t>
+            </w:r>
+            <w:proofErr w:type="spellEnd"/>
+            <w:r>
+              <w:rPr>
+                <w:rFonts w:ascii="Arial" w:hAnsi="Arial" w:cs="Arial"/>
+                <w:sz w:val="24"/>
+                <w:szCs w:val="24"/>
+              </w:rPr>
+              <w:t xml:space="preserve"> para </w:t>
+            </w:r>
+            <w:proofErr w:type="spellStart"/>
+            <w:r>
+              <w:rPr>
+                <w:rFonts w:ascii="Arial" w:hAnsi="Arial" w:cs="Arial"/>
+                <w:sz w:val="24"/>
+                <w:szCs w:val="24"/>
+              </w:rPr>
+              <w:t>backend</w:t>
+            </w:r>
+            <w:proofErr w:type="spellEnd"/>
+          </w:p>
+        </w:tc>
+        <w:tc>
+          <w:tcPr>
+            <w:tcW w:w="2004" w:type="dxa"/>
+            <w:vAlign w:val="center"/>
+          </w:tcPr>
+          <w:p>
+            <w:pPr>
+              <w:rPr>
+                <w:rFonts w:ascii="Arial" w:hAnsi="Arial" w:cs="Arial"/>
+                <w:sz w:val="24"/>
+                <w:szCs w:val="24"/>
+              </w:rPr>
+            </w:pPr>
+            <w:r>
+              <w:rPr>
+                <w:rFonts w:ascii="Arial" w:hAnsi="Arial" w:cs="Arial"/>
+                <w:sz w:val="24"/>
+                <w:szCs w:val="24"/>
+              </w:rPr>
+              <w:t>Leonardo Merino Garfias</w:t>
+            </w:r>
+          </w:p>
+        </w:tc>
+        <w:tc>
+          <w:tcPr>
+            <w:tcW w:w="1150" w:type="dxa"/>
+            <w:vAlign w:val="center"/>
+          </w:tcPr>
+          <w:p>
+            <w:pPr>
+              <w:rPr>
+                <w:rFonts w:ascii="Arial" w:hAnsi="Arial" w:cs="Arial"/>
+                <w:sz w:val="24"/>
+                <w:szCs w:val="24"/>
+              </w:rPr>
+            </w:pPr>
+            <w:r>
+              <w:rPr>
+                <w:rFonts w:ascii="Arial" w:hAnsi="Arial" w:cs="Arial"/>
+                <w:sz w:val="24"/>
+                <w:szCs w:val="24"/>
+              </w:rPr>
+              <w:t>8</w:t>
+            </w:r>
+            <w:r>
+              <w:rPr>
+                <w:rFonts w:ascii="Arial" w:hAnsi="Arial" w:cs="Arial"/>
+                <w:sz w:val="24"/>
+                <w:szCs w:val="24"/>
+              </w:rPr>
+              <w:t>:</w:t>
+            </w:r>
+            <w:r>
+              <w:rPr>
+                <w:rFonts w:ascii="Arial" w:hAnsi="Arial" w:cs="Arial"/>
+                <w:sz w:val="24"/>
+                <w:szCs w:val="24"/>
+              </w:rPr>
+              <w:t>1</w:t>
+            </w:r>
+            <w:r>
+              <w:rPr>
+                <w:rFonts w:ascii="Arial" w:hAnsi="Arial" w:cs="Arial"/>
+                <w:sz w:val="24"/>
+                <w:szCs w:val="24"/>
+              </w:rPr>
+              <w:t>0</w:t>
+            </w:r>
+            <w:r>
+              <w:rPr>
+                <w:rFonts w:ascii="Arial" w:hAnsi="Arial" w:cs="Arial"/>
+                <w:sz w:val="24"/>
+                <w:szCs w:val="24"/>
+              </w:rPr>
+              <w:t>a</w:t>
+            </w:r>
+            <w:r>
+              <w:rPr>
+                <w:rFonts w:ascii="Arial" w:hAnsi="Arial" w:cs="Arial"/>
+                <w:sz w:val="24"/>
+                <w:szCs w:val="24"/>
+              </w:rPr>
+              <w:t>m</w:t>
+            </w:r>
+          </w:p>
+        </w:tc>
+        <w:tc>
+          <w:tcPr>
+            <w:tcW w:w="1535" w:type="dxa"/>
+            <w:vAlign w:val="center"/>
+          </w:tcPr>
+          <w:p>
+            <w:pPr>
+              <w:rPr>
+                <w:rFonts w:ascii="Arial" w:hAnsi="Arial" w:cs="Arial"/>
+                <w:sz w:val="24"/>
+                <w:szCs w:val="24"/>
+              </w:rPr>
+            </w:pPr>
+            <w:r>
+              <w:rPr>
+                <w:rFonts w:ascii="Arial" w:hAnsi="Arial" w:cs="Arial"/>
+                <w:sz w:val="24"/>
+                <w:szCs w:val="24"/>
+              </w:rPr>
+              <w:t>9</w:t>
+            </w:r>
+            <w:r>
+              <w:rPr>
+                <w:rFonts w:ascii="Arial" w:hAnsi="Arial" w:cs="Arial"/>
+                <w:sz w:val="24"/>
+                <w:szCs w:val="24"/>
+              </w:rPr>
+              <w:t>:00</w:t>
+            </w:r>
+            <w:r>
+              <w:rPr>
+                <w:rFonts w:ascii="Arial" w:hAnsi="Arial" w:cs="Arial"/>
+                <w:sz w:val="24"/>
+                <w:szCs w:val="24"/>
+              </w:rPr>
+              <w:t>a</w:t>
+            </w:r>
+            <w:r>
+              <w:rPr>
+                <w:rFonts w:ascii="Arial" w:hAnsi="Arial" w:cs="Arial"/>
+                <w:sz w:val="24"/>
+                <w:szCs w:val="24"/>
+              </w:rPr>
+              <w:t>m</w:t>
+            </w:r>
+          </w:p>
+        </w:tc>
+        <w:tc>
+          <w:tcPr>
+            <w:tcW w:w="2480" w:type="dxa"/>
+            <w:vAlign w:val="center"/>
+          </w:tcPr>
+          <w:p>
+            <w:pPr>
+              <w:rPr>
+                <w:rFonts w:ascii="Arial" w:hAnsi="Arial" w:cs="Arial"/>
+                <w:sz w:val="24"/>
+                <w:szCs w:val="24"/>
+              </w:rPr>
+            </w:pPr>
+            <w:r>
+              <w:rPr>
+                <w:rFonts w:ascii="Arial" w:hAnsi="Arial" w:cs="Arial"/>
+                <w:sz w:val="24"/>
+                <w:szCs w:val="24"/>
+              </w:rPr>
+              <w:t>Completado</w:t>
+            </w:r>
+          </w:p>
+        </w:tc>
+      </w:tr>
+    </w:tbl>
+    <w:p>
+      <w:pPr>
+        <w:pStyle w:val="titulo1"/>
+        <w:outlineLvl w:val="2"/>
+        <w:rPr>
+          <w:sz w:val="32"/>
+          <w:szCs w:val="72"/>
+        </w:rPr>
+      </w:pPr>
+      <w:r>
+        <w:rPr>
+          <w:sz w:val="32"/>
+          <w:szCs w:val="72"/>
+        </w:rPr>
+        <w:lastRenderedPageBreak/>
+        <w:t>Gestión de Riesgos e Incidencias</w:t>
+      </w:r>
+    </w:p>
+    <w:tbl>
+      <w:tblPr>
+        <w:tblStyle w:val="Tablaconcuadrcula"/>
+        <w:tblW w:w="9634" w:type="dxa"/>
+        <w:jc w:val="center"/>
+        <w:tblBorders>
+          <w:top w:val="single" w:sz="4" w:space="0" w:color="7F7F7F" w:themeColor="text1" w:themeTint="80"/>
+          <w:left w:val="single" w:sz="4" w:space="0" w:color="7F7F7F" w:themeColor="text1" w:themeTint="80"/>
+          <w:bottom w:val="single" w:sz="4" w:space="0" w:color="7F7F7F" w:themeColor="text1" w:themeTint="80"/>
+          <w:right w:val="single" w:sz="4" w:space="0" w:color="7F7F7F" w:themeColor="text1" w:themeTint="80"/>
+          <w:insideH w:val="single" w:sz="4" w:space="0" w:color="7F7F7F" w:themeColor="text1" w:themeTint="80"/>
+          <w:insideV w:val="single" w:sz="4" w:space="0" w:color="7F7F7F" w:themeColor="text1" w:themeTint="80"/>
+        </w:tblBorders>
+        <w:tblCellMar>
+          <w:top w:w="57" w:type="dxa"/>
+          <w:bottom w:w="57" w:type="dxa"/>
+        </w:tblCellMar>
+        <w:tblLook w:val="04A0" w:firstRow="1" w:lastRow="0" w:firstColumn="1" w:lastColumn="0" w:noHBand="0" w:noVBand="1"/>
+      </w:tblPr>
+      <w:tblGrid>
+        <w:gridCol w:w="2942"/>
+        <w:gridCol w:w="2943"/>
+        <w:gridCol w:w="3749"/>
+      </w:tblGrid>
+      <w:tr>
+        <w:trPr>
+          <w:jc w:val="center"/>
+        </w:trPr>
+        <w:tc>
+          <w:tcPr>
+            <w:tcW w:w="2942" w:type="dxa"/>
+            <w:shd w:val="clear" w:color="auto" w:fill="262626" w:themeFill="text1" w:themeFillTint="D9"/>
+            <w:vAlign w:val="center"/>
+          </w:tcPr>
+          <w:p>
+            <w:pPr>
+              <w:jc w:val="center"/>
+              <w:rPr>
+                <w:rFonts w:ascii="Arial" w:hAnsi="Arial" w:cs="Arial"/>
+                <w:b/>
+                <w:bCs/>
+                <w:sz w:val="24"/>
+                <w:szCs w:val="24"/>
+              </w:rPr>
+            </w:pPr>
+            <w:r>
+              <w:rPr>
+                <w:rFonts w:ascii="Arial" w:hAnsi="Arial" w:cs="Arial"/>
+                <w:b/>
+                <w:bCs/>
+                <w:sz w:val="24"/>
+                <w:szCs w:val="24"/>
+              </w:rPr>
+              <w:t>Riesgo / Problema detectado</w:t>
+            </w:r>
+          </w:p>
+        </w:tc>
+        <w:tc>
+          <w:tcPr>
+            <w:tcW w:w="2943" w:type="dxa"/>
+            <w:shd w:val="clear" w:color="auto" w:fill="262626" w:themeFill="text1" w:themeFillTint="D9"/>
+            <w:vAlign w:val="center"/>
+          </w:tcPr>
+          <w:p>
+            <w:pPr>
+              <w:jc w:val="center"/>
+              <w:rPr>
+                <w:rFonts w:ascii="Arial" w:hAnsi="Arial" w:cs="Arial"/>
+                <w:b/>
+                <w:bCs/>
+                <w:sz w:val="24"/>
+                <w:szCs w:val="24"/>
+              </w:rPr>
+            </w:pPr>
+            <w:r>
+              <w:rPr>
+                <w:rFonts w:ascii="Arial" w:hAnsi="Arial" w:cs="Arial"/>
+                <w:b/>
+                <w:bCs/>
+                <w:sz w:val="24"/>
+                <w:szCs w:val="24"/>
+              </w:rPr>
+              <w:t>Impacto en alcance/tiempo/costo</w:t>
+            </w:r>
+          </w:p>
+        </w:tc>
+        <w:tc>
+          <w:tcPr>
+            <w:tcW w:w="3749" w:type="dxa"/>
+            <w:shd w:val="clear" w:color="auto" w:fill="262626" w:themeFill="text1" w:themeFillTint="D9"/>
+            <w:vAlign w:val="center"/>
+          </w:tcPr>
+          <w:p>
+            <w:pPr>
+              <w:jc w:val="center"/>
+              <w:rPr>
+                <w:rFonts w:ascii="Arial" w:hAnsi="Arial" w:cs="Arial"/>
+                <w:b/>
+                <w:bCs/>
+                <w:sz w:val="24"/>
+                <w:szCs w:val="24"/>
+              </w:rPr>
+            </w:pPr>
+            <w:r>
+              <w:rPr>
+                <w:rFonts w:ascii="Arial" w:hAnsi="Arial" w:cs="Arial"/>
+                <w:b/>
+                <w:bCs/>
+                <w:sz w:val="24"/>
+                <w:szCs w:val="24"/>
+              </w:rPr>
+              <w:t>Acción correctiva o preventiva</w:t>
+            </w:r>
+          </w:p>
+        </w:tc>
+      </w:tr>
+      <w:tr>
+        <w:trPr>
+          <w:jc w:val="center"/>
+        </w:trPr>
+        <w:tc>
+          <w:tcPr>
+            <w:tcW w:w="2942" w:type="dxa"/>
+            <w:vAlign w:val="center"/>
+          </w:tcPr>
+          <w:p>
+            <w:pPr>
+              <w:rPr>
+                <w:rFonts w:ascii="Arial" w:hAnsi="Arial" w:cs="Arial"/>
+                <w:sz w:val="24"/>
+                <w:szCs w:val="24"/>
+              </w:rPr>
+            </w:pPr>
+            <w:r>
+              <w:rPr>
+                <w:rFonts w:ascii="Arial" w:hAnsi="Arial" w:cs="Arial"/>
+                <w:sz w:val="24"/>
+                <w:szCs w:val="24"/>
+              </w:rPr>
+              <w:t>--</w:t>
+            </w:r>
+          </w:p>
+        </w:tc>
+        <w:tc>
+          <w:tcPr>
+            <w:tcW w:w="2943" w:type="dxa"/>
+            <w:vAlign w:val="center"/>
+          </w:tcPr>
+          <w:p>
+            <w:pPr>
+              <w:jc w:val="center"/>
+              <w:rPr>
+                <w:rFonts w:ascii="Arial" w:hAnsi="Arial" w:cs="Arial"/>
+                <w:sz w:val="24"/>
+                <w:szCs w:val="24"/>
+              </w:rPr>
+            </w:pPr>
+            <w:r>
+              <w:rPr>
+                <w:rFonts w:ascii="Arial" w:hAnsi="Arial" w:cs="Arial"/>
+                <w:sz w:val="24"/>
+                <w:szCs w:val="24"/>
+              </w:rPr>
+              <w:t>--</w:t>
+            </w:r>
+          </w:p>
+        </w:tc>
+        <w:tc>
+          <w:tcPr>
+            <w:tcW w:w="3749" w:type="dxa"/>
+            <w:vAlign w:val="center"/>
+          </w:tcPr>
+          <w:p>
+            <w:pPr>
+              <w:rPr>
+                <w:rFonts w:ascii="Arial" w:hAnsi="Arial" w:cs="Arial"/>
+                <w:sz w:val="24"/>
+                <w:szCs w:val="24"/>
+              </w:rPr>
+            </w:pPr>
+            <w:r>
+              <w:rPr>
+                <w:rFonts w:ascii="Arial" w:hAnsi="Arial" w:cs="Arial"/>
+                <w:sz w:val="24"/>
+                <w:szCs w:val="24"/>
+              </w:rPr>
+              <w:t>--</w:t>
+            </w:r>
+          </w:p>
+        </w:tc>
+      </w:tr>
+    </w:tbl>
     <w:p>
       <w:r>
         <w:br w:type="page"/>
@@ -27896,7 +30212,7 @@
   <w:style w:type="paragraph" w:default="1" w:styleId="Normal">
     <w:name w:val="Normal"/>
     <w:qFormat/>
-    <w:rsid w:val="00A940BA"/>
+    <w:rsid w:val="00C04E92"/>
   </w:style>
   <w:style w:type="paragraph" w:styleId="Ttulo1">
     <w:name w:val="heading 1"/>

</xml_diff>

<commit_message>
:memo: Bitácora 18 de mayo
</commit_message>
<xml_diff>
--- a/BITACORA.docx
+++ b/BITACORA.docx
@@ -377,7 +377,7 @@
                                   <w:rFonts w:ascii="Abadi Extra Light" w:hAnsi="Abadi Extra Light"/>
                                   <w:color w:val="FFFFFF" w:themeColor="background1"/>
                                 </w:rPr>
-                                <w:t>4</w:t>
+                                <w:t>8</w:t>
                               </w:r>
                               <w:r>
                                 <w:rPr>
@@ -664,7 +664,7 @@
                             <w:rFonts w:ascii="Abadi Extra Light" w:hAnsi="Abadi Extra Light"/>
                             <w:color w:val="FFFFFF" w:themeColor="background1"/>
                           </w:rPr>
-                          <w:t>4</w:t>
+                          <w:t>8</w:t>
                         </w:r>
                         <w:r>
                           <w:rPr>
@@ -750,7 +750,6 @@
           <w:docPartUnique/>
         </w:docPartObj>
       </w:sdtPr>
-      <w:sdtEndPr/>
       <w:sdtContent>
         <w:p>
           <w:pPr>
@@ -807,7 +806,7 @@
           <w:r>
             <w:fldChar w:fldCharType="separate"/>
           </w:r>
-          <w:hyperlink w:anchor="_Toc229639232" w:history="1">
+          <w:hyperlink w:anchor="_Toc229984842" w:history="1">
             <w:r>
               <w:rPr>
                 <w:rStyle w:val="Hipervnculo"/>
@@ -834,7 +833,7 @@
                 <w:noProof/>
                 <w:webHidden/>
               </w:rPr>
-              <w:instrText xml:space="preserve"> PAGEREF _Toc229639232 \h </w:instrText>
+              <w:instrText xml:space="preserve"> PAGEREF _Toc229984842 \h </w:instrText>
             </w:r>
             <w:r>
               <w:rPr>
@@ -875,7 +874,7 @@
               <w:lang w:eastAsia="ko-KR"/>
             </w:rPr>
           </w:pPr>
-          <w:hyperlink w:anchor="_Toc229639233" w:history="1">
+          <w:hyperlink w:anchor="_Toc229984843" w:history="1">
             <w:r>
               <w:rPr>
                 <w:rStyle w:val="Hipervnculo"/>
@@ -903,7 +902,7 @@
                 <w:noProof/>
                 <w:webHidden/>
               </w:rPr>
-              <w:instrText xml:space="preserve"> PAGEREF _Toc229639233 \h </w:instrText>
+              <w:instrText xml:space="preserve"> PAGEREF _Toc229984843 \h </w:instrText>
             </w:r>
             <w:r>
               <w:rPr>
@@ -947,7 +946,7 @@
               <w:lang w:eastAsia="ko-KR"/>
             </w:rPr>
           </w:pPr>
-          <w:hyperlink w:anchor="_Toc229639234" w:history="1">
+          <w:hyperlink w:anchor="_Toc229984844" w:history="1">
             <w:r>
               <w:rPr>
                 <w:rStyle w:val="Hipervnculo"/>
@@ -974,7 +973,7 @@
                 <w:noProof/>
                 <w:webHidden/>
               </w:rPr>
-              <w:instrText xml:space="preserve"> PAGEREF _Toc229639234 \h </w:instrText>
+              <w:instrText xml:space="preserve"> PAGEREF _Toc229984844 \h </w:instrText>
             </w:r>
             <w:r>
               <w:rPr>
@@ -1018,7 +1017,7 @@
               <w:lang w:eastAsia="ko-KR"/>
             </w:rPr>
           </w:pPr>
-          <w:hyperlink w:anchor="_Toc229639235" w:history="1">
+          <w:hyperlink w:anchor="_Toc229984845" w:history="1">
             <w:r>
               <w:rPr>
                 <w:rStyle w:val="Hipervnculo"/>
@@ -1045,7 +1044,7 @@
                 <w:noProof/>
                 <w:webHidden/>
               </w:rPr>
-              <w:instrText xml:space="preserve"> PAGEREF _Toc229639235 \h </w:instrText>
+              <w:instrText xml:space="preserve"> PAGEREF _Toc229984845 \h </w:instrText>
             </w:r>
             <w:r>
               <w:rPr>
@@ -1089,7 +1088,7 @@
               <w:lang w:eastAsia="ko-KR"/>
             </w:rPr>
           </w:pPr>
-          <w:hyperlink w:anchor="_Toc229639236" w:history="1">
+          <w:hyperlink w:anchor="_Toc229984846" w:history="1">
             <w:r>
               <w:rPr>
                 <w:rStyle w:val="Hipervnculo"/>
@@ -1116,7 +1115,7 @@
                 <w:noProof/>
                 <w:webHidden/>
               </w:rPr>
-              <w:instrText xml:space="preserve"> PAGEREF _Toc229639236 \h </w:instrText>
+              <w:instrText xml:space="preserve"> PAGEREF _Toc229984846 \h </w:instrText>
             </w:r>
             <w:r>
               <w:rPr>
@@ -1157,7 +1156,7 @@
               <w:lang w:eastAsia="ko-KR"/>
             </w:rPr>
           </w:pPr>
-          <w:hyperlink w:anchor="_Toc229639237" w:history="1">
+          <w:hyperlink w:anchor="_Toc229984847" w:history="1">
             <w:r>
               <w:rPr>
                 <w:rStyle w:val="Hipervnculo"/>
@@ -1185,7 +1184,7 @@
                 <w:noProof/>
                 <w:webHidden/>
               </w:rPr>
-              <w:instrText xml:space="preserve"> PAGEREF _Toc229639237 \h </w:instrText>
+              <w:instrText xml:space="preserve"> PAGEREF _Toc229984847 \h </w:instrText>
             </w:r>
             <w:r>
               <w:rPr>
@@ -1229,7 +1228,7 @@
               <w:lang w:eastAsia="ko-KR"/>
             </w:rPr>
           </w:pPr>
-          <w:hyperlink w:anchor="_Toc229639238" w:history="1">
+          <w:hyperlink w:anchor="_Toc229984848" w:history="1">
             <w:r>
               <w:rPr>
                 <w:rStyle w:val="Hipervnculo"/>
@@ -1256,7 +1255,7 @@
                 <w:noProof/>
                 <w:webHidden/>
               </w:rPr>
-              <w:instrText xml:space="preserve"> PAGEREF _Toc229639238 \h </w:instrText>
+              <w:instrText xml:space="preserve"> PAGEREF _Toc229984848 \h </w:instrText>
             </w:r>
             <w:r>
               <w:rPr>
@@ -1300,7 +1299,7 @@
               <w:lang w:eastAsia="ko-KR"/>
             </w:rPr>
           </w:pPr>
-          <w:hyperlink w:anchor="_Toc229639239" w:history="1">
+          <w:hyperlink w:anchor="_Toc229984849" w:history="1">
             <w:r>
               <w:rPr>
                 <w:rStyle w:val="Hipervnculo"/>
@@ -1327,7 +1326,7 @@
                 <w:noProof/>
                 <w:webHidden/>
               </w:rPr>
-              <w:instrText xml:space="preserve"> PAGEREF _Toc229639239 \h </w:instrText>
+              <w:instrText xml:space="preserve"> PAGEREF _Toc229984849 \h </w:instrText>
             </w:r>
             <w:r>
               <w:rPr>
@@ -1371,7 +1370,7 @@
               <w:lang w:eastAsia="ko-KR"/>
             </w:rPr>
           </w:pPr>
-          <w:hyperlink w:anchor="_Toc229639240" w:history="1">
+          <w:hyperlink w:anchor="_Toc229984850" w:history="1">
             <w:r>
               <w:rPr>
                 <w:rStyle w:val="Hipervnculo"/>
@@ -1398,7 +1397,7 @@
                 <w:noProof/>
                 <w:webHidden/>
               </w:rPr>
-              <w:instrText xml:space="preserve"> PAGEREF _Toc229639240 \h </w:instrText>
+              <w:instrText xml:space="preserve"> PAGEREF _Toc229984850 \h </w:instrText>
             </w:r>
             <w:r>
               <w:rPr>
@@ -1442,7 +1441,7 @@
               <w:lang w:eastAsia="ko-KR"/>
             </w:rPr>
           </w:pPr>
-          <w:hyperlink w:anchor="_Toc229639241" w:history="1">
+          <w:hyperlink w:anchor="_Toc229984851" w:history="1">
             <w:r>
               <w:rPr>
                 <w:rStyle w:val="Hipervnculo"/>
@@ -1470,7 +1469,7 @@
                 <w:noProof/>
                 <w:webHidden/>
               </w:rPr>
-              <w:instrText xml:space="preserve"> PAGEREF _Toc229639241 \h </w:instrText>
+              <w:instrText xml:space="preserve"> PAGEREF _Toc229984851 \h </w:instrText>
             </w:r>
             <w:r>
               <w:rPr>
@@ -1514,7 +1513,7 @@
               <w:lang w:eastAsia="ko-KR"/>
             </w:rPr>
           </w:pPr>
-          <w:hyperlink w:anchor="_Toc229639242" w:history="1">
+          <w:hyperlink w:anchor="_Toc229984852" w:history="1">
             <w:r>
               <w:rPr>
                 <w:rStyle w:val="Hipervnculo"/>
@@ -1541,7 +1540,7 @@
                 <w:noProof/>
                 <w:webHidden/>
               </w:rPr>
-              <w:instrText xml:space="preserve"> PAGEREF _Toc229639242 \h </w:instrText>
+              <w:instrText xml:space="preserve"> PAGEREF _Toc229984852 \h </w:instrText>
             </w:r>
             <w:r>
               <w:rPr>
@@ -1585,7 +1584,7 @@
               <w:lang w:eastAsia="ko-KR"/>
             </w:rPr>
           </w:pPr>
-          <w:hyperlink w:anchor="_Toc229639243" w:history="1">
+          <w:hyperlink w:anchor="_Toc229984853" w:history="1">
             <w:r>
               <w:rPr>
                 <w:rStyle w:val="Hipervnculo"/>
@@ -1612,7 +1611,7 @@
                 <w:noProof/>
                 <w:webHidden/>
               </w:rPr>
-              <w:instrText xml:space="preserve"> PAGEREF _Toc229639243 \h </w:instrText>
+              <w:instrText xml:space="preserve"> PAGEREF _Toc229984853 \h </w:instrText>
             </w:r>
             <w:r>
               <w:rPr>
@@ -1656,7 +1655,7 @@
               <w:lang w:eastAsia="ko-KR"/>
             </w:rPr>
           </w:pPr>
-          <w:hyperlink w:anchor="_Toc229639244" w:history="1">
+          <w:hyperlink w:anchor="_Toc229984854" w:history="1">
             <w:r>
               <w:rPr>
                 <w:rStyle w:val="Hipervnculo"/>
@@ -1683,7 +1682,7 @@
                 <w:noProof/>
                 <w:webHidden/>
               </w:rPr>
-              <w:instrText xml:space="preserve"> PAGEREF _Toc229639244 \h </w:instrText>
+              <w:instrText xml:space="preserve"> PAGEREF _Toc229984854 \h </w:instrText>
             </w:r>
             <w:r>
               <w:rPr>
@@ -1724,7 +1723,7 @@
               <w:lang w:eastAsia="ko-KR"/>
             </w:rPr>
           </w:pPr>
-          <w:hyperlink w:anchor="_Toc229639245" w:history="1">
+          <w:hyperlink w:anchor="_Toc229984855" w:history="1">
             <w:r>
               <w:rPr>
                 <w:rStyle w:val="Hipervnculo"/>
@@ -1752,7 +1751,7 @@
                 <w:noProof/>
                 <w:webHidden/>
               </w:rPr>
-              <w:instrText xml:space="preserve"> PAGEREF _Toc229639245 \h </w:instrText>
+              <w:instrText xml:space="preserve"> PAGEREF _Toc229984855 \h </w:instrText>
             </w:r>
             <w:r>
               <w:rPr>
@@ -1796,7 +1795,7 @@
               <w:lang w:eastAsia="ko-KR"/>
             </w:rPr>
           </w:pPr>
-          <w:hyperlink w:anchor="_Toc229639246" w:history="1">
+          <w:hyperlink w:anchor="_Toc229984856" w:history="1">
             <w:r>
               <w:rPr>
                 <w:rStyle w:val="Hipervnculo"/>
@@ -1823,7 +1822,7 @@
                 <w:noProof/>
                 <w:webHidden/>
               </w:rPr>
-              <w:instrText xml:space="preserve"> PAGEREF _Toc229639246 \h </w:instrText>
+              <w:instrText xml:space="preserve"> PAGEREF _Toc229984856 \h </w:instrText>
             </w:r>
             <w:r>
               <w:rPr>
@@ -1867,7 +1866,7 @@
               <w:lang w:eastAsia="ko-KR"/>
             </w:rPr>
           </w:pPr>
-          <w:hyperlink w:anchor="_Toc229639247" w:history="1">
+          <w:hyperlink w:anchor="_Toc229984857" w:history="1">
             <w:r>
               <w:rPr>
                 <w:rStyle w:val="Hipervnculo"/>
@@ -1894,7 +1893,7 @@
                 <w:noProof/>
                 <w:webHidden/>
               </w:rPr>
-              <w:instrText xml:space="preserve"> PAGEREF _Toc229639247 \h </w:instrText>
+              <w:instrText xml:space="preserve"> PAGEREF _Toc229984857 \h </w:instrText>
             </w:r>
             <w:r>
               <w:rPr>
@@ -1938,7 +1937,7 @@
               <w:lang w:eastAsia="ko-KR"/>
             </w:rPr>
           </w:pPr>
-          <w:hyperlink w:anchor="_Toc229639248" w:history="1">
+          <w:hyperlink w:anchor="_Toc229984858" w:history="1">
             <w:r>
               <w:rPr>
                 <w:rStyle w:val="Hipervnculo"/>
@@ -1965,7 +1964,7 @@
                 <w:noProof/>
                 <w:webHidden/>
               </w:rPr>
-              <w:instrText xml:space="preserve"> PAGEREF _Toc229639248 \h </w:instrText>
+              <w:instrText xml:space="preserve"> PAGEREF _Toc229984858 \h </w:instrText>
             </w:r>
             <w:r>
               <w:rPr>
@@ -2006,7 +2005,7 @@
               <w:lang w:eastAsia="ko-KR"/>
             </w:rPr>
           </w:pPr>
-          <w:hyperlink w:anchor="_Toc229639249" w:history="1">
+          <w:hyperlink w:anchor="_Toc229984859" w:history="1">
             <w:r>
               <w:rPr>
                 <w:rStyle w:val="Hipervnculo"/>
@@ -2034,7 +2033,7 @@
                 <w:noProof/>
                 <w:webHidden/>
               </w:rPr>
-              <w:instrText xml:space="preserve"> PAGEREF _Toc229639249 \h </w:instrText>
+              <w:instrText xml:space="preserve"> PAGEREF _Toc229984859 \h </w:instrText>
             </w:r>
             <w:r>
               <w:rPr>
@@ -2078,7 +2077,7 @@
               <w:lang w:eastAsia="ko-KR"/>
             </w:rPr>
           </w:pPr>
-          <w:hyperlink w:anchor="_Toc229639250" w:history="1">
+          <w:hyperlink w:anchor="_Toc229984860" w:history="1">
             <w:r>
               <w:rPr>
                 <w:rStyle w:val="Hipervnculo"/>
@@ -2105,7 +2104,7 @@
                 <w:noProof/>
                 <w:webHidden/>
               </w:rPr>
-              <w:instrText xml:space="preserve"> PAGEREF _Toc229639250 \h </w:instrText>
+              <w:instrText xml:space="preserve"> PAGEREF _Toc229984860 \h </w:instrText>
             </w:r>
             <w:r>
               <w:rPr>
@@ -2149,7 +2148,7 @@
               <w:lang w:eastAsia="ko-KR"/>
             </w:rPr>
           </w:pPr>
-          <w:hyperlink w:anchor="_Toc229639251" w:history="1">
+          <w:hyperlink w:anchor="_Toc229984861" w:history="1">
             <w:r>
               <w:rPr>
                 <w:rStyle w:val="Hipervnculo"/>
@@ -2176,7 +2175,7 @@
                 <w:noProof/>
                 <w:webHidden/>
               </w:rPr>
-              <w:instrText xml:space="preserve"> PAGEREF _Toc229639251 \h </w:instrText>
+              <w:instrText xml:space="preserve"> PAGEREF _Toc229984861 \h </w:instrText>
             </w:r>
             <w:r>
               <w:rPr>
@@ -2220,7 +2219,7 @@
               <w:lang w:eastAsia="ko-KR"/>
             </w:rPr>
           </w:pPr>
-          <w:hyperlink w:anchor="_Toc229639252" w:history="1">
+          <w:hyperlink w:anchor="_Toc229984862" w:history="1">
             <w:r>
               <w:rPr>
                 <w:rStyle w:val="Hipervnculo"/>
@@ -2247,7 +2246,7 @@
                 <w:noProof/>
                 <w:webHidden/>
               </w:rPr>
-              <w:instrText xml:space="preserve"> PAGEREF _Toc229639252 \h </w:instrText>
+              <w:instrText xml:space="preserve"> PAGEREF _Toc229984862 \h </w:instrText>
             </w:r>
             <w:r>
               <w:rPr>
@@ -2288,7 +2287,7 @@
               <w:lang w:eastAsia="ko-KR"/>
             </w:rPr>
           </w:pPr>
-          <w:hyperlink w:anchor="_Toc229639253" w:history="1">
+          <w:hyperlink w:anchor="_Toc229984863" w:history="1">
             <w:r>
               <w:rPr>
                 <w:rStyle w:val="Hipervnculo"/>
@@ -2316,7 +2315,7 @@
                 <w:noProof/>
                 <w:webHidden/>
               </w:rPr>
-              <w:instrText xml:space="preserve"> PAGEREF _Toc229639253 \h </w:instrText>
+              <w:instrText xml:space="preserve"> PAGEREF _Toc229984863 \h </w:instrText>
             </w:r>
             <w:r>
               <w:rPr>
@@ -2360,7 +2359,7 @@
               <w:lang w:eastAsia="ko-KR"/>
             </w:rPr>
           </w:pPr>
-          <w:hyperlink w:anchor="_Toc229639254" w:history="1">
+          <w:hyperlink w:anchor="_Toc229984864" w:history="1">
             <w:r>
               <w:rPr>
                 <w:rStyle w:val="Hipervnculo"/>
@@ -2387,7 +2386,7 @@
                 <w:noProof/>
                 <w:webHidden/>
               </w:rPr>
-              <w:instrText xml:space="preserve"> PAGEREF _Toc229639254 \h </w:instrText>
+              <w:instrText xml:space="preserve"> PAGEREF _Toc229984864 \h </w:instrText>
             </w:r>
             <w:r>
               <w:rPr>
@@ -2431,7 +2430,7 @@
               <w:lang w:eastAsia="ko-KR"/>
             </w:rPr>
           </w:pPr>
-          <w:hyperlink w:anchor="_Toc229639255" w:history="1">
+          <w:hyperlink w:anchor="_Toc229984865" w:history="1">
             <w:r>
               <w:rPr>
                 <w:rStyle w:val="Hipervnculo"/>
@@ -2458,7 +2457,7 @@
                 <w:noProof/>
                 <w:webHidden/>
               </w:rPr>
-              <w:instrText xml:space="preserve"> PAGEREF _Toc229639255 \h </w:instrText>
+              <w:instrText xml:space="preserve"> PAGEREF _Toc229984865 \h </w:instrText>
             </w:r>
             <w:r>
               <w:rPr>
@@ -2502,7 +2501,7 @@
               <w:lang w:eastAsia="ko-KR"/>
             </w:rPr>
           </w:pPr>
-          <w:hyperlink w:anchor="_Toc229639256" w:history="1">
+          <w:hyperlink w:anchor="_Toc229984866" w:history="1">
             <w:r>
               <w:rPr>
                 <w:rStyle w:val="Hipervnculo"/>
@@ -2529,7 +2528,7 @@
                 <w:noProof/>
                 <w:webHidden/>
               </w:rPr>
-              <w:instrText xml:space="preserve"> PAGEREF _Toc229639256 \h </w:instrText>
+              <w:instrText xml:space="preserve"> PAGEREF _Toc229984866 \h </w:instrText>
             </w:r>
             <w:r>
               <w:rPr>
@@ -2573,7 +2572,7 @@
               <w:lang w:eastAsia="ko-KR"/>
             </w:rPr>
           </w:pPr>
-          <w:hyperlink w:anchor="_Toc229639257" w:history="1">
+          <w:hyperlink w:anchor="_Toc229984867" w:history="1">
             <w:r>
               <w:rPr>
                 <w:rStyle w:val="Hipervnculo"/>
@@ -2600,7 +2599,7 @@
                 <w:noProof/>
                 <w:webHidden/>
               </w:rPr>
-              <w:instrText xml:space="preserve"> PAGEREF _Toc229639257 \h </w:instrText>
+              <w:instrText xml:space="preserve"> PAGEREF _Toc229984867 \h </w:instrText>
             </w:r>
             <w:r>
               <w:rPr>
@@ -2641,7 +2640,7 @@
               <w:lang w:eastAsia="ko-KR"/>
             </w:rPr>
           </w:pPr>
-          <w:hyperlink w:anchor="_Toc229639258" w:history="1">
+          <w:hyperlink w:anchor="_Toc229984868" w:history="1">
             <w:r>
               <w:rPr>
                 <w:rStyle w:val="Hipervnculo"/>
@@ -2669,7 +2668,7 @@
                 <w:noProof/>
                 <w:webHidden/>
               </w:rPr>
-              <w:instrText xml:space="preserve"> PAGEREF _Toc229639258 \h </w:instrText>
+              <w:instrText xml:space="preserve"> PAGEREF _Toc229984868 \h </w:instrText>
             </w:r>
             <w:r>
               <w:rPr>
@@ -2713,7 +2712,7 @@
               <w:lang w:eastAsia="ko-KR"/>
             </w:rPr>
           </w:pPr>
-          <w:hyperlink w:anchor="_Toc229639259" w:history="1">
+          <w:hyperlink w:anchor="_Toc229984869" w:history="1">
             <w:r>
               <w:rPr>
                 <w:rStyle w:val="Hipervnculo"/>
@@ -2740,7 +2739,7 @@
                 <w:noProof/>
                 <w:webHidden/>
               </w:rPr>
-              <w:instrText xml:space="preserve"> PAGEREF _Toc229639259 \h </w:instrText>
+              <w:instrText xml:space="preserve"> PAGEREF _Toc229984869 \h </w:instrText>
             </w:r>
             <w:r>
               <w:rPr>
@@ -2784,7 +2783,7 @@
               <w:lang w:eastAsia="ko-KR"/>
             </w:rPr>
           </w:pPr>
-          <w:hyperlink w:anchor="_Toc229639260" w:history="1">
+          <w:hyperlink w:anchor="_Toc229984870" w:history="1">
             <w:r>
               <w:rPr>
                 <w:rStyle w:val="Hipervnculo"/>
@@ -2811,7 +2810,7 @@
                 <w:noProof/>
                 <w:webHidden/>
               </w:rPr>
-              <w:instrText xml:space="preserve"> PAGEREF _Toc229639260 \h </w:instrText>
+              <w:instrText xml:space="preserve"> PAGEREF _Toc229984870 \h </w:instrText>
             </w:r>
             <w:r>
               <w:rPr>
@@ -2852,7 +2851,7 @@
               <w:lang w:eastAsia="ko-KR"/>
             </w:rPr>
           </w:pPr>
-          <w:hyperlink w:anchor="_Toc229639261" w:history="1">
+          <w:hyperlink w:anchor="_Toc229984871" w:history="1">
             <w:r>
               <w:rPr>
                 <w:rStyle w:val="Hipervnculo"/>
@@ -2880,7 +2879,7 @@
                 <w:noProof/>
                 <w:webHidden/>
               </w:rPr>
-              <w:instrText xml:space="preserve"> PAGEREF _Toc229639261 \h </w:instrText>
+              <w:instrText xml:space="preserve"> PAGEREF _Toc229984871 \h </w:instrText>
             </w:r>
             <w:r>
               <w:rPr>
@@ -2924,7 +2923,7 @@
               <w:lang w:eastAsia="ko-KR"/>
             </w:rPr>
           </w:pPr>
-          <w:hyperlink w:anchor="_Toc229639262" w:history="1">
+          <w:hyperlink w:anchor="_Toc229984872" w:history="1">
             <w:r>
               <w:rPr>
                 <w:rStyle w:val="Hipervnculo"/>
@@ -2951,7 +2950,7 @@
                 <w:noProof/>
                 <w:webHidden/>
               </w:rPr>
-              <w:instrText xml:space="preserve"> PAGEREF _Toc229639262 \h </w:instrText>
+              <w:instrText xml:space="preserve"> PAGEREF _Toc229984872 \h </w:instrText>
             </w:r>
             <w:r>
               <w:rPr>
@@ -2995,7 +2994,7 @@
               <w:lang w:eastAsia="ko-KR"/>
             </w:rPr>
           </w:pPr>
-          <w:hyperlink w:anchor="_Toc229639263" w:history="1">
+          <w:hyperlink w:anchor="_Toc229984873" w:history="1">
             <w:r>
               <w:rPr>
                 <w:rStyle w:val="Hipervnculo"/>
@@ -3022,7 +3021,7 @@
                 <w:noProof/>
                 <w:webHidden/>
               </w:rPr>
-              <w:instrText xml:space="preserve"> PAGEREF _Toc229639263 \h </w:instrText>
+              <w:instrText xml:space="preserve"> PAGEREF _Toc229984873 \h </w:instrText>
             </w:r>
             <w:r>
               <w:rPr>
@@ -3066,7 +3065,7 @@
               <w:lang w:eastAsia="ko-KR"/>
             </w:rPr>
           </w:pPr>
-          <w:hyperlink w:anchor="_Toc229639264" w:history="1">
+          <w:hyperlink w:anchor="_Toc229984874" w:history="1">
             <w:r>
               <w:rPr>
                 <w:rStyle w:val="Hipervnculo"/>
@@ -3093,7 +3092,7 @@
                 <w:noProof/>
                 <w:webHidden/>
               </w:rPr>
-              <w:instrText xml:space="preserve"> PAGEREF _Toc229639264 \h </w:instrText>
+              <w:instrText xml:space="preserve"> PAGEREF _Toc229984874 \h </w:instrText>
             </w:r>
             <w:r>
               <w:rPr>
@@ -3137,7 +3136,7 @@
               <w:lang w:eastAsia="ko-KR"/>
             </w:rPr>
           </w:pPr>
-          <w:hyperlink w:anchor="_Toc229639265" w:history="1">
+          <w:hyperlink w:anchor="_Toc229984875" w:history="1">
             <w:r>
               <w:rPr>
                 <w:rStyle w:val="Hipervnculo"/>
@@ -3164,7 +3163,7 @@
                 <w:noProof/>
                 <w:webHidden/>
               </w:rPr>
-              <w:instrText xml:space="preserve"> PAGEREF _Toc229639265 \h </w:instrText>
+              <w:instrText xml:space="preserve"> PAGEREF _Toc229984875 \h </w:instrText>
             </w:r>
             <w:r>
               <w:rPr>
@@ -3205,7 +3204,7 @@
               <w:lang w:eastAsia="ko-KR"/>
             </w:rPr>
           </w:pPr>
-          <w:hyperlink w:anchor="_Toc229639266" w:history="1">
+          <w:hyperlink w:anchor="_Toc229984876" w:history="1">
             <w:r>
               <w:rPr>
                 <w:rStyle w:val="Hipervnculo"/>
@@ -3233,7 +3232,7 @@
                 <w:noProof/>
                 <w:webHidden/>
               </w:rPr>
-              <w:instrText xml:space="preserve"> PAGEREF _Toc229639266 \h </w:instrText>
+              <w:instrText xml:space="preserve"> PAGEREF _Toc229984876 \h </w:instrText>
             </w:r>
             <w:r>
               <w:rPr>
@@ -3277,7 +3276,7 @@
               <w:lang w:eastAsia="ko-KR"/>
             </w:rPr>
           </w:pPr>
-          <w:hyperlink w:anchor="_Toc229639267" w:history="1">
+          <w:hyperlink w:anchor="_Toc229984877" w:history="1">
             <w:r>
               <w:rPr>
                 <w:rStyle w:val="Hipervnculo"/>
@@ -3304,7 +3303,7 @@
                 <w:noProof/>
                 <w:webHidden/>
               </w:rPr>
-              <w:instrText xml:space="preserve"> PAGEREF _Toc229639267 \h </w:instrText>
+              <w:instrText xml:space="preserve"> PAGEREF _Toc229984877 \h </w:instrText>
             </w:r>
             <w:r>
               <w:rPr>
@@ -3348,7 +3347,7 @@
               <w:lang w:eastAsia="ko-KR"/>
             </w:rPr>
           </w:pPr>
-          <w:hyperlink w:anchor="_Toc229639268" w:history="1">
+          <w:hyperlink w:anchor="_Toc229984878" w:history="1">
             <w:r>
               <w:rPr>
                 <w:rStyle w:val="Hipervnculo"/>
@@ -3375,7 +3374,7 @@
                 <w:noProof/>
                 <w:webHidden/>
               </w:rPr>
-              <w:instrText xml:space="preserve"> PAGEREF _Toc229639268 \h </w:instrText>
+              <w:instrText xml:space="preserve"> PAGEREF _Toc229984878 \h </w:instrText>
             </w:r>
             <w:r>
               <w:rPr>
@@ -3419,7 +3418,7 @@
               <w:lang w:eastAsia="ko-KR"/>
             </w:rPr>
           </w:pPr>
-          <w:hyperlink w:anchor="_Toc229639269" w:history="1">
+          <w:hyperlink w:anchor="_Toc229984879" w:history="1">
             <w:r>
               <w:rPr>
                 <w:rStyle w:val="Hipervnculo"/>
@@ -3446,7 +3445,7 @@
                 <w:noProof/>
                 <w:webHidden/>
               </w:rPr>
-              <w:instrText xml:space="preserve"> PAGEREF _Toc229639269 \h </w:instrText>
+              <w:instrText xml:space="preserve"> PAGEREF _Toc229984879 \h </w:instrText>
             </w:r>
             <w:r>
               <w:rPr>
@@ -3487,7 +3486,7 @@
               <w:lang w:eastAsia="ko-KR"/>
             </w:rPr>
           </w:pPr>
-          <w:hyperlink w:anchor="_Toc229639270" w:history="1">
+          <w:hyperlink w:anchor="_Toc229984880" w:history="1">
             <w:r>
               <w:rPr>
                 <w:rStyle w:val="Hipervnculo"/>
@@ -3515,7 +3514,7 @@
                 <w:noProof/>
                 <w:webHidden/>
               </w:rPr>
-              <w:instrText xml:space="preserve"> PAGEREF _Toc229639270 \h </w:instrText>
+              <w:instrText xml:space="preserve"> PAGEREF _Toc229984880 \h </w:instrText>
             </w:r>
             <w:r>
               <w:rPr>
@@ -3559,7 +3558,7 @@
               <w:lang w:eastAsia="ko-KR"/>
             </w:rPr>
           </w:pPr>
-          <w:hyperlink w:anchor="_Toc229639271" w:history="1">
+          <w:hyperlink w:anchor="_Toc229984881" w:history="1">
             <w:r>
               <w:rPr>
                 <w:rStyle w:val="Hipervnculo"/>
@@ -3586,7 +3585,7 @@
                 <w:noProof/>
                 <w:webHidden/>
               </w:rPr>
-              <w:instrText xml:space="preserve"> PAGEREF _Toc229639271 \h </w:instrText>
+              <w:instrText xml:space="preserve"> PAGEREF _Toc229984881 \h </w:instrText>
             </w:r>
             <w:r>
               <w:rPr>
@@ -3630,7 +3629,7 @@
               <w:lang w:eastAsia="ko-KR"/>
             </w:rPr>
           </w:pPr>
-          <w:hyperlink w:anchor="_Toc229639272" w:history="1">
+          <w:hyperlink w:anchor="_Toc229984882" w:history="1">
             <w:r>
               <w:rPr>
                 <w:rStyle w:val="Hipervnculo"/>
@@ -3657,7 +3656,7 @@
                 <w:noProof/>
                 <w:webHidden/>
               </w:rPr>
-              <w:instrText xml:space="preserve"> PAGEREF _Toc229639272 \h </w:instrText>
+              <w:instrText xml:space="preserve"> PAGEREF _Toc229984882 \h </w:instrText>
             </w:r>
             <w:r>
               <w:rPr>
@@ -3701,7 +3700,7 @@
               <w:lang w:eastAsia="ko-KR"/>
             </w:rPr>
           </w:pPr>
-          <w:hyperlink w:anchor="_Toc229639273" w:history="1">
+          <w:hyperlink w:anchor="_Toc229984883" w:history="1">
             <w:r>
               <w:rPr>
                 <w:rStyle w:val="Hipervnculo"/>
@@ -3728,7 +3727,7 @@
                 <w:noProof/>
                 <w:webHidden/>
               </w:rPr>
-              <w:instrText xml:space="preserve"> PAGEREF _Toc229639273 \h </w:instrText>
+              <w:instrText xml:space="preserve"> PAGEREF _Toc229984883 \h </w:instrText>
             </w:r>
             <w:r>
               <w:rPr>
@@ -3769,7 +3768,7 @@
               <w:lang w:eastAsia="ko-KR"/>
             </w:rPr>
           </w:pPr>
-          <w:hyperlink w:anchor="_Toc229639274" w:history="1">
+          <w:hyperlink w:anchor="_Toc229984884" w:history="1">
             <w:r>
               <w:rPr>
                 <w:rStyle w:val="Hipervnculo"/>
@@ -3797,7 +3796,7 @@
                 <w:noProof/>
                 <w:webHidden/>
               </w:rPr>
-              <w:instrText xml:space="preserve"> PAGEREF _Toc229639274 \h </w:instrText>
+              <w:instrText xml:space="preserve"> PAGEREF _Toc229984884 \h </w:instrText>
             </w:r>
             <w:r>
               <w:rPr>
@@ -3841,7 +3840,7 @@
               <w:lang w:eastAsia="ko-KR"/>
             </w:rPr>
           </w:pPr>
-          <w:hyperlink w:anchor="_Toc229639275" w:history="1">
+          <w:hyperlink w:anchor="_Toc229984885" w:history="1">
             <w:r>
               <w:rPr>
                 <w:rStyle w:val="Hipervnculo"/>
@@ -3868,7 +3867,7 @@
                 <w:noProof/>
                 <w:webHidden/>
               </w:rPr>
-              <w:instrText xml:space="preserve"> PAGEREF _Toc229639275 \h </w:instrText>
+              <w:instrText xml:space="preserve"> PAGEREF _Toc229984885 \h </w:instrText>
             </w:r>
             <w:r>
               <w:rPr>
@@ -3912,7 +3911,7 @@
               <w:lang w:eastAsia="ko-KR"/>
             </w:rPr>
           </w:pPr>
-          <w:hyperlink w:anchor="_Toc229639276" w:history="1">
+          <w:hyperlink w:anchor="_Toc229984886" w:history="1">
             <w:r>
               <w:rPr>
                 <w:rStyle w:val="Hipervnculo"/>
@@ -3939,7 +3938,7 @@
                 <w:noProof/>
                 <w:webHidden/>
               </w:rPr>
-              <w:instrText xml:space="preserve"> PAGEREF _Toc229639276 \h </w:instrText>
+              <w:instrText xml:space="preserve"> PAGEREF _Toc229984886 \h </w:instrText>
             </w:r>
             <w:r>
               <w:rPr>
@@ -3983,7 +3982,7 @@
               <w:lang w:eastAsia="ko-KR"/>
             </w:rPr>
           </w:pPr>
-          <w:hyperlink w:anchor="_Toc229639277" w:history="1">
+          <w:hyperlink w:anchor="_Toc229984887" w:history="1">
             <w:r>
               <w:rPr>
                 <w:rStyle w:val="Hipervnculo"/>
@@ -4010,7 +4009,7 @@
                 <w:noProof/>
                 <w:webHidden/>
               </w:rPr>
-              <w:instrText xml:space="preserve"> PAGEREF _Toc229639277 \h </w:instrText>
+              <w:instrText xml:space="preserve"> PAGEREF _Toc229984887 \h </w:instrText>
             </w:r>
             <w:r>
               <w:rPr>
@@ -4054,12 +4053,365 @@
               <w:lang w:eastAsia="ko-KR"/>
             </w:rPr>
           </w:pPr>
-          <w:hyperlink w:anchor="_Toc229639278" w:history="1">
+          <w:hyperlink w:anchor="_Toc229984888" w:history="1">
             <w:r>
               <w:rPr>
                 <w:rStyle w:val="Hipervnculo"/>
                 <w:noProof/>
               </w:rPr>
+              <w:t>Semana del 18 de mayo al 22 de mayo</w:t>
+            </w:r>
+            <w:r>
+              <w:rPr>
+                <w:noProof/>
+                <w:webHidden/>
+              </w:rPr>
+              <w:tab/>
+            </w:r>
+            <w:r>
+              <w:rPr>
+                <w:noProof/>
+                <w:webHidden/>
+              </w:rPr>
+              <w:fldChar w:fldCharType="begin"/>
+            </w:r>
+            <w:r>
+              <w:rPr>
+                <w:noProof/>
+                <w:webHidden/>
+              </w:rPr>
+              <w:instrText xml:space="preserve"> PAGEREF _Toc229984888 \h </w:instrText>
+            </w:r>
+            <w:r>
+              <w:rPr>
+                <w:noProof/>
+                <w:webHidden/>
+              </w:rPr>
+            </w:r>
+            <w:r>
+              <w:rPr>
+                <w:noProof/>
+                <w:webHidden/>
+              </w:rPr>
+              <w:fldChar w:fldCharType="separate"/>
+            </w:r>
+            <w:r>
+              <w:rPr>
+                <w:noProof/>
+                <w:webHidden/>
+              </w:rPr>
+              <w:t>21</w:t>
+            </w:r>
+            <w:r>
+              <w:rPr>
+                <w:noProof/>
+                <w:webHidden/>
+              </w:rPr>
+              <w:fldChar w:fldCharType="end"/>
+            </w:r>
+          </w:hyperlink>
+        </w:p>
+        <w:p>
+          <w:pPr>
+            <w:pStyle w:val="TDC2"/>
+            <w:rPr>
+              <w:noProof/>
+              <w:sz w:val="24"/>
+              <w:szCs w:val="24"/>
+              <w:lang w:eastAsia="ko-KR"/>
+            </w:rPr>
+          </w:pPr>
+          <w:hyperlink w:anchor="_Toc229984889" w:history="1">
+            <w:r>
+              <w:rPr>
+                <w:rStyle w:val="Hipervnculo"/>
+                <w:rFonts w:ascii="Aptos" w:hAnsi="Aptos"/>
+                <w:noProof/>
+              </w:rPr>
+              <w:t>Día 1: Realizar Puntos de Función</w:t>
+            </w:r>
+            <w:r>
+              <w:rPr>
+                <w:noProof/>
+                <w:webHidden/>
+              </w:rPr>
+              <w:tab/>
+            </w:r>
+            <w:r>
+              <w:rPr>
+                <w:noProof/>
+                <w:webHidden/>
+              </w:rPr>
+              <w:fldChar w:fldCharType="begin"/>
+            </w:r>
+            <w:r>
+              <w:rPr>
+                <w:noProof/>
+                <w:webHidden/>
+              </w:rPr>
+              <w:instrText xml:space="preserve"> PAGEREF _Toc229984889 \h </w:instrText>
+            </w:r>
+            <w:r>
+              <w:rPr>
+                <w:noProof/>
+                <w:webHidden/>
+              </w:rPr>
+            </w:r>
+            <w:r>
+              <w:rPr>
+                <w:noProof/>
+                <w:webHidden/>
+              </w:rPr>
+              <w:fldChar w:fldCharType="separate"/>
+            </w:r>
+            <w:r>
+              <w:rPr>
+                <w:noProof/>
+                <w:webHidden/>
+              </w:rPr>
+              <w:t>21</w:t>
+            </w:r>
+            <w:r>
+              <w:rPr>
+                <w:noProof/>
+                <w:webHidden/>
+              </w:rPr>
+              <w:fldChar w:fldCharType="end"/>
+            </w:r>
+          </w:hyperlink>
+        </w:p>
+        <w:p>
+          <w:pPr>
+            <w:pStyle w:val="TDC3"/>
+            <w:tabs>
+              <w:tab w:val="right" w:leader="dot" w:pos="9350"/>
+            </w:tabs>
+            <w:rPr>
+              <w:noProof/>
+              <w:sz w:val="24"/>
+              <w:szCs w:val="24"/>
+              <w:lang w:eastAsia="ko-KR"/>
+            </w:rPr>
+          </w:pPr>
+          <w:hyperlink w:anchor="_Toc229984890" w:history="1">
+            <w:r>
+              <w:rPr>
+                <w:rStyle w:val="Hipervnculo"/>
+                <w:noProof/>
+              </w:rPr>
+              <w:t>Asistencia y Participación</w:t>
+            </w:r>
+            <w:r>
+              <w:rPr>
+                <w:noProof/>
+                <w:webHidden/>
+              </w:rPr>
+              <w:tab/>
+            </w:r>
+            <w:r>
+              <w:rPr>
+                <w:noProof/>
+                <w:webHidden/>
+              </w:rPr>
+              <w:fldChar w:fldCharType="begin"/>
+            </w:r>
+            <w:r>
+              <w:rPr>
+                <w:noProof/>
+                <w:webHidden/>
+              </w:rPr>
+              <w:instrText xml:space="preserve"> PAGEREF _Toc229984890 \h </w:instrText>
+            </w:r>
+            <w:r>
+              <w:rPr>
+                <w:noProof/>
+                <w:webHidden/>
+              </w:rPr>
+            </w:r>
+            <w:r>
+              <w:rPr>
+                <w:noProof/>
+                <w:webHidden/>
+              </w:rPr>
+              <w:fldChar w:fldCharType="separate"/>
+            </w:r>
+            <w:r>
+              <w:rPr>
+                <w:noProof/>
+                <w:webHidden/>
+              </w:rPr>
+              <w:t>21</w:t>
+            </w:r>
+            <w:r>
+              <w:rPr>
+                <w:noProof/>
+                <w:webHidden/>
+              </w:rPr>
+              <w:fldChar w:fldCharType="end"/>
+            </w:r>
+          </w:hyperlink>
+        </w:p>
+        <w:p>
+          <w:pPr>
+            <w:pStyle w:val="TDC3"/>
+            <w:tabs>
+              <w:tab w:val="right" w:leader="dot" w:pos="9350"/>
+            </w:tabs>
+            <w:rPr>
+              <w:noProof/>
+              <w:sz w:val="24"/>
+              <w:szCs w:val="24"/>
+              <w:lang w:eastAsia="ko-KR"/>
+            </w:rPr>
+          </w:pPr>
+          <w:hyperlink w:anchor="_Toc229984891" w:history="1">
+            <w:r>
+              <w:rPr>
+                <w:rStyle w:val="Hipervnculo"/>
+                <w:noProof/>
+              </w:rPr>
+              <w:t>Actividades Ejecutadas</w:t>
+            </w:r>
+            <w:r>
+              <w:rPr>
+                <w:noProof/>
+                <w:webHidden/>
+              </w:rPr>
+              <w:tab/>
+            </w:r>
+            <w:r>
+              <w:rPr>
+                <w:noProof/>
+                <w:webHidden/>
+              </w:rPr>
+              <w:fldChar w:fldCharType="begin"/>
+            </w:r>
+            <w:r>
+              <w:rPr>
+                <w:noProof/>
+                <w:webHidden/>
+              </w:rPr>
+              <w:instrText xml:space="preserve"> PAGEREF _Toc229984891 \h </w:instrText>
+            </w:r>
+            <w:r>
+              <w:rPr>
+                <w:noProof/>
+                <w:webHidden/>
+              </w:rPr>
+            </w:r>
+            <w:r>
+              <w:rPr>
+                <w:noProof/>
+                <w:webHidden/>
+              </w:rPr>
+              <w:fldChar w:fldCharType="separate"/>
+            </w:r>
+            <w:r>
+              <w:rPr>
+                <w:noProof/>
+                <w:webHidden/>
+              </w:rPr>
+              <w:t>21</w:t>
+            </w:r>
+            <w:r>
+              <w:rPr>
+                <w:noProof/>
+                <w:webHidden/>
+              </w:rPr>
+              <w:fldChar w:fldCharType="end"/>
+            </w:r>
+          </w:hyperlink>
+        </w:p>
+        <w:p>
+          <w:pPr>
+            <w:pStyle w:val="TDC3"/>
+            <w:tabs>
+              <w:tab w:val="right" w:leader="dot" w:pos="9350"/>
+            </w:tabs>
+            <w:rPr>
+              <w:noProof/>
+              <w:sz w:val="24"/>
+              <w:szCs w:val="24"/>
+              <w:lang w:eastAsia="ko-KR"/>
+            </w:rPr>
+          </w:pPr>
+          <w:hyperlink w:anchor="_Toc229984892" w:history="1">
+            <w:r>
+              <w:rPr>
+                <w:rStyle w:val="Hipervnculo"/>
+                <w:noProof/>
+              </w:rPr>
+              <w:t>Gestión de Riesgos e Incidencias</w:t>
+            </w:r>
+            <w:r>
+              <w:rPr>
+                <w:noProof/>
+                <w:webHidden/>
+              </w:rPr>
+              <w:tab/>
+            </w:r>
+            <w:r>
+              <w:rPr>
+                <w:noProof/>
+                <w:webHidden/>
+              </w:rPr>
+              <w:fldChar w:fldCharType="begin"/>
+            </w:r>
+            <w:r>
+              <w:rPr>
+                <w:noProof/>
+                <w:webHidden/>
+              </w:rPr>
+              <w:instrText xml:space="preserve"> PAGEREF _Toc229984892 \h </w:instrText>
+            </w:r>
+            <w:r>
+              <w:rPr>
+                <w:noProof/>
+                <w:webHidden/>
+              </w:rPr>
+            </w:r>
+            <w:r>
+              <w:rPr>
+                <w:noProof/>
+                <w:webHidden/>
+              </w:rPr>
+              <w:fldChar w:fldCharType="separate"/>
+            </w:r>
+            <w:r>
+              <w:rPr>
+                <w:noProof/>
+                <w:webHidden/>
+              </w:rPr>
+              <w:t>22</w:t>
+            </w:r>
+            <w:r>
+              <w:rPr>
+                <w:noProof/>
+                <w:webHidden/>
+              </w:rPr>
+              <w:fldChar w:fldCharType="end"/>
+            </w:r>
+          </w:hyperlink>
+        </w:p>
+        <w:p>
+          <w:pPr>
+            <w:pStyle w:val="TDC1"/>
+            <w:tabs>
+              <w:tab w:val="right" w:leader="dot" w:pos="9350"/>
+            </w:tabs>
+            <w:rPr>
+              <w:noProof/>
+              <w:sz w:val="24"/>
+              <w:szCs w:val="24"/>
+              <w:lang w:eastAsia="ko-KR"/>
+            </w:rPr>
+          </w:pPr>
+          <w:hyperlink w:anchor="_Toc229984893" w:history="1">
+            <w:r>
+              <w:rPr>
+                <w:rStyle w:val="Hipervnculo"/>
+                <w:noProof/>
+              </w:rPr>
               <w:t>Referencias</w:t>
             </w:r>
             <w:r>
@@ -4081,7 +4433,7 @@
                 <w:noProof/>
                 <w:webHidden/>
               </w:rPr>
-              <w:instrText xml:space="preserve"> PAGEREF _Toc229639278 \h </w:instrText>
+              <w:instrText xml:space="preserve"> PAGEREF _Toc229984893 \h </w:instrText>
             </w:r>
             <w:r>
               <w:rPr>
@@ -4101,7 +4453,7 @@
                 <w:noProof/>
                 <w:webHidden/>
               </w:rPr>
-              <w:t>22</w:t>
+              <w:t>23</w:t>
             </w:r>
             <w:r>
               <w:rPr>
@@ -4172,7 +4524,7 @@
         <w:jc w:val="both"/>
         <w:outlineLvl w:val="0"/>
       </w:pPr>
-      <w:bookmarkStart w:id="0" w:name="_Toc229639232"/>
+      <w:bookmarkStart w:id="0" w:name="_Toc229984842"/>
       <w:r>
         <w:lastRenderedPageBreak/>
         <w:t xml:space="preserve">Semana </w:t>
@@ -4231,7 +4583,7 @@
                 <w:szCs w:val="28"/>
               </w:rPr>
             </w:pPr>
-            <w:bookmarkStart w:id="1" w:name="_Toc229639233"/>
+            <w:bookmarkStart w:id="1" w:name="_Toc229984843"/>
             <w:r>
               <w:rPr>
                 <w:rFonts w:ascii="Aptos" w:hAnsi="Aptos"/>
@@ -4572,7 +4924,7 @@
           <w:szCs w:val="72"/>
         </w:rPr>
       </w:pPr>
-      <w:bookmarkStart w:id="2" w:name="_Toc229639234"/>
+      <w:bookmarkStart w:id="2" w:name="_Toc229984844"/>
       <w:r>
         <w:rPr>
           <w:sz w:val="32"/>
@@ -5386,7 +5738,7 @@
           <w:szCs w:val="72"/>
         </w:rPr>
       </w:pPr>
-      <w:bookmarkStart w:id="3" w:name="_Toc229639235"/>
+      <w:bookmarkStart w:id="3" w:name="_Toc229984845"/>
       <w:r>
         <w:rPr>
           <w:sz w:val="32"/>
@@ -6263,7 +6615,7 @@
           <w:szCs w:val="72"/>
         </w:rPr>
       </w:pPr>
-      <w:bookmarkStart w:id="4" w:name="_Toc229639236"/>
+      <w:bookmarkStart w:id="4" w:name="_Toc229984846"/>
       <w:r>
         <w:rPr>
           <w:sz w:val="32"/>
@@ -6552,7 +6904,7 @@
                 <w:szCs w:val="28"/>
               </w:rPr>
             </w:pPr>
-            <w:bookmarkStart w:id="5" w:name="_Toc229639237"/>
+            <w:bookmarkStart w:id="5" w:name="_Toc229984847"/>
             <w:r>
               <w:rPr>
                 <w:rFonts w:ascii="Aptos" w:hAnsi="Aptos"/>
@@ -6891,7 +7243,7 @@
           <w:szCs w:val="72"/>
         </w:rPr>
       </w:pPr>
-      <w:bookmarkStart w:id="6" w:name="_Toc229639238"/>
+      <w:bookmarkStart w:id="6" w:name="_Toc229984848"/>
       <w:r>
         <w:rPr>
           <w:sz w:val="32"/>
@@ -7691,7 +8043,7 @@
           <w:szCs w:val="72"/>
         </w:rPr>
       </w:pPr>
-      <w:bookmarkStart w:id="7" w:name="_Toc229639239"/>
+      <w:bookmarkStart w:id="7" w:name="_Toc229984849"/>
       <w:r>
         <w:rPr>
           <w:sz w:val="32"/>
@@ -8446,7 +8798,7 @@
           <w:szCs w:val="72"/>
         </w:rPr>
       </w:pPr>
-      <w:bookmarkStart w:id="8" w:name="_Toc229639240"/>
+      <w:bookmarkStart w:id="8" w:name="_Toc229984850"/>
       <w:r>
         <w:rPr>
           <w:sz w:val="32"/>
@@ -8733,7 +9085,7 @@
                 <w:color w:val="FFFFFF" w:themeColor="background1"/>
               </w:rPr>
             </w:pPr>
-            <w:bookmarkStart w:id="9" w:name="_Toc229639241"/>
+            <w:bookmarkStart w:id="9" w:name="_Toc229984851"/>
             <w:r>
               <w:rPr>
                 <w:rFonts w:ascii="Aptos" w:hAnsi="Aptos"/>
@@ -9080,7 +9432,7 @@
           <w:szCs w:val="72"/>
         </w:rPr>
       </w:pPr>
-      <w:bookmarkStart w:id="10" w:name="_Toc229639242"/>
+      <w:bookmarkStart w:id="10" w:name="_Toc229984852"/>
       <w:r>
         <w:rPr>
           <w:sz w:val="32"/>
@@ -9710,7 +10062,7 @@
           <w:szCs w:val="72"/>
         </w:rPr>
       </w:pPr>
-      <w:bookmarkStart w:id="11" w:name="_Toc229639243"/>
+      <w:bookmarkStart w:id="11" w:name="_Toc229984853"/>
       <w:r>
         <w:rPr>
           <w:sz w:val="32"/>
@@ -10089,7 +10441,7 @@
         <w:jc w:val="both"/>
         <w:outlineLvl w:val="0"/>
       </w:pPr>
-      <w:bookmarkStart w:id="12" w:name="_Toc229639244"/>
+      <w:bookmarkStart w:id="12" w:name="_Toc229984854"/>
       <w:r>
         <w:lastRenderedPageBreak/>
         <w:t xml:space="preserve">Semana </w:t>
@@ -10154,7 +10506,7 @@
                 <w:szCs w:val="28"/>
               </w:rPr>
             </w:pPr>
-            <w:bookmarkStart w:id="13" w:name="_Toc229639245"/>
+            <w:bookmarkStart w:id="13" w:name="_Toc229984855"/>
             <w:r>
               <w:rPr>
                 <w:rFonts w:ascii="Aptos" w:hAnsi="Aptos"/>
@@ -10492,7 +10844,7 @@
           <w:szCs w:val="72"/>
         </w:rPr>
       </w:pPr>
-      <w:bookmarkStart w:id="14" w:name="_Toc229639246"/>
+      <w:bookmarkStart w:id="14" w:name="_Toc229984856"/>
       <w:r>
         <w:rPr>
           <w:sz w:val="32"/>
@@ -11296,7 +11648,7 @@
           <w:szCs w:val="72"/>
         </w:rPr>
       </w:pPr>
-      <w:bookmarkStart w:id="15" w:name="_Toc229639247"/>
+      <w:bookmarkStart w:id="15" w:name="_Toc229984857"/>
       <w:r>
         <w:rPr>
           <w:sz w:val="32"/>
@@ -12244,7 +12596,7 @@
           <w:szCs w:val="72"/>
         </w:rPr>
       </w:pPr>
-      <w:bookmarkStart w:id="16" w:name="_Toc229639248"/>
+      <w:bookmarkStart w:id="16" w:name="_Toc229984858"/>
       <w:r>
         <w:rPr>
           <w:sz w:val="32"/>
@@ -12520,7 +12872,7 @@
                 <w:szCs w:val="28"/>
               </w:rPr>
             </w:pPr>
-            <w:bookmarkStart w:id="17" w:name="_Toc229639249"/>
+            <w:bookmarkStart w:id="17" w:name="_Toc229984859"/>
             <w:r>
               <w:rPr>
                 <w:rFonts w:ascii="Aptos" w:hAnsi="Aptos"/>
@@ -12859,7 +13211,7 @@
           <w:szCs w:val="72"/>
         </w:rPr>
       </w:pPr>
-      <w:bookmarkStart w:id="18" w:name="_Toc229639250"/>
+      <w:bookmarkStart w:id="18" w:name="_Toc229984860"/>
       <w:r>
         <w:rPr>
           <w:sz w:val="32"/>
@@ -13585,7 +13937,7 @@
           <w:szCs w:val="72"/>
         </w:rPr>
       </w:pPr>
-      <w:bookmarkStart w:id="19" w:name="_Toc229639251"/>
+      <w:bookmarkStart w:id="19" w:name="_Toc229984861"/>
       <w:r>
         <w:rPr>
           <w:sz w:val="32"/>
@@ -14318,7 +14670,7 @@
         <w:jc w:val="both"/>
         <w:outlineLvl w:val="0"/>
       </w:pPr>
-      <w:bookmarkStart w:id="20" w:name="_Toc229639252"/>
+      <w:bookmarkStart w:id="20" w:name="_Toc229984862"/>
       <w:r>
         <w:lastRenderedPageBreak/>
         <w:t xml:space="preserve">Semana </w:t>
@@ -14404,7 +14756,7 @@
                 <w:szCs w:val="28"/>
               </w:rPr>
             </w:pPr>
-            <w:bookmarkStart w:id="21" w:name="_Toc229639253"/>
+            <w:bookmarkStart w:id="21" w:name="_Toc229984863"/>
             <w:r>
               <w:rPr>
                 <w:rFonts w:ascii="Aptos" w:hAnsi="Aptos"/>
@@ -14794,7 +15146,7 @@
           <w:szCs w:val="72"/>
         </w:rPr>
       </w:pPr>
-      <w:bookmarkStart w:id="22" w:name="_Toc229639254"/>
+      <w:bookmarkStart w:id="22" w:name="_Toc229984864"/>
       <w:r>
         <w:rPr>
           <w:sz w:val="32"/>
@@ -15906,7 +16258,7 @@
           <w:szCs w:val="72"/>
         </w:rPr>
       </w:pPr>
-      <w:bookmarkStart w:id="23" w:name="_Toc229639255"/>
+      <w:bookmarkStart w:id="23" w:name="_Toc229984865"/>
       <w:r>
         <w:rPr>
           <w:sz w:val="32"/>
@@ -17164,7 +17516,7 @@
           <w:szCs w:val="72"/>
         </w:rPr>
       </w:pPr>
-      <w:bookmarkStart w:id="24" w:name="_Toc229639256"/>
+      <w:bookmarkStart w:id="24" w:name="_Toc229984866"/>
       <w:r>
         <w:rPr>
           <w:sz w:val="32"/>
@@ -17426,7 +17778,7 @@
         <w:jc w:val="both"/>
         <w:outlineLvl w:val="0"/>
       </w:pPr>
-      <w:bookmarkStart w:id="25" w:name="_Toc229639257"/>
+      <w:bookmarkStart w:id="25" w:name="_Toc229984867"/>
       <w:r>
         <w:lastRenderedPageBreak/>
         <w:t xml:space="preserve">Semana </w:t>
@@ -17503,7 +17855,7 @@
                 <w:szCs w:val="28"/>
               </w:rPr>
             </w:pPr>
-            <w:bookmarkStart w:id="26" w:name="_Toc229639258"/>
+            <w:bookmarkStart w:id="26" w:name="_Toc229984868"/>
             <w:r>
               <w:rPr>
                 <w:rFonts w:ascii="Aptos" w:hAnsi="Aptos"/>
@@ -17902,7 +18254,7 @@
           <w:szCs w:val="72"/>
         </w:rPr>
       </w:pPr>
-      <w:bookmarkStart w:id="27" w:name="_Toc229639259"/>
+      <w:bookmarkStart w:id="27" w:name="_Toc229984869"/>
       <w:r>
         <w:rPr>
           <w:sz w:val="32"/>
@@ -18839,7 +19191,7 @@
           <w:szCs w:val="72"/>
         </w:rPr>
       </w:pPr>
-      <w:bookmarkStart w:id="28" w:name="_Toc229639260"/>
+      <w:bookmarkStart w:id="28" w:name="_Toc229984870"/>
       <w:r>
         <w:rPr>
           <w:sz w:val="32"/>
@@ -19726,7 +20078,7 @@
                 <w:szCs w:val="28"/>
               </w:rPr>
             </w:pPr>
-            <w:bookmarkStart w:id="29" w:name="_Toc229639261"/>
+            <w:bookmarkStart w:id="29" w:name="_Toc229984871"/>
             <w:r>
               <w:rPr>
                 <w:rFonts w:ascii="Aptos" w:hAnsi="Aptos"/>
@@ -20122,7 +20474,7 @@
           <w:szCs w:val="72"/>
         </w:rPr>
       </w:pPr>
-      <w:bookmarkStart w:id="30" w:name="_Toc229639262"/>
+      <w:bookmarkStart w:id="30" w:name="_Toc229984872"/>
       <w:r>
         <w:rPr>
           <w:sz w:val="32"/>
@@ -20870,7 +21222,7 @@
           <w:szCs w:val="72"/>
         </w:rPr>
       </w:pPr>
-      <w:bookmarkStart w:id="31" w:name="_Toc229639263"/>
+      <w:bookmarkStart w:id="31" w:name="_Toc229984873"/>
       <w:r>
         <w:rPr>
           <w:sz w:val="32"/>
@@ -21711,7 +22063,7 @@
           <w:szCs w:val="72"/>
         </w:rPr>
       </w:pPr>
-      <w:bookmarkStart w:id="32" w:name="_Toc229639264"/>
+      <w:bookmarkStart w:id="32" w:name="_Toc229984874"/>
       <w:r>
         <w:rPr>
           <w:sz w:val="32"/>
@@ -22150,7 +22502,7 @@
         <w:jc w:val="both"/>
         <w:outlineLvl w:val="0"/>
       </w:pPr>
-      <w:bookmarkStart w:id="33" w:name="_Toc229639265"/>
+      <w:bookmarkStart w:id="33" w:name="_Toc229984875"/>
       <w:r>
         <w:lastRenderedPageBreak/>
         <w:t xml:space="preserve">Semana del </w:t>
@@ -22233,7 +22585,7 @@
                 <w:szCs w:val="28"/>
               </w:rPr>
             </w:pPr>
-            <w:bookmarkStart w:id="34" w:name="_Toc229639266"/>
+            <w:bookmarkStart w:id="34" w:name="_Toc229984876"/>
             <w:r>
               <w:rPr>
                 <w:rFonts w:ascii="Aptos" w:hAnsi="Aptos"/>
@@ -22614,7 +22966,7 @@
           <w:szCs w:val="72"/>
         </w:rPr>
       </w:pPr>
-      <w:bookmarkStart w:id="35" w:name="_Toc229639267"/>
+      <w:bookmarkStart w:id="35" w:name="_Toc229984877"/>
       <w:r>
         <w:rPr>
           <w:sz w:val="32"/>
@@ -23388,7 +23740,7 @@
           <w:szCs w:val="72"/>
         </w:rPr>
       </w:pPr>
-      <w:bookmarkStart w:id="36" w:name="_Toc229639268"/>
+      <w:bookmarkStart w:id="36" w:name="_Toc229984878"/>
       <w:r>
         <w:rPr>
           <w:sz w:val="32"/>
@@ -24247,7 +24599,7 @@
         <w:pStyle w:val="titulo1"/>
         <w:outlineLvl w:val="2"/>
       </w:pPr>
-      <w:bookmarkStart w:id="37" w:name="_Toc229639269"/>
+      <w:bookmarkStart w:id="37" w:name="_Toc229984879"/>
       <w:r>
         <w:rPr>
           <w:sz w:val="32"/>
@@ -24481,7 +24833,7 @@
             <w:pPr>
               <w:pStyle w:val="Ttulo2"/>
             </w:pPr>
-            <w:bookmarkStart w:id="38" w:name="_Toc229639270"/>
+            <w:bookmarkStart w:id="38" w:name="_Toc229984880"/>
             <w:r>
               <w:rPr>
                 <w:rFonts w:ascii="Aptos" w:hAnsi="Aptos"/>
@@ -24812,7 +25164,7 @@
           <w:szCs w:val="32"/>
         </w:rPr>
       </w:pPr>
-      <w:bookmarkStart w:id="39" w:name="_Toc229639271"/>
+      <w:bookmarkStart w:id="39" w:name="_Toc229984881"/>
       <w:r>
         <w:rPr>
           <w:sz w:val="32"/>
@@ -25430,7 +25782,7 @@
           <w:szCs w:val="32"/>
         </w:rPr>
       </w:pPr>
-      <w:bookmarkStart w:id="40" w:name="_Toc229639272"/>
+      <w:bookmarkStart w:id="40" w:name="_Toc229984882"/>
       <w:r>
         <w:rPr>
           <w:sz w:val="32"/>
@@ -25996,7 +26348,7 @@
         <w:pStyle w:val="titulo1"/>
         <w:outlineLvl w:val="2"/>
       </w:pPr>
-      <w:bookmarkStart w:id="41" w:name="_Toc229639273"/>
+      <w:bookmarkStart w:id="41" w:name="_Toc229984883"/>
       <w:r>
         <w:rPr>
           <w:sz w:val="32"/>
@@ -26225,7 +26577,7 @@
             <w:pPr>
               <w:pStyle w:val="Ttulo2"/>
             </w:pPr>
-            <w:bookmarkStart w:id="42" w:name="_Toc229639274"/>
+            <w:bookmarkStart w:id="42" w:name="_Toc229984884"/>
             <w:r>
               <w:rPr>
                 <w:rFonts w:ascii="Aptos" w:hAnsi="Aptos"/>
@@ -26573,7 +26925,7 @@
           <w:szCs w:val="32"/>
         </w:rPr>
       </w:pPr>
-      <w:bookmarkStart w:id="43" w:name="_Toc229639275"/>
+      <w:bookmarkStart w:id="43" w:name="_Toc229984885"/>
       <w:r>
         <w:rPr>
           <w:sz w:val="32"/>
@@ -27362,7 +27714,7 @@
           <w:szCs w:val="32"/>
         </w:rPr>
       </w:pPr>
-      <w:bookmarkStart w:id="44" w:name="_Toc229639276"/>
+      <w:bookmarkStart w:id="44" w:name="_Toc229984886"/>
       <w:r>
         <w:rPr>
           <w:sz w:val="32"/>
@@ -28092,7 +28444,7 @@
         <w:pStyle w:val="titulo1"/>
         <w:outlineLvl w:val="2"/>
       </w:pPr>
-      <w:bookmarkStart w:id="45" w:name="_Toc229639277"/>
+      <w:bookmarkStart w:id="45" w:name="_Toc229984887"/>
       <w:r>
         <w:rPr>
           <w:sz w:val="32"/>
@@ -28129,7 +28481,7 @@
         </w:trPr>
         <w:tc>
           <w:tcPr>
-            <w:tcW w:w="2942" w:type="dxa"/>
+            <w:tcW w:w="2834" w:type="dxa"/>
             <w:shd w:val="clear" w:color="auto" w:fill="262626" w:themeFill="text1" w:themeFillTint="D9"/>
             <w:vAlign w:val="center"/>
           </w:tcPr>
@@ -28158,7 +28510,7 @@
         </w:tc>
         <w:tc>
           <w:tcPr>
-            <w:tcW w:w="2943" w:type="dxa"/>
+            <w:tcW w:w="2924" w:type="dxa"/>
             <w:shd w:val="clear" w:color="auto" w:fill="262626" w:themeFill="text1" w:themeFillTint="D9"/>
             <w:vAlign w:val="center"/>
           </w:tcPr>
@@ -28187,7 +28539,7 @@
         </w:tc>
         <w:tc>
           <w:tcPr>
-            <w:tcW w:w="3749" w:type="dxa"/>
+            <w:tcW w:w="3592" w:type="dxa"/>
             <w:shd w:val="clear" w:color="auto" w:fill="262626" w:themeFill="text1" w:themeFillTint="D9"/>
             <w:vAlign w:val="center"/>
           </w:tcPr>
@@ -28222,7 +28574,7 @@
         </w:trPr>
         <w:tc>
           <w:tcPr>
-            <w:tcW w:w="2942" w:type="dxa"/>
+            <w:tcW w:w="2834" w:type="dxa"/>
             <w:vAlign w:val="center"/>
           </w:tcPr>
           <w:p>
@@ -28245,7 +28597,7 @@
         </w:tc>
         <w:tc>
           <w:tcPr>
-            <w:tcW w:w="2943" w:type="dxa"/>
+            <w:tcW w:w="2924" w:type="dxa"/>
             <w:vAlign w:val="center"/>
           </w:tcPr>
           <w:p>
@@ -28269,7 +28621,7 @@
         </w:tc>
         <w:tc>
           <w:tcPr>
-            <w:tcW w:w="3749" w:type="dxa"/>
+            <w:tcW w:w="3592" w:type="dxa"/>
             <w:vAlign w:val="center"/>
           </w:tcPr>
           <w:p>
@@ -28285,6 +28637,2251 @@
         </w:tc>
       </w:tr>
     </w:tbl>
+    <w:p>
+      <w:pPr>
+        <w:pStyle w:val="Ttulo0"/>
+        <w:jc w:val="both"/>
+        <w:outlineLvl w:val="0"/>
+      </w:pPr>
+      <w:bookmarkStart w:id="46" w:name="_Toc229984888"/>
+      <w:r>
+        <w:lastRenderedPageBreak/>
+        <w:t>Semana del 1</w:t>
+      </w:r>
+      <w:r>
+        <w:t>8</w:t>
+      </w:r>
+      <w:r>
+        <w:t xml:space="preserve"> de mayo al </w:t>
+      </w:r>
+      <w:r>
+        <w:t>22</w:t>
+      </w:r>
+      <w:r>
+        <w:t xml:space="preserve"> de mayo</w:t>
+      </w:r>
+      <w:bookmarkEnd w:id="46"/>
+    </w:p>
+    <w:p>
+      <w:r>
+        <w:rPr>
+          <w:b/>
+          <w:bCs/>
+        </w:rPr>
+        <w:t>Objetivo:</w:t>
+      </w:r>
+      <w:r>
+        <w:t xml:space="preserve"> </w:t>
+      </w:r>
+      <w:r>
+        <w:t>Continuar con Documentación Final: Puntos de Función y Estimación de Costos</w:t>
+      </w:r>
+      <w:r>
+        <w:t>.</w:t>
+      </w:r>
+    </w:p>
+    <w:tbl>
+      <w:tblPr>
+        <w:tblStyle w:val="Tablaconcuadrcula"/>
+        <w:tblW w:w="9634" w:type="dxa"/>
+        <w:jc w:val="center"/>
+        <w:tblBorders>
+          <w:top w:val="single" w:sz="4" w:space="0" w:color="7F7F7F" w:themeColor="text1" w:themeTint="80"/>
+          <w:left w:val="single" w:sz="4" w:space="0" w:color="7F7F7F" w:themeColor="text1" w:themeTint="80"/>
+          <w:bottom w:val="single" w:sz="4" w:space="0" w:color="7F7F7F" w:themeColor="text1" w:themeTint="80"/>
+          <w:right w:val="single" w:sz="4" w:space="0" w:color="7F7F7F" w:themeColor="text1" w:themeTint="80"/>
+          <w:insideH w:val="single" w:sz="4" w:space="0" w:color="7F7F7F" w:themeColor="text1" w:themeTint="80"/>
+        </w:tblBorders>
+        <w:tblCellMar>
+          <w:top w:w="57" w:type="dxa"/>
+          <w:bottom w:w="57" w:type="dxa"/>
+        </w:tblCellMar>
+        <w:tblLook w:val="04A0" w:firstRow="1" w:lastRow="0" w:firstColumn="1" w:lastColumn="0" w:noHBand="0" w:noVBand="1"/>
+      </w:tblPr>
+      <w:tblGrid>
+        <w:gridCol w:w="5098"/>
+        <w:gridCol w:w="4536"/>
+      </w:tblGrid>
+      <w:tr>
+        <w:trPr>
+          <w:trHeight w:val="583"/>
+          <w:jc w:val="center"/>
+        </w:trPr>
+        <w:tc>
+          <w:tcPr>
+            <w:tcW w:w="9634" w:type="dxa"/>
+            <w:gridSpan w:val="2"/>
+            <w:shd w:val="clear" w:color="auto" w:fill="262626" w:themeFill="text1" w:themeFillTint="D9"/>
+            <w:vAlign w:val="center"/>
+          </w:tcPr>
+          <w:p>
+            <w:pPr>
+              <w:pStyle w:val="Ttulo2"/>
+              <w:rPr>
+                <w:rFonts w:ascii="Aptos" w:hAnsi="Aptos"/>
+                <w:b/>
+                <w:bCs/>
+                <w:color w:val="FFFFFF" w:themeColor="background1"/>
+                <w:sz w:val="28"/>
+                <w:szCs w:val="28"/>
+              </w:rPr>
+            </w:pPr>
+            <w:bookmarkStart w:id="47" w:name="_Toc229984889"/>
+            <w:r>
+              <w:rPr>
+                <w:rFonts w:ascii="Aptos" w:hAnsi="Aptos"/>
+                <w:b/>
+                <w:bCs/>
+                <w:color w:val="FFFFFF" w:themeColor="background1"/>
+                <w:sz w:val="28"/>
+                <w:szCs w:val="28"/>
+              </w:rPr>
+              <w:t xml:space="preserve">Día 1: </w:t>
+            </w:r>
+            <w:r>
+              <w:rPr>
+                <w:rFonts w:ascii="Aptos" w:hAnsi="Aptos"/>
+                <w:b/>
+                <w:bCs/>
+                <w:color w:val="FFFFFF" w:themeColor="background1"/>
+                <w:sz w:val="28"/>
+                <w:szCs w:val="28"/>
+              </w:rPr>
+              <w:t>Realizar Puntos de Función</w:t>
+            </w:r>
+            <w:bookmarkEnd w:id="47"/>
+          </w:p>
+        </w:tc>
+      </w:tr>
+      <w:tr>
+        <w:trPr>
+          <w:jc w:val="center"/>
+        </w:trPr>
+        <w:tc>
+          <w:tcPr>
+            <w:tcW w:w="9634" w:type="dxa"/>
+            <w:gridSpan w:val="2"/>
+            <w:vAlign w:val="center"/>
+          </w:tcPr>
+          <w:p>
+            <w:pPr>
+              <w:rPr>
+                <w:rFonts w:ascii="Arial" w:hAnsi="Arial" w:cs="Arial"/>
+                <w:sz w:val="24"/>
+                <w:szCs w:val="24"/>
+              </w:rPr>
+            </w:pPr>
+            <w:r>
+              <w:rPr>
+                <w:rFonts w:ascii="Arial" w:hAnsi="Arial" w:cs="Arial"/>
+                <w:b/>
+                <w:bCs/>
+                <w:sz w:val="24"/>
+                <w:szCs w:val="24"/>
+              </w:rPr>
+              <w:t xml:space="preserve">Nombre del Proyecto: </w:t>
+            </w:r>
+            <w:r>
+              <w:rPr>
+                <w:rFonts w:ascii="Arial" w:hAnsi="Arial" w:cs="Arial"/>
+                <w:sz w:val="24"/>
+                <w:szCs w:val="24"/>
+              </w:rPr>
+              <w:t>Portafolio Digital de Arquitecto</w:t>
+            </w:r>
+          </w:p>
+        </w:tc>
+      </w:tr>
+      <w:tr>
+        <w:trPr>
+          <w:jc w:val="center"/>
+        </w:trPr>
+        <w:tc>
+          <w:tcPr>
+            <w:tcW w:w="5098" w:type="dxa"/>
+            <w:vAlign w:val="center"/>
+          </w:tcPr>
+          <w:p>
+            <w:pPr>
+              <w:rPr>
+                <w:rFonts w:ascii="Arial" w:hAnsi="Arial" w:cs="Arial"/>
+                <w:b/>
+                <w:bCs/>
+                <w:sz w:val="24"/>
+                <w:szCs w:val="24"/>
+              </w:rPr>
+            </w:pPr>
+            <w:r>
+              <w:rPr>
+                <w:rFonts w:ascii="Arial" w:hAnsi="Arial" w:cs="Arial"/>
+                <w:b/>
+                <w:bCs/>
+                <w:sz w:val="24"/>
+                <w:szCs w:val="24"/>
+              </w:rPr>
+              <w:t xml:space="preserve">Equipo No.: </w:t>
+            </w:r>
+            <w:r>
+              <w:rPr>
+                <w:rFonts w:ascii="Arial" w:hAnsi="Arial" w:cs="Arial"/>
+                <w:b/>
+                <w:bCs/>
+                <w:sz w:val="24"/>
+                <w:szCs w:val="24"/>
+              </w:rPr>
+              <w:tab/>
+            </w:r>
+            <w:r>
+              <w:rPr>
+                <w:rFonts w:ascii="Arial" w:hAnsi="Arial" w:cs="Arial"/>
+                <w:sz w:val="24"/>
+                <w:szCs w:val="24"/>
+              </w:rPr>
+              <w:t>6</w:t>
+            </w:r>
+          </w:p>
+        </w:tc>
+        <w:tc>
+          <w:tcPr>
+            <w:tcW w:w="4536" w:type="dxa"/>
+            <w:vAlign w:val="center"/>
+          </w:tcPr>
+          <w:p>
+            <w:pPr>
+              <w:rPr>
+                <w:rFonts w:ascii="Arial" w:hAnsi="Arial" w:cs="Arial"/>
+                <w:b/>
+                <w:bCs/>
+                <w:sz w:val="24"/>
+                <w:szCs w:val="24"/>
+              </w:rPr>
+            </w:pPr>
+            <w:r>
+              <w:rPr>
+                <w:rFonts w:ascii="Arial" w:hAnsi="Arial" w:cs="Arial"/>
+                <w:b/>
+                <w:bCs/>
+                <w:sz w:val="24"/>
+                <w:szCs w:val="24"/>
+              </w:rPr>
+              <w:t>Fecha:</w:t>
+            </w:r>
+            <w:r>
+              <w:rPr>
+                <w:rFonts w:ascii="Arial" w:hAnsi="Arial" w:cs="Arial"/>
+                <w:b/>
+                <w:bCs/>
+                <w:sz w:val="24"/>
+                <w:szCs w:val="24"/>
+              </w:rPr>
+              <w:t xml:space="preserve"> </w:t>
+            </w:r>
+            <w:r>
+              <w:rPr>
+                <w:rFonts w:ascii="Arial" w:hAnsi="Arial" w:cs="Arial"/>
+                <w:sz w:val="24"/>
+                <w:szCs w:val="24"/>
+              </w:rPr>
+              <w:t>1</w:t>
+            </w:r>
+            <w:r>
+              <w:rPr>
+                <w:rFonts w:ascii="Arial" w:hAnsi="Arial" w:cs="Arial"/>
+                <w:sz w:val="24"/>
+                <w:szCs w:val="24"/>
+              </w:rPr>
+              <w:t>8</w:t>
+            </w:r>
+            <w:r>
+              <w:rPr>
+                <w:rFonts w:ascii="Arial" w:hAnsi="Arial" w:cs="Arial"/>
+                <w:sz w:val="24"/>
+                <w:szCs w:val="24"/>
+              </w:rPr>
+              <w:t>/0</w:t>
+            </w:r>
+            <w:r>
+              <w:rPr>
+                <w:rFonts w:ascii="Arial" w:hAnsi="Arial" w:cs="Arial"/>
+                <w:sz w:val="24"/>
+                <w:szCs w:val="24"/>
+              </w:rPr>
+              <w:t>5</w:t>
+            </w:r>
+            <w:r>
+              <w:rPr>
+                <w:rFonts w:ascii="Arial" w:hAnsi="Arial" w:cs="Arial"/>
+                <w:sz w:val="24"/>
+                <w:szCs w:val="24"/>
+              </w:rPr>
+              <w:t>/202</w:t>
+            </w:r>
+            <w:r>
+              <w:rPr>
+                <w:rFonts w:ascii="Arial" w:hAnsi="Arial" w:cs="Arial"/>
+                <w:sz w:val="24"/>
+                <w:szCs w:val="24"/>
+              </w:rPr>
+              <w:t>6</w:t>
+            </w:r>
+          </w:p>
+        </w:tc>
+      </w:tr>
+      <w:tr>
+        <w:trPr>
+          <w:jc w:val="center"/>
+        </w:trPr>
+        <w:tc>
+          <w:tcPr>
+            <w:tcW w:w="5098" w:type="dxa"/>
+            <w:vAlign w:val="center"/>
+          </w:tcPr>
+          <w:p>
+            <w:pPr>
+              <w:rPr>
+                <w:rFonts w:ascii="Arial" w:hAnsi="Arial" w:cs="Arial"/>
+                <w:b/>
+                <w:bCs/>
+                <w:sz w:val="24"/>
+                <w:szCs w:val="24"/>
+              </w:rPr>
+            </w:pPr>
+            <w:r>
+              <w:rPr>
+                <w:rFonts w:ascii="Arial" w:hAnsi="Arial" w:cs="Arial"/>
+                <w:b/>
+                <w:bCs/>
+                <w:sz w:val="24"/>
+                <w:szCs w:val="24"/>
+              </w:rPr>
+              <w:t xml:space="preserve">Número de sesión / Día de trabajo: </w:t>
+            </w:r>
+            <w:r>
+              <w:rPr>
+                <w:rFonts w:ascii="Arial" w:hAnsi="Arial" w:cs="Arial"/>
+                <w:sz w:val="24"/>
+                <w:szCs w:val="24"/>
+              </w:rPr>
+              <w:t>1</w:t>
+            </w:r>
+          </w:p>
+        </w:tc>
+        <w:tc>
+          <w:tcPr>
+            <w:tcW w:w="4536" w:type="dxa"/>
+            <w:vAlign w:val="center"/>
+          </w:tcPr>
+          <w:p>
+            <w:pPr>
+              <w:rPr>
+                <w:rFonts w:ascii="Arial" w:hAnsi="Arial" w:cs="Arial"/>
+                <w:b/>
+                <w:bCs/>
+                <w:sz w:val="24"/>
+                <w:szCs w:val="24"/>
+              </w:rPr>
+            </w:pPr>
+            <w:r>
+              <w:rPr>
+                <w:rFonts w:ascii="Arial" w:hAnsi="Arial" w:cs="Arial"/>
+                <w:b/>
+                <w:bCs/>
+                <w:sz w:val="24"/>
+                <w:szCs w:val="24"/>
+              </w:rPr>
+              <w:t xml:space="preserve">Modalidad: </w:t>
+            </w:r>
+            <w:r>
+              <w:rPr>
+                <w:rFonts w:ascii="Arial" w:hAnsi="Arial" w:cs="Arial"/>
+                <w:sz w:val="24"/>
+                <w:szCs w:val="24"/>
+                <w:shd w:val="clear" w:color="auto" w:fill="F5E4A9" w:themeFill="accent3" w:themeFillTint="66"/>
+              </w:rPr>
+              <w:t>Presencial</w:t>
+            </w:r>
+            <w:r>
+              <w:rPr>
+                <w:rFonts w:ascii="Arial" w:hAnsi="Arial" w:cs="Arial"/>
+                <w:sz w:val="24"/>
+                <w:szCs w:val="24"/>
+              </w:rPr>
+              <w:t xml:space="preserve"> / </w:t>
+            </w:r>
+            <w:r>
+              <w:rPr>
+                <w:rFonts w:ascii="Arial" w:hAnsi="Arial" w:cs="Arial"/>
+                <w:sz w:val="24"/>
+                <w:szCs w:val="24"/>
+              </w:rPr>
+              <w:t>Virtual</w:t>
+            </w:r>
+            <w:r>
+              <w:rPr>
+                <w:rFonts w:ascii="Arial" w:hAnsi="Arial" w:cs="Arial"/>
+                <w:sz w:val="24"/>
+                <w:szCs w:val="24"/>
+              </w:rPr>
+              <w:t xml:space="preserve"> / </w:t>
+            </w:r>
+            <w:r>
+              <w:rPr>
+                <w:rFonts w:ascii="Arial" w:hAnsi="Arial" w:cs="Arial"/>
+                <w:sz w:val="24"/>
+                <w:szCs w:val="24"/>
+              </w:rPr>
+              <w:t>Mixto</w:t>
+            </w:r>
+          </w:p>
+        </w:tc>
+      </w:tr>
+      <w:tr>
+        <w:trPr>
+          <w:jc w:val="center"/>
+        </w:trPr>
+        <w:tc>
+          <w:tcPr>
+            <w:tcW w:w="9634" w:type="dxa"/>
+            <w:gridSpan w:val="2"/>
+            <w:vAlign w:val="center"/>
+          </w:tcPr>
+          <w:p>
+            <w:pPr>
+              <w:rPr>
+                <w:rFonts w:ascii="Arial" w:hAnsi="Arial" w:cs="Arial"/>
+                <w:b/>
+                <w:bCs/>
+                <w:sz w:val="24"/>
+                <w:szCs w:val="24"/>
+              </w:rPr>
+            </w:pPr>
+            <w:r>
+              <w:rPr>
+                <w:rFonts w:ascii="Arial" w:hAnsi="Arial" w:cs="Arial"/>
+                <w:b/>
+                <w:bCs/>
+                <w:sz w:val="24"/>
+                <w:szCs w:val="24"/>
+              </w:rPr>
+              <w:t>Duración de la sesión:</w:t>
+            </w:r>
+            <w:r>
+              <w:rPr>
+                <w:rFonts w:ascii="Arial" w:hAnsi="Arial" w:cs="Arial"/>
+                <w:b/>
+                <w:bCs/>
+                <w:sz w:val="24"/>
+                <w:szCs w:val="24"/>
+              </w:rPr>
+              <w:t xml:space="preserve"> </w:t>
+            </w:r>
+            <w:r>
+              <w:rPr>
+                <w:rFonts w:ascii="Arial" w:hAnsi="Arial" w:cs="Arial"/>
+                <w:sz w:val="24"/>
+                <w:szCs w:val="24"/>
+              </w:rPr>
+              <w:t xml:space="preserve">1 </w:t>
+            </w:r>
+            <w:proofErr w:type="spellStart"/>
+            <w:r>
+              <w:rPr>
+                <w:rFonts w:ascii="Arial" w:hAnsi="Arial" w:cs="Arial"/>
+                <w:sz w:val="24"/>
+                <w:szCs w:val="24"/>
+              </w:rPr>
+              <w:t>hr</w:t>
+            </w:r>
+            <w:proofErr w:type="spellEnd"/>
+          </w:p>
+        </w:tc>
+      </w:tr>
+    </w:tbl>
+    <w:p>
+      <w:pPr>
+        <w:rPr>
+          <w:rFonts w:ascii="Arial" w:hAnsi="Arial" w:cs="Arial"/>
+          <w:sz w:val="24"/>
+          <w:szCs w:val="24"/>
+        </w:rPr>
+      </w:pPr>
+    </w:p>
+    <w:p>
+      <w:pPr>
+        <w:pStyle w:val="titulo1"/>
+        <w:outlineLvl w:val="2"/>
+        <w:rPr>
+          <w:sz w:val="32"/>
+          <w:szCs w:val="72"/>
+        </w:rPr>
+      </w:pPr>
+      <w:bookmarkStart w:id="48" w:name="_Toc229984890"/>
+      <w:r>
+        <w:rPr>
+          <w:sz w:val="32"/>
+          <w:szCs w:val="72"/>
+        </w:rPr>
+        <w:t>Asistencia y Participación</w:t>
+      </w:r>
+      <w:bookmarkEnd w:id="48"/>
+    </w:p>
+    <w:tbl>
+      <w:tblPr>
+        <w:tblStyle w:val="Tablaconcuadrcula"/>
+        <w:tblW w:w="10281" w:type="dxa"/>
+        <w:jc w:val="center"/>
+        <w:tblBorders>
+          <w:top w:val="single" w:sz="4" w:space="0" w:color="7F7F7F" w:themeColor="text1" w:themeTint="80"/>
+          <w:left w:val="single" w:sz="4" w:space="0" w:color="7F7F7F" w:themeColor="text1" w:themeTint="80"/>
+          <w:bottom w:val="single" w:sz="4" w:space="0" w:color="7F7F7F" w:themeColor="text1" w:themeTint="80"/>
+          <w:right w:val="single" w:sz="4" w:space="0" w:color="7F7F7F" w:themeColor="text1" w:themeTint="80"/>
+          <w:insideH w:val="single" w:sz="4" w:space="0" w:color="7F7F7F" w:themeColor="text1" w:themeTint="80"/>
+          <w:insideV w:val="single" w:sz="4" w:space="0" w:color="7F7F7F" w:themeColor="text1" w:themeTint="80"/>
+        </w:tblBorders>
+        <w:tblCellMar>
+          <w:top w:w="57" w:type="dxa"/>
+          <w:bottom w:w="57" w:type="dxa"/>
+        </w:tblCellMar>
+        <w:tblLook w:val="04A0" w:firstRow="1" w:lastRow="0" w:firstColumn="1" w:lastColumn="0" w:noHBand="0" w:noVBand="1"/>
+      </w:tblPr>
+      <w:tblGrid>
+        <w:gridCol w:w="1538"/>
+        <w:gridCol w:w="1791"/>
+        <w:gridCol w:w="1563"/>
+        <w:gridCol w:w="3061"/>
+        <w:gridCol w:w="2328"/>
+      </w:tblGrid>
+      <w:tr>
+        <w:trPr>
+          <w:jc w:val="center"/>
+        </w:trPr>
+        <w:tc>
+          <w:tcPr>
+            <w:tcW w:w="1538" w:type="dxa"/>
+            <w:shd w:val="clear" w:color="auto" w:fill="262626" w:themeFill="text1" w:themeFillTint="D9"/>
+            <w:vAlign w:val="center"/>
+          </w:tcPr>
+          <w:p>
+            <w:pPr>
+              <w:jc w:val="center"/>
+              <w:rPr>
+                <w:rFonts w:ascii="Arial" w:hAnsi="Arial" w:cs="Arial"/>
+                <w:b/>
+                <w:bCs/>
+                <w:sz w:val="24"/>
+                <w:szCs w:val="24"/>
+              </w:rPr>
+            </w:pPr>
+            <w:r>
+              <w:rPr>
+                <w:rFonts w:ascii="Arial" w:hAnsi="Arial" w:cs="Arial"/>
+                <w:b/>
+                <w:bCs/>
+                <w:sz w:val="24"/>
+                <w:szCs w:val="24"/>
+              </w:rPr>
+              <w:t>Integrante</w:t>
+            </w:r>
+          </w:p>
+        </w:tc>
+        <w:tc>
+          <w:tcPr>
+            <w:tcW w:w="1791" w:type="dxa"/>
+            <w:shd w:val="clear" w:color="auto" w:fill="262626" w:themeFill="text1" w:themeFillTint="D9"/>
+            <w:vAlign w:val="center"/>
+          </w:tcPr>
+          <w:p>
+            <w:pPr>
+              <w:jc w:val="center"/>
+              <w:rPr>
+                <w:rFonts w:ascii="Arial" w:hAnsi="Arial" w:cs="Arial"/>
+                <w:b/>
+                <w:bCs/>
+                <w:sz w:val="24"/>
+                <w:szCs w:val="24"/>
+              </w:rPr>
+            </w:pPr>
+            <w:r>
+              <w:rPr>
+                <w:rFonts w:ascii="Arial" w:hAnsi="Arial" w:cs="Arial"/>
+                <w:b/>
+                <w:bCs/>
+                <w:sz w:val="24"/>
+                <w:szCs w:val="24"/>
+              </w:rPr>
+              <w:t>Rol</w:t>
+            </w:r>
+          </w:p>
+        </w:tc>
+        <w:tc>
+          <w:tcPr>
+            <w:tcW w:w="1563" w:type="dxa"/>
+            <w:shd w:val="clear" w:color="auto" w:fill="262626" w:themeFill="text1" w:themeFillTint="D9"/>
+            <w:vAlign w:val="center"/>
+          </w:tcPr>
+          <w:p>
+            <w:pPr>
+              <w:jc w:val="center"/>
+              <w:rPr>
+                <w:rFonts w:ascii="Arial" w:hAnsi="Arial" w:cs="Arial"/>
+                <w:b/>
+                <w:bCs/>
+                <w:sz w:val="24"/>
+                <w:szCs w:val="24"/>
+              </w:rPr>
+            </w:pPr>
+            <w:r>
+              <w:rPr>
+                <w:rFonts w:ascii="Arial" w:hAnsi="Arial" w:cs="Arial"/>
+                <w:b/>
+                <w:bCs/>
+                <w:sz w:val="24"/>
+                <w:szCs w:val="24"/>
+              </w:rPr>
+              <w:t>Asistencia (Sí/No)</w:t>
+            </w:r>
+          </w:p>
+        </w:tc>
+        <w:tc>
+          <w:tcPr>
+            <w:tcW w:w="3061" w:type="dxa"/>
+            <w:shd w:val="clear" w:color="auto" w:fill="262626" w:themeFill="text1" w:themeFillTint="D9"/>
+            <w:vAlign w:val="center"/>
+          </w:tcPr>
+          <w:p>
+            <w:pPr>
+              <w:jc w:val="center"/>
+              <w:rPr>
+                <w:rFonts w:ascii="Arial" w:hAnsi="Arial" w:cs="Arial"/>
+                <w:b/>
+                <w:bCs/>
+                <w:sz w:val="24"/>
+                <w:szCs w:val="24"/>
+              </w:rPr>
+            </w:pPr>
+            <w:r>
+              <w:rPr>
+                <w:rFonts w:ascii="Arial" w:hAnsi="Arial" w:cs="Arial"/>
+                <w:b/>
+                <w:bCs/>
+                <w:sz w:val="24"/>
+                <w:szCs w:val="24"/>
+              </w:rPr>
+              <w:t>Actividades</w:t>
+            </w:r>
+          </w:p>
+        </w:tc>
+        <w:tc>
+          <w:tcPr>
+            <w:tcW w:w="2328" w:type="dxa"/>
+            <w:shd w:val="clear" w:color="auto" w:fill="262626" w:themeFill="text1" w:themeFillTint="D9"/>
+            <w:vAlign w:val="center"/>
+          </w:tcPr>
+          <w:p>
+            <w:pPr>
+              <w:jc w:val="center"/>
+              <w:rPr>
+                <w:rFonts w:ascii="Arial" w:hAnsi="Arial" w:cs="Arial"/>
+                <w:b/>
+                <w:bCs/>
+                <w:sz w:val="24"/>
+                <w:szCs w:val="24"/>
+              </w:rPr>
+            </w:pPr>
+            <w:r>
+              <w:rPr>
+                <w:rFonts w:ascii="Arial" w:hAnsi="Arial" w:cs="Arial"/>
+                <w:b/>
+                <w:bCs/>
+                <w:sz w:val="24"/>
+                <w:szCs w:val="24"/>
+              </w:rPr>
+              <w:t>Entregables Esperados</w:t>
+            </w:r>
+          </w:p>
+        </w:tc>
+      </w:tr>
+      <w:tr>
+        <w:trPr>
+          <w:jc w:val="center"/>
+        </w:trPr>
+        <w:tc>
+          <w:tcPr>
+            <w:tcW w:w="1538" w:type="dxa"/>
+            <w:vAlign w:val="center"/>
+          </w:tcPr>
+          <w:p>
+            <w:pPr>
+              <w:rPr>
+                <w:rFonts w:ascii="Arial" w:hAnsi="Arial" w:cs="Arial"/>
+                <w:sz w:val="24"/>
+                <w:szCs w:val="24"/>
+              </w:rPr>
+            </w:pPr>
+            <w:r>
+              <w:rPr>
+                <w:rFonts w:ascii="Arial" w:hAnsi="Arial" w:cs="Arial"/>
+                <w:sz w:val="24"/>
+                <w:szCs w:val="24"/>
+              </w:rPr>
+              <w:t>María Fernanda Barrón Álvarez</w:t>
+            </w:r>
+          </w:p>
+        </w:tc>
+        <w:tc>
+          <w:tcPr>
+            <w:tcW w:w="1791" w:type="dxa"/>
+            <w:vAlign w:val="center"/>
+          </w:tcPr>
+          <w:p>
+            <w:pPr>
+              <w:rPr>
+                <w:rFonts w:ascii="Arial" w:hAnsi="Arial" w:cs="Arial"/>
+                <w:sz w:val="24"/>
+                <w:szCs w:val="24"/>
+              </w:rPr>
+            </w:pPr>
+            <w:r>
+              <w:rPr>
+                <w:rFonts w:ascii="Arial" w:hAnsi="Arial" w:cs="Arial"/>
+                <w:sz w:val="24"/>
+                <w:szCs w:val="24"/>
+              </w:rPr>
+              <w:t>Project Manager</w:t>
+            </w:r>
+          </w:p>
+        </w:tc>
+        <w:tc>
+          <w:tcPr>
+            <w:tcW w:w="1563" w:type="dxa"/>
+            <w:vAlign w:val="center"/>
+          </w:tcPr>
+          <w:p>
+            <w:pPr>
+              <w:rPr>
+                <w:rFonts w:ascii="Arial" w:hAnsi="Arial" w:cs="Arial"/>
+                <w:sz w:val="24"/>
+                <w:szCs w:val="24"/>
+              </w:rPr>
+            </w:pPr>
+            <w:r>
+              <w:rPr>
+                <w:rFonts w:ascii="Arial" w:hAnsi="Arial" w:cs="Arial"/>
+                <w:sz w:val="24"/>
+                <w:szCs w:val="24"/>
+              </w:rPr>
+              <w:t>Sí</w:t>
+            </w:r>
+          </w:p>
+        </w:tc>
+        <w:tc>
+          <w:tcPr>
+            <w:tcW w:w="3061" w:type="dxa"/>
+            <w:vAlign w:val="center"/>
+          </w:tcPr>
+          <w:p>
+            <w:pPr>
+              <w:pStyle w:val="Prrafodelista"/>
+              <w:numPr>
+                <w:ilvl w:val="0"/>
+                <w:numId w:val="27"/>
+              </w:numPr>
+              <w:ind w:left="246" w:hanging="218"/>
+              <w:rPr>
+                <w:rFonts w:ascii="Arial" w:hAnsi="Arial" w:cs="Arial"/>
+                <w:sz w:val="24"/>
+                <w:szCs w:val="24"/>
+              </w:rPr>
+            </w:pPr>
+            <w:r>
+              <w:rPr>
+                <w:rFonts w:ascii="Arial" w:hAnsi="Arial" w:cs="Arial"/>
+                <w:sz w:val="24"/>
+                <w:szCs w:val="24"/>
+              </w:rPr>
+              <w:t>Realizar estimación de puntos de función</w:t>
+            </w:r>
+          </w:p>
+          <w:p>
+            <w:pPr>
+              <w:pStyle w:val="Prrafodelista"/>
+              <w:numPr>
+                <w:ilvl w:val="0"/>
+                <w:numId w:val="27"/>
+              </w:numPr>
+              <w:ind w:left="246" w:hanging="218"/>
+              <w:rPr>
+                <w:rFonts w:ascii="Arial" w:hAnsi="Arial" w:cs="Arial"/>
+                <w:sz w:val="24"/>
+                <w:szCs w:val="24"/>
+              </w:rPr>
+            </w:pPr>
+            <w:r>
+              <w:rPr>
+                <w:rFonts w:ascii="Arial" w:hAnsi="Arial" w:cs="Arial"/>
+                <w:sz w:val="24"/>
+                <w:szCs w:val="24"/>
+              </w:rPr>
+              <w:t>Bitácora del día</w:t>
+            </w:r>
+          </w:p>
+        </w:tc>
+        <w:tc>
+          <w:tcPr>
+            <w:tcW w:w="2328" w:type="dxa"/>
+            <w:vAlign w:val="center"/>
+          </w:tcPr>
+          <w:p>
+            <w:pPr>
+              <w:pStyle w:val="Prrafodelista"/>
+              <w:numPr>
+                <w:ilvl w:val="0"/>
+                <w:numId w:val="27"/>
+              </w:numPr>
+              <w:ind w:left="219" w:hanging="219"/>
+              <w:rPr>
+                <w:rFonts w:ascii="Arial" w:hAnsi="Arial" w:cs="Arial"/>
+                <w:sz w:val="24"/>
+                <w:szCs w:val="24"/>
+              </w:rPr>
+            </w:pPr>
+            <w:r>
+              <w:rPr>
+                <w:rFonts w:ascii="Arial" w:hAnsi="Arial" w:cs="Arial"/>
+                <w:sz w:val="24"/>
+                <w:szCs w:val="24"/>
+              </w:rPr>
+              <w:t>Documento final con punto</w:t>
+            </w:r>
+            <w:r>
+              <w:rPr>
+                <w:rFonts w:ascii="Arial" w:hAnsi="Arial" w:cs="Arial"/>
+                <w:sz w:val="24"/>
+                <w:szCs w:val="24"/>
+              </w:rPr>
+              <w:t xml:space="preserve"> 7</w:t>
+            </w:r>
+            <w:r>
+              <w:rPr>
+                <w:rFonts w:ascii="Arial" w:hAnsi="Arial" w:cs="Arial"/>
+                <w:sz w:val="24"/>
+                <w:szCs w:val="24"/>
+              </w:rPr>
+              <w:t xml:space="preserve">.  </w:t>
+            </w:r>
+          </w:p>
+          <w:p>
+            <w:pPr>
+              <w:pStyle w:val="Prrafodelista"/>
+              <w:numPr>
+                <w:ilvl w:val="0"/>
+                <w:numId w:val="27"/>
+              </w:numPr>
+              <w:ind w:left="219" w:hanging="219"/>
+              <w:rPr>
+                <w:rFonts w:ascii="Arial" w:hAnsi="Arial" w:cs="Arial"/>
+                <w:sz w:val="24"/>
+                <w:szCs w:val="24"/>
+              </w:rPr>
+            </w:pPr>
+            <w:r>
+              <w:rPr>
+                <w:rFonts w:ascii="Arial" w:hAnsi="Arial" w:cs="Arial"/>
+                <w:sz w:val="24"/>
+                <w:szCs w:val="24"/>
+              </w:rPr>
+              <w:t>Bitácora</w:t>
+            </w:r>
+          </w:p>
+        </w:tc>
+      </w:tr>
+      <w:tr>
+        <w:trPr>
+          <w:jc w:val="center"/>
+        </w:trPr>
+        <w:tc>
+          <w:tcPr>
+            <w:tcW w:w="1538" w:type="dxa"/>
+            <w:vAlign w:val="center"/>
+          </w:tcPr>
+          <w:p>
+            <w:pPr>
+              <w:rPr>
+                <w:rFonts w:ascii="Arial" w:hAnsi="Arial" w:cs="Arial"/>
+                <w:sz w:val="24"/>
+                <w:szCs w:val="24"/>
+              </w:rPr>
+            </w:pPr>
+            <w:r>
+              <w:rPr>
+                <w:rFonts w:ascii="Arial" w:hAnsi="Arial" w:cs="Arial"/>
+                <w:sz w:val="24"/>
+                <w:szCs w:val="24"/>
+              </w:rPr>
+              <w:t xml:space="preserve">Leslie Miroslava Benítez </w:t>
+            </w:r>
+          </w:p>
+          <w:p>
+            <w:pPr>
+              <w:rPr>
+                <w:rFonts w:ascii="Arial" w:hAnsi="Arial" w:cs="Arial"/>
+                <w:sz w:val="24"/>
+                <w:szCs w:val="24"/>
+              </w:rPr>
+            </w:pPr>
+            <w:r>
+              <w:rPr>
+                <w:rFonts w:ascii="Arial" w:hAnsi="Arial" w:cs="Arial"/>
+                <w:sz w:val="24"/>
+                <w:szCs w:val="24"/>
+              </w:rPr>
+              <w:t>Marín</w:t>
+            </w:r>
+          </w:p>
+        </w:tc>
+        <w:tc>
+          <w:tcPr>
+            <w:tcW w:w="1791" w:type="dxa"/>
+            <w:vAlign w:val="center"/>
+          </w:tcPr>
+          <w:p>
+            <w:pPr>
+              <w:rPr>
+                <w:rFonts w:ascii="Arial" w:hAnsi="Arial" w:cs="Arial"/>
+                <w:sz w:val="24"/>
+                <w:szCs w:val="24"/>
+              </w:rPr>
+            </w:pPr>
+            <w:r>
+              <w:rPr>
+                <w:rFonts w:ascii="Arial" w:hAnsi="Arial" w:cs="Arial"/>
+                <w:sz w:val="24"/>
+                <w:szCs w:val="24"/>
+              </w:rPr>
+              <w:t xml:space="preserve">Desarrolladora </w:t>
+            </w:r>
+            <w:proofErr w:type="spellStart"/>
+            <w:r>
+              <w:rPr>
+                <w:rFonts w:ascii="Arial" w:hAnsi="Arial" w:cs="Arial"/>
+                <w:sz w:val="24"/>
+                <w:szCs w:val="24"/>
+              </w:rPr>
+              <w:t>frontend</w:t>
+            </w:r>
+            <w:proofErr w:type="spellEnd"/>
+          </w:p>
+        </w:tc>
+        <w:tc>
+          <w:tcPr>
+            <w:tcW w:w="1563" w:type="dxa"/>
+            <w:vAlign w:val="center"/>
+          </w:tcPr>
+          <w:p>
+            <w:pPr>
+              <w:rPr>
+                <w:rFonts w:ascii="Arial" w:hAnsi="Arial" w:cs="Arial"/>
+                <w:sz w:val="24"/>
+                <w:szCs w:val="24"/>
+              </w:rPr>
+            </w:pPr>
+            <w:r>
+              <w:rPr>
+                <w:rFonts w:ascii="Arial" w:hAnsi="Arial" w:cs="Arial"/>
+                <w:sz w:val="24"/>
+                <w:szCs w:val="24"/>
+              </w:rPr>
+              <w:t>Sí</w:t>
+            </w:r>
+          </w:p>
+        </w:tc>
+        <w:tc>
+          <w:tcPr>
+            <w:tcW w:w="3061" w:type="dxa"/>
+            <w:vAlign w:val="center"/>
+          </w:tcPr>
+          <w:p>
+            <w:pPr>
+              <w:pStyle w:val="Prrafodelista"/>
+              <w:numPr>
+                <w:ilvl w:val="0"/>
+                <w:numId w:val="27"/>
+              </w:numPr>
+              <w:ind w:left="270" w:hanging="184"/>
+              <w:rPr>
+                <w:rFonts w:ascii="Arial" w:hAnsi="Arial" w:cs="Arial"/>
+                <w:sz w:val="24"/>
+                <w:szCs w:val="24"/>
+              </w:rPr>
+            </w:pPr>
+            <w:r>
+              <w:rPr>
+                <w:rFonts w:ascii="Arial" w:hAnsi="Arial" w:cs="Arial"/>
+                <w:sz w:val="24"/>
+                <w:szCs w:val="24"/>
+              </w:rPr>
+              <w:t xml:space="preserve">Continuación de prototipo: diseño de página (archivos </w:t>
+            </w:r>
+            <w:proofErr w:type="spellStart"/>
+            <w:r>
+              <w:rPr>
+                <w:rFonts w:ascii="Arial" w:hAnsi="Arial" w:cs="Arial"/>
+                <w:sz w:val="24"/>
+                <w:szCs w:val="24"/>
+              </w:rPr>
+              <w:t>css</w:t>
+            </w:r>
+            <w:proofErr w:type="spellEnd"/>
+            <w:r>
+              <w:rPr>
+                <w:rFonts w:ascii="Arial" w:hAnsi="Arial" w:cs="Arial"/>
+                <w:sz w:val="24"/>
+                <w:szCs w:val="24"/>
+              </w:rPr>
+              <w:t>)</w:t>
+            </w:r>
+            <w:r>
+              <w:rPr>
+                <w:rFonts w:ascii="Arial" w:hAnsi="Arial" w:cs="Arial"/>
+                <w:sz w:val="24"/>
+                <w:szCs w:val="24"/>
+              </w:rPr>
+              <w:t xml:space="preserve"> </w:t>
+            </w:r>
+          </w:p>
+        </w:tc>
+        <w:tc>
+          <w:tcPr>
+            <w:tcW w:w="2328" w:type="dxa"/>
+            <w:vAlign w:val="center"/>
+          </w:tcPr>
+          <w:p>
+            <w:pPr>
+              <w:pStyle w:val="Prrafodelista"/>
+              <w:numPr>
+                <w:ilvl w:val="0"/>
+                <w:numId w:val="27"/>
+              </w:numPr>
+              <w:ind w:left="219" w:hanging="218"/>
+              <w:rPr>
+                <w:rFonts w:ascii="Arial" w:hAnsi="Arial" w:cs="Arial"/>
+                <w:sz w:val="24"/>
+                <w:szCs w:val="24"/>
+              </w:rPr>
+            </w:pPr>
+            <w:r>
+              <w:rPr>
+                <w:rFonts w:ascii="Arial" w:hAnsi="Arial" w:cs="Arial"/>
+                <w:sz w:val="24"/>
+                <w:szCs w:val="24"/>
+              </w:rPr>
+              <w:t>Prototipo funcional navegable con estructura completa del sitio</w:t>
+            </w:r>
+          </w:p>
+        </w:tc>
+      </w:tr>
+      <w:tr>
+        <w:trPr>
+          <w:jc w:val="center"/>
+        </w:trPr>
+        <w:tc>
+          <w:tcPr>
+            <w:tcW w:w="1538" w:type="dxa"/>
+            <w:vAlign w:val="center"/>
+          </w:tcPr>
+          <w:p>
+            <w:pPr>
+              <w:rPr>
+                <w:rFonts w:ascii="Arial" w:hAnsi="Arial" w:cs="Arial"/>
+                <w:sz w:val="24"/>
+                <w:szCs w:val="24"/>
+              </w:rPr>
+            </w:pPr>
+            <w:r>
+              <w:rPr>
+                <w:rFonts w:ascii="Arial" w:hAnsi="Arial" w:cs="Arial"/>
+                <w:sz w:val="24"/>
+                <w:szCs w:val="24"/>
+              </w:rPr>
+              <w:t>Leonardo Merino Garfias</w:t>
+            </w:r>
+          </w:p>
+        </w:tc>
+        <w:tc>
+          <w:tcPr>
+            <w:tcW w:w="1791" w:type="dxa"/>
+            <w:vAlign w:val="center"/>
+          </w:tcPr>
+          <w:p>
+            <w:pPr>
+              <w:rPr>
+                <w:rFonts w:ascii="Arial" w:hAnsi="Arial" w:cs="Arial"/>
+                <w:sz w:val="24"/>
+                <w:szCs w:val="24"/>
+              </w:rPr>
+            </w:pPr>
+            <w:r>
+              <w:rPr>
+                <w:rFonts w:ascii="Arial" w:hAnsi="Arial" w:cs="Arial"/>
+                <w:sz w:val="24"/>
+                <w:szCs w:val="24"/>
+              </w:rPr>
+              <w:t xml:space="preserve">Desarrollador </w:t>
+            </w:r>
+            <w:proofErr w:type="spellStart"/>
+            <w:r>
+              <w:rPr>
+                <w:rFonts w:ascii="Arial" w:hAnsi="Arial" w:cs="Arial"/>
+                <w:sz w:val="24"/>
+                <w:szCs w:val="24"/>
+              </w:rPr>
+              <w:t>backend</w:t>
+            </w:r>
+            <w:proofErr w:type="spellEnd"/>
+          </w:p>
+        </w:tc>
+        <w:tc>
+          <w:tcPr>
+            <w:tcW w:w="1563" w:type="dxa"/>
+            <w:vAlign w:val="center"/>
+          </w:tcPr>
+          <w:p>
+            <w:pPr>
+              <w:rPr>
+                <w:rFonts w:ascii="Arial" w:hAnsi="Arial" w:cs="Arial"/>
+                <w:sz w:val="24"/>
+                <w:szCs w:val="24"/>
+              </w:rPr>
+            </w:pPr>
+            <w:r>
+              <w:rPr>
+                <w:rFonts w:ascii="Arial" w:hAnsi="Arial" w:cs="Arial"/>
+                <w:sz w:val="24"/>
+                <w:szCs w:val="24"/>
+              </w:rPr>
+              <w:t>Sí</w:t>
+            </w:r>
+          </w:p>
+        </w:tc>
+        <w:tc>
+          <w:tcPr>
+            <w:tcW w:w="3061" w:type="dxa"/>
+            <w:vAlign w:val="center"/>
+          </w:tcPr>
+          <w:p>
+            <w:pPr>
+              <w:pStyle w:val="Prrafodelista"/>
+              <w:numPr>
+                <w:ilvl w:val="0"/>
+                <w:numId w:val="27"/>
+              </w:numPr>
+              <w:ind w:left="246" w:hanging="218"/>
+              <w:rPr>
+                <w:rFonts w:ascii="Arial" w:hAnsi="Arial" w:cs="Arial"/>
+                <w:sz w:val="24"/>
+                <w:szCs w:val="24"/>
+              </w:rPr>
+            </w:pPr>
+            <w:r>
+              <w:rPr>
+                <w:rFonts w:ascii="Arial" w:hAnsi="Arial" w:cs="Arial"/>
+                <w:sz w:val="24"/>
+                <w:szCs w:val="24"/>
+              </w:rPr>
+              <w:t>Realizar estimación de puntos de función</w:t>
+            </w:r>
+          </w:p>
+        </w:tc>
+        <w:tc>
+          <w:tcPr>
+            <w:tcW w:w="2328" w:type="dxa"/>
+            <w:vAlign w:val="center"/>
+          </w:tcPr>
+          <w:p>
+            <w:pPr>
+              <w:pStyle w:val="Prrafodelista"/>
+              <w:numPr>
+                <w:ilvl w:val="0"/>
+                <w:numId w:val="27"/>
+              </w:numPr>
+              <w:ind w:left="349" w:hanging="248"/>
+              <w:rPr>
+                <w:rFonts w:ascii="Arial" w:hAnsi="Arial" w:cs="Arial"/>
+                <w:sz w:val="24"/>
+                <w:szCs w:val="24"/>
+              </w:rPr>
+            </w:pPr>
+            <w:r>
+              <w:rPr>
+                <w:rFonts w:ascii="Arial" w:hAnsi="Arial" w:cs="Arial"/>
+                <w:sz w:val="24"/>
+                <w:szCs w:val="24"/>
+              </w:rPr>
+              <w:t>Parte de documentación</w:t>
+            </w:r>
+            <w:r>
+              <w:rPr>
+                <w:rFonts w:ascii="Arial" w:hAnsi="Arial" w:cs="Arial"/>
+                <w:sz w:val="24"/>
+                <w:szCs w:val="24"/>
+              </w:rPr>
+              <w:t xml:space="preserve"> con punto 7.</w:t>
+            </w:r>
+          </w:p>
+        </w:tc>
+      </w:tr>
+    </w:tbl>
+    <w:p>
+      <w:pPr>
+        <w:rPr>
+          <w:rFonts w:ascii="Arial" w:hAnsi="Arial" w:cs="Arial"/>
+          <w:sz w:val="24"/>
+          <w:szCs w:val="24"/>
+        </w:rPr>
+      </w:pPr>
+    </w:p>
+    <w:p>
+      <w:pPr>
+        <w:pStyle w:val="titulo1"/>
+        <w:outlineLvl w:val="2"/>
+        <w:rPr>
+          <w:sz w:val="32"/>
+          <w:szCs w:val="72"/>
+        </w:rPr>
+      </w:pPr>
+      <w:bookmarkStart w:id="49" w:name="_Toc229984891"/>
+      <w:r>
+        <w:rPr>
+          <w:sz w:val="32"/>
+          <w:szCs w:val="72"/>
+        </w:rPr>
+        <w:t>A</w:t>
+      </w:r>
+      <w:r>
+        <w:rPr>
+          <w:sz w:val="32"/>
+          <w:szCs w:val="72"/>
+        </w:rPr>
+        <w:t>ctividades Ejecutadas</w:t>
+      </w:r>
+      <w:bookmarkEnd w:id="49"/>
+    </w:p>
+    <w:tbl>
+      <w:tblPr>
+        <w:tblStyle w:val="Tablaconcuadrcula"/>
+        <w:tblW w:w="10124" w:type="dxa"/>
+        <w:jc w:val="center"/>
+        <w:tblBorders>
+          <w:top w:val="single" w:sz="4" w:space="0" w:color="7F7F7F" w:themeColor="text1" w:themeTint="80"/>
+          <w:left w:val="single" w:sz="4" w:space="0" w:color="7F7F7F" w:themeColor="text1" w:themeTint="80"/>
+          <w:bottom w:val="single" w:sz="4" w:space="0" w:color="7F7F7F" w:themeColor="text1" w:themeTint="80"/>
+          <w:right w:val="single" w:sz="4" w:space="0" w:color="7F7F7F" w:themeColor="text1" w:themeTint="80"/>
+          <w:insideH w:val="single" w:sz="4" w:space="0" w:color="7F7F7F" w:themeColor="text1" w:themeTint="80"/>
+          <w:insideV w:val="single" w:sz="4" w:space="0" w:color="7F7F7F" w:themeColor="text1" w:themeTint="80"/>
+        </w:tblBorders>
+        <w:tblCellMar>
+          <w:top w:w="57" w:type="dxa"/>
+          <w:bottom w:w="57" w:type="dxa"/>
+        </w:tblCellMar>
+        <w:tblLook w:val="04A0" w:firstRow="1" w:lastRow="0" w:firstColumn="1" w:lastColumn="0" w:noHBand="0" w:noVBand="1"/>
+      </w:tblPr>
+      <w:tblGrid>
+        <w:gridCol w:w="2955"/>
+        <w:gridCol w:w="2004"/>
+        <w:gridCol w:w="1150"/>
+        <w:gridCol w:w="1535"/>
+        <w:gridCol w:w="2480"/>
+      </w:tblGrid>
+      <w:tr>
+        <w:trPr>
+          <w:jc w:val="center"/>
+        </w:trPr>
+        <w:tc>
+          <w:tcPr>
+            <w:tcW w:w="2955" w:type="dxa"/>
+            <w:shd w:val="clear" w:color="auto" w:fill="262626" w:themeFill="text1" w:themeFillTint="D9"/>
+            <w:vAlign w:val="center"/>
+          </w:tcPr>
+          <w:p>
+            <w:pPr>
+              <w:jc w:val="center"/>
+              <w:rPr>
+                <w:rFonts w:ascii="Arial" w:hAnsi="Arial" w:cs="Arial"/>
+                <w:b/>
+                <w:bCs/>
+                <w:sz w:val="24"/>
+                <w:szCs w:val="24"/>
+              </w:rPr>
+            </w:pPr>
+            <w:r>
+              <w:rPr>
+                <w:rFonts w:ascii="Arial" w:hAnsi="Arial" w:cs="Arial"/>
+                <w:b/>
+                <w:bCs/>
+                <w:sz w:val="24"/>
+                <w:szCs w:val="24"/>
+              </w:rPr>
+              <w:t>Actividad</w:t>
+            </w:r>
+          </w:p>
+        </w:tc>
+        <w:tc>
+          <w:tcPr>
+            <w:tcW w:w="2004" w:type="dxa"/>
+            <w:shd w:val="clear" w:color="auto" w:fill="262626" w:themeFill="text1" w:themeFillTint="D9"/>
+            <w:vAlign w:val="center"/>
+          </w:tcPr>
+          <w:p>
+            <w:pPr>
+              <w:jc w:val="center"/>
+              <w:rPr>
+                <w:rFonts w:ascii="Arial" w:hAnsi="Arial" w:cs="Arial"/>
+                <w:b/>
+                <w:bCs/>
+                <w:sz w:val="24"/>
+                <w:szCs w:val="24"/>
+              </w:rPr>
+            </w:pPr>
+            <w:r>
+              <w:rPr>
+                <w:rFonts w:ascii="Arial" w:hAnsi="Arial" w:cs="Arial"/>
+                <w:b/>
+                <w:bCs/>
+                <w:sz w:val="24"/>
+                <w:szCs w:val="24"/>
+              </w:rPr>
+              <w:t>Responsable(s)</w:t>
+            </w:r>
+          </w:p>
+        </w:tc>
+        <w:tc>
+          <w:tcPr>
+            <w:tcW w:w="1150" w:type="dxa"/>
+            <w:shd w:val="clear" w:color="auto" w:fill="262626" w:themeFill="text1" w:themeFillTint="D9"/>
+            <w:vAlign w:val="center"/>
+          </w:tcPr>
+          <w:p>
+            <w:pPr>
+              <w:jc w:val="center"/>
+              <w:rPr>
+                <w:rFonts w:ascii="Arial" w:hAnsi="Arial" w:cs="Arial"/>
+                <w:b/>
+                <w:bCs/>
+                <w:sz w:val="24"/>
+                <w:szCs w:val="24"/>
+              </w:rPr>
+            </w:pPr>
+            <w:proofErr w:type="spellStart"/>
+            <w:r>
+              <w:rPr>
+                <w:rFonts w:ascii="Arial" w:hAnsi="Arial" w:cs="Arial"/>
+                <w:b/>
+                <w:bCs/>
+                <w:sz w:val="24"/>
+                <w:szCs w:val="24"/>
+              </w:rPr>
+              <w:t>Hr</w:t>
+            </w:r>
+            <w:proofErr w:type="spellEnd"/>
+            <w:r>
+              <w:rPr>
+                <w:rFonts w:ascii="Arial" w:hAnsi="Arial" w:cs="Arial"/>
+                <w:b/>
+                <w:bCs/>
+                <w:sz w:val="24"/>
+                <w:szCs w:val="24"/>
+              </w:rPr>
+              <w:t xml:space="preserve">. </w:t>
+            </w:r>
+            <w:proofErr w:type="spellStart"/>
+            <w:r>
+              <w:rPr>
+                <w:rFonts w:ascii="Arial" w:hAnsi="Arial" w:cs="Arial"/>
+                <w:b/>
+                <w:bCs/>
+                <w:sz w:val="24"/>
+                <w:szCs w:val="24"/>
+              </w:rPr>
+              <w:t>Ini</w:t>
+            </w:r>
+            <w:proofErr w:type="spellEnd"/>
+          </w:p>
+        </w:tc>
+        <w:tc>
+          <w:tcPr>
+            <w:tcW w:w="1535" w:type="dxa"/>
+            <w:shd w:val="clear" w:color="auto" w:fill="262626" w:themeFill="text1" w:themeFillTint="D9"/>
+            <w:vAlign w:val="center"/>
+          </w:tcPr>
+          <w:p>
+            <w:pPr>
+              <w:jc w:val="center"/>
+              <w:rPr>
+                <w:rFonts w:ascii="Arial" w:hAnsi="Arial" w:cs="Arial"/>
+                <w:b/>
+                <w:bCs/>
+                <w:sz w:val="24"/>
+                <w:szCs w:val="24"/>
+              </w:rPr>
+            </w:pPr>
+            <w:proofErr w:type="spellStart"/>
+            <w:r>
+              <w:rPr>
+                <w:rFonts w:ascii="Arial" w:hAnsi="Arial" w:cs="Arial"/>
+                <w:b/>
+                <w:bCs/>
+                <w:sz w:val="24"/>
+                <w:szCs w:val="24"/>
+              </w:rPr>
+              <w:t>Hr</w:t>
+            </w:r>
+            <w:proofErr w:type="spellEnd"/>
+            <w:r>
+              <w:rPr>
+                <w:rFonts w:ascii="Arial" w:hAnsi="Arial" w:cs="Arial"/>
+                <w:b/>
+                <w:bCs/>
+                <w:sz w:val="24"/>
+                <w:szCs w:val="24"/>
+              </w:rPr>
+              <w:t>. fin</w:t>
+            </w:r>
+          </w:p>
+        </w:tc>
+        <w:tc>
+          <w:tcPr>
+            <w:tcW w:w="2480" w:type="dxa"/>
+            <w:shd w:val="clear" w:color="auto" w:fill="262626" w:themeFill="text1" w:themeFillTint="D9"/>
+            <w:vAlign w:val="center"/>
+          </w:tcPr>
+          <w:p>
+            <w:pPr>
+              <w:jc w:val="center"/>
+              <w:rPr>
+                <w:rFonts w:ascii="Arial" w:hAnsi="Arial" w:cs="Arial"/>
+                <w:b/>
+                <w:bCs/>
+                <w:sz w:val="24"/>
+                <w:szCs w:val="24"/>
+              </w:rPr>
+            </w:pPr>
+            <w:r>
+              <w:rPr>
+                <w:rFonts w:ascii="Arial" w:hAnsi="Arial" w:cs="Arial"/>
+                <w:b/>
+                <w:bCs/>
+                <w:sz w:val="24"/>
+                <w:szCs w:val="24"/>
+              </w:rPr>
+              <w:t>Estado (Completado / En proceso / Pendiente)</w:t>
+            </w:r>
+          </w:p>
+        </w:tc>
+      </w:tr>
+      <w:tr>
+        <w:trPr>
+          <w:jc w:val="center"/>
+        </w:trPr>
+        <w:tc>
+          <w:tcPr>
+            <w:tcW w:w="2955" w:type="dxa"/>
+            <w:vAlign w:val="center"/>
+          </w:tcPr>
+          <w:p>
+            <w:pPr>
+              <w:rPr>
+                <w:rFonts w:ascii="Arial" w:hAnsi="Arial" w:cs="Arial"/>
+                <w:sz w:val="24"/>
+                <w:szCs w:val="24"/>
+              </w:rPr>
+            </w:pPr>
+            <w:r>
+              <w:rPr>
+                <w:rFonts w:ascii="Arial" w:hAnsi="Arial" w:cs="Arial"/>
+                <w:sz w:val="24"/>
+                <w:szCs w:val="24"/>
+              </w:rPr>
+              <w:t>Puntos de Función</w:t>
+            </w:r>
+          </w:p>
+        </w:tc>
+        <w:tc>
+          <w:tcPr>
+            <w:tcW w:w="2004" w:type="dxa"/>
+            <w:vAlign w:val="center"/>
+          </w:tcPr>
+          <w:p>
+            <w:pPr>
+              <w:rPr>
+                <w:rFonts w:ascii="Arial" w:hAnsi="Arial" w:cs="Arial"/>
+                <w:sz w:val="24"/>
+                <w:szCs w:val="24"/>
+              </w:rPr>
+            </w:pPr>
+            <w:r>
+              <w:rPr>
+                <w:rFonts w:ascii="Arial" w:hAnsi="Arial" w:cs="Arial"/>
+                <w:sz w:val="24"/>
+                <w:szCs w:val="24"/>
+              </w:rPr>
+              <w:t>María Fernanda Barrón Álvarez</w:t>
+            </w:r>
+          </w:p>
+        </w:tc>
+        <w:tc>
+          <w:tcPr>
+            <w:tcW w:w="1150" w:type="dxa"/>
+            <w:vAlign w:val="center"/>
+          </w:tcPr>
+          <w:p>
+            <w:pPr>
+              <w:rPr>
+                <w:rFonts w:ascii="Arial" w:hAnsi="Arial" w:cs="Arial"/>
+                <w:sz w:val="24"/>
+                <w:szCs w:val="24"/>
+              </w:rPr>
+            </w:pPr>
+            <w:r>
+              <w:rPr>
+                <w:rFonts w:ascii="Arial" w:hAnsi="Arial" w:cs="Arial"/>
+                <w:sz w:val="24"/>
+                <w:szCs w:val="24"/>
+              </w:rPr>
+              <w:t>8</w:t>
+            </w:r>
+            <w:r>
+              <w:rPr>
+                <w:rFonts w:ascii="Arial" w:hAnsi="Arial" w:cs="Arial"/>
+                <w:sz w:val="24"/>
+                <w:szCs w:val="24"/>
+              </w:rPr>
+              <w:t>:</w:t>
+            </w:r>
+            <w:r>
+              <w:rPr>
+                <w:rFonts w:ascii="Arial" w:hAnsi="Arial" w:cs="Arial"/>
+                <w:sz w:val="24"/>
+                <w:szCs w:val="24"/>
+              </w:rPr>
+              <w:t xml:space="preserve">00 </w:t>
+            </w:r>
+            <w:r>
+              <w:rPr>
+                <w:rFonts w:ascii="Arial" w:hAnsi="Arial" w:cs="Arial"/>
+                <w:sz w:val="24"/>
+                <w:szCs w:val="24"/>
+              </w:rPr>
+              <w:t>a</w:t>
+            </w:r>
+            <w:r>
+              <w:rPr>
+                <w:rFonts w:ascii="Arial" w:hAnsi="Arial" w:cs="Arial"/>
+                <w:sz w:val="24"/>
+                <w:szCs w:val="24"/>
+              </w:rPr>
+              <w:t>m</w:t>
+            </w:r>
+          </w:p>
+        </w:tc>
+        <w:tc>
+          <w:tcPr>
+            <w:tcW w:w="1535" w:type="dxa"/>
+            <w:vAlign w:val="center"/>
+          </w:tcPr>
+          <w:p>
+            <w:pPr>
+              <w:rPr>
+                <w:rFonts w:ascii="Arial" w:hAnsi="Arial" w:cs="Arial"/>
+                <w:sz w:val="24"/>
+                <w:szCs w:val="24"/>
+              </w:rPr>
+            </w:pPr>
+            <w:r>
+              <w:rPr>
+                <w:rFonts w:ascii="Arial" w:hAnsi="Arial" w:cs="Arial"/>
+                <w:sz w:val="24"/>
+                <w:szCs w:val="24"/>
+              </w:rPr>
+              <w:t>9</w:t>
+            </w:r>
+            <w:r>
+              <w:rPr>
+                <w:rFonts w:ascii="Arial" w:hAnsi="Arial" w:cs="Arial"/>
+                <w:sz w:val="24"/>
+                <w:szCs w:val="24"/>
+              </w:rPr>
+              <w:t>:</w:t>
+            </w:r>
+            <w:r>
+              <w:rPr>
+                <w:rFonts w:ascii="Arial" w:hAnsi="Arial" w:cs="Arial"/>
+                <w:sz w:val="24"/>
+                <w:szCs w:val="24"/>
+              </w:rPr>
+              <w:t>0</w:t>
+            </w:r>
+            <w:r>
+              <w:rPr>
+                <w:rFonts w:ascii="Arial" w:hAnsi="Arial" w:cs="Arial"/>
+                <w:sz w:val="24"/>
+                <w:szCs w:val="24"/>
+              </w:rPr>
+              <w:t>0</w:t>
+            </w:r>
+            <w:r>
+              <w:rPr>
+                <w:rFonts w:ascii="Arial" w:hAnsi="Arial" w:cs="Arial"/>
+                <w:sz w:val="24"/>
+                <w:szCs w:val="24"/>
+              </w:rPr>
+              <w:t xml:space="preserve"> </w:t>
+            </w:r>
+            <w:r>
+              <w:rPr>
+                <w:rFonts w:ascii="Arial" w:hAnsi="Arial" w:cs="Arial"/>
+                <w:sz w:val="24"/>
+                <w:szCs w:val="24"/>
+              </w:rPr>
+              <w:t>a</w:t>
+            </w:r>
+            <w:r>
+              <w:rPr>
+                <w:rFonts w:ascii="Arial" w:hAnsi="Arial" w:cs="Arial"/>
+                <w:sz w:val="24"/>
+                <w:szCs w:val="24"/>
+              </w:rPr>
+              <w:t>m</w:t>
+            </w:r>
+          </w:p>
+        </w:tc>
+        <w:tc>
+          <w:tcPr>
+            <w:tcW w:w="2480" w:type="dxa"/>
+            <w:vAlign w:val="center"/>
+          </w:tcPr>
+          <w:p>
+            <w:pPr>
+              <w:rPr>
+                <w:rFonts w:ascii="Arial" w:hAnsi="Arial" w:cs="Arial"/>
+                <w:sz w:val="24"/>
+                <w:szCs w:val="24"/>
+              </w:rPr>
+            </w:pPr>
+            <w:r>
+              <w:rPr>
+                <w:rFonts w:ascii="Arial" w:hAnsi="Arial" w:cs="Arial"/>
+                <w:sz w:val="24"/>
+                <w:szCs w:val="24"/>
+              </w:rPr>
+              <w:t>Completado</w:t>
+            </w:r>
+          </w:p>
+        </w:tc>
+      </w:tr>
+      <w:tr>
+        <w:trPr>
+          <w:jc w:val="center"/>
+        </w:trPr>
+        <w:tc>
+          <w:tcPr>
+            <w:tcW w:w="2955" w:type="dxa"/>
+            <w:vAlign w:val="center"/>
+          </w:tcPr>
+          <w:p>
+            <w:pPr>
+              <w:rPr>
+                <w:rFonts w:ascii="Arial" w:hAnsi="Arial" w:cs="Arial"/>
+                <w:sz w:val="24"/>
+                <w:szCs w:val="24"/>
+              </w:rPr>
+            </w:pPr>
+            <w:r>
+              <w:rPr>
+                <w:rFonts w:ascii="Arial" w:hAnsi="Arial" w:cs="Arial"/>
+                <w:sz w:val="24"/>
+                <w:szCs w:val="24"/>
+              </w:rPr>
+              <w:t xml:space="preserve">Adición de archivos </w:t>
+            </w:r>
+            <w:proofErr w:type="spellStart"/>
+            <w:r>
+              <w:rPr>
+                <w:rFonts w:ascii="Arial" w:hAnsi="Arial" w:cs="Arial"/>
+                <w:sz w:val="24"/>
+                <w:szCs w:val="24"/>
+              </w:rPr>
+              <w:t>css</w:t>
+            </w:r>
+            <w:proofErr w:type="spellEnd"/>
+            <w:r>
+              <w:rPr>
+                <w:rFonts w:ascii="Arial" w:hAnsi="Arial" w:cs="Arial"/>
+                <w:sz w:val="24"/>
+                <w:szCs w:val="24"/>
+              </w:rPr>
+              <w:t xml:space="preserve"> del proyecto.</w:t>
+            </w:r>
+          </w:p>
+        </w:tc>
+        <w:tc>
+          <w:tcPr>
+            <w:tcW w:w="2004" w:type="dxa"/>
+            <w:vAlign w:val="center"/>
+          </w:tcPr>
+          <w:p>
+            <w:pPr>
+              <w:rPr>
+                <w:rFonts w:ascii="Arial" w:hAnsi="Arial" w:cs="Arial"/>
+                <w:sz w:val="24"/>
+                <w:szCs w:val="24"/>
+              </w:rPr>
+            </w:pPr>
+            <w:r>
+              <w:rPr>
+                <w:rFonts w:ascii="Arial" w:hAnsi="Arial" w:cs="Arial"/>
+                <w:sz w:val="24"/>
+                <w:szCs w:val="24"/>
+              </w:rPr>
+              <w:t>Leslie Miroslava Benítez Marín</w:t>
+            </w:r>
+          </w:p>
+        </w:tc>
+        <w:tc>
+          <w:tcPr>
+            <w:tcW w:w="1150" w:type="dxa"/>
+            <w:vAlign w:val="center"/>
+          </w:tcPr>
+          <w:p>
+            <w:pPr>
+              <w:rPr>
+                <w:rFonts w:ascii="Arial" w:hAnsi="Arial" w:cs="Arial"/>
+                <w:sz w:val="24"/>
+                <w:szCs w:val="24"/>
+              </w:rPr>
+            </w:pPr>
+            <w:r>
+              <w:rPr>
+                <w:rFonts w:ascii="Arial" w:hAnsi="Arial" w:cs="Arial"/>
+                <w:sz w:val="24"/>
+                <w:szCs w:val="24"/>
+              </w:rPr>
+              <w:t>8</w:t>
+            </w:r>
+            <w:r>
+              <w:rPr>
+                <w:rFonts w:ascii="Arial" w:hAnsi="Arial" w:cs="Arial"/>
+                <w:sz w:val="24"/>
+                <w:szCs w:val="24"/>
+              </w:rPr>
+              <w:t>:</w:t>
+            </w:r>
+            <w:r>
+              <w:rPr>
+                <w:rFonts w:ascii="Arial" w:hAnsi="Arial" w:cs="Arial"/>
+                <w:sz w:val="24"/>
+                <w:szCs w:val="24"/>
+              </w:rPr>
+              <w:t>0</w:t>
+            </w:r>
+            <w:r>
+              <w:rPr>
+                <w:rFonts w:ascii="Arial" w:hAnsi="Arial" w:cs="Arial"/>
+                <w:sz w:val="24"/>
+                <w:szCs w:val="24"/>
+              </w:rPr>
+              <w:t>0</w:t>
+            </w:r>
+            <w:r>
+              <w:rPr>
+                <w:rFonts w:ascii="Arial" w:hAnsi="Arial" w:cs="Arial"/>
+                <w:sz w:val="24"/>
+                <w:szCs w:val="24"/>
+              </w:rPr>
+              <w:t xml:space="preserve"> </w:t>
+            </w:r>
+            <w:r>
+              <w:rPr>
+                <w:rFonts w:ascii="Arial" w:hAnsi="Arial" w:cs="Arial"/>
+                <w:sz w:val="24"/>
+                <w:szCs w:val="24"/>
+              </w:rPr>
+              <w:t>a</w:t>
+            </w:r>
+            <w:r>
+              <w:rPr>
+                <w:rFonts w:ascii="Arial" w:hAnsi="Arial" w:cs="Arial"/>
+                <w:sz w:val="24"/>
+                <w:szCs w:val="24"/>
+              </w:rPr>
+              <w:t>m</w:t>
+            </w:r>
+          </w:p>
+        </w:tc>
+        <w:tc>
+          <w:tcPr>
+            <w:tcW w:w="1535" w:type="dxa"/>
+            <w:vAlign w:val="center"/>
+          </w:tcPr>
+          <w:p>
+            <w:pPr>
+              <w:rPr>
+                <w:rFonts w:ascii="Arial" w:hAnsi="Arial" w:cs="Arial"/>
+                <w:sz w:val="24"/>
+                <w:szCs w:val="24"/>
+              </w:rPr>
+            </w:pPr>
+            <w:r>
+              <w:rPr>
+                <w:rFonts w:ascii="Arial" w:hAnsi="Arial" w:cs="Arial"/>
+                <w:sz w:val="24"/>
+                <w:szCs w:val="24"/>
+              </w:rPr>
+              <w:t>9</w:t>
+            </w:r>
+            <w:r>
+              <w:rPr>
+                <w:rFonts w:ascii="Arial" w:hAnsi="Arial" w:cs="Arial"/>
+                <w:sz w:val="24"/>
+                <w:szCs w:val="24"/>
+              </w:rPr>
+              <w:t>:00</w:t>
+            </w:r>
+            <w:r>
+              <w:rPr>
+                <w:rFonts w:ascii="Arial" w:hAnsi="Arial" w:cs="Arial"/>
+                <w:sz w:val="24"/>
+                <w:szCs w:val="24"/>
+              </w:rPr>
+              <w:t xml:space="preserve"> </w:t>
+            </w:r>
+            <w:r>
+              <w:rPr>
+                <w:rFonts w:ascii="Arial" w:hAnsi="Arial" w:cs="Arial"/>
+                <w:sz w:val="24"/>
+                <w:szCs w:val="24"/>
+              </w:rPr>
+              <w:t>a</w:t>
+            </w:r>
+            <w:r>
+              <w:rPr>
+                <w:rFonts w:ascii="Arial" w:hAnsi="Arial" w:cs="Arial"/>
+                <w:sz w:val="24"/>
+                <w:szCs w:val="24"/>
+              </w:rPr>
+              <w:t>m</w:t>
+            </w:r>
+          </w:p>
+        </w:tc>
+        <w:tc>
+          <w:tcPr>
+            <w:tcW w:w="2480" w:type="dxa"/>
+            <w:vAlign w:val="center"/>
+          </w:tcPr>
+          <w:p>
+            <w:pPr>
+              <w:rPr>
+                <w:rFonts w:ascii="Arial" w:hAnsi="Arial" w:cs="Arial"/>
+                <w:sz w:val="24"/>
+                <w:szCs w:val="24"/>
+              </w:rPr>
+            </w:pPr>
+            <w:r>
+              <w:rPr>
+                <w:rFonts w:ascii="Arial" w:hAnsi="Arial" w:cs="Arial"/>
+                <w:sz w:val="24"/>
+                <w:szCs w:val="24"/>
+              </w:rPr>
+              <w:t>Completado</w:t>
+            </w:r>
+          </w:p>
+        </w:tc>
+      </w:tr>
+      <w:tr>
+        <w:trPr>
+          <w:jc w:val="center"/>
+        </w:trPr>
+        <w:tc>
+          <w:tcPr>
+            <w:tcW w:w="2955" w:type="dxa"/>
+            <w:vAlign w:val="center"/>
+          </w:tcPr>
+          <w:p>
+            <w:pPr>
+              <w:rPr>
+                <w:rFonts w:ascii="Arial" w:hAnsi="Arial" w:cs="Arial"/>
+                <w:sz w:val="24"/>
+                <w:szCs w:val="24"/>
+              </w:rPr>
+            </w:pPr>
+            <w:r>
+              <w:rPr>
+                <w:rFonts w:ascii="Arial" w:hAnsi="Arial" w:cs="Arial"/>
+                <w:sz w:val="24"/>
+                <w:szCs w:val="24"/>
+              </w:rPr>
+              <w:lastRenderedPageBreak/>
+              <w:t>Puntos de Función</w:t>
+            </w:r>
+          </w:p>
+        </w:tc>
+        <w:tc>
+          <w:tcPr>
+            <w:tcW w:w="2004" w:type="dxa"/>
+            <w:vAlign w:val="center"/>
+          </w:tcPr>
+          <w:p>
+            <w:pPr>
+              <w:rPr>
+                <w:rFonts w:ascii="Arial" w:hAnsi="Arial" w:cs="Arial"/>
+                <w:sz w:val="24"/>
+                <w:szCs w:val="24"/>
+              </w:rPr>
+            </w:pPr>
+            <w:r>
+              <w:rPr>
+                <w:rFonts w:ascii="Arial" w:hAnsi="Arial" w:cs="Arial"/>
+                <w:sz w:val="24"/>
+                <w:szCs w:val="24"/>
+              </w:rPr>
+              <w:t>Leonardo Merino Garfias</w:t>
+            </w:r>
+          </w:p>
+        </w:tc>
+        <w:tc>
+          <w:tcPr>
+            <w:tcW w:w="1150" w:type="dxa"/>
+            <w:vAlign w:val="center"/>
+          </w:tcPr>
+          <w:p>
+            <w:pPr>
+              <w:rPr>
+                <w:rFonts w:ascii="Arial" w:hAnsi="Arial" w:cs="Arial"/>
+                <w:sz w:val="24"/>
+                <w:szCs w:val="24"/>
+              </w:rPr>
+            </w:pPr>
+            <w:r>
+              <w:rPr>
+                <w:rFonts w:ascii="Arial" w:hAnsi="Arial" w:cs="Arial"/>
+                <w:sz w:val="24"/>
+                <w:szCs w:val="24"/>
+              </w:rPr>
+              <w:t>8</w:t>
+            </w:r>
+            <w:r>
+              <w:rPr>
+                <w:rFonts w:ascii="Arial" w:hAnsi="Arial" w:cs="Arial"/>
+                <w:sz w:val="24"/>
+                <w:szCs w:val="24"/>
+              </w:rPr>
+              <w:t>:</w:t>
+            </w:r>
+            <w:r>
+              <w:rPr>
+                <w:rFonts w:ascii="Arial" w:hAnsi="Arial" w:cs="Arial"/>
+                <w:sz w:val="24"/>
+                <w:szCs w:val="24"/>
+              </w:rPr>
+              <w:t>0</w:t>
+            </w:r>
+            <w:r>
+              <w:rPr>
+                <w:rFonts w:ascii="Arial" w:hAnsi="Arial" w:cs="Arial"/>
+                <w:sz w:val="24"/>
+                <w:szCs w:val="24"/>
+              </w:rPr>
+              <w:t>0</w:t>
+            </w:r>
+            <w:r>
+              <w:rPr>
+                <w:rFonts w:ascii="Arial" w:hAnsi="Arial" w:cs="Arial"/>
+                <w:sz w:val="24"/>
+                <w:szCs w:val="24"/>
+              </w:rPr>
+              <w:t>a</w:t>
+            </w:r>
+            <w:r>
+              <w:rPr>
+                <w:rFonts w:ascii="Arial" w:hAnsi="Arial" w:cs="Arial"/>
+                <w:sz w:val="24"/>
+                <w:szCs w:val="24"/>
+              </w:rPr>
+              <w:t>m</w:t>
+            </w:r>
+          </w:p>
+        </w:tc>
+        <w:tc>
+          <w:tcPr>
+            <w:tcW w:w="1535" w:type="dxa"/>
+            <w:vAlign w:val="center"/>
+          </w:tcPr>
+          <w:p>
+            <w:pPr>
+              <w:rPr>
+                <w:rFonts w:ascii="Arial" w:hAnsi="Arial" w:cs="Arial"/>
+                <w:sz w:val="24"/>
+                <w:szCs w:val="24"/>
+              </w:rPr>
+            </w:pPr>
+            <w:r>
+              <w:rPr>
+                <w:rFonts w:ascii="Arial" w:hAnsi="Arial" w:cs="Arial"/>
+                <w:sz w:val="24"/>
+                <w:szCs w:val="24"/>
+              </w:rPr>
+              <w:t>9</w:t>
+            </w:r>
+            <w:r>
+              <w:rPr>
+                <w:rFonts w:ascii="Arial" w:hAnsi="Arial" w:cs="Arial"/>
+                <w:sz w:val="24"/>
+                <w:szCs w:val="24"/>
+              </w:rPr>
+              <w:t>:00</w:t>
+            </w:r>
+            <w:r>
+              <w:rPr>
+                <w:rFonts w:ascii="Arial" w:hAnsi="Arial" w:cs="Arial"/>
+                <w:sz w:val="24"/>
+                <w:szCs w:val="24"/>
+              </w:rPr>
+              <w:t>a</w:t>
+            </w:r>
+            <w:r>
+              <w:rPr>
+                <w:rFonts w:ascii="Arial" w:hAnsi="Arial" w:cs="Arial"/>
+                <w:sz w:val="24"/>
+                <w:szCs w:val="24"/>
+              </w:rPr>
+              <w:t>m</w:t>
+            </w:r>
+          </w:p>
+        </w:tc>
+        <w:tc>
+          <w:tcPr>
+            <w:tcW w:w="2480" w:type="dxa"/>
+            <w:vAlign w:val="center"/>
+          </w:tcPr>
+          <w:p>
+            <w:pPr>
+              <w:rPr>
+                <w:rFonts w:ascii="Arial" w:hAnsi="Arial" w:cs="Arial"/>
+                <w:sz w:val="24"/>
+                <w:szCs w:val="24"/>
+              </w:rPr>
+            </w:pPr>
+            <w:r>
+              <w:rPr>
+                <w:rFonts w:ascii="Arial" w:hAnsi="Arial" w:cs="Arial"/>
+                <w:sz w:val="24"/>
+                <w:szCs w:val="24"/>
+              </w:rPr>
+              <w:t>Completado</w:t>
+            </w:r>
+          </w:p>
+        </w:tc>
+      </w:tr>
+    </w:tbl>
+    <w:p/>
+    <w:p>
+      <w:pPr>
+        <w:pStyle w:val="titulo1"/>
+        <w:outlineLvl w:val="2"/>
+      </w:pPr>
+      <w:bookmarkStart w:id="50" w:name="_Toc229984892"/>
+      <w:r>
+        <w:rPr>
+          <w:sz w:val="32"/>
+          <w:szCs w:val="32"/>
+        </w:rPr>
+        <w:t>Gestión de Riesgos e Incidencias</w:t>
+      </w:r>
+      <w:bookmarkEnd w:id="50"/>
+    </w:p>
+    <w:tbl>
+      <w:tblPr>
+        <w:tblStyle w:val="Tablaconcuadrcula"/>
+        <w:tblW w:w="0" w:type="auto"/>
+        <w:jc w:val="center"/>
+        <w:tblBorders>
+          <w:top w:val="single" w:sz="4" w:space="0" w:color="7F7F7F" w:themeColor="text1" w:themeTint="80"/>
+          <w:left w:val="single" w:sz="4" w:space="0" w:color="7F7F7F" w:themeColor="text1" w:themeTint="80"/>
+          <w:bottom w:val="single" w:sz="4" w:space="0" w:color="7F7F7F" w:themeColor="text1" w:themeTint="80"/>
+          <w:right w:val="single" w:sz="4" w:space="0" w:color="7F7F7F" w:themeColor="text1" w:themeTint="80"/>
+          <w:insideH w:val="single" w:sz="4" w:space="0" w:color="7F7F7F" w:themeColor="text1" w:themeTint="80"/>
+          <w:insideV w:val="single" w:sz="4" w:space="0" w:color="7F7F7F" w:themeColor="text1" w:themeTint="80"/>
+        </w:tblBorders>
+        <w:tblLook w:val="04A0" w:firstRow="1" w:lastRow="0" w:firstColumn="1" w:lastColumn="0" w:noHBand="0" w:noVBand="1"/>
+      </w:tblPr>
+      <w:tblGrid>
+        <w:gridCol w:w="2834"/>
+        <w:gridCol w:w="2924"/>
+        <w:gridCol w:w="3592"/>
+      </w:tblGrid>
+      <w:tr>
+        <w:trPr>
+          <w:trHeight w:val="300"/>
+          <w:jc w:val="center"/>
+        </w:trPr>
+        <w:tc>
+          <w:tcPr>
+            <w:tcW w:w="2942" w:type="dxa"/>
+            <w:shd w:val="clear" w:color="auto" w:fill="262626" w:themeFill="text1" w:themeFillTint="D9"/>
+            <w:vAlign w:val="center"/>
+          </w:tcPr>
+          <w:p>
+            <w:pPr>
+              <w:jc w:val="center"/>
+              <w:rPr>
+                <w:rFonts w:ascii="Arial" w:hAnsi="Arial" w:cs="Arial"/>
+                <w:b/>
+                <w:bCs/>
+                <w:sz w:val="24"/>
+                <w:szCs w:val="24"/>
+              </w:rPr>
+            </w:pPr>
+            <w:r>
+              <w:rPr>
+                <w:rFonts w:ascii="Arial" w:hAnsi="Arial" w:cs="Arial"/>
+                <w:b/>
+                <w:bCs/>
+                <w:sz w:val="24"/>
+                <w:szCs w:val="24"/>
+              </w:rPr>
+              <w:t>Riesgo / Problema detectado</w:t>
+            </w:r>
+          </w:p>
+        </w:tc>
+        <w:tc>
+          <w:tcPr>
+            <w:tcW w:w="2943" w:type="dxa"/>
+            <w:shd w:val="clear" w:color="auto" w:fill="262626" w:themeFill="text1" w:themeFillTint="D9"/>
+            <w:vAlign w:val="center"/>
+          </w:tcPr>
+          <w:p>
+            <w:pPr>
+              <w:jc w:val="center"/>
+              <w:rPr>
+                <w:rFonts w:ascii="Arial" w:hAnsi="Arial" w:cs="Arial"/>
+                <w:b/>
+                <w:bCs/>
+                <w:sz w:val="24"/>
+                <w:szCs w:val="24"/>
+              </w:rPr>
+            </w:pPr>
+            <w:r>
+              <w:rPr>
+                <w:rFonts w:ascii="Arial" w:hAnsi="Arial" w:cs="Arial"/>
+                <w:b/>
+                <w:bCs/>
+                <w:sz w:val="24"/>
+                <w:szCs w:val="24"/>
+              </w:rPr>
+              <w:t>Impacto en alcance/tiempo/costo</w:t>
+            </w:r>
+          </w:p>
+        </w:tc>
+        <w:tc>
+          <w:tcPr>
+            <w:tcW w:w="3749" w:type="dxa"/>
+            <w:shd w:val="clear" w:color="auto" w:fill="262626" w:themeFill="text1" w:themeFillTint="D9"/>
+            <w:vAlign w:val="center"/>
+          </w:tcPr>
+          <w:p>
+            <w:pPr>
+              <w:jc w:val="center"/>
+              <w:rPr>
+                <w:rFonts w:ascii="Arial" w:hAnsi="Arial" w:cs="Arial"/>
+                <w:b/>
+                <w:bCs/>
+                <w:sz w:val="24"/>
+                <w:szCs w:val="24"/>
+              </w:rPr>
+            </w:pPr>
+            <w:r>
+              <w:rPr>
+                <w:rFonts w:ascii="Arial" w:hAnsi="Arial" w:cs="Arial"/>
+                <w:b/>
+                <w:bCs/>
+                <w:sz w:val="24"/>
+                <w:szCs w:val="24"/>
+              </w:rPr>
+              <w:t>Acción correctiva o preventiva</w:t>
+            </w:r>
+          </w:p>
+        </w:tc>
+      </w:tr>
+      <w:tr>
+        <w:trPr>
+          <w:trHeight w:val="300"/>
+          <w:jc w:val="center"/>
+        </w:trPr>
+        <w:tc>
+          <w:tcPr>
+            <w:tcW w:w="2942" w:type="dxa"/>
+            <w:vAlign w:val="center"/>
+          </w:tcPr>
+          <w:p>
+            <w:pPr>
+              <w:rPr>
+                <w:rFonts w:ascii="Arial" w:hAnsi="Arial" w:cs="Arial"/>
+                <w:sz w:val="24"/>
+                <w:szCs w:val="24"/>
+              </w:rPr>
+            </w:pPr>
+            <w:r>
+              <w:rPr>
+                <w:rFonts w:ascii="Arial" w:hAnsi="Arial" w:cs="Arial"/>
+                <w:sz w:val="24"/>
+                <w:szCs w:val="24"/>
+              </w:rPr>
+              <w:t>--</w:t>
+            </w:r>
+          </w:p>
+        </w:tc>
+        <w:tc>
+          <w:tcPr>
+            <w:tcW w:w="2943" w:type="dxa"/>
+            <w:vAlign w:val="center"/>
+          </w:tcPr>
+          <w:p>
+            <w:pPr>
+              <w:jc w:val="center"/>
+              <w:rPr>
+                <w:rFonts w:ascii="Arial" w:hAnsi="Arial" w:cs="Arial"/>
+                <w:sz w:val="24"/>
+                <w:szCs w:val="24"/>
+              </w:rPr>
+            </w:pPr>
+            <w:r>
+              <w:rPr>
+                <w:rFonts w:ascii="Arial" w:hAnsi="Arial" w:cs="Arial"/>
+                <w:sz w:val="24"/>
+                <w:szCs w:val="24"/>
+              </w:rPr>
+              <w:t>--</w:t>
+            </w:r>
+          </w:p>
+        </w:tc>
+        <w:tc>
+          <w:tcPr>
+            <w:tcW w:w="3749" w:type="dxa"/>
+            <w:vAlign w:val="center"/>
+          </w:tcPr>
+          <w:p>
+            <w:r>
+              <w:rPr>
+                <w:rFonts w:ascii="Arial" w:hAnsi="Arial" w:cs="Arial"/>
+                <w:sz w:val="24"/>
+                <w:szCs w:val="24"/>
+              </w:rPr>
+              <w:t>--</w:t>
+            </w:r>
+          </w:p>
+        </w:tc>
+      </w:tr>
+    </w:tbl>
+    <w:p/>
     <w:p/>
     <w:p>
       <w:r>
@@ -28297,12 +30894,12 @@
         <w:jc w:val="both"/>
         <w:outlineLvl w:val="0"/>
       </w:pPr>
-      <w:bookmarkStart w:id="46" w:name="_Toc229639278"/>
+      <w:bookmarkStart w:id="51" w:name="_Toc229984893"/>
       <w:r>
         <w:lastRenderedPageBreak/>
         <w:t>Referencias</w:t>
       </w:r>
-      <w:bookmarkEnd w:id="46"/>
+      <w:bookmarkEnd w:id="51"/>
     </w:p>
     <w:p>
       <w:pPr>
@@ -31562,7 +34159,7 @@
   <w:style w:type="paragraph" w:default="1" w:styleId="Normal">
     <w:name w:val="Normal"/>
     <w:qFormat/>
-    <w:rsid w:val="009E2F7A"/>
+    <w:rsid w:val="005003E9"/>
   </w:style>
   <w:style w:type="paragraph" w:styleId="Ttulo1">
     <w:name w:val="heading 1"/>

</xml_diff>

<commit_message>
:pencil2: Añadiento Puntos de Función finales
</commit_message>
<xml_diff>
--- a/BITACORA.docx
+++ b/BITACORA.docx
@@ -30882,6 +30882,2086 @@
       </w:tr>
     </w:tbl>
     <w:p/>
+    <w:p/>
+    <w:p>
+      <w:r>
+        <w:br w:type="page"/>
+      </w:r>
+    </w:p>
+    <w:tbl>
+      <w:tblPr>
+        <w:tblStyle w:val="Tablaconcuadrcula"/>
+        <w:tblW w:w="9634" w:type="dxa"/>
+        <w:jc w:val="center"/>
+        <w:tblBorders>
+          <w:top w:val="single" w:sz="4" w:space="0" w:color="7F7F7F" w:themeColor="text1" w:themeTint="80"/>
+          <w:left w:val="single" w:sz="4" w:space="0" w:color="7F7F7F" w:themeColor="text1" w:themeTint="80"/>
+          <w:bottom w:val="single" w:sz="4" w:space="0" w:color="7F7F7F" w:themeColor="text1" w:themeTint="80"/>
+          <w:right w:val="single" w:sz="4" w:space="0" w:color="7F7F7F" w:themeColor="text1" w:themeTint="80"/>
+          <w:insideH w:val="single" w:sz="4" w:space="0" w:color="7F7F7F" w:themeColor="text1" w:themeTint="80"/>
+        </w:tblBorders>
+        <w:tblCellMar>
+          <w:top w:w="57" w:type="dxa"/>
+          <w:bottom w:w="57" w:type="dxa"/>
+        </w:tblCellMar>
+        <w:tblLook w:val="04A0" w:firstRow="1" w:lastRow="0" w:firstColumn="1" w:lastColumn="0" w:noHBand="0" w:noVBand="1"/>
+      </w:tblPr>
+      <w:tblGrid>
+        <w:gridCol w:w="5098"/>
+        <w:gridCol w:w="4536"/>
+      </w:tblGrid>
+      <w:tr>
+        <w:trPr>
+          <w:trHeight w:val="583"/>
+          <w:jc w:val="center"/>
+        </w:trPr>
+        <w:tc>
+          <w:tcPr>
+            <w:tcW w:w="9634" w:type="dxa"/>
+            <w:gridSpan w:val="2"/>
+            <w:shd w:val="clear" w:color="auto" w:fill="262626" w:themeFill="text1" w:themeFillTint="D9"/>
+            <w:vAlign w:val="center"/>
+          </w:tcPr>
+          <w:p>
+            <w:pPr>
+              <w:pStyle w:val="Ttulo2"/>
+              <w:rPr>
+                <w:rFonts w:ascii="Aptos" w:hAnsi="Aptos"/>
+                <w:b/>
+                <w:bCs/>
+                <w:color w:val="FFFFFF" w:themeColor="background1"/>
+                <w:sz w:val="28"/>
+                <w:szCs w:val="28"/>
+              </w:rPr>
+            </w:pPr>
+            <w:r>
+              <w:rPr>
+                <w:rFonts w:ascii="Aptos" w:hAnsi="Aptos"/>
+                <w:b/>
+                <w:bCs/>
+                <w:color w:val="FFFFFF" w:themeColor="background1"/>
+                <w:sz w:val="28"/>
+                <w:szCs w:val="28"/>
+              </w:rPr>
+              <w:lastRenderedPageBreak/>
+              <w:t xml:space="preserve">Día </w:t>
+            </w:r>
+            <w:r>
+              <w:rPr>
+                <w:rFonts w:ascii="Aptos" w:hAnsi="Aptos"/>
+                <w:b/>
+                <w:bCs/>
+                <w:color w:val="FFFFFF" w:themeColor="background1"/>
+                <w:sz w:val="28"/>
+                <w:szCs w:val="28"/>
+              </w:rPr>
+              <w:t>2</w:t>
+            </w:r>
+            <w:r>
+              <w:rPr>
+                <w:rFonts w:ascii="Aptos" w:hAnsi="Aptos"/>
+                <w:b/>
+                <w:bCs/>
+                <w:color w:val="FFFFFF" w:themeColor="background1"/>
+                <w:sz w:val="28"/>
+                <w:szCs w:val="28"/>
+              </w:rPr>
+              <w:t>: Realizar Puntos de Función</w:t>
+            </w:r>
+          </w:p>
+        </w:tc>
+      </w:tr>
+      <w:tr>
+        <w:trPr>
+          <w:jc w:val="center"/>
+        </w:trPr>
+        <w:tc>
+          <w:tcPr>
+            <w:tcW w:w="9634" w:type="dxa"/>
+            <w:gridSpan w:val="2"/>
+            <w:vAlign w:val="center"/>
+          </w:tcPr>
+          <w:p>
+            <w:pPr>
+              <w:rPr>
+                <w:rFonts w:ascii="Arial" w:hAnsi="Arial" w:cs="Arial"/>
+                <w:sz w:val="24"/>
+                <w:szCs w:val="24"/>
+              </w:rPr>
+            </w:pPr>
+            <w:r>
+              <w:rPr>
+                <w:rFonts w:ascii="Arial" w:hAnsi="Arial" w:cs="Arial"/>
+                <w:b/>
+                <w:bCs/>
+                <w:sz w:val="24"/>
+                <w:szCs w:val="24"/>
+              </w:rPr>
+              <w:t xml:space="preserve">Nombre del Proyecto: </w:t>
+            </w:r>
+            <w:r>
+              <w:rPr>
+                <w:rFonts w:ascii="Arial" w:hAnsi="Arial" w:cs="Arial"/>
+                <w:sz w:val="24"/>
+                <w:szCs w:val="24"/>
+              </w:rPr>
+              <w:t>Portafolio Digital de Arquitecto</w:t>
+            </w:r>
+          </w:p>
+        </w:tc>
+      </w:tr>
+      <w:tr>
+        <w:trPr>
+          <w:jc w:val="center"/>
+        </w:trPr>
+        <w:tc>
+          <w:tcPr>
+            <w:tcW w:w="5098" w:type="dxa"/>
+            <w:vAlign w:val="center"/>
+          </w:tcPr>
+          <w:p>
+            <w:pPr>
+              <w:rPr>
+                <w:rFonts w:ascii="Arial" w:hAnsi="Arial" w:cs="Arial"/>
+                <w:b/>
+                <w:bCs/>
+                <w:sz w:val="24"/>
+                <w:szCs w:val="24"/>
+              </w:rPr>
+            </w:pPr>
+            <w:r>
+              <w:rPr>
+                <w:rFonts w:ascii="Arial" w:hAnsi="Arial" w:cs="Arial"/>
+                <w:b/>
+                <w:bCs/>
+                <w:sz w:val="24"/>
+                <w:szCs w:val="24"/>
+              </w:rPr>
+              <w:t xml:space="preserve">Equipo No.: </w:t>
+            </w:r>
+            <w:r>
+              <w:rPr>
+                <w:rFonts w:ascii="Arial" w:hAnsi="Arial" w:cs="Arial"/>
+                <w:b/>
+                <w:bCs/>
+                <w:sz w:val="24"/>
+                <w:szCs w:val="24"/>
+              </w:rPr>
+              <w:tab/>
+            </w:r>
+            <w:r>
+              <w:rPr>
+                <w:rFonts w:ascii="Arial" w:hAnsi="Arial" w:cs="Arial"/>
+                <w:sz w:val="24"/>
+                <w:szCs w:val="24"/>
+              </w:rPr>
+              <w:t>6</w:t>
+            </w:r>
+          </w:p>
+        </w:tc>
+        <w:tc>
+          <w:tcPr>
+            <w:tcW w:w="4536" w:type="dxa"/>
+            <w:vAlign w:val="center"/>
+          </w:tcPr>
+          <w:p>
+            <w:pPr>
+              <w:rPr>
+                <w:rFonts w:ascii="Arial" w:hAnsi="Arial" w:cs="Arial"/>
+                <w:b/>
+                <w:bCs/>
+                <w:sz w:val="24"/>
+                <w:szCs w:val="24"/>
+              </w:rPr>
+            </w:pPr>
+            <w:r>
+              <w:rPr>
+                <w:rFonts w:ascii="Arial" w:hAnsi="Arial" w:cs="Arial"/>
+                <w:b/>
+                <w:bCs/>
+                <w:sz w:val="24"/>
+                <w:szCs w:val="24"/>
+              </w:rPr>
+              <w:t>Fecha:</w:t>
+            </w:r>
+            <w:r>
+              <w:rPr>
+                <w:rFonts w:ascii="Arial" w:hAnsi="Arial" w:cs="Arial"/>
+                <w:b/>
+                <w:bCs/>
+                <w:sz w:val="24"/>
+                <w:szCs w:val="24"/>
+              </w:rPr>
+              <w:t xml:space="preserve"> </w:t>
+            </w:r>
+            <w:r>
+              <w:rPr>
+                <w:rFonts w:ascii="Arial" w:hAnsi="Arial" w:cs="Arial"/>
+                <w:sz w:val="24"/>
+                <w:szCs w:val="24"/>
+              </w:rPr>
+              <w:t>1</w:t>
+            </w:r>
+            <w:r>
+              <w:rPr>
+                <w:rFonts w:ascii="Arial" w:hAnsi="Arial" w:cs="Arial"/>
+                <w:sz w:val="24"/>
+                <w:szCs w:val="24"/>
+              </w:rPr>
+              <w:t>9</w:t>
+            </w:r>
+            <w:r>
+              <w:rPr>
+                <w:rFonts w:ascii="Arial" w:hAnsi="Arial" w:cs="Arial"/>
+                <w:sz w:val="24"/>
+                <w:szCs w:val="24"/>
+              </w:rPr>
+              <w:t>/0</w:t>
+            </w:r>
+            <w:r>
+              <w:rPr>
+                <w:rFonts w:ascii="Arial" w:hAnsi="Arial" w:cs="Arial"/>
+                <w:sz w:val="24"/>
+                <w:szCs w:val="24"/>
+              </w:rPr>
+              <w:t>5</w:t>
+            </w:r>
+            <w:r>
+              <w:rPr>
+                <w:rFonts w:ascii="Arial" w:hAnsi="Arial" w:cs="Arial"/>
+                <w:sz w:val="24"/>
+                <w:szCs w:val="24"/>
+              </w:rPr>
+              <w:t>/202</w:t>
+            </w:r>
+            <w:r>
+              <w:rPr>
+                <w:rFonts w:ascii="Arial" w:hAnsi="Arial" w:cs="Arial"/>
+                <w:sz w:val="24"/>
+                <w:szCs w:val="24"/>
+              </w:rPr>
+              <w:t>6</w:t>
+            </w:r>
+          </w:p>
+        </w:tc>
+      </w:tr>
+      <w:tr>
+        <w:trPr>
+          <w:jc w:val="center"/>
+        </w:trPr>
+        <w:tc>
+          <w:tcPr>
+            <w:tcW w:w="5098" w:type="dxa"/>
+            <w:vAlign w:val="center"/>
+          </w:tcPr>
+          <w:p>
+            <w:pPr>
+              <w:rPr>
+                <w:rFonts w:ascii="Arial" w:hAnsi="Arial" w:cs="Arial"/>
+                <w:b/>
+                <w:bCs/>
+                <w:sz w:val="24"/>
+                <w:szCs w:val="24"/>
+              </w:rPr>
+            </w:pPr>
+            <w:r>
+              <w:rPr>
+                <w:rFonts w:ascii="Arial" w:hAnsi="Arial" w:cs="Arial"/>
+                <w:b/>
+                <w:bCs/>
+                <w:sz w:val="24"/>
+                <w:szCs w:val="24"/>
+              </w:rPr>
+              <w:t xml:space="preserve">Número de sesión / Día de trabajo: </w:t>
+            </w:r>
+            <w:r>
+              <w:rPr>
+                <w:rFonts w:ascii="Arial" w:hAnsi="Arial" w:cs="Arial"/>
+                <w:sz w:val="24"/>
+                <w:szCs w:val="24"/>
+              </w:rPr>
+              <w:t>1</w:t>
+            </w:r>
+          </w:p>
+        </w:tc>
+        <w:tc>
+          <w:tcPr>
+            <w:tcW w:w="4536" w:type="dxa"/>
+            <w:vAlign w:val="center"/>
+          </w:tcPr>
+          <w:p>
+            <w:pPr>
+              <w:rPr>
+                <w:rFonts w:ascii="Arial" w:hAnsi="Arial" w:cs="Arial"/>
+                <w:b/>
+                <w:bCs/>
+                <w:sz w:val="24"/>
+                <w:szCs w:val="24"/>
+              </w:rPr>
+            </w:pPr>
+            <w:r>
+              <w:rPr>
+                <w:rFonts w:ascii="Arial" w:hAnsi="Arial" w:cs="Arial"/>
+                <w:b/>
+                <w:bCs/>
+                <w:sz w:val="24"/>
+                <w:szCs w:val="24"/>
+              </w:rPr>
+              <w:t xml:space="preserve">Modalidad: </w:t>
+            </w:r>
+            <w:r>
+              <w:rPr>
+                <w:rFonts w:ascii="Arial" w:hAnsi="Arial" w:cs="Arial"/>
+                <w:sz w:val="24"/>
+                <w:szCs w:val="24"/>
+                <w:shd w:val="clear" w:color="auto" w:fill="F5E4A9" w:themeFill="accent3" w:themeFillTint="66"/>
+              </w:rPr>
+              <w:t>Presencial</w:t>
+            </w:r>
+            <w:r>
+              <w:rPr>
+                <w:rFonts w:ascii="Arial" w:hAnsi="Arial" w:cs="Arial"/>
+                <w:sz w:val="24"/>
+                <w:szCs w:val="24"/>
+              </w:rPr>
+              <w:t xml:space="preserve"> / </w:t>
+            </w:r>
+            <w:r>
+              <w:rPr>
+                <w:rFonts w:ascii="Arial" w:hAnsi="Arial" w:cs="Arial"/>
+                <w:sz w:val="24"/>
+                <w:szCs w:val="24"/>
+              </w:rPr>
+              <w:t>Virtual</w:t>
+            </w:r>
+            <w:r>
+              <w:rPr>
+                <w:rFonts w:ascii="Arial" w:hAnsi="Arial" w:cs="Arial"/>
+                <w:sz w:val="24"/>
+                <w:szCs w:val="24"/>
+              </w:rPr>
+              <w:t xml:space="preserve"> / </w:t>
+            </w:r>
+            <w:r>
+              <w:rPr>
+                <w:rFonts w:ascii="Arial" w:hAnsi="Arial" w:cs="Arial"/>
+                <w:sz w:val="24"/>
+                <w:szCs w:val="24"/>
+              </w:rPr>
+              <w:t>Mixto</w:t>
+            </w:r>
+          </w:p>
+        </w:tc>
+      </w:tr>
+      <w:tr>
+        <w:trPr>
+          <w:jc w:val="center"/>
+        </w:trPr>
+        <w:tc>
+          <w:tcPr>
+            <w:tcW w:w="9634" w:type="dxa"/>
+            <w:gridSpan w:val="2"/>
+            <w:vAlign w:val="center"/>
+          </w:tcPr>
+          <w:p>
+            <w:pPr>
+              <w:rPr>
+                <w:rFonts w:ascii="Arial" w:hAnsi="Arial" w:cs="Arial"/>
+                <w:b/>
+                <w:bCs/>
+                <w:sz w:val="24"/>
+                <w:szCs w:val="24"/>
+              </w:rPr>
+            </w:pPr>
+            <w:r>
+              <w:rPr>
+                <w:rFonts w:ascii="Arial" w:hAnsi="Arial" w:cs="Arial"/>
+                <w:b/>
+                <w:bCs/>
+                <w:sz w:val="24"/>
+                <w:szCs w:val="24"/>
+              </w:rPr>
+              <w:t>Duración de la sesión:</w:t>
+            </w:r>
+            <w:r>
+              <w:rPr>
+                <w:rFonts w:ascii="Arial" w:hAnsi="Arial" w:cs="Arial"/>
+                <w:b/>
+                <w:bCs/>
+                <w:sz w:val="24"/>
+                <w:szCs w:val="24"/>
+              </w:rPr>
+              <w:t xml:space="preserve"> </w:t>
+            </w:r>
+            <w:r>
+              <w:rPr>
+                <w:rFonts w:ascii="Arial" w:hAnsi="Arial" w:cs="Arial"/>
+                <w:sz w:val="24"/>
+                <w:szCs w:val="24"/>
+              </w:rPr>
+              <w:t xml:space="preserve">50 min. </w:t>
+            </w:r>
+          </w:p>
+        </w:tc>
+      </w:tr>
+    </w:tbl>
+    <w:p>
+      <w:pPr>
+        <w:rPr>
+          <w:rFonts w:ascii="Arial" w:hAnsi="Arial" w:cs="Arial"/>
+          <w:sz w:val="24"/>
+          <w:szCs w:val="24"/>
+        </w:rPr>
+      </w:pPr>
+    </w:p>
+    <w:p>
+      <w:pPr>
+        <w:pStyle w:val="titulo1"/>
+        <w:outlineLvl w:val="2"/>
+        <w:rPr>
+          <w:sz w:val="32"/>
+          <w:szCs w:val="72"/>
+        </w:rPr>
+      </w:pPr>
+      <w:r>
+        <w:rPr>
+          <w:sz w:val="32"/>
+          <w:szCs w:val="72"/>
+        </w:rPr>
+        <w:t>Asistencia y Participación</w:t>
+      </w:r>
+    </w:p>
+    <w:tbl>
+      <w:tblPr>
+        <w:tblStyle w:val="Tablaconcuadrcula"/>
+        <w:tblW w:w="10281" w:type="dxa"/>
+        <w:jc w:val="center"/>
+        <w:tblBorders>
+          <w:top w:val="single" w:sz="4" w:space="0" w:color="7F7F7F" w:themeColor="text1" w:themeTint="80"/>
+          <w:left w:val="single" w:sz="4" w:space="0" w:color="7F7F7F" w:themeColor="text1" w:themeTint="80"/>
+          <w:bottom w:val="single" w:sz="4" w:space="0" w:color="7F7F7F" w:themeColor="text1" w:themeTint="80"/>
+          <w:right w:val="single" w:sz="4" w:space="0" w:color="7F7F7F" w:themeColor="text1" w:themeTint="80"/>
+          <w:insideH w:val="single" w:sz="4" w:space="0" w:color="7F7F7F" w:themeColor="text1" w:themeTint="80"/>
+          <w:insideV w:val="single" w:sz="4" w:space="0" w:color="7F7F7F" w:themeColor="text1" w:themeTint="80"/>
+        </w:tblBorders>
+        <w:tblCellMar>
+          <w:top w:w="57" w:type="dxa"/>
+          <w:bottom w:w="57" w:type="dxa"/>
+        </w:tblCellMar>
+        <w:tblLook w:val="04A0" w:firstRow="1" w:lastRow="0" w:firstColumn="1" w:lastColumn="0" w:noHBand="0" w:noVBand="1"/>
+      </w:tblPr>
+      <w:tblGrid>
+        <w:gridCol w:w="1538"/>
+        <w:gridCol w:w="1791"/>
+        <w:gridCol w:w="1563"/>
+        <w:gridCol w:w="3061"/>
+        <w:gridCol w:w="2328"/>
+      </w:tblGrid>
+      <w:tr>
+        <w:trPr>
+          <w:jc w:val="center"/>
+        </w:trPr>
+        <w:tc>
+          <w:tcPr>
+            <w:tcW w:w="1538" w:type="dxa"/>
+            <w:shd w:val="clear" w:color="auto" w:fill="262626" w:themeFill="text1" w:themeFillTint="D9"/>
+            <w:vAlign w:val="center"/>
+          </w:tcPr>
+          <w:p>
+            <w:pPr>
+              <w:jc w:val="center"/>
+              <w:rPr>
+                <w:rFonts w:ascii="Arial" w:hAnsi="Arial" w:cs="Arial"/>
+                <w:b/>
+                <w:bCs/>
+                <w:sz w:val="24"/>
+                <w:szCs w:val="24"/>
+              </w:rPr>
+            </w:pPr>
+            <w:r>
+              <w:rPr>
+                <w:rFonts w:ascii="Arial" w:hAnsi="Arial" w:cs="Arial"/>
+                <w:b/>
+                <w:bCs/>
+                <w:sz w:val="24"/>
+                <w:szCs w:val="24"/>
+              </w:rPr>
+              <w:t>Integrante</w:t>
+            </w:r>
+          </w:p>
+        </w:tc>
+        <w:tc>
+          <w:tcPr>
+            <w:tcW w:w="1791" w:type="dxa"/>
+            <w:shd w:val="clear" w:color="auto" w:fill="262626" w:themeFill="text1" w:themeFillTint="D9"/>
+            <w:vAlign w:val="center"/>
+          </w:tcPr>
+          <w:p>
+            <w:pPr>
+              <w:jc w:val="center"/>
+              <w:rPr>
+                <w:rFonts w:ascii="Arial" w:hAnsi="Arial" w:cs="Arial"/>
+                <w:b/>
+                <w:bCs/>
+                <w:sz w:val="24"/>
+                <w:szCs w:val="24"/>
+              </w:rPr>
+            </w:pPr>
+            <w:r>
+              <w:rPr>
+                <w:rFonts w:ascii="Arial" w:hAnsi="Arial" w:cs="Arial"/>
+                <w:b/>
+                <w:bCs/>
+                <w:sz w:val="24"/>
+                <w:szCs w:val="24"/>
+              </w:rPr>
+              <w:t>Rol</w:t>
+            </w:r>
+          </w:p>
+        </w:tc>
+        <w:tc>
+          <w:tcPr>
+            <w:tcW w:w="1563" w:type="dxa"/>
+            <w:shd w:val="clear" w:color="auto" w:fill="262626" w:themeFill="text1" w:themeFillTint="D9"/>
+            <w:vAlign w:val="center"/>
+          </w:tcPr>
+          <w:p>
+            <w:pPr>
+              <w:jc w:val="center"/>
+              <w:rPr>
+                <w:rFonts w:ascii="Arial" w:hAnsi="Arial" w:cs="Arial"/>
+                <w:b/>
+                <w:bCs/>
+                <w:sz w:val="24"/>
+                <w:szCs w:val="24"/>
+              </w:rPr>
+            </w:pPr>
+            <w:r>
+              <w:rPr>
+                <w:rFonts w:ascii="Arial" w:hAnsi="Arial" w:cs="Arial"/>
+                <w:b/>
+                <w:bCs/>
+                <w:sz w:val="24"/>
+                <w:szCs w:val="24"/>
+              </w:rPr>
+              <w:t>Asistencia (Sí/No)</w:t>
+            </w:r>
+          </w:p>
+        </w:tc>
+        <w:tc>
+          <w:tcPr>
+            <w:tcW w:w="3061" w:type="dxa"/>
+            <w:shd w:val="clear" w:color="auto" w:fill="262626" w:themeFill="text1" w:themeFillTint="D9"/>
+            <w:vAlign w:val="center"/>
+          </w:tcPr>
+          <w:p>
+            <w:pPr>
+              <w:jc w:val="center"/>
+              <w:rPr>
+                <w:rFonts w:ascii="Arial" w:hAnsi="Arial" w:cs="Arial"/>
+                <w:b/>
+                <w:bCs/>
+                <w:sz w:val="24"/>
+                <w:szCs w:val="24"/>
+              </w:rPr>
+            </w:pPr>
+            <w:r>
+              <w:rPr>
+                <w:rFonts w:ascii="Arial" w:hAnsi="Arial" w:cs="Arial"/>
+                <w:b/>
+                <w:bCs/>
+                <w:sz w:val="24"/>
+                <w:szCs w:val="24"/>
+              </w:rPr>
+              <w:t>Actividades</w:t>
+            </w:r>
+          </w:p>
+        </w:tc>
+        <w:tc>
+          <w:tcPr>
+            <w:tcW w:w="2328" w:type="dxa"/>
+            <w:shd w:val="clear" w:color="auto" w:fill="262626" w:themeFill="text1" w:themeFillTint="D9"/>
+            <w:vAlign w:val="center"/>
+          </w:tcPr>
+          <w:p>
+            <w:pPr>
+              <w:jc w:val="center"/>
+              <w:rPr>
+                <w:rFonts w:ascii="Arial" w:hAnsi="Arial" w:cs="Arial"/>
+                <w:b/>
+                <w:bCs/>
+                <w:sz w:val="24"/>
+                <w:szCs w:val="24"/>
+              </w:rPr>
+            </w:pPr>
+            <w:r>
+              <w:rPr>
+                <w:rFonts w:ascii="Arial" w:hAnsi="Arial" w:cs="Arial"/>
+                <w:b/>
+                <w:bCs/>
+                <w:sz w:val="24"/>
+                <w:szCs w:val="24"/>
+              </w:rPr>
+              <w:t>Entregables Esperados</w:t>
+            </w:r>
+          </w:p>
+        </w:tc>
+      </w:tr>
+      <w:tr>
+        <w:trPr>
+          <w:jc w:val="center"/>
+        </w:trPr>
+        <w:tc>
+          <w:tcPr>
+            <w:tcW w:w="1538" w:type="dxa"/>
+            <w:vAlign w:val="center"/>
+          </w:tcPr>
+          <w:p>
+            <w:pPr>
+              <w:rPr>
+                <w:rFonts w:ascii="Arial" w:hAnsi="Arial" w:cs="Arial"/>
+                <w:sz w:val="24"/>
+                <w:szCs w:val="24"/>
+              </w:rPr>
+            </w:pPr>
+            <w:r>
+              <w:rPr>
+                <w:rFonts w:ascii="Arial" w:hAnsi="Arial" w:cs="Arial"/>
+                <w:sz w:val="24"/>
+                <w:szCs w:val="24"/>
+              </w:rPr>
+              <w:t>María Fernanda Barrón Álvarez</w:t>
+            </w:r>
+          </w:p>
+        </w:tc>
+        <w:tc>
+          <w:tcPr>
+            <w:tcW w:w="1791" w:type="dxa"/>
+            <w:vAlign w:val="center"/>
+          </w:tcPr>
+          <w:p>
+            <w:pPr>
+              <w:rPr>
+                <w:rFonts w:ascii="Arial" w:hAnsi="Arial" w:cs="Arial"/>
+                <w:sz w:val="24"/>
+                <w:szCs w:val="24"/>
+              </w:rPr>
+            </w:pPr>
+            <w:r>
+              <w:rPr>
+                <w:rFonts w:ascii="Arial" w:hAnsi="Arial" w:cs="Arial"/>
+                <w:sz w:val="24"/>
+                <w:szCs w:val="24"/>
+              </w:rPr>
+              <w:t>Project Manager</w:t>
+            </w:r>
+          </w:p>
+        </w:tc>
+        <w:tc>
+          <w:tcPr>
+            <w:tcW w:w="1563" w:type="dxa"/>
+            <w:vAlign w:val="center"/>
+          </w:tcPr>
+          <w:p>
+            <w:pPr>
+              <w:rPr>
+                <w:rFonts w:ascii="Arial" w:hAnsi="Arial" w:cs="Arial"/>
+                <w:sz w:val="24"/>
+                <w:szCs w:val="24"/>
+              </w:rPr>
+            </w:pPr>
+            <w:r>
+              <w:rPr>
+                <w:rFonts w:ascii="Arial" w:hAnsi="Arial" w:cs="Arial"/>
+                <w:sz w:val="24"/>
+                <w:szCs w:val="24"/>
+              </w:rPr>
+              <w:t>Sí</w:t>
+            </w:r>
+          </w:p>
+        </w:tc>
+        <w:tc>
+          <w:tcPr>
+            <w:tcW w:w="3061" w:type="dxa"/>
+            <w:vAlign w:val="center"/>
+          </w:tcPr>
+          <w:p>
+            <w:pPr>
+              <w:pStyle w:val="Prrafodelista"/>
+              <w:numPr>
+                <w:ilvl w:val="0"/>
+                <w:numId w:val="27"/>
+              </w:numPr>
+              <w:ind w:left="246" w:hanging="218"/>
+              <w:rPr>
+                <w:rFonts w:ascii="Arial" w:hAnsi="Arial" w:cs="Arial"/>
+                <w:sz w:val="24"/>
+                <w:szCs w:val="24"/>
+              </w:rPr>
+            </w:pPr>
+            <w:r>
+              <w:rPr>
+                <w:rFonts w:ascii="Arial" w:hAnsi="Arial" w:cs="Arial"/>
+                <w:sz w:val="24"/>
+                <w:szCs w:val="24"/>
+              </w:rPr>
+              <w:t>Bitácora del día</w:t>
+            </w:r>
+          </w:p>
+          <w:p>
+            <w:pPr>
+              <w:pStyle w:val="Prrafodelista"/>
+              <w:numPr>
+                <w:ilvl w:val="0"/>
+                <w:numId w:val="27"/>
+              </w:numPr>
+              <w:ind w:left="246" w:hanging="218"/>
+              <w:rPr>
+                <w:rFonts w:ascii="Arial" w:hAnsi="Arial" w:cs="Arial"/>
+                <w:sz w:val="24"/>
+                <w:szCs w:val="24"/>
+              </w:rPr>
+            </w:pPr>
+            <w:r>
+              <w:rPr>
+                <w:rFonts w:ascii="Arial" w:hAnsi="Arial" w:cs="Arial"/>
+                <w:sz w:val="24"/>
+                <w:szCs w:val="24"/>
+              </w:rPr>
+              <w:t xml:space="preserve">Revisión de </w:t>
+            </w:r>
+            <w:r>
+              <w:rPr>
+                <w:rFonts w:ascii="Arial" w:hAnsi="Arial" w:cs="Arial"/>
+                <w:sz w:val="24"/>
+                <w:szCs w:val="24"/>
+              </w:rPr>
+              <w:t>avance del prototipo</w:t>
+            </w:r>
+          </w:p>
+        </w:tc>
+        <w:tc>
+          <w:tcPr>
+            <w:tcW w:w="2328" w:type="dxa"/>
+            <w:vAlign w:val="center"/>
+          </w:tcPr>
+          <w:p>
+            <w:pPr>
+              <w:pStyle w:val="Prrafodelista"/>
+              <w:numPr>
+                <w:ilvl w:val="0"/>
+                <w:numId w:val="27"/>
+              </w:numPr>
+              <w:ind w:left="219" w:hanging="219"/>
+              <w:rPr>
+                <w:rFonts w:ascii="Arial" w:hAnsi="Arial" w:cs="Arial"/>
+                <w:sz w:val="24"/>
+                <w:szCs w:val="24"/>
+              </w:rPr>
+            </w:pPr>
+            <w:r>
+              <w:rPr>
+                <w:rFonts w:ascii="Arial" w:hAnsi="Arial" w:cs="Arial"/>
+                <w:sz w:val="24"/>
+                <w:szCs w:val="24"/>
+              </w:rPr>
+              <w:t>Bitácora</w:t>
+            </w:r>
+          </w:p>
+        </w:tc>
+      </w:tr>
+      <w:tr>
+        <w:trPr>
+          <w:jc w:val="center"/>
+        </w:trPr>
+        <w:tc>
+          <w:tcPr>
+            <w:tcW w:w="1538" w:type="dxa"/>
+            <w:vAlign w:val="center"/>
+          </w:tcPr>
+          <w:p>
+            <w:pPr>
+              <w:rPr>
+                <w:rFonts w:ascii="Arial" w:hAnsi="Arial" w:cs="Arial"/>
+                <w:sz w:val="24"/>
+                <w:szCs w:val="24"/>
+              </w:rPr>
+            </w:pPr>
+            <w:r>
+              <w:rPr>
+                <w:rFonts w:ascii="Arial" w:hAnsi="Arial" w:cs="Arial"/>
+                <w:sz w:val="24"/>
+                <w:szCs w:val="24"/>
+              </w:rPr>
+              <w:t xml:space="preserve">Leslie Miroslava Benítez </w:t>
+            </w:r>
+          </w:p>
+          <w:p>
+            <w:pPr>
+              <w:rPr>
+                <w:rFonts w:ascii="Arial" w:hAnsi="Arial" w:cs="Arial"/>
+                <w:sz w:val="24"/>
+                <w:szCs w:val="24"/>
+              </w:rPr>
+            </w:pPr>
+            <w:r>
+              <w:rPr>
+                <w:rFonts w:ascii="Arial" w:hAnsi="Arial" w:cs="Arial"/>
+                <w:sz w:val="24"/>
+                <w:szCs w:val="24"/>
+              </w:rPr>
+              <w:t>Marín</w:t>
+            </w:r>
+          </w:p>
+        </w:tc>
+        <w:tc>
+          <w:tcPr>
+            <w:tcW w:w="1791" w:type="dxa"/>
+            <w:vAlign w:val="center"/>
+          </w:tcPr>
+          <w:p>
+            <w:pPr>
+              <w:rPr>
+                <w:rFonts w:ascii="Arial" w:hAnsi="Arial" w:cs="Arial"/>
+                <w:sz w:val="24"/>
+                <w:szCs w:val="24"/>
+              </w:rPr>
+            </w:pPr>
+            <w:r>
+              <w:rPr>
+                <w:rFonts w:ascii="Arial" w:hAnsi="Arial" w:cs="Arial"/>
+                <w:sz w:val="24"/>
+                <w:szCs w:val="24"/>
+              </w:rPr>
+              <w:t xml:space="preserve">Desarrolladora </w:t>
+            </w:r>
+            <w:proofErr w:type="spellStart"/>
+            <w:r>
+              <w:rPr>
+                <w:rFonts w:ascii="Arial" w:hAnsi="Arial" w:cs="Arial"/>
+                <w:sz w:val="24"/>
+                <w:szCs w:val="24"/>
+              </w:rPr>
+              <w:t>frontend</w:t>
+            </w:r>
+            <w:proofErr w:type="spellEnd"/>
+          </w:p>
+        </w:tc>
+        <w:tc>
+          <w:tcPr>
+            <w:tcW w:w="1563" w:type="dxa"/>
+            <w:vAlign w:val="center"/>
+          </w:tcPr>
+          <w:p>
+            <w:pPr>
+              <w:rPr>
+                <w:rFonts w:ascii="Arial" w:hAnsi="Arial" w:cs="Arial"/>
+                <w:sz w:val="24"/>
+                <w:szCs w:val="24"/>
+              </w:rPr>
+            </w:pPr>
+            <w:r>
+              <w:rPr>
+                <w:rFonts w:ascii="Arial" w:hAnsi="Arial" w:cs="Arial"/>
+                <w:sz w:val="24"/>
+                <w:szCs w:val="24"/>
+              </w:rPr>
+              <w:t>No</w:t>
+            </w:r>
+          </w:p>
+        </w:tc>
+        <w:tc>
+          <w:tcPr>
+            <w:tcW w:w="3061" w:type="dxa"/>
+            <w:vAlign w:val="center"/>
+          </w:tcPr>
+          <w:p>
+            <w:pPr>
+              <w:pStyle w:val="Prrafodelista"/>
+              <w:numPr>
+                <w:ilvl w:val="0"/>
+                <w:numId w:val="27"/>
+              </w:numPr>
+              <w:ind w:left="270" w:hanging="184"/>
+              <w:rPr>
+                <w:rFonts w:ascii="Arial" w:hAnsi="Arial" w:cs="Arial"/>
+                <w:sz w:val="24"/>
+                <w:szCs w:val="24"/>
+              </w:rPr>
+            </w:pPr>
+            <w:r>
+              <w:rPr>
+                <w:rFonts w:ascii="Arial" w:hAnsi="Arial" w:cs="Arial"/>
+                <w:sz w:val="24"/>
+                <w:szCs w:val="24"/>
+              </w:rPr>
+              <w:t xml:space="preserve">Continuación de prototipo: diseño de página (archivos </w:t>
+            </w:r>
+            <w:proofErr w:type="spellStart"/>
+            <w:r>
+              <w:rPr>
+                <w:rFonts w:ascii="Arial" w:hAnsi="Arial" w:cs="Arial"/>
+                <w:sz w:val="24"/>
+                <w:szCs w:val="24"/>
+              </w:rPr>
+              <w:t>css</w:t>
+            </w:r>
+            <w:proofErr w:type="spellEnd"/>
+            <w:r>
+              <w:rPr>
+                <w:rFonts w:ascii="Arial" w:hAnsi="Arial" w:cs="Arial"/>
+                <w:sz w:val="24"/>
+                <w:szCs w:val="24"/>
+              </w:rPr>
+              <w:t xml:space="preserve">) </w:t>
+            </w:r>
+          </w:p>
+        </w:tc>
+        <w:tc>
+          <w:tcPr>
+            <w:tcW w:w="2328" w:type="dxa"/>
+            <w:vAlign w:val="center"/>
+          </w:tcPr>
+          <w:p>
+            <w:pPr>
+              <w:pStyle w:val="Prrafodelista"/>
+              <w:numPr>
+                <w:ilvl w:val="0"/>
+                <w:numId w:val="27"/>
+              </w:numPr>
+              <w:ind w:left="219" w:hanging="218"/>
+              <w:rPr>
+                <w:rFonts w:ascii="Arial" w:hAnsi="Arial" w:cs="Arial"/>
+                <w:sz w:val="24"/>
+                <w:szCs w:val="24"/>
+              </w:rPr>
+            </w:pPr>
+            <w:r>
+              <w:rPr>
+                <w:rFonts w:ascii="Arial" w:hAnsi="Arial" w:cs="Arial"/>
+                <w:sz w:val="24"/>
+                <w:szCs w:val="24"/>
+              </w:rPr>
+              <w:t>Prototipo funcional navegable con estructura completa del sitio</w:t>
+            </w:r>
+          </w:p>
+        </w:tc>
+      </w:tr>
+      <w:tr>
+        <w:trPr>
+          <w:jc w:val="center"/>
+        </w:trPr>
+        <w:tc>
+          <w:tcPr>
+            <w:tcW w:w="1538" w:type="dxa"/>
+            <w:vAlign w:val="center"/>
+          </w:tcPr>
+          <w:p>
+            <w:pPr>
+              <w:rPr>
+                <w:rFonts w:ascii="Arial" w:hAnsi="Arial" w:cs="Arial"/>
+                <w:sz w:val="24"/>
+                <w:szCs w:val="24"/>
+              </w:rPr>
+            </w:pPr>
+            <w:r>
+              <w:rPr>
+                <w:rFonts w:ascii="Arial" w:hAnsi="Arial" w:cs="Arial"/>
+                <w:sz w:val="24"/>
+                <w:szCs w:val="24"/>
+              </w:rPr>
+              <w:t>Leonardo Merino Garfias</w:t>
+            </w:r>
+          </w:p>
+        </w:tc>
+        <w:tc>
+          <w:tcPr>
+            <w:tcW w:w="1791" w:type="dxa"/>
+            <w:vAlign w:val="center"/>
+          </w:tcPr>
+          <w:p>
+            <w:pPr>
+              <w:rPr>
+                <w:rFonts w:ascii="Arial" w:hAnsi="Arial" w:cs="Arial"/>
+                <w:sz w:val="24"/>
+                <w:szCs w:val="24"/>
+              </w:rPr>
+            </w:pPr>
+            <w:r>
+              <w:rPr>
+                <w:rFonts w:ascii="Arial" w:hAnsi="Arial" w:cs="Arial"/>
+                <w:sz w:val="24"/>
+                <w:szCs w:val="24"/>
+              </w:rPr>
+              <w:t xml:space="preserve">Desarrollador </w:t>
+            </w:r>
+            <w:proofErr w:type="spellStart"/>
+            <w:r>
+              <w:rPr>
+                <w:rFonts w:ascii="Arial" w:hAnsi="Arial" w:cs="Arial"/>
+                <w:sz w:val="24"/>
+                <w:szCs w:val="24"/>
+              </w:rPr>
+              <w:t>backend</w:t>
+            </w:r>
+            <w:proofErr w:type="spellEnd"/>
+          </w:p>
+        </w:tc>
+        <w:tc>
+          <w:tcPr>
+            <w:tcW w:w="1563" w:type="dxa"/>
+            <w:vAlign w:val="center"/>
+          </w:tcPr>
+          <w:p>
+            <w:pPr>
+              <w:rPr>
+                <w:rFonts w:ascii="Arial" w:hAnsi="Arial" w:cs="Arial"/>
+                <w:sz w:val="24"/>
+                <w:szCs w:val="24"/>
+              </w:rPr>
+            </w:pPr>
+            <w:r>
+              <w:rPr>
+                <w:rFonts w:ascii="Arial" w:hAnsi="Arial" w:cs="Arial"/>
+                <w:sz w:val="24"/>
+                <w:szCs w:val="24"/>
+              </w:rPr>
+              <w:t>Sí</w:t>
+            </w:r>
+          </w:p>
+        </w:tc>
+        <w:tc>
+          <w:tcPr>
+            <w:tcW w:w="3061" w:type="dxa"/>
+            <w:vAlign w:val="center"/>
+          </w:tcPr>
+          <w:p>
+            <w:pPr>
+              <w:pStyle w:val="Prrafodelista"/>
+              <w:numPr>
+                <w:ilvl w:val="0"/>
+                <w:numId w:val="27"/>
+              </w:numPr>
+              <w:ind w:left="246" w:hanging="218"/>
+              <w:rPr>
+                <w:rFonts w:ascii="Arial" w:hAnsi="Arial" w:cs="Arial"/>
+                <w:sz w:val="24"/>
+                <w:szCs w:val="24"/>
+              </w:rPr>
+            </w:pPr>
+            <w:r>
+              <w:rPr>
+                <w:rFonts w:ascii="Arial" w:hAnsi="Arial" w:cs="Arial"/>
+                <w:sz w:val="24"/>
+                <w:szCs w:val="24"/>
+              </w:rPr>
+              <w:t xml:space="preserve">Continuar </w:t>
+            </w:r>
+            <w:r>
+              <w:rPr>
+                <w:rFonts w:ascii="Arial" w:hAnsi="Arial" w:cs="Arial"/>
+                <w:sz w:val="24"/>
+                <w:szCs w:val="24"/>
+              </w:rPr>
+              <w:t>estimación de puntos de función</w:t>
+            </w:r>
+          </w:p>
+        </w:tc>
+        <w:tc>
+          <w:tcPr>
+            <w:tcW w:w="2328" w:type="dxa"/>
+            <w:vAlign w:val="center"/>
+          </w:tcPr>
+          <w:p>
+            <w:pPr>
+              <w:pStyle w:val="Prrafodelista"/>
+              <w:numPr>
+                <w:ilvl w:val="0"/>
+                <w:numId w:val="27"/>
+              </w:numPr>
+              <w:ind w:left="349" w:hanging="248"/>
+              <w:rPr>
+                <w:rFonts w:ascii="Arial" w:hAnsi="Arial" w:cs="Arial"/>
+                <w:sz w:val="24"/>
+                <w:szCs w:val="24"/>
+              </w:rPr>
+            </w:pPr>
+            <w:r>
+              <w:rPr>
+                <w:rFonts w:ascii="Arial" w:hAnsi="Arial" w:cs="Arial"/>
+                <w:sz w:val="24"/>
+                <w:szCs w:val="24"/>
+              </w:rPr>
+              <w:t>Parte de documentación con punto 7.</w:t>
+            </w:r>
+          </w:p>
+        </w:tc>
+      </w:tr>
+    </w:tbl>
+    <w:p>
+      <w:pPr>
+        <w:rPr>
+          <w:rFonts w:ascii="Arial" w:hAnsi="Arial" w:cs="Arial"/>
+          <w:sz w:val="24"/>
+          <w:szCs w:val="24"/>
+        </w:rPr>
+      </w:pPr>
+    </w:p>
+    <w:p>
+      <w:pPr>
+        <w:pStyle w:val="titulo1"/>
+        <w:outlineLvl w:val="2"/>
+        <w:rPr>
+          <w:sz w:val="32"/>
+          <w:szCs w:val="72"/>
+        </w:rPr>
+      </w:pPr>
+      <w:r>
+        <w:rPr>
+          <w:sz w:val="32"/>
+          <w:szCs w:val="72"/>
+        </w:rPr>
+        <w:t>A</w:t>
+      </w:r>
+      <w:r>
+        <w:rPr>
+          <w:sz w:val="32"/>
+          <w:szCs w:val="72"/>
+        </w:rPr>
+        <w:t>ctividades Ejecutadas</w:t>
+      </w:r>
+    </w:p>
+    <w:tbl>
+      <w:tblPr>
+        <w:tblStyle w:val="Tablaconcuadrcula"/>
+        <w:tblW w:w="10124" w:type="dxa"/>
+        <w:jc w:val="center"/>
+        <w:tblBorders>
+          <w:top w:val="single" w:sz="4" w:space="0" w:color="7F7F7F" w:themeColor="text1" w:themeTint="80"/>
+          <w:left w:val="single" w:sz="4" w:space="0" w:color="7F7F7F" w:themeColor="text1" w:themeTint="80"/>
+          <w:bottom w:val="single" w:sz="4" w:space="0" w:color="7F7F7F" w:themeColor="text1" w:themeTint="80"/>
+          <w:right w:val="single" w:sz="4" w:space="0" w:color="7F7F7F" w:themeColor="text1" w:themeTint="80"/>
+          <w:insideH w:val="single" w:sz="4" w:space="0" w:color="7F7F7F" w:themeColor="text1" w:themeTint="80"/>
+          <w:insideV w:val="single" w:sz="4" w:space="0" w:color="7F7F7F" w:themeColor="text1" w:themeTint="80"/>
+        </w:tblBorders>
+        <w:tblCellMar>
+          <w:top w:w="57" w:type="dxa"/>
+          <w:bottom w:w="57" w:type="dxa"/>
+        </w:tblCellMar>
+        <w:tblLook w:val="04A0" w:firstRow="1" w:lastRow="0" w:firstColumn="1" w:lastColumn="0" w:noHBand="0" w:noVBand="1"/>
+      </w:tblPr>
+      <w:tblGrid>
+        <w:gridCol w:w="2955"/>
+        <w:gridCol w:w="2004"/>
+        <w:gridCol w:w="1150"/>
+        <w:gridCol w:w="1535"/>
+        <w:gridCol w:w="2480"/>
+      </w:tblGrid>
+      <w:tr>
+        <w:trPr>
+          <w:jc w:val="center"/>
+        </w:trPr>
+        <w:tc>
+          <w:tcPr>
+            <w:tcW w:w="2955" w:type="dxa"/>
+            <w:shd w:val="clear" w:color="auto" w:fill="262626" w:themeFill="text1" w:themeFillTint="D9"/>
+            <w:vAlign w:val="center"/>
+          </w:tcPr>
+          <w:p>
+            <w:pPr>
+              <w:jc w:val="center"/>
+              <w:rPr>
+                <w:rFonts w:ascii="Arial" w:hAnsi="Arial" w:cs="Arial"/>
+                <w:b/>
+                <w:bCs/>
+                <w:sz w:val="24"/>
+                <w:szCs w:val="24"/>
+              </w:rPr>
+            </w:pPr>
+            <w:r>
+              <w:rPr>
+                <w:rFonts w:ascii="Arial" w:hAnsi="Arial" w:cs="Arial"/>
+                <w:b/>
+                <w:bCs/>
+                <w:sz w:val="24"/>
+                <w:szCs w:val="24"/>
+              </w:rPr>
+              <w:t>Actividad</w:t>
+            </w:r>
+          </w:p>
+        </w:tc>
+        <w:tc>
+          <w:tcPr>
+            <w:tcW w:w="2004" w:type="dxa"/>
+            <w:shd w:val="clear" w:color="auto" w:fill="262626" w:themeFill="text1" w:themeFillTint="D9"/>
+            <w:vAlign w:val="center"/>
+          </w:tcPr>
+          <w:p>
+            <w:pPr>
+              <w:jc w:val="center"/>
+              <w:rPr>
+                <w:rFonts w:ascii="Arial" w:hAnsi="Arial" w:cs="Arial"/>
+                <w:b/>
+                <w:bCs/>
+                <w:sz w:val="24"/>
+                <w:szCs w:val="24"/>
+              </w:rPr>
+            </w:pPr>
+            <w:r>
+              <w:rPr>
+                <w:rFonts w:ascii="Arial" w:hAnsi="Arial" w:cs="Arial"/>
+                <w:b/>
+                <w:bCs/>
+                <w:sz w:val="24"/>
+                <w:szCs w:val="24"/>
+              </w:rPr>
+              <w:t>Responsable(s)</w:t>
+            </w:r>
+          </w:p>
+        </w:tc>
+        <w:tc>
+          <w:tcPr>
+            <w:tcW w:w="1150" w:type="dxa"/>
+            <w:shd w:val="clear" w:color="auto" w:fill="262626" w:themeFill="text1" w:themeFillTint="D9"/>
+            <w:vAlign w:val="center"/>
+          </w:tcPr>
+          <w:p>
+            <w:pPr>
+              <w:jc w:val="center"/>
+              <w:rPr>
+                <w:rFonts w:ascii="Arial" w:hAnsi="Arial" w:cs="Arial"/>
+                <w:b/>
+                <w:bCs/>
+                <w:sz w:val="24"/>
+                <w:szCs w:val="24"/>
+              </w:rPr>
+            </w:pPr>
+            <w:proofErr w:type="spellStart"/>
+            <w:r>
+              <w:rPr>
+                <w:rFonts w:ascii="Arial" w:hAnsi="Arial" w:cs="Arial"/>
+                <w:b/>
+                <w:bCs/>
+                <w:sz w:val="24"/>
+                <w:szCs w:val="24"/>
+              </w:rPr>
+              <w:t>Hr</w:t>
+            </w:r>
+            <w:proofErr w:type="spellEnd"/>
+            <w:r>
+              <w:rPr>
+                <w:rFonts w:ascii="Arial" w:hAnsi="Arial" w:cs="Arial"/>
+                <w:b/>
+                <w:bCs/>
+                <w:sz w:val="24"/>
+                <w:szCs w:val="24"/>
+              </w:rPr>
+              <w:t xml:space="preserve">. </w:t>
+            </w:r>
+            <w:proofErr w:type="spellStart"/>
+            <w:r>
+              <w:rPr>
+                <w:rFonts w:ascii="Arial" w:hAnsi="Arial" w:cs="Arial"/>
+                <w:b/>
+                <w:bCs/>
+                <w:sz w:val="24"/>
+                <w:szCs w:val="24"/>
+              </w:rPr>
+              <w:t>Ini</w:t>
+            </w:r>
+            <w:proofErr w:type="spellEnd"/>
+          </w:p>
+        </w:tc>
+        <w:tc>
+          <w:tcPr>
+            <w:tcW w:w="1535" w:type="dxa"/>
+            <w:shd w:val="clear" w:color="auto" w:fill="262626" w:themeFill="text1" w:themeFillTint="D9"/>
+            <w:vAlign w:val="center"/>
+          </w:tcPr>
+          <w:p>
+            <w:pPr>
+              <w:jc w:val="center"/>
+              <w:rPr>
+                <w:rFonts w:ascii="Arial" w:hAnsi="Arial" w:cs="Arial"/>
+                <w:b/>
+                <w:bCs/>
+                <w:sz w:val="24"/>
+                <w:szCs w:val="24"/>
+              </w:rPr>
+            </w:pPr>
+            <w:proofErr w:type="spellStart"/>
+            <w:r>
+              <w:rPr>
+                <w:rFonts w:ascii="Arial" w:hAnsi="Arial" w:cs="Arial"/>
+                <w:b/>
+                <w:bCs/>
+                <w:sz w:val="24"/>
+                <w:szCs w:val="24"/>
+              </w:rPr>
+              <w:t>Hr</w:t>
+            </w:r>
+            <w:proofErr w:type="spellEnd"/>
+            <w:r>
+              <w:rPr>
+                <w:rFonts w:ascii="Arial" w:hAnsi="Arial" w:cs="Arial"/>
+                <w:b/>
+                <w:bCs/>
+                <w:sz w:val="24"/>
+                <w:szCs w:val="24"/>
+              </w:rPr>
+              <w:t>. fin</w:t>
+            </w:r>
+          </w:p>
+        </w:tc>
+        <w:tc>
+          <w:tcPr>
+            <w:tcW w:w="2480" w:type="dxa"/>
+            <w:shd w:val="clear" w:color="auto" w:fill="262626" w:themeFill="text1" w:themeFillTint="D9"/>
+            <w:vAlign w:val="center"/>
+          </w:tcPr>
+          <w:p>
+            <w:pPr>
+              <w:jc w:val="center"/>
+              <w:rPr>
+                <w:rFonts w:ascii="Arial" w:hAnsi="Arial" w:cs="Arial"/>
+                <w:b/>
+                <w:bCs/>
+                <w:sz w:val="24"/>
+                <w:szCs w:val="24"/>
+              </w:rPr>
+            </w:pPr>
+            <w:r>
+              <w:rPr>
+                <w:rFonts w:ascii="Arial" w:hAnsi="Arial" w:cs="Arial"/>
+                <w:b/>
+                <w:bCs/>
+                <w:sz w:val="24"/>
+                <w:szCs w:val="24"/>
+              </w:rPr>
+              <w:t>Estado (Completado / En proceso / Pendiente)</w:t>
+            </w:r>
+          </w:p>
+        </w:tc>
+      </w:tr>
+      <w:tr>
+        <w:trPr>
+          <w:jc w:val="center"/>
+        </w:trPr>
+        <w:tc>
+          <w:tcPr>
+            <w:tcW w:w="2955" w:type="dxa"/>
+            <w:vAlign w:val="center"/>
+          </w:tcPr>
+          <w:p>
+            <w:pPr>
+              <w:rPr>
+                <w:rFonts w:ascii="Arial" w:hAnsi="Arial" w:cs="Arial"/>
+                <w:sz w:val="24"/>
+                <w:szCs w:val="24"/>
+              </w:rPr>
+            </w:pPr>
+            <w:r>
+              <w:rPr>
+                <w:rFonts w:ascii="Arial" w:hAnsi="Arial" w:cs="Arial"/>
+                <w:sz w:val="24"/>
+                <w:szCs w:val="24"/>
+              </w:rPr>
+              <w:t>Bitácora</w:t>
+            </w:r>
+          </w:p>
+        </w:tc>
+        <w:tc>
+          <w:tcPr>
+            <w:tcW w:w="2004" w:type="dxa"/>
+            <w:vAlign w:val="center"/>
+          </w:tcPr>
+          <w:p>
+            <w:pPr>
+              <w:rPr>
+                <w:rFonts w:ascii="Arial" w:hAnsi="Arial" w:cs="Arial"/>
+                <w:sz w:val="24"/>
+                <w:szCs w:val="24"/>
+              </w:rPr>
+            </w:pPr>
+            <w:r>
+              <w:rPr>
+                <w:rFonts w:ascii="Arial" w:hAnsi="Arial" w:cs="Arial"/>
+                <w:sz w:val="24"/>
+                <w:szCs w:val="24"/>
+              </w:rPr>
+              <w:t>María Fernanda Barrón Álvarez</w:t>
+            </w:r>
+          </w:p>
+        </w:tc>
+        <w:tc>
+          <w:tcPr>
+            <w:tcW w:w="1150" w:type="dxa"/>
+            <w:vAlign w:val="center"/>
+          </w:tcPr>
+          <w:p>
+            <w:pPr>
+              <w:rPr>
+                <w:rFonts w:ascii="Arial" w:hAnsi="Arial" w:cs="Arial"/>
+                <w:sz w:val="24"/>
+                <w:szCs w:val="24"/>
+              </w:rPr>
+            </w:pPr>
+            <w:r>
+              <w:rPr>
+                <w:rFonts w:ascii="Arial" w:hAnsi="Arial" w:cs="Arial"/>
+                <w:sz w:val="24"/>
+                <w:szCs w:val="24"/>
+              </w:rPr>
+              <w:t>8</w:t>
+            </w:r>
+            <w:r>
+              <w:rPr>
+                <w:rFonts w:ascii="Arial" w:hAnsi="Arial" w:cs="Arial"/>
+                <w:sz w:val="24"/>
+                <w:szCs w:val="24"/>
+              </w:rPr>
+              <w:t>:</w:t>
+            </w:r>
+            <w:r>
+              <w:rPr>
+                <w:rFonts w:ascii="Arial" w:hAnsi="Arial" w:cs="Arial"/>
+                <w:sz w:val="24"/>
+                <w:szCs w:val="24"/>
+              </w:rPr>
+              <w:t>1</w:t>
+            </w:r>
+            <w:r>
+              <w:rPr>
+                <w:rFonts w:ascii="Arial" w:hAnsi="Arial" w:cs="Arial"/>
+                <w:sz w:val="24"/>
+                <w:szCs w:val="24"/>
+              </w:rPr>
+              <w:t>0</w:t>
+            </w:r>
+            <w:r>
+              <w:rPr>
+                <w:rFonts w:ascii="Arial" w:hAnsi="Arial" w:cs="Arial"/>
+                <w:sz w:val="24"/>
+                <w:szCs w:val="24"/>
+              </w:rPr>
+              <w:t xml:space="preserve"> a</w:t>
+            </w:r>
+            <w:r>
+              <w:rPr>
+                <w:rFonts w:ascii="Arial" w:hAnsi="Arial" w:cs="Arial"/>
+                <w:sz w:val="24"/>
+                <w:szCs w:val="24"/>
+              </w:rPr>
+              <w:t>m</w:t>
+            </w:r>
+          </w:p>
+        </w:tc>
+        <w:tc>
+          <w:tcPr>
+            <w:tcW w:w="1535" w:type="dxa"/>
+            <w:vAlign w:val="center"/>
+          </w:tcPr>
+          <w:p>
+            <w:pPr>
+              <w:rPr>
+                <w:rFonts w:ascii="Arial" w:hAnsi="Arial" w:cs="Arial"/>
+                <w:sz w:val="24"/>
+                <w:szCs w:val="24"/>
+              </w:rPr>
+            </w:pPr>
+            <w:r>
+              <w:rPr>
+                <w:rFonts w:ascii="Arial" w:hAnsi="Arial" w:cs="Arial"/>
+                <w:sz w:val="24"/>
+                <w:szCs w:val="24"/>
+              </w:rPr>
+              <w:t>8</w:t>
+            </w:r>
+            <w:r>
+              <w:rPr>
+                <w:rFonts w:ascii="Arial" w:hAnsi="Arial" w:cs="Arial"/>
+                <w:sz w:val="24"/>
+                <w:szCs w:val="24"/>
+              </w:rPr>
+              <w:t>:</w:t>
+            </w:r>
+            <w:r>
+              <w:rPr>
+                <w:rFonts w:ascii="Arial" w:hAnsi="Arial" w:cs="Arial"/>
+                <w:sz w:val="24"/>
+                <w:szCs w:val="24"/>
+              </w:rPr>
+              <w:t>15</w:t>
+            </w:r>
+            <w:r>
+              <w:rPr>
+                <w:rFonts w:ascii="Arial" w:hAnsi="Arial" w:cs="Arial"/>
+                <w:sz w:val="24"/>
+                <w:szCs w:val="24"/>
+              </w:rPr>
+              <w:t xml:space="preserve"> a</w:t>
+            </w:r>
+            <w:r>
+              <w:rPr>
+                <w:rFonts w:ascii="Arial" w:hAnsi="Arial" w:cs="Arial"/>
+                <w:sz w:val="24"/>
+                <w:szCs w:val="24"/>
+              </w:rPr>
+              <w:t>m</w:t>
+            </w:r>
+          </w:p>
+        </w:tc>
+        <w:tc>
+          <w:tcPr>
+            <w:tcW w:w="2480" w:type="dxa"/>
+            <w:vAlign w:val="center"/>
+          </w:tcPr>
+          <w:p>
+            <w:pPr>
+              <w:rPr>
+                <w:rFonts w:ascii="Arial" w:hAnsi="Arial" w:cs="Arial"/>
+                <w:sz w:val="24"/>
+                <w:szCs w:val="24"/>
+              </w:rPr>
+            </w:pPr>
+            <w:r>
+              <w:rPr>
+                <w:rFonts w:ascii="Arial" w:hAnsi="Arial" w:cs="Arial"/>
+                <w:sz w:val="24"/>
+                <w:szCs w:val="24"/>
+              </w:rPr>
+              <w:t>Completado</w:t>
+            </w:r>
+          </w:p>
+        </w:tc>
+      </w:tr>
+      <w:tr>
+        <w:trPr>
+          <w:jc w:val="center"/>
+        </w:trPr>
+        <w:tc>
+          <w:tcPr>
+            <w:tcW w:w="2955" w:type="dxa"/>
+            <w:vAlign w:val="center"/>
+          </w:tcPr>
+          <w:p>
+            <w:pPr>
+              <w:rPr>
+                <w:rFonts w:ascii="Arial" w:hAnsi="Arial" w:cs="Arial"/>
+                <w:sz w:val="24"/>
+                <w:szCs w:val="24"/>
+              </w:rPr>
+            </w:pPr>
+            <w:r>
+              <w:rPr>
+                <w:rFonts w:ascii="Arial" w:hAnsi="Arial" w:cs="Arial"/>
+                <w:sz w:val="24"/>
+                <w:szCs w:val="24"/>
+              </w:rPr>
+              <w:t xml:space="preserve">Revisión de avance de prototipo </w:t>
+            </w:r>
+          </w:p>
+        </w:tc>
+        <w:tc>
+          <w:tcPr>
+            <w:tcW w:w="2004" w:type="dxa"/>
+            <w:vAlign w:val="center"/>
+          </w:tcPr>
+          <w:p>
+            <w:pPr>
+              <w:rPr>
+                <w:rFonts w:ascii="Arial" w:hAnsi="Arial" w:cs="Arial"/>
+                <w:sz w:val="24"/>
+                <w:szCs w:val="24"/>
+              </w:rPr>
+            </w:pPr>
+            <w:r>
+              <w:rPr>
+                <w:rFonts w:ascii="Arial" w:hAnsi="Arial" w:cs="Arial"/>
+                <w:sz w:val="24"/>
+                <w:szCs w:val="24"/>
+              </w:rPr>
+              <w:t>María Fernanda Barrón Álvarez</w:t>
+            </w:r>
+          </w:p>
+        </w:tc>
+        <w:tc>
+          <w:tcPr>
+            <w:tcW w:w="1150" w:type="dxa"/>
+            <w:vAlign w:val="center"/>
+          </w:tcPr>
+          <w:p>
+            <w:pPr>
+              <w:rPr>
+                <w:rFonts w:ascii="Arial" w:hAnsi="Arial" w:cs="Arial"/>
+                <w:sz w:val="24"/>
+                <w:szCs w:val="24"/>
+              </w:rPr>
+            </w:pPr>
+            <w:r>
+              <w:rPr>
+                <w:rFonts w:ascii="Arial" w:hAnsi="Arial" w:cs="Arial"/>
+                <w:sz w:val="24"/>
+                <w:szCs w:val="24"/>
+              </w:rPr>
+              <w:t>8:1</w:t>
+            </w:r>
+            <w:r>
+              <w:rPr>
+                <w:rFonts w:ascii="Arial" w:hAnsi="Arial" w:cs="Arial"/>
+                <w:sz w:val="24"/>
+                <w:szCs w:val="24"/>
+              </w:rPr>
+              <w:t>5 am</w:t>
+            </w:r>
+          </w:p>
+        </w:tc>
+        <w:tc>
+          <w:tcPr>
+            <w:tcW w:w="1535" w:type="dxa"/>
+            <w:vAlign w:val="center"/>
+          </w:tcPr>
+          <w:p>
+            <w:pPr>
+              <w:rPr>
+                <w:rFonts w:ascii="Arial" w:hAnsi="Arial" w:cs="Arial"/>
+                <w:sz w:val="24"/>
+                <w:szCs w:val="24"/>
+              </w:rPr>
+            </w:pPr>
+            <w:r>
+              <w:rPr>
+                <w:rFonts w:ascii="Arial" w:hAnsi="Arial" w:cs="Arial"/>
+                <w:sz w:val="24"/>
+                <w:szCs w:val="24"/>
+              </w:rPr>
+              <w:t>9</w:t>
+            </w:r>
+            <w:r>
+              <w:rPr>
+                <w:rFonts w:ascii="Arial" w:hAnsi="Arial" w:cs="Arial"/>
+                <w:sz w:val="24"/>
+                <w:szCs w:val="24"/>
+              </w:rPr>
+              <w:t>:</w:t>
+            </w:r>
+            <w:r>
+              <w:rPr>
+                <w:rFonts w:ascii="Arial" w:hAnsi="Arial" w:cs="Arial"/>
+                <w:sz w:val="24"/>
+                <w:szCs w:val="24"/>
+              </w:rPr>
+              <w:t>00 am</w:t>
+            </w:r>
+          </w:p>
+        </w:tc>
+        <w:tc>
+          <w:tcPr>
+            <w:tcW w:w="2480" w:type="dxa"/>
+            <w:vAlign w:val="center"/>
+          </w:tcPr>
+          <w:p>
+            <w:pPr>
+              <w:rPr>
+                <w:rFonts w:ascii="Arial" w:hAnsi="Arial" w:cs="Arial"/>
+                <w:sz w:val="24"/>
+                <w:szCs w:val="24"/>
+              </w:rPr>
+            </w:pPr>
+            <w:r>
+              <w:rPr>
+                <w:rFonts w:ascii="Arial" w:hAnsi="Arial" w:cs="Arial"/>
+                <w:sz w:val="24"/>
+                <w:szCs w:val="24"/>
+              </w:rPr>
+              <w:t>En proceso</w:t>
+            </w:r>
+          </w:p>
+        </w:tc>
+      </w:tr>
+      <w:tr>
+        <w:trPr>
+          <w:jc w:val="center"/>
+        </w:trPr>
+        <w:tc>
+          <w:tcPr>
+            <w:tcW w:w="2955" w:type="dxa"/>
+            <w:vAlign w:val="center"/>
+          </w:tcPr>
+          <w:p>
+            <w:pPr>
+              <w:rPr>
+                <w:rFonts w:ascii="Arial" w:hAnsi="Arial" w:cs="Arial"/>
+                <w:sz w:val="24"/>
+                <w:szCs w:val="24"/>
+              </w:rPr>
+            </w:pPr>
+            <w:r>
+              <w:rPr>
+                <w:rFonts w:ascii="Arial" w:hAnsi="Arial" w:cs="Arial"/>
+                <w:sz w:val="24"/>
+                <w:szCs w:val="24"/>
+              </w:rPr>
+              <w:t>Puntos de Función</w:t>
+            </w:r>
+          </w:p>
+        </w:tc>
+        <w:tc>
+          <w:tcPr>
+            <w:tcW w:w="2004" w:type="dxa"/>
+            <w:vAlign w:val="center"/>
+          </w:tcPr>
+          <w:p>
+            <w:pPr>
+              <w:rPr>
+                <w:rFonts w:ascii="Arial" w:hAnsi="Arial" w:cs="Arial"/>
+                <w:sz w:val="24"/>
+                <w:szCs w:val="24"/>
+              </w:rPr>
+            </w:pPr>
+            <w:r>
+              <w:rPr>
+                <w:rFonts w:ascii="Arial" w:hAnsi="Arial" w:cs="Arial"/>
+                <w:sz w:val="24"/>
+                <w:szCs w:val="24"/>
+              </w:rPr>
+              <w:t>Leonardo Merino Garfias</w:t>
+            </w:r>
+          </w:p>
+        </w:tc>
+        <w:tc>
+          <w:tcPr>
+            <w:tcW w:w="1150" w:type="dxa"/>
+            <w:vAlign w:val="center"/>
+          </w:tcPr>
+          <w:p>
+            <w:pPr>
+              <w:rPr>
+                <w:rFonts w:ascii="Arial" w:hAnsi="Arial" w:cs="Arial"/>
+                <w:sz w:val="24"/>
+                <w:szCs w:val="24"/>
+              </w:rPr>
+            </w:pPr>
+            <w:r>
+              <w:rPr>
+                <w:rFonts w:ascii="Arial" w:hAnsi="Arial" w:cs="Arial"/>
+                <w:sz w:val="24"/>
+                <w:szCs w:val="24"/>
+              </w:rPr>
+              <w:t>8</w:t>
+            </w:r>
+            <w:r>
+              <w:rPr>
+                <w:rFonts w:ascii="Arial" w:hAnsi="Arial" w:cs="Arial"/>
+                <w:sz w:val="24"/>
+                <w:szCs w:val="24"/>
+              </w:rPr>
+              <w:t>:</w:t>
+            </w:r>
+            <w:r>
+              <w:rPr>
+                <w:rFonts w:ascii="Arial" w:hAnsi="Arial" w:cs="Arial"/>
+                <w:sz w:val="24"/>
+                <w:szCs w:val="24"/>
+              </w:rPr>
+              <w:t>1</w:t>
+            </w:r>
+            <w:r>
+              <w:rPr>
+                <w:rFonts w:ascii="Arial" w:hAnsi="Arial" w:cs="Arial"/>
+                <w:sz w:val="24"/>
+                <w:szCs w:val="24"/>
+              </w:rPr>
+              <w:t>0</w:t>
+            </w:r>
+            <w:r>
+              <w:rPr>
+                <w:rFonts w:ascii="Arial" w:hAnsi="Arial" w:cs="Arial"/>
+                <w:sz w:val="24"/>
+                <w:szCs w:val="24"/>
+              </w:rPr>
+              <w:t>a</w:t>
+            </w:r>
+            <w:r>
+              <w:rPr>
+                <w:rFonts w:ascii="Arial" w:hAnsi="Arial" w:cs="Arial"/>
+                <w:sz w:val="24"/>
+                <w:szCs w:val="24"/>
+              </w:rPr>
+              <w:t>m</w:t>
+            </w:r>
+          </w:p>
+        </w:tc>
+        <w:tc>
+          <w:tcPr>
+            <w:tcW w:w="1535" w:type="dxa"/>
+            <w:vAlign w:val="center"/>
+          </w:tcPr>
+          <w:p>
+            <w:pPr>
+              <w:rPr>
+                <w:rFonts w:ascii="Arial" w:hAnsi="Arial" w:cs="Arial"/>
+                <w:sz w:val="24"/>
+                <w:szCs w:val="24"/>
+              </w:rPr>
+            </w:pPr>
+            <w:r>
+              <w:rPr>
+                <w:rFonts w:ascii="Arial" w:hAnsi="Arial" w:cs="Arial"/>
+                <w:sz w:val="24"/>
+                <w:szCs w:val="24"/>
+              </w:rPr>
+              <w:t>9</w:t>
+            </w:r>
+            <w:r>
+              <w:rPr>
+                <w:rFonts w:ascii="Arial" w:hAnsi="Arial" w:cs="Arial"/>
+                <w:sz w:val="24"/>
+                <w:szCs w:val="24"/>
+              </w:rPr>
+              <w:t>:00</w:t>
+            </w:r>
+            <w:r>
+              <w:rPr>
+                <w:rFonts w:ascii="Arial" w:hAnsi="Arial" w:cs="Arial"/>
+                <w:sz w:val="24"/>
+                <w:szCs w:val="24"/>
+              </w:rPr>
+              <w:t>a</w:t>
+            </w:r>
+            <w:r>
+              <w:rPr>
+                <w:rFonts w:ascii="Arial" w:hAnsi="Arial" w:cs="Arial"/>
+                <w:sz w:val="24"/>
+                <w:szCs w:val="24"/>
+              </w:rPr>
+              <w:t>m</w:t>
+            </w:r>
+          </w:p>
+        </w:tc>
+        <w:tc>
+          <w:tcPr>
+            <w:tcW w:w="2480" w:type="dxa"/>
+            <w:vAlign w:val="center"/>
+          </w:tcPr>
+          <w:p>
+            <w:pPr>
+              <w:rPr>
+                <w:rFonts w:ascii="Arial" w:hAnsi="Arial" w:cs="Arial"/>
+                <w:sz w:val="24"/>
+                <w:szCs w:val="24"/>
+              </w:rPr>
+            </w:pPr>
+            <w:r>
+              <w:rPr>
+                <w:rFonts w:ascii="Arial" w:hAnsi="Arial" w:cs="Arial"/>
+                <w:sz w:val="24"/>
+                <w:szCs w:val="24"/>
+              </w:rPr>
+              <w:t>Completado</w:t>
+            </w:r>
+          </w:p>
+        </w:tc>
+      </w:tr>
+    </w:tbl>
+    <w:p/>
+    <w:p>
+      <w:pPr>
+        <w:pStyle w:val="titulo1"/>
+        <w:outlineLvl w:val="2"/>
+      </w:pPr>
+      <w:r>
+        <w:rPr>
+          <w:sz w:val="32"/>
+          <w:szCs w:val="32"/>
+        </w:rPr>
+        <w:t>Gestión de Riesgos e Incidencias</w:t>
+      </w:r>
+    </w:p>
+    <w:tbl>
+      <w:tblPr>
+        <w:tblStyle w:val="Tablaconcuadrcula"/>
+        <w:tblW w:w="0" w:type="auto"/>
+        <w:jc w:val="center"/>
+        <w:tblBorders>
+          <w:top w:val="single" w:sz="4" w:space="0" w:color="7F7F7F" w:themeColor="text1" w:themeTint="80"/>
+          <w:left w:val="single" w:sz="4" w:space="0" w:color="7F7F7F" w:themeColor="text1" w:themeTint="80"/>
+          <w:bottom w:val="single" w:sz="4" w:space="0" w:color="7F7F7F" w:themeColor="text1" w:themeTint="80"/>
+          <w:right w:val="single" w:sz="4" w:space="0" w:color="7F7F7F" w:themeColor="text1" w:themeTint="80"/>
+          <w:insideH w:val="single" w:sz="4" w:space="0" w:color="7F7F7F" w:themeColor="text1" w:themeTint="80"/>
+          <w:insideV w:val="single" w:sz="4" w:space="0" w:color="7F7F7F" w:themeColor="text1" w:themeTint="80"/>
+        </w:tblBorders>
+        <w:tblLook w:val="04A0" w:firstRow="1" w:lastRow="0" w:firstColumn="1" w:lastColumn="0" w:noHBand="0" w:noVBand="1"/>
+      </w:tblPr>
+      <w:tblGrid>
+        <w:gridCol w:w="2834"/>
+        <w:gridCol w:w="2924"/>
+        <w:gridCol w:w="3592"/>
+      </w:tblGrid>
+      <w:tr>
+        <w:trPr>
+          <w:trHeight w:val="300"/>
+          <w:jc w:val="center"/>
+        </w:trPr>
+        <w:tc>
+          <w:tcPr>
+            <w:tcW w:w="2942" w:type="dxa"/>
+            <w:shd w:val="clear" w:color="auto" w:fill="262626" w:themeFill="text1" w:themeFillTint="D9"/>
+            <w:vAlign w:val="center"/>
+          </w:tcPr>
+          <w:p>
+            <w:pPr>
+              <w:jc w:val="center"/>
+              <w:rPr>
+                <w:rFonts w:ascii="Arial" w:hAnsi="Arial" w:cs="Arial"/>
+                <w:b/>
+                <w:bCs/>
+                <w:sz w:val="24"/>
+                <w:szCs w:val="24"/>
+              </w:rPr>
+            </w:pPr>
+            <w:r>
+              <w:rPr>
+                <w:rFonts w:ascii="Arial" w:hAnsi="Arial" w:cs="Arial"/>
+                <w:b/>
+                <w:bCs/>
+                <w:sz w:val="24"/>
+                <w:szCs w:val="24"/>
+              </w:rPr>
+              <w:lastRenderedPageBreak/>
+              <w:t>Riesgo / Problema detectado</w:t>
+            </w:r>
+          </w:p>
+        </w:tc>
+        <w:tc>
+          <w:tcPr>
+            <w:tcW w:w="2943" w:type="dxa"/>
+            <w:shd w:val="clear" w:color="auto" w:fill="262626" w:themeFill="text1" w:themeFillTint="D9"/>
+            <w:vAlign w:val="center"/>
+          </w:tcPr>
+          <w:p>
+            <w:pPr>
+              <w:jc w:val="center"/>
+              <w:rPr>
+                <w:rFonts w:ascii="Arial" w:hAnsi="Arial" w:cs="Arial"/>
+                <w:b/>
+                <w:bCs/>
+                <w:sz w:val="24"/>
+                <w:szCs w:val="24"/>
+              </w:rPr>
+            </w:pPr>
+            <w:r>
+              <w:rPr>
+                <w:rFonts w:ascii="Arial" w:hAnsi="Arial" w:cs="Arial"/>
+                <w:b/>
+                <w:bCs/>
+                <w:sz w:val="24"/>
+                <w:szCs w:val="24"/>
+              </w:rPr>
+              <w:t>Impacto en alcance/tiempo/costo</w:t>
+            </w:r>
+          </w:p>
+        </w:tc>
+        <w:tc>
+          <w:tcPr>
+            <w:tcW w:w="3749" w:type="dxa"/>
+            <w:shd w:val="clear" w:color="auto" w:fill="262626" w:themeFill="text1" w:themeFillTint="D9"/>
+            <w:vAlign w:val="center"/>
+          </w:tcPr>
+          <w:p>
+            <w:pPr>
+              <w:jc w:val="center"/>
+              <w:rPr>
+                <w:rFonts w:ascii="Arial" w:hAnsi="Arial" w:cs="Arial"/>
+                <w:b/>
+                <w:bCs/>
+                <w:sz w:val="24"/>
+                <w:szCs w:val="24"/>
+              </w:rPr>
+            </w:pPr>
+            <w:r>
+              <w:rPr>
+                <w:rFonts w:ascii="Arial" w:hAnsi="Arial" w:cs="Arial"/>
+                <w:b/>
+                <w:bCs/>
+                <w:sz w:val="24"/>
+                <w:szCs w:val="24"/>
+              </w:rPr>
+              <w:t>Acción correctiva o preventiva</w:t>
+            </w:r>
+          </w:p>
+        </w:tc>
+      </w:tr>
+      <w:tr>
+        <w:trPr>
+          <w:trHeight w:val="300"/>
+          <w:jc w:val="center"/>
+        </w:trPr>
+        <w:tc>
+          <w:tcPr>
+            <w:tcW w:w="2942" w:type="dxa"/>
+            <w:vAlign w:val="center"/>
+          </w:tcPr>
+          <w:p>
+            <w:pPr>
+              <w:rPr>
+                <w:rFonts w:ascii="Arial" w:hAnsi="Arial" w:cs="Arial"/>
+                <w:sz w:val="24"/>
+                <w:szCs w:val="24"/>
+              </w:rPr>
+            </w:pPr>
+            <w:r>
+              <w:rPr>
+                <w:rFonts w:ascii="Arial" w:hAnsi="Arial" w:cs="Arial"/>
+                <w:sz w:val="24"/>
+                <w:szCs w:val="24"/>
+              </w:rPr>
+              <w:t>--</w:t>
+            </w:r>
+          </w:p>
+        </w:tc>
+        <w:tc>
+          <w:tcPr>
+            <w:tcW w:w="2943" w:type="dxa"/>
+            <w:vAlign w:val="center"/>
+          </w:tcPr>
+          <w:p>
+            <w:pPr>
+              <w:jc w:val="center"/>
+              <w:rPr>
+                <w:rFonts w:ascii="Arial" w:hAnsi="Arial" w:cs="Arial"/>
+                <w:sz w:val="24"/>
+                <w:szCs w:val="24"/>
+              </w:rPr>
+            </w:pPr>
+            <w:r>
+              <w:rPr>
+                <w:rFonts w:ascii="Arial" w:hAnsi="Arial" w:cs="Arial"/>
+                <w:sz w:val="24"/>
+                <w:szCs w:val="24"/>
+              </w:rPr>
+              <w:t>--</w:t>
+            </w:r>
+          </w:p>
+        </w:tc>
+        <w:tc>
+          <w:tcPr>
+            <w:tcW w:w="3749" w:type="dxa"/>
+            <w:vAlign w:val="center"/>
+          </w:tcPr>
+          <w:p>
+            <w:r>
+              <w:rPr>
+                <w:rFonts w:ascii="Arial" w:hAnsi="Arial" w:cs="Arial"/>
+                <w:sz w:val="24"/>
+                <w:szCs w:val="24"/>
+              </w:rPr>
+              <w:t>--</w:t>
+            </w:r>
+          </w:p>
+        </w:tc>
+      </w:tr>
+    </w:tbl>
     <w:p/>
     <w:p>
       <w:r>
@@ -34159,7 +36239,7 @@
   <w:style w:type="paragraph" w:default="1" w:styleId="Normal">
     <w:name w:val="Normal"/>
     <w:qFormat/>
-    <w:rsid w:val="005003E9"/>
+    <w:rsid w:val="005452F8"/>
   </w:style>
   <w:style w:type="paragraph" w:styleId="Ttulo1">
     <w:name w:val="heading 1"/>

</xml_diff>

<commit_message>
:pencil2: Continuando puntos de función
</commit_message>
<xml_diff>
--- a/BITACORA.docx
+++ b/BITACORA.docx
@@ -4890,18 +4890,8 @@
                 <w:sz w:val="24"/>
                 <w:szCs w:val="24"/>
               </w:rPr>
-              <w:t xml:space="preserve">1 </w:t>
-            </w:r>
-            <w:proofErr w:type="spellStart"/>
-            <w:r>
-              <w:rPr>
-                <w:rFonts w:ascii="Arial" w:hAnsi="Arial" w:cs="Arial"/>
-                <w:sz w:val="24"/>
-                <w:szCs w:val="24"/>
-              </w:rPr>
-              <w:t>hr</w:t>
-            </w:r>
-            <w:proofErr w:type="spellEnd"/>
+              <w:t>1 hr</w:t>
+            </w:r>
           </w:p>
         </w:tc>
       </w:tr>
@@ -5371,18 +5361,8 @@
                 <w:sz w:val="24"/>
                 <w:szCs w:val="24"/>
               </w:rPr>
-              <w:t xml:space="preserve"> </w:t>
-            </w:r>
-            <w:proofErr w:type="spellStart"/>
-            <w:r>
-              <w:rPr>
-                <w:rFonts w:ascii="Arial" w:hAnsi="Arial" w:cs="Arial"/>
-                <w:sz w:val="24"/>
-                <w:szCs w:val="24"/>
-              </w:rPr>
-              <w:t>frontend</w:t>
-            </w:r>
-            <w:proofErr w:type="spellEnd"/>
+              <w:t xml:space="preserve"> frontend</w:t>
+            </w:r>
           </w:p>
         </w:tc>
         <w:tc>
@@ -5541,18 +5521,8 @@
                 <w:sz w:val="24"/>
                 <w:szCs w:val="24"/>
               </w:rPr>
-              <w:t xml:space="preserve">Desarrollador </w:t>
-            </w:r>
-            <w:proofErr w:type="spellStart"/>
-            <w:r>
-              <w:rPr>
-                <w:rFonts w:ascii="Arial" w:hAnsi="Arial" w:cs="Arial"/>
-                <w:sz w:val="24"/>
-                <w:szCs w:val="24"/>
-              </w:rPr>
-              <w:t>backend</w:t>
-            </w:r>
-            <w:proofErr w:type="spellEnd"/>
+              <w:t>Desarrollador backend</w:t>
+            </w:r>
           </w:p>
         </w:tc>
         <w:tc>
@@ -5854,40 +5824,16 @@
                 <w:szCs w:val="24"/>
               </w:rPr>
             </w:pPr>
-            <w:proofErr w:type="spellStart"/>
-            <w:r>
-              <w:rPr>
-                <w:rFonts w:ascii="Arial" w:hAnsi="Arial" w:cs="Arial"/>
-                <w:b/>
-                <w:bCs/>
-                <w:sz w:val="24"/>
-                <w:szCs w:val="24"/>
-              </w:rPr>
-              <w:t>Hr</w:t>
-            </w:r>
-            <w:proofErr w:type="spellEnd"/>
-            <w:r>
-              <w:rPr>
-                <w:rFonts w:ascii="Arial" w:hAnsi="Arial" w:cs="Arial"/>
-                <w:b/>
-                <w:bCs/>
-                <w:sz w:val="24"/>
-                <w:szCs w:val="24"/>
-              </w:rPr>
-              <w:t xml:space="preserve">. </w:t>
-            </w:r>
-            <w:proofErr w:type="spellStart"/>
-            <w:r>
-              <w:rPr>
-                <w:rFonts w:ascii="Arial" w:hAnsi="Arial" w:cs="Arial"/>
-                <w:b/>
-                <w:bCs/>
-                <w:sz w:val="24"/>
-                <w:szCs w:val="24"/>
-              </w:rPr>
-              <w:t>Ini</w:t>
-            </w:r>
-            <w:proofErr w:type="spellEnd"/>
+            <w:r>
+              <w:rPr>
+                <w:rFonts w:ascii="Arial" w:hAnsi="Arial" w:cs="Arial"/>
+                <w:b/>
+                <w:bCs/>
+                <w:sz w:val="24"/>
+                <w:szCs w:val="24"/>
+              </w:rPr>
+              <w:t>Hr. Ini</w:t>
+            </w:r>
           </w:p>
         </w:tc>
         <w:tc>
@@ -5907,27 +5853,15 @@
                 <w:szCs w:val="24"/>
               </w:rPr>
             </w:pPr>
-            <w:proofErr w:type="spellStart"/>
-            <w:r>
-              <w:rPr>
-                <w:rFonts w:ascii="Arial" w:hAnsi="Arial" w:cs="Arial"/>
-                <w:b/>
-                <w:bCs/>
-                <w:sz w:val="24"/>
-                <w:szCs w:val="24"/>
-              </w:rPr>
-              <w:t>Hr</w:t>
-            </w:r>
-            <w:proofErr w:type="spellEnd"/>
-            <w:r>
-              <w:rPr>
-                <w:rFonts w:ascii="Arial" w:hAnsi="Arial" w:cs="Arial"/>
-                <w:b/>
-                <w:bCs/>
-                <w:sz w:val="24"/>
-                <w:szCs w:val="24"/>
-              </w:rPr>
-              <w:t>. fin</w:t>
+            <w:r>
+              <w:rPr>
+                <w:rFonts w:ascii="Arial" w:hAnsi="Arial" w:cs="Arial"/>
+                <w:b/>
+                <w:bCs/>
+                <w:sz w:val="24"/>
+                <w:szCs w:val="24"/>
+              </w:rPr>
+              <w:t>Hr. fin</w:t>
             </w:r>
           </w:p>
         </w:tc>
@@ -7209,18 +7143,8 @@
                 <w:sz w:val="24"/>
                 <w:szCs w:val="24"/>
               </w:rPr>
-              <w:t xml:space="preserve">1 </w:t>
-            </w:r>
-            <w:proofErr w:type="spellStart"/>
-            <w:r>
-              <w:rPr>
-                <w:rFonts w:ascii="Arial" w:hAnsi="Arial" w:cs="Arial"/>
-                <w:sz w:val="24"/>
-                <w:szCs w:val="24"/>
-              </w:rPr>
-              <w:t>hr</w:t>
-            </w:r>
-            <w:proofErr w:type="spellEnd"/>
+              <w:t>1 hr</w:t>
+            </w:r>
           </w:p>
         </w:tc>
       </w:tr>
@@ -7666,18 +7590,8 @@
                 <w:sz w:val="24"/>
                 <w:szCs w:val="24"/>
               </w:rPr>
-              <w:t xml:space="preserve">Desarrolladora </w:t>
-            </w:r>
-            <w:proofErr w:type="spellStart"/>
-            <w:r>
-              <w:rPr>
-                <w:rFonts w:ascii="Arial" w:hAnsi="Arial" w:cs="Arial"/>
-                <w:sz w:val="24"/>
-                <w:szCs w:val="24"/>
-              </w:rPr>
-              <w:t>frontend</w:t>
-            </w:r>
-            <w:proofErr w:type="spellEnd"/>
+              <w:t>Desarrolladora frontend</w:t>
+            </w:r>
           </w:p>
         </w:tc>
         <w:tc>
@@ -7828,18 +7742,8 @@
                 <w:sz w:val="24"/>
                 <w:szCs w:val="24"/>
               </w:rPr>
-              <w:t xml:space="preserve">Desarrollador </w:t>
-            </w:r>
-            <w:proofErr w:type="spellStart"/>
-            <w:r>
-              <w:rPr>
-                <w:rFonts w:ascii="Arial" w:hAnsi="Arial" w:cs="Arial"/>
-                <w:sz w:val="24"/>
-                <w:szCs w:val="24"/>
-              </w:rPr>
-              <w:t>backend</w:t>
-            </w:r>
-            <w:proofErr w:type="spellEnd"/>
+              <w:t>Desarrollador backend</w:t>
+            </w:r>
           </w:p>
         </w:tc>
         <w:tc>
@@ -8159,40 +8063,16 @@
                 <w:szCs w:val="24"/>
               </w:rPr>
             </w:pPr>
-            <w:proofErr w:type="spellStart"/>
-            <w:r>
-              <w:rPr>
-                <w:rFonts w:ascii="Arial" w:hAnsi="Arial" w:cs="Arial"/>
-                <w:b/>
-                <w:bCs/>
-                <w:sz w:val="24"/>
-                <w:szCs w:val="24"/>
-              </w:rPr>
-              <w:t>Hr</w:t>
-            </w:r>
-            <w:proofErr w:type="spellEnd"/>
-            <w:r>
-              <w:rPr>
-                <w:rFonts w:ascii="Arial" w:hAnsi="Arial" w:cs="Arial"/>
-                <w:b/>
-                <w:bCs/>
-                <w:sz w:val="24"/>
-                <w:szCs w:val="24"/>
-              </w:rPr>
-              <w:t xml:space="preserve">. </w:t>
-            </w:r>
-            <w:proofErr w:type="spellStart"/>
-            <w:r>
-              <w:rPr>
-                <w:rFonts w:ascii="Arial" w:hAnsi="Arial" w:cs="Arial"/>
-                <w:b/>
-                <w:bCs/>
-                <w:sz w:val="24"/>
-                <w:szCs w:val="24"/>
-              </w:rPr>
-              <w:t>Ini</w:t>
-            </w:r>
-            <w:proofErr w:type="spellEnd"/>
+            <w:r>
+              <w:rPr>
+                <w:rFonts w:ascii="Arial" w:hAnsi="Arial" w:cs="Arial"/>
+                <w:b/>
+                <w:bCs/>
+                <w:sz w:val="24"/>
+                <w:szCs w:val="24"/>
+              </w:rPr>
+              <w:t>Hr. Ini</w:t>
+            </w:r>
           </w:p>
         </w:tc>
         <w:tc>
@@ -8212,27 +8092,15 @@
                 <w:szCs w:val="24"/>
               </w:rPr>
             </w:pPr>
-            <w:proofErr w:type="spellStart"/>
-            <w:r>
-              <w:rPr>
-                <w:rFonts w:ascii="Arial" w:hAnsi="Arial" w:cs="Arial"/>
-                <w:b/>
-                <w:bCs/>
-                <w:sz w:val="24"/>
-                <w:szCs w:val="24"/>
-              </w:rPr>
-              <w:t>Hr</w:t>
-            </w:r>
-            <w:proofErr w:type="spellEnd"/>
-            <w:r>
-              <w:rPr>
-                <w:rFonts w:ascii="Arial" w:hAnsi="Arial" w:cs="Arial"/>
-                <w:b/>
-                <w:bCs/>
-                <w:sz w:val="24"/>
-                <w:szCs w:val="24"/>
-              </w:rPr>
-              <w:t>. fin</w:t>
+            <w:r>
+              <w:rPr>
+                <w:rFonts w:ascii="Arial" w:hAnsi="Arial" w:cs="Arial"/>
+                <w:b/>
+                <w:bCs/>
+                <w:sz w:val="24"/>
+                <w:szCs w:val="24"/>
+              </w:rPr>
+              <w:t>Hr. fin</w:t>
             </w:r>
           </w:p>
         </w:tc>
@@ -9398,18 +9266,8 @@
                 <w:sz w:val="24"/>
                 <w:szCs w:val="24"/>
               </w:rPr>
-              <w:t xml:space="preserve">1 </w:t>
-            </w:r>
-            <w:proofErr w:type="spellStart"/>
-            <w:r>
-              <w:rPr>
-                <w:rFonts w:ascii="Arial" w:hAnsi="Arial" w:cs="Arial"/>
-                <w:sz w:val="24"/>
-                <w:szCs w:val="24"/>
-              </w:rPr>
-              <w:t>hr</w:t>
-            </w:r>
-            <w:proofErr w:type="spellEnd"/>
+              <w:t>1 hr</w:t>
+            </w:r>
           </w:p>
         </w:tc>
       </w:tr>
@@ -9829,18 +9687,8 @@
                 <w:sz w:val="24"/>
                 <w:szCs w:val="24"/>
               </w:rPr>
-              <w:t xml:space="preserve">Desarrolladora </w:t>
-            </w:r>
-            <w:proofErr w:type="spellStart"/>
-            <w:r>
-              <w:rPr>
-                <w:rFonts w:ascii="Arial" w:hAnsi="Arial" w:cs="Arial"/>
-                <w:sz w:val="24"/>
-                <w:szCs w:val="24"/>
-              </w:rPr>
-              <w:t>frontend</w:t>
-            </w:r>
-            <w:proofErr w:type="spellEnd"/>
+              <w:t>Desarrolladora frontend</w:t>
+            </w:r>
           </w:p>
         </w:tc>
         <w:tc>
@@ -9959,18 +9807,8 @@
                 <w:sz w:val="24"/>
                 <w:szCs w:val="24"/>
               </w:rPr>
-              <w:t xml:space="preserve">Desarrollador </w:t>
-            </w:r>
-            <w:proofErr w:type="spellStart"/>
-            <w:r>
-              <w:rPr>
-                <w:rFonts w:ascii="Arial" w:hAnsi="Arial" w:cs="Arial"/>
-                <w:sz w:val="24"/>
-                <w:szCs w:val="24"/>
-              </w:rPr>
-              <w:t>backend</w:t>
-            </w:r>
-            <w:proofErr w:type="spellEnd"/>
+              <w:t>Desarrollador backend</w:t>
+            </w:r>
           </w:p>
         </w:tc>
         <w:tc>
@@ -10177,40 +10015,16 @@
                 <w:szCs w:val="24"/>
               </w:rPr>
             </w:pPr>
-            <w:proofErr w:type="spellStart"/>
-            <w:r>
-              <w:rPr>
-                <w:rFonts w:ascii="Arial" w:hAnsi="Arial" w:cs="Arial"/>
-                <w:b/>
-                <w:bCs/>
-                <w:sz w:val="24"/>
-                <w:szCs w:val="24"/>
-              </w:rPr>
-              <w:t>Hr</w:t>
-            </w:r>
-            <w:proofErr w:type="spellEnd"/>
-            <w:r>
-              <w:rPr>
-                <w:rFonts w:ascii="Arial" w:hAnsi="Arial" w:cs="Arial"/>
-                <w:b/>
-                <w:bCs/>
-                <w:sz w:val="24"/>
-                <w:szCs w:val="24"/>
-              </w:rPr>
-              <w:t xml:space="preserve">. </w:t>
-            </w:r>
-            <w:proofErr w:type="spellStart"/>
-            <w:r>
-              <w:rPr>
-                <w:rFonts w:ascii="Arial" w:hAnsi="Arial" w:cs="Arial"/>
-                <w:b/>
-                <w:bCs/>
-                <w:sz w:val="24"/>
-                <w:szCs w:val="24"/>
-              </w:rPr>
-              <w:t>Ini</w:t>
-            </w:r>
-            <w:proofErr w:type="spellEnd"/>
+            <w:r>
+              <w:rPr>
+                <w:rFonts w:ascii="Arial" w:hAnsi="Arial" w:cs="Arial"/>
+                <w:b/>
+                <w:bCs/>
+                <w:sz w:val="24"/>
+                <w:szCs w:val="24"/>
+              </w:rPr>
+              <w:t>Hr. Ini</w:t>
+            </w:r>
           </w:p>
         </w:tc>
         <w:tc>
@@ -10230,27 +10044,15 @@
                 <w:szCs w:val="24"/>
               </w:rPr>
             </w:pPr>
-            <w:proofErr w:type="spellStart"/>
-            <w:r>
-              <w:rPr>
-                <w:rFonts w:ascii="Arial" w:hAnsi="Arial" w:cs="Arial"/>
-                <w:b/>
-                <w:bCs/>
-                <w:sz w:val="24"/>
-                <w:szCs w:val="24"/>
-              </w:rPr>
-              <w:t>Hr</w:t>
-            </w:r>
-            <w:proofErr w:type="spellEnd"/>
-            <w:r>
-              <w:rPr>
-                <w:rFonts w:ascii="Arial" w:hAnsi="Arial" w:cs="Arial"/>
-                <w:b/>
-                <w:bCs/>
-                <w:sz w:val="24"/>
-                <w:szCs w:val="24"/>
-              </w:rPr>
-              <w:t>. fin</w:t>
+            <w:r>
+              <w:rPr>
+                <w:rFonts w:ascii="Arial" w:hAnsi="Arial" w:cs="Arial"/>
+                <w:b/>
+                <w:bCs/>
+                <w:sz w:val="24"/>
+                <w:szCs w:val="24"/>
+              </w:rPr>
+              <w:t>Hr. fin</w:t>
             </w:r>
           </w:p>
         </w:tc>
@@ -10810,18 +10612,8 @@
                 <w:sz w:val="24"/>
                 <w:szCs w:val="24"/>
               </w:rPr>
-              <w:t xml:space="preserve">1 </w:t>
-            </w:r>
-            <w:proofErr w:type="spellStart"/>
-            <w:r>
-              <w:rPr>
-                <w:rFonts w:ascii="Arial" w:hAnsi="Arial" w:cs="Arial"/>
-                <w:sz w:val="24"/>
-                <w:szCs w:val="24"/>
-              </w:rPr>
-              <w:t>hr</w:t>
-            </w:r>
-            <w:proofErr w:type="spellEnd"/>
+              <w:t>1 hr</w:t>
+            </w:r>
           </w:p>
         </w:tc>
       </w:tr>
@@ -11297,18 +11089,8 @@
                 <w:sz w:val="24"/>
                 <w:szCs w:val="24"/>
               </w:rPr>
-              <w:t xml:space="preserve">Desarrolladora </w:t>
-            </w:r>
-            <w:proofErr w:type="spellStart"/>
-            <w:r>
-              <w:rPr>
-                <w:rFonts w:ascii="Arial" w:hAnsi="Arial" w:cs="Arial"/>
-                <w:sz w:val="24"/>
-                <w:szCs w:val="24"/>
-              </w:rPr>
-              <w:t>frontend</w:t>
-            </w:r>
-            <w:proofErr w:type="spellEnd"/>
+              <w:t>Desarrolladora frontend</w:t>
+            </w:r>
           </w:p>
         </w:tc>
         <w:tc>
@@ -11459,18 +11241,8 @@
                 <w:sz w:val="24"/>
                 <w:szCs w:val="24"/>
               </w:rPr>
-              <w:t xml:space="preserve">Desarrollador </w:t>
-            </w:r>
-            <w:proofErr w:type="spellStart"/>
-            <w:r>
-              <w:rPr>
-                <w:rFonts w:ascii="Arial" w:hAnsi="Arial" w:cs="Arial"/>
-                <w:sz w:val="24"/>
-                <w:szCs w:val="24"/>
-              </w:rPr>
-              <w:t>backend</w:t>
-            </w:r>
-            <w:proofErr w:type="spellEnd"/>
+              <w:t>Desarrollador backend</w:t>
+            </w:r>
           </w:p>
         </w:tc>
         <w:tc>
@@ -11764,40 +11536,16 @@
                 <w:szCs w:val="24"/>
               </w:rPr>
             </w:pPr>
-            <w:proofErr w:type="spellStart"/>
-            <w:r>
-              <w:rPr>
-                <w:rFonts w:ascii="Arial" w:hAnsi="Arial" w:cs="Arial"/>
-                <w:b/>
-                <w:bCs/>
-                <w:sz w:val="24"/>
-                <w:szCs w:val="24"/>
-              </w:rPr>
-              <w:t>Hr</w:t>
-            </w:r>
-            <w:proofErr w:type="spellEnd"/>
-            <w:r>
-              <w:rPr>
-                <w:rFonts w:ascii="Arial" w:hAnsi="Arial" w:cs="Arial"/>
-                <w:b/>
-                <w:bCs/>
-                <w:sz w:val="24"/>
-                <w:szCs w:val="24"/>
-              </w:rPr>
-              <w:t xml:space="preserve">. </w:t>
-            </w:r>
-            <w:proofErr w:type="spellStart"/>
-            <w:r>
-              <w:rPr>
-                <w:rFonts w:ascii="Arial" w:hAnsi="Arial" w:cs="Arial"/>
-                <w:b/>
-                <w:bCs/>
-                <w:sz w:val="24"/>
-                <w:szCs w:val="24"/>
-              </w:rPr>
-              <w:t>Ini</w:t>
-            </w:r>
-            <w:proofErr w:type="spellEnd"/>
+            <w:r>
+              <w:rPr>
+                <w:rFonts w:ascii="Arial" w:hAnsi="Arial" w:cs="Arial"/>
+                <w:b/>
+                <w:bCs/>
+                <w:sz w:val="24"/>
+                <w:szCs w:val="24"/>
+              </w:rPr>
+              <w:t>Hr. Ini</w:t>
+            </w:r>
           </w:p>
         </w:tc>
         <w:tc>
@@ -11817,27 +11565,15 @@
                 <w:szCs w:val="24"/>
               </w:rPr>
             </w:pPr>
-            <w:proofErr w:type="spellStart"/>
-            <w:r>
-              <w:rPr>
-                <w:rFonts w:ascii="Arial" w:hAnsi="Arial" w:cs="Arial"/>
-                <w:b/>
-                <w:bCs/>
-                <w:sz w:val="24"/>
-                <w:szCs w:val="24"/>
-              </w:rPr>
-              <w:t>Hr</w:t>
-            </w:r>
-            <w:proofErr w:type="spellEnd"/>
-            <w:r>
-              <w:rPr>
-                <w:rFonts w:ascii="Arial" w:hAnsi="Arial" w:cs="Arial"/>
-                <w:b/>
-                <w:bCs/>
-                <w:sz w:val="24"/>
-                <w:szCs w:val="24"/>
-              </w:rPr>
-              <w:t>. fin</w:t>
+            <w:r>
+              <w:rPr>
+                <w:rFonts w:ascii="Arial" w:hAnsi="Arial" w:cs="Arial"/>
+                <w:b/>
+                <w:bCs/>
+                <w:sz w:val="24"/>
+                <w:szCs w:val="24"/>
+              </w:rPr>
+              <w:t>Hr. fin</w:t>
             </w:r>
           </w:p>
         </w:tc>
@@ -13177,18 +12913,8 @@
                 <w:sz w:val="24"/>
                 <w:szCs w:val="24"/>
               </w:rPr>
-              <w:t xml:space="preserve">1 </w:t>
-            </w:r>
-            <w:proofErr w:type="spellStart"/>
-            <w:r>
-              <w:rPr>
-                <w:rFonts w:ascii="Arial" w:hAnsi="Arial" w:cs="Arial"/>
-                <w:sz w:val="24"/>
-                <w:szCs w:val="24"/>
-              </w:rPr>
-              <w:t>hr</w:t>
-            </w:r>
-            <w:proofErr w:type="spellEnd"/>
+              <w:t>1 hr</w:t>
+            </w:r>
           </w:p>
         </w:tc>
       </w:tr>
@@ -13632,18 +13358,8 @@
                 <w:sz w:val="24"/>
                 <w:szCs w:val="24"/>
               </w:rPr>
-              <w:t xml:space="preserve">Desarrolladora </w:t>
-            </w:r>
-            <w:proofErr w:type="spellStart"/>
-            <w:r>
-              <w:rPr>
-                <w:rFonts w:ascii="Arial" w:hAnsi="Arial" w:cs="Arial"/>
-                <w:sz w:val="24"/>
-                <w:szCs w:val="24"/>
-              </w:rPr>
-              <w:t>frontend</w:t>
-            </w:r>
-            <w:proofErr w:type="spellEnd"/>
+              <w:t>Desarrolladora frontend</w:t>
+            </w:r>
           </w:p>
         </w:tc>
         <w:tc>
@@ -13762,18 +13478,8 @@
                 <w:sz w:val="24"/>
                 <w:szCs w:val="24"/>
               </w:rPr>
-              <w:t xml:space="preserve">Desarrollador </w:t>
-            </w:r>
-            <w:proofErr w:type="spellStart"/>
-            <w:r>
-              <w:rPr>
-                <w:rFonts w:ascii="Arial" w:hAnsi="Arial" w:cs="Arial"/>
-                <w:sz w:val="24"/>
-                <w:szCs w:val="24"/>
-              </w:rPr>
-              <w:t>backend</w:t>
-            </w:r>
-            <w:proofErr w:type="spellEnd"/>
+              <w:t>Desarrollador backend</w:t>
+            </w:r>
           </w:p>
         </w:tc>
         <w:tc>
@@ -14053,40 +13759,16 @@
                 <w:szCs w:val="24"/>
               </w:rPr>
             </w:pPr>
-            <w:proofErr w:type="spellStart"/>
-            <w:r>
-              <w:rPr>
-                <w:rFonts w:ascii="Arial" w:hAnsi="Arial" w:cs="Arial"/>
-                <w:b/>
-                <w:bCs/>
-                <w:sz w:val="24"/>
-                <w:szCs w:val="24"/>
-              </w:rPr>
-              <w:t>Hr</w:t>
-            </w:r>
-            <w:proofErr w:type="spellEnd"/>
-            <w:r>
-              <w:rPr>
-                <w:rFonts w:ascii="Arial" w:hAnsi="Arial" w:cs="Arial"/>
-                <w:b/>
-                <w:bCs/>
-                <w:sz w:val="24"/>
-                <w:szCs w:val="24"/>
-              </w:rPr>
-              <w:t xml:space="preserve">. </w:t>
-            </w:r>
-            <w:proofErr w:type="spellStart"/>
-            <w:r>
-              <w:rPr>
-                <w:rFonts w:ascii="Arial" w:hAnsi="Arial" w:cs="Arial"/>
-                <w:b/>
-                <w:bCs/>
-                <w:sz w:val="24"/>
-                <w:szCs w:val="24"/>
-              </w:rPr>
-              <w:t>Ini</w:t>
-            </w:r>
-            <w:proofErr w:type="spellEnd"/>
+            <w:r>
+              <w:rPr>
+                <w:rFonts w:ascii="Arial" w:hAnsi="Arial" w:cs="Arial"/>
+                <w:b/>
+                <w:bCs/>
+                <w:sz w:val="24"/>
+                <w:szCs w:val="24"/>
+              </w:rPr>
+              <w:t>Hr. Ini</w:t>
+            </w:r>
           </w:p>
         </w:tc>
         <w:tc>
@@ -14106,27 +13788,15 @@
                 <w:szCs w:val="24"/>
               </w:rPr>
             </w:pPr>
-            <w:proofErr w:type="spellStart"/>
-            <w:r>
-              <w:rPr>
-                <w:rFonts w:ascii="Arial" w:hAnsi="Arial" w:cs="Arial"/>
-                <w:b/>
-                <w:bCs/>
-                <w:sz w:val="24"/>
-                <w:szCs w:val="24"/>
-              </w:rPr>
-              <w:t>Hr</w:t>
-            </w:r>
-            <w:proofErr w:type="spellEnd"/>
-            <w:r>
-              <w:rPr>
-                <w:rFonts w:ascii="Arial" w:hAnsi="Arial" w:cs="Arial"/>
-                <w:b/>
-                <w:bCs/>
-                <w:sz w:val="24"/>
-                <w:szCs w:val="24"/>
-              </w:rPr>
-              <w:t>. fin</w:t>
+            <w:r>
+              <w:rPr>
+                <w:rFonts w:ascii="Arial" w:hAnsi="Arial" w:cs="Arial"/>
+                <w:b/>
+                <w:bCs/>
+                <w:sz w:val="24"/>
+                <w:szCs w:val="24"/>
+              </w:rPr>
+              <w:t>Hr. fin</w:t>
             </w:r>
           </w:p>
         </w:tc>
@@ -15104,18 +14774,8 @@
                 <w:sz w:val="24"/>
                 <w:szCs w:val="24"/>
               </w:rPr>
-              <w:t xml:space="preserve">1 </w:t>
-            </w:r>
-            <w:proofErr w:type="spellStart"/>
-            <w:r>
-              <w:rPr>
-                <w:rFonts w:ascii="Arial" w:hAnsi="Arial" w:cs="Arial"/>
-                <w:sz w:val="24"/>
-                <w:szCs w:val="24"/>
-              </w:rPr>
-              <w:t>hr</w:t>
-            </w:r>
-            <w:proofErr w:type="spellEnd"/>
+              <w:t>1 hr</w:t>
+            </w:r>
             <w:r>
               <w:rPr>
                 <w:rFonts w:ascii="Arial" w:hAnsi="Arial" w:cs="Arial"/>
@@ -15658,18 +15318,8 @@
                 <w:sz w:val="24"/>
                 <w:szCs w:val="24"/>
               </w:rPr>
-              <w:t xml:space="preserve">Desarrolladora </w:t>
-            </w:r>
-            <w:proofErr w:type="spellStart"/>
-            <w:r>
-              <w:rPr>
-                <w:rFonts w:ascii="Arial" w:hAnsi="Arial" w:cs="Arial"/>
-                <w:sz w:val="24"/>
-                <w:szCs w:val="24"/>
-              </w:rPr>
-              <w:t>frontend</w:t>
-            </w:r>
-            <w:proofErr w:type="spellEnd"/>
+              <w:t>Desarrolladora frontend</w:t>
+            </w:r>
           </w:p>
         </w:tc>
         <w:tc>
@@ -15982,18 +15632,8 @@
                 <w:sz w:val="24"/>
                 <w:szCs w:val="24"/>
               </w:rPr>
-              <w:t xml:space="preserve">Desarrollador </w:t>
-            </w:r>
-            <w:proofErr w:type="spellStart"/>
-            <w:r>
-              <w:rPr>
-                <w:rFonts w:ascii="Arial" w:hAnsi="Arial" w:cs="Arial"/>
-                <w:sz w:val="24"/>
-                <w:szCs w:val="24"/>
-              </w:rPr>
-              <w:t>backend</w:t>
-            </w:r>
-            <w:proofErr w:type="spellEnd"/>
+              <w:t>Desarrollador backend</w:t>
+            </w:r>
           </w:p>
         </w:tc>
         <w:tc>
@@ -16380,40 +16020,16 @@
                 <w:szCs w:val="24"/>
               </w:rPr>
             </w:pPr>
-            <w:proofErr w:type="spellStart"/>
-            <w:r>
-              <w:rPr>
-                <w:rFonts w:ascii="Arial" w:hAnsi="Arial" w:cs="Arial"/>
-                <w:b/>
-                <w:bCs/>
-                <w:sz w:val="24"/>
-                <w:szCs w:val="24"/>
-              </w:rPr>
-              <w:t>Hr</w:t>
-            </w:r>
-            <w:proofErr w:type="spellEnd"/>
-            <w:r>
-              <w:rPr>
-                <w:rFonts w:ascii="Arial" w:hAnsi="Arial" w:cs="Arial"/>
-                <w:b/>
-                <w:bCs/>
-                <w:sz w:val="24"/>
-                <w:szCs w:val="24"/>
-              </w:rPr>
-              <w:t xml:space="preserve">. </w:t>
-            </w:r>
-            <w:proofErr w:type="spellStart"/>
-            <w:r>
-              <w:rPr>
-                <w:rFonts w:ascii="Arial" w:hAnsi="Arial" w:cs="Arial"/>
-                <w:b/>
-                <w:bCs/>
-                <w:sz w:val="24"/>
-                <w:szCs w:val="24"/>
-              </w:rPr>
-              <w:t>Ini</w:t>
-            </w:r>
-            <w:proofErr w:type="spellEnd"/>
+            <w:r>
+              <w:rPr>
+                <w:rFonts w:ascii="Arial" w:hAnsi="Arial" w:cs="Arial"/>
+                <w:b/>
+                <w:bCs/>
+                <w:sz w:val="24"/>
+                <w:szCs w:val="24"/>
+              </w:rPr>
+              <w:t>Hr. Ini</w:t>
+            </w:r>
           </w:p>
         </w:tc>
         <w:tc>
@@ -16433,27 +16049,15 @@
                 <w:szCs w:val="24"/>
               </w:rPr>
             </w:pPr>
-            <w:proofErr w:type="spellStart"/>
-            <w:r>
-              <w:rPr>
-                <w:rFonts w:ascii="Arial" w:hAnsi="Arial" w:cs="Arial"/>
-                <w:b/>
-                <w:bCs/>
-                <w:sz w:val="24"/>
-                <w:szCs w:val="24"/>
-              </w:rPr>
-              <w:t>Hr</w:t>
-            </w:r>
-            <w:proofErr w:type="spellEnd"/>
-            <w:r>
-              <w:rPr>
-                <w:rFonts w:ascii="Arial" w:hAnsi="Arial" w:cs="Arial"/>
-                <w:b/>
-                <w:bCs/>
-                <w:sz w:val="24"/>
-                <w:szCs w:val="24"/>
-              </w:rPr>
-              <w:t>. fin</w:t>
+            <w:r>
+              <w:rPr>
+                <w:rFonts w:ascii="Arial" w:hAnsi="Arial" w:cs="Arial"/>
+                <w:b/>
+                <w:bCs/>
+                <w:sz w:val="24"/>
+                <w:szCs w:val="24"/>
+              </w:rPr>
+              <w:t>Hr. fin</w:t>
             </w:r>
           </w:p>
         </w:tc>
@@ -17342,18 +16946,8 @@
                 <w:sz w:val="24"/>
                 <w:szCs w:val="24"/>
               </w:rPr>
-              <w:t xml:space="preserve">Elaborar documento con </w:t>
-            </w:r>
-            <w:proofErr w:type="spellStart"/>
-            <w:r>
-              <w:rPr>
-                <w:rFonts w:ascii="Arial" w:hAnsi="Arial" w:cs="Arial"/>
-                <w:sz w:val="24"/>
-                <w:szCs w:val="24"/>
-              </w:rPr>
-              <w:t>requisistos</w:t>
-            </w:r>
-            <w:proofErr w:type="spellEnd"/>
+              <w:t>Elaborar documento con requisistos</w:t>
+            </w:r>
           </w:p>
         </w:tc>
         <w:tc>
@@ -18212,18 +17806,8 @@
                 <w:sz w:val="24"/>
                 <w:szCs w:val="24"/>
               </w:rPr>
-              <w:t xml:space="preserve"> </w:t>
-            </w:r>
-            <w:proofErr w:type="spellStart"/>
-            <w:r>
-              <w:rPr>
-                <w:rFonts w:ascii="Arial" w:hAnsi="Arial" w:cs="Arial"/>
-                <w:sz w:val="24"/>
-                <w:szCs w:val="24"/>
-              </w:rPr>
-              <w:t>hr</w:t>
-            </w:r>
-            <w:proofErr w:type="spellEnd"/>
+              <w:t xml:space="preserve"> hr</w:t>
+            </w:r>
             <w:r>
               <w:rPr>
                 <w:rFonts w:ascii="Arial" w:hAnsi="Arial" w:cs="Arial"/>
@@ -18821,18 +18405,8 @@
                 <w:sz w:val="24"/>
                 <w:szCs w:val="24"/>
               </w:rPr>
-              <w:t xml:space="preserve">Desarrolladora </w:t>
-            </w:r>
-            <w:proofErr w:type="spellStart"/>
-            <w:r>
-              <w:rPr>
-                <w:rFonts w:ascii="Arial" w:hAnsi="Arial" w:cs="Arial"/>
-                <w:sz w:val="24"/>
-                <w:szCs w:val="24"/>
-              </w:rPr>
-              <w:t>frontend</w:t>
-            </w:r>
-            <w:proofErr w:type="spellEnd"/>
+              <w:t>Desarrolladora frontend</w:t>
+            </w:r>
           </w:p>
         </w:tc>
         <w:tc>
@@ -19033,18 +18607,8 @@
                 <w:sz w:val="24"/>
                 <w:szCs w:val="24"/>
               </w:rPr>
-              <w:t xml:space="preserve">Desarrollador </w:t>
-            </w:r>
-            <w:proofErr w:type="spellStart"/>
-            <w:r>
-              <w:rPr>
-                <w:rFonts w:ascii="Arial" w:hAnsi="Arial" w:cs="Arial"/>
-                <w:sz w:val="24"/>
-                <w:szCs w:val="24"/>
-              </w:rPr>
-              <w:t>backend</w:t>
-            </w:r>
-            <w:proofErr w:type="spellEnd"/>
+              <w:t>Desarrollador backend</w:t>
+            </w:r>
           </w:p>
         </w:tc>
         <w:tc>
@@ -19314,40 +18878,16 @@
                 <w:szCs w:val="24"/>
               </w:rPr>
             </w:pPr>
-            <w:proofErr w:type="spellStart"/>
-            <w:r>
-              <w:rPr>
-                <w:rFonts w:ascii="Arial" w:hAnsi="Arial" w:cs="Arial"/>
-                <w:b/>
-                <w:bCs/>
-                <w:sz w:val="24"/>
-                <w:szCs w:val="24"/>
-              </w:rPr>
-              <w:t>Hr</w:t>
-            </w:r>
-            <w:proofErr w:type="spellEnd"/>
-            <w:r>
-              <w:rPr>
-                <w:rFonts w:ascii="Arial" w:hAnsi="Arial" w:cs="Arial"/>
-                <w:b/>
-                <w:bCs/>
-                <w:sz w:val="24"/>
-                <w:szCs w:val="24"/>
-              </w:rPr>
-              <w:t xml:space="preserve">. </w:t>
-            </w:r>
-            <w:proofErr w:type="spellStart"/>
-            <w:r>
-              <w:rPr>
-                <w:rFonts w:ascii="Arial" w:hAnsi="Arial" w:cs="Arial"/>
-                <w:b/>
-                <w:bCs/>
-                <w:sz w:val="24"/>
-                <w:szCs w:val="24"/>
-              </w:rPr>
-              <w:t>Ini</w:t>
-            </w:r>
-            <w:proofErr w:type="spellEnd"/>
+            <w:r>
+              <w:rPr>
+                <w:rFonts w:ascii="Arial" w:hAnsi="Arial" w:cs="Arial"/>
+                <w:b/>
+                <w:bCs/>
+                <w:sz w:val="24"/>
+                <w:szCs w:val="24"/>
+              </w:rPr>
+              <w:t>Hr. Ini</w:t>
+            </w:r>
           </w:p>
         </w:tc>
         <w:tc>
@@ -19367,27 +18907,15 @@
                 <w:szCs w:val="24"/>
               </w:rPr>
             </w:pPr>
-            <w:proofErr w:type="spellStart"/>
-            <w:r>
-              <w:rPr>
-                <w:rFonts w:ascii="Arial" w:hAnsi="Arial" w:cs="Arial"/>
-                <w:b/>
-                <w:bCs/>
-                <w:sz w:val="24"/>
-                <w:szCs w:val="24"/>
-              </w:rPr>
-              <w:t>Hr</w:t>
-            </w:r>
-            <w:proofErr w:type="spellEnd"/>
-            <w:r>
-              <w:rPr>
-                <w:rFonts w:ascii="Arial" w:hAnsi="Arial" w:cs="Arial"/>
-                <w:b/>
-                <w:bCs/>
-                <w:sz w:val="24"/>
-                <w:szCs w:val="24"/>
-              </w:rPr>
-              <w:t>. fin</w:t>
+            <w:r>
+              <w:rPr>
+                <w:rFonts w:ascii="Arial" w:hAnsi="Arial" w:cs="Arial"/>
+                <w:b/>
+                <w:bCs/>
+                <w:sz w:val="24"/>
+                <w:szCs w:val="24"/>
+              </w:rPr>
+              <w:t>Hr. fin</w:t>
             </w:r>
           </w:p>
         </w:tc>
@@ -20440,18 +19968,8 @@
                 <w:sz w:val="24"/>
                 <w:szCs w:val="24"/>
               </w:rPr>
-              <w:t xml:space="preserve">3 </w:t>
-            </w:r>
-            <w:proofErr w:type="spellStart"/>
-            <w:r>
-              <w:rPr>
-                <w:rFonts w:ascii="Arial" w:hAnsi="Arial" w:cs="Arial"/>
-                <w:sz w:val="24"/>
-                <w:szCs w:val="24"/>
-              </w:rPr>
-              <w:t>hr</w:t>
-            </w:r>
-            <w:proofErr w:type="spellEnd"/>
+              <w:t>3 hr</w:t>
+            </w:r>
           </w:p>
         </w:tc>
       </w:tr>
@@ -20940,18 +20458,8 @@
                 <w:sz w:val="24"/>
                 <w:szCs w:val="24"/>
               </w:rPr>
-              <w:t xml:space="preserve">Desarrolladora </w:t>
-            </w:r>
-            <w:proofErr w:type="spellStart"/>
-            <w:r>
-              <w:rPr>
-                <w:rFonts w:ascii="Arial" w:hAnsi="Arial" w:cs="Arial"/>
-                <w:sz w:val="24"/>
-                <w:szCs w:val="24"/>
-              </w:rPr>
-              <w:t>frontend</w:t>
-            </w:r>
-            <w:proofErr w:type="spellEnd"/>
+              <w:t>Desarrolladora frontend</w:t>
+            </w:r>
           </w:p>
         </w:tc>
         <w:tc>
@@ -21082,18 +20590,8 @@
                 <w:sz w:val="24"/>
                 <w:szCs w:val="24"/>
               </w:rPr>
-              <w:t xml:space="preserve">Desarrollador </w:t>
-            </w:r>
-            <w:proofErr w:type="spellStart"/>
-            <w:r>
-              <w:rPr>
-                <w:rFonts w:ascii="Arial" w:hAnsi="Arial" w:cs="Arial"/>
-                <w:sz w:val="24"/>
-                <w:szCs w:val="24"/>
-              </w:rPr>
-              <w:t>backend</w:t>
-            </w:r>
-            <w:proofErr w:type="spellEnd"/>
+              <w:t>Desarrollador backend</w:t>
+            </w:r>
           </w:p>
         </w:tc>
         <w:tc>
@@ -21344,40 +20842,16 @@
                 <w:szCs w:val="24"/>
               </w:rPr>
             </w:pPr>
-            <w:proofErr w:type="spellStart"/>
-            <w:r>
-              <w:rPr>
-                <w:rFonts w:ascii="Arial" w:hAnsi="Arial" w:cs="Arial"/>
-                <w:b/>
-                <w:bCs/>
-                <w:sz w:val="24"/>
-                <w:szCs w:val="24"/>
-              </w:rPr>
-              <w:t>Hr</w:t>
-            </w:r>
-            <w:proofErr w:type="spellEnd"/>
-            <w:r>
-              <w:rPr>
-                <w:rFonts w:ascii="Arial" w:hAnsi="Arial" w:cs="Arial"/>
-                <w:b/>
-                <w:bCs/>
-                <w:sz w:val="24"/>
-                <w:szCs w:val="24"/>
-              </w:rPr>
-              <w:t xml:space="preserve">. </w:t>
-            </w:r>
-            <w:proofErr w:type="spellStart"/>
-            <w:r>
-              <w:rPr>
-                <w:rFonts w:ascii="Arial" w:hAnsi="Arial" w:cs="Arial"/>
-                <w:b/>
-                <w:bCs/>
-                <w:sz w:val="24"/>
-                <w:szCs w:val="24"/>
-              </w:rPr>
-              <w:t>Ini</w:t>
-            </w:r>
-            <w:proofErr w:type="spellEnd"/>
+            <w:r>
+              <w:rPr>
+                <w:rFonts w:ascii="Arial" w:hAnsi="Arial" w:cs="Arial"/>
+                <w:b/>
+                <w:bCs/>
+                <w:sz w:val="24"/>
+                <w:szCs w:val="24"/>
+              </w:rPr>
+              <w:t>Hr. Ini</w:t>
+            </w:r>
           </w:p>
         </w:tc>
         <w:tc>
@@ -21397,27 +20871,15 @@
                 <w:szCs w:val="24"/>
               </w:rPr>
             </w:pPr>
-            <w:proofErr w:type="spellStart"/>
-            <w:r>
-              <w:rPr>
-                <w:rFonts w:ascii="Arial" w:hAnsi="Arial" w:cs="Arial"/>
-                <w:b/>
-                <w:bCs/>
-                <w:sz w:val="24"/>
-                <w:szCs w:val="24"/>
-              </w:rPr>
-              <w:t>Hr</w:t>
-            </w:r>
-            <w:proofErr w:type="spellEnd"/>
-            <w:r>
-              <w:rPr>
-                <w:rFonts w:ascii="Arial" w:hAnsi="Arial" w:cs="Arial"/>
-                <w:b/>
-                <w:bCs/>
-                <w:sz w:val="24"/>
-                <w:szCs w:val="24"/>
-              </w:rPr>
-              <w:t>. fin</w:t>
+            <w:r>
+              <w:rPr>
+                <w:rFonts w:ascii="Arial" w:hAnsi="Arial" w:cs="Arial"/>
+                <w:b/>
+                <w:bCs/>
+                <w:sz w:val="24"/>
+                <w:szCs w:val="24"/>
+              </w:rPr>
+              <w:t>Hr. fin</w:t>
             </w:r>
           </w:p>
         </w:tc>
@@ -22932,18 +22394,8 @@
                 <w:sz w:val="24"/>
                 <w:szCs w:val="24"/>
               </w:rPr>
-              <w:t xml:space="preserve">1 </w:t>
-            </w:r>
-            <w:proofErr w:type="spellStart"/>
-            <w:r>
-              <w:rPr>
-                <w:rFonts w:ascii="Arial" w:hAnsi="Arial" w:cs="Arial"/>
-                <w:sz w:val="24"/>
-                <w:szCs w:val="24"/>
-              </w:rPr>
-              <w:t>hr</w:t>
-            </w:r>
-            <w:proofErr w:type="spellEnd"/>
+              <w:t>1 hr</w:t>
+            </w:r>
           </w:p>
         </w:tc>
       </w:tr>
@@ -23379,18 +22831,8 @@
                 <w:sz w:val="24"/>
                 <w:szCs w:val="24"/>
               </w:rPr>
-              <w:t xml:space="preserve">Desarrolladora </w:t>
-            </w:r>
-            <w:proofErr w:type="spellStart"/>
-            <w:r>
-              <w:rPr>
-                <w:rFonts w:ascii="Arial" w:hAnsi="Arial" w:cs="Arial"/>
-                <w:sz w:val="24"/>
-                <w:szCs w:val="24"/>
-              </w:rPr>
-              <w:t>frontend</w:t>
-            </w:r>
-            <w:proofErr w:type="spellEnd"/>
+              <w:t>Desarrolladora frontend</w:t>
+            </w:r>
           </w:p>
         </w:tc>
         <w:tc>
@@ -23465,43 +22907,7 @@
                 <w:sz w:val="24"/>
                 <w:szCs w:val="24"/>
               </w:rPr>
-              <w:t xml:space="preserve"> de </w:t>
-            </w:r>
-            <w:proofErr w:type="spellStart"/>
-            <w:r>
-              <w:rPr>
-                <w:rFonts w:ascii="Arial" w:hAnsi="Arial" w:cs="Arial"/>
-                <w:sz w:val="24"/>
-                <w:szCs w:val="24"/>
-              </w:rPr>
-              <w:t>stack</w:t>
-            </w:r>
-            <w:proofErr w:type="spellEnd"/>
-            <w:r>
-              <w:rPr>
-                <w:rFonts w:ascii="Arial" w:hAnsi="Arial" w:cs="Arial"/>
-                <w:sz w:val="24"/>
-                <w:szCs w:val="24"/>
-              </w:rPr>
-              <w:t xml:space="preserve"> para </w:t>
-            </w:r>
-            <w:proofErr w:type="spellStart"/>
-            <w:r>
-              <w:rPr>
-                <w:rFonts w:ascii="Arial" w:hAnsi="Arial" w:cs="Arial"/>
-                <w:sz w:val="24"/>
-                <w:szCs w:val="24"/>
-              </w:rPr>
-              <w:t>frontend</w:t>
-            </w:r>
-            <w:proofErr w:type="spellEnd"/>
-            <w:r>
-              <w:rPr>
-                <w:rFonts w:ascii="Arial" w:hAnsi="Arial" w:cs="Arial"/>
-                <w:sz w:val="24"/>
-                <w:szCs w:val="24"/>
-              </w:rPr>
-              <w:t xml:space="preserve"> </w:t>
+              <w:t xml:space="preserve"> de stack para frontend </w:t>
             </w:r>
           </w:p>
         </w:tc>
@@ -23581,18 +22987,8 @@
                 <w:sz w:val="24"/>
                 <w:szCs w:val="24"/>
               </w:rPr>
-              <w:t xml:space="preserve">Desarrollador </w:t>
-            </w:r>
-            <w:proofErr w:type="spellStart"/>
-            <w:r>
-              <w:rPr>
-                <w:rFonts w:ascii="Arial" w:hAnsi="Arial" w:cs="Arial"/>
-                <w:sz w:val="24"/>
-                <w:szCs w:val="24"/>
-              </w:rPr>
-              <w:t>backend</w:t>
-            </w:r>
-            <w:proofErr w:type="spellEnd"/>
+              <w:t>Desarrollador backend</w:t>
+            </w:r>
           </w:p>
         </w:tc>
         <w:tc>
@@ -23659,36 +23055,8 @@
                 <w:sz w:val="24"/>
                 <w:szCs w:val="24"/>
               </w:rPr>
-              <w:t xml:space="preserve"> de </w:t>
-            </w:r>
-            <w:proofErr w:type="spellStart"/>
-            <w:r>
-              <w:rPr>
-                <w:rFonts w:ascii="Arial" w:hAnsi="Arial" w:cs="Arial"/>
-                <w:sz w:val="24"/>
-                <w:szCs w:val="24"/>
-              </w:rPr>
-              <w:t>stack</w:t>
-            </w:r>
-            <w:proofErr w:type="spellEnd"/>
-            <w:r>
-              <w:rPr>
-                <w:rFonts w:ascii="Arial" w:hAnsi="Arial" w:cs="Arial"/>
-                <w:sz w:val="24"/>
-                <w:szCs w:val="24"/>
-              </w:rPr>
-              <w:t xml:space="preserve"> para </w:t>
-            </w:r>
-            <w:proofErr w:type="spellStart"/>
-            <w:r>
-              <w:rPr>
-                <w:rFonts w:ascii="Arial" w:hAnsi="Arial" w:cs="Arial"/>
-                <w:sz w:val="24"/>
-                <w:szCs w:val="24"/>
-              </w:rPr>
-              <w:t>backend</w:t>
-            </w:r>
-            <w:proofErr w:type="spellEnd"/>
+              <w:t xml:space="preserve"> de stack para backend</w:t>
+            </w:r>
           </w:p>
         </w:tc>
         <w:tc>
@@ -23862,40 +23230,16 @@
                 <w:szCs w:val="24"/>
               </w:rPr>
             </w:pPr>
-            <w:proofErr w:type="spellStart"/>
-            <w:r>
-              <w:rPr>
-                <w:rFonts w:ascii="Arial" w:hAnsi="Arial" w:cs="Arial"/>
-                <w:b/>
-                <w:bCs/>
-                <w:sz w:val="24"/>
-                <w:szCs w:val="24"/>
-              </w:rPr>
-              <w:t>Hr</w:t>
-            </w:r>
-            <w:proofErr w:type="spellEnd"/>
-            <w:r>
-              <w:rPr>
-                <w:rFonts w:ascii="Arial" w:hAnsi="Arial" w:cs="Arial"/>
-                <w:b/>
-                <w:bCs/>
-                <w:sz w:val="24"/>
-                <w:szCs w:val="24"/>
-              </w:rPr>
-              <w:t xml:space="preserve">. </w:t>
-            </w:r>
-            <w:proofErr w:type="spellStart"/>
-            <w:r>
-              <w:rPr>
-                <w:rFonts w:ascii="Arial" w:hAnsi="Arial" w:cs="Arial"/>
-                <w:b/>
-                <w:bCs/>
-                <w:sz w:val="24"/>
-                <w:szCs w:val="24"/>
-              </w:rPr>
-              <w:t>Ini</w:t>
-            </w:r>
-            <w:proofErr w:type="spellEnd"/>
+            <w:r>
+              <w:rPr>
+                <w:rFonts w:ascii="Arial" w:hAnsi="Arial" w:cs="Arial"/>
+                <w:b/>
+                <w:bCs/>
+                <w:sz w:val="24"/>
+                <w:szCs w:val="24"/>
+              </w:rPr>
+              <w:t>Hr. Ini</w:t>
+            </w:r>
           </w:p>
         </w:tc>
         <w:tc>
@@ -23915,27 +23259,15 @@
                 <w:szCs w:val="24"/>
               </w:rPr>
             </w:pPr>
-            <w:proofErr w:type="spellStart"/>
-            <w:r>
-              <w:rPr>
-                <w:rFonts w:ascii="Arial" w:hAnsi="Arial" w:cs="Arial"/>
-                <w:b/>
-                <w:bCs/>
-                <w:sz w:val="24"/>
-                <w:szCs w:val="24"/>
-              </w:rPr>
-              <w:t>Hr</w:t>
-            </w:r>
-            <w:proofErr w:type="spellEnd"/>
-            <w:r>
-              <w:rPr>
-                <w:rFonts w:ascii="Arial" w:hAnsi="Arial" w:cs="Arial"/>
-                <w:b/>
-                <w:bCs/>
-                <w:sz w:val="24"/>
-                <w:szCs w:val="24"/>
-              </w:rPr>
-              <w:t>. fin</w:t>
+            <w:r>
+              <w:rPr>
+                <w:rFonts w:ascii="Arial" w:hAnsi="Arial" w:cs="Arial"/>
+                <w:b/>
+                <w:bCs/>
+                <w:sz w:val="24"/>
+                <w:szCs w:val="24"/>
+              </w:rPr>
+              <w:t>Hr. fin</w:t>
             </w:r>
           </w:p>
         </w:tc>
@@ -24192,27 +23524,8 @@
                 <w:sz w:val="24"/>
                 <w:szCs w:val="24"/>
               </w:rPr>
-              <w:t xml:space="preserve">Análisis y modificación de </w:t>
-            </w:r>
-            <w:proofErr w:type="spellStart"/>
-            <w:r>
-              <w:rPr>
-                <w:rFonts w:ascii="Arial" w:hAnsi="Arial" w:cs="Arial"/>
-                <w:sz w:val="24"/>
-                <w:szCs w:val="24"/>
-              </w:rPr>
-              <w:t>stack</w:t>
-            </w:r>
-            <w:proofErr w:type="spellEnd"/>
-            <w:r>
-              <w:rPr>
-                <w:rFonts w:ascii="Arial" w:hAnsi="Arial" w:cs="Arial"/>
-                <w:sz w:val="24"/>
-                <w:szCs w:val="24"/>
-              </w:rPr>
-              <w:t xml:space="preserve"> para </w:t>
-            </w:r>
-            <w:proofErr w:type="spellStart"/>
+              <w:t xml:space="preserve">Análisis y modificación de stack para </w:t>
+            </w:r>
             <w:r>
               <w:rPr>
                 <w:rFonts w:ascii="Arial" w:hAnsi="Arial" w:cs="Arial"/>
@@ -24221,7 +23534,6 @@
               </w:rPr>
               <w:t>frontend</w:t>
             </w:r>
-            <w:proofErr w:type="spellEnd"/>
           </w:p>
         </w:tc>
         <w:tc>
@@ -24404,27 +23716,8 @@
                 <w:sz w:val="24"/>
                 <w:szCs w:val="24"/>
               </w:rPr>
-              <w:t xml:space="preserve">Análisis y modificación de </w:t>
-            </w:r>
-            <w:proofErr w:type="spellStart"/>
-            <w:r>
-              <w:rPr>
-                <w:rFonts w:ascii="Arial" w:hAnsi="Arial" w:cs="Arial"/>
-                <w:sz w:val="24"/>
-                <w:szCs w:val="24"/>
-              </w:rPr>
-              <w:t>stack</w:t>
-            </w:r>
-            <w:proofErr w:type="spellEnd"/>
-            <w:r>
-              <w:rPr>
-                <w:rFonts w:ascii="Arial" w:hAnsi="Arial" w:cs="Arial"/>
-                <w:sz w:val="24"/>
-                <w:szCs w:val="24"/>
-              </w:rPr>
-              <w:t xml:space="preserve"> para </w:t>
-            </w:r>
-            <w:proofErr w:type="spellStart"/>
+              <w:t xml:space="preserve">Análisis y modificación de stack para </w:t>
+            </w:r>
             <w:r>
               <w:rPr>
                 <w:rFonts w:ascii="Arial" w:hAnsi="Arial" w:cs="Arial"/>
@@ -24433,7 +23726,6 @@
               </w:rPr>
               <w:t>backend</w:t>
             </w:r>
-            <w:proofErr w:type="spellEnd"/>
           </w:p>
         </w:tc>
         <w:tc>
@@ -26891,18 +26183,8 @@
                 <w:sz w:val="24"/>
                 <w:szCs w:val="24"/>
               </w:rPr>
-              <w:t xml:space="preserve">1 </w:t>
-            </w:r>
-            <w:proofErr w:type="spellStart"/>
-            <w:r>
-              <w:rPr>
-                <w:rFonts w:ascii="Arial" w:hAnsi="Arial" w:cs="Arial"/>
-                <w:sz w:val="24"/>
-                <w:szCs w:val="24"/>
-              </w:rPr>
-              <w:t>hr</w:t>
-            </w:r>
-            <w:proofErr w:type="spellEnd"/>
+              <w:t>1 hr</w:t>
+            </w:r>
           </w:p>
         </w:tc>
       </w:tr>
@@ -27382,18 +26664,8 @@
                 <w:sz w:val="24"/>
                 <w:szCs w:val="24"/>
               </w:rPr>
-              <w:t xml:space="preserve">Desarrolladora </w:t>
-            </w:r>
-            <w:proofErr w:type="spellStart"/>
-            <w:r>
-              <w:rPr>
-                <w:rFonts w:ascii="Arial" w:hAnsi="Arial" w:cs="Arial"/>
-                <w:sz w:val="24"/>
-                <w:szCs w:val="24"/>
-              </w:rPr>
-              <w:t>frontend</w:t>
-            </w:r>
-            <w:proofErr w:type="spellEnd"/>
+              <w:t>Desarrolladora frontend</w:t>
+            </w:r>
           </w:p>
         </w:tc>
         <w:tc>
@@ -27497,18 +26769,8 @@
                 <w:sz w:val="24"/>
                 <w:szCs w:val="24"/>
               </w:rPr>
-              <w:t xml:space="preserve">, avance en </w:t>
-            </w:r>
-            <w:proofErr w:type="spellStart"/>
-            <w:r>
-              <w:rPr>
-                <w:rFonts w:ascii="Arial" w:hAnsi="Arial" w:cs="Arial"/>
-                <w:sz w:val="24"/>
-                <w:szCs w:val="24"/>
-              </w:rPr>
-              <w:t>grid</w:t>
-            </w:r>
-            <w:proofErr w:type="spellEnd"/>
+              <w:t>, avance en grid</w:t>
+            </w:r>
           </w:p>
         </w:tc>
       </w:tr>
@@ -27559,18 +26821,8 @@
                 <w:sz w:val="24"/>
                 <w:szCs w:val="24"/>
               </w:rPr>
-              <w:t xml:space="preserve">Desarrollador </w:t>
-            </w:r>
-            <w:proofErr w:type="spellStart"/>
-            <w:r>
-              <w:rPr>
-                <w:rFonts w:ascii="Arial" w:hAnsi="Arial" w:cs="Arial"/>
-                <w:sz w:val="24"/>
-                <w:szCs w:val="24"/>
-              </w:rPr>
-              <w:t>backend</w:t>
-            </w:r>
-            <w:proofErr w:type="spellEnd"/>
+              <w:t>Desarrollador backend</w:t>
+            </w:r>
           </w:p>
         </w:tc>
         <w:tc>
@@ -27826,40 +27078,16 @@
                 <w:szCs w:val="24"/>
               </w:rPr>
             </w:pPr>
-            <w:proofErr w:type="spellStart"/>
-            <w:r>
-              <w:rPr>
-                <w:rFonts w:ascii="Arial" w:hAnsi="Arial" w:cs="Arial"/>
-                <w:b/>
-                <w:bCs/>
-                <w:sz w:val="24"/>
-                <w:szCs w:val="24"/>
-              </w:rPr>
-              <w:t>Hr</w:t>
-            </w:r>
-            <w:proofErr w:type="spellEnd"/>
-            <w:r>
-              <w:rPr>
-                <w:rFonts w:ascii="Arial" w:hAnsi="Arial" w:cs="Arial"/>
-                <w:b/>
-                <w:bCs/>
-                <w:sz w:val="24"/>
-                <w:szCs w:val="24"/>
-              </w:rPr>
-              <w:t xml:space="preserve">. </w:t>
-            </w:r>
-            <w:proofErr w:type="spellStart"/>
-            <w:r>
-              <w:rPr>
-                <w:rFonts w:ascii="Arial" w:hAnsi="Arial" w:cs="Arial"/>
-                <w:b/>
-                <w:bCs/>
-                <w:sz w:val="24"/>
-                <w:szCs w:val="24"/>
-              </w:rPr>
-              <w:t>Ini</w:t>
-            </w:r>
-            <w:proofErr w:type="spellEnd"/>
+            <w:r>
+              <w:rPr>
+                <w:rFonts w:ascii="Arial" w:hAnsi="Arial" w:cs="Arial"/>
+                <w:b/>
+                <w:bCs/>
+                <w:sz w:val="24"/>
+                <w:szCs w:val="24"/>
+              </w:rPr>
+              <w:t>Hr. Ini</w:t>
+            </w:r>
           </w:p>
         </w:tc>
         <w:tc>
@@ -27879,27 +27107,15 @@
                 <w:szCs w:val="24"/>
               </w:rPr>
             </w:pPr>
-            <w:proofErr w:type="spellStart"/>
-            <w:r>
-              <w:rPr>
-                <w:rFonts w:ascii="Arial" w:hAnsi="Arial" w:cs="Arial"/>
-                <w:b/>
-                <w:bCs/>
-                <w:sz w:val="24"/>
-                <w:szCs w:val="24"/>
-              </w:rPr>
-              <w:t>Hr</w:t>
-            </w:r>
-            <w:proofErr w:type="spellEnd"/>
-            <w:r>
-              <w:rPr>
-                <w:rFonts w:ascii="Arial" w:hAnsi="Arial" w:cs="Arial"/>
-                <w:b/>
-                <w:bCs/>
-                <w:sz w:val="24"/>
-                <w:szCs w:val="24"/>
-              </w:rPr>
-              <w:t>. fin</w:t>
+            <w:r>
+              <w:rPr>
+                <w:rFonts w:ascii="Arial" w:hAnsi="Arial" w:cs="Arial"/>
+                <w:b/>
+                <w:bCs/>
+                <w:sz w:val="24"/>
+                <w:szCs w:val="24"/>
+              </w:rPr>
+              <w:t>Hr. fin</w:t>
             </w:r>
           </w:p>
         </w:tc>
@@ -29081,18 +28297,8 @@
                 <w:sz w:val="24"/>
                 <w:szCs w:val="24"/>
               </w:rPr>
-              <w:t xml:space="preserve">1 </w:t>
-            </w:r>
-            <w:proofErr w:type="spellStart"/>
-            <w:r>
-              <w:rPr>
-                <w:rFonts w:ascii="Arial" w:hAnsi="Arial" w:cs="Arial"/>
-                <w:sz w:val="24"/>
-                <w:szCs w:val="24"/>
-              </w:rPr>
-              <w:t>hr</w:t>
-            </w:r>
-            <w:proofErr w:type="spellEnd"/>
+              <w:t>1 hr</w:t>
+            </w:r>
           </w:p>
         </w:tc>
       </w:tr>
@@ -29558,18 +28764,8 @@
                 <w:sz w:val="24"/>
                 <w:szCs w:val="24"/>
               </w:rPr>
-              <w:t xml:space="preserve">Desarrolladora </w:t>
-            </w:r>
-            <w:proofErr w:type="spellStart"/>
-            <w:r>
-              <w:rPr>
-                <w:rFonts w:ascii="Arial" w:hAnsi="Arial" w:cs="Arial"/>
-                <w:sz w:val="24"/>
-                <w:szCs w:val="24"/>
-              </w:rPr>
-              <w:t>frontend</w:t>
-            </w:r>
-            <w:proofErr w:type="spellEnd"/>
+              <w:t>Desarrolladora frontend</w:t>
+            </w:r>
           </w:p>
         </w:tc>
         <w:tc>
@@ -29620,25 +28816,7 @@
                 <w:sz w:val="24"/>
                 <w:szCs w:val="24"/>
               </w:rPr>
-              <w:t xml:space="preserve">Continuación de prototipo: diseño de página (archivos </w:t>
-            </w:r>
-            <w:proofErr w:type="spellStart"/>
-            <w:r>
-              <w:rPr>
-                <w:rFonts w:ascii="Arial" w:hAnsi="Arial" w:cs="Arial"/>
-                <w:sz w:val="24"/>
-                <w:szCs w:val="24"/>
-              </w:rPr>
-              <w:t>css</w:t>
-            </w:r>
-            <w:proofErr w:type="spellEnd"/>
-            <w:r>
-              <w:rPr>
-                <w:rFonts w:ascii="Arial" w:hAnsi="Arial" w:cs="Arial"/>
-                <w:sz w:val="24"/>
-                <w:szCs w:val="24"/>
-              </w:rPr>
-              <w:t>)</w:t>
+              <w:t>Continuación de prototipo: diseño de página (archivos css)</w:t>
             </w:r>
             <w:r>
               <w:rPr>
@@ -29726,18 +28904,8 @@
                 <w:sz w:val="24"/>
                 <w:szCs w:val="24"/>
               </w:rPr>
-              <w:t xml:space="preserve">Desarrollador </w:t>
-            </w:r>
-            <w:proofErr w:type="spellStart"/>
-            <w:r>
-              <w:rPr>
-                <w:rFonts w:ascii="Arial" w:hAnsi="Arial" w:cs="Arial"/>
-                <w:sz w:val="24"/>
-                <w:szCs w:val="24"/>
-              </w:rPr>
-              <w:t>backend</w:t>
-            </w:r>
-            <w:proofErr w:type="spellEnd"/>
+              <w:t>Desarrollador backend</w:t>
+            </w:r>
           </w:p>
         </w:tc>
         <w:tc>
@@ -29971,40 +29139,16 @@
                 <w:szCs w:val="24"/>
               </w:rPr>
             </w:pPr>
-            <w:proofErr w:type="spellStart"/>
-            <w:r>
-              <w:rPr>
-                <w:rFonts w:ascii="Arial" w:hAnsi="Arial" w:cs="Arial"/>
-                <w:b/>
-                <w:bCs/>
-                <w:sz w:val="24"/>
-                <w:szCs w:val="24"/>
-              </w:rPr>
-              <w:t>Hr</w:t>
-            </w:r>
-            <w:proofErr w:type="spellEnd"/>
-            <w:r>
-              <w:rPr>
-                <w:rFonts w:ascii="Arial" w:hAnsi="Arial" w:cs="Arial"/>
-                <w:b/>
-                <w:bCs/>
-                <w:sz w:val="24"/>
-                <w:szCs w:val="24"/>
-              </w:rPr>
-              <w:t xml:space="preserve">. </w:t>
-            </w:r>
-            <w:proofErr w:type="spellStart"/>
-            <w:r>
-              <w:rPr>
-                <w:rFonts w:ascii="Arial" w:hAnsi="Arial" w:cs="Arial"/>
-                <w:b/>
-                <w:bCs/>
-                <w:sz w:val="24"/>
-                <w:szCs w:val="24"/>
-              </w:rPr>
-              <w:t>Ini</w:t>
-            </w:r>
-            <w:proofErr w:type="spellEnd"/>
+            <w:r>
+              <w:rPr>
+                <w:rFonts w:ascii="Arial" w:hAnsi="Arial" w:cs="Arial"/>
+                <w:b/>
+                <w:bCs/>
+                <w:sz w:val="24"/>
+                <w:szCs w:val="24"/>
+              </w:rPr>
+              <w:t>Hr. Ini</w:t>
+            </w:r>
           </w:p>
         </w:tc>
         <w:tc>
@@ -30024,27 +29168,15 @@
                 <w:szCs w:val="24"/>
               </w:rPr>
             </w:pPr>
-            <w:proofErr w:type="spellStart"/>
-            <w:r>
-              <w:rPr>
-                <w:rFonts w:ascii="Arial" w:hAnsi="Arial" w:cs="Arial"/>
-                <w:b/>
-                <w:bCs/>
-                <w:sz w:val="24"/>
-                <w:szCs w:val="24"/>
-              </w:rPr>
-              <w:t>Hr</w:t>
-            </w:r>
-            <w:proofErr w:type="spellEnd"/>
-            <w:r>
-              <w:rPr>
-                <w:rFonts w:ascii="Arial" w:hAnsi="Arial" w:cs="Arial"/>
-                <w:b/>
-                <w:bCs/>
-                <w:sz w:val="24"/>
-                <w:szCs w:val="24"/>
-              </w:rPr>
-              <w:t>. fin</w:t>
+            <w:r>
+              <w:rPr>
+                <w:rFonts w:ascii="Arial" w:hAnsi="Arial" w:cs="Arial"/>
+                <w:b/>
+                <w:bCs/>
+                <w:sz w:val="24"/>
+                <w:szCs w:val="24"/>
+              </w:rPr>
+              <w:t>Hr. fin</w:t>
             </w:r>
           </w:p>
         </w:tc>
@@ -30301,25 +29433,7 @@
                 <w:sz w:val="24"/>
                 <w:szCs w:val="24"/>
               </w:rPr>
-              <w:t xml:space="preserve">Adición de archivos </w:t>
-            </w:r>
-            <w:proofErr w:type="spellStart"/>
-            <w:r>
-              <w:rPr>
-                <w:rFonts w:ascii="Arial" w:hAnsi="Arial" w:cs="Arial"/>
-                <w:sz w:val="24"/>
-                <w:szCs w:val="24"/>
-              </w:rPr>
-              <w:t>css</w:t>
-            </w:r>
-            <w:proofErr w:type="spellEnd"/>
-            <w:r>
-              <w:rPr>
-                <w:rFonts w:ascii="Arial" w:hAnsi="Arial" w:cs="Arial"/>
-                <w:sz w:val="24"/>
-                <w:szCs w:val="24"/>
-              </w:rPr>
-              <w:t xml:space="preserve"> del proyecto.</w:t>
+              <w:t>Adición de archivos css del proyecto.</w:t>
             </w:r>
           </w:p>
         </w:tc>
@@ -31733,18 +30847,8 @@
                 <w:sz w:val="24"/>
                 <w:szCs w:val="24"/>
               </w:rPr>
-              <w:t xml:space="preserve">Desarrolladora </w:t>
-            </w:r>
-            <w:proofErr w:type="spellStart"/>
-            <w:r>
-              <w:rPr>
-                <w:rFonts w:ascii="Arial" w:hAnsi="Arial" w:cs="Arial"/>
-                <w:sz w:val="24"/>
-                <w:szCs w:val="24"/>
-              </w:rPr>
-              <w:t>frontend</w:t>
-            </w:r>
-            <w:proofErr w:type="spellEnd"/>
+              <w:t>Desarrolladora frontend</w:t>
+            </w:r>
           </w:p>
         </w:tc>
         <w:tc>
@@ -31795,25 +30899,7 @@
                 <w:sz w:val="24"/>
                 <w:szCs w:val="24"/>
               </w:rPr>
-              <w:t xml:space="preserve">Continuación de prototipo: diseño de página (archivos </w:t>
-            </w:r>
-            <w:proofErr w:type="spellStart"/>
-            <w:r>
-              <w:rPr>
-                <w:rFonts w:ascii="Arial" w:hAnsi="Arial" w:cs="Arial"/>
-                <w:sz w:val="24"/>
-                <w:szCs w:val="24"/>
-              </w:rPr>
-              <w:t>css</w:t>
-            </w:r>
-            <w:proofErr w:type="spellEnd"/>
-            <w:r>
-              <w:rPr>
-                <w:rFonts w:ascii="Arial" w:hAnsi="Arial" w:cs="Arial"/>
-                <w:sz w:val="24"/>
-                <w:szCs w:val="24"/>
-              </w:rPr>
-              <w:t xml:space="preserve">) </w:t>
+              <w:t xml:space="preserve">Continuación de prototipo: diseño de página (archivos css) </w:t>
             </w:r>
           </w:p>
         </w:tc>
@@ -31893,18 +30979,8 @@
                 <w:sz w:val="24"/>
                 <w:szCs w:val="24"/>
               </w:rPr>
-              <w:t xml:space="preserve">Desarrollador </w:t>
-            </w:r>
-            <w:proofErr w:type="spellStart"/>
-            <w:r>
-              <w:rPr>
-                <w:rFonts w:ascii="Arial" w:hAnsi="Arial" w:cs="Arial"/>
-                <w:sz w:val="24"/>
-                <w:szCs w:val="24"/>
-              </w:rPr>
-              <w:t>backend</w:t>
-            </w:r>
-            <w:proofErr w:type="spellEnd"/>
+              <w:t>Desarrollador backend</w:t>
+            </w:r>
           </w:p>
         </w:tc>
         <w:tc>
@@ -32136,40 +31212,16 @@
                 <w:szCs w:val="24"/>
               </w:rPr>
             </w:pPr>
-            <w:proofErr w:type="spellStart"/>
-            <w:r>
-              <w:rPr>
-                <w:rFonts w:ascii="Arial" w:hAnsi="Arial" w:cs="Arial"/>
-                <w:b/>
-                <w:bCs/>
-                <w:sz w:val="24"/>
-                <w:szCs w:val="24"/>
-              </w:rPr>
-              <w:t>Hr</w:t>
-            </w:r>
-            <w:proofErr w:type="spellEnd"/>
-            <w:r>
-              <w:rPr>
-                <w:rFonts w:ascii="Arial" w:hAnsi="Arial" w:cs="Arial"/>
-                <w:b/>
-                <w:bCs/>
-                <w:sz w:val="24"/>
-                <w:szCs w:val="24"/>
-              </w:rPr>
-              <w:t xml:space="preserve">. </w:t>
-            </w:r>
-            <w:proofErr w:type="spellStart"/>
-            <w:r>
-              <w:rPr>
-                <w:rFonts w:ascii="Arial" w:hAnsi="Arial" w:cs="Arial"/>
-                <w:b/>
-                <w:bCs/>
-                <w:sz w:val="24"/>
-                <w:szCs w:val="24"/>
-              </w:rPr>
-              <w:t>Ini</w:t>
-            </w:r>
-            <w:proofErr w:type="spellEnd"/>
+            <w:r>
+              <w:rPr>
+                <w:rFonts w:ascii="Arial" w:hAnsi="Arial" w:cs="Arial"/>
+                <w:b/>
+                <w:bCs/>
+                <w:sz w:val="24"/>
+                <w:szCs w:val="24"/>
+              </w:rPr>
+              <w:t>Hr. Ini</w:t>
+            </w:r>
           </w:p>
         </w:tc>
         <w:tc>
@@ -32189,27 +31241,15 @@
                 <w:szCs w:val="24"/>
               </w:rPr>
             </w:pPr>
-            <w:proofErr w:type="spellStart"/>
-            <w:r>
-              <w:rPr>
-                <w:rFonts w:ascii="Arial" w:hAnsi="Arial" w:cs="Arial"/>
-                <w:b/>
-                <w:bCs/>
-                <w:sz w:val="24"/>
-                <w:szCs w:val="24"/>
-              </w:rPr>
-              <w:t>Hr</w:t>
-            </w:r>
-            <w:proofErr w:type="spellEnd"/>
-            <w:r>
-              <w:rPr>
-                <w:rFonts w:ascii="Arial" w:hAnsi="Arial" w:cs="Arial"/>
-                <w:b/>
-                <w:bCs/>
-                <w:sz w:val="24"/>
-                <w:szCs w:val="24"/>
-              </w:rPr>
-              <w:t>. fin</w:t>
+            <w:r>
+              <w:rPr>
+                <w:rFonts w:ascii="Arial" w:hAnsi="Arial" w:cs="Arial"/>
+                <w:b/>
+                <w:bCs/>
+                <w:sz w:val="24"/>
+                <w:szCs w:val="24"/>
+              </w:rPr>
+              <w:t>Hr. fin</w:t>
             </w:r>
           </w:p>
         </w:tc>
@@ -32574,7 +31614,7 @@
                 <w:sz w:val="24"/>
                 <w:szCs w:val="24"/>
               </w:rPr>
-              <w:t>En proceso</w:t>
+              <w:t>Completado</w:t>
             </w:r>
           </w:p>
         </w:tc>

</xml_diff>

<commit_message>
:memo: Bitácora del 19 de mayo: Puntos de Función
</commit_message>
<xml_diff>
--- a/BITACORA.docx
+++ b/BITACORA.docx
@@ -4890,8 +4890,18 @@
                 <w:sz w:val="24"/>
                 <w:szCs w:val="24"/>
               </w:rPr>
-              <w:t>1 hr</w:t>
-            </w:r>
+              <w:t xml:space="preserve">1 </w:t>
+            </w:r>
+            <w:proofErr w:type="spellStart"/>
+            <w:r>
+              <w:rPr>
+                <w:rFonts w:ascii="Arial" w:hAnsi="Arial" w:cs="Arial"/>
+                <w:sz w:val="24"/>
+                <w:szCs w:val="24"/>
+              </w:rPr>
+              <w:t>hr</w:t>
+            </w:r>
+            <w:proofErr w:type="spellEnd"/>
           </w:p>
         </w:tc>
       </w:tr>
@@ -5361,8 +5371,18 @@
                 <w:sz w:val="24"/>
                 <w:szCs w:val="24"/>
               </w:rPr>
-              <w:t xml:space="preserve"> frontend</w:t>
-            </w:r>
+              <w:t xml:space="preserve"> </w:t>
+            </w:r>
+            <w:proofErr w:type="spellStart"/>
+            <w:r>
+              <w:rPr>
+                <w:rFonts w:ascii="Arial" w:hAnsi="Arial" w:cs="Arial"/>
+                <w:sz w:val="24"/>
+                <w:szCs w:val="24"/>
+              </w:rPr>
+              <w:t>frontend</w:t>
+            </w:r>
+            <w:proofErr w:type="spellEnd"/>
           </w:p>
         </w:tc>
         <w:tc>
@@ -5521,8 +5541,18 @@
                 <w:sz w:val="24"/>
                 <w:szCs w:val="24"/>
               </w:rPr>
-              <w:t>Desarrollador backend</w:t>
-            </w:r>
+              <w:t xml:space="preserve">Desarrollador </w:t>
+            </w:r>
+            <w:proofErr w:type="spellStart"/>
+            <w:r>
+              <w:rPr>
+                <w:rFonts w:ascii="Arial" w:hAnsi="Arial" w:cs="Arial"/>
+                <w:sz w:val="24"/>
+                <w:szCs w:val="24"/>
+              </w:rPr>
+              <w:t>backend</w:t>
+            </w:r>
+            <w:proofErr w:type="spellEnd"/>
           </w:p>
         </w:tc>
         <w:tc>
@@ -5824,16 +5854,40 @@
                 <w:szCs w:val="24"/>
               </w:rPr>
             </w:pPr>
-            <w:r>
-              <w:rPr>
-                <w:rFonts w:ascii="Arial" w:hAnsi="Arial" w:cs="Arial"/>
-                <w:b/>
-                <w:bCs/>
-                <w:sz w:val="24"/>
-                <w:szCs w:val="24"/>
-              </w:rPr>
-              <w:t>Hr. Ini</w:t>
-            </w:r>
+            <w:proofErr w:type="spellStart"/>
+            <w:r>
+              <w:rPr>
+                <w:rFonts w:ascii="Arial" w:hAnsi="Arial" w:cs="Arial"/>
+                <w:b/>
+                <w:bCs/>
+                <w:sz w:val="24"/>
+                <w:szCs w:val="24"/>
+              </w:rPr>
+              <w:t>Hr</w:t>
+            </w:r>
+            <w:proofErr w:type="spellEnd"/>
+            <w:r>
+              <w:rPr>
+                <w:rFonts w:ascii="Arial" w:hAnsi="Arial" w:cs="Arial"/>
+                <w:b/>
+                <w:bCs/>
+                <w:sz w:val="24"/>
+                <w:szCs w:val="24"/>
+              </w:rPr>
+              <w:t xml:space="preserve">. </w:t>
+            </w:r>
+            <w:proofErr w:type="spellStart"/>
+            <w:r>
+              <w:rPr>
+                <w:rFonts w:ascii="Arial" w:hAnsi="Arial" w:cs="Arial"/>
+                <w:b/>
+                <w:bCs/>
+                <w:sz w:val="24"/>
+                <w:szCs w:val="24"/>
+              </w:rPr>
+              <w:t>Ini</w:t>
+            </w:r>
+            <w:proofErr w:type="spellEnd"/>
           </w:p>
         </w:tc>
         <w:tc>
@@ -5853,15 +5907,27 @@
                 <w:szCs w:val="24"/>
               </w:rPr>
             </w:pPr>
-            <w:r>
-              <w:rPr>
-                <w:rFonts w:ascii="Arial" w:hAnsi="Arial" w:cs="Arial"/>
-                <w:b/>
-                <w:bCs/>
-                <w:sz w:val="24"/>
-                <w:szCs w:val="24"/>
-              </w:rPr>
-              <w:t>Hr. fin</w:t>
+            <w:proofErr w:type="spellStart"/>
+            <w:r>
+              <w:rPr>
+                <w:rFonts w:ascii="Arial" w:hAnsi="Arial" w:cs="Arial"/>
+                <w:b/>
+                <w:bCs/>
+                <w:sz w:val="24"/>
+                <w:szCs w:val="24"/>
+              </w:rPr>
+              <w:t>Hr</w:t>
+            </w:r>
+            <w:proofErr w:type="spellEnd"/>
+            <w:r>
+              <w:rPr>
+                <w:rFonts w:ascii="Arial" w:hAnsi="Arial" w:cs="Arial"/>
+                <w:b/>
+                <w:bCs/>
+                <w:sz w:val="24"/>
+                <w:szCs w:val="24"/>
+              </w:rPr>
+              <w:t>. fin</w:t>
             </w:r>
           </w:p>
         </w:tc>
@@ -7143,8 +7209,18 @@
                 <w:sz w:val="24"/>
                 <w:szCs w:val="24"/>
               </w:rPr>
-              <w:t>1 hr</w:t>
-            </w:r>
+              <w:t xml:space="preserve">1 </w:t>
+            </w:r>
+            <w:proofErr w:type="spellStart"/>
+            <w:r>
+              <w:rPr>
+                <w:rFonts w:ascii="Arial" w:hAnsi="Arial" w:cs="Arial"/>
+                <w:sz w:val="24"/>
+                <w:szCs w:val="24"/>
+              </w:rPr>
+              <w:t>hr</w:t>
+            </w:r>
+            <w:proofErr w:type="spellEnd"/>
           </w:p>
         </w:tc>
       </w:tr>
@@ -7590,8 +7666,18 @@
                 <w:sz w:val="24"/>
                 <w:szCs w:val="24"/>
               </w:rPr>
-              <w:t>Desarrolladora frontend</w:t>
-            </w:r>
+              <w:t xml:space="preserve">Desarrolladora </w:t>
+            </w:r>
+            <w:proofErr w:type="spellStart"/>
+            <w:r>
+              <w:rPr>
+                <w:rFonts w:ascii="Arial" w:hAnsi="Arial" w:cs="Arial"/>
+                <w:sz w:val="24"/>
+                <w:szCs w:val="24"/>
+              </w:rPr>
+              <w:t>frontend</w:t>
+            </w:r>
+            <w:proofErr w:type="spellEnd"/>
           </w:p>
         </w:tc>
         <w:tc>
@@ -7742,8 +7828,18 @@
                 <w:sz w:val="24"/>
                 <w:szCs w:val="24"/>
               </w:rPr>
-              <w:t>Desarrollador backend</w:t>
-            </w:r>
+              <w:t xml:space="preserve">Desarrollador </w:t>
+            </w:r>
+            <w:proofErr w:type="spellStart"/>
+            <w:r>
+              <w:rPr>
+                <w:rFonts w:ascii="Arial" w:hAnsi="Arial" w:cs="Arial"/>
+                <w:sz w:val="24"/>
+                <w:szCs w:val="24"/>
+              </w:rPr>
+              <w:t>backend</w:t>
+            </w:r>
+            <w:proofErr w:type="spellEnd"/>
           </w:p>
         </w:tc>
         <w:tc>
@@ -8063,16 +8159,40 @@
                 <w:szCs w:val="24"/>
               </w:rPr>
             </w:pPr>
-            <w:r>
-              <w:rPr>
-                <w:rFonts w:ascii="Arial" w:hAnsi="Arial" w:cs="Arial"/>
-                <w:b/>
-                <w:bCs/>
-                <w:sz w:val="24"/>
-                <w:szCs w:val="24"/>
-              </w:rPr>
-              <w:t>Hr. Ini</w:t>
-            </w:r>
+            <w:proofErr w:type="spellStart"/>
+            <w:r>
+              <w:rPr>
+                <w:rFonts w:ascii="Arial" w:hAnsi="Arial" w:cs="Arial"/>
+                <w:b/>
+                <w:bCs/>
+                <w:sz w:val="24"/>
+                <w:szCs w:val="24"/>
+              </w:rPr>
+              <w:t>Hr</w:t>
+            </w:r>
+            <w:proofErr w:type="spellEnd"/>
+            <w:r>
+              <w:rPr>
+                <w:rFonts w:ascii="Arial" w:hAnsi="Arial" w:cs="Arial"/>
+                <w:b/>
+                <w:bCs/>
+                <w:sz w:val="24"/>
+                <w:szCs w:val="24"/>
+              </w:rPr>
+              <w:t xml:space="preserve">. </w:t>
+            </w:r>
+            <w:proofErr w:type="spellStart"/>
+            <w:r>
+              <w:rPr>
+                <w:rFonts w:ascii="Arial" w:hAnsi="Arial" w:cs="Arial"/>
+                <w:b/>
+                <w:bCs/>
+                <w:sz w:val="24"/>
+                <w:szCs w:val="24"/>
+              </w:rPr>
+              <w:t>Ini</w:t>
+            </w:r>
+            <w:proofErr w:type="spellEnd"/>
           </w:p>
         </w:tc>
         <w:tc>
@@ -8092,15 +8212,27 @@
                 <w:szCs w:val="24"/>
               </w:rPr>
             </w:pPr>
-            <w:r>
-              <w:rPr>
-                <w:rFonts w:ascii="Arial" w:hAnsi="Arial" w:cs="Arial"/>
-                <w:b/>
-                <w:bCs/>
-                <w:sz w:val="24"/>
-                <w:szCs w:val="24"/>
-              </w:rPr>
-              <w:t>Hr. fin</w:t>
+            <w:proofErr w:type="spellStart"/>
+            <w:r>
+              <w:rPr>
+                <w:rFonts w:ascii="Arial" w:hAnsi="Arial" w:cs="Arial"/>
+                <w:b/>
+                <w:bCs/>
+                <w:sz w:val="24"/>
+                <w:szCs w:val="24"/>
+              </w:rPr>
+              <w:t>Hr</w:t>
+            </w:r>
+            <w:proofErr w:type="spellEnd"/>
+            <w:r>
+              <w:rPr>
+                <w:rFonts w:ascii="Arial" w:hAnsi="Arial" w:cs="Arial"/>
+                <w:b/>
+                <w:bCs/>
+                <w:sz w:val="24"/>
+                <w:szCs w:val="24"/>
+              </w:rPr>
+              <w:t>. fin</w:t>
             </w:r>
           </w:p>
         </w:tc>
@@ -9266,8 +9398,18 @@
                 <w:sz w:val="24"/>
                 <w:szCs w:val="24"/>
               </w:rPr>
-              <w:t>1 hr</w:t>
-            </w:r>
+              <w:t xml:space="preserve">1 </w:t>
+            </w:r>
+            <w:proofErr w:type="spellStart"/>
+            <w:r>
+              <w:rPr>
+                <w:rFonts w:ascii="Arial" w:hAnsi="Arial" w:cs="Arial"/>
+                <w:sz w:val="24"/>
+                <w:szCs w:val="24"/>
+              </w:rPr>
+              <w:t>hr</w:t>
+            </w:r>
+            <w:proofErr w:type="spellEnd"/>
           </w:p>
         </w:tc>
       </w:tr>
@@ -9687,8 +9829,18 @@
                 <w:sz w:val="24"/>
                 <w:szCs w:val="24"/>
               </w:rPr>
-              <w:t>Desarrolladora frontend</w:t>
-            </w:r>
+              <w:t xml:space="preserve">Desarrolladora </w:t>
+            </w:r>
+            <w:proofErr w:type="spellStart"/>
+            <w:r>
+              <w:rPr>
+                <w:rFonts w:ascii="Arial" w:hAnsi="Arial" w:cs="Arial"/>
+                <w:sz w:val="24"/>
+                <w:szCs w:val="24"/>
+              </w:rPr>
+              <w:t>frontend</w:t>
+            </w:r>
+            <w:proofErr w:type="spellEnd"/>
           </w:p>
         </w:tc>
         <w:tc>
@@ -9807,8 +9959,18 @@
                 <w:sz w:val="24"/>
                 <w:szCs w:val="24"/>
               </w:rPr>
-              <w:t>Desarrollador backend</w:t>
-            </w:r>
+              <w:t xml:space="preserve">Desarrollador </w:t>
+            </w:r>
+            <w:proofErr w:type="spellStart"/>
+            <w:r>
+              <w:rPr>
+                <w:rFonts w:ascii="Arial" w:hAnsi="Arial" w:cs="Arial"/>
+                <w:sz w:val="24"/>
+                <w:szCs w:val="24"/>
+              </w:rPr>
+              <w:t>backend</w:t>
+            </w:r>
+            <w:proofErr w:type="spellEnd"/>
           </w:p>
         </w:tc>
         <w:tc>
@@ -10015,16 +10177,40 @@
                 <w:szCs w:val="24"/>
               </w:rPr>
             </w:pPr>
-            <w:r>
-              <w:rPr>
-                <w:rFonts w:ascii="Arial" w:hAnsi="Arial" w:cs="Arial"/>
-                <w:b/>
-                <w:bCs/>
-                <w:sz w:val="24"/>
-                <w:szCs w:val="24"/>
-              </w:rPr>
-              <w:t>Hr. Ini</w:t>
-            </w:r>
+            <w:proofErr w:type="spellStart"/>
+            <w:r>
+              <w:rPr>
+                <w:rFonts w:ascii="Arial" w:hAnsi="Arial" w:cs="Arial"/>
+                <w:b/>
+                <w:bCs/>
+                <w:sz w:val="24"/>
+                <w:szCs w:val="24"/>
+              </w:rPr>
+              <w:t>Hr</w:t>
+            </w:r>
+            <w:proofErr w:type="spellEnd"/>
+            <w:r>
+              <w:rPr>
+                <w:rFonts w:ascii="Arial" w:hAnsi="Arial" w:cs="Arial"/>
+                <w:b/>
+                <w:bCs/>
+                <w:sz w:val="24"/>
+                <w:szCs w:val="24"/>
+              </w:rPr>
+              <w:t xml:space="preserve">. </w:t>
+            </w:r>
+            <w:proofErr w:type="spellStart"/>
+            <w:r>
+              <w:rPr>
+                <w:rFonts w:ascii="Arial" w:hAnsi="Arial" w:cs="Arial"/>
+                <w:b/>
+                <w:bCs/>
+                <w:sz w:val="24"/>
+                <w:szCs w:val="24"/>
+              </w:rPr>
+              <w:t>Ini</w:t>
+            </w:r>
+            <w:proofErr w:type="spellEnd"/>
           </w:p>
         </w:tc>
         <w:tc>
@@ -10044,15 +10230,27 @@
                 <w:szCs w:val="24"/>
               </w:rPr>
             </w:pPr>
-            <w:r>
-              <w:rPr>
-                <w:rFonts w:ascii="Arial" w:hAnsi="Arial" w:cs="Arial"/>
-                <w:b/>
-                <w:bCs/>
-                <w:sz w:val="24"/>
-                <w:szCs w:val="24"/>
-              </w:rPr>
-              <w:t>Hr. fin</w:t>
+            <w:proofErr w:type="spellStart"/>
+            <w:r>
+              <w:rPr>
+                <w:rFonts w:ascii="Arial" w:hAnsi="Arial" w:cs="Arial"/>
+                <w:b/>
+                <w:bCs/>
+                <w:sz w:val="24"/>
+                <w:szCs w:val="24"/>
+              </w:rPr>
+              <w:t>Hr</w:t>
+            </w:r>
+            <w:proofErr w:type="spellEnd"/>
+            <w:r>
+              <w:rPr>
+                <w:rFonts w:ascii="Arial" w:hAnsi="Arial" w:cs="Arial"/>
+                <w:b/>
+                <w:bCs/>
+                <w:sz w:val="24"/>
+                <w:szCs w:val="24"/>
+              </w:rPr>
+              <w:t>. fin</w:t>
             </w:r>
           </w:p>
         </w:tc>
@@ -10612,8 +10810,18 @@
                 <w:sz w:val="24"/>
                 <w:szCs w:val="24"/>
               </w:rPr>
-              <w:t>1 hr</w:t>
-            </w:r>
+              <w:t xml:space="preserve">1 </w:t>
+            </w:r>
+            <w:proofErr w:type="spellStart"/>
+            <w:r>
+              <w:rPr>
+                <w:rFonts w:ascii="Arial" w:hAnsi="Arial" w:cs="Arial"/>
+                <w:sz w:val="24"/>
+                <w:szCs w:val="24"/>
+              </w:rPr>
+              <w:t>hr</w:t>
+            </w:r>
+            <w:proofErr w:type="spellEnd"/>
           </w:p>
         </w:tc>
       </w:tr>
@@ -11089,8 +11297,18 @@
                 <w:sz w:val="24"/>
                 <w:szCs w:val="24"/>
               </w:rPr>
-              <w:t>Desarrolladora frontend</w:t>
-            </w:r>
+              <w:t xml:space="preserve">Desarrolladora </w:t>
+            </w:r>
+            <w:proofErr w:type="spellStart"/>
+            <w:r>
+              <w:rPr>
+                <w:rFonts w:ascii="Arial" w:hAnsi="Arial" w:cs="Arial"/>
+                <w:sz w:val="24"/>
+                <w:szCs w:val="24"/>
+              </w:rPr>
+              <w:t>frontend</w:t>
+            </w:r>
+            <w:proofErr w:type="spellEnd"/>
           </w:p>
         </w:tc>
         <w:tc>
@@ -11241,8 +11459,18 @@
                 <w:sz w:val="24"/>
                 <w:szCs w:val="24"/>
               </w:rPr>
-              <w:t>Desarrollador backend</w:t>
-            </w:r>
+              <w:t xml:space="preserve">Desarrollador </w:t>
+            </w:r>
+            <w:proofErr w:type="spellStart"/>
+            <w:r>
+              <w:rPr>
+                <w:rFonts w:ascii="Arial" w:hAnsi="Arial" w:cs="Arial"/>
+                <w:sz w:val="24"/>
+                <w:szCs w:val="24"/>
+              </w:rPr>
+              <w:t>backend</w:t>
+            </w:r>
+            <w:proofErr w:type="spellEnd"/>
           </w:p>
         </w:tc>
         <w:tc>
@@ -11536,16 +11764,40 @@
                 <w:szCs w:val="24"/>
               </w:rPr>
             </w:pPr>
-            <w:r>
-              <w:rPr>
-                <w:rFonts w:ascii="Arial" w:hAnsi="Arial" w:cs="Arial"/>
-                <w:b/>
-                <w:bCs/>
-                <w:sz w:val="24"/>
-                <w:szCs w:val="24"/>
-              </w:rPr>
-              <w:t>Hr. Ini</w:t>
-            </w:r>
+            <w:proofErr w:type="spellStart"/>
+            <w:r>
+              <w:rPr>
+                <w:rFonts w:ascii="Arial" w:hAnsi="Arial" w:cs="Arial"/>
+                <w:b/>
+                <w:bCs/>
+                <w:sz w:val="24"/>
+                <w:szCs w:val="24"/>
+              </w:rPr>
+              <w:t>Hr</w:t>
+            </w:r>
+            <w:proofErr w:type="spellEnd"/>
+            <w:r>
+              <w:rPr>
+                <w:rFonts w:ascii="Arial" w:hAnsi="Arial" w:cs="Arial"/>
+                <w:b/>
+                <w:bCs/>
+                <w:sz w:val="24"/>
+                <w:szCs w:val="24"/>
+              </w:rPr>
+              <w:t xml:space="preserve">. </w:t>
+            </w:r>
+            <w:proofErr w:type="spellStart"/>
+            <w:r>
+              <w:rPr>
+                <w:rFonts w:ascii="Arial" w:hAnsi="Arial" w:cs="Arial"/>
+                <w:b/>
+                <w:bCs/>
+                <w:sz w:val="24"/>
+                <w:szCs w:val="24"/>
+              </w:rPr>
+              <w:t>Ini</w:t>
+            </w:r>
+            <w:proofErr w:type="spellEnd"/>
           </w:p>
         </w:tc>
         <w:tc>
@@ -11565,15 +11817,27 @@
                 <w:szCs w:val="24"/>
               </w:rPr>
             </w:pPr>
-            <w:r>
-              <w:rPr>
-                <w:rFonts w:ascii="Arial" w:hAnsi="Arial" w:cs="Arial"/>
-                <w:b/>
-                <w:bCs/>
-                <w:sz w:val="24"/>
-                <w:szCs w:val="24"/>
-              </w:rPr>
-              <w:t>Hr. fin</w:t>
+            <w:proofErr w:type="spellStart"/>
+            <w:r>
+              <w:rPr>
+                <w:rFonts w:ascii="Arial" w:hAnsi="Arial" w:cs="Arial"/>
+                <w:b/>
+                <w:bCs/>
+                <w:sz w:val="24"/>
+                <w:szCs w:val="24"/>
+              </w:rPr>
+              <w:t>Hr</w:t>
+            </w:r>
+            <w:proofErr w:type="spellEnd"/>
+            <w:r>
+              <w:rPr>
+                <w:rFonts w:ascii="Arial" w:hAnsi="Arial" w:cs="Arial"/>
+                <w:b/>
+                <w:bCs/>
+                <w:sz w:val="24"/>
+                <w:szCs w:val="24"/>
+              </w:rPr>
+              <w:t>. fin</w:t>
             </w:r>
           </w:p>
         </w:tc>
@@ -12913,8 +13177,18 @@
                 <w:sz w:val="24"/>
                 <w:szCs w:val="24"/>
               </w:rPr>
-              <w:t>1 hr</w:t>
-            </w:r>
+              <w:t xml:space="preserve">1 </w:t>
+            </w:r>
+            <w:proofErr w:type="spellStart"/>
+            <w:r>
+              <w:rPr>
+                <w:rFonts w:ascii="Arial" w:hAnsi="Arial" w:cs="Arial"/>
+                <w:sz w:val="24"/>
+                <w:szCs w:val="24"/>
+              </w:rPr>
+              <w:t>hr</w:t>
+            </w:r>
+            <w:proofErr w:type="spellEnd"/>
           </w:p>
         </w:tc>
       </w:tr>
@@ -13358,8 +13632,18 @@
                 <w:sz w:val="24"/>
                 <w:szCs w:val="24"/>
               </w:rPr>
-              <w:t>Desarrolladora frontend</w:t>
-            </w:r>
+              <w:t xml:space="preserve">Desarrolladora </w:t>
+            </w:r>
+            <w:proofErr w:type="spellStart"/>
+            <w:r>
+              <w:rPr>
+                <w:rFonts w:ascii="Arial" w:hAnsi="Arial" w:cs="Arial"/>
+                <w:sz w:val="24"/>
+                <w:szCs w:val="24"/>
+              </w:rPr>
+              <w:t>frontend</w:t>
+            </w:r>
+            <w:proofErr w:type="spellEnd"/>
           </w:p>
         </w:tc>
         <w:tc>
@@ -13478,8 +13762,18 @@
                 <w:sz w:val="24"/>
                 <w:szCs w:val="24"/>
               </w:rPr>
-              <w:t>Desarrollador backend</w:t>
-            </w:r>
+              <w:t xml:space="preserve">Desarrollador </w:t>
+            </w:r>
+            <w:proofErr w:type="spellStart"/>
+            <w:r>
+              <w:rPr>
+                <w:rFonts w:ascii="Arial" w:hAnsi="Arial" w:cs="Arial"/>
+                <w:sz w:val="24"/>
+                <w:szCs w:val="24"/>
+              </w:rPr>
+              <w:t>backend</w:t>
+            </w:r>
+            <w:proofErr w:type="spellEnd"/>
           </w:p>
         </w:tc>
         <w:tc>
@@ -13759,16 +14053,40 @@
                 <w:szCs w:val="24"/>
               </w:rPr>
             </w:pPr>
-            <w:r>
-              <w:rPr>
-                <w:rFonts w:ascii="Arial" w:hAnsi="Arial" w:cs="Arial"/>
-                <w:b/>
-                <w:bCs/>
-                <w:sz w:val="24"/>
-                <w:szCs w:val="24"/>
-              </w:rPr>
-              <w:t>Hr. Ini</w:t>
-            </w:r>
+            <w:proofErr w:type="spellStart"/>
+            <w:r>
+              <w:rPr>
+                <w:rFonts w:ascii="Arial" w:hAnsi="Arial" w:cs="Arial"/>
+                <w:b/>
+                <w:bCs/>
+                <w:sz w:val="24"/>
+                <w:szCs w:val="24"/>
+              </w:rPr>
+              <w:t>Hr</w:t>
+            </w:r>
+            <w:proofErr w:type="spellEnd"/>
+            <w:r>
+              <w:rPr>
+                <w:rFonts w:ascii="Arial" w:hAnsi="Arial" w:cs="Arial"/>
+                <w:b/>
+                <w:bCs/>
+                <w:sz w:val="24"/>
+                <w:szCs w:val="24"/>
+              </w:rPr>
+              <w:t xml:space="preserve">. </w:t>
+            </w:r>
+            <w:proofErr w:type="spellStart"/>
+            <w:r>
+              <w:rPr>
+                <w:rFonts w:ascii="Arial" w:hAnsi="Arial" w:cs="Arial"/>
+                <w:b/>
+                <w:bCs/>
+                <w:sz w:val="24"/>
+                <w:szCs w:val="24"/>
+              </w:rPr>
+              <w:t>Ini</w:t>
+            </w:r>
+            <w:proofErr w:type="spellEnd"/>
           </w:p>
         </w:tc>
         <w:tc>
@@ -13788,15 +14106,27 @@
                 <w:szCs w:val="24"/>
               </w:rPr>
             </w:pPr>
-            <w:r>
-              <w:rPr>
-                <w:rFonts w:ascii="Arial" w:hAnsi="Arial" w:cs="Arial"/>
-                <w:b/>
-                <w:bCs/>
-                <w:sz w:val="24"/>
-                <w:szCs w:val="24"/>
-              </w:rPr>
-              <w:t>Hr. fin</w:t>
+            <w:proofErr w:type="spellStart"/>
+            <w:r>
+              <w:rPr>
+                <w:rFonts w:ascii="Arial" w:hAnsi="Arial" w:cs="Arial"/>
+                <w:b/>
+                <w:bCs/>
+                <w:sz w:val="24"/>
+                <w:szCs w:val="24"/>
+              </w:rPr>
+              <w:t>Hr</w:t>
+            </w:r>
+            <w:proofErr w:type="spellEnd"/>
+            <w:r>
+              <w:rPr>
+                <w:rFonts w:ascii="Arial" w:hAnsi="Arial" w:cs="Arial"/>
+                <w:b/>
+                <w:bCs/>
+                <w:sz w:val="24"/>
+                <w:szCs w:val="24"/>
+              </w:rPr>
+              <w:t>. fin</w:t>
             </w:r>
           </w:p>
         </w:tc>
@@ -14774,8 +15104,18 @@
                 <w:sz w:val="24"/>
                 <w:szCs w:val="24"/>
               </w:rPr>
-              <w:t>1 hr</w:t>
-            </w:r>
+              <w:t xml:space="preserve">1 </w:t>
+            </w:r>
+            <w:proofErr w:type="spellStart"/>
+            <w:r>
+              <w:rPr>
+                <w:rFonts w:ascii="Arial" w:hAnsi="Arial" w:cs="Arial"/>
+                <w:sz w:val="24"/>
+                <w:szCs w:val="24"/>
+              </w:rPr>
+              <w:t>hr</w:t>
+            </w:r>
+            <w:proofErr w:type="spellEnd"/>
             <w:r>
               <w:rPr>
                 <w:rFonts w:ascii="Arial" w:hAnsi="Arial" w:cs="Arial"/>
@@ -15318,8 +15658,18 @@
                 <w:sz w:val="24"/>
                 <w:szCs w:val="24"/>
               </w:rPr>
-              <w:t>Desarrolladora frontend</w:t>
-            </w:r>
+              <w:t xml:space="preserve">Desarrolladora </w:t>
+            </w:r>
+            <w:proofErr w:type="spellStart"/>
+            <w:r>
+              <w:rPr>
+                <w:rFonts w:ascii="Arial" w:hAnsi="Arial" w:cs="Arial"/>
+                <w:sz w:val="24"/>
+                <w:szCs w:val="24"/>
+              </w:rPr>
+              <w:t>frontend</w:t>
+            </w:r>
+            <w:proofErr w:type="spellEnd"/>
           </w:p>
         </w:tc>
         <w:tc>
@@ -15632,8 +15982,18 @@
                 <w:sz w:val="24"/>
                 <w:szCs w:val="24"/>
               </w:rPr>
-              <w:t>Desarrollador backend</w:t>
-            </w:r>
+              <w:t xml:space="preserve">Desarrollador </w:t>
+            </w:r>
+            <w:proofErr w:type="spellStart"/>
+            <w:r>
+              <w:rPr>
+                <w:rFonts w:ascii="Arial" w:hAnsi="Arial" w:cs="Arial"/>
+                <w:sz w:val="24"/>
+                <w:szCs w:val="24"/>
+              </w:rPr>
+              <w:t>backend</w:t>
+            </w:r>
+            <w:proofErr w:type="spellEnd"/>
           </w:p>
         </w:tc>
         <w:tc>
@@ -16020,16 +16380,40 @@
                 <w:szCs w:val="24"/>
               </w:rPr>
             </w:pPr>
-            <w:r>
-              <w:rPr>
-                <w:rFonts w:ascii="Arial" w:hAnsi="Arial" w:cs="Arial"/>
-                <w:b/>
-                <w:bCs/>
-                <w:sz w:val="24"/>
-                <w:szCs w:val="24"/>
-              </w:rPr>
-              <w:t>Hr. Ini</w:t>
-            </w:r>
+            <w:proofErr w:type="spellStart"/>
+            <w:r>
+              <w:rPr>
+                <w:rFonts w:ascii="Arial" w:hAnsi="Arial" w:cs="Arial"/>
+                <w:b/>
+                <w:bCs/>
+                <w:sz w:val="24"/>
+                <w:szCs w:val="24"/>
+              </w:rPr>
+              <w:t>Hr</w:t>
+            </w:r>
+            <w:proofErr w:type="spellEnd"/>
+            <w:r>
+              <w:rPr>
+                <w:rFonts w:ascii="Arial" w:hAnsi="Arial" w:cs="Arial"/>
+                <w:b/>
+                <w:bCs/>
+                <w:sz w:val="24"/>
+                <w:szCs w:val="24"/>
+              </w:rPr>
+              <w:t xml:space="preserve">. </w:t>
+            </w:r>
+            <w:proofErr w:type="spellStart"/>
+            <w:r>
+              <w:rPr>
+                <w:rFonts w:ascii="Arial" w:hAnsi="Arial" w:cs="Arial"/>
+                <w:b/>
+                <w:bCs/>
+                <w:sz w:val="24"/>
+                <w:szCs w:val="24"/>
+              </w:rPr>
+              <w:t>Ini</w:t>
+            </w:r>
+            <w:proofErr w:type="spellEnd"/>
           </w:p>
         </w:tc>
         <w:tc>
@@ -16049,15 +16433,27 @@
                 <w:szCs w:val="24"/>
               </w:rPr>
             </w:pPr>
-            <w:r>
-              <w:rPr>
-                <w:rFonts w:ascii="Arial" w:hAnsi="Arial" w:cs="Arial"/>
-                <w:b/>
-                <w:bCs/>
-                <w:sz w:val="24"/>
-                <w:szCs w:val="24"/>
-              </w:rPr>
-              <w:t>Hr. fin</w:t>
+            <w:proofErr w:type="spellStart"/>
+            <w:r>
+              <w:rPr>
+                <w:rFonts w:ascii="Arial" w:hAnsi="Arial" w:cs="Arial"/>
+                <w:b/>
+                <w:bCs/>
+                <w:sz w:val="24"/>
+                <w:szCs w:val="24"/>
+              </w:rPr>
+              <w:t>Hr</w:t>
+            </w:r>
+            <w:proofErr w:type="spellEnd"/>
+            <w:r>
+              <w:rPr>
+                <w:rFonts w:ascii="Arial" w:hAnsi="Arial" w:cs="Arial"/>
+                <w:b/>
+                <w:bCs/>
+                <w:sz w:val="24"/>
+                <w:szCs w:val="24"/>
+              </w:rPr>
+              <w:t>. fin</w:t>
             </w:r>
           </w:p>
         </w:tc>
@@ -16946,8 +17342,18 @@
                 <w:sz w:val="24"/>
                 <w:szCs w:val="24"/>
               </w:rPr>
-              <w:t>Elaborar documento con requisistos</w:t>
-            </w:r>
+              <w:t xml:space="preserve">Elaborar documento con </w:t>
+            </w:r>
+            <w:proofErr w:type="spellStart"/>
+            <w:r>
+              <w:rPr>
+                <w:rFonts w:ascii="Arial" w:hAnsi="Arial" w:cs="Arial"/>
+                <w:sz w:val="24"/>
+                <w:szCs w:val="24"/>
+              </w:rPr>
+              <w:t>requisistos</w:t>
+            </w:r>
+            <w:proofErr w:type="spellEnd"/>
           </w:p>
         </w:tc>
         <w:tc>
@@ -17806,8 +18212,18 @@
                 <w:sz w:val="24"/>
                 <w:szCs w:val="24"/>
               </w:rPr>
-              <w:t xml:space="preserve"> hr</w:t>
-            </w:r>
+              <w:t xml:space="preserve"> </w:t>
+            </w:r>
+            <w:proofErr w:type="spellStart"/>
+            <w:r>
+              <w:rPr>
+                <w:rFonts w:ascii="Arial" w:hAnsi="Arial" w:cs="Arial"/>
+                <w:sz w:val="24"/>
+                <w:szCs w:val="24"/>
+              </w:rPr>
+              <w:t>hr</w:t>
+            </w:r>
+            <w:proofErr w:type="spellEnd"/>
             <w:r>
               <w:rPr>
                 <w:rFonts w:ascii="Arial" w:hAnsi="Arial" w:cs="Arial"/>
@@ -18405,8 +18821,18 @@
                 <w:sz w:val="24"/>
                 <w:szCs w:val="24"/>
               </w:rPr>
-              <w:t>Desarrolladora frontend</w:t>
-            </w:r>
+              <w:t xml:space="preserve">Desarrolladora </w:t>
+            </w:r>
+            <w:proofErr w:type="spellStart"/>
+            <w:r>
+              <w:rPr>
+                <w:rFonts w:ascii="Arial" w:hAnsi="Arial" w:cs="Arial"/>
+                <w:sz w:val="24"/>
+                <w:szCs w:val="24"/>
+              </w:rPr>
+              <w:t>frontend</w:t>
+            </w:r>
+            <w:proofErr w:type="spellEnd"/>
           </w:p>
         </w:tc>
         <w:tc>
@@ -18607,8 +19033,18 @@
                 <w:sz w:val="24"/>
                 <w:szCs w:val="24"/>
               </w:rPr>
-              <w:t>Desarrollador backend</w:t>
-            </w:r>
+              <w:t xml:space="preserve">Desarrollador </w:t>
+            </w:r>
+            <w:proofErr w:type="spellStart"/>
+            <w:r>
+              <w:rPr>
+                <w:rFonts w:ascii="Arial" w:hAnsi="Arial" w:cs="Arial"/>
+                <w:sz w:val="24"/>
+                <w:szCs w:val="24"/>
+              </w:rPr>
+              <w:t>backend</w:t>
+            </w:r>
+            <w:proofErr w:type="spellEnd"/>
           </w:p>
         </w:tc>
         <w:tc>
@@ -18878,16 +19314,40 @@
                 <w:szCs w:val="24"/>
               </w:rPr>
             </w:pPr>
-            <w:r>
-              <w:rPr>
-                <w:rFonts w:ascii="Arial" w:hAnsi="Arial" w:cs="Arial"/>
-                <w:b/>
-                <w:bCs/>
-                <w:sz w:val="24"/>
-                <w:szCs w:val="24"/>
-              </w:rPr>
-              <w:t>Hr. Ini</w:t>
-            </w:r>
+            <w:proofErr w:type="spellStart"/>
+            <w:r>
+              <w:rPr>
+                <w:rFonts w:ascii="Arial" w:hAnsi="Arial" w:cs="Arial"/>
+                <w:b/>
+                <w:bCs/>
+                <w:sz w:val="24"/>
+                <w:szCs w:val="24"/>
+              </w:rPr>
+              <w:t>Hr</w:t>
+            </w:r>
+            <w:proofErr w:type="spellEnd"/>
+            <w:r>
+              <w:rPr>
+                <w:rFonts w:ascii="Arial" w:hAnsi="Arial" w:cs="Arial"/>
+                <w:b/>
+                <w:bCs/>
+                <w:sz w:val="24"/>
+                <w:szCs w:val="24"/>
+              </w:rPr>
+              <w:t xml:space="preserve">. </w:t>
+            </w:r>
+            <w:proofErr w:type="spellStart"/>
+            <w:r>
+              <w:rPr>
+                <w:rFonts w:ascii="Arial" w:hAnsi="Arial" w:cs="Arial"/>
+                <w:b/>
+                <w:bCs/>
+                <w:sz w:val="24"/>
+                <w:szCs w:val="24"/>
+              </w:rPr>
+              <w:t>Ini</w:t>
+            </w:r>
+            <w:proofErr w:type="spellEnd"/>
           </w:p>
         </w:tc>
         <w:tc>
@@ -18907,15 +19367,27 @@
                 <w:szCs w:val="24"/>
               </w:rPr>
             </w:pPr>
-            <w:r>
-              <w:rPr>
-                <w:rFonts w:ascii="Arial" w:hAnsi="Arial" w:cs="Arial"/>
-                <w:b/>
-                <w:bCs/>
-                <w:sz w:val="24"/>
-                <w:szCs w:val="24"/>
-              </w:rPr>
-              <w:t>Hr. fin</w:t>
+            <w:proofErr w:type="spellStart"/>
+            <w:r>
+              <w:rPr>
+                <w:rFonts w:ascii="Arial" w:hAnsi="Arial" w:cs="Arial"/>
+                <w:b/>
+                <w:bCs/>
+                <w:sz w:val="24"/>
+                <w:szCs w:val="24"/>
+              </w:rPr>
+              <w:t>Hr</w:t>
+            </w:r>
+            <w:proofErr w:type="spellEnd"/>
+            <w:r>
+              <w:rPr>
+                <w:rFonts w:ascii="Arial" w:hAnsi="Arial" w:cs="Arial"/>
+                <w:b/>
+                <w:bCs/>
+                <w:sz w:val="24"/>
+                <w:szCs w:val="24"/>
+              </w:rPr>
+              <w:t>. fin</w:t>
             </w:r>
           </w:p>
         </w:tc>
@@ -19968,8 +20440,18 @@
                 <w:sz w:val="24"/>
                 <w:szCs w:val="24"/>
               </w:rPr>
-              <w:t>3 hr</w:t>
-            </w:r>
+              <w:t xml:space="preserve">3 </w:t>
+            </w:r>
+            <w:proofErr w:type="spellStart"/>
+            <w:r>
+              <w:rPr>
+                <w:rFonts w:ascii="Arial" w:hAnsi="Arial" w:cs="Arial"/>
+                <w:sz w:val="24"/>
+                <w:szCs w:val="24"/>
+              </w:rPr>
+              <w:t>hr</w:t>
+            </w:r>
+            <w:proofErr w:type="spellEnd"/>
           </w:p>
         </w:tc>
       </w:tr>
@@ -20458,8 +20940,18 @@
                 <w:sz w:val="24"/>
                 <w:szCs w:val="24"/>
               </w:rPr>
-              <w:t>Desarrolladora frontend</w:t>
-            </w:r>
+              <w:t xml:space="preserve">Desarrolladora </w:t>
+            </w:r>
+            <w:proofErr w:type="spellStart"/>
+            <w:r>
+              <w:rPr>
+                <w:rFonts w:ascii="Arial" w:hAnsi="Arial" w:cs="Arial"/>
+                <w:sz w:val="24"/>
+                <w:szCs w:val="24"/>
+              </w:rPr>
+              <w:t>frontend</w:t>
+            </w:r>
+            <w:proofErr w:type="spellEnd"/>
           </w:p>
         </w:tc>
         <w:tc>
@@ -20590,8 +21082,18 @@
                 <w:sz w:val="24"/>
                 <w:szCs w:val="24"/>
               </w:rPr>
-              <w:t>Desarrollador backend</w:t>
-            </w:r>
+              <w:t xml:space="preserve">Desarrollador </w:t>
+            </w:r>
+            <w:proofErr w:type="spellStart"/>
+            <w:r>
+              <w:rPr>
+                <w:rFonts w:ascii="Arial" w:hAnsi="Arial" w:cs="Arial"/>
+                <w:sz w:val="24"/>
+                <w:szCs w:val="24"/>
+              </w:rPr>
+              <w:t>backend</w:t>
+            </w:r>
+            <w:proofErr w:type="spellEnd"/>
           </w:p>
         </w:tc>
         <w:tc>
@@ -20842,16 +21344,40 @@
                 <w:szCs w:val="24"/>
               </w:rPr>
             </w:pPr>
-            <w:r>
-              <w:rPr>
-                <w:rFonts w:ascii="Arial" w:hAnsi="Arial" w:cs="Arial"/>
-                <w:b/>
-                <w:bCs/>
-                <w:sz w:val="24"/>
-                <w:szCs w:val="24"/>
-              </w:rPr>
-              <w:t>Hr. Ini</w:t>
-            </w:r>
+            <w:proofErr w:type="spellStart"/>
+            <w:r>
+              <w:rPr>
+                <w:rFonts w:ascii="Arial" w:hAnsi="Arial" w:cs="Arial"/>
+                <w:b/>
+                <w:bCs/>
+                <w:sz w:val="24"/>
+                <w:szCs w:val="24"/>
+              </w:rPr>
+              <w:t>Hr</w:t>
+            </w:r>
+            <w:proofErr w:type="spellEnd"/>
+            <w:r>
+              <w:rPr>
+                <w:rFonts w:ascii="Arial" w:hAnsi="Arial" w:cs="Arial"/>
+                <w:b/>
+                <w:bCs/>
+                <w:sz w:val="24"/>
+                <w:szCs w:val="24"/>
+              </w:rPr>
+              <w:t xml:space="preserve">. </w:t>
+            </w:r>
+            <w:proofErr w:type="spellStart"/>
+            <w:r>
+              <w:rPr>
+                <w:rFonts w:ascii="Arial" w:hAnsi="Arial" w:cs="Arial"/>
+                <w:b/>
+                <w:bCs/>
+                <w:sz w:val="24"/>
+                <w:szCs w:val="24"/>
+              </w:rPr>
+              <w:t>Ini</w:t>
+            </w:r>
+            <w:proofErr w:type="spellEnd"/>
           </w:p>
         </w:tc>
         <w:tc>
@@ -20871,15 +21397,27 @@
                 <w:szCs w:val="24"/>
               </w:rPr>
             </w:pPr>
-            <w:r>
-              <w:rPr>
-                <w:rFonts w:ascii="Arial" w:hAnsi="Arial" w:cs="Arial"/>
-                <w:b/>
-                <w:bCs/>
-                <w:sz w:val="24"/>
-                <w:szCs w:val="24"/>
-              </w:rPr>
-              <w:t>Hr. fin</w:t>
+            <w:proofErr w:type="spellStart"/>
+            <w:r>
+              <w:rPr>
+                <w:rFonts w:ascii="Arial" w:hAnsi="Arial" w:cs="Arial"/>
+                <w:b/>
+                <w:bCs/>
+                <w:sz w:val="24"/>
+                <w:szCs w:val="24"/>
+              </w:rPr>
+              <w:t>Hr</w:t>
+            </w:r>
+            <w:proofErr w:type="spellEnd"/>
+            <w:r>
+              <w:rPr>
+                <w:rFonts w:ascii="Arial" w:hAnsi="Arial" w:cs="Arial"/>
+                <w:b/>
+                <w:bCs/>
+                <w:sz w:val="24"/>
+                <w:szCs w:val="24"/>
+              </w:rPr>
+              <w:t>. fin</w:t>
             </w:r>
           </w:p>
         </w:tc>
@@ -22394,8 +22932,18 @@
                 <w:sz w:val="24"/>
                 <w:szCs w:val="24"/>
               </w:rPr>
-              <w:t>1 hr</w:t>
-            </w:r>
+              <w:t xml:space="preserve">1 </w:t>
+            </w:r>
+            <w:proofErr w:type="spellStart"/>
+            <w:r>
+              <w:rPr>
+                <w:rFonts w:ascii="Arial" w:hAnsi="Arial" w:cs="Arial"/>
+                <w:sz w:val="24"/>
+                <w:szCs w:val="24"/>
+              </w:rPr>
+              <w:t>hr</w:t>
+            </w:r>
+            <w:proofErr w:type="spellEnd"/>
           </w:p>
         </w:tc>
       </w:tr>
@@ -22831,8 +23379,18 @@
                 <w:sz w:val="24"/>
                 <w:szCs w:val="24"/>
               </w:rPr>
-              <w:t>Desarrolladora frontend</w:t>
-            </w:r>
+              <w:t xml:space="preserve">Desarrolladora </w:t>
+            </w:r>
+            <w:proofErr w:type="spellStart"/>
+            <w:r>
+              <w:rPr>
+                <w:rFonts w:ascii="Arial" w:hAnsi="Arial" w:cs="Arial"/>
+                <w:sz w:val="24"/>
+                <w:szCs w:val="24"/>
+              </w:rPr>
+              <w:t>frontend</w:t>
+            </w:r>
+            <w:proofErr w:type="spellEnd"/>
           </w:p>
         </w:tc>
         <w:tc>
@@ -22907,7 +23465,43 @@
                 <w:sz w:val="24"/>
                 <w:szCs w:val="24"/>
               </w:rPr>
-              <w:t xml:space="preserve"> de stack para frontend </w:t>
+              <w:t xml:space="preserve"> de </w:t>
+            </w:r>
+            <w:proofErr w:type="spellStart"/>
+            <w:r>
+              <w:rPr>
+                <w:rFonts w:ascii="Arial" w:hAnsi="Arial" w:cs="Arial"/>
+                <w:sz w:val="24"/>
+                <w:szCs w:val="24"/>
+              </w:rPr>
+              <w:t>stack</w:t>
+            </w:r>
+            <w:proofErr w:type="spellEnd"/>
+            <w:r>
+              <w:rPr>
+                <w:rFonts w:ascii="Arial" w:hAnsi="Arial" w:cs="Arial"/>
+                <w:sz w:val="24"/>
+                <w:szCs w:val="24"/>
+              </w:rPr>
+              <w:t xml:space="preserve"> para </w:t>
+            </w:r>
+            <w:proofErr w:type="spellStart"/>
+            <w:r>
+              <w:rPr>
+                <w:rFonts w:ascii="Arial" w:hAnsi="Arial" w:cs="Arial"/>
+                <w:sz w:val="24"/>
+                <w:szCs w:val="24"/>
+              </w:rPr>
+              <w:t>frontend</w:t>
+            </w:r>
+            <w:proofErr w:type="spellEnd"/>
+            <w:r>
+              <w:rPr>
+                <w:rFonts w:ascii="Arial" w:hAnsi="Arial" w:cs="Arial"/>
+                <w:sz w:val="24"/>
+                <w:szCs w:val="24"/>
+              </w:rPr>
+              <w:t xml:space="preserve"> </w:t>
             </w:r>
           </w:p>
         </w:tc>
@@ -22987,8 +23581,18 @@
                 <w:sz w:val="24"/>
                 <w:szCs w:val="24"/>
               </w:rPr>
-              <w:t>Desarrollador backend</w:t>
-            </w:r>
+              <w:t xml:space="preserve">Desarrollador </w:t>
+            </w:r>
+            <w:proofErr w:type="spellStart"/>
+            <w:r>
+              <w:rPr>
+                <w:rFonts w:ascii="Arial" w:hAnsi="Arial" w:cs="Arial"/>
+                <w:sz w:val="24"/>
+                <w:szCs w:val="24"/>
+              </w:rPr>
+              <w:t>backend</w:t>
+            </w:r>
+            <w:proofErr w:type="spellEnd"/>
           </w:p>
         </w:tc>
         <w:tc>
@@ -23055,8 +23659,36 @@
                 <w:sz w:val="24"/>
                 <w:szCs w:val="24"/>
               </w:rPr>
-              <w:t xml:space="preserve"> de stack para backend</w:t>
-            </w:r>
+              <w:t xml:space="preserve"> de </w:t>
+            </w:r>
+            <w:proofErr w:type="spellStart"/>
+            <w:r>
+              <w:rPr>
+                <w:rFonts w:ascii="Arial" w:hAnsi="Arial" w:cs="Arial"/>
+                <w:sz w:val="24"/>
+                <w:szCs w:val="24"/>
+              </w:rPr>
+              <w:t>stack</w:t>
+            </w:r>
+            <w:proofErr w:type="spellEnd"/>
+            <w:r>
+              <w:rPr>
+                <w:rFonts w:ascii="Arial" w:hAnsi="Arial" w:cs="Arial"/>
+                <w:sz w:val="24"/>
+                <w:szCs w:val="24"/>
+              </w:rPr>
+              <w:t xml:space="preserve"> para </w:t>
+            </w:r>
+            <w:proofErr w:type="spellStart"/>
+            <w:r>
+              <w:rPr>
+                <w:rFonts w:ascii="Arial" w:hAnsi="Arial" w:cs="Arial"/>
+                <w:sz w:val="24"/>
+                <w:szCs w:val="24"/>
+              </w:rPr>
+              <w:t>backend</w:t>
+            </w:r>
+            <w:proofErr w:type="spellEnd"/>
           </w:p>
         </w:tc>
         <w:tc>
@@ -23230,16 +23862,40 @@
                 <w:szCs w:val="24"/>
               </w:rPr>
             </w:pPr>
-            <w:r>
-              <w:rPr>
-                <w:rFonts w:ascii="Arial" w:hAnsi="Arial" w:cs="Arial"/>
-                <w:b/>
-                <w:bCs/>
-                <w:sz w:val="24"/>
-                <w:szCs w:val="24"/>
-              </w:rPr>
-              <w:t>Hr. Ini</w:t>
-            </w:r>
+            <w:proofErr w:type="spellStart"/>
+            <w:r>
+              <w:rPr>
+                <w:rFonts w:ascii="Arial" w:hAnsi="Arial" w:cs="Arial"/>
+                <w:b/>
+                <w:bCs/>
+                <w:sz w:val="24"/>
+                <w:szCs w:val="24"/>
+              </w:rPr>
+              <w:t>Hr</w:t>
+            </w:r>
+            <w:proofErr w:type="spellEnd"/>
+            <w:r>
+              <w:rPr>
+                <w:rFonts w:ascii="Arial" w:hAnsi="Arial" w:cs="Arial"/>
+                <w:b/>
+                <w:bCs/>
+                <w:sz w:val="24"/>
+                <w:szCs w:val="24"/>
+              </w:rPr>
+              <w:t xml:space="preserve">. </w:t>
+            </w:r>
+            <w:proofErr w:type="spellStart"/>
+            <w:r>
+              <w:rPr>
+                <w:rFonts w:ascii="Arial" w:hAnsi="Arial" w:cs="Arial"/>
+                <w:b/>
+                <w:bCs/>
+                <w:sz w:val="24"/>
+                <w:szCs w:val="24"/>
+              </w:rPr>
+              <w:t>Ini</w:t>
+            </w:r>
+            <w:proofErr w:type="spellEnd"/>
           </w:p>
         </w:tc>
         <w:tc>
@@ -23259,15 +23915,27 @@
                 <w:szCs w:val="24"/>
               </w:rPr>
             </w:pPr>
-            <w:r>
-              <w:rPr>
-                <w:rFonts w:ascii="Arial" w:hAnsi="Arial" w:cs="Arial"/>
-                <w:b/>
-                <w:bCs/>
-                <w:sz w:val="24"/>
-                <w:szCs w:val="24"/>
-              </w:rPr>
-              <w:t>Hr. fin</w:t>
+            <w:proofErr w:type="spellStart"/>
+            <w:r>
+              <w:rPr>
+                <w:rFonts w:ascii="Arial" w:hAnsi="Arial" w:cs="Arial"/>
+                <w:b/>
+                <w:bCs/>
+                <w:sz w:val="24"/>
+                <w:szCs w:val="24"/>
+              </w:rPr>
+              <w:t>Hr</w:t>
+            </w:r>
+            <w:proofErr w:type="spellEnd"/>
+            <w:r>
+              <w:rPr>
+                <w:rFonts w:ascii="Arial" w:hAnsi="Arial" w:cs="Arial"/>
+                <w:b/>
+                <w:bCs/>
+                <w:sz w:val="24"/>
+                <w:szCs w:val="24"/>
+              </w:rPr>
+              <w:t>. fin</w:t>
             </w:r>
           </w:p>
         </w:tc>
@@ -23524,8 +24192,27 @@
                 <w:sz w:val="24"/>
                 <w:szCs w:val="24"/>
               </w:rPr>
-              <w:t xml:space="preserve">Análisis y modificación de stack para </w:t>
-            </w:r>
+              <w:t xml:space="preserve">Análisis y modificación de </w:t>
+            </w:r>
+            <w:proofErr w:type="spellStart"/>
+            <w:r>
+              <w:rPr>
+                <w:rFonts w:ascii="Arial" w:hAnsi="Arial" w:cs="Arial"/>
+                <w:sz w:val="24"/>
+                <w:szCs w:val="24"/>
+              </w:rPr>
+              <w:t>stack</w:t>
+            </w:r>
+            <w:proofErr w:type="spellEnd"/>
+            <w:r>
+              <w:rPr>
+                <w:rFonts w:ascii="Arial" w:hAnsi="Arial" w:cs="Arial"/>
+                <w:sz w:val="24"/>
+                <w:szCs w:val="24"/>
+              </w:rPr>
+              <w:t xml:space="preserve"> para </w:t>
+            </w:r>
+            <w:proofErr w:type="spellStart"/>
             <w:r>
               <w:rPr>
                 <w:rFonts w:ascii="Arial" w:hAnsi="Arial" w:cs="Arial"/>
@@ -23534,6 +24221,7 @@
               </w:rPr>
               <w:t>frontend</w:t>
             </w:r>
+            <w:proofErr w:type="spellEnd"/>
           </w:p>
         </w:tc>
         <w:tc>
@@ -23716,8 +24404,27 @@
                 <w:sz w:val="24"/>
                 <w:szCs w:val="24"/>
               </w:rPr>
-              <w:t xml:space="preserve">Análisis y modificación de stack para </w:t>
-            </w:r>
+              <w:t xml:space="preserve">Análisis y modificación de </w:t>
+            </w:r>
+            <w:proofErr w:type="spellStart"/>
+            <w:r>
+              <w:rPr>
+                <w:rFonts w:ascii="Arial" w:hAnsi="Arial" w:cs="Arial"/>
+                <w:sz w:val="24"/>
+                <w:szCs w:val="24"/>
+              </w:rPr>
+              <w:t>stack</w:t>
+            </w:r>
+            <w:proofErr w:type="spellEnd"/>
+            <w:r>
+              <w:rPr>
+                <w:rFonts w:ascii="Arial" w:hAnsi="Arial" w:cs="Arial"/>
+                <w:sz w:val="24"/>
+                <w:szCs w:val="24"/>
+              </w:rPr>
+              <w:t xml:space="preserve"> para </w:t>
+            </w:r>
+            <w:proofErr w:type="spellStart"/>
             <w:r>
               <w:rPr>
                 <w:rFonts w:ascii="Arial" w:hAnsi="Arial" w:cs="Arial"/>
@@ -23726,6 +24433,7 @@
               </w:rPr>
               <w:t>backend</w:t>
             </w:r>
+            <w:proofErr w:type="spellEnd"/>
           </w:p>
         </w:tc>
         <w:tc>
@@ -24432,8 +25140,18 @@
                 <w:sz w:val="24"/>
                 <w:szCs w:val="24"/>
               </w:rPr>
-              <w:t>1 hr</w:t>
-            </w:r>
+              <w:t xml:space="preserve">1 </w:t>
+            </w:r>
+            <w:proofErr w:type="spellStart"/>
+            <w:r>
+              <w:rPr>
+                <w:rFonts w:ascii="Arial" w:hAnsi="Arial" w:cs="Arial"/>
+                <w:sz w:val="24"/>
+                <w:szCs w:val="24"/>
+              </w:rPr>
+              <w:t>hr</w:t>
+            </w:r>
+            <w:proofErr w:type="spellEnd"/>
           </w:p>
         </w:tc>
       </w:tr>
@@ -24836,8 +25554,18 @@
                 <w:sz w:val="24"/>
                 <w:szCs w:val="24"/>
               </w:rPr>
-              <w:t>Desarrolladora frontend</w:t>
-            </w:r>
+              <w:t xml:space="preserve">Desarrolladora </w:t>
+            </w:r>
+            <w:proofErr w:type="spellStart"/>
+            <w:r>
+              <w:rPr>
+                <w:rFonts w:ascii="Arial" w:hAnsi="Arial" w:cs="Arial"/>
+                <w:sz w:val="24"/>
+                <w:szCs w:val="24"/>
+              </w:rPr>
+              <w:t>frontend</w:t>
+            </w:r>
+            <w:proofErr w:type="spellEnd"/>
           </w:p>
         </w:tc>
         <w:tc>
@@ -24911,13 +25639,23 @@
                 <w:szCs w:val="24"/>
               </w:rPr>
             </w:pPr>
-            <w:r>
-              <w:rPr>
-                <w:rFonts w:ascii="Arial" w:hAnsi="Arial" w:cs="Arial"/>
-                <w:sz w:val="24"/>
-                <w:szCs w:val="24"/>
-              </w:rPr>
-              <w:t>Interaces preliminares</w:t>
+            <w:proofErr w:type="spellStart"/>
+            <w:r>
+              <w:rPr>
+                <w:rFonts w:ascii="Arial" w:hAnsi="Arial" w:cs="Arial"/>
+                <w:sz w:val="24"/>
+                <w:szCs w:val="24"/>
+              </w:rPr>
+              <w:t>Interaces</w:t>
+            </w:r>
+            <w:proofErr w:type="spellEnd"/>
+            <w:r>
+              <w:rPr>
+                <w:rFonts w:ascii="Arial" w:hAnsi="Arial" w:cs="Arial"/>
+                <w:sz w:val="24"/>
+                <w:szCs w:val="24"/>
+              </w:rPr>
+              <w:t xml:space="preserve"> preliminares</w:t>
             </w:r>
           </w:p>
         </w:tc>
@@ -24969,8 +25707,18 @@
                 <w:sz w:val="24"/>
                 <w:szCs w:val="24"/>
               </w:rPr>
-              <w:t>Desarrollador backend</w:t>
-            </w:r>
+              <w:t xml:space="preserve">Desarrollador </w:t>
+            </w:r>
+            <w:proofErr w:type="spellStart"/>
+            <w:r>
+              <w:rPr>
+                <w:rFonts w:ascii="Arial" w:hAnsi="Arial" w:cs="Arial"/>
+                <w:sz w:val="24"/>
+                <w:szCs w:val="24"/>
+              </w:rPr>
+              <w:t>backend</w:t>
+            </w:r>
+            <w:proofErr w:type="spellEnd"/>
           </w:p>
         </w:tc>
         <w:tc>
@@ -25186,16 +25934,40 @@
                 <w:szCs w:val="24"/>
               </w:rPr>
             </w:pPr>
-            <w:r>
-              <w:rPr>
-                <w:rFonts w:ascii="Arial" w:hAnsi="Arial" w:cs="Arial"/>
-                <w:b/>
-                <w:bCs/>
-                <w:sz w:val="24"/>
-                <w:szCs w:val="24"/>
-              </w:rPr>
-              <w:t>Hr. Ini</w:t>
-            </w:r>
+            <w:proofErr w:type="spellStart"/>
+            <w:r>
+              <w:rPr>
+                <w:rFonts w:ascii="Arial" w:hAnsi="Arial" w:cs="Arial"/>
+                <w:b/>
+                <w:bCs/>
+                <w:sz w:val="24"/>
+                <w:szCs w:val="24"/>
+              </w:rPr>
+              <w:t>Hr</w:t>
+            </w:r>
+            <w:proofErr w:type="spellEnd"/>
+            <w:r>
+              <w:rPr>
+                <w:rFonts w:ascii="Arial" w:hAnsi="Arial" w:cs="Arial"/>
+                <w:b/>
+                <w:bCs/>
+                <w:sz w:val="24"/>
+                <w:szCs w:val="24"/>
+              </w:rPr>
+              <w:t xml:space="preserve">. </w:t>
+            </w:r>
+            <w:proofErr w:type="spellStart"/>
+            <w:r>
+              <w:rPr>
+                <w:rFonts w:ascii="Arial" w:hAnsi="Arial" w:cs="Arial"/>
+                <w:b/>
+                <w:bCs/>
+                <w:sz w:val="24"/>
+                <w:szCs w:val="24"/>
+              </w:rPr>
+              <w:t>Ini</w:t>
+            </w:r>
+            <w:proofErr w:type="spellEnd"/>
           </w:p>
         </w:tc>
         <w:tc>
@@ -25215,15 +25987,27 @@
                 <w:szCs w:val="24"/>
               </w:rPr>
             </w:pPr>
-            <w:r>
-              <w:rPr>
-                <w:rFonts w:ascii="Arial" w:hAnsi="Arial" w:cs="Arial"/>
-                <w:b/>
-                <w:bCs/>
-                <w:sz w:val="24"/>
-                <w:szCs w:val="24"/>
-              </w:rPr>
-              <w:t>Hr. fin</w:t>
+            <w:proofErr w:type="spellStart"/>
+            <w:r>
+              <w:rPr>
+                <w:rFonts w:ascii="Arial" w:hAnsi="Arial" w:cs="Arial"/>
+                <w:b/>
+                <w:bCs/>
+                <w:sz w:val="24"/>
+                <w:szCs w:val="24"/>
+              </w:rPr>
+              <w:t>Hr</w:t>
+            </w:r>
+            <w:proofErr w:type="spellEnd"/>
+            <w:r>
+              <w:rPr>
+                <w:rFonts w:ascii="Arial" w:hAnsi="Arial" w:cs="Arial"/>
+                <w:b/>
+                <w:bCs/>
+                <w:sz w:val="24"/>
+                <w:szCs w:val="24"/>
+              </w:rPr>
+              <w:t>. fin</w:t>
             </w:r>
           </w:p>
         </w:tc>
@@ -26183,8 +26967,18 @@
                 <w:sz w:val="24"/>
                 <w:szCs w:val="24"/>
               </w:rPr>
-              <w:t>1 hr</w:t>
-            </w:r>
+              <w:t xml:space="preserve">1 </w:t>
+            </w:r>
+            <w:proofErr w:type="spellStart"/>
+            <w:r>
+              <w:rPr>
+                <w:rFonts w:ascii="Arial" w:hAnsi="Arial" w:cs="Arial"/>
+                <w:sz w:val="24"/>
+                <w:szCs w:val="24"/>
+              </w:rPr>
+              <w:t>hr</w:t>
+            </w:r>
+            <w:proofErr w:type="spellEnd"/>
           </w:p>
         </w:tc>
       </w:tr>
@@ -26664,8 +27458,18 @@
                 <w:sz w:val="24"/>
                 <w:szCs w:val="24"/>
               </w:rPr>
-              <w:t>Desarrolladora frontend</w:t>
-            </w:r>
+              <w:t xml:space="preserve">Desarrolladora </w:t>
+            </w:r>
+            <w:proofErr w:type="spellStart"/>
+            <w:r>
+              <w:rPr>
+                <w:rFonts w:ascii="Arial" w:hAnsi="Arial" w:cs="Arial"/>
+                <w:sz w:val="24"/>
+                <w:szCs w:val="24"/>
+              </w:rPr>
+              <w:t>frontend</w:t>
+            </w:r>
+            <w:proofErr w:type="spellEnd"/>
           </w:p>
         </w:tc>
         <w:tc>
@@ -26769,8 +27573,18 @@
                 <w:sz w:val="24"/>
                 <w:szCs w:val="24"/>
               </w:rPr>
-              <w:t>, avance en grid</w:t>
-            </w:r>
+              <w:t xml:space="preserve">, avance en </w:t>
+            </w:r>
+            <w:proofErr w:type="spellStart"/>
+            <w:r>
+              <w:rPr>
+                <w:rFonts w:ascii="Arial" w:hAnsi="Arial" w:cs="Arial"/>
+                <w:sz w:val="24"/>
+                <w:szCs w:val="24"/>
+              </w:rPr>
+              <w:t>grid</w:t>
+            </w:r>
+            <w:proofErr w:type="spellEnd"/>
           </w:p>
         </w:tc>
       </w:tr>
@@ -26821,8 +27635,18 @@
                 <w:sz w:val="24"/>
                 <w:szCs w:val="24"/>
               </w:rPr>
-              <w:t>Desarrollador backend</w:t>
-            </w:r>
+              <w:t xml:space="preserve">Desarrollador </w:t>
+            </w:r>
+            <w:proofErr w:type="spellStart"/>
+            <w:r>
+              <w:rPr>
+                <w:rFonts w:ascii="Arial" w:hAnsi="Arial" w:cs="Arial"/>
+                <w:sz w:val="24"/>
+                <w:szCs w:val="24"/>
+              </w:rPr>
+              <w:t>backend</w:t>
+            </w:r>
+            <w:proofErr w:type="spellEnd"/>
           </w:p>
         </w:tc>
         <w:tc>
@@ -27078,16 +27902,40 @@
                 <w:szCs w:val="24"/>
               </w:rPr>
             </w:pPr>
-            <w:r>
-              <w:rPr>
-                <w:rFonts w:ascii="Arial" w:hAnsi="Arial" w:cs="Arial"/>
-                <w:b/>
-                <w:bCs/>
-                <w:sz w:val="24"/>
-                <w:szCs w:val="24"/>
-              </w:rPr>
-              <w:t>Hr. Ini</w:t>
-            </w:r>
+            <w:proofErr w:type="spellStart"/>
+            <w:r>
+              <w:rPr>
+                <w:rFonts w:ascii="Arial" w:hAnsi="Arial" w:cs="Arial"/>
+                <w:b/>
+                <w:bCs/>
+                <w:sz w:val="24"/>
+                <w:szCs w:val="24"/>
+              </w:rPr>
+              <w:t>Hr</w:t>
+            </w:r>
+            <w:proofErr w:type="spellEnd"/>
+            <w:r>
+              <w:rPr>
+                <w:rFonts w:ascii="Arial" w:hAnsi="Arial" w:cs="Arial"/>
+                <w:b/>
+                <w:bCs/>
+                <w:sz w:val="24"/>
+                <w:szCs w:val="24"/>
+              </w:rPr>
+              <w:t xml:space="preserve">. </w:t>
+            </w:r>
+            <w:proofErr w:type="spellStart"/>
+            <w:r>
+              <w:rPr>
+                <w:rFonts w:ascii="Arial" w:hAnsi="Arial" w:cs="Arial"/>
+                <w:b/>
+                <w:bCs/>
+                <w:sz w:val="24"/>
+                <w:szCs w:val="24"/>
+              </w:rPr>
+              <w:t>Ini</w:t>
+            </w:r>
+            <w:proofErr w:type="spellEnd"/>
           </w:p>
         </w:tc>
         <w:tc>
@@ -27107,15 +27955,27 @@
                 <w:szCs w:val="24"/>
               </w:rPr>
             </w:pPr>
-            <w:r>
-              <w:rPr>
-                <w:rFonts w:ascii="Arial" w:hAnsi="Arial" w:cs="Arial"/>
-                <w:b/>
-                <w:bCs/>
-                <w:sz w:val="24"/>
-                <w:szCs w:val="24"/>
-              </w:rPr>
-              <w:t>Hr. fin</w:t>
+            <w:proofErr w:type="spellStart"/>
+            <w:r>
+              <w:rPr>
+                <w:rFonts w:ascii="Arial" w:hAnsi="Arial" w:cs="Arial"/>
+                <w:b/>
+                <w:bCs/>
+                <w:sz w:val="24"/>
+                <w:szCs w:val="24"/>
+              </w:rPr>
+              <w:t>Hr</w:t>
+            </w:r>
+            <w:proofErr w:type="spellEnd"/>
+            <w:r>
+              <w:rPr>
+                <w:rFonts w:ascii="Arial" w:hAnsi="Arial" w:cs="Arial"/>
+                <w:b/>
+                <w:bCs/>
+                <w:sz w:val="24"/>
+                <w:szCs w:val="24"/>
+              </w:rPr>
+              <w:t>. fin</w:t>
             </w:r>
           </w:p>
         </w:tc>
@@ -28297,8 +29157,18 @@
                 <w:sz w:val="24"/>
                 <w:szCs w:val="24"/>
               </w:rPr>
-              <w:t>1 hr</w:t>
-            </w:r>
+              <w:t xml:space="preserve">1 </w:t>
+            </w:r>
+            <w:proofErr w:type="spellStart"/>
+            <w:r>
+              <w:rPr>
+                <w:rFonts w:ascii="Arial" w:hAnsi="Arial" w:cs="Arial"/>
+                <w:sz w:val="24"/>
+                <w:szCs w:val="24"/>
+              </w:rPr>
+              <w:t>hr</w:t>
+            </w:r>
+            <w:proofErr w:type="spellEnd"/>
           </w:p>
         </w:tc>
       </w:tr>
@@ -28764,8 +29634,18 @@
                 <w:sz w:val="24"/>
                 <w:szCs w:val="24"/>
               </w:rPr>
-              <w:t>Desarrolladora frontend</w:t>
-            </w:r>
+              <w:t xml:space="preserve">Desarrolladora </w:t>
+            </w:r>
+            <w:proofErr w:type="spellStart"/>
+            <w:r>
+              <w:rPr>
+                <w:rFonts w:ascii="Arial" w:hAnsi="Arial" w:cs="Arial"/>
+                <w:sz w:val="24"/>
+                <w:szCs w:val="24"/>
+              </w:rPr>
+              <w:t>frontend</w:t>
+            </w:r>
+            <w:proofErr w:type="spellEnd"/>
           </w:p>
         </w:tc>
         <w:tc>
@@ -28816,7 +29696,25 @@
                 <w:sz w:val="24"/>
                 <w:szCs w:val="24"/>
               </w:rPr>
-              <w:t>Continuación de prototipo: diseño de página (archivos css)</w:t>
+              <w:t xml:space="preserve">Continuación de prototipo: diseño de página (archivos </w:t>
+            </w:r>
+            <w:proofErr w:type="spellStart"/>
+            <w:r>
+              <w:rPr>
+                <w:rFonts w:ascii="Arial" w:hAnsi="Arial" w:cs="Arial"/>
+                <w:sz w:val="24"/>
+                <w:szCs w:val="24"/>
+              </w:rPr>
+              <w:t>css</w:t>
+            </w:r>
+            <w:proofErr w:type="spellEnd"/>
+            <w:r>
+              <w:rPr>
+                <w:rFonts w:ascii="Arial" w:hAnsi="Arial" w:cs="Arial"/>
+                <w:sz w:val="24"/>
+                <w:szCs w:val="24"/>
+              </w:rPr>
+              <w:t>)</w:t>
             </w:r>
             <w:r>
               <w:rPr>
@@ -28904,8 +29802,18 @@
                 <w:sz w:val="24"/>
                 <w:szCs w:val="24"/>
               </w:rPr>
-              <w:t>Desarrollador backend</w:t>
-            </w:r>
+              <w:t xml:space="preserve">Desarrollador </w:t>
+            </w:r>
+            <w:proofErr w:type="spellStart"/>
+            <w:r>
+              <w:rPr>
+                <w:rFonts w:ascii="Arial" w:hAnsi="Arial" w:cs="Arial"/>
+                <w:sz w:val="24"/>
+                <w:szCs w:val="24"/>
+              </w:rPr>
+              <w:t>backend</w:t>
+            </w:r>
+            <w:proofErr w:type="spellEnd"/>
           </w:p>
         </w:tc>
         <w:tc>
@@ -29139,16 +30047,40 @@
                 <w:szCs w:val="24"/>
               </w:rPr>
             </w:pPr>
-            <w:r>
-              <w:rPr>
-                <w:rFonts w:ascii="Arial" w:hAnsi="Arial" w:cs="Arial"/>
-                <w:b/>
-                <w:bCs/>
-                <w:sz w:val="24"/>
-                <w:szCs w:val="24"/>
-              </w:rPr>
-              <w:t>Hr. Ini</w:t>
-            </w:r>
+            <w:proofErr w:type="spellStart"/>
+            <w:r>
+              <w:rPr>
+                <w:rFonts w:ascii="Arial" w:hAnsi="Arial" w:cs="Arial"/>
+                <w:b/>
+                <w:bCs/>
+                <w:sz w:val="24"/>
+                <w:szCs w:val="24"/>
+              </w:rPr>
+              <w:t>Hr</w:t>
+            </w:r>
+            <w:proofErr w:type="spellEnd"/>
+            <w:r>
+              <w:rPr>
+                <w:rFonts w:ascii="Arial" w:hAnsi="Arial" w:cs="Arial"/>
+                <w:b/>
+                <w:bCs/>
+                <w:sz w:val="24"/>
+                <w:szCs w:val="24"/>
+              </w:rPr>
+              <w:t xml:space="preserve">. </w:t>
+            </w:r>
+            <w:proofErr w:type="spellStart"/>
+            <w:r>
+              <w:rPr>
+                <w:rFonts w:ascii="Arial" w:hAnsi="Arial" w:cs="Arial"/>
+                <w:b/>
+                <w:bCs/>
+                <w:sz w:val="24"/>
+                <w:szCs w:val="24"/>
+              </w:rPr>
+              <w:t>Ini</w:t>
+            </w:r>
+            <w:proofErr w:type="spellEnd"/>
           </w:p>
         </w:tc>
         <w:tc>
@@ -29168,15 +30100,27 @@
                 <w:szCs w:val="24"/>
               </w:rPr>
             </w:pPr>
-            <w:r>
-              <w:rPr>
-                <w:rFonts w:ascii="Arial" w:hAnsi="Arial" w:cs="Arial"/>
-                <w:b/>
-                <w:bCs/>
-                <w:sz w:val="24"/>
-                <w:szCs w:val="24"/>
-              </w:rPr>
-              <w:t>Hr. fin</w:t>
+            <w:proofErr w:type="spellStart"/>
+            <w:r>
+              <w:rPr>
+                <w:rFonts w:ascii="Arial" w:hAnsi="Arial" w:cs="Arial"/>
+                <w:b/>
+                <w:bCs/>
+                <w:sz w:val="24"/>
+                <w:szCs w:val="24"/>
+              </w:rPr>
+              <w:t>Hr</w:t>
+            </w:r>
+            <w:proofErr w:type="spellEnd"/>
+            <w:r>
+              <w:rPr>
+                <w:rFonts w:ascii="Arial" w:hAnsi="Arial" w:cs="Arial"/>
+                <w:b/>
+                <w:bCs/>
+                <w:sz w:val="24"/>
+                <w:szCs w:val="24"/>
+              </w:rPr>
+              <w:t>. fin</w:t>
             </w:r>
           </w:p>
         </w:tc>
@@ -29433,7 +30377,25 @@
                 <w:sz w:val="24"/>
                 <w:szCs w:val="24"/>
               </w:rPr>
-              <w:t>Adición de archivos css del proyecto.</w:t>
+              <w:t xml:space="preserve">Adición de archivos </w:t>
+            </w:r>
+            <w:proofErr w:type="spellStart"/>
+            <w:r>
+              <w:rPr>
+                <w:rFonts w:ascii="Arial" w:hAnsi="Arial" w:cs="Arial"/>
+                <w:sz w:val="24"/>
+                <w:szCs w:val="24"/>
+              </w:rPr>
+              <w:t>css</w:t>
+            </w:r>
+            <w:proofErr w:type="spellEnd"/>
+            <w:r>
+              <w:rPr>
+                <w:rFonts w:ascii="Arial" w:hAnsi="Arial" w:cs="Arial"/>
+                <w:sz w:val="24"/>
+                <w:szCs w:val="24"/>
+              </w:rPr>
+              <w:t xml:space="preserve"> del proyecto.</w:t>
             </w:r>
           </w:p>
         </w:tc>
@@ -30847,8 +31809,18 @@
                 <w:sz w:val="24"/>
                 <w:szCs w:val="24"/>
               </w:rPr>
-              <w:t>Desarrolladora frontend</w:t>
-            </w:r>
+              <w:t xml:space="preserve">Desarrolladora </w:t>
+            </w:r>
+            <w:proofErr w:type="spellStart"/>
+            <w:r>
+              <w:rPr>
+                <w:rFonts w:ascii="Arial" w:hAnsi="Arial" w:cs="Arial"/>
+                <w:sz w:val="24"/>
+                <w:szCs w:val="24"/>
+              </w:rPr>
+              <w:t>frontend</w:t>
+            </w:r>
+            <w:proofErr w:type="spellEnd"/>
           </w:p>
         </w:tc>
         <w:tc>
@@ -30899,7 +31871,25 @@
                 <w:sz w:val="24"/>
                 <w:szCs w:val="24"/>
               </w:rPr>
-              <w:t xml:space="preserve">Continuación de prototipo: diseño de página (archivos css) </w:t>
+              <w:t xml:space="preserve">Continuación de prototipo: diseño de página (archivos </w:t>
+            </w:r>
+            <w:proofErr w:type="spellStart"/>
+            <w:r>
+              <w:rPr>
+                <w:rFonts w:ascii="Arial" w:hAnsi="Arial" w:cs="Arial"/>
+                <w:sz w:val="24"/>
+                <w:szCs w:val="24"/>
+              </w:rPr>
+              <w:t>css</w:t>
+            </w:r>
+            <w:proofErr w:type="spellEnd"/>
+            <w:r>
+              <w:rPr>
+                <w:rFonts w:ascii="Arial" w:hAnsi="Arial" w:cs="Arial"/>
+                <w:sz w:val="24"/>
+                <w:szCs w:val="24"/>
+              </w:rPr>
+              <w:t xml:space="preserve">) </w:t>
             </w:r>
           </w:p>
         </w:tc>
@@ -30979,8 +31969,18 @@
                 <w:sz w:val="24"/>
                 <w:szCs w:val="24"/>
               </w:rPr>
-              <w:t>Desarrollador backend</w:t>
-            </w:r>
+              <w:t xml:space="preserve">Desarrollador </w:t>
+            </w:r>
+            <w:proofErr w:type="spellStart"/>
+            <w:r>
+              <w:rPr>
+                <w:rFonts w:ascii="Arial" w:hAnsi="Arial" w:cs="Arial"/>
+                <w:sz w:val="24"/>
+                <w:szCs w:val="24"/>
+              </w:rPr>
+              <w:t>backend</w:t>
+            </w:r>
+            <w:proofErr w:type="spellEnd"/>
           </w:p>
         </w:tc>
         <w:tc>
@@ -31212,16 +32212,40 @@
                 <w:szCs w:val="24"/>
               </w:rPr>
             </w:pPr>
-            <w:r>
-              <w:rPr>
-                <w:rFonts w:ascii="Arial" w:hAnsi="Arial" w:cs="Arial"/>
-                <w:b/>
-                <w:bCs/>
-                <w:sz w:val="24"/>
-                <w:szCs w:val="24"/>
-              </w:rPr>
-              <w:t>Hr. Ini</w:t>
-            </w:r>
+            <w:proofErr w:type="spellStart"/>
+            <w:r>
+              <w:rPr>
+                <w:rFonts w:ascii="Arial" w:hAnsi="Arial" w:cs="Arial"/>
+                <w:b/>
+                <w:bCs/>
+                <w:sz w:val="24"/>
+                <w:szCs w:val="24"/>
+              </w:rPr>
+              <w:t>Hr</w:t>
+            </w:r>
+            <w:proofErr w:type="spellEnd"/>
+            <w:r>
+              <w:rPr>
+                <w:rFonts w:ascii="Arial" w:hAnsi="Arial" w:cs="Arial"/>
+                <w:b/>
+                <w:bCs/>
+                <w:sz w:val="24"/>
+                <w:szCs w:val="24"/>
+              </w:rPr>
+              <w:t xml:space="preserve">. </w:t>
+            </w:r>
+            <w:proofErr w:type="spellStart"/>
+            <w:r>
+              <w:rPr>
+                <w:rFonts w:ascii="Arial" w:hAnsi="Arial" w:cs="Arial"/>
+                <w:b/>
+                <w:bCs/>
+                <w:sz w:val="24"/>
+                <w:szCs w:val="24"/>
+              </w:rPr>
+              <w:t>Ini</w:t>
+            </w:r>
+            <w:proofErr w:type="spellEnd"/>
           </w:p>
         </w:tc>
         <w:tc>
@@ -31241,15 +32265,27 @@
                 <w:szCs w:val="24"/>
               </w:rPr>
             </w:pPr>
-            <w:r>
-              <w:rPr>
-                <w:rFonts w:ascii="Arial" w:hAnsi="Arial" w:cs="Arial"/>
-                <w:b/>
-                <w:bCs/>
-                <w:sz w:val="24"/>
-                <w:szCs w:val="24"/>
-              </w:rPr>
-              <w:t>Hr. fin</w:t>
+            <w:proofErr w:type="spellStart"/>
+            <w:r>
+              <w:rPr>
+                <w:rFonts w:ascii="Arial" w:hAnsi="Arial" w:cs="Arial"/>
+                <w:b/>
+                <w:bCs/>
+                <w:sz w:val="24"/>
+                <w:szCs w:val="24"/>
+              </w:rPr>
+              <w:t>Hr</w:t>
+            </w:r>
+            <w:proofErr w:type="spellEnd"/>
+            <w:r>
+              <w:rPr>
+                <w:rFonts w:ascii="Arial" w:hAnsi="Arial" w:cs="Arial"/>
+                <w:b/>
+                <w:bCs/>
+                <w:sz w:val="24"/>
+                <w:szCs w:val="24"/>
+              </w:rPr>
+              <w:t>. fin</w:t>
             </w:r>
           </w:p>
         </w:tc>
@@ -31720,6 +32756,14 @@
                 <w:sz w:val="24"/>
                 <w:szCs w:val="24"/>
               </w:rPr>
+              <w:t xml:space="preserve"> </w:t>
+            </w:r>
+            <w:r>
+              <w:rPr>
+                <w:rFonts w:ascii="Arial" w:hAnsi="Arial" w:cs="Arial"/>
+                <w:sz w:val="24"/>
+                <w:szCs w:val="24"/>
+              </w:rPr>
               <w:t>a</w:t>
             </w:r>
             <w:r>
@@ -31760,6 +32804,14 @@
                 <w:szCs w:val="24"/>
               </w:rPr>
               <w:t>:00</w:t>
+            </w:r>
+            <w:r>
+              <w:rPr>
+                <w:rFonts w:ascii="Arial" w:hAnsi="Arial" w:cs="Arial"/>
+                <w:sz w:val="24"/>
+                <w:szCs w:val="24"/>
+              </w:rPr>
+              <w:t xml:space="preserve"> </w:t>
             </w:r>
             <w:r>
               <w:rPr>

</xml_diff>

<commit_message>
:memo: Bitácora 20 de mayo: PF y Estimaciones.
</commit_message>
<xml_diff>
--- a/BITACORA.docx
+++ b/BITACORA.docx
@@ -806,7 +806,7 @@
           <w:r>
             <w:fldChar w:fldCharType="separate"/>
           </w:r>
-          <w:hyperlink w:anchor="_Toc229984842" w:history="1">
+          <w:hyperlink w:anchor="_Toc230158414" w:history="1">
             <w:r>
               <w:rPr>
                 <w:rStyle w:val="Hipervnculo"/>
@@ -833,7 +833,7 @@
                 <w:noProof/>
                 <w:webHidden/>
               </w:rPr>
-              <w:instrText xml:space="preserve"> PAGEREF _Toc229984842 \h </w:instrText>
+              <w:instrText xml:space="preserve"> PAGEREF _Toc230158414 \h </w:instrText>
             </w:r>
             <w:r>
               <w:rPr>
@@ -874,7 +874,7 @@
               <w:lang w:eastAsia="ko-KR"/>
             </w:rPr>
           </w:pPr>
-          <w:hyperlink w:anchor="_Toc229984843" w:history="1">
+          <w:hyperlink w:anchor="_Toc230158415" w:history="1">
             <w:r>
               <w:rPr>
                 <w:rStyle w:val="Hipervnculo"/>
@@ -902,7 +902,7 @@
                 <w:noProof/>
                 <w:webHidden/>
               </w:rPr>
-              <w:instrText xml:space="preserve"> PAGEREF _Toc229984843 \h </w:instrText>
+              <w:instrText xml:space="preserve"> PAGEREF _Toc230158415 \h </w:instrText>
             </w:r>
             <w:r>
               <w:rPr>
@@ -946,7 +946,7 @@
               <w:lang w:eastAsia="ko-KR"/>
             </w:rPr>
           </w:pPr>
-          <w:hyperlink w:anchor="_Toc229984844" w:history="1">
+          <w:hyperlink w:anchor="_Toc230158416" w:history="1">
             <w:r>
               <w:rPr>
                 <w:rStyle w:val="Hipervnculo"/>
@@ -973,7 +973,7 @@
                 <w:noProof/>
                 <w:webHidden/>
               </w:rPr>
-              <w:instrText xml:space="preserve"> PAGEREF _Toc229984844 \h </w:instrText>
+              <w:instrText xml:space="preserve"> PAGEREF _Toc230158416 \h </w:instrText>
             </w:r>
             <w:r>
               <w:rPr>
@@ -1017,7 +1017,7 @@
               <w:lang w:eastAsia="ko-KR"/>
             </w:rPr>
           </w:pPr>
-          <w:hyperlink w:anchor="_Toc229984845" w:history="1">
+          <w:hyperlink w:anchor="_Toc230158417" w:history="1">
             <w:r>
               <w:rPr>
                 <w:rStyle w:val="Hipervnculo"/>
@@ -1044,7 +1044,7 @@
                 <w:noProof/>
                 <w:webHidden/>
               </w:rPr>
-              <w:instrText xml:space="preserve"> PAGEREF _Toc229984845 \h </w:instrText>
+              <w:instrText xml:space="preserve"> PAGEREF _Toc230158417 \h </w:instrText>
             </w:r>
             <w:r>
               <w:rPr>
@@ -1088,7 +1088,7 @@
               <w:lang w:eastAsia="ko-KR"/>
             </w:rPr>
           </w:pPr>
-          <w:hyperlink w:anchor="_Toc229984846" w:history="1">
+          <w:hyperlink w:anchor="_Toc230158418" w:history="1">
             <w:r>
               <w:rPr>
                 <w:rStyle w:val="Hipervnculo"/>
@@ -1115,7 +1115,7 @@
                 <w:noProof/>
                 <w:webHidden/>
               </w:rPr>
-              <w:instrText xml:space="preserve"> PAGEREF _Toc229984846 \h </w:instrText>
+              <w:instrText xml:space="preserve"> PAGEREF _Toc230158418 \h </w:instrText>
             </w:r>
             <w:r>
               <w:rPr>
@@ -1156,7 +1156,7 @@
               <w:lang w:eastAsia="ko-KR"/>
             </w:rPr>
           </w:pPr>
-          <w:hyperlink w:anchor="_Toc229984847" w:history="1">
+          <w:hyperlink w:anchor="_Toc230158419" w:history="1">
             <w:r>
               <w:rPr>
                 <w:rStyle w:val="Hipervnculo"/>
@@ -1184,7 +1184,7 @@
                 <w:noProof/>
                 <w:webHidden/>
               </w:rPr>
-              <w:instrText xml:space="preserve"> PAGEREF _Toc229984847 \h </w:instrText>
+              <w:instrText xml:space="preserve"> PAGEREF _Toc230158419 \h </w:instrText>
             </w:r>
             <w:r>
               <w:rPr>
@@ -1228,7 +1228,7 @@
               <w:lang w:eastAsia="ko-KR"/>
             </w:rPr>
           </w:pPr>
-          <w:hyperlink w:anchor="_Toc229984848" w:history="1">
+          <w:hyperlink w:anchor="_Toc230158420" w:history="1">
             <w:r>
               <w:rPr>
                 <w:rStyle w:val="Hipervnculo"/>
@@ -1255,7 +1255,7 @@
                 <w:noProof/>
                 <w:webHidden/>
               </w:rPr>
-              <w:instrText xml:space="preserve"> PAGEREF _Toc229984848 \h </w:instrText>
+              <w:instrText xml:space="preserve"> PAGEREF _Toc230158420 \h </w:instrText>
             </w:r>
             <w:r>
               <w:rPr>
@@ -1299,7 +1299,7 @@
               <w:lang w:eastAsia="ko-KR"/>
             </w:rPr>
           </w:pPr>
-          <w:hyperlink w:anchor="_Toc229984849" w:history="1">
+          <w:hyperlink w:anchor="_Toc230158421" w:history="1">
             <w:r>
               <w:rPr>
                 <w:rStyle w:val="Hipervnculo"/>
@@ -1326,7 +1326,7 @@
                 <w:noProof/>
                 <w:webHidden/>
               </w:rPr>
-              <w:instrText xml:space="preserve"> PAGEREF _Toc229984849 \h </w:instrText>
+              <w:instrText xml:space="preserve"> PAGEREF _Toc230158421 \h </w:instrText>
             </w:r>
             <w:r>
               <w:rPr>
@@ -1370,7 +1370,7 @@
               <w:lang w:eastAsia="ko-KR"/>
             </w:rPr>
           </w:pPr>
-          <w:hyperlink w:anchor="_Toc229984850" w:history="1">
+          <w:hyperlink w:anchor="_Toc230158422" w:history="1">
             <w:r>
               <w:rPr>
                 <w:rStyle w:val="Hipervnculo"/>
@@ -1397,7 +1397,7 @@
                 <w:noProof/>
                 <w:webHidden/>
               </w:rPr>
-              <w:instrText xml:space="preserve"> PAGEREF _Toc229984850 \h </w:instrText>
+              <w:instrText xml:space="preserve"> PAGEREF _Toc230158422 \h </w:instrText>
             </w:r>
             <w:r>
               <w:rPr>
@@ -1441,7 +1441,7 @@
               <w:lang w:eastAsia="ko-KR"/>
             </w:rPr>
           </w:pPr>
-          <w:hyperlink w:anchor="_Toc229984851" w:history="1">
+          <w:hyperlink w:anchor="_Toc230158423" w:history="1">
             <w:r>
               <w:rPr>
                 <w:rStyle w:val="Hipervnculo"/>
@@ -1469,7 +1469,7 @@
                 <w:noProof/>
                 <w:webHidden/>
               </w:rPr>
-              <w:instrText xml:space="preserve"> PAGEREF _Toc229984851 \h </w:instrText>
+              <w:instrText xml:space="preserve"> PAGEREF _Toc230158423 \h </w:instrText>
             </w:r>
             <w:r>
               <w:rPr>
@@ -1513,7 +1513,7 @@
               <w:lang w:eastAsia="ko-KR"/>
             </w:rPr>
           </w:pPr>
-          <w:hyperlink w:anchor="_Toc229984852" w:history="1">
+          <w:hyperlink w:anchor="_Toc230158424" w:history="1">
             <w:r>
               <w:rPr>
                 <w:rStyle w:val="Hipervnculo"/>
@@ -1540,7 +1540,7 @@
                 <w:noProof/>
                 <w:webHidden/>
               </w:rPr>
-              <w:instrText xml:space="preserve"> PAGEREF _Toc229984852 \h </w:instrText>
+              <w:instrText xml:space="preserve"> PAGEREF _Toc230158424 \h </w:instrText>
             </w:r>
             <w:r>
               <w:rPr>
@@ -1584,7 +1584,7 @@
               <w:lang w:eastAsia="ko-KR"/>
             </w:rPr>
           </w:pPr>
-          <w:hyperlink w:anchor="_Toc229984853" w:history="1">
+          <w:hyperlink w:anchor="_Toc230158425" w:history="1">
             <w:r>
               <w:rPr>
                 <w:rStyle w:val="Hipervnculo"/>
@@ -1611,7 +1611,7 @@
                 <w:noProof/>
                 <w:webHidden/>
               </w:rPr>
-              <w:instrText xml:space="preserve"> PAGEREF _Toc229984853 \h </w:instrText>
+              <w:instrText xml:space="preserve"> PAGEREF _Toc230158425 \h </w:instrText>
             </w:r>
             <w:r>
               <w:rPr>
@@ -1655,7 +1655,7 @@
               <w:lang w:eastAsia="ko-KR"/>
             </w:rPr>
           </w:pPr>
-          <w:hyperlink w:anchor="_Toc229984854" w:history="1">
+          <w:hyperlink w:anchor="_Toc230158426" w:history="1">
             <w:r>
               <w:rPr>
                 <w:rStyle w:val="Hipervnculo"/>
@@ -1682,7 +1682,7 @@
                 <w:noProof/>
                 <w:webHidden/>
               </w:rPr>
-              <w:instrText xml:space="preserve"> PAGEREF _Toc229984854 \h </w:instrText>
+              <w:instrText xml:space="preserve"> PAGEREF _Toc230158426 \h </w:instrText>
             </w:r>
             <w:r>
               <w:rPr>
@@ -1723,7 +1723,7 @@
               <w:lang w:eastAsia="ko-KR"/>
             </w:rPr>
           </w:pPr>
-          <w:hyperlink w:anchor="_Toc229984855" w:history="1">
+          <w:hyperlink w:anchor="_Toc230158427" w:history="1">
             <w:r>
               <w:rPr>
                 <w:rStyle w:val="Hipervnculo"/>
@@ -1751,7 +1751,7 @@
                 <w:noProof/>
                 <w:webHidden/>
               </w:rPr>
-              <w:instrText xml:space="preserve"> PAGEREF _Toc229984855 \h </w:instrText>
+              <w:instrText xml:space="preserve"> PAGEREF _Toc230158427 \h </w:instrText>
             </w:r>
             <w:r>
               <w:rPr>
@@ -1795,7 +1795,7 @@
               <w:lang w:eastAsia="ko-KR"/>
             </w:rPr>
           </w:pPr>
-          <w:hyperlink w:anchor="_Toc229984856" w:history="1">
+          <w:hyperlink w:anchor="_Toc230158428" w:history="1">
             <w:r>
               <w:rPr>
                 <w:rStyle w:val="Hipervnculo"/>
@@ -1822,7 +1822,7 @@
                 <w:noProof/>
                 <w:webHidden/>
               </w:rPr>
-              <w:instrText xml:space="preserve"> PAGEREF _Toc229984856 \h </w:instrText>
+              <w:instrText xml:space="preserve"> PAGEREF _Toc230158428 \h </w:instrText>
             </w:r>
             <w:r>
               <w:rPr>
@@ -1866,7 +1866,7 @@
               <w:lang w:eastAsia="ko-KR"/>
             </w:rPr>
           </w:pPr>
-          <w:hyperlink w:anchor="_Toc229984857" w:history="1">
+          <w:hyperlink w:anchor="_Toc230158429" w:history="1">
             <w:r>
               <w:rPr>
                 <w:rStyle w:val="Hipervnculo"/>
@@ -1893,7 +1893,7 @@
                 <w:noProof/>
                 <w:webHidden/>
               </w:rPr>
-              <w:instrText xml:space="preserve"> PAGEREF _Toc229984857 \h </w:instrText>
+              <w:instrText xml:space="preserve"> PAGEREF _Toc230158429 \h </w:instrText>
             </w:r>
             <w:r>
               <w:rPr>
@@ -1937,7 +1937,7 @@
               <w:lang w:eastAsia="ko-KR"/>
             </w:rPr>
           </w:pPr>
-          <w:hyperlink w:anchor="_Toc229984858" w:history="1">
+          <w:hyperlink w:anchor="_Toc230158430" w:history="1">
             <w:r>
               <w:rPr>
                 <w:rStyle w:val="Hipervnculo"/>
@@ -1964,7 +1964,7 @@
                 <w:noProof/>
                 <w:webHidden/>
               </w:rPr>
-              <w:instrText xml:space="preserve"> PAGEREF _Toc229984858 \h </w:instrText>
+              <w:instrText xml:space="preserve"> PAGEREF _Toc230158430 \h </w:instrText>
             </w:r>
             <w:r>
               <w:rPr>
@@ -2005,7 +2005,7 @@
               <w:lang w:eastAsia="ko-KR"/>
             </w:rPr>
           </w:pPr>
-          <w:hyperlink w:anchor="_Toc229984859" w:history="1">
+          <w:hyperlink w:anchor="_Toc230158431" w:history="1">
             <w:r>
               <w:rPr>
                 <w:rStyle w:val="Hipervnculo"/>
@@ -2033,7 +2033,7 @@
                 <w:noProof/>
                 <w:webHidden/>
               </w:rPr>
-              <w:instrText xml:space="preserve"> PAGEREF _Toc229984859 \h </w:instrText>
+              <w:instrText xml:space="preserve"> PAGEREF _Toc230158431 \h </w:instrText>
             </w:r>
             <w:r>
               <w:rPr>
@@ -2077,7 +2077,7 @@
               <w:lang w:eastAsia="ko-KR"/>
             </w:rPr>
           </w:pPr>
-          <w:hyperlink w:anchor="_Toc229984860" w:history="1">
+          <w:hyperlink w:anchor="_Toc230158432" w:history="1">
             <w:r>
               <w:rPr>
                 <w:rStyle w:val="Hipervnculo"/>
@@ -2104,7 +2104,7 @@
                 <w:noProof/>
                 <w:webHidden/>
               </w:rPr>
-              <w:instrText xml:space="preserve"> PAGEREF _Toc229984860 \h </w:instrText>
+              <w:instrText xml:space="preserve"> PAGEREF _Toc230158432 \h </w:instrText>
             </w:r>
             <w:r>
               <w:rPr>
@@ -2148,7 +2148,7 @@
               <w:lang w:eastAsia="ko-KR"/>
             </w:rPr>
           </w:pPr>
-          <w:hyperlink w:anchor="_Toc229984861" w:history="1">
+          <w:hyperlink w:anchor="_Toc230158433" w:history="1">
             <w:r>
               <w:rPr>
                 <w:rStyle w:val="Hipervnculo"/>
@@ -2175,7 +2175,7 @@
                 <w:noProof/>
                 <w:webHidden/>
               </w:rPr>
-              <w:instrText xml:space="preserve"> PAGEREF _Toc229984861 \h </w:instrText>
+              <w:instrText xml:space="preserve"> PAGEREF _Toc230158433 \h </w:instrText>
             </w:r>
             <w:r>
               <w:rPr>
@@ -2219,7 +2219,7 @@
               <w:lang w:eastAsia="ko-KR"/>
             </w:rPr>
           </w:pPr>
-          <w:hyperlink w:anchor="_Toc229984862" w:history="1">
+          <w:hyperlink w:anchor="_Toc230158434" w:history="1">
             <w:r>
               <w:rPr>
                 <w:rStyle w:val="Hipervnculo"/>
@@ -2246,7 +2246,7 @@
                 <w:noProof/>
                 <w:webHidden/>
               </w:rPr>
-              <w:instrText xml:space="preserve"> PAGEREF _Toc229984862 \h </w:instrText>
+              <w:instrText xml:space="preserve"> PAGEREF _Toc230158434 \h </w:instrText>
             </w:r>
             <w:r>
               <w:rPr>
@@ -2287,7 +2287,7 @@
               <w:lang w:eastAsia="ko-KR"/>
             </w:rPr>
           </w:pPr>
-          <w:hyperlink w:anchor="_Toc229984863" w:history="1">
+          <w:hyperlink w:anchor="_Toc230158435" w:history="1">
             <w:r>
               <w:rPr>
                 <w:rStyle w:val="Hipervnculo"/>
@@ -2315,7 +2315,7 @@
                 <w:noProof/>
                 <w:webHidden/>
               </w:rPr>
-              <w:instrText xml:space="preserve"> PAGEREF _Toc229984863 \h </w:instrText>
+              <w:instrText xml:space="preserve"> PAGEREF _Toc230158435 \h </w:instrText>
             </w:r>
             <w:r>
               <w:rPr>
@@ -2359,7 +2359,7 @@
               <w:lang w:eastAsia="ko-KR"/>
             </w:rPr>
           </w:pPr>
-          <w:hyperlink w:anchor="_Toc229984864" w:history="1">
+          <w:hyperlink w:anchor="_Toc230158436" w:history="1">
             <w:r>
               <w:rPr>
                 <w:rStyle w:val="Hipervnculo"/>
@@ -2386,7 +2386,7 @@
                 <w:noProof/>
                 <w:webHidden/>
               </w:rPr>
-              <w:instrText xml:space="preserve"> PAGEREF _Toc229984864 \h </w:instrText>
+              <w:instrText xml:space="preserve"> PAGEREF _Toc230158436 \h </w:instrText>
             </w:r>
             <w:r>
               <w:rPr>
@@ -2430,7 +2430,7 @@
               <w:lang w:eastAsia="ko-KR"/>
             </w:rPr>
           </w:pPr>
-          <w:hyperlink w:anchor="_Toc229984865" w:history="1">
+          <w:hyperlink w:anchor="_Toc230158437" w:history="1">
             <w:r>
               <w:rPr>
                 <w:rStyle w:val="Hipervnculo"/>
@@ -2457,7 +2457,7 @@
                 <w:noProof/>
                 <w:webHidden/>
               </w:rPr>
-              <w:instrText xml:space="preserve"> PAGEREF _Toc229984865 \h </w:instrText>
+              <w:instrText xml:space="preserve"> PAGEREF _Toc230158437 \h </w:instrText>
             </w:r>
             <w:r>
               <w:rPr>
@@ -2501,7 +2501,7 @@
               <w:lang w:eastAsia="ko-KR"/>
             </w:rPr>
           </w:pPr>
-          <w:hyperlink w:anchor="_Toc229984866" w:history="1">
+          <w:hyperlink w:anchor="_Toc230158438" w:history="1">
             <w:r>
               <w:rPr>
                 <w:rStyle w:val="Hipervnculo"/>
@@ -2528,7 +2528,7 @@
                 <w:noProof/>
                 <w:webHidden/>
               </w:rPr>
-              <w:instrText xml:space="preserve"> PAGEREF _Toc229984866 \h </w:instrText>
+              <w:instrText xml:space="preserve"> PAGEREF _Toc230158438 \h </w:instrText>
             </w:r>
             <w:r>
               <w:rPr>
@@ -2572,7 +2572,7 @@
               <w:lang w:eastAsia="ko-KR"/>
             </w:rPr>
           </w:pPr>
-          <w:hyperlink w:anchor="_Toc229984867" w:history="1">
+          <w:hyperlink w:anchor="_Toc230158439" w:history="1">
             <w:r>
               <w:rPr>
                 <w:rStyle w:val="Hipervnculo"/>
@@ -2599,7 +2599,7 @@
                 <w:noProof/>
                 <w:webHidden/>
               </w:rPr>
-              <w:instrText xml:space="preserve"> PAGEREF _Toc229984867 \h </w:instrText>
+              <w:instrText xml:space="preserve"> PAGEREF _Toc230158439 \h </w:instrText>
             </w:r>
             <w:r>
               <w:rPr>
@@ -2640,7 +2640,7 @@
               <w:lang w:eastAsia="ko-KR"/>
             </w:rPr>
           </w:pPr>
-          <w:hyperlink w:anchor="_Toc229984868" w:history="1">
+          <w:hyperlink w:anchor="_Toc230158440" w:history="1">
             <w:r>
               <w:rPr>
                 <w:rStyle w:val="Hipervnculo"/>
@@ -2668,7 +2668,7 @@
                 <w:noProof/>
                 <w:webHidden/>
               </w:rPr>
-              <w:instrText xml:space="preserve"> PAGEREF _Toc229984868 \h </w:instrText>
+              <w:instrText xml:space="preserve"> PAGEREF _Toc230158440 \h </w:instrText>
             </w:r>
             <w:r>
               <w:rPr>
@@ -2712,7 +2712,7 @@
               <w:lang w:eastAsia="ko-KR"/>
             </w:rPr>
           </w:pPr>
-          <w:hyperlink w:anchor="_Toc229984869" w:history="1">
+          <w:hyperlink w:anchor="_Toc230158441" w:history="1">
             <w:r>
               <w:rPr>
                 <w:rStyle w:val="Hipervnculo"/>
@@ -2739,7 +2739,7 @@
                 <w:noProof/>
                 <w:webHidden/>
               </w:rPr>
-              <w:instrText xml:space="preserve"> PAGEREF _Toc229984869 \h </w:instrText>
+              <w:instrText xml:space="preserve"> PAGEREF _Toc230158441 \h </w:instrText>
             </w:r>
             <w:r>
               <w:rPr>
@@ -2783,7 +2783,7 @@
               <w:lang w:eastAsia="ko-KR"/>
             </w:rPr>
           </w:pPr>
-          <w:hyperlink w:anchor="_Toc229984870" w:history="1">
+          <w:hyperlink w:anchor="_Toc230158442" w:history="1">
             <w:r>
               <w:rPr>
                 <w:rStyle w:val="Hipervnculo"/>
@@ -2810,7 +2810,7 @@
                 <w:noProof/>
                 <w:webHidden/>
               </w:rPr>
-              <w:instrText xml:space="preserve"> PAGEREF _Toc229984870 \h </w:instrText>
+              <w:instrText xml:space="preserve"> PAGEREF _Toc230158442 \h </w:instrText>
             </w:r>
             <w:r>
               <w:rPr>
@@ -2851,7 +2851,7 @@
               <w:lang w:eastAsia="ko-KR"/>
             </w:rPr>
           </w:pPr>
-          <w:hyperlink w:anchor="_Toc229984871" w:history="1">
+          <w:hyperlink w:anchor="_Toc230158443" w:history="1">
             <w:r>
               <w:rPr>
                 <w:rStyle w:val="Hipervnculo"/>
@@ -2879,7 +2879,7 @@
                 <w:noProof/>
                 <w:webHidden/>
               </w:rPr>
-              <w:instrText xml:space="preserve"> PAGEREF _Toc229984871 \h </w:instrText>
+              <w:instrText xml:space="preserve"> PAGEREF _Toc230158443 \h </w:instrText>
             </w:r>
             <w:r>
               <w:rPr>
@@ -2923,7 +2923,7 @@
               <w:lang w:eastAsia="ko-KR"/>
             </w:rPr>
           </w:pPr>
-          <w:hyperlink w:anchor="_Toc229984872" w:history="1">
+          <w:hyperlink w:anchor="_Toc230158444" w:history="1">
             <w:r>
               <w:rPr>
                 <w:rStyle w:val="Hipervnculo"/>
@@ -2950,7 +2950,7 @@
                 <w:noProof/>
                 <w:webHidden/>
               </w:rPr>
-              <w:instrText xml:space="preserve"> PAGEREF _Toc229984872 \h </w:instrText>
+              <w:instrText xml:space="preserve"> PAGEREF _Toc230158444 \h </w:instrText>
             </w:r>
             <w:r>
               <w:rPr>
@@ -2994,7 +2994,7 @@
               <w:lang w:eastAsia="ko-KR"/>
             </w:rPr>
           </w:pPr>
-          <w:hyperlink w:anchor="_Toc229984873" w:history="1">
+          <w:hyperlink w:anchor="_Toc230158445" w:history="1">
             <w:r>
               <w:rPr>
                 <w:rStyle w:val="Hipervnculo"/>
@@ -3021,7 +3021,7 @@
                 <w:noProof/>
                 <w:webHidden/>
               </w:rPr>
-              <w:instrText xml:space="preserve"> PAGEREF _Toc229984873 \h </w:instrText>
+              <w:instrText xml:space="preserve"> PAGEREF _Toc230158445 \h </w:instrText>
             </w:r>
             <w:r>
               <w:rPr>
@@ -3065,7 +3065,7 @@
               <w:lang w:eastAsia="ko-KR"/>
             </w:rPr>
           </w:pPr>
-          <w:hyperlink w:anchor="_Toc229984874" w:history="1">
+          <w:hyperlink w:anchor="_Toc230158446" w:history="1">
             <w:r>
               <w:rPr>
                 <w:rStyle w:val="Hipervnculo"/>
@@ -3092,7 +3092,7 @@
                 <w:noProof/>
                 <w:webHidden/>
               </w:rPr>
-              <w:instrText xml:space="preserve"> PAGEREF _Toc229984874 \h </w:instrText>
+              <w:instrText xml:space="preserve"> PAGEREF _Toc230158446 \h </w:instrText>
             </w:r>
             <w:r>
               <w:rPr>
@@ -3136,7 +3136,7 @@
               <w:lang w:eastAsia="ko-KR"/>
             </w:rPr>
           </w:pPr>
-          <w:hyperlink w:anchor="_Toc229984875" w:history="1">
+          <w:hyperlink w:anchor="_Toc230158447" w:history="1">
             <w:r>
               <w:rPr>
                 <w:rStyle w:val="Hipervnculo"/>
@@ -3163,7 +3163,7 @@
                 <w:noProof/>
                 <w:webHidden/>
               </w:rPr>
-              <w:instrText xml:space="preserve"> PAGEREF _Toc229984875 \h </w:instrText>
+              <w:instrText xml:space="preserve"> PAGEREF _Toc230158447 \h </w:instrText>
             </w:r>
             <w:r>
               <w:rPr>
@@ -3204,7 +3204,7 @@
               <w:lang w:eastAsia="ko-KR"/>
             </w:rPr>
           </w:pPr>
-          <w:hyperlink w:anchor="_Toc229984876" w:history="1">
+          <w:hyperlink w:anchor="_Toc230158448" w:history="1">
             <w:r>
               <w:rPr>
                 <w:rStyle w:val="Hipervnculo"/>
@@ -3232,7 +3232,7 @@
                 <w:noProof/>
                 <w:webHidden/>
               </w:rPr>
-              <w:instrText xml:space="preserve"> PAGEREF _Toc229984876 \h </w:instrText>
+              <w:instrText xml:space="preserve"> PAGEREF _Toc230158448 \h </w:instrText>
             </w:r>
             <w:r>
               <w:rPr>
@@ -3276,7 +3276,7 @@
               <w:lang w:eastAsia="ko-KR"/>
             </w:rPr>
           </w:pPr>
-          <w:hyperlink w:anchor="_Toc229984877" w:history="1">
+          <w:hyperlink w:anchor="_Toc230158449" w:history="1">
             <w:r>
               <w:rPr>
                 <w:rStyle w:val="Hipervnculo"/>
@@ -3303,7 +3303,7 @@
                 <w:noProof/>
                 <w:webHidden/>
               </w:rPr>
-              <w:instrText xml:space="preserve"> PAGEREF _Toc229984877 \h </w:instrText>
+              <w:instrText xml:space="preserve"> PAGEREF _Toc230158449 \h </w:instrText>
             </w:r>
             <w:r>
               <w:rPr>
@@ -3347,7 +3347,7 @@
               <w:lang w:eastAsia="ko-KR"/>
             </w:rPr>
           </w:pPr>
-          <w:hyperlink w:anchor="_Toc229984878" w:history="1">
+          <w:hyperlink w:anchor="_Toc230158450" w:history="1">
             <w:r>
               <w:rPr>
                 <w:rStyle w:val="Hipervnculo"/>
@@ -3374,7 +3374,7 @@
                 <w:noProof/>
                 <w:webHidden/>
               </w:rPr>
-              <w:instrText xml:space="preserve"> PAGEREF _Toc229984878 \h </w:instrText>
+              <w:instrText xml:space="preserve"> PAGEREF _Toc230158450 \h </w:instrText>
             </w:r>
             <w:r>
               <w:rPr>
@@ -3418,7 +3418,7 @@
               <w:lang w:eastAsia="ko-KR"/>
             </w:rPr>
           </w:pPr>
-          <w:hyperlink w:anchor="_Toc229984879" w:history="1">
+          <w:hyperlink w:anchor="_Toc230158451" w:history="1">
             <w:r>
               <w:rPr>
                 <w:rStyle w:val="Hipervnculo"/>
@@ -3445,7 +3445,7 @@
                 <w:noProof/>
                 <w:webHidden/>
               </w:rPr>
-              <w:instrText xml:space="preserve"> PAGEREF _Toc229984879 \h </w:instrText>
+              <w:instrText xml:space="preserve"> PAGEREF _Toc230158451 \h </w:instrText>
             </w:r>
             <w:r>
               <w:rPr>
@@ -3486,7 +3486,7 @@
               <w:lang w:eastAsia="ko-KR"/>
             </w:rPr>
           </w:pPr>
-          <w:hyperlink w:anchor="_Toc229984880" w:history="1">
+          <w:hyperlink w:anchor="_Toc230158452" w:history="1">
             <w:r>
               <w:rPr>
                 <w:rStyle w:val="Hipervnculo"/>
@@ -3514,7 +3514,7 @@
                 <w:noProof/>
                 <w:webHidden/>
               </w:rPr>
-              <w:instrText xml:space="preserve"> PAGEREF _Toc229984880 \h </w:instrText>
+              <w:instrText xml:space="preserve"> PAGEREF _Toc230158452 \h </w:instrText>
             </w:r>
             <w:r>
               <w:rPr>
@@ -3558,7 +3558,7 @@
               <w:lang w:eastAsia="ko-KR"/>
             </w:rPr>
           </w:pPr>
-          <w:hyperlink w:anchor="_Toc229984881" w:history="1">
+          <w:hyperlink w:anchor="_Toc230158453" w:history="1">
             <w:r>
               <w:rPr>
                 <w:rStyle w:val="Hipervnculo"/>
@@ -3585,7 +3585,7 @@
                 <w:noProof/>
                 <w:webHidden/>
               </w:rPr>
-              <w:instrText xml:space="preserve"> PAGEREF _Toc229984881 \h </w:instrText>
+              <w:instrText xml:space="preserve"> PAGEREF _Toc230158453 \h </w:instrText>
             </w:r>
             <w:r>
               <w:rPr>
@@ -3629,7 +3629,7 @@
               <w:lang w:eastAsia="ko-KR"/>
             </w:rPr>
           </w:pPr>
-          <w:hyperlink w:anchor="_Toc229984882" w:history="1">
+          <w:hyperlink w:anchor="_Toc230158454" w:history="1">
             <w:r>
               <w:rPr>
                 <w:rStyle w:val="Hipervnculo"/>
@@ -3656,7 +3656,7 @@
                 <w:noProof/>
                 <w:webHidden/>
               </w:rPr>
-              <w:instrText xml:space="preserve"> PAGEREF _Toc229984882 \h </w:instrText>
+              <w:instrText xml:space="preserve"> PAGEREF _Toc230158454 \h </w:instrText>
             </w:r>
             <w:r>
               <w:rPr>
@@ -3700,7 +3700,7 @@
               <w:lang w:eastAsia="ko-KR"/>
             </w:rPr>
           </w:pPr>
-          <w:hyperlink w:anchor="_Toc229984883" w:history="1">
+          <w:hyperlink w:anchor="_Toc230158455" w:history="1">
             <w:r>
               <w:rPr>
                 <w:rStyle w:val="Hipervnculo"/>
@@ -3727,7 +3727,7 @@
                 <w:noProof/>
                 <w:webHidden/>
               </w:rPr>
-              <w:instrText xml:space="preserve"> PAGEREF _Toc229984883 \h </w:instrText>
+              <w:instrText xml:space="preserve"> PAGEREF _Toc230158455 \h </w:instrText>
             </w:r>
             <w:r>
               <w:rPr>
@@ -3768,7 +3768,7 @@
               <w:lang w:eastAsia="ko-KR"/>
             </w:rPr>
           </w:pPr>
-          <w:hyperlink w:anchor="_Toc229984884" w:history="1">
+          <w:hyperlink w:anchor="_Toc230158456" w:history="1">
             <w:r>
               <w:rPr>
                 <w:rStyle w:val="Hipervnculo"/>
@@ -3796,7 +3796,7 @@
                 <w:noProof/>
                 <w:webHidden/>
               </w:rPr>
-              <w:instrText xml:space="preserve"> PAGEREF _Toc229984884 \h </w:instrText>
+              <w:instrText xml:space="preserve"> PAGEREF _Toc230158456 \h </w:instrText>
             </w:r>
             <w:r>
               <w:rPr>
@@ -3840,7 +3840,7 @@
               <w:lang w:eastAsia="ko-KR"/>
             </w:rPr>
           </w:pPr>
-          <w:hyperlink w:anchor="_Toc229984885" w:history="1">
+          <w:hyperlink w:anchor="_Toc230158457" w:history="1">
             <w:r>
               <w:rPr>
                 <w:rStyle w:val="Hipervnculo"/>
@@ -3867,7 +3867,7 @@
                 <w:noProof/>
                 <w:webHidden/>
               </w:rPr>
-              <w:instrText xml:space="preserve"> PAGEREF _Toc229984885 \h </w:instrText>
+              <w:instrText xml:space="preserve"> PAGEREF _Toc230158457 \h </w:instrText>
             </w:r>
             <w:r>
               <w:rPr>
@@ -3911,7 +3911,7 @@
               <w:lang w:eastAsia="ko-KR"/>
             </w:rPr>
           </w:pPr>
-          <w:hyperlink w:anchor="_Toc229984886" w:history="1">
+          <w:hyperlink w:anchor="_Toc230158458" w:history="1">
             <w:r>
               <w:rPr>
                 <w:rStyle w:val="Hipervnculo"/>
@@ -3938,7 +3938,7 @@
                 <w:noProof/>
                 <w:webHidden/>
               </w:rPr>
-              <w:instrText xml:space="preserve"> PAGEREF _Toc229984886 \h </w:instrText>
+              <w:instrText xml:space="preserve"> PAGEREF _Toc230158458 \h </w:instrText>
             </w:r>
             <w:r>
               <w:rPr>
@@ -3982,7 +3982,7 @@
               <w:lang w:eastAsia="ko-KR"/>
             </w:rPr>
           </w:pPr>
-          <w:hyperlink w:anchor="_Toc229984887" w:history="1">
+          <w:hyperlink w:anchor="_Toc230158459" w:history="1">
             <w:r>
               <w:rPr>
                 <w:rStyle w:val="Hipervnculo"/>
@@ -4009,7 +4009,7 @@
                 <w:noProof/>
                 <w:webHidden/>
               </w:rPr>
-              <w:instrText xml:space="preserve"> PAGEREF _Toc229984887 \h </w:instrText>
+              <w:instrText xml:space="preserve"> PAGEREF _Toc230158459 \h </w:instrText>
             </w:r>
             <w:r>
               <w:rPr>
@@ -4053,7 +4053,7 @@
               <w:lang w:eastAsia="ko-KR"/>
             </w:rPr>
           </w:pPr>
-          <w:hyperlink w:anchor="_Toc229984888" w:history="1">
+          <w:hyperlink w:anchor="_Toc230158460" w:history="1">
             <w:r>
               <w:rPr>
                 <w:rStyle w:val="Hipervnculo"/>
@@ -4080,7 +4080,7 @@
                 <w:noProof/>
                 <w:webHidden/>
               </w:rPr>
-              <w:instrText xml:space="preserve"> PAGEREF _Toc229984888 \h </w:instrText>
+              <w:instrText xml:space="preserve"> PAGEREF _Toc230158460 \h </w:instrText>
             </w:r>
             <w:r>
               <w:rPr>
@@ -4121,7 +4121,7 @@
               <w:lang w:eastAsia="ko-KR"/>
             </w:rPr>
           </w:pPr>
-          <w:hyperlink w:anchor="_Toc229984889" w:history="1">
+          <w:hyperlink w:anchor="_Toc230158461" w:history="1">
             <w:r>
               <w:rPr>
                 <w:rStyle w:val="Hipervnculo"/>
@@ -4149,7 +4149,7 @@
                 <w:noProof/>
                 <w:webHidden/>
               </w:rPr>
-              <w:instrText xml:space="preserve"> PAGEREF _Toc229984889 \h </w:instrText>
+              <w:instrText xml:space="preserve"> PAGEREF _Toc230158461 \h </w:instrText>
             </w:r>
             <w:r>
               <w:rPr>
@@ -4193,7 +4193,7 @@
               <w:lang w:eastAsia="ko-KR"/>
             </w:rPr>
           </w:pPr>
-          <w:hyperlink w:anchor="_Toc229984890" w:history="1">
+          <w:hyperlink w:anchor="_Toc230158462" w:history="1">
             <w:r>
               <w:rPr>
                 <w:rStyle w:val="Hipervnculo"/>
@@ -4220,7 +4220,7 @@
                 <w:noProof/>
                 <w:webHidden/>
               </w:rPr>
-              <w:instrText xml:space="preserve"> PAGEREF _Toc229984890 \h </w:instrText>
+              <w:instrText xml:space="preserve"> PAGEREF _Toc230158462 \h </w:instrText>
             </w:r>
             <w:r>
               <w:rPr>
@@ -4264,7 +4264,7 @@
               <w:lang w:eastAsia="ko-KR"/>
             </w:rPr>
           </w:pPr>
-          <w:hyperlink w:anchor="_Toc229984891" w:history="1">
+          <w:hyperlink w:anchor="_Toc230158463" w:history="1">
             <w:r>
               <w:rPr>
                 <w:rStyle w:val="Hipervnculo"/>
@@ -4291,7 +4291,7 @@
                 <w:noProof/>
                 <w:webHidden/>
               </w:rPr>
-              <w:instrText xml:space="preserve"> PAGEREF _Toc229984891 \h </w:instrText>
+              <w:instrText xml:space="preserve"> PAGEREF _Toc230158463 \h </w:instrText>
             </w:r>
             <w:r>
               <w:rPr>
@@ -4335,7 +4335,7 @@
               <w:lang w:eastAsia="ko-KR"/>
             </w:rPr>
           </w:pPr>
-          <w:hyperlink w:anchor="_Toc229984892" w:history="1">
+          <w:hyperlink w:anchor="_Toc230158464" w:history="1">
             <w:r>
               <w:rPr>
                 <w:rStyle w:val="Hipervnculo"/>
@@ -4362,7 +4362,7 @@
                 <w:noProof/>
                 <w:webHidden/>
               </w:rPr>
-              <w:instrText xml:space="preserve"> PAGEREF _Toc229984892 \h </w:instrText>
+              <w:instrText xml:space="preserve"> PAGEREF _Toc230158464 \h </w:instrText>
             </w:r>
             <w:r>
               <w:rPr>
@@ -4383,6 +4383,570 @@
                 <w:webHidden/>
               </w:rPr>
               <w:t>22</w:t>
+            </w:r>
+            <w:r>
+              <w:rPr>
+                <w:noProof/>
+                <w:webHidden/>
+              </w:rPr>
+              <w:fldChar w:fldCharType="end"/>
+            </w:r>
+          </w:hyperlink>
+        </w:p>
+        <w:p>
+          <w:pPr>
+            <w:pStyle w:val="TDC2"/>
+            <w:rPr>
+              <w:noProof/>
+              <w:sz w:val="24"/>
+              <w:szCs w:val="24"/>
+              <w:lang w:eastAsia="ko-KR"/>
+            </w:rPr>
+          </w:pPr>
+          <w:hyperlink w:anchor="_Toc230158465" w:history="1">
+            <w:r>
+              <w:rPr>
+                <w:rStyle w:val="Hipervnculo"/>
+                <w:rFonts w:ascii="Aptos" w:hAnsi="Aptos"/>
+                <w:noProof/>
+              </w:rPr>
+              <w:t>Día 2: Realizar Puntos de Función</w:t>
+            </w:r>
+            <w:r>
+              <w:rPr>
+                <w:noProof/>
+                <w:webHidden/>
+              </w:rPr>
+              <w:tab/>
+            </w:r>
+            <w:r>
+              <w:rPr>
+                <w:noProof/>
+                <w:webHidden/>
+              </w:rPr>
+              <w:fldChar w:fldCharType="begin"/>
+            </w:r>
+            <w:r>
+              <w:rPr>
+                <w:noProof/>
+                <w:webHidden/>
+              </w:rPr>
+              <w:instrText xml:space="preserve"> PAGEREF _Toc230158465 \h </w:instrText>
+            </w:r>
+            <w:r>
+              <w:rPr>
+                <w:noProof/>
+                <w:webHidden/>
+              </w:rPr>
+            </w:r>
+            <w:r>
+              <w:rPr>
+                <w:noProof/>
+                <w:webHidden/>
+              </w:rPr>
+              <w:fldChar w:fldCharType="separate"/>
+            </w:r>
+            <w:r>
+              <w:rPr>
+                <w:noProof/>
+                <w:webHidden/>
+              </w:rPr>
+              <w:t>23</w:t>
+            </w:r>
+            <w:r>
+              <w:rPr>
+                <w:noProof/>
+                <w:webHidden/>
+              </w:rPr>
+              <w:fldChar w:fldCharType="end"/>
+            </w:r>
+          </w:hyperlink>
+        </w:p>
+        <w:p>
+          <w:pPr>
+            <w:pStyle w:val="TDC3"/>
+            <w:tabs>
+              <w:tab w:val="right" w:leader="dot" w:pos="9350"/>
+            </w:tabs>
+            <w:rPr>
+              <w:noProof/>
+              <w:sz w:val="24"/>
+              <w:szCs w:val="24"/>
+              <w:lang w:eastAsia="ko-KR"/>
+            </w:rPr>
+          </w:pPr>
+          <w:hyperlink w:anchor="_Toc230158466" w:history="1">
+            <w:r>
+              <w:rPr>
+                <w:rStyle w:val="Hipervnculo"/>
+                <w:noProof/>
+              </w:rPr>
+              <w:t>Asistencia y Participación</w:t>
+            </w:r>
+            <w:r>
+              <w:rPr>
+                <w:noProof/>
+                <w:webHidden/>
+              </w:rPr>
+              <w:tab/>
+            </w:r>
+            <w:r>
+              <w:rPr>
+                <w:noProof/>
+                <w:webHidden/>
+              </w:rPr>
+              <w:fldChar w:fldCharType="begin"/>
+            </w:r>
+            <w:r>
+              <w:rPr>
+                <w:noProof/>
+                <w:webHidden/>
+              </w:rPr>
+              <w:instrText xml:space="preserve"> PAGEREF _Toc230158466 \h </w:instrText>
+            </w:r>
+            <w:r>
+              <w:rPr>
+                <w:noProof/>
+                <w:webHidden/>
+              </w:rPr>
+            </w:r>
+            <w:r>
+              <w:rPr>
+                <w:noProof/>
+                <w:webHidden/>
+              </w:rPr>
+              <w:fldChar w:fldCharType="separate"/>
+            </w:r>
+            <w:r>
+              <w:rPr>
+                <w:noProof/>
+                <w:webHidden/>
+              </w:rPr>
+              <w:t>23</w:t>
+            </w:r>
+            <w:r>
+              <w:rPr>
+                <w:noProof/>
+                <w:webHidden/>
+              </w:rPr>
+              <w:fldChar w:fldCharType="end"/>
+            </w:r>
+          </w:hyperlink>
+        </w:p>
+        <w:p>
+          <w:pPr>
+            <w:pStyle w:val="TDC3"/>
+            <w:tabs>
+              <w:tab w:val="right" w:leader="dot" w:pos="9350"/>
+            </w:tabs>
+            <w:rPr>
+              <w:noProof/>
+              <w:sz w:val="24"/>
+              <w:szCs w:val="24"/>
+              <w:lang w:eastAsia="ko-KR"/>
+            </w:rPr>
+          </w:pPr>
+          <w:hyperlink w:anchor="_Toc230158467" w:history="1">
+            <w:r>
+              <w:rPr>
+                <w:rStyle w:val="Hipervnculo"/>
+                <w:noProof/>
+              </w:rPr>
+              <w:t>Actividades Ejecutadas</w:t>
+            </w:r>
+            <w:r>
+              <w:rPr>
+                <w:noProof/>
+                <w:webHidden/>
+              </w:rPr>
+              <w:tab/>
+            </w:r>
+            <w:r>
+              <w:rPr>
+                <w:noProof/>
+                <w:webHidden/>
+              </w:rPr>
+              <w:fldChar w:fldCharType="begin"/>
+            </w:r>
+            <w:r>
+              <w:rPr>
+                <w:noProof/>
+                <w:webHidden/>
+              </w:rPr>
+              <w:instrText xml:space="preserve"> PAGEREF _Toc230158467 \h </w:instrText>
+            </w:r>
+            <w:r>
+              <w:rPr>
+                <w:noProof/>
+                <w:webHidden/>
+              </w:rPr>
+            </w:r>
+            <w:r>
+              <w:rPr>
+                <w:noProof/>
+                <w:webHidden/>
+              </w:rPr>
+              <w:fldChar w:fldCharType="separate"/>
+            </w:r>
+            <w:r>
+              <w:rPr>
+                <w:noProof/>
+                <w:webHidden/>
+              </w:rPr>
+              <w:t>23</w:t>
+            </w:r>
+            <w:r>
+              <w:rPr>
+                <w:noProof/>
+                <w:webHidden/>
+              </w:rPr>
+              <w:fldChar w:fldCharType="end"/>
+            </w:r>
+          </w:hyperlink>
+        </w:p>
+        <w:p>
+          <w:pPr>
+            <w:pStyle w:val="TDC3"/>
+            <w:tabs>
+              <w:tab w:val="right" w:leader="dot" w:pos="9350"/>
+            </w:tabs>
+            <w:rPr>
+              <w:noProof/>
+              <w:sz w:val="24"/>
+              <w:szCs w:val="24"/>
+              <w:lang w:eastAsia="ko-KR"/>
+            </w:rPr>
+          </w:pPr>
+          <w:hyperlink w:anchor="_Toc230158468" w:history="1">
+            <w:r>
+              <w:rPr>
+                <w:rStyle w:val="Hipervnculo"/>
+                <w:noProof/>
+              </w:rPr>
+              <w:t>Gestión de Riesgos e Incidencias</w:t>
+            </w:r>
+            <w:r>
+              <w:rPr>
+                <w:noProof/>
+                <w:webHidden/>
+              </w:rPr>
+              <w:tab/>
+            </w:r>
+            <w:r>
+              <w:rPr>
+                <w:noProof/>
+                <w:webHidden/>
+              </w:rPr>
+              <w:fldChar w:fldCharType="begin"/>
+            </w:r>
+            <w:r>
+              <w:rPr>
+                <w:noProof/>
+                <w:webHidden/>
+              </w:rPr>
+              <w:instrText xml:space="preserve"> PAGEREF _Toc230158468 \h </w:instrText>
+            </w:r>
+            <w:r>
+              <w:rPr>
+                <w:noProof/>
+                <w:webHidden/>
+              </w:rPr>
+            </w:r>
+            <w:r>
+              <w:rPr>
+                <w:noProof/>
+                <w:webHidden/>
+              </w:rPr>
+              <w:fldChar w:fldCharType="separate"/>
+            </w:r>
+            <w:r>
+              <w:rPr>
+                <w:noProof/>
+                <w:webHidden/>
+              </w:rPr>
+              <w:t>23</w:t>
+            </w:r>
+            <w:r>
+              <w:rPr>
+                <w:noProof/>
+                <w:webHidden/>
+              </w:rPr>
+              <w:fldChar w:fldCharType="end"/>
+            </w:r>
+          </w:hyperlink>
+        </w:p>
+        <w:p>
+          <w:pPr>
+            <w:pStyle w:val="TDC2"/>
+            <w:rPr>
+              <w:noProof/>
+              <w:sz w:val="24"/>
+              <w:szCs w:val="24"/>
+              <w:lang w:eastAsia="ko-KR"/>
+            </w:rPr>
+          </w:pPr>
+          <w:hyperlink w:anchor="_Toc230158469" w:history="1">
+            <w:r>
+              <w:rPr>
+                <w:rStyle w:val="Hipervnculo"/>
+                <w:rFonts w:ascii="Aptos" w:hAnsi="Aptos"/>
+                <w:noProof/>
+              </w:rPr>
+              <w:t>Día 3: Realizar Puntos de Función y Estimación de Costos</w:t>
+            </w:r>
+            <w:r>
+              <w:rPr>
+                <w:noProof/>
+                <w:webHidden/>
+              </w:rPr>
+              <w:tab/>
+            </w:r>
+            <w:r>
+              <w:rPr>
+                <w:noProof/>
+                <w:webHidden/>
+              </w:rPr>
+              <w:fldChar w:fldCharType="begin"/>
+            </w:r>
+            <w:r>
+              <w:rPr>
+                <w:noProof/>
+                <w:webHidden/>
+              </w:rPr>
+              <w:instrText xml:space="preserve"> PAGEREF _Toc230158469 \h </w:instrText>
+            </w:r>
+            <w:r>
+              <w:rPr>
+                <w:noProof/>
+                <w:webHidden/>
+              </w:rPr>
+            </w:r>
+            <w:r>
+              <w:rPr>
+                <w:noProof/>
+                <w:webHidden/>
+              </w:rPr>
+              <w:fldChar w:fldCharType="separate"/>
+            </w:r>
+            <w:r>
+              <w:rPr>
+                <w:noProof/>
+                <w:webHidden/>
+              </w:rPr>
+              <w:t>25</w:t>
+            </w:r>
+            <w:r>
+              <w:rPr>
+                <w:noProof/>
+                <w:webHidden/>
+              </w:rPr>
+              <w:fldChar w:fldCharType="end"/>
+            </w:r>
+          </w:hyperlink>
+        </w:p>
+        <w:p>
+          <w:pPr>
+            <w:pStyle w:val="TDC3"/>
+            <w:tabs>
+              <w:tab w:val="right" w:leader="dot" w:pos="9350"/>
+            </w:tabs>
+            <w:rPr>
+              <w:noProof/>
+              <w:sz w:val="24"/>
+              <w:szCs w:val="24"/>
+              <w:lang w:eastAsia="ko-KR"/>
+            </w:rPr>
+          </w:pPr>
+          <w:hyperlink w:anchor="_Toc230158470" w:history="1">
+            <w:r>
+              <w:rPr>
+                <w:rStyle w:val="Hipervnculo"/>
+                <w:noProof/>
+              </w:rPr>
+              <w:t>Asistencia y Participación</w:t>
+            </w:r>
+            <w:r>
+              <w:rPr>
+                <w:noProof/>
+                <w:webHidden/>
+              </w:rPr>
+              <w:tab/>
+            </w:r>
+            <w:r>
+              <w:rPr>
+                <w:noProof/>
+                <w:webHidden/>
+              </w:rPr>
+              <w:fldChar w:fldCharType="begin"/>
+            </w:r>
+            <w:r>
+              <w:rPr>
+                <w:noProof/>
+                <w:webHidden/>
+              </w:rPr>
+              <w:instrText xml:space="preserve"> PAGEREF _Toc230158470 \h </w:instrText>
+            </w:r>
+            <w:r>
+              <w:rPr>
+                <w:noProof/>
+                <w:webHidden/>
+              </w:rPr>
+            </w:r>
+            <w:r>
+              <w:rPr>
+                <w:noProof/>
+                <w:webHidden/>
+              </w:rPr>
+              <w:fldChar w:fldCharType="separate"/>
+            </w:r>
+            <w:r>
+              <w:rPr>
+                <w:noProof/>
+                <w:webHidden/>
+              </w:rPr>
+              <w:t>25</w:t>
+            </w:r>
+            <w:r>
+              <w:rPr>
+                <w:noProof/>
+                <w:webHidden/>
+              </w:rPr>
+              <w:fldChar w:fldCharType="end"/>
+            </w:r>
+          </w:hyperlink>
+        </w:p>
+        <w:p>
+          <w:pPr>
+            <w:pStyle w:val="TDC3"/>
+            <w:tabs>
+              <w:tab w:val="right" w:leader="dot" w:pos="9350"/>
+            </w:tabs>
+            <w:rPr>
+              <w:noProof/>
+              <w:sz w:val="24"/>
+              <w:szCs w:val="24"/>
+              <w:lang w:eastAsia="ko-KR"/>
+            </w:rPr>
+          </w:pPr>
+          <w:hyperlink w:anchor="_Toc230158471" w:history="1">
+            <w:r>
+              <w:rPr>
+                <w:rStyle w:val="Hipervnculo"/>
+                <w:noProof/>
+              </w:rPr>
+              <w:t>Actividades Ejecutadas</w:t>
+            </w:r>
+            <w:r>
+              <w:rPr>
+                <w:noProof/>
+                <w:webHidden/>
+              </w:rPr>
+              <w:tab/>
+            </w:r>
+            <w:r>
+              <w:rPr>
+                <w:noProof/>
+                <w:webHidden/>
+              </w:rPr>
+              <w:fldChar w:fldCharType="begin"/>
+            </w:r>
+            <w:r>
+              <w:rPr>
+                <w:noProof/>
+                <w:webHidden/>
+              </w:rPr>
+              <w:instrText xml:space="preserve"> PAGEREF _Toc230158471 \h </w:instrText>
+            </w:r>
+            <w:r>
+              <w:rPr>
+                <w:noProof/>
+                <w:webHidden/>
+              </w:rPr>
+            </w:r>
+            <w:r>
+              <w:rPr>
+                <w:noProof/>
+                <w:webHidden/>
+              </w:rPr>
+              <w:fldChar w:fldCharType="separate"/>
+            </w:r>
+            <w:r>
+              <w:rPr>
+                <w:noProof/>
+                <w:webHidden/>
+              </w:rPr>
+              <w:t>25</w:t>
+            </w:r>
+            <w:r>
+              <w:rPr>
+                <w:noProof/>
+                <w:webHidden/>
+              </w:rPr>
+              <w:fldChar w:fldCharType="end"/>
+            </w:r>
+          </w:hyperlink>
+        </w:p>
+        <w:p>
+          <w:pPr>
+            <w:pStyle w:val="TDC3"/>
+            <w:tabs>
+              <w:tab w:val="right" w:leader="dot" w:pos="9350"/>
+            </w:tabs>
+            <w:rPr>
+              <w:noProof/>
+              <w:sz w:val="24"/>
+              <w:szCs w:val="24"/>
+              <w:lang w:eastAsia="ko-KR"/>
+            </w:rPr>
+          </w:pPr>
+          <w:hyperlink w:anchor="_Toc230158472" w:history="1">
+            <w:r>
+              <w:rPr>
+                <w:rStyle w:val="Hipervnculo"/>
+                <w:noProof/>
+              </w:rPr>
+              <w:t>Gestión de Riesgos e Incidencias</w:t>
+            </w:r>
+            <w:r>
+              <w:rPr>
+                <w:noProof/>
+                <w:webHidden/>
+              </w:rPr>
+              <w:tab/>
+            </w:r>
+            <w:r>
+              <w:rPr>
+                <w:noProof/>
+                <w:webHidden/>
+              </w:rPr>
+              <w:fldChar w:fldCharType="begin"/>
+            </w:r>
+            <w:r>
+              <w:rPr>
+                <w:noProof/>
+                <w:webHidden/>
+              </w:rPr>
+              <w:instrText xml:space="preserve"> PAGEREF _Toc230158472 \h </w:instrText>
+            </w:r>
+            <w:r>
+              <w:rPr>
+                <w:noProof/>
+                <w:webHidden/>
+              </w:rPr>
+            </w:r>
+            <w:r>
+              <w:rPr>
+                <w:noProof/>
+                <w:webHidden/>
+              </w:rPr>
+              <w:fldChar w:fldCharType="separate"/>
+            </w:r>
+            <w:r>
+              <w:rPr>
+                <w:noProof/>
+                <w:webHidden/>
+              </w:rPr>
+              <w:t>25</w:t>
             </w:r>
             <w:r>
               <w:rPr>
@@ -4406,7 +4970,7 @@
               <w:lang w:eastAsia="ko-KR"/>
             </w:rPr>
           </w:pPr>
-          <w:hyperlink w:anchor="_Toc229984893" w:history="1">
+          <w:hyperlink w:anchor="_Toc230158473" w:history="1">
             <w:r>
               <w:rPr>
                 <w:rStyle w:val="Hipervnculo"/>
@@ -4433,7 +4997,7 @@
                 <w:noProof/>
                 <w:webHidden/>
               </w:rPr>
-              <w:instrText xml:space="preserve"> PAGEREF _Toc229984893 \h </w:instrText>
+              <w:instrText xml:space="preserve"> PAGEREF _Toc230158473 \h </w:instrText>
             </w:r>
             <w:r>
               <w:rPr>
@@ -4453,7 +5017,7 @@
                 <w:noProof/>
                 <w:webHidden/>
               </w:rPr>
-              <w:t>23</w:t>
+              <w:t>27</w:t>
             </w:r>
             <w:r>
               <w:rPr>
@@ -4524,7 +5088,7 @@
         <w:jc w:val="both"/>
         <w:outlineLvl w:val="0"/>
       </w:pPr>
-      <w:bookmarkStart w:id="0" w:name="_Toc229984842"/>
+      <w:bookmarkStart w:id="0" w:name="_Toc230158414"/>
       <w:r>
         <w:lastRenderedPageBreak/>
         <w:t xml:space="preserve">Semana </w:t>
@@ -4583,7 +5147,7 @@
                 <w:szCs w:val="28"/>
               </w:rPr>
             </w:pPr>
-            <w:bookmarkStart w:id="1" w:name="_Toc229984843"/>
+            <w:bookmarkStart w:id="1" w:name="_Toc230158415"/>
             <w:r>
               <w:rPr>
                 <w:rFonts w:ascii="Aptos" w:hAnsi="Aptos"/>
@@ -4924,7 +5488,7 @@
           <w:szCs w:val="72"/>
         </w:rPr>
       </w:pPr>
-      <w:bookmarkStart w:id="2" w:name="_Toc229984844"/>
+      <w:bookmarkStart w:id="2" w:name="_Toc230158416"/>
       <w:r>
         <w:rPr>
           <w:sz w:val="32"/>
@@ -5738,7 +6302,7 @@
           <w:szCs w:val="72"/>
         </w:rPr>
       </w:pPr>
-      <w:bookmarkStart w:id="3" w:name="_Toc229984845"/>
+      <w:bookmarkStart w:id="3" w:name="_Toc230158417"/>
       <w:r>
         <w:rPr>
           <w:sz w:val="32"/>
@@ -6615,7 +7179,7 @@
           <w:szCs w:val="72"/>
         </w:rPr>
       </w:pPr>
-      <w:bookmarkStart w:id="4" w:name="_Toc229984846"/>
+      <w:bookmarkStart w:id="4" w:name="_Toc230158418"/>
       <w:r>
         <w:rPr>
           <w:sz w:val="32"/>
@@ -6904,7 +7468,7 @@
                 <w:szCs w:val="28"/>
               </w:rPr>
             </w:pPr>
-            <w:bookmarkStart w:id="5" w:name="_Toc229984847"/>
+            <w:bookmarkStart w:id="5" w:name="_Toc230158419"/>
             <w:r>
               <w:rPr>
                 <w:rFonts w:ascii="Aptos" w:hAnsi="Aptos"/>
@@ -7243,7 +7807,7 @@
           <w:szCs w:val="72"/>
         </w:rPr>
       </w:pPr>
-      <w:bookmarkStart w:id="6" w:name="_Toc229984848"/>
+      <w:bookmarkStart w:id="6" w:name="_Toc230158420"/>
       <w:r>
         <w:rPr>
           <w:sz w:val="32"/>
@@ -8043,7 +8607,7 @@
           <w:szCs w:val="72"/>
         </w:rPr>
       </w:pPr>
-      <w:bookmarkStart w:id="7" w:name="_Toc229984849"/>
+      <w:bookmarkStart w:id="7" w:name="_Toc230158421"/>
       <w:r>
         <w:rPr>
           <w:sz w:val="32"/>
@@ -8798,7 +9362,7 @@
           <w:szCs w:val="72"/>
         </w:rPr>
       </w:pPr>
-      <w:bookmarkStart w:id="8" w:name="_Toc229984850"/>
+      <w:bookmarkStart w:id="8" w:name="_Toc230158422"/>
       <w:r>
         <w:rPr>
           <w:sz w:val="32"/>
@@ -9085,7 +9649,7 @@
                 <w:color w:val="FFFFFF" w:themeColor="background1"/>
               </w:rPr>
             </w:pPr>
-            <w:bookmarkStart w:id="9" w:name="_Toc229984851"/>
+            <w:bookmarkStart w:id="9" w:name="_Toc230158423"/>
             <w:r>
               <w:rPr>
                 <w:rFonts w:ascii="Aptos" w:hAnsi="Aptos"/>
@@ -9432,7 +9996,7 @@
           <w:szCs w:val="72"/>
         </w:rPr>
       </w:pPr>
-      <w:bookmarkStart w:id="10" w:name="_Toc229984852"/>
+      <w:bookmarkStart w:id="10" w:name="_Toc230158424"/>
       <w:r>
         <w:rPr>
           <w:sz w:val="32"/>
@@ -10062,7 +10626,7 @@
           <w:szCs w:val="72"/>
         </w:rPr>
       </w:pPr>
-      <w:bookmarkStart w:id="11" w:name="_Toc229984853"/>
+      <w:bookmarkStart w:id="11" w:name="_Toc230158425"/>
       <w:r>
         <w:rPr>
           <w:sz w:val="32"/>
@@ -10441,7 +11005,7 @@
         <w:jc w:val="both"/>
         <w:outlineLvl w:val="0"/>
       </w:pPr>
-      <w:bookmarkStart w:id="12" w:name="_Toc229984854"/>
+      <w:bookmarkStart w:id="12" w:name="_Toc230158426"/>
       <w:r>
         <w:lastRenderedPageBreak/>
         <w:t xml:space="preserve">Semana </w:t>
@@ -10506,7 +11070,7 @@
                 <w:szCs w:val="28"/>
               </w:rPr>
             </w:pPr>
-            <w:bookmarkStart w:id="13" w:name="_Toc229984855"/>
+            <w:bookmarkStart w:id="13" w:name="_Toc230158427"/>
             <w:r>
               <w:rPr>
                 <w:rFonts w:ascii="Aptos" w:hAnsi="Aptos"/>
@@ -10844,7 +11408,7 @@
           <w:szCs w:val="72"/>
         </w:rPr>
       </w:pPr>
-      <w:bookmarkStart w:id="14" w:name="_Toc229984856"/>
+      <w:bookmarkStart w:id="14" w:name="_Toc230158428"/>
       <w:r>
         <w:rPr>
           <w:sz w:val="32"/>
@@ -11648,7 +12212,7 @@
           <w:szCs w:val="72"/>
         </w:rPr>
       </w:pPr>
-      <w:bookmarkStart w:id="15" w:name="_Toc229984857"/>
+      <w:bookmarkStart w:id="15" w:name="_Toc230158429"/>
       <w:r>
         <w:rPr>
           <w:sz w:val="32"/>
@@ -12596,7 +13160,7 @@
           <w:szCs w:val="72"/>
         </w:rPr>
       </w:pPr>
-      <w:bookmarkStart w:id="16" w:name="_Toc229984858"/>
+      <w:bookmarkStart w:id="16" w:name="_Toc230158430"/>
       <w:r>
         <w:rPr>
           <w:sz w:val="32"/>
@@ -12872,7 +13436,7 @@
                 <w:szCs w:val="28"/>
               </w:rPr>
             </w:pPr>
-            <w:bookmarkStart w:id="17" w:name="_Toc229984859"/>
+            <w:bookmarkStart w:id="17" w:name="_Toc230158431"/>
             <w:r>
               <w:rPr>
                 <w:rFonts w:ascii="Aptos" w:hAnsi="Aptos"/>
@@ -13211,7 +13775,7 @@
           <w:szCs w:val="72"/>
         </w:rPr>
       </w:pPr>
-      <w:bookmarkStart w:id="18" w:name="_Toc229984860"/>
+      <w:bookmarkStart w:id="18" w:name="_Toc230158432"/>
       <w:r>
         <w:rPr>
           <w:sz w:val="32"/>
@@ -13937,7 +14501,7 @@
           <w:szCs w:val="72"/>
         </w:rPr>
       </w:pPr>
-      <w:bookmarkStart w:id="19" w:name="_Toc229984861"/>
+      <w:bookmarkStart w:id="19" w:name="_Toc230158433"/>
       <w:r>
         <w:rPr>
           <w:sz w:val="32"/>
@@ -14670,7 +15234,7 @@
         <w:jc w:val="both"/>
         <w:outlineLvl w:val="0"/>
       </w:pPr>
-      <w:bookmarkStart w:id="20" w:name="_Toc229984862"/>
+      <w:bookmarkStart w:id="20" w:name="_Toc230158434"/>
       <w:r>
         <w:lastRenderedPageBreak/>
         <w:t xml:space="preserve">Semana </w:t>
@@ -14756,7 +15320,7 @@
                 <w:szCs w:val="28"/>
               </w:rPr>
             </w:pPr>
-            <w:bookmarkStart w:id="21" w:name="_Toc229984863"/>
+            <w:bookmarkStart w:id="21" w:name="_Toc230158435"/>
             <w:r>
               <w:rPr>
                 <w:rFonts w:ascii="Aptos" w:hAnsi="Aptos"/>
@@ -15146,7 +15710,7 @@
           <w:szCs w:val="72"/>
         </w:rPr>
       </w:pPr>
-      <w:bookmarkStart w:id="22" w:name="_Toc229984864"/>
+      <w:bookmarkStart w:id="22" w:name="_Toc230158436"/>
       <w:r>
         <w:rPr>
           <w:sz w:val="32"/>
@@ -16258,7 +16822,7 @@
           <w:szCs w:val="72"/>
         </w:rPr>
       </w:pPr>
-      <w:bookmarkStart w:id="23" w:name="_Toc229984865"/>
+      <w:bookmarkStart w:id="23" w:name="_Toc230158437"/>
       <w:r>
         <w:rPr>
           <w:sz w:val="32"/>
@@ -17516,7 +18080,7 @@
           <w:szCs w:val="72"/>
         </w:rPr>
       </w:pPr>
-      <w:bookmarkStart w:id="24" w:name="_Toc229984866"/>
+      <w:bookmarkStart w:id="24" w:name="_Toc230158438"/>
       <w:r>
         <w:rPr>
           <w:sz w:val="32"/>
@@ -17778,7 +18342,7 @@
         <w:jc w:val="both"/>
         <w:outlineLvl w:val="0"/>
       </w:pPr>
-      <w:bookmarkStart w:id="25" w:name="_Toc229984867"/>
+      <w:bookmarkStart w:id="25" w:name="_Toc230158439"/>
       <w:r>
         <w:lastRenderedPageBreak/>
         <w:t xml:space="preserve">Semana </w:t>
@@ -17855,7 +18419,7 @@
                 <w:szCs w:val="28"/>
               </w:rPr>
             </w:pPr>
-            <w:bookmarkStart w:id="26" w:name="_Toc229984868"/>
+            <w:bookmarkStart w:id="26" w:name="_Toc230158440"/>
             <w:r>
               <w:rPr>
                 <w:rFonts w:ascii="Aptos" w:hAnsi="Aptos"/>
@@ -18254,7 +18818,7 @@
           <w:szCs w:val="72"/>
         </w:rPr>
       </w:pPr>
-      <w:bookmarkStart w:id="27" w:name="_Toc229984869"/>
+      <w:bookmarkStart w:id="27" w:name="_Toc230158441"/>
       <w:r>
         <w:rPr>
           <w:sz w:val="32"/>
@@ -19191,7 +19755,7 @@
           <w:szCs w:val="72"/>
         </w:rPr>
       </w:pPr>
-      <w:bookmarkStart w:id="28" w:name="_Toc229984870"/>
+      <w:bookmarkStart w:id="28" w:name="_Toc230158442"/>
       <w:r>
         <w:rPr>
           <w:sz w:val="32"/>
@@ -20078,7 +20642,7 @@
                 <w:szCs w:val="28"/>
               </w:rPr>
             </w:pPr>
-            <w:bookmarkStart w:id="29" w:name="_Toc229984871"/>
+            <w:bookmarkStart w:id="29" w:name="_Toc230158443"/>
             <w:r>
               <w:rPr>
                 <w:rFonts w:ascii="Aptos" w:hAnsi="Aptos"/>
@@ -20474,7 +21038,7 @@
           <w:szCs w:val="72"/>
         </w:rPr>
       </w:pPr>
-      <w:bookmarkStart w:id="30" w:name="_Toc229984872"/>
+      <w:bookmarkStart w:id="30" w:name="_Toc230158444"/>
       <w:r>
         <w:rPr>
           <w:sz w:val="32"/>
@@ -21222,7 +21786,7 @@
           <w:szCs w:val="72"/>
         </w:rPr>
       </w:pPr>
-      <w:bookmarkStart w:id="31" w:name="_Toc229984873"/>
+      <w:bookmarkStart w:id="31" w:name="_Toc230158445"/>
       <w:r>
         <w:rPr>
           <w:sz w:val="32"/>
@@ -22063,7 +22627,7 @@
           <w:szCs w:val="72"/>
         </w:rPr>
       </w:pPr>
-      <w:bookmarkStart w:id="32" w:name="_Toc229984874"/>
+      <w:bookmarkStart w:id="32" w:name="_Toc230158446"/>
       <w:r>
         <w:rPr>
           <w:sz w:val="32"/>
@@ -22502,7 +23066,7 @@
         <w:jc w:val="both"/>
         <w:outlineLvl w:val="0"/>
       </w:pPr>
-      <w:bookmarkStart w:id="33" w:name="_Toc229984875"/>
+      <w:bookmarkStart w:id="33" w:name="_Toc230158447"/>
       <w:r>
         <w:lastRenderedPageBreak/>
         <w:t xml:space="preserve">Semana del </w:t>
@@ -22585,7 +23149,7 @@
                 <w:szCs w:val="28"/>
               </w:rPr>
             </w:pPr>
-            <w:bookmarkStart w:id="34" w:name="_Toc229984876"/>
+            <w:bookmarkStart w:id="34" w:name="_Toc230158448"/>
             <w:r>
               <w:rPr>
                 <w:rFonts w:ascii="Aptos" w:hAnsi="Aptos"/>
@@ -22966,7 +23530,7 @@
           <w:szCs w:val="72"/>
         </w:rPr>
       </w:pPr>
-      <w:bookmarkStart w:id="35" w:name="_Toc229984877"/>
+      <w:bookmarkStart w:id="35" w:name="_Toc230158449"/>
       <w:r>
         <w:rPr>
           <w:sz w:val="32"/>
@@ -23740,7 +24304,7 @@
           <w:szCs w:val="72"/>
         </w:rPr>
       </w:pPr>
-      <w:bookmarkStart w:id="36" w:name="_Toc229984878"/>
+      <w:bookmarkStart w:id="36" w:name="_Toc230158450"/>
       <w:r>
         <w:rPr>
           <w:sz w:val="32"/>
@@ -24599,7 +25163,7 @@
         <w:pStyle w:val="titulo1"/>
         <w:outlineLvl w:val="2"/>
       </w:pPr>
-      <w:bookmarkStart w:id="37" w:name="_Toc229984879"/>
+      <w:bookmarkStart w:id="37" w:name="_Toc230158451"/>
       <w:r>
         <w:rPr>
           <w:sz w:val="32"/>
@@ -24833,7 +25397,7 @@
             <w:pPr>
               <w:pStyle w:val="Ttulo2"/>
             </w:pPr>
-            <w:bookmarkStart w:id="38" w:name="_Toc229984880"/>
+            <w:bookmarkStart w:id="38" w:name="_Toc230158452"/>
             <w:r>
               <w:rPr>
                 <w:rFonts w:ascii="Aptos" w:hAnsi="Aptos"/>
@@ -25174,7 +25738,7 @@
           <w:szCs w:val="32"/>
         </w:rPr>
       </w:pPr>
-      <w:bookmarkStart w:id="39" w:name="_Toc229984881"/>
+      <w:bookmarkStart w:id="39" w:name="_Toc230158453"/>
       <w:r>
         <w:rPr>
           <w:sz w:val="32"/>
@@ -25822,7 +26386,7 @@
           <w:szCs w:val="32"/>
         </w:rPr>
       </w:pPr>
-      <w:bookmarkStart w:id="40" w:name="_Toc229984882"/>
+      <w:bookmarkStart w:id="40" w:name="_Toc230158454"/>
       <w:r>
         <w:rPr>
           <w:sz w:val="32"/>
@@ -26424,7 +26988,7 @@
         <w:pStyle w:val="titulo1"/>
         <w:outlineLvl w:val="2"/>
       </w:pPr>
-      <w:bookmarkStart w:id="41" w:name="_Toc229984883"/>
+      <w:bookmarkStart w:id="41" w:name="_Toc230158455"/>
       <w:r>
         <w:rPr>
           <w:sz w:val="32"/>
@@ -26653,7 +27217,7 @@
             <w:pPr>
               <w:pStyle w:val="Ttulo2"/>
             </w:pPr>
-            <w:bookmarkStart w:id="42" w:name="_Toc229984884"/>
+            <w:bookmarkStart w:id="42" w:name="_Toc230158456"/>
             <w:r>
               <w:rPr>
                 <w:rFonts w:ascii="Aptos" w:hAnsi="Aptos"/>
@@ -27001,7 +27565,7 @@
           <w:szCs w:val="32"/>
         </w:rPr>
       </w:pPr>
-      <w:bookmarkStart w:id="43" w:name="_Toc229984885"/>
+      <w:bookmarkStart w:id="43" w:name="_Toc230158457"/>
       <w:r>
         <w:rPr>
           <w:sz w:val="32"/>
@@ -27790,7 +28354,7 @@
           <w:szCs w:val="32"/>
         </w:rPr>
       </w:pPr>
-      <w:bookmarkStart w:id="44" w:name="_Toc229984886"/>
+      <w:bookmarkStart w:id="44" w:name="_Toc230158458"/>
       <w:r>
         <w:rPr>
           <w:sz w:val="32"/>
@@ -28520,7 +29084,7 @@
         <w:pStyle w:val="titulo1"/>
         <w:outlineLvl w:val="2"/>
       </w:pPr>
-      <w:bookmarkStart w:id="45" w:name="_Toc229984887"/>
+      <w:bookmarkStart w:id="45" w:name="_Toc230158459"/>
       <w:r>
         <w:rPr>
           <w:sz w:val="32"/>
@@ -28719,7 +29283,7 @@
         <w:jc w:val="both"/>
         <w:outlineLvl w:val="0"/>
       </w:pPr>
-      <w:bookmarkStart w:id="46" w:name="_Toc229984888"/>
+      <w:bookmarkStart w:id="46" w:name="_Toc230158460"/>
       <w:r>
         <w:lastRenderedPageBreak/>
         <w:t>Semana del 1</w:t>
@@ -28802,7 +29366,7 @@
                 <w:szCs w:val="28"/>
               </w:rPr>
             </w:pPr>
-            <w:bookmarkStart w:id="47" w:name="_Toc229984889"/>
+            <w:bookmarkStart w:id="47" w:name="_Toc230158461"/>
             <w:r>
               <w:rPr>
                 <w:rFonts w:ascii="Aptos" w:hAnsi="Aptos"/>
@@ -29191,7 +29755,7 @@
           <w:szCs w:val="72"/>
         </w:rPr>
       </w:pPr>
-      <w:bookmarkStart w:id="48" w:name="_Toc229984890"/>
+      <w:bookmarkStart w:id="48" w:name="_Toc230158462"/>
       <w:r>
         <w:rPr>
           <w:sz w:val="32"/>
@@ -29925,7 +30489,7 @@
           <w:szCs w:val="72"/>
         </w:rPr>
       </w:pPr>
-      <w:bookmarkStart w:id="49" w:name="_Toc229984891"/>
+      <w:bookmarkStart w:id="49" w:name="_Toc230158463"/>
       <w:r>
         <w:rPr>
           <w:sz w:val="32"/>
@@ -30764,7 +31328,7 @@
         <w:pStyle w:val="titulo1"/>
         <w:outlineLvl w:val="2"/>
       </w:pPr>
-      <w:bookmarkStart w:id="50" w:name="_Toc229984892"/>
+      <w:bookmarkStart w:id="50" w:name="_Toc230158464"/>
       <w:r>
         <w:rPr>
           <w:sz w:val="32"/>
@@ -31010,6 +31574,7 @@
                 <w:szCs w:val="28"/>
               </w:rPr>
             </w:pPr>
+            <w:bookmarkStart w:id="51" w:name="_Toc230158465"/>
             <w:r>
               <w:rPr>
                 <w:rFonts w:ascii="Aptos" w:hAnsi="Aptos"/>
@@ -31044,6 +31609,7 @@
               </w:rPr>
               <w:t>: Realizar Puntos de Función</w:t>
             </w:r>
+            <w:bookmarkEnd w:id="51"/>
           </w:p>
         </w:tc>
       </w:tr>
@@ -31399,6 +31965,7 @@
           <w:szCs w:val="72"/>
         </w:rPr>
       </w:pPr>
+      <w:bookmarkStart w:id="52" w:name="_Toc230158466"/>
       <w:r>
         <w:rPr>
           <w:sz w:val="32"/>
@@ -31406,6 +31973,7 @@
         </w:rPr>
         <w:t>Asistencia y Participación</w:t>
       </w:r>
+      <w:bookmarkEnd w:id="52"/>
     </w:p>
     <w:tbl>
       <w:tblPr>
@@ -32092,6 +32660,7 @@
           <w:szCs w:val="72"/>
         </w:rPr>
       </w:pPr>
+      <w:bookmarkStart w:id="53" w:name="_Toc230158467"/>
       <w:r>
         <w:rPr>
           <w:sz w:val="32"/>
@@ -32106,6 +32675,7 @@
         </w:rPr>
         <w:t>ctividades Ejecutadas</w:t>
       </w:r>
+      <w:bookmarkEnd w:id="53"/>
     </w:p>
     <w:tbl>
       <w:tblPr>
@@ -32862,6 +33432,7 @@
         <w:pStyle w:val="titulo1"/>
         <w:outlineLvl w:val="2"/>
       </w:pPr>
+      <w:bookmarkStart w:id="54" w:name="_Toc230158468"/>
       <w:r>
         <w:rPr>
           <w:sz w:val="32"/>
@@ -32869,6 +33440,2137 @@
         </w:rPr>
         <w:t>Gestión de Riesgos e Incidencias</w:t>
       </w:r>
+      <w:bookmarkEnd w:id="54"/>
+    </w:p>
+    <w:tbl>
+      <w:tblPr>
+        <w:tblStyle w:val="Tablaconcuadrcula"/>
+        <w:tblW w:w="0" w:type="auto"/>
+        <w:jc w:val="center"/>
+        <w:tblBorders>
+          <w:top w:val="single" w:sz="4" w:space="0" w:color="7F7F7F" w:themeColor="text1" w:themeTint="80"/>
+          <w:left w:val="single" w:sz="4" w:space="0" w:color="7F7F7F" w:themeColor="text1" w:themeTint="80"/>
+          <w:bottom w:val="single" w:sz="4" w:space="0" w:color="7F7F7F" w:themeColor="text1" w:themeTint="80"/>
+          <w:right w:val="single" w:sz="4" w:space="0" w:color="7F7F7F" w:themeColor="text1" w:themeTint="80"/>
+          <w:insideH w:val="single" w:sz="4" w:space="0" w:color="7F7F7F" w:themeColor="text1" w:themeTint="80"/>
+          <w:insideV w:val="single" w:sz="4" w:space="0" w:color="7F7F7F" w:themeColor="text1" w:themeTint="80"/>
+        </w:tblBorders>
+        <w:tblLook w:val="04A0" w:firstRow="1" w:lastRow="0" w:firstColumn="1" w:lastColumn="0" w:noHBand="0" w:noVBand="1"/>
+      </w:tblPr>
+      <w:tblGrid>
+        <w:gridCol w:w="2836"/>
+        <w:gridCol w:w="2923"/>
+        <w:gridCol w:w="3591"/>
+      </w:tblGrid>
+      <w:tr>
+        <w:trPr>
+          <w:trHeight w:val="300"/>
+          <w:jc w:val="center"/>
+        </w:trPr>
+        <w:tc>
+          <w:tcPr>
+            <w:tcW w:w="2942" w:type="dxa"/>
+            <w:shd w:val="clear" w:color="auto" w:fill="262626" w:themeFill="text1" w:themeFillTint="D9"/>
+            <w:vAlign w:val="center"/>
+          </w:tcPr>
+          <w:p>
+            <w:pPr>
+              <w:jc w:val="center"/>
+              <w:rPr>
+                <w:rFonts w:ascii="Arial" w:hAnsi="Arial" w:cs="Arial"/>
+                <w:b/>
+                <w:bCs/>
+                <w:sz w:val="24"/>
+                <w:szCs w:val="24"/>
+              </w:rPr>
+            </w:pPr>
+            <w:r>
+              <w:rPr>
+                <w:rFonts w:ascii="Arial" w:hAnsi="Arial" w:cs="Arial"/>
+                <w:b/>
+                <w:bCs/>
+                <w:sz w:val="24"/>
+                <w:szCs w:val="24"/>
+              </w:rPr>
+              <w:lastRenderedPageBreak/>
+              <w:t>Riesgo / Problema detectado</w:t>
+            </w:r>
+          </w:p>
+        </w:tc>
+        <w:tc>
+          <w:tcPr>
+            <w:tcW w:w="2943" w:type="dxa"/>
+            <w:shd w:val="clear" w:color="auto" w:fill="262626" w:themeFill="text1" w:themeFillTint="D9"/>
+            <w:vAlign w:val="center"/>
+          </w:tcPr>
+          <w:p>
+            <w:pPr>
+              <w:jc w:val="center"/>
+              <w:rPr>
+                <w:rFonts w:ascii="Arial" w:hAnsi="Arial" w:cs="Arial"/>
+                <w:b/>
+                <w:bCs/>
+                <w:sz w:val="24"/>
+                <w:szCs w:val="24"/>
+              </w:rPr>
+            </w:pPr>
+            <w:r>
+              <w:rPr>
+                <w:rFonts w:ascii="Arial" w:hAnsi="Arial" w:cs="Arial"/>
+                <w:b/>
+                <w:bCs/>
+                <w:sz w:val="24"/>
+                <w:szCs w:val="24"/>
+              </w:rPr>
+              <w:t>Impacto en alcance/tiempo/costo</w:t>
+            </w:r>
+          </w:p>
+        </w:tc>
+        <w:tc>
+          <w:tcPr>
+            <w:tcW w:w="3749" w:type="dxa"/>
+            <w:shd w:val="clear" w:color="auto" w:fill="262626" w:themeFill="text1" w:themeFillTint="D9"/>
+            <w:vAlign w:val="center"/>
+          </w:tcPr>
+          <w:p>
+            <w:pPr>
+              <w:jc w:val="center"/>
+              <w:rPr>
+                <w:rFonts w:ascii="Arial" w:hAnsi="Arial" w:cs="Arial"/>
+                <w:b/>
+                <w:bCs/>
+                <w:sz w:val="24"/>
+                <w:szCs w:val="24"/>
+              </w:rPr>
+            </w:pPr>
+            <w:r>
+              <w:rPr>
+                <w:rFonts w:ascii="Arial" w:hAnsi="Arial" w:cs="Arial"/>
+                <w:b/>
+                <w:bCs/>
+                <w:sz w:val="24"/>
+                <w:szCs w:val="24"/>
+              </w:rPr>
+              <w:t>Acción correctiva o preventiva</w:t>
+            </w:r>
+          </w:p>
+        </w:tc>
+      </w:tr>
+      <w:tr>
+        <w:trPr>
+          <w:trHeight w:val="300"/>
+          <w:jc w:val="center"/>
+        </w:trPr>
+        <w:tc>
+          <w:tcPr>
+            <w:tcW w:w="2942" w:type="dxa"/>
+            <w:vAlign w:val="center"/>
+          </w:tcPr>
+          <w:p>
+            <w:pPr>
+              <w:rPr>
+                <w:rFonts w:ascii="Arial" w:hAnsi="Arial" w:cs="Arial"/>
+                <w:sz w:val="24"/>
+                <w:szCs w:val="24"/>
+              </w:rPr>
+            </w:pPr>
+            <w:r>
+              <w:rPr>
+                <w:rFonts w:ascii="Arial" w:hAnsi="Arial" w:cs="Arial"/>
+                <w:sz w:val="24"/>
+                <w:szCs w:val="24"/>
+              </w:rPr>
+              <w:t xml:space="preserve">Error en información presentada en prototipo. </w:t>
+            </w:r>
+          </w:p>
+        </w:tc>
+        <w:tc>
+          <w:tcPr>
+            <w:tcW w:w="2943" w:type="dxa"/>
+            <w:vAlign w:val="center"/>
+          </w:tcPr>
+          <w:p>
+            <w:pPr>
+              <w:jc w:val="center"/>
+              <w:rPr>
+                <w:rFonts w:ascii="Arial" w:hAnsi="Arial" w:cs="Arial"/>
+                <w:sz w:val="24"/>
+                <w:szCs w:val="24"/>
+              </w:rPr>
+            </w:pPr>
+            <w:r>
+              <w:rPr>
+                <w:rFonts w:ascii="Arial" w:hAnsi="Arial" w:cs="Arial"/>
+                <w:sz w:val="24"/>
+                <w:szCs w:val="24"/>
+              </w:rPr>
+              <w:t>Alcance</w:t>
+            </w:r>
+          </w:p>
+        </w:tc>
+        <w:tc>
+          <w:tcPr>
+            <w:tcW w:w="3749" w:type="dxa"/>
+            <w:vAlign w:val="center"/>
+          </w:tcPr>
+          <w:p>
+            <w:r>
+              <w:rPr>
+                <w:rFonts w:ascii="Arial" w:hAnsi="Arial" w:cs="Arial"/>
+                <w:sz w:val="24"/>
+                <w:szCs w:val="24"/>
+              </w:rPr>
+              <w:t xml:space="preserve">Corregir información. </w:t>
+            </w:r>
+          </w:p>
+        </w:tc>
+      </w:tr>
+    </w:tbl>
+    <w:p/>
+    <w:p>
+      <w:r>
+        <w:br w:type="page"/>
+      </w:r>
+    </w:p>
+    <w:tbl>
+      <w:tblPr>
+        <w:tblStyle w:val="Tablaconcuadrcula"/>
+        <w:tblW w:w="9634" w:type="dxa"/>
+        <w:jc w:val="center"/>
+        <w:tblBorders>
+          <w:top w:val="single" w:sz="4" w:space="0" w:color="7F7F7F" w:themeColor="text1" w:themeTint="80"/>
+          <w:left w:val="single" w:sz="4" w:space="0" w:color="7F7F7F" w:themeColor="text1" w:themeTint="80"/>
+          <w:bottom w:val="single" w:sz="4" w:space="0" w:color="7F7F7F" w:themeColor="text1" w:themeTint="80"/>
+          <w:right w:val="single" w:sz="4" w:space="0" w:color="7F7F7F" w:themeColor="text1" w:themeTint="80"/>
+          <w:insideH w:val="single" w:sz="4" w:space="0" w:color="7F7F7F" w:themeColor="text1" w:themeTint="80"/>
+        </w:tblBorders>
+        <w:tblCellMar>
+          <w:top w:w="57" w:type="dxa"/>
+          <w:bottom w:w="57" w:type="dxa"/>
+        </w:tblCellMar>
+        <w:tblLook w:val="04A0" w:firstRow="1" w:lastRow="0" w:firstColumn="1" w:lastColumn="0" w:noHBand="0" w:noVBand="1"/>
+      </w:tblPr>
+      <w:tblGrid>
+        <w:gridCol w:w="5098"/>
+        <w:gridCol w:w="4536"/>
+      </w:tblGrid>
+      <w:tr>
+        <w:trPr>
+          <w:trHeight w:val="583"/>
+          <w:jc w:val="center"/>
+        </w:trPr>
+        <w:tc>
+          <w:tcPr>
+            <w:tcW w:w="9634" w:type="dxa"/>
+            <w:gridSpan w:val="2"/>
+            <w:shd w:val="clear" w:color="auto" w:fill="262626" w:themeFill="text1" w:themeFillTint="D9"/>
+            <w:vAlign w:val="center"/>
+          </w:tcPr>
+          <w:p>
+            <w:pPr>
+              <w:pStyle w:val="Ttulo2"/>
+              <w:rPr>
+                <w:rFonts w:ascii="Aptos" w:hAnsi="Aptos"/>
+                <w:b/>
+                <w:bCs/>
+                <w:color w:val="FFFFFF" w:themeColor="background1"/>
+                <w:sz w:val="28"/>
+                <w:szCs w:val="28"/>
+              </w:rPr>
+            </w:pPr>
+            <w:bookmarkStart w:id="55" w:name="_Toc230158469"/>
+            <w:r>
+              <w:rPr>
+                <w:rFonts w:ascii="Aptos" w:hAnsi="Aptos"/>
+                <w:b/>
+                <w:bCs/>
+                <w:color w:val="FFFFFF" w:themeColor="background1"/>
+                <w:sz w:val="28"/>
+                <w:szCs w:val="28"/>
+              </w:rPr>
+              <w:lastRenderedPageBreak/>
+              <w:t xml:space="preserve">Día </w:t>
+            </w:r>
+            <w:r>
+              <w:rPr>
+                <w:rFonts w:ascii="Aptos" w:hAnsi="Aptos"/>
+                <w:b/>
+                <w:bCs/>
+                <w:color w:val="FFFFFF" w:themeColor="background1"/>
+                <w:sz w:val="28"/>
+                <w:szCs w:val="28"/>
+              </w:rPr>
+              <w:t>3</w:t>
+            </w:r>
+            <w:r>
+              <w:rPr>
+                <w:rFonts w:ascii="Aptos" w:hAnsi="Aptos"/>
+                <w:b/>
+                <w:bCs/>
+                <w:color w:val="FFFFFF" w:themeColor="background1"/>
+                <w:sz w:val="28"/>
+                <w:szCs w:val="28"/>
+              </w:rPr>
+              <w:t>: Realizar Puntos de Función</w:t>
+            </w:r>
+            <w:r>
+              <w:rPr>
+                <w:rFonts w:ascii="Aptos" w:hAnsi="Aptos"/>
+                <w:b/>
+                <w:bCs/>
+                <w:color w:val="FFFFFF" w:themeColor="background1"/>
+                <w:sz w:val="28"/>
+                <w:szCs w:val="28"/>
+              </w:rPr>
+              <w:t xml:space="preserve"> y Estimación de Costos</w:t>
+            </w:r>
+            <w:bookmarkEnd w:id="55"/>
+            <w:r>
+              <w:rPr>
+                <w:rFonts w:ascii="Aptos" w:hAnsi="Aptos"/>
+                <w:b/>
+                <w:bCs/>
+                <w:color w:val="FFFFFF" w:themeColor="background1"/>
+                <w:sz w:val="28"/>
+                <w:szCs w:val="28"/>
+              </w:rPr>
+              <w:t xml:space="preserve"> </w:t>
+            </w:r>
+          </w:p>
+        </w:tc>
+      </w:tr>
+      <w:tr>
+        <w:trPr>
+          <w:jc w:val="center"/>
+        </w:trPr>
+        <w:tc>
+          <w:tcPr>
+            <w:tcW w:w="9634" w:type="dxa"/>
+            <w:gridSpan w:val="2"/>
+            <w:vAlign w:val="center"/>
+          </w:tcPr>
+          <w:p>
+            <w:pPr>
+              <w:rPr>
+                <w:rFonts w:ascii="Arial" w:hAnsi="Arial" w:cs="Arial"/>
+                <w:sz w:val="24"/>
+                <w:szCs w:val="24"/>
+              </w:rPr>
+            </w:pPr>
+            <w:r>
+              <w:rPr>
+                <w:rFonts w:ascii="Arial" w:hAnsi="Arial" w:cs="Arial"/>
+                <w:b/>
+                <w:bCs/>
+                <w:sz w:val="24"/>
+                <w:szCs w:val="24"/>
+              </w:rPr>
+              <w:t xml:space="preserve">Nombre del Proyecto: </w:t>
+            </w:r>
+            <w:r>
+              <w:rPr>
+                <w:rFonts w:ascii="Arial" w:hAnsi="Arial" w:cs="Arial"/>
+                <w:sz w:val="24"/>
+                <w:szCs w:val="24"/>
+              </w:rPr>
+              <w:t>Portafolio Digital de Arquitecto</w:t>
+            </w:r>
+          </w:p>
+        </w:tc>
+      </w:tr>
+      <w:tr>
+        <w:trPr>
+          <w:jc w:val="center"/>
+        </w:trPr>
+        <w:tc>
+          <w:tcPr>
+            <w:tcW w:w="5098" w:type="dxa"/>
+            <w:vAlign w:val="center"/>
+          </w:tcPr>
+          <w:p>
+            <w:pPr>
+              <w:rPr>
+                <w:rFonts w:ascii="Arial" w:hAnsi="Arial" w:cs="Arial"/>
+                <w:b/>
+                <w:bCs/>
+                <w:sz w:val="24"/>
+                <w:szCs w:val="24"/>
+              </w:rPr>
+            </w:pPr>
+            <w:r>
+              <w:rPr>
+                <w:rFonts w:ascii="Arial" w:hAnsi="Arial" w:cs="Arial"/>
+                <w:b/>
+                <w:bCs/>
+                <w:sz w:val="24"/>
+                <w:szCs w:val="24"/>
+              </w:rPr>
+              <w:t xml:space="preserve">Equipo No.: </w:t>
+            </w:r>
+            <w:r>
+              <w:rPr>
+                <w:rFonts w:ascii="Arial" w:hAnsi="Arial" w:cs="Arial"/>
+                <w:b/>
+                <w:bCs/>
+                <w:sz w:val="24"/>
+                <w:szCs w:val="24"/>
+              </w:rPr>
+              <w:tab/>
+            </w:r>
+            <w:r>
+              <w:rPr>
+                <w:rFonts w:ascii="Arial" w:hAnsi="Arial" w:cs="Arial"/>
+                <w:sz w:val="24"/>
+                <w:szCs w:val="24"/>
+              </w:rPr>
+              <w:t>6</w:t>
+            </w:r>
+          </w:p>
+        </w:tc>
+        <w:tc>
+          <w:tcPr>
+            <w:tcW w:w="4536" w:type="dxa"/>
+            <w:vAlign w:val="center"/>
+          </w:tcPr>
+          <w:p>
+            <w:pPr>
+              <w:rPr>
+                <w:rFonts w:ascii="Arial" w:hAnsi="Arial" w:cs="Arial"/>
+                <w:b/>
+                <w:bCs/>
+                <w:sz w:val="24"/>
+                <w:szCs w:val="24"/>
+              </w:rPr>
+            </w:pPr>
+            <w:r>
+              <w:rPr>
+                <w:rFonts w:ascii="Arial" w:hAnsi="Arial" w:cs="Arial"/>
+                <w:b/>
+                <w:bCs/>
+                <w:sz w:val="24"/>
+                <w:szCs w:val="24"/>
+              </w:rPr>
+              <w:t>Fecha:</w:t>
+            </w:r>
+            <w:r>
+              <w:rPr>
+                <w:rFonts w:ascii="Arial" w:hAnsi="Arial" w:cs="Arial"/>
+                <w:b/>
+                <w:bCs/>
+                <w:sz w:val="24"/>
+                <w:szCs w:val="24"/>
+              </w:rPr>
+              <w:t xml:space="preserve"> </w:t>
+            </w:r>
+            <w:r>
+              <w:rPr>
+                <w:rFonts w:ascii="Arial" w:hAnsi="Arial" w:cs="Arial"/>
+                <w:sz w:val="24"/>
+                <w:szCs w:val="24"/>
+              </w:rPr>
+              <w:t>20</w:t>
+            </w:r>
+            <w:r>
+              <w:rPr>
+                <w:rFonts w:ascii="Arial" w:hAnsi="Arial" w:cs="Arial"/>
+                <w:sz w:val="24"/>
+                <w:szCs w:val="24"/>
+              </w:rPr>
+              <w:t>/0</w:t>
+            </w:r>
+            <w:r>
+              <w:rPr>
+                <w:rFonts w:ascii="Arial" w:hAnsi="Arial" w:cs="Arial"/>
+                <w:sz w:val="24"/>
+                <w:szCs w:val="24"/>
+              </w:rPr>
+              <w:t>5</w:t>
+            </w:r>
+            <w:r>
+              <w:rPr>
+                <w:rFonts w:ascii="Arial" w:hAnsi="Arial" w:cs="Arial"/>
+                <w:sz w:val="24"/>
+                <w:szCs w:val="24"/>
+              </w:rPr>
+              <w:t>/202</w:t>
+            </w:r>
+            <w:r>
+              <w:rPr>
+                <w:rFonts w:ascii="Arial" w:hAnsi="Arial" w:cs="Arial"/>
+                <w:sz w:val="24"/>
+                <w:szCs w:val="24"/>
+              </w:rPr>
+              <w:t>6</w:t>
+            </w:r>
+          </w:p>
+        </w:tc>
+      </w:tr>
+      <w:tr>
+        <w:trPr>
+          <w:jc w:val="center"/>
+        </w:trPr>
+        <w:tc>
+          <w:tcPr>
+            <w:tcW w:w="5098" w:type="dxa"/>
+            <w:vAlign w:val="center"/>
+          </w:tcPr>
+          <w:p>
+            <w:pPr>
+              <w:rPr>
+                <w:rFonts w:ascii="Arial" w:hAnsi="Arial" w:cs="Arial"/>
+                <w:b/>
+                <w:bCs/>
+                <w:sz w:val="24"/>
+                <w:szCs w:val="24"/>
+              </w:rPr>
+            </w:pPr>
+            <w:r>
+              <w:rPr>
+                <w:rFonts w:ascii="Arial" w:hAnsi="Arial" w:cs="Arial"/>
+                <w:b/>
+                <w:bCs/>
+                <w:sz w:val="24"/>
+                <w:szCs w:val="24"/>
+              </w:rPr>
+              <w:t xml:space="preserve">Número de sesión / Día de trabajo: </w:t>
+            </w:r>
+            <w:r>
+              <w:rPr>
+                <w:rFonts w:ascii="Arial" w:hAnsi="Arial" w:cs="Arial"/>
+                <w:sz w:val="24"/>
+                <w:szCs w:val="24"/>
+              </w:rPr>
+              <w:t>1</w:t>
+            </w:r>
+          </w:p>
+        </w:tc>
+        <w:tc>
+          <w:tcPr>
+            <w:tcW w:w="4536" w:type="dxa"/>
+            <w:vAlign w:val="center"/>
+          </w:tcPr>
+          <w:p>
+            <w:pPr>
+              <w:rPr>
+                <w:rFonts w:ascii="Arial" w:hAnsi="Arial" w:cs="Arial"/>
+                <w:b/>
+                <w:bCs/>
+                <w:sz w:val="24"/>
+                <w:szCs w:val="24"/>
+              </w:rPr>
+            </w:pPr>
+            <w:r>
+              <w:rPr>
+                <w:rFonts w:ascii="Arial" w:hAnsi="Arial" w:cs="Arial"/>
+                <w:b/>
+                <w:bCs/>
+                <w:sz w:val="24"/>
+                <w:szCs w:val="24"/>
+              </w:rPr>
+              <w:t xml:space="preserve">Modalidad: </w:t>
+            </w:r>
+            <w:r>
+              <w:rPr>
+                <w:rFonts w:ascii="Arial" w:hAnsi="Arial" w:cs="Arial"/>
+                <w:sz w:val="24"/>
+                <w:szCs w:val="24"/>
+              </w:rPr>
+              <w:t>Presencial</w:t>
+            </w:r>
+            <w:r>
+              <w:rPr>
+                <w:rFonts w:ascii="Arial" w:hAnsi="Arial" w:cs="Arial"/>
+                <w:sz w:val="24"/>
+                <w:szCs w:val="24"/>
+              </w:rPr>
+              <w:t xml:space="preserve"> / </w:t>
+            </w:r>
+            <w:r>
+              <w:rPr>
+                <w:rFonts w:ascii="Arial" w:hAnsi="Arial" w:cs="Arial"/>
+                <w:sz w:val="24"/>
+                <w:szCs w:val="24"/>
+              </w:rPr>
+              <w:t>Virtual</w:t>
+            </w:r>
+            <w:r>
+              <w:rPr>
+                <w:rFonts w:ascii="Arial" w:hAnsi="Arial" w:cs="Arial"/>
+                <w:sz w:val="24"/>
+                <w:szCs w:val="24"/>
+              </w:rPr>
+              <w:t xml:space="preserve"> / </w:t>
+            </w:r>
+            <w:r>
+              <w:rPr>
+                <w:rFonts w:ascii="Arial" w:hAnsi="Arial" w:cs="Arial"/>
+                <w:sz w:val="24"/>
+                <w:szCs w:val="24"/>
+                <w:shd w:val="clear" w:color="auto" w:fill="F5E4A9" w:themeFill="accent3" w:themeFillTint="66"/>
+              </w:rPr>
+              <w:t>Mixto</w:t>
+            </w:r>
+          </w:p>
+        </w:tc>
+      </w:tr>
+      <w:tr>
+        <w:trPr>
+          <w:jc w:val="center"/>
+        </w:trPr>
+        <w:tc>
+          <w:tcPr>
+            <w:tcW w:w="9634" w:type="dxa"/>
+            <w:gridSpan w:val="2"/>
+            <w:vAlign w:val="center"/>
+          </w:tcPr>
+          <w:p>
+            <w:pPr>
+              <w:rPr>
+                <w:rFonts w:ascii="Arial" w:hAnsi="Arial" w:cs="Arial"/>
+                <w:b/>
+                <w:bCs/>
+                <w:sz w:val="24"/>
+                <w:szCs w:val="24"/>
+              </w:rPr>
+            </w:pPr>
+            <w:r>
+              <w:rPr>
+                <w:rFonts w:ascii="Arial" w:hAnsi="Arial" w:cs="Arial"/>
+                <w:b/>
+                <w:bCs/>
+                <w:sz w:val="24"/>
+                <w:szCs w:val="24"/>
+              </w:rPr>
+              <w:t>Duración de la sesión:</w:t>
+            </w:r>
+            <w:r>
+              <w:rPr>
+                <w:rFonts w:ascii="Arial" w:hAnsi="Arial" w:cs="Arial"/>
+                <w:b/>
+                <w:bCs/>
+                <w:sz w:val="24"/>
+                <w:szCs w:val="24"/>
+              </w:rPr>
+              <w:t xml:space="preserve"> </w:t>
+            </w:r>
+            <w:r>
+              <w:rPr>
+                <w:rFonts w:ascii="Arial" w:hAnsi="Arial" w:cs="Arial"/>
+                <w:sz w:val="24"/>
+                <w:szCs w:val="24"/>
+              </w:rPr>
+              <w:t xml:space="preserve">50 min. </w:t>
+            </w:r>
+          </w:p>
+        </w:tc>
+      </w:tr>
+    </w:tbl>
+    <w:p>
+      <w:pPr>
+        <w:rPr>
+          <w:rFonts w:ascii="Arial" w:hAnsi="Arial" w:cs="Arial"/>
+          <w:sz w:val="24"/>
+          <w:szCs w:val="24"/>
+        </w:rPr>
+      </w:pPr>
+    </w:p>
+    <w:p>
+      <w:pPr>
+        <w:pStyle w:val="titulo1"/>
+        <w:outlineLvl w:val="2"/>
+        <w:rPr>
+          <w:sz w:val="32"/>
+          <w:szCs w:val="72"/>
+        </w:rPr>
+      </w:pPr>
+      <w:bookmarkStart w:id="56" w:name="_Toc230158470"/>
+      <w:r>
+        <w:rPr>
+          <w:sz w:val="32"/>
+          <w:szCs w:val="72"/>
+        </w:rPr>
+        <w:t>Asistencia y Participación</w:t>
+      </w:r>
+      <w:bookmarkEnd w:id="56"/>
+    </w:p>
+    <w:tbl>
+      <w:tblPr>
+        <w:tblStyle w:val="Tablaconcuadrcula"/>
+        <w:tblW w:w="10281" w:type="dxa"/>
+        <w:jc w:val="center"/>
+        <w:tblBorders>
+          <w:top w:val="single" w:sz="4" w:space="0" w:color="7F7F7F" w:themeColor="text1" w:themeTint="80"/>
+          <w:left w:val="single" w:sz="4" w:space="0" w:color="7F7F7F" w:themeColor="text1" w:themeTint="80"/>
+          <w:bottom w:val="single" w:sz="4" w:space="0" w:color="7F7F7F" w:themeColor="text1" w:themeTint="80"/>
+          <w:right w:val="single" w:sz="4" w:space="0" w:color="7F7F7F" w:themeColor="text1" w:themeTint="80"/>
+          <w:insideH w:val="single" w:sz="4" w:space="0" w:color="7F7F7F" w:themeColor="text1" w:themeTint="80"/>
+          <w:insideV w:val="single" w:sz="4" w:space="0" w:color="7F7F7F" w:themeColor="text1" w:themeTint="80"/>
+        </w:tblBorders>
+        <w:tblCellMar>
+          <w:top w:w="57" w:type="dxa"/>
+          <w:bottom w:w="57" w:type="dxa"/>
+        </w:tblCellMar>
+        <w:tblLook w:val="04A0" w:firstRow="1" w:lastRow="0" w:firstColumn="1" w:lastColumn="0" w:noHBand="0" w:noVBand="1"/>
+      </w:tblPr>
+      <w:tblGrid>
+        <w:gridCol w:w="1538"/>
+        <w:gridCol w:w="1791"/>
+        <w:gridCol w:w="1563"/>
+        <w:gridCol w:w="3061"/>
+        <w:gridCol w:w="2328"/>
+      </w:tblGrid>
+      <w:tr>
+        <w:trPr>
+          <w:jc w:val="center"/>
+        </w:trPr>
+        <w:tc>
+          <w:tcPr>
+            <w:tcW w:w="1538" w:type="dxa"/>
+            <w:shd w:val="clear" w:color="auto" w:fill="262626" w:themeFill="text1" w:themeFillTint="D9"/>
+            <w:vAlign w:val="center"/>
+          </w:tcPr>
+          <w:p>
+            <w:pPr>
+              <w:jc w:val="center"/>
+              <w:rPr>
+                <w:rFonts w:ascii="Arial" w:hAnsi="Arial" w:cs="Arial"/>
+                <w:b/>
+                <w:bCs/>
+                <w:sz w:val="24"/>
+                <w:szCs w:val="24"/>
+              </w:rPr>
+            </w:pPr>
+            <w:r>
+              <w:rPr>
+                <w:rFonts w:ascii="Arial" w:hAnsi="Arial" w:cs="Arial"/>
+                <w:b/>
+                <w:bCs/>
+                <w:sz w:val="24"/>
+                <w:szCs w:val="24"/>
+              </w:rPr>
+              <w:t>Integrante</w:t>
+            </w:r>
+          </w:p>
+        </w:tc>
+        <w:tc>
+          <w:tcPr>
+            <w:tcW w:w="1791" w:type="dxa"/>
+            <w:shd w:val="clear" w:color="auto" w:fill="262626" w:themeFill="text1" w:themeFillTint="D9"/>
+            <w:vAlign w:val="center"/>
+          </w:tcPr>
+          <w:p>
+            <w:pPr>
+              <w:jc w:val="center"/>
+              <w:rPr>
+                <w:rFonts w:ascii="Arial" w:hAnsi="Arial" w:cs="Arial"/>
+                <w:b/>
+                <w:bCs/>
+                <w:sz w:val="24"/>
+                <w:szCs w:val="24"/>
+              </w:rPr>
+            </w:pPr>
+            <w:r>
+              <w:rPr>
+                <w:rFonts w:ascii="Arial" w:hAnsi="Arial" w:cs="Arial"/>
+                <w:b/>
+                <w:bCs/>
+                <w:sz w:val="24"/>
+                <w:szCs w:val="24"/>
+              </w:rPr>
+              <w:t>Rol</w:t>
+            </w:r>
+          </w:p>
+        </w:tc>
+        <w:tc>
+          <w:tcPr>
+            <w:tcW w:w="1563" w:type="dxa"/>
+            <w:shd w:val="clear" w:color="auto" w:fill="262626" w:themeFill="text1" w:themeFillTint="D9"/>
+            <w:vAlign w:val="center"/>
+          </w:tcPr>
+          <w:p>
+            <w:pPr>
+              <w:jc w:val="center"/>
+              <w:rPr>
+                <w:rFonts w:ascii="Arial" w:hAnsi="Arial" w:cs="Arial"/>
+                <w:b/>
+                <w:bCs/>
+                <w:sz w:val="24"/>
+                <w:szCs w:val="24"/>
+              </w:rPr>
+            </w:pPr>
+            <w:r>
+              <w:rPr>
+                <w:rFonts w:ascii="Arial" w:hAnsi="Arial" w:cs="Arial"/>
+                <w:b/>
+                <w:bCs/>
+                <w:sz w:val="24"/>
+                <w:szCs w:val="24"/>
+              </w:rPr>
+              <w:t>Asistencia (Sí/No)</w:t>
+            </w:r>
+          </w:p>
+        </w:tc>
+        <w:tc>
+          <w:tcPr>
+            <w:tcW w:w="3061" w:type="dxa"/>
+            <w:shd w:val="clear" w:color="auto" w:fill="262626" w:themeFill="text1" w:themeFillTint="D9"/>
+            <w:vAlign w:val="center"/>
+          </w:tcPr>
+          <w:p>
+            <w:pPr>
+              <w:jc w:val="center"/>
+              <w:rPr>
+                <w:rFonts w:ascii="Arial" w:hAnsi="Arial" w:cs="Arial"/>
+                <w:b/>
+                <w:bCs/>
+                <w:sz w:val="24"/>
+                <w:szCs w:val="24"/>
+              </w:rPr>
+            </w:pPr>
+            <w:r>
+              <w:rPr>
+                <w:rFonts w:ascii="Arial" w:hAnsi="Arial" w:cs="Arial"/>
+                <w:b/>
+                <w:bCs/>
+                <w:sz w:val="24"/>
+                <w:szCs w:val="24"/>
+              </w:rPr>
+              <w:t>Actividades</w:t>
+            </w:r>
+          </w:p>
+        </w:tc>
+        <w:tc>
+          <w:tcPr>
+            <w:tcW w:w="2328" w:type="dxa"/>
+            <w:shd w:val="clear" w:color="auto" w:fill="262626" w:themeFill="text1" w:themeFillTint="D9"/>
+            <w:vAlign w:val="center"/>
+          </w:tcPr>
+          <w:p>
+            <w:pPr>
+              <w:jc w:val="center"/>
+              <w:rPr>
+                <w:rFonts w:ascii="Arial" w:hAnsi="Arial" w:cs="Arial"/>
+                <w:b/>
+                <w:bCs/>
+                <w:sz w:val="24"/>
+                <w:szCs w:val="24"/>
+              </w:rPr>
+            </w:pPr>
+            <w:r>
+              <w:rPr>
+                <w:rFonts w:ascii="Arial" w:hAnsi="Arial" w:cs="Arial"/>
+                <w:b/>
+                <w:bCs/>
+                <w:sz w:val="24"/>
+                <w:szCs w:val="24"/>
+              </w:rPr>
+              <w:t>Entregables Esperados</w:t>
+            </w:r>
+          </w:p>
+        </w:tc>
+      </w:tr>
+      <w:tr>
+        <w:trPr>
+          <w:jc w:val="center"/>
+        </w:trPr>
+        <w:tc>
+          <w:tcPr>
+            <w:tcW w:w="1538" w:type="dxa"/>
+            <w:vAlign w:val="center"/>
+          </w:tcPr>
+          <w:p>
+            <w:pPr>
+              <w:rPr>
+                <w:rFonts w:ascii="Arial" w:hAnsi="Arial" w:cs="Arial"/>
+                <w:sz w:val="24"/>
+                <w:szCs w:val="24"/>
+              </w:rPr>
+            </w:pPr>
+            <w:r>
+              <w:rPr>
+                <w:rFonts w:ascii="Arial" w:hAnsi="Arial" w:cs="Arial"/>
+                <w:sz w:val="24"/>
+                <w:szCs w:val="24"/>
+              </w:rPr>
+              <w:t>María Fernanda Barrón Álvarez</w:t>
+            </w:r>
+          </w:p>
+        </w:tc>
+        <w:tc>
+          <w:tcPr>
+            <w:tcW w:w="1791" w:type="dxa"/>
+            <w:vAlign w:val="center"/>
+          </w:tcPr>
+          <w:p>
+            <w:pPr>
+              <w:rPr>
+                <w:rFonts w:ascii="Arial" w:hAnsi="Arial" w:cs="Arial"/>
+                <w:sz w:val="24"/>
+                <w:szCs w:val="24"/>
+              </w:rPr>
+            </w:pPr>
+            <w:r>
+              <w:rPr>
+                <w:rFonts w:ascii="Arial" w:hAnsi="Arial" w:cs="Arial"/>
+                <w:sz w:val="24"/>
+                <w:szCs w:val="24"/>
+              </w:rPr>
+              <w:t>Project Manager</w:t>
+            </w:r>
+          </w:p>
+        </w:tc>
+        <w:tc>
+          <w:tcPr>
+            <w:tcW w:w="1563" w:type="dxa"/>
+            <w:vAlign w:val="center"/>
+          </w:tcPr>
+          <w:p>
+            <w:pPr>
+              <w:rPr>
+                <w:rFonts w:ascii="Arial" w:hAnsi="Arial" w:cs="Arial"/>
+                <w:sz w:val="24"/>
+                <w:szCs w:val="24"/>
+              </w:rPr>
+            </w:pPr>
+            <w:r>
+              <w:rPr>
+                <w:rFonts w:ascii="Arial" w:hAnsi="Arial" w:cs="Arial"/>
+                <w:sz w:val="24"/>
+                <w:szCs w:val="24"/>
+              </w:rPr>
+              <w:t>Sí</w:t>
+            </w:r>
+          </w:p>
+        </w:tc>
+        <w:tc>
+          <w:tcPr>
+            <w:tcW w:w="3061" w:type="dxa"/>
+            <w:vAlign w:val="center"/>
+          </w:tcPr>
+          <w:p>
+            <w:pPr>
+              <w:pStyle w:val="Prrafodelista"/>
+              <w:numPr>
+                <w:ilvl w:val="0"/>
+                <w:numId w:val="27"/>
+              </w:numPr>
+              <w:ind w:left="246" w:hanging="218"/>
+              <w:rPr>
+                <w:rFonts w:ascii="Arial" w:hAnsi="Arial" w:cs="Arial"/>
+                <w:sz w:val="24"/>
+                <w:szCs w:val="24"/>
+              </w:rPr>
+            </w:pPr>
+            <w:r>
+              <w:rPr>
+                <w:rFonts w:ascii="Arial" w:hAnsi="Arial" w:cs="Arial"/>
+                <w:sz w:val="24"/>
+                <w:szCs w:val="24"/>
+              </w:rPr>
+              <w:t>Bitácora del día</w:t>
+            </w:r>
+          </w:p>
+          <w:p>
+            <w:pPr>
+              <w:pStyle w:val="Prrafodelista"/>
+              <w:numPr>
+                <w:ilvl w:val="0"/>
+                <w:numId w:val="27"/>
+              </w:numPr>
+              <w:ind w:left="246" w:hanging="218"/>
+              <w:rPr>
+                <w:rFonts w:ascii="Arial" w:hAnsi="Arial" w:cs="Arial"/>
+                <w:sz w:val="24"/>
+                <w:szCs w:val="24"/>
+              </w:rPr>
+            </w:pPr>
+            <w:r>
+              <w:rPr>
+                <w:rFonts w:ascii="Arial" w:hAnsi="Arial" w:cs="Arial"/>
+                <w:sz w:val="24"/>
+                <w:szCs w:val="24"/>
+              </w:rPr>
+              <w:t xml:space="preserve">Revisión de </w:t>
+            </w:r>
+            <w:r>
+              <w:rPr>
+                <w:rFonts w:ascii="Arial" w:hAnsi="Arial" w:cs="Arial"/>
+                <w:sz w:val="24"/>
+                <w:szCs w:val="24"/>
+              </w:rPr>
+              <w:t xml:space="preserve">corrección </w:t>
+            </w:r>
+            <w:r>
+              <w:rPr>
+                <w:rFonts w:ascii="Arial" w:hAnsi="Arial" w:cs="Arial"/>
+                <w:sz w:val="24"/>
+                <w:szCs w:val="24"/>
+              </w:rPr>
+              <w:t>del prototipo</w:t>
+            </w:r>
+          </w:p>
+          <w:p>
+            <w:pPr>
+              <w:pStyle w:val="Prrafodelista"/>
+              <w:numPr>
+                <w:ilvl w:val="0"/>
+                <w:numId w:val="27"/>
+              </w:numPr>
+              <w:ind w:left="246" w:hanging="218"/>
+              <w:rPr>
+                <w:rFonts w:ascii="Arial" w:hAnsi="Arial" w:cs="Arial"/>
+                <w:sz w:val="24"/>
+                <w:szCs w:val="24"/>
+              </w:rPr>
+            </w:pPr>
+            <w:r>
+              <w:rPr>
+                <w:rFonts w:ascii="Arial" w:hAnsi="Arial" w:cs="Arial"/>
+                <w:sz w:val="24"/>
+                <w:szCs w:val="24"/>
+              </w:rPr>
+              <w:t>Formato del documento</w:t>
+            </w:r>
+          </w:p>
+        </w:tc>
+        <w:tc>
+          <w:tcPr>
+            <w:tcW w:w="2328" w:type="dxa"/>
+            <w:vAlign w:val="center"/>
+          </w:tcPr>
+          <w:p>
+            <w:pPr>
+              <w:pStyle w:val="Prrafodelista"/>
+              <w:numPr>
+                <w:ilvl w:val="0"/>
+                <w:numId w:val="27"/>
+              </w:numPr>
+              <w:ind w:left="219" w:hanging="219"/>
+              <w:rPr>
+                <w:rFonts w:ascii="Arial" w:hAnsi="Arial" w:cs="Arial"/>
+                <w:sz w:val="24"/>
+                <w:szCs w:val="24"/>
+              </w:rPr>
+            </w:pPr>
+            <w:r>
+              <w:rPr>
+                <w:rFonts w:ascii="Arial" w:hAnsi="Arial" w:cs="Arial"/>
+                <w:sz w:val="24"/>
+                <w:szCs w:val="24"/>
+              </w:rPr>
+              <w:t>Bitácora</w:t>
+            </w:r>
+          </w:p>
+          <w:p>
+            <w:pPr>
+              <w:pStyle w:val="Prrafodelista"/>
+              <w:numPr>
+                <w:ilvl w:val="0"/>
+                <w:numId w:val="27"/>
+              </w:numPr>
+              <w:ind w:left="219" w:hanging="219"/>
+              <w:rPr>
+                <w:rFonts w:ascii="Arial" w:hAnsi="Arial" w:cs="Arial"/>
+                <w:sz w:val="24"/>
+                <w:szCs w:val="24"/>
+              </w:rPr>
+            </w:pPr>
+            <w:r>
+              <w:rPr>
+                <w:rFonts w:ascii="Arial" w:hAnsi="Arial" w:cs="Arial"/>
+                <w:sz w:val="24"/>
+                <w:szCs w:val="24"/>
+              </w:rPr>
+              <w:t>Documentación final</w:t>
+            </w:r>
+          </w:p>
+        </w:tc>
+      </w:tr>
+      <w:tr>
+        <w:trPr>
+          <w:jc w:val="center"/>
+        </w:trPr>
+        <w:tc>
+          <w:tcPr>
+            <w:tcW w:w="1538" w:type="dxa"/>
+            <w:vAlign w:val="center"/>
+          </w:tcPr>
+          <w:p>
+            <w:pPr>
+              <w:rPr>
+                <w:rFonts w:ascii="Arial" w:hAnsi="Arial" w:cs="Arial"/>
+                <w:sz w:val="24"/>
+                <w:szCs w:val="24"/>
+              </w:rPr>
+            </w:pPr>
+            <w:r>
+              <w:rPr>
+                <w:rFonts w:ascii="Arial" w:hAnsi="Arial" w:cs="Arial"/>
+                <w:sz w:val="24"/>
+                <w:szCs w:val="24"/>
+              </w:rPr>
+              <w:t xml:space="preserve">Leslie Miroslava Benítez </w:t>
+            </w:r>
+          </w:p>
+          <w:p>
+            <w:pPr>
+              <w:rPr>
+                <w:rFonts w:ascii="Arial" w:hAnsi="Arial" w:cs="Arial"/>
+                <w:sz w:val="24"/>
+                <w:szCs w:val="24"/>
+              </w:rPr>
+            </w:pPr>
+            <w:r>
+              <w:rPr>
+                <w:rFonts w:ascii="Arial" w:hAnsi="Arial" w:cs="Arial"/>
+                <w:sz w:val="24"/>
+                <w:szCs w:val="24"/>
+              </w:rPr>
+              <w:t>Marín</w:t>
+            </w:r>
+          </w:p>
+        </w:tc>
+        <w:tc>
+          <w:tcPr>
+            <w:tcW w:w="1791" w:type="dxa"/>
+            <w:vAlign w:val="center"/>
+          </w:tcPr>
+          <w:p>
+            <w:pPr>
+              <w:rPr>
+                <w:rFonts w:ascii="Arial" w:hAnsi="Arial" w:cs="Arial"/>
+                <w:sz w:val="24"/>
+                <w:szCs w:val="24"/>
+              </w:rPr>
+            </w:pPr>
+            <w:r>
+              <w:rPr>
+                <w:rFonts w:ascii="Arial" w:hAnsi="Arial" w:cs="Arial"/>
+                <w:sz w:val="24"/>
+                <w:szCs w:val="24"/>
+              </w:rPr>
+              <w:t xml:space="preserve">Desarrolladora </w:t>
+            </w:r>
+            <w:proofErr w:type="spellStart"/>
+            <w:r>
+              <w:rPr>
+                <w:rFonts w:ascii="Arial" w:hAnsi="Arial" w:cs="Arial"/>
+                <w:sz w:val="24"/>
+                <w:szCs w:val="24"/>
+              </w:rPr>
+              <w:t>frontend</w:t>
+            </w:r>
+            <w:proofErr w:type="spellEnd"/>
+          </w:p>
+        </w:tc>
+        <w:tc>
+          <w:tcPr>
+            <w:tcW w:w="1563" w:type="dxa"/>
+            <w:vAlign w:val="center"/>
+          </w:tcPr>
+          <w:p>
+            <w:pPr>
+              <w:rPr>
+                <w:rFonts w:ascii="Arial" w:hAnsi="Arial" w:cs="Arial"/>
+                <w:sz w:val="24"/>
+                <w:szCs w:val="24"/>
+              </w:rPr>
+            </w:pPr>
+            <w:r>
+              <w:rPr>
+                <w:rFonts w:ascii="Arial" w:hAnsi="Arial" w:cs="Arial"/>
+                <w:sz w:val="24"/>
+                <w:szCs w:val="24"/>
+              </w:rPr>
+              <w:t>Sí</w:t>
+            </w:r>
+            <w:r>
+              <w:rPr>
+                <w:rFonts w:ascii="Arial" w:hAnsi="Arial" w:cs="Arial"/>
+                <w:sz w:val="24"/>
+                <w:szCs w:val="24"/>
+              </w:rPr>
+              <w:t xml:space="preserve"> (virtual)</w:t>
+            </w:r>
+          </w:p>
+        </w:tc>
+        <w:tc>
+          <w:tcPr>
+            <w:tcW w:w="3061" w:type="dxa"/>
+            <w:vAlign w:val="center"/>
+          </w:tcPr>
+          <w:p>
+            <w:pPr>
+              <w:pStyle w:val="Prrafodelista"/>
+              <w:numPr>
+                <w:ilvl w:val="0"/>
+                <w:numId w:val="27"/>
+              </w:numPr>
+              <w:ind w:left="270" w:hanging="184"/>
+              <w:rPr>
+                <w:rFonts w:ascii="Arial" w:hAnsi="Arial" w:cs="Arial"/>
+                <w:sz w:val="24"/>
+                <w:szCs w:val="24"/>
+              </w:rPr>
+            </w:pPr>
+            <w:r>
+              <w:rPr>
+                <w:rFonts w:ascii="Arial" w:hAnsi="Arial" w:cs="Arial"/>
+                <w:sz w:val="24"/>
+                <w:szCs w:val="24"/>
+              </w:rPr>
+              <w:t>Corrección</w:t>
+            </w:r>
+            <w:r>
+              <w:rPr>
+                <w:rFonts w:ascii="Arial" w:hAnsi="Arial" w:cs="Arial"/>
+                <w:sz w:val="24"/>
+                <w:szCs w:val="24"/>
+              </w:rPr>
+              <w:t xml:space="preserve"> de prototipo </w:t>
+            </w:r>
+          </w:p>
+        </w:tc>
+        <w:tc>
+          <w:tcPr>
+            <w:tcW w:w="2328" w:type="dxa"/>
+            <w:vAlign w:val="center"/>
+          </w:tcPr>
+          <w:p>
+            <w:pPr>
+              <w:pStyle w:val="Prrafodelista"/>
+              <w:numPr>
+                <w:ilvl w:val="0"/>
+                <w:numId w:val="27"/>
+              </w:numPr>
+              <w:ind w:left="219" w:hanging="218"/>
+              <w:rPr>
+                <w:rFonts w:ascii="Arial" w:hAnsi="Arial" w:cs="Arial"/>
+                <w:sz w:val="24"/>
+                <w:szCs w:val="24"/>
+              </w:rPr>
+            </w:pPr>
+            <w:r>
+              <w:rPr>
+                <w:rFonts w:ascii="Arial" w:hAnsi="Arial" w:cs="Arial"/>
+                <w:sz w:val="24"/>
+                <w:szCs w:val="24"/>
+              </w:rPr>
+              <w:t>Prototipo funcional navegable con estructura completa del sitio</w:t>
+            </w:r>
+          </w:p>
+        </w:tc>
+      </w:tr>
+      <w:tr>
+        <w:trPr>
+          <w:jc w:val="center"/>
+        </w:trPr>
+        <w:tc>
+          <w:tcPr>
+            <w:tcW w:w="1538" w:type="dxa"/>
+            <w:vAlign w:val="center"/>
+          </w:tcPr>
+          <w:p>
+            <w:pPr>
+              <w:rPr>
+                <w:rFonts w:ascii="Arial" w:hAnsi="Arial" w:cs="Arial"/>
+                <w:sz w:val="24"/>
+                <w:szCs w:val="24"/>
+              </w:rPr>
+            </w:pPr>
+            <w:r>
+              <w:rPr>
+                <w:rFonts w:ascii="Arial" w:hAnsi="Arial" w:cs="Arial"/>
+                <w:sz w:val="24"/>
+                <w:szCs w:val="24"/>
+              </w:rPr>
+              <w:t>Leonardo Merino Garfias</w:t>
+            </w:r>
+          </w:p>
+        </w:tc>
+        <w:tc>
+          <w:tcPr>
+            <w:tcW w:w="1791" w:type="dxa"/>
+            <w:vAlign w:val="center"/>
+          </w:tcPr>
+          <w:p>
+            <w:pPr>
+              <w:rPr>
+                <w:rFonts w:ascii="Arial" w:hAnsi="Arial" w:cs="Arial"/>
+                <w:sz w:val="24"/>
+                <w:szCs w:val="24"/>
+              </w:rPr>
+            </w:pPr>
+            <w:r>
+              <w:rPr>
+                <w:rFonts w:ascii="Arial" w:hAnsi="Arial" w:cs="Arial"/>
+                <w:sz w:val="24"/>
+                <w:szCs w:val="24"/>
+              </w:rPr>
+              <w:t xml:space="preserve">Desarrollador </w:t>
+            </w:r>
+            <w:proofErr w:type="spellStart"/>
+            <w:r>
+              <w:rPr>
+                <w:rFonts w:ascii="Arial" w:hAnsi="Arial" w:cs="Arial"/>
+                <w:sz w:val="24"/>
+                <w:szCs w:val="24"/>
+              </w:rPr>
+              <w:t>backend</w:t>
+            </w:r>
+            <w:proofErr w:type="spellEnd"/>
+          </w:p>
+        </w:tc>
+        <w:tc>
+          <w:tcPr>
+            <w:tcW w:w="1563" w:type="dxa"/>
+            <w:vAlign w:val="center"/>
+          </w:tcPr>
+          <w:p>
+            <w:pPr>
+              <w:rPr>
+                <w:rFonts w:ascii="Arial" w:hAnsi="Arial" w:cs="Arial"/>
+                <w:sz w:val="24"/>
+                <w:szCs w:val="24"/>
+              </w:rPr>
+            </w:pPr>
+            <w:r>
+              <w:rPr>
+                <w:rFonts w:ascii="Arial" w:hAnsi="Arial" w:cs="Arial"/>
+                <w:sz w:val="24"/>
+                <w:szCs w:val="24"/>
+              </w:rPr>
+              <w:t>Sí</w:t>
+            </w:r>
+            <w:r>
+              <w:rPr>
+                <w:rFonts w:ascii="Arial" w:hAnsi="Arial" w:cs="Arial"/>
+                <w:sz w:val="24"/>
+                <w:szCs w:val="24"/>
+              </w:rPr>
+              <w:t xml:space="preserve"> (virtual)</w:t>
+            </w:r>
+          </w:p>
+        </w:tc>
+        <w:tc>
+          <w:tcPr>
+            <w:tcW w:w="3061" w:type="dxa"/>
+            <w:vAlign w:val="center"/>
+          </w:tcPr>
+          <w:p>
+            <w:pPr>
+              <w:pStyle w:val="Prrafodelista"/>
+              <w:numPr>
+                <w:ilvl w:val="0"/>
+                <w:numId w:val="27"/>
+              </w:numPr>
+              <w:ind w:left="246" w:hanging="218"/>
+              <w:rPr>
+                <w:rFonts w:ascii="Arial" w:hAnsi="Arial" w:cs="Arial"/>
+                <w:sz w:val="24"/>
+                <w:szCs w:val="24"/>
+              </w:rPr>
+            </w:pPr>
+            <w:r>
+              <w:rPr>
+                <w:rFonts w:ascii="Arial" w:hAnsi="Arial" w:cs="Arial"/>
+                <w:sz w:val="24"/>
+                <w:szCs w:val="24"/>
+              </w:rPr>
+              <w:t>Continuar estimación de puntos de función</w:t>
+            </w:r>
+            <w:r>
+              <w:rPr>
+                <w:rFonts w:ascii="Arial" w:hAnsi="Arial" w:cs="Arial"/>
+                <w:sz w:val="24"/>
+                <w:szCs w:val="24"/>
+              </w:rPr>
+              <w:t xml:space="preserve"> y estimación de costos</w:t>
+            </w:r>
+          </w:p>
+        </w:tc>
+        <w:tc>
+          <w:tcPr>
+            <w:tcW w:w="2328" w:type="dxa"/>
+            <w:vAlign w:val="center"/>
+          </w:tcPr>
+          <w:p>
+            <w:pPr>
+              <w:pStyle w:val="Prrafodelista"/>
+              <w:numPr>
+                <w:ilvl w:val="0"/>
+                <w:numId w:val="27"/>
+              </w:numPr>
+              <w:ind w:left="349" w:hanging="248"/>
+              <w:rPr>
+                <w:rFonts w:ascii="Arial" w:hAnsi="Arial" w:cs="Arial"/>
+                <w:sz w:val="24"/>
+                <w:szCs w:val="24"/>
+              </w:rPr>
+            </w:pPr>
+            <w:r>
+              <w:rPr>
+                <w:rFonts w:ascii="Arial" w:hAnsi="Arial" w:cs="Arial"/>
+                <w:sz w:val="24"/>
+                <w:szCs w:val="24"/>
+              </w:rPr>
+              <w:t>Parte de documentación con punto 7</w:t>
+            </w:r>
+            <w:r>
+              <w:rPr>
+                <w:rFonts w:ascii="Arial" w:hAnsi="Arial" w:cs="Arial"/>
+                <w:sz w:val="24"/>
+                <w:szCs w:val="24"/>
+              </w:rPr>
+              <w:t>.</w:t>
+            </w:r>
+          </w:p>
+        </w:tc>
+      </w:tr>
+    </w:tbl>
+    <w:p>
+      <w:pPr>
+        <w:rPr>
+          <w:rFonts w:ascii="Arial" w:hAnsi="Arial" w:cs="Arial"/>
+          <w:sz w:val="24"/>
+          <w:szCs w:val="24"/>
+        </w:rPr>
+      </w:pPr>
+    </w:p>
+    <w:p>
+      <w:pPr>
+        <w:pStyle w:val="titulo1"/>
+        <w:outlineLvl w:val="2"/>
+        <w:rPr>
+          <w:sz w:val="32"/>
+          <w:szCs w:val="72"/>
+        </w:rPr>
+      </w:pPr>
+      <w:bookmarkStart w:id="57" w:name="_Toc230158471"/>
+      <w:r>
+        <w:rPr>
+          <w:sz w:val="32"/>
+          <w:szCs w:val="72"/>
+        </w:rPr>
+        <w:t>A</w:t>
+      </w:r>
+      <w:r>
+        <w:rPr>
+          <w:sz w:val="32"/>
+          <w:szCs w:val="72"/>
+        </w:rPr>
+        <w:t>ctividades Ejecutadas</w:t>
+      </w:r>
+      <w:bookmarkEnd w:id="57"/>
+    </w:p>
+    <w:tbl>
+      <w:tblPr>
+        <w:tblStyle w:val="Tablaconcuadrcula"/>
+        <w:tblW w:w="10124" w:type="dxa"/>
+        <w:jc w:val="center"/>
+        <w:tblBorders>
+          <w:top w:val="single" w:sz="4" w:space="0" w:color="7F7F7F" w:themeColor="text1" w:themeTint="80"/>
+          <w:left w:val="single" w:sz="4" w:space="0" w:color="7F7F7F" w:themeColor="text1" w:themeTint="80"/>
+          <w:bottom w:val="single" w:sz="4" w:space="0" w:color="7F7F7F" w:themeColor="text1" w:themeTint="80"/>
+          <w:right w:val="single" w:sz="4" w:space="0" w:color="7F7F7F" w:themeColor="text1" w:themeTint="80"/>
+          <w:insideH w:val="single" w:sz="4" w:space="0" w:color="7F7F7F" w:themeColor="text1" w:themeTint="80"/>
+          <w:insideV w:val="single" w:sz="4" w:space="0" w:color="7F7F7F" w:themeColor="text1" w:themeTint="80"/>
+        </w:tblBorders>
+        <w:tblCellMar>
+          <w:top w:w="57" w:type="dxa"/>
+          <w:bottom w:w="57" w:type="dxa"/>
+        </w:tblCellMar>
+        <w:tblLook w:val="04A0" w:firstRow="1" w:lastRow="0" w:firstColumn="1" w:lastColumn="0" w:noHBand="0" w:noVBand="1"/>
+      </w:tblPr>
+      <w:tblGrid>
+        <w:gridCol w:w="2955"/>
+        <w:gridCol w:w="2004"/>
+        <w:gridCol w:w="1150"/>
+        <w:gridCol w:w="1535"/>
+        <w:gridCol w:w="2480"/>
+      </w:tblGrid>
+      <w:tr>
+        <w:trPr>
+          <w:jc w:val="center"/>
+        </w:trPr>
+        <w:tc>
+          <w:tcPr>
+            <w:tcW w:w="2955" w:type="dxa"/>
+            <w:shd w:val="clear" w:color="auto" w:fill="262626" w:themeFill="text1" w:themeFillTint="D9"/>
+            <w:vAlign w:val="center"/>
+          </w:tcPr>
+          <w:p>
+            <w:pPr>
+              <w:jc w:val="center"/>
+              <w:rPr>
+                <w:rFonts w:ascii="Arial" w:hAnsi="Arial" w:cs="Arial"/>
+                <w:b/>
+                <w:bCs/>
+                <w:sz w:val="24"/>
+                <w:szCs w:val="24"/>
+              </w:rPr>
+            </w:pPr>
+            <w:r>
+              <w:rPr>
+                <w:rFonts w:ascii="Arial" w:hAnsi="Arial" w:cs="Arial"/>
+                <w:b/>
+                <w:bCs/>
+                <w:sz w:val="24"/>
+                <w:szCs w:val="24"/>
+              </w:rPr>
+              <w:t>Actividad</w:t>
+            </w:r>
+          </w:p>
+        </w:tc>
+        <w:tc>
+          <w:tcPr>
+            <w:tcW w:w="2004" w:type="dxa"/>
+            <w:shd w:val="clear" w:color="auto" w:fill="262626" w:themeFill="text1" w:themeFillTint="D9"/>
+            <w:vAlign w:val="center"/>
+          </w:tcPr>
+          <w:p>
+            <w:pPr>
+              <w:jc w:val="center"/>
+              <w:rPr>
+                <w:rFonts w:ascii="Arial" w:hAnsi="Arial" w:cs="Arial"/>
+                <w:b/>
+                <w:bCs/>
+                <w:sz w:val="24"/>
+                <w:szCs w:val="24"/>
+              </w:rPr>
+            </w:pPr>
+            <w:r>
+              <w:rPr>
+                <w:rFonts w:ascii="Arial" w:hAnsi="Arial" w:cs="Arial"/>
+                <w:b/>
+                <w:bCs/>
+                <w:sz w:val="24"/>
+                <w:szCs w:val="24"/>
+              </w:rPr>
+              <w:t>Responsable(s)</w:t>
+            </w:r>
+          </w:p>
+        </w:tc>
+        <w:tc>
+          <w:tcPr>
+            <w:tcW w:w="1150" w:type="dxa"/>
+            <w:shd w:val="clear" w:color="auto" w:fill="262626" w:themeFill="text1" w:themeFillTint="D9"/>
+            <w:vAlign w:val="center"/>
+          </w:tcPr>
+          <w:p>
+            <w:pPr>
+              <w:jc w:val="center"/>
+              <w:rPr>
+                <w:rFonts w:ascii="Arial" w:hAnsi="Arial" w:cs="Arial"/>
+                <w:b/>
+                <w:bCs/>
+                <w:sz w:val="24"/>
+                <w:szCs w:val="24"/>
+              </w:rPr>
+            </w:pPr>
+            <w:proofErr w:type="spellStart"/>
+            <w:r>
+              <w:rPr>
+                <w:rFonts w:ascii="Arial" w:hAnsi="Arial" w:cs="Arial"/>
+                <w:b/>
+                <w:bCs/>
+                <w:sz w:val="24"/>
+                <w:szCs w:val="24"/>
+              </w:rPr>
+              <w:t>Hr</w:t>
+            </w:r>
+            <w:proofErr w:type="spellEnd"/>
+            <w:r>
+              <w:rPr>
+                <w:rFonts w:ascii="Arial" w:hAnsi="Arial" w:cs="Arial"/>
+                <w:b/>
+                <w:bCs/>
+                <w:sz w:val="24"/>
+                <w:szCs w:val="24"/>
+              </w:rPr>
+              <w:t xml:space="preserve">. </w:t>
+            </w:r>
+            <w:proofErr w:type="spellStart"/>
+            <w:r>
+              <w:rPr>
+                <w:rFonts w:ascii="Arial" w:hAnsi="Arial" w:cs="Arial"/>
+                <w:b/>
+                <w:bCs/>
+                <w:sz w:val="24"/>
+                <w:szCs w:val="24"/>
+              </w:rPr>
+              <w:t>Ini</w:t>
+            </w:r>
+            <w:proofErr w:type="spellEnd"/>
+          </w:p>
+        </w:tc>
+        <w:tc>
+          <w:tcPr>
+            <w:tcW w:w="1535" w:type="dxa"/>
+            <w:shd w:val="clear" w:color="auto" w:fill="262626" w:themeFill="text1" w:themeFillTint="D9"/>
+            <w:vAlign w:val="center"/>
+          </w:tcPr>
+          <w:p>
+            <w:pPr>
+              <w:jc w:val="center"/>
+              <w:rPr>
+                <w:rFonts w:ascii="Arial" w:hAnsi="Arial" w:cs="Arial"/>
+                <w:b/>
+                <w:bCs/>
+                <w:sz w:val="24"/>
+                <w:szCs w:val="24"/>
+              </w:rPr>
+            </w:pPr>
+            <w:proofErr w:type="spellStart"/>
+            <w:r>
+              <w:rPr>
+                <w:rFonts w:ascii="Arial" w:hAnsi="Arial" w:cs="Arial"/>
+                <w:b/>
+                <w:bCs/>
+                <w:sz w:val="24"/>
+                <w:szCs w:val="24"/>
+              </w:rPr>
+              <w:t>Hr</w:t>
+            </w:r>
+            <w:proofErr w:type="spellEnd"/>
+            <w:r>
+              <w:rPr>
+                <w:rFonts w:ascii="Arial" w:hAnsi="Arial" w:cs="Arial"/>
+                <w:b/>
+                <w:bCs/>
+                <w:sz w:val="24"/>
+                <w:szCs w:val="24"/>
+              </w:rPr>
+              <w:t>. fin</w:t>
+            </w:r>
+          </w:p>
+        </w:tc>
+        <w:tc>
+          <w:tcPr>
+            <w:tcW w:w="2480" w:type="dxa"/>
+            <w:shd w:val="clear" w:color="auto" w:fill="262626" w:themeFill="text1" w:themeFillTint="D9"/>
+            <w:vAlign w:val="center"/>
+          </w:tcPr>
+          <w:p>
+            <w:pPr>
+              <w:jc w:val="center"/>
+              <w:rPr>
+                <w:rFonts w:ascii="Arial" w:hAnsi="Arial" w:cs="Arial"/>
+                <w:b/>
+                <w:bCs/>
+                <w:sz w:val="24"/>
+                <w:szCs w:val="24"/>
+              </w:rPr>
+            </w:pPr>
+            <w:r>
+              <w:rPr>
+                <w:rFonts w:ascii="Arial" w:hAnsi="Arial" w:cs="Arial"/>
+                <w:b/>
+                <w:bCs/>
+                <w:sz w:val="24"/>
+                <w:szCs w:val="24"/>
+              </w:rPr>
+              <w:t>Estado (Completado / En proceso / Pendiente)</w:t>
+            </w:r>
+          </w:p>
+        </w:tc>
+      </w:tr>
+      <w:tr>
+        <w:trPr>
+          <w:jc w:val="center"/>
+        </w:trPr>
+        <w:tc>
+          <w:tcPr>
+            <w:tcW w:w="2955" w:type="dxa"/>
+            <w:vAlign w:val="center"/>
+          </w:tcPr>
+          <w:p>
+            <w:pPr>
+              <w:rPr>
+                <w:rFonts w:ascii="Arial" w:hAnsi="Arial" w:cs="Arial"/>
+                <w:sz w:val="24"/>
+                <w:szCs w:val="24"/>
+              </w:rPr>
+            </w:pPr>
+            <w:r>
+              <w:rPr>
+                <w:rFonts w:ascii="Arial" w:hAnsi="Arial" w:cs="Arial"/>
+                <w:sz w:val="24"/>
+                <w:szCs w:val="24"/>
+              </w:rPr>
+              <w:t>Bitácora</w:t>
+            </w:r>
+          </w:p>
+        </w:tc>
+        <w:tc>
+          <w:tcPr>
+            <w:tcW w:w="2004" w:type="dxa"/>
+            <w:vAlign w:val="center"/>
+          </w:tcPr>
+          <w:p>
+            <w:pPr>
+              <w:rPr>
+                <w:rFonts w:ascii="Arial" w:hAnsi="Arial" w:cs="Arial"/>
+                <w:sz w:val="24"/>
+                <w:szCs w:val="24"/>
+              </w:rPr>
+            </w:pPr>
+            <w:r>
+              <w:rPr>
+                <w:rFonts w:ascii="Arial" w:hAnsi="Arial" w:cs="Arial"/>
+                <w:sz w:val="24"/>
+                <w:szCs w:val="24"/>
+              </w:rPr>
+              <w:t>María Fernanda Barrón Álvarez</w:t>
+            </w:r>
+          </w:p>
+        </w:tc>
+        <w:tc>
+          <w:tcPr>
+            <w:tcW w:w="1150" w:type="dxa"/>
+            <w:vAlign w:val="center"/>
+          </w:tcPr>
+          <w:p>
+            <w:pPr>
+              <w:rPr>
+                <w:rFonts w:ascii="Arial" w:hAnsi="Arial" w:cs="Arial"/>
+                <w:sz w:val="24"/>
+                <w:szCs w:val="24"/>
+              </w:rPr>
+            </w:pPr>
+            <w:r>
+              <w:rPr>
+                <w:rFonts w:ascii="Arial" w:hAnsi="Arial" w:cs="Arial"/>
+                <w:sz w:val="24"/>
+                <w:szCs w:val="24"/>
+              </w:rPr>
+              <w:t>8</w:t>
+            </w:r>
+            <w:r>
+              <w:rPr>
+                <w:rFonts w:ascii="Arial" w:hAnsi="Arial" w:cs="Arial"/>
+                <w:sz w:val="24"/>
+                <w:szCs w:val="24"/>
+              </w:rPr>
+              <w:t>:</w:t>
+            </w:r>
+            <w:r>
+              <w:rPr>
+                <w:rFonts w:ascii="Arial" w:hAnsi="Arial" w:cs="Arial"/>
+                <w:sz w:val="24"/>
+                <w:szCs w:val="24"/>
+              </w:rPr>
+              <w:t>1</w:t>
+            </w:r>
+            <w:r>
+              <w:rPr>
+                <w:rFonts w:ascii="Arial" w:hAnsi="Arial" w:cs="Arial"/>
+                <w:sz w:val="24"/>
+                <w:szCs w:val="24"/>
+              </w:rPr>
+              <w:t>5</w:t>
+            </w:r>
+            <w:r>
+              <w:rPr>
+                <w:rFonts w:ascii="Arial" w:hAnsi="Arial" w:cs="Arial"/>
+                <w:sz w:val="24"/>
+                <w:szCs w:val="24"/>
+              </w:rPr>
+              <w:t xml:space="preserve"> a</w:t>
+            </w:r>
+            <w:r>
+              <w:rPr>
+                <w:rFonts w:ascii="Arial" w:hAnsi="Arial" w:cs="Arial"/>
+                <w:sz w:val="24"/>
+                <w:szCs w:val="24"/>
+              </w:rPr>
+              <w:t>m</w:t>
+            </w:r>
+          </w:p>
+        </w:tc>
+        <w:tc>
+          <w:tcPr>
+            <w:tcW w:w="1535" w:type="dxa"/>
+            <w:vAlign w:val="center"/>
+          </w:tcPr>
+          <w:p>
+            <w:pPr>
+              <w:rPr>
+                <w:rFonts w:ascii="Arial" w:hAnsi="Arial" w:cs="Arial"/>
+                <w:sz w:val="24"/>
+                <w:szCs w:val="24"/>
+              </w:rPr>
+            </w:pPr>
+            <w:r>
+              <w:rPr>
+                <w:rFonts w:ascii="Arial" w:hAnsi="Arial" w:cs="Arial"/>
+                <w:sz w:val="24"/>
+                <w:szCs w:val="24"/>
+              </w:rPr>
+              <w:t>9:00</w:t>
+            </w:r>
+            <w:r>
+              <w:rPr>
+                <w:rFonts w:ascii="Arial" w:hAnsi="Arial" w:cs="Arial"/>
+                <w:sz w:val="24"/>
+                <w:szCs w:val="24"/>
+              </w:rPr>
+              <w:t xml:space="preserve"> a</w:t>
+            </w:r>
+            <w:r>
+              <w:rPr>
+                <w:rFonts w:ascii="Arial" w:hAnsi="Arial" w:cs="Arial"/>
+                <w:sz w:val="24"/>
+                <w:szCs w:val="24"/>
+              </w:rPr>
+              <w:t>m</w:t>
+            </w:r>
+          </w:p>
+        </w:tc>
+        <w:tc>
+          <w:tcPr>
+            <w:tcW w:w="2480" w:type="dxa"/>
+            <w:vAlign w:val="center"/>
+          </w:tcPr>
+          <w:p>
+            <w:pPr>
+              <w:rPr>
+                <w:rFonts w:ascii="Arial" w:hAnsi="Arial" w:cs="Arial"/>
+                <w:sz w:val="24"/>
+                <w:szCs w:val="24"/>
+              </w:rPr>
+            </w:pPr>
+            <w:r>
+              <w:rPr>
+                <w:rFonts w:ascii="Arial" w:hAnsi="Arial" w:cs="Arial"/>
+                <w:sz w:val="24"/>
+                <w:szCs w:val="24"/>
+              </w:rPr>
+              <w:t>Completado</w:t>
+            </w:r>
+          </w:p>
+        </w:tc>
+      </w:tr>
+      <w:tr>
+        <w:trPr>
+          <w:jc w:val="center"/>
+        </w:trPr>
+        <w:tc>
+          <w:tcPr>
+            <w:tcW w:w="2955" w:type="dxa"/>
+            <w:vAlign w:val="center"/>
+          </w:tcPr>
+          <w:p>
+            <w:pPr>
+              <w:rPr>
+                <w:rFonts w:ascii="Arial" w:hAnsi="Arial" w:cs="Arial"/>
+                <w:sz w:val="24"/>
+                <w:szCs w:val="24"/>
+              </w:rPr>
+            </w:pPr>
+            <w:r>
+              <w:rPr>
+                <w:rFonts w:ascii="Arial" w:hAnsi="Arial" w:cs="Arial"/>
+                <w:sz w:val="24"/>
+                <w:szCs w:val="24"/>
+              </w:rPr>
+              <w:t xml:space="preserve">Revisión de avance de prototipo </w:t>
+            </w:r>
+          </w:p>
+        </w:tc>
+        <w:tc>
+          <w:tcPr>
+            <w:tcW w:w="2004" w:type="dxa"/>
+            <w:vAlign w:val="center"/>
+          </w:tcPr>
+          <w:p>
+            <w:pPr>
+              <w:rPr>
+                <w:rFonts w:ascii="Arial" w:hAnsi="Arial" w:cs="Arial"/>
+                <w:sz w:val="24"/>
+                <w:szCs w:val="24"/>
+              </w:rPr>
+            </w:pPr>
+            <w:r>
+              <w:rPr>
+                <w:rFonts w:ascii="Arial" w:hAnsi="Arial" w:cs="Arial"/>
+                <w:sz w:val="24"/>
+                <w:szCs w:val="24"/>
+              </w:rPr>
+              <w:t>María Fernanda Barrón Álvarez</w:t>
+            </w:r>
+          </w:p>
+        </w:tc>
+        <w:tc>
+          <w:tcPr>
+            <w:tcW w:w="1150" w:type="dxa"/>
+            <w:vAlign w:val="center"/>
+          </w:tcPr>
+          <w:p>
+            <w:pPr>
+              <w:rPr>
+                <w:rFonts w:ascii="Arial" w:hAnsi="Arial" w:cs="Arial"/>
+                <w:sz w:val="24"/>
+                <w:szCs w:val="24"/>
+              </w:rPr>
+            </w:pPr>
+            <w:r>
+              <w:rPr>
+                <w:rFonts w:ascii="Arial" w:hAnsi="Arial" w:cs="Arial"/>
+                <w:sz w:val="24"/>
+                <w:szCs w:val="24"/>
+              </w:rPr>
+              <w:t>8:15 am</w:t>
+            </w:r>
+          </w:p>
+        </w:tc>
+        <w:tc>
+          <w:tcPr>
+            <w:tcW w:w="1535" w:type="dxa"/>
+            <w:vAlign w:val="center"/>
+          </w:tcPr>
+          <w:p>
+            <w:pPr>
+              <w:rPr>
+                <w:rFonts w:ascii="Arial" w:hAnsi="Arial" w:cs="Arial"/>
+                <w:sz w:val="24"/>
+                <w:szCs w:val="24"/>
+              </w:rPr>
+            </w:pPr>
+            <w:r>
+              <w:rPr>
+                <w:rFonts w:ascii="Arial" w:hAnsi="Arial" w:cs="Arial"/>
+                <w:sz w:val="24"/>
+                <w:szCs w:val="24"/>
+              </w:rPr>
+              <w:t>8:35</w:t>
+            </w:r>
+            <w:r>
+              <w:rPr>
+                <w:rFonts w:ascii="Arial" w:hAnsi="Arial" w:cs="Arial"/>
+                <w:sz w:val="24"/>
+                <w:szCs w:val="24"/>
+              </w:rPr>
+              <w:t xml:space="preserve"> am</w:t>
+            </w:r>
+          </w:p>
+        </w:tc>
+        <w:tc>
+          <w:tcPr>
+            <w:tcW w:w="2480" w:type="dxa"/>
+            <w:vAlign w:val="center"/>
+          </w:tcPr>
+          <w:p>
+            <w:pPr>
+              <w:rPr>
+                <w:rFonts w:ascii="Arial" w:hAnsi="Arial" w:cs="Arial"/>
+                <w:sz w:val="24"/>
+                <w:szCs w:val="24"/>
+              </w:rPr>
+            </w:pPr>
+            <w:r>
+              <w:rPr>
+                <w:rFonts w:ascii="Arial" w:hAnsi="Arial" w:cs="Arial"/>
+                <w:sz w:val="24"/>
+                <w:szCs w:val="24"/>
+              </w:rPr>
+              <w:t>Completado</w:t>
+            </w:r>
+          </w:p>
+        </w:tc>
+      </w:tr>
+      <w:tr>
+        <w:trPr>
+          <w:jc w:val="center"/>
+        </w:trPr>
+        <w:tc>
+          <w:tcPr>
+            <w:tcW w:w="2955" w:type="dxa"/>
+            <w:vAlign w:val="center"/>
+          </w:tcPr>
+          <w:p>
+            <w:pPr>
+              <w:rPr>
+                <w:rFonts w:ascii="Arial" w:hAnsi="Arial" w:cs="Arial"/>
+                <w:sz w:val="24"/>
+                <w:szCs w:val="24"/>
+              </w:rPr>
+            </w:pPr>
+            <w:r>
+              <w:rPr>
+                <w:rFonts w:ascii="Arial" w:hAnsi="Arial" w:cs="Arial"/>
+                <w:sz w:val="24"/>
+                <w:szCs w:val="24"/>
+              </w:rPr>
+              <w:t>Puntos de Función</w:t>
+            </w:r>
+          </w:p>
+        </w:tc>
+        <w:tc>
+          <w:tcPr>
+            <w:tcW w:w="2004" w:type="dxa"/>
+            <w:vAlign w:val="center"/>
+          </w:tcPr>
+          <w:p>
+            <w:pPr>
+              <w:rPr>
+                <w:rFonts w:ascii="Arial" w:hAnsi="Arial" w:cs="Arial"/>
+                <w:sz w:val="24"/>
+                <w:szCs w:val="24"/>
+              </w:rPr>
+            </w:pPr>
+            <w:r>
+              <w:rPr>
+                <w:rFonts w:ascii="Arial" w:hAnsi="Arial" w:cs="Arial"/>
+                <w:sz w:val="24"/>
+                <w:szCs w:val="24"/>
+              </w:rPr>
+              <w:t>Leonardo Merino Garfias</w:t>
+            </w:r>
+          </w:p>
+        </w:tc>
+        <w:tc>
+          <w:tcPr>
+            <w:tcW w:w="1150" w:type="dxa"/>
+            <w:vAlign w:val="center"/>
+          </w:tcPr>
+          <w:p>
+            <w:pPr>
+              <w:rPr>
+                <w:rFonts w:ascii="Arial" w:hAnsi="Arial" w:cs="Arial"/>
+                <w:sz w:val="24"/>
+                <w:szCs w:val="24"/>
+              </w:rPr>
+            </w:pPr>
+            <w:r>
+              <w:rPr>
+                <w:rFonts w:ascii="Arial" w:hAnsi="Arial" w:cs="Arial"/>
+                <w:sz w:val="24"/>
+                <w:szCs w:val="24"/>
+              </w:rPr>
+              <w:t>8</w:t>
+            </w:r>
+            <w:r>
+              <w:rPr>
+                <w:rFonts w:ascii="Arial" w:hAnsi="Arial" w:cs="Arial"/>
+                <w:sz w:val="24"/>
+                <w:szCs w:val="24"/>
+              </w:rPr>
+              <w:t>:</w:t>
+            </w:r>
+            <w:r>
+              <w:rPr>
+                <w:rFonts w:ascii="Arial" w:hAnsi="Arial" w:cs="Arial"/>
+                <w:sz w:val="24"/>
+                <w:szCs w:val="24"/>
+              </w:rPr>
+              <w:t>15</w:t>
+            </w:r>
+            <w:r>
+              <w:rPr>
+                <w:rFonts w:ascii="Arial" w:hAnsi="Arial" w:cs="Arial"/>
+                <w:sz w:val="24"/>
+                <w:szCs w:val="24"/>
+              </w:rPr>
+              <w:t xml:space="preserve"> a</w:t>
+            </w:r>
+            <w:r>
+              <w:rPr>
+                <w:rFonts w:ascii="Arial" w:hAnsi="Arial" w:cs="Arial"/>
+                <w:sz w:val="24"/>
+                <w:szCs w:val="24"/>
+              </w:rPr>
+              <w:t>m</w:t>
+            </w:r>
+          </w:p>
+        </w:tc>
+        <w:tc>
+          <w:tcPr>
+            <w:tcW w:w="1535" w:type="dxa"/>
+            <w:vAlign w:val="center"/>
+          </w:tcPr>
+          <w:p>
+            <w:pPr>
+              <w:rPr>
+                <w:rFonts w:ascii="Arial" w:hAnsi="Arial" w:cs="Arial"/>
+                <w:sz w:val="24"/>
+                <w:szCs w:val="24"/>
+              </w:rPr>
+            </w:pPr>
+            <w:r>
+              <w:rPr>
+                <w:rFonts w:ascii="Arial" w:hAnsi="Arial" w:cs="Arial"/>
+                <w:sz w:val="24"/>
+                <w:szCs w:val="24"/>
+              </w:rPr>
+              <w:t>9</w:t>
+            </w:r>
+            <w:r>
+              <w:rPr>
+                <w:rFonts w:ascii="Arial" w:hAnsi="Arial" w:cs="Arial"/>
+                <w:sz w:val="24"/>
+                <w:szCs w:val="24"/>
+              </w:rPr>
+              <w:t>:00</w:t>
+            </w:r>
+            <w:r>
+              <w:rPr>
+                <w:rFonts w:ascii="Arial" w:hAnsi="Arial" w:cs="Arial"/>
+                <w:sz w:val="24"/>
+                <w:szCs w:val="24"/>
+              </w:rPr>
+              <w:t xml:space="preserve"> a</w:t>
+            </w:r>
+            <w:r>
+              <w:rPr>
+                <w:rFonts w:ascii="Arial" w:hAnsi="Arial" w:cs="Arial"/>
+                <w:sz w:val="24"/>
+                <w:szCs w:val="24"/>
+              </w:rPr>
+              <w:t>m</w:t>
+            </w:r>
+          </w:p>
+        </w:tc>
+        <w:tc>
+          <w:tcPr>
+            <w:tcW w:w="2480" w:type="dxa"/>
+            <w:vAlign w:val="center"/>
+          </w:tcPr>
+          <w:p>
+            <w:pPr>
+              <w:rPr>
+                <w:rFonts w:ascii="Arial" w:hAnsi="Arial" w:cs="Arial"/>
+                <w:sz w:val="24"/>
+                <w:szCs w:val="24"/>
+              </w:rPr>
+            </w:pPr>
+            <w:r>
+              <w:rPr>
+                <w:rFonts w:ascii="Arial" w:hAnsi="Arial" w:cs="Arial"/>
+                <w:sz w:val="24"/>
+                <w:szCs w:val="24"/>
+              </w:rPr>
+              <w:t>Completado</w:t>
+            </w:r>
+          </w:p>
+        </w:tc>
+      </w:tr>
+    </w:tbl>
+    <w:p/>
+    <w:p>
+      <w:pPr>
+        <w:pStyle w:val="titulo1"/>
+        <w:outlineLvl w:val="2"/>
+      </w:pPr>
+      <w:bookmarkStart w:id="58" w:name="_Toc230158472"/>
+      <w:r>
+        <w:rPr>
+          <w:sz w:val="32"/>
+          <w:szCs w:val="32"/>
+        </w:rPr>
+        <w:t>Gestión de Riesgos e Incidencias</w:t>
+      </w:r>
+      <w:bookmarkEnd w:id="58"/>
     </w:p>
     <w:tbl>
       <w:tblPr>
@@ -33066,12 +35768,12 @@
         <w:jc w:val="both"/>
         <w:outlineLvl w:val="0"/>
       </w:pPr>
-      <w:bookmarkStart w:id="51" w:name="_Toc229984893"/>
+      <w:bookmarkStart w:id="59" w:name="_Toc230158473"/>
       <w:r>
         <w:lastRenderedPageBreak/>
         <w:t>Referencias</w:t>
       </w:r>
-      <w:bookmarkEnd w:id="51"/>
+      <w:bookmarkEnd w:id="59"/>
     </w:p>
     <w:p>
       <w:pPr>
@@ -36331,7 +39033,7 @@
   <w:style w:type="paragraph" w:default="1" w:styleId="Normal">
     <w:name w:val="Normal"/>
     <w:qFormat/>
-    <w:rsid w:val="005452F8"/>
+    <w:rsid w:val="00AD256B"/>
   </w:style>
   <w:style w:type="paragraph" w:styleId="Ttulo1">
     <w:name w:val="heading 1"/>

</xml_diff>

<commit_message>
:memo: Bitácora 21 y 22 de mayo: Estimaciones, EDT, Cronograma y Roles de Equipo
</commit_message>
<xml_diff>
--- a/BITACORA.docx
+++ b/BITACORA.docx
@@ -33689,29 +33689,7 @@
                 <w:szCs w:val="28"/>
               </w:rPr>
               <w:lastRenderedPageBreak/>
-              <w:t xml:space="preserve">Día </w:t>
-            </w:r>
-            <w:r>
-              <w:rPr>
-                <w:rFonts w:ascii="Aptos" w:hAnsi="Aptos"/>
-                <w:b/>
-                <w:bCs/>
-                <w:color w:val="FFFFFF" w:themeColor="background1"/>
-                <w:sz w:val="28"/>
-                <w:szCs w:val="28"/>
-              </w:rPr>
-              <w:t>3</w:t>
-            </w:r>
-            <w:r>
-              <w:rPr>
-                <w:rFonts w:ascii="Aptos" w:hAnsi="Aptos"/>
-                <w:b/>
-                <w:bCs/>
-                <w:color w:val="FFFFFF" w:themeColor="background1"/>
-                <w:sz w:val="28"/>
-                <w:szCs w:val="28"/>
-              </w:rPr>
-              <w:t>: Realizar Puntos de Función</w:t>
+              <w:t>Día 3: Realizar Puntos de Función</w:t>
             </w:r>
             <w:r>
               <w:rPr>
@@ -35762,6 +35740,4398 @@
         <w:br w:type="page"/>
       </w:r>
     </w:p>
+    <w:tbl>
+      <w:tblPr>
+        <w:tblStyle w:val="Tablaconcuadrcula"/>
+        <w:tblW w:w="9634" w:type="dxa"/>
+        <w:jc w:val="center"/>
+        <w:tblBorders>
+          <w:top w:val="single" w:sz="4" w:space="0" w:color="7F7F7F" w:themeColor="text1" w:themeTint="80"/>
+          <w:left w:val="single" w:sz="4" w:space="0" w:color="7F7F7F" w:themeColor="text1" w:themeTint="80"/>
+          <w:bottom w:val="single" w:sz="4" w:space="0" w:color="7F7F7F" w:themeColor="text1" w:themeTint="80"/>
+          <w:right w:val="single" w:sz="4" w:space="0" w:color="7F7F7F" w:themeColor="text1" w:themeTint="80"/>
+          <w:insideH w:val="single" w:sz="4" w:space="0" w:color="7F7F7F" w:themeColor="text1" w:themeTint="80"/>
+        </w:tblBorders>
+        <w:tblCellMar>
+          <w:top w:w="57" w:type="dxa"/>
+          <w:bottom w:w="57" w:type="dxa"/>
+        </w:tblCellMar>
+        <w:tblLook w:val="04A0" w:firstRow="1" w:lastRow="0" w:firstColumn="1" w:lastColumn="0" w:noHBand="0" w:noVBand="1"/>
+      </w:tblPr>
+      <w:tblGrid>
+        <w:gridCol w:w="5098"/>
+        <w:gridCol w:w="4536"/>
+      </w:tblGrid>
+      <w:tr>
+        <w:trPr>
+          <w:trHeight w:val="583"/>
+          <w:jc w:val="center"/>
+        </w:trPr>
+        <w:tc>
+          <w:tcPr>
+            <w:tcW w:w="9634" w:type="dxa"/>
+            <w:gridSpan w:val="2"/>
+            <w:shd w:val="clear" w:color="auto" w:fill="262626" w:themeFill="text1" w:themeFillTint="D9"/>
+            <w:vAlign w:val="center"/>
+          </w:tcPr>
+          <w:p>
+            <w:pPr>
+              <w:pStyle w:val="Ttulo2"/>
+              <w:rPr>
+                <w:rFonts w:ascii="Aptos" w:hAnsi="Aptos"/>
+                <w:b/>
+                <w:bCs/>
+                <w:color w:val="FFFFFF" w:themeColor="background1"/>
+                <w:sz w:val="28"/>
+                <w:szCs w:val="28"/>
+              </w:rPr>
+            </w:pPr>
+            <w:r>
+              <w:rPr>
+                <w:rFonts w:ascii="Aptos" w:hAnsi="Aptos"/>
+                <w:b/>
+                <w:bCs/>
+                <w:color w:val="FFFFFF" w:themeColor="background1"/>
+                <w:sz w:val="28"/>
+                <w:szCs w:val="28"/>
+              </w:rPr>
+              <w:lastRenderedPageBreak/>
+              <w:t xml:space="preserve">Día 4: </w:t>
+            </w:r>
+            <w:r>
+              <w:rPr>
+                <w:rFonts w:ascii="Aptos" w:hAnsi="Aptos"/>
+                <w:b/>
+                <w:bCs/>
+                <w:color w:val="FFFFFF" w:themeColor="background1"/>
+                <w:sz w:val="28"/>
+                <w:szCs w:val="28"/>
+              </w:rPr>
+              <w:t>Agregar EDT a documentación</w:t>
+            </w:r>
+          </w:p>
+        </w:tc>
+      </w:tr>
+      <w:tr>
+        <w:trPr>
+          <w:jc w:val="center"/>
+        </w:trPr>
+        <w:tc>
+          <w:tcPr>
+            <w:tcW w:w="9634" w:type="dxa"/>
+            <w:gridSpan w:val="2"/>
+            <w:vAlign w:val="center"/>
+          </w:tcPr>
+          <w:p>
+            <w:pPr>
+              <w:rPr>
+                <w:rFonts w:ascii="Arial" w:hAnsi="Arial" w:cs="Arial"/>
+                <w:sz w:val="24"/>
+                <w:szCs w:val="24"/>
+              </w:rPr>
+            </w:pPr>
+            <w:r>
+              <w:rPr>
+                <w:rFonts w:ascii="Arial" w:hAnsi="Arial" w:cs="Arial"/>
+                <w:b/>
+                <w:bCs/>
+                <w:sz w:val="24"/>
+                <w:szCs w:val="24"/>
+              </w:rPr>
+              <w:t xml:space="preserve">Nombre del Proyecto: </w:t>
+            </w:r>
+            <w:r>
+              <w:rPr>
+                <w:rFonts w:ascii="Arial" w:hAnsi="Arial" w:cs="Arial"/>
+                <w:sz w:val="24"/>
+                <w:szCs w:val="24"/>
+              </w:rPr>
+              <w:t>Portafolio Digital de Arquitecto</w:t>
+            </w:r>
+          </w:p>
+        </w:tc>
+      </w:tr>
+      <w:tr>
+        <w:trPr>
+          <w:jc w:val="center"/>
+        </w:trPr>
+        <w:tc>
+          <w:tcPr>
+            <w:tcW w:w="5098" w:type="dxa"/>
+            <w:vAlign w:val="center"/>
+          </w:tcPr>
+          <w:p>
+            <w:pPr>
+              <w:rPr>
+                <w:rFonts w:ascii="Arial" w:hAnsi="Arial" w:cs="Arial"/>
+                <w:b/>
+                <w:bCs/>
+                <w:sz w:val="24"/>
+                <w:szCs w:val="24"/>
+              </w:rPr>
+            </w:pPr>
+            <w:r>
+              <w:rPr>
+                <w:rFonts w:ascii="Arial" w:hAnsi="Arial" w:cs="Arial"/>
+                <w:b/>
+                <w:bCs/>
+                <w:sz w:val="24"/>
+                <w:szCs w:val="24"/>
+              </w:rPr>
+              <w:t xml:space="preserve">Equipo No.: </w:t>
+            </w:r>
+            <w:r>
+              <w:rPr>
+                <w:rFonts w:ascii="Arial" w:hAnsi="Arial" w:cs="Arial"/>
+                <w:b/>
+                <w:bCs/>
+                <w:sz w:val="24"/>
+                <w:szCs w:val="24"/>
+              </w:rPr>
+              <w:tab/>
+            </w:r>
+            <w:r>
+              <w:rPr>
+                <w:rFonts w:ascii="Arial" w:hAnsi="Arial" w:cs="Arial"/>
+                <w:sz w:val="24"/>
+                <w:szCs w:val="24"/>
+              </w:rPr>
+              <w:t>6</w:t>
+            </w:r>
+          </w:p>
+        </w:tc>
+        <w:tc>
+          <w:tcPr>
+            <w:tcW w:w="4536" w:type="dxa"/>
+            <w:vAlign w:val="center"/>
+          </w:tcPr>
+          <w:p>
+            <w:pPr>
+              <w:rPr>
+                <w:rFonts w:ascii="Arial" w:hAnsi="Arial" w:cs="Arial"/>
+                <w:b/>
+                <w:bCs/>
+                <w:sz w:val="24"/>
+                <w:szCs w:val="24"/>
+              </w:rPr>
+            </w:pPr>
+            <w:r>
+              <w:rPr>
+                <w:rFonts w:ascii="Arial" w:hAnsi="Arial" w:cs="Arial"/>
+                <w:b/>
+                <w:bCs/>
+                <w:sz w:val="24"/>
+                <w:szCs w:val="24"/>
+              </w:rPr>
+              <w:t>Fecha:</w:t>
+            </w:r>
+            <w:r>
+              <w:rPr>
+                <w:rFonts w:ascii="Arial" w:hAnsi="Arial" w:cs="Arial"/>
+                <w:b/>
+                <w:bCs/>
+                <w:sz w:val="24"/>
+                <w:szCs w:val="24"/>
+              </w:rPr>
+              <w:t xml:space="preserve"> </w:t>
+            </w:r>
+            <w:r>
+              <w:rPr>
+                <w:rFonts w:ascii="Arial" w:hAnsi="Arial" w:cs="Arial"/>
+                <w:sz w:val="24"/>
+                <w:szCs w:val="24"/>
+              </w:rPr>
+              <w:t>2</w:t>
+            </w:r>
+            <w:r>
+              <w:rPr>
+                <w:rFonts w:ascii="Arial" w:hAnsi="Arial" w:cs="Arial"/>
+                <w:sz w:val="24"/>
+                <w:szCs w:val="24"/>
+              </w:rPr>
+              <w:t>1</w:t>
+            </w:r>
+            <w:r>
+              <w:rPr>
+                <w:rFonts w:ascii="Arial" w:hAnsi="Arial" w:cs="Arial"/>
+                <w:sz w:val="24"/>
+                <w:szCs w:val="24"/>
+              </w:rPr>
+              <w:t>/0</w:t>
+            </w:r>
+            <w:r>
+              <w:rPr>
+                <w:rFonts w:ascii="Arial" w:hAnsi="Arial" w:cs="Arial"/>
+                <w:sz w:val="24"/>
+                <w:szCs w:val="24"/>
+              </w:rPr>
+              <w:t>5</w:t>
+            </w:r>
+            <w:r>
+              <w:rPr>
+                <w:rFonts w:ascii="Arial" w:hAnsi="Arial" w:cs="Arial"/>
+                <w:sz w:val="24"/>
+                <w:szCs w:val="24"/>
+              </w:rPr>
+              <w:t>/202</w:t>
+            </w:r>
+            <w:r>
+              <w:rPr>
+                <w:rFonts w:ascii="Arial" w:hAnsi="Arial" w:cs="Arial"/>
+                <w:sz w:val="24"/>
+                <w:szCs w:val="24"/>
+              </w:rPr>
+              <w:t>6</w:t>
+            </w:r>
+          </w:p>
+        </w:tc>
+      </w:tr>
+      <w:tr>
+        <w:trPr>
+          <w:jc w:val="center"/>
+        </w:trPr>
+        <w:tc>
+          <w:tcPr>
+            <w:tcW w:w="5098" w:type="dxa"/>
+            <w:vAlign w:val="center"/>
+          </w:tcPr>
+          <w:p>
+            <w:pPr>
+              <w:rPr>
+                <w:rFonts w:ascii="Arial" w:hAnsi="Arial" w:cs="Arial"/>
+                <w:b/>
+                <w:bCs/>
+                <w:sz w:val="24"/>
+                <w:szCs w:val="24"/>
+              </w:rPr>
+            </w:pPr>
+            <w:r>
+              <w:rPr>
+                <w:rFonts w:ascii="Arial" w:hAnsi="Arial" w:cs="Arial"/>
+                <w:b/>
+                <w:bCs/>
+                <w:sz w:val="24"/>
+                <w:szCs w:val="24"/>
+              </w:rPr>
+              <w:t xml:space="preserve">Número de sesión / Día de trabajo: </w:t>
+            </w:r>
+            <w:r>
+              <w:rPr>
+                <w:rFonts w:ascii="Arial" w:hAnsi="Arial" w:cs="Arial"/>
+                <w:sz w:val="24"/>
+                <w:szCs w:val="24"/>
+              </w:rPr>
+              <w:t>1</w:t>
+            </w:r>
+          </w:p>
+        </w:tc>
+        <w:tc>
+          <w:tcPr>
+            <w:tcW w:w="4536" w:type="dxa"/>
+            <w:vAlign w:val="center"/>
+          </w:tcPr>
+          <w:p>
+            <w:pPr>
+              <w:rPr>
+                <w:rFonts w:ascii="Arial" w:hAnsi="Arial" w:cs="Arial"/>
+                <w:b/>
+                <w:bCs/>
+                <w:sz w:val="24"/>
+                <w:szCs w:val="24"/>
+              </w:rPr>
+            </w:pPr>
+            <w:r>
+              <w:rPr>
+                <w:rFonts w:ascii="Arial" w:hAnsi="Arial" w:cs="Arial"/>
+                <w:b/>
+                <w:bCs/>
+                <w:sz w:val="24"/>
+                <w:szCs w:val="24"/>
+              </w:rPr>
+              <w:t xml:space="preserve">Modalidad: </w:t>
+            </w:r>
+            <w:r>
+              <w:rPr>
+                <w:rFonts w:ascii="Arial" w:hAnsi="Arial" w:cs="Arial"/>
+                <w:sz w:val="24"/>
+                <w:szCs w:val="24"/>
+              </w:rPr>
+              <w:t>Presencial</w:t>
+            </w:r>
+            <w:r>
+              <w:rPr>
+                <w:rFonts w:ascii="Arial" w:hAnsi="Arial" w:cs="Arial"/>
+                <w:sz w:val="24"/>
+                <w:szCs w:val="24"/>
+              </w:rPr>
+              <w:t xml:space="preserve"> / </w:t>
+            </w:r>
+            <w:r>
+              <w:rPr>
+                <w:rFonts w:ascii="Arial" w:hAnsi="Arial" w:cs="Arial"/>
+                <w:sz w:val="24"/>
+                <w:szCs w:val="24"/>
+              </w:rPr>
+              <w:t>Virtual</w:t>
+            </w:r>
+            <w:r>
+              <w:rPr>
+                <w:rFonts w:ascii="Arial" w:hAnsi="Arial" w:cs="Arial"/>
+                <w:sz w:val="24"/>
+                <w:szCs w:val="24"/>
+              </w:rPr>
+              <w:t xml:space="preserve"> / </w:t>
+            </w:r>
+            <w:r>
+              <w:rPr>
+                <w:rFonts w:ascii="Arial" w:hAnsi="Arial" w:cs="Arial"/>
+                <w:sz w:val="24"/>
+                <w:szCs w:val="24"/>
+                <w:shd w:val="clear" w:color="auto" w:fill="F5E4A9" w:themeFill="accent3" w:themeFillTint="66"/>
+              </w:rPr>
+              <w:t>Mixto</w:t>
+            </w:r>
+          </w:p>
+        </w:tc>
+      </w:tr>
+      <w:tr>
+        <w:trPr>
+          <w:jc w:val="center"/>
+        </w:trPr>
+        <w:tc>
+          <w:tcPr>
+            <w:tcW w:w="9634" w:type="dxa"/>
+            <w:gridSpan w:val="2"/>
+            <w:vAlign w:val="center"/>
+          </w:tcPr>
+          <w:p>
+            <w:pPr>
+              <w:rPr>
+                <w:rFonts w:ascii="Arial" w:hAnsi="Arial" w:cs="Arial"/>
+                <w:b/>
+                <w:bCs/>
+                <w:sz w:val="24"/>
+                <w:szCs w:val="24"/>
+              </w:rPr>
+            </w:pPr>
+            <w:r>
+              <w:rPr>
+                <w:rFonts w:ascii="Arial" w:hAnsi="Arial" w:cs="Arial"/>
+                <w:b/>
+                <w:bCs/>
+                <w:sz w:val="24"/>
+                <w:szCs w:val="24"/>
+              </w:rPr>
+              <w:t>Duración de la sesión:</w:t>
+            </w:r>
+            <w:r>
+              <w:rPr>
+                <w:rFonts w:ascii="Arial" w:hAnsi="Arial" w:cs="Arial"/>
+                <w:b/>
+                <w:bCs/>
+                <w:sz w:val="24"/>
+                <w:szCs w:val="24"/>
+              </w:rPr>
+              <w:t xml:space="preserve"> </w:t>
+            </w:r>
+            <w:r>
+              <w:rPr>
+                <w:rFonts w:ascii="Arial" w:hAnsi="Arial" w:cs="Arial"/>
+                <w:sz w:val="24"/>
+                <w:szCs w:val="24"/>
+              </w:rPr>
+              <w:t xml:space="preserve">50 min. </w:t>
+            </w:r>
+          </w:p>
+        </w:tc>
+      </w:tr>
+    </w:tbl>
+    <w:p>
+      <w:pPr>
+        <w:rPr>
+          <w:rFonts w:ascii="Arial" w:hAnsi="Arial" w:cs="Arial"/>
+          <w:sz w:val="24"/>
+          <w:szCs w:val="24"/>
+        </w:rPr>
+      </w:pPr>
+    </w:p>
+    <w:p>
+      <w:pPr>
+        <w:pStyle w:val="titulo1"/>
+        <w:outlineLvl w:val="2"/>
+        <w:rPr>
+          <w:sz w:val="32"/>
+          <w:szCs w:val="72"/>
+        </w:rPr>
+      </w:pPr>
+      <w:r>
+        <w:rPr>
+          <w:sz w:val="32"/>
+          <w:szCs w:val="72"/>
+        </w:rPr>
+        <w:t>Asistencia y Participación</w:t>
+      </w:r>
+    </w:p>
+    <w:tbl>
+      <w:tblPr>
+        <w:tblStyle w:val="Tablaconcuadrcula"/>
+        <w:tblW w:w="10281" w:type="dxa"/>
+        <w:jc w:val="center"/>
+        <w:tblBorders>
+          <w:top w:val="single" w:sz="4" w:space="0" w:color="7F7F7F" w:themeColor="text1" w:themeTint="80"/>
+          <w:left w:val="single" w:sz="4" w:space="0" w:color="7F7F7F" w:themeColor="text1" w:themeTint="80"/>
+          <w:bottom w:val="single" w:sz="4" w:space="0" w:color="7F7F7F" w:themeColor="text1" w:themeTint="80"/>
+          <w:right w:val="single" w:sz="4" w:space="0" w:color="7F7F7F" w:themeColor="text1" w:themeTint="80"/>
+          <w:insideH w:val="single" w:sz="4" w:space="0" w:color="7F7F7F" w:themeColor="text1" w:themeTint="80"/>
+          <w:insideV w:val="single" w:sz="4" w:space="0" w:color="7F7F7F" w:themeColor="text1" w:themeTint="80"/>
+        </w:tblBorders>
+        <w:tblCellMar>
+          <w:top w:w="57" w:type="dxa"/>
+          <w:bottom w:w="57" w:type="dxa"/>
+        </w:tblCellMar>
+        <w:tblLook w:val="04A0" w:firstRow="1" w:lastRow="0" w:firstColumn="1" w:lastColumn="0" w:noHBand="0" w:noVBand="1"/>
+      </w:tblPr>
+      <w:tblGrid>
+        <w:gridCol w:w="1538"/>
+        <w:gridCol w:w="1791"/>
+        <w:gridCol w:w="1563"/>
+        <w:gridCol w:w="3061"/>
+        <w:gridCol w:w="2328"/>
+      </w:tblGrid>
+      <w:tr>
+        <w:trPr>
+          <w:jc w:val="center"/>
+        </w:trPr>
+        <w:tc>
+          <w:tcPr>
+            <w:tcW w:w="1538" w:type="dxa"/>
+            <w:shd w:val="clear" w:color="auto" w:fill="262626" w:themeFill="text1" w:themeFillTint="D9"/>
+            <w:vAlign w:val="center"/>
+          </w:tcPr>
+          <w:p>
+            <w:pPr>
+              <w:jc w:val="center"/>
+              <w:rPr>
+                <w:rFonts w:ascii="Arial" w:hAnsi="Arial" w:cs="Arial"/>
+                <w:b/>
+                <w:bCs/>
+                <w:sz w:val="24"/>
+                <w:szCs w:val="24"/>
+              </w:rPr>
+            </w:pPr>
+            <w:r>
+              <w:rPr>
+                <w:rFonts w:ascii="Arial" w:hAnsi="Arial" w:cs="Arial"/>
+                <w:b/>
+                <w:bCs/>
+                <w:sz w:val="24"/>
+                <w:szCs w:val="24"/>
+              </w:rPr>
+              <w:t>Integrante</w:t>
+            </w:r>
+          </w:p>
+        </w:tc>
+        <w:tc>
+          <w:tcPr>
+            <w:tcW w:w="1791" w:type="dxa"/>
+            <w:shd w:val="clear" w:color="auto" w:fill="262626" w:themeFill="text1" w:themeFillTint="D9"/>
+            <w:vAlign w:val="center"/>
+          </w:tcPr>
+          <w:p>
+            <w:pPr>
+              <w:jc w:val="center"/>
+              <w:rPr>
+                <w:rFonts w:ascii="Arial" w:hAnsi="Arial" w:cs="Arial"/>
+                <w:b/>
+                <w:bCs/>
+                <w:sz w:val="24"/>
+                <w:szCs w:val="24"/>
+              </w:rPr>
+            </w:pPr>
+            <w:r>
+              <w:rPr>
+                <w:rFonts w:ascii="Arial" w:hAnsi="Arial" w:cs="Arial"/>
+                <w:b/>
+                <w:bCs/>
+                <w:sz w:val="24"/>
+                <w:szCs w:val="24"/>
+              </w:rPr>
+              <w:t>Rol</w:t>
+            </w:r>
+          </w:p>
+        </w:tc>
+        <w:tc>
+          <w:tcPr>
+            <w:tcW w:w="1563" w:type="dxa"/>
+            <w:shd w:val="clear" w:color="auto" w:fill="262626" w:themeFill="text1" w:themeFillTint="D9"/>
+            <w:vAlign w:val="center"/>
+          </w:tcPr>
+          <w:p>
+            <w:pPr>
+              <w:jc w:val="center"/>
+              <w:rPr>
+                <w:rFonts w:ascii="Arial" w:hAnsi="Arial" w:cs="Arial"/>
+                <w:b/>
+                <w:bCs/>
+                <w:sz w:val="24"/>
+                <w:szCs w:val="24"/>
+              </w:rPr>
+            </w:pPr>
+            <w:r>
+              <w:rPr>
+                <w:rFonts w:ascii="Arial" w:hAnsi="Arial" w:cs="Arial"/>
+                <w:b/>
+                <w:bCs/>
+                <w:sz w:val="24"/>
+                <w:szCs w:val="24"/>
+              </w:rPr>
+              <w:t>Asistencia (Sí/No)</w:t>
+            </w:r>
+          </w:p>
+        </w:tc>
+        <w:tc>
+          <w:tcPr>
+            <w:tcW w:w="3061" w:type="dxa"/>
+            <w:shd w:val="clear" w:color="auto" w:fill="262626" w:themeFill="text1" w:themeFillTint="D9"/>
+            <w:vAlign w:val="center"/>
+          </w:tcPr>
+          <w:p>
+            <w:pPr>
+              <w:jc w:val="center"/>
+              <w:rPr>
+                <w:rFonts w:ascii="Arial" w:hAnsi="Arial" w:cs="Arial"/>
+                <w:b/>
+                <w:bCs/>
+                <w:sz w:val="24"/>
+                <w:szCs w:val="24"/>
+              </w:rPr>
+            </w:pPr>
+            <w:r>
+              <w:rPr>
+                <w:rFonts w:ascii="Arial" w:hAnsi="Arial" w:cs="Arial"/>
+                <w:b/>
+                <w:bCs/>
+                <w:sz w:val="24"/>
+                <w:szCs w:val="24"/>
+              </w:rPr>
+              <w:t>Actividades</w:t>
+            </w:r>
+          </w:p>
+        </w:tc>
+        <w:tc>
+          <w:tcPr>
+            <w:tcW w:w="2328" w:type="dxa"/>
+            <w:shd w:val="clear" w:color="auto" w:fill="262626" w:themeFill="text1" w:themeFillTint="D9"/>
+            <w:vAlign w:val="center"/>
+          </w:tcPr>
+          <w:p>
+            <w:pPr>
+              <w:jc w:val="center"/>
+              <w:rPr>
+                <w:rFonts w:ascii="Arial" w:hAnsi="Arial" w:cs="Arial"/>
+                <w:b/>
+                <w:bCs/>
+                <w:sz w:val="24"/>
+                <w:szCs w:val="24"/>
+              </w:rPr>
+            </w:pPr>
+            <w:r>
+              <w:rPr>
+                <w:rFonts w:ascii="Arial" w:hAnsi="Arial" w:cs="Arial"/>
+                <w:b/>
+                <w:bCs/>
+                <w:sz w:val="24"/>
+                <w:szCs w:val="24"/>
+              </w:rPr>
+              <w:t>Entregables Esperados</w:t>
+            </w:r>
+          </w:p>
+        </w:tc>
+      </w:tr>
+      <w:tr>
+        <w:trPr>
+          <w:jc w:val="center"/>
+        </w:trPr>
+        <w:tc>
+          <w:tcPr>
+            <w:tcW w:w="1538" w:type="dxa"/>
+            <w:vAlign w:val="center"/>
+          </w:tcPr>
+          <w:p>
+            <w:pPr>
+              <w:rPr>
+                <w:rFonts w:ascii="Arial" w:hAnsi="Arial" w:cs="Arial"/>
+                <w:sz w:val="24"/>
+                <w:szCs w:val="24"/>
+              </w:rPr>
+            </w:pPr>
+            <w:r>
+              <w:rPr>
+                <w:rFonts w:ascii="Arial" w:hAnsi="Arial" w:cs="Arial"/>
+                <w:sz w:val="24"/>
+                <w:szCs w:val="24"/>
+              </w:rPr>
+              <w:t>María Fernanda Barrón Álvarez</w:t>
+            </w:r>
+          </w:p>
+        </w:tc>
+        <w:tc>
+          <w:tcPr>
+            <w:tcW w:w="1791" w:type="dxa"/>
+            <w:vAlign w:val="center"/>
+          </w:tcPr>
+          <w:p>
+            <w:pPr>
+              <w:rPr>
+                <w:rFonts w:ascii="Arial" w:hAnsi="Arial" w:cs="Arial"/>
+                <w:sz w:val="24"/>
+                <w:szCs w:val="24"/>
+              </w:rPr>
+            </w:pPr>
+            <w:r>
+              <w:rPr>
+                <w:rFonts w:ascii="Arial" w:hAnsi="Arial" w:cs="Arial"/>
+                <w:sz w:val="24"/>
+                <w:szCs w:val="24"/>
+              </w:rPr>
+              <w:t>Project Manager</w:t>
+            </w:r>
+          </w:p>
+        </w:tc>
+        <w:tc>
+          <w:tcPr>
+            <w:tcW w:w="1563" w:type="dxa"/>
+            <w:vAlign w:val="center"/>
+          </w:tcPr>
+          <w:p>
+            <w:pPr>
+              <w:rPr>
+                <w:rFonts w:ascii="Arial" w:hAnsi="Arial" w:cs="Arial"/>
+                <w:sz w:val="24"/>
+                <w:szCs w:val="24"/>
+              </w:rPr>
+            </w:pPr>
+            <w:r>
+              <w:rPr>
+                <w:rFonts w:ascii="Arial" w:hAnsi="Arial" w:cs="Arial"/>
+                <w:sz w:val="24"/>
+                <w:szCs w:val="24"/>
+              </w:rPr>
+              <w:t>Sí</w:t>
+            </w:r>
+          </w:p>
+        </w:tc>
+        <w:tc>
+          <w:tcPr>
+            <w:tcW w:w="3061" w:type="dxa"/>
+            <w:vAlign w:val="center"/>
+          </w:tcPr>
+          <w:p>
+            <w:pPr>
+              <w:pStyle w:val="Prrafodelista"/>
+              <w:numPr>
+                <w:ilvl w:val="0"/>
+                <w:numId w:val="27"/>
+              </w:numPr>
+              <w:ind w:left="246" w:hanging="218"/>
+              <w:rPr>
+                <w:rFonts w:ascii="Arial" w:hAnsi="Arial" w:cs="Arial"/>
+                <w:sz w:val="24"/>
+                <w:szCs w:val="24"/>
+              </w:rPr>
+            </w:pPr>
+            <w:r>
+              <w:rPr>
+                <w:rFonts w:ascii="Arial" w:hAnsi="Arial" w:cs="Arial"/>
+                <w:sz w:val="24"/>
+                <w:szCs w:val="24"/>
+              </w:rPr>
+              <w:t>Bitácora del día</w:t>
+            </w:r>
+          </w:p>
+          <w:p>
+            <w:pPr>
+              <w:pStyle w:val="Prrafodelista"/>
+              <w:numPr>
+                <w:ilvl w:val="0"/>
+                <w:numId w:val="27"/>
+              </w:numPr>
+              <w:ind w:left="246" w:hanging="218"/>
+              <w:rPr>
+                <w:rFonts w:ascii="Arial" w:hAnsi="Arial" w:cs="Arial"/>
+                <w:sz w:val="24"/>
+                <w:szCs w:val="24"/>
+              </w:rPr>
+            </w:pPr>
+            <w:r>
+              <w:rPr>
+                <w:rFonts w:ascii="Arial" w:hAnsi="Arial" w:cs="Arial"/>
+                <w:sz w:val="24"/>
+                <w:szCs w:val="24"/>
+              </w:rPr>
+              <w:t>Documentación final, punto 8.</w:t>
+            </w:r>
+            <w:r>
+              <w:rPr>
+                <w:rFonts w:ascii="Arial" w:hAnsi="Arial" w:cs="Arial"/>
+                <w:sz w:val="24"/>
+                <w:szCs w:val="24"/>
+              </w:rPr>
+              <w:t>3</w:t>
+            </w:r>
+            <w:r>
+              <w:rPr>
+                <w:rFonts w:ascii="Arial" w:hAnsi="Arial" w:cs="Arial"/>
+                <w:sz w:val="24"/>
+                <w:szCs w:val="24"/>
+              </w:rPr>
+              <w:t>.</w:t>
+            </w:r>
+          </w:p>
+        </w:tc>
+        <w:tc>
+          <w:tcPr>
+            <w:tcW w:w="2328" w:type="dxa"/>
+            <w:vAlign w:val="center"/>
+          </w:tcPr>
+          <w:p>
+            <w:pPr>
+              <w:pStyle w:val="Prrafodelista"/>
+              <w:numPr>
+                <w:ilvl w:val="0"/>
+                <w:numId w:val="27"/>
+              </w:numPr>
+              <w:ind w:left="219" w:hanging="219"/>
+              <w:rPr>
+                <w:rFonts w:ascii="Arial" w:hAnsi="Arial" w:cs="Arial"/>
+                <w:sz w:val="24"/>
+                <w:szCs w:val="24"/>
+              </w:rPr>
+            </w:pPr>
+            <w:r>
+              <w:rPr>
+                <w:rFonts w:ascii="Arial" w:hAnsi="Arial" w:cs="Arial"/>
+                <w:sz w:val="24"/>
+                <w:szCs w:val="24"/>
+              </w:rPr>
+              <w:t>Bitácora</w:t>
+            </w:r>
+          </w:p>
+          <w:p>
+            <w:pPr>
+              <w:pStyle w:val="Prrafodelista"/>
+              <w:numPr>
+                <w:ilvl w:val="0"/>
+                <w:numId w:val="27"/>
+              </w:numPr>
+              <w:ind w:left="219" w:hanging="219"/>
+              <w:rPr>
+                <w:rFonts w:ascii="Arial" w:hAnsi="Arial" w:cs="Arial"/>
+                <w:sz w:val="24"/>
+                <w:szCs w:val="24"/>
+              </w:rPr>
+            </w:pPr>
+            <w:r>
+              <w:rPr>
+                <w:rFonts w:ascii="Arial" w:hAnsi="Arial" w:cs="Arial"/>
+                <w:sz w:val="24"/>
+                <w:szCs w:val="24"/>
+              </w:rPr>
+              <w:t>Documentación final</w:t>
+            </w:r>
+          </w:p>
+        </w:tc>
+      </w:tr>
+      <w:tr>
+        <w:trPr>
+          <w:jc w:val="center"/>
+        </w:trPr>
+        <w:tc>
+          <w:tcPr>
+            <w:tcW w:w="1538" w:type="dxa"/>
+            <w:vAlign w:val="center"/>
+          </w:tcPr>
+          <w:p>
+            <w:pPr>
+              <w:rPr>
+                <w:rFonts w:ascii="Arial" w:hAnsi="Arial" w:cs="Arial"/>
+                <w:sz w:val="24"/>
+                <w:szCs w:val="24"/>
+              </w:rPr>
+            </w:pPr>
+            <w:r>
+              <w:rPr>
+                <w:rFonts w:ascii="Arial" w:hAnsi="Arial" w:cs="Arial"/>
+                <w:sz w:val="24"/>
+                <w:szCs w:val="24"/>
+              </w:rPr>
+              <w:t xml:space="preserve">Leslie Miroslava Benítez </w:t>
+            </w:r>
+          </w:p>
+          <w:p>
+            <w:pPr>
+              <w:rPr>
+                <w:rFonts w:ascii="Arial" w:hAnsi="Arial" w:cs="Arial"/>
+                <w:sz w:val="24"/>
+                <w:szCs w:val="24"/>
+              </w:rPr>
+            </w:pPr>
+            <w:r>
+              <w:rPr>
+                <w:rFonts w:ascii="Arial" w:hAnsi="Arial" w:cs="Arial"/>
+                <w:sz w:val="24"/>
+                <w:szCs w:val="24"/>
+              </w:rPr>
+              <w:t>Marín</w:t>
+            </w:r>
+          </w:p>
+        </w:tc>
+        <w:tc>
+          <w:tcPr>
+            <w:tcW w:w="1791" w:type="dxa"/>
+            <w:vAlign w:val="center"/>
+          </w:tcPr>
+          <w:p>
+            <w:pPr>
+              <w:rPr>
+                <w:rFonts w:ascii="Arial" w:hAnsi="Arial" w:cs="Arial"/>
+                <w:sz w:val="24"/>
+                <w:szCs w:val="24"/>
+              </w:rPr>
+            </w:pPr>
+            <w:r>
+              <w:rPr>
+                <w:rFonts w:ascii="Arial" w:hAnsi="Arial" w:cs="Arial"/>
+                <w:sz w:val="24"/>
+                <w:szCs w:val="24"/>
+              </w:rPr>
+              <w:t xml:space="preserve">Desarrolladora </w:t>
+            </w:r>
+            <w:proofErr w:type="spellStart"/>
+            <w:r>
+              <w:rPr>
+                <w:rFonts w:ascii="Arial" w:hAnsi="Arial" w:cs="Arial"/>
+                <w:sz w:val="24"/>
+                <w:szCs w:val="24"/>
+              </w:rPr>
+              <w:t>frontend</w:t>
+            </w:r>
+            <w:proofErr w:type="spellEnd"/>
+          </w:p>
+        </w:tc>
+        <w:tc>
+          <w:tcPr>
+            <w:tcW w:w="1563" w:type="dxa"/>
+            <w:vAlign w:val="center"/>
+          </w:tcPr>
+          <w:p>
+            <w:pPr>
+              <w:rPr>
+                <w:rFonts w:ascii="Arial" w:hAnsi="Arial" w:cs="Arial"/>
+                <w:sz w:val="24"/>
+                <w:szCs w:val="24"/>
+              </w:rPr>
+            </w:pPr>
+            <w:r>
+              <w:rPr>
+                <w:rFonts w:ascii="Arial" w:hAnsi="Arial" w:cs="Arial"/>
+                <w:sz w:val="24"/>
+                <w:szCs w:val="24"/>
+              </w:rPr>
+              <w:t>Sí (virtual)</w:t>
+            </w:r>
+          </w:p>
+        </w:tc>
+        <w:tc>
+          <w:tcPr>
+            <w:tcW w:w="3061" w:type="dxa"/>
+            <w:vAlign w:val="center"/>
+          </w:tcPr>
+          <w:p>
+            <w:pPr>
+              <w:pStyle w:val="Prrafodelista"/>
+              <w:numPr>
+                <w:ilvl w:val="0"/>
+                <w:numId w:val="27"/>
+              </w:numPr>
+              <w:ind w:left="270" w:hanging="184"/>
+              <w:rPr>
+                <w:rFonts w:ascii="Arial" w:hAnsi="Arial" w:cs="Arial"/>
+                <w:sz w:val="24"/>
+                <w:szCs w:val="24"/>
+              </w:rPr>
+            </w:pPr>
+            <w:r>
+              <w:rPr>
+                <w:rFonts w:ascii="Arial" w:hAnsi="Arial" w:cs="Arial"/>
+                <w:sz w:val="24"/>
+                <w:szCs w:val="24"/>
+              </w:rPr>
+              <w:t>Documentación final, punto 8.1.</w:t>
+            </w:r>
+          </w:p>
+        </w:tc>
+        <w:tc>
+          <w:tcPr>
+            <w:tcW w:w="2328" w:type="dxa"/>
+            <w:vAlign w:val="center"/>
+          </w:tcPr>
+          <w:p>
+            <w:pPr>
+              <w:pStyle w:val="Prrafodelista"/>
+              <w:numPr>
+                <w:ilvl w:val="0"/>
+                <w:numId w:val="27"/>
+              </w:numPr>
+              <w:ind w:left="219" w:hanging="218"/>
+              <w:rPr>
+                <w:rFonts w:ascii="Arial" w:hAnsi="Arial" w:cs="Arial"/>
+                <w:sz w:val="24"/>
+                <w:szCs w:val="24"/>
+              </w:rPr>
+            </w:pPr>
+            <w:r>
+              <w:rPr>
+                <w:rFonts w:ascii="Arial" w:hAnsi="Arial" w:cs="Arial"/>
+                <w:sz w:val="24"/>
+                <w:szCs w:val="24"/>
+              </w:rPr>
+              <w:t>Documentación final</w:t>
+            </w:r>
+          </w:p>
+        </w:tc>
+      </w:tr>
+      <w:tr>
+        <w:trPr>
+          <w:jc w:val="center"/>
+        </w:trPr>
+        <w:tc>
+          <w:tcPr>
+            <w:tcW w:w="1538" w:type="dxa"/>
+            <w:vAlign w:val="center"/>
+          </w:tcPr>
+          <w:p>
+            <w:pPr>
+              <w:rPr>
+                <w:rFonts w:ascii="Arial" w:hAnsi="Arial" w:cs="Arial"/>
+                <w:sz w:val="24"/>
+                <w:szCs w:val="24"/>
+              </w:rPr>
+            </w:pPr>
+            <w:r>
+              <w:rPr>
+                <w:rFonts w:ascii="Arial" w:hAnsi="Arial" w:cs="Arial"/>
+                <w:sz w:val="24"/>
+                <w:szCs w:val="24"/>
+              </w:rPr>
+              <w:t>Leonardo Merino Garfias</w:t>
+            </w:r>
+          </w:p>
+        </w:tc>
+        <w:tc>
+          <w:tcPr>
+            <w:tcW w:w="1791" w:type="dxa"/>
+            <w:vAlign w:val="center"/>
+          </w:tcPr>
+          <w:p>
+            <w:pPr>
+              <w:rPr>
+                <w:rFonts w:ascii="Arial" w:hAnsi="Arial" w:cs="Arial"/>
+                <w:sz w:val="24"/>
+                <w:szCs w:val="24"/>
+              </w:rPr>
+            </w:pPr>
+            <w:r>
+              <w:rPr>
+                <w:rFonts w:ascii="Arial" w:hAnsi="Arial" w:cs="Arial"/>
+                <w:sz w:val="24"/>
+                <w:szCs w:val="24"/>
+              </w:rPr>
+              <w:t xml:space="preserve">Desarrollador </w:t>
+            </w:r>
+            <w:proofErr w:type="spellStart"/>
+            <w:r>
+              <w:rPr>
+                <w:rFonts w:ascii="Arial" w:hAnsi="Arial" w:cs="Arial"/>
+                <w:sz w:val="24"/>
+                <w:szCs w:val="24"/>
+              </w:rPr>
+              <w:t>backend</w:t>
+            </w:r>
+            <w:proofErr w:type="spellEnd"/>
+          </w:p>
+        </w:tc>
+        <w:tc>
+          <w:tcPr>
+            <w:tcW w:w="1563" w:type="dxa"/>
+            <w:vAlign w:val="center"/>
+          </w:tcPr>
+          <w:p>
+            <w:pPr>
+              <w:rPr>
+                <w:rFonts w:ascii="Arial" w:hAnsi="Arial" w:cs="Arial"/>
+                <w:sz w:val="24"/>
+                <w:szCs w:val="24"/>
+              </w:rPr>
+            </w:pPr>
+            <w:r>
+              <w:rPr>
+                <w:rFonts w:ascii="Arial" w:hAnsi="Arial" w:cs="Arial"/>
+                <w:sz w:val="24"/>
+                <w:szCs w:val="24"/>
+              </w:rPr>
+              <w:t>Sí (virtual)</w:t>
+            </w:r>
+          </w:p>
+        </w:tc>
+        <w:tc>
+          <w:tcPr>
+            <w:tcW w:w="3061" w:type="dxa"/>
+            <w:vAlign w:val="center"/>
+          </w:tcPr>
+          <w:p>
+            <w:pPr>
+              <w:pStyle w:val="Prrafodelista"/>
+              <w:numPr>
+                <w:ilvl w:val="0"/>
+                <w:numId w:val="27"/>
+              </w:numPr>
+              <w:ind w:left="246" w:hanging="218"/>
+              <w:rPr>
+                <w:rFonts w:ascii="Arial" w:hAnsi="Arial" w:cs="Arial"/>
+                <w:sz w:val="24"/>
+                <w:szCs w:val="24"/>
+              </w:rPr>
+            </w:pPr>
+            <w:r>
+              <w:rPr>
+                <w:rFonts w:ascii="Arial" w:hAnsi="Arial" w:cs="Arial"/>
+                <w:sz w:val="24"/>
+                <w:szCs w:val="24"/>
+              </w:rPr>
+              <w:t>Documentación final, punto 8.2.</w:t>
+            </w:r>
+          </w:p>
+        </w:tc>
+        <w:tc>
+          <w:tcPr>
+            <w:tcW w:w="2328" w:type="dxa"/>
+            <w:vAlign w:val="center"/>
+          </w:tcPr>
+          <w:p>
+            <w:pPr>
+              <w:pStyle w:val="Prrafodelista"/>
+              <w:numPr>
+                <w:ilvl w:val="0"/>
+                <w:numId w:val="27"/>
+              </w:numPr>
+              <w:ind w:left="349" w:hanging="248"/>
+              <w:rPr>
+                <w:rFonts w:ascii="Arial" w:hAnsi="Arial" w:cs="Arial"/>
+                <w:sz w:val="24"/>
+                <w:szCs w:val="24"/>
+              </w:rPr>
+            </w:pPr>
+            <w:r>
+              <w:rPr>
+                <w:rFonts w:ascii="Arial" w:hAnsi="Arial" w:cs="Arial"/>
+                <w:sz w:val="24"/>
+                <w:szCs w:val="24"/>
+              </w:rPr>
+              <w:t>Documentación final</w:t>
+            </w:r>
+          </w:p>
+        </w:tc>
+      </w:tr>
+    </w:tbl>
+    <w:p>
+      <w:pPr>
+        <w:rPr>
+          <w:rFonts w:ascii="Arial" w:hAnsi="Arial" w:cs="Arial"/>
+          <w:sz w:val="24"/>
+          <w:szCs w:val="24"/>
+        </w:rPr>
+      </w:pPr>
+    </w:p>
+    <w:p>
+      <w:pPr>
+        <w:pStyle w:val="titulo1"/>
+        <w:outlineLvl w:val="2"/>
+        <w:rPr>
+          <w:sz w:val="32"/>
+          <w:szCs w:val="72"/>
+        </w:rPr>
+      </w:pPr>
+      <w:r>
+        <w:rPr>
+          <w:sz w:val="32"/>
+          <w:szCs w:val="72"/>
+        </w:rPr>
+        <w:t>A</w:t>
+      </w:r>
+      <w:r>
+        <w:rPr>
+          <w:sz w:val="32"/>
+          <w:szCs w:val="72"/>
+        </w:rPr>
+        <w:t>ctividades Ejecutadas</w:t>
+      </w:r>
+    </w:p>
+    <w:tbl>
+      <w:tblPr>
+        <w:tblStyle w:val="Tablaconcuadrcula"/>
+        <w:tblW w:w="10124" w:type="dxa"/>
+        <w:jc w:val="center"/>
+        <w:tblBorders>
+          <w:top w:val="single" w:sz="4" w:space="0" w:color="7F7F7F" w:themeColor="text1" w:themeTint="80"/>
+          <w:left w:val="single" w:sz="4" w:space="0" w:color="7F7F7F" w:themeColor="text1" w:themeTint="80"/>
+          <w:bottom w:val="single" w:sz="4" w:space="0" w:color="7F7F7F" w:themeColor="text1" w:themeTint="80"/>
+          <w:right w:val="single" w:sz="4" w:space="0" w:color="7F7F7F" w:themeColor="text1" w:themeTint="80"/>
+          <w:insideH w:val="single" w:sz="4" w:space="0" w:color="7F7F7F" w:themeColor="text1" w:themeTint="80"/>
+          <w:insideV w:val="single" w:sz="4" w:space="0" w:color="7F7F7F" w:themeColor="text1" w:themeTint="80"/>
+        </w:tblBorders>
+        <w:tblCellMar>
+          <w:top w:w="57" w:type="dxa"/>
+          <w:bottom w:w="57" w:type="dxa"/>
+        </w:tblCellMar>
+        <w:tblLook w:val="04A0" w:firstRow="1" w:lastRow="0" w:firstColumn="1" w:lastColumn="0" w:noHBand="0" w:noVBand="1"/>
+      </w:tblPr>
+      <w:tblGrid>
+        <w:gridCol w:w="2955"/>
+        <w:gridCol w:w="2004"/>
+        <w:gridCol w:w="1150"/>
+        <w:gridCol w:w="1535"/>
+        <w:gridCol w:w="2480"/>
+      </w:tblGrid>
+      <w:tr>
+        <w:trPr>
+          <w:jc w:val="center"/>
+        </w:trPr>
+        <w:tc>
+          <w:tcPr>
+            <w:tcW w:w="2955" w:type="dxa"/>
+            <w:shd w:val="clear" w:color="auto" w:fill="262626" w:themeFill="text1" w:themeFillTint="D9"/>
+            <w:vAlign w:val="center"/>
+          </w:tcPr>
+          <w:p>
+            <w:pPr>
+              <w:jc w:val="center"/>
+              <w:rPr>
+                <w:rFonts w:ascii="Arial" w:hAnsi="Arial" w:cs="Arial"/>
+                <w:b/>
+                <w:bCs/>
+                <w:sz w:val="24"/>
+                <w:szCs w:val="24"/>
+              </w:rPr>
+            </w:pPr>
+            <w:r>
+              <w:rPr>
+                <w:rFonts w:ascii="Arial" w:hAnsi="Arial" w:cs="Arial"/>
+                <w:b/>
+                <w:bCs/>
+                <w:sz w:val="24"/>
+                <w:szCs w:val="24"/>
+              </w:rPr>
+              <w:t>Actividad</w:t>
+            </w:r>
+          </w:p>
+        </w:tc>
+        <w:tc>
+          <w:tcPr>
+            <w:tcW w:w="2004" w:type="dxa"/>
+            <w:shd w:val="clear" w:color="auto" w:fill="262626" w:themeFill="text1" w:themeFillTint="D9"/>
+            <w:vAlign w:val="center"/>
+          </w:tcPr>
+          <w:p>
+            <w:pPr>
+              <w:jc w:val="center"/>
+              <w:rPr>
+                <w:rFonts w:ascii="Arial" w:hAnsi="Arial" w:cs="Arial"/>
+                <w:b/>
+                <w:bCs/>
+                <w:sz w:val="24"/>
+                <w:szCs w:val="24"/>
+              </w:rPr>
+            </w:pPr>
+            <w:r>
+              <w:rPr>
+                <w:rFonts w:ascii="Arial" w:hAnsi="Arial" w:cs="Arial"/>
+                <w:b/>
+                <w:bCs/>
+                <w:sz w:val="24"/>
+                <w:szCs w:val="24"/>
+              </w:rPr>
+              <w:t>Responsable(s)</w:t>
+            </w:r>
+          </w:p>
+        </w:tc>
+        <w:tc>
+          <w:tcPr>
+            <w:tcW w:w="1150" w:type="dxa"/>
+            <w:shd w:val="clear" w:color="auto" w:fill="262626" w:themeFill="text1" w:themeFillTint="D9"/>
+            <w:vAlign w:val="center"/>
+          </w:tcPr>
+          <w:p>
+            <w:pPr>
+              <w:jc w:val="center"/>
+              <w:rPr>
+                <w:rFonts w:ascii="Arial" w:hAnsi="Arial" w:cs="Arial"/>
+                <w:b/>
+                <w:bCs/>
+                <w:sz w:val="24"/>
+                <w:szCs w:val="24"/>
+              </w:rPr>
+            </w:pPr>
+            <w:proofErr w:type="spellStart"/>
+            <w:r>
+              <w:rPr>
+                <w:rFonts w:ascii="Arial" w:hAnsi="Arial" w:cs="Arial"/>
+                <w:b/>
+                <w:bCs/>
+                <w:sz w:val="24"/>
+                <w:szCs w:val="24"/>
+              </w:rPr>
+              <w:t>Hr</w:t>
+            </w:r>
+            <w:proofErr w:type="spellEnd"/>
+            <w:r>
+              <w:rPr>
+                <w:rFonts w:ascii="Arial" w:hAnsi="Arial" w:cs="Arial"/>
+                <w:b/>
+                <w:bCs/>
+                <w:sz w:val="24"/>
+                <w:szCs w:val="24"/>
+              </w:rPr>
+              <w:t xml:space="preserve">. </w:t>
+            </w:r>
+            <w:proofErr w:type="spellStart"/>
+            <w:r>
+              <w:rPr>
+                <w:rFonts w:ascii="Arial" w:hAnsi="Arial" w:cs="Arial"/>
+                <w:b/>
+                <w:bCs/>
+                <w:sz w:val="24"/>
+                <w:szCs w:val="24"/>
+              </w:rPr>
+              <w:t>Ini</w:t>
+            </w:r>
+            <w:proofErr w:type="spellEnd"/>
+          </w:p>
+        </w:tc>
+        <w:tc>
+          <w:tcPr>
+            <w:tcW w:w="1535" w:type="dxa"/>
+            <w:shd w:val="clear" w:color="auto" w:fill="262626" w:themeFill="text1" w:themeFillTint="D9"/>
+            <w:vAlign w:val="center"/>
+          </w:tcPr>
+          <w:p>
+            <w:pPr>
+              <w:jc w:val="center"/>
+              <w:rPr>
+                <w:rFonts w:ascii="Arial" w:hAnsi="Arial" w:cs="Arial"/>
+                <w:b/>
+                <w:bCs/>
+                <w:sz w:val="24"/>
+                <w:szCs w:val="24"/>
+              </w:rPr>
+            </w:pPr>
+            <w:proofErr w:type="spellStart"/>
+            <w:r>
+              <w:rPr>
+                <w:rFonts w:ascii="Arial" w:hAnsi="Arial" w:cs="Arial"/>
+                <w:b/>
+                <w:bCs/>
+                <w:sz w:val="24"/>
+                <w:szCs w:val="24"/>
+              </w:rPr>
+              <w:t>Hr</w:t>
+            </w:r>
+            <w:proofErr w:type="spellEnd"/>
+            <w:r>
+              <w:rPr>
+                <w:rFonts w:ascii="Arial" w:hAnsi="Arial" w:cs="Arial"/>
+                <w:b/>
+                <w:bCs/>
+                <w:sz w:val="24"/>
+                <w:szCs w:val="24"/>
+              </w:rPr>
+              <w:t>. fin</w:t>
+            </w:r>
+          </w:p>
+        </w:tc>
+        <w:tc>
+          <w:tcPr>
+            <w:tcW w:w="2480" w:type="dxa"/>
+            <w:shd w:val="clear" w:color="auto" w:fill="262626" w:themeFill="text1" w:themeFillTint="D9"/>
+            <w:vAlign w:val="center"/>
+          </w:tcPr>
+          <w:p>
+            <w:pPr>
+              <w:jc w:val="center"/>
+              <w:rPr>
+                <w:rFonts w:ascii="Arial" w:hAnsi="Arial" w:cs="Arial"/>
+                <w:b/>
+                <w:bCs/>
+                <w:sz w:val="24"/>
+                <w:szCs w:val="24"/>
+              </w:rPr>
+            </w:pPr>
+            <w:r>
+              <w:rPr>
+                <w:rFonts w:ascii="Arial" w:hAnsi="Arial" w:cs="Arial"/>
+                <w:b/>
+                <w:bCs/>
+                <w:sz w:val="24"/>
+                <w:szCs w:val="24"/>
+              </w:rPr>
+              <w:t>Estado (Completado / En proceso / Pendiente)</w:t>
+            </w:r>
+          </w:p>
+        </w:tc>
+      </w:tr>
+      <w:tr>
+        <w:trPr>
+          <w:jc w:val="center"/>
+        </w:trPr>
+        <w:tc>
+          <w:tcPr>
+            <w:tcW w:w="2955" w:type="dxa"/>
+            <w:vAlign w:val="center"/>
+          </w:tcPr>
+          <w:p>
+            <w:pPr>
+              <w:rPr>
+                <w:rFonts w:ascii="Arial" w:hAnsi="Arial" w:cs="Arial"/>
+                <w:sz w:val="24"/>
+                <w:szCs w:val="24"/>
+              </w:rPr>
+            </w:pPr>
+            <w:r>
+              <w:rPr>
+                <w:rFonts w:ascii="Arial" w:hAnsi="Arial" w:cs="Arial"/>
+                <w:sz w:val="24"/>
+                <w:szCs w:val="24"/>
+              </w:rPr>
+              <w:t>Bitácora</w:t>
+            </w:r>
+          </w:p>
+        </w:tc>
+        <w:tc>
+          <w:tcPr>
+            <w:tcW w:w="2004" w:type="dxa"/>
+            <w:vAlign w:val="center"/>
+          </w:tcPr>
+          <w:p>
+            <w:pPr>
+              <w:rPr>
+                <w:rFonts w:ascii="Arial" w:hAnsi="Arial" w:cs="Arial"/>
+                <w:sz w:val="24"/>
+                <w:szCs w:val="24"/>
+              </w:rPr>
+            </w:pPr>
+            <w:r>
+              <w:rPr>
+                <w:rFonts w:ascii="Arial" w:hAnsi="Arial" w:cs="Arial"/>
+                <w:sz w:val="24"/>
+                <w:szCs w:val="24"/>
+              </w:rPr>
+              <w:t>Fernanda</w:t>
+            </w:r>
+            <w:r>
+              <w:rPr>
+                <w:rFonts w:ascii="Arial" w:hAnsi="Arial" w:cs="Arial"/>
+                <w:sz w:val="24"/>
+                <w:szCs w:val="24"/>
+              </w:rPr>
+              <w:t xml:space="preserve"> </w:t>
+            </w:r>
+            <w:r>
+              <w:rPr>
+                <w:rFonts w:ascii="Arial" w:hAnsi="Arial" w:cs="Arial"/>
+                <w:sz w:val="24"/>
+                <w:szCs w:val="24"/>
+              </w:rPr>
+              <w:t>Álvarez</w:t>
+            </w:r>
+          </w:p>
+        </w:tc>
+        <w:tc>
+          <w:tcPr>
+            <w:tcW w:w="1150" w:type="dxa"/>
+            <w:vAlign w:val="center"/>
+          </w:tcPr>
+          <w:p>
+            <w:pPr>
+              <w:rPr>
+                <w:rFonts w:ascii="Arial" w:hAnsi="Arial" w:cs="Arial"/>
+                <w:sz w:val="24"/>
+                <w:szCs w:val="24"/>
+              </w:rPr>
+            </w:pPr>
+            <w:r>
+              <w:rPr>
+                <w:rFonts w:ascii="Arial" w:hAnsi="Arial" w:cs="Arial"/>
+                <w:sz w:val="24"/>
+                <w:szCs w:val="24"/>
+              </w:rPr>
+              <w:t>8</w:t>
+            </w:r>
+            <w:r>
+              <w:rPr>
+                <w:rFonts w:ascii="Arial" w:hAnsi="Arial" w:cs="Arial"/>
+                <w:sz w:val="24"/>
+                <w:szCs w:val="24"/>
+              </w:rPr>
+              <w:t>:</w:t>
+            </w:r>
+            <w:r>
+              <w:rPr>
+                <w:rFonts w:ascii="Arial" w:hAnsi="Arial" w:cs="Arial"/>
+                <w:sz w:val="24"/>
+                <w:szCs w:val="24"/>
+              </w:rPr>
+              <w:t>1</w:t>
+            </w:r>
+            <w:r>
+              <w:rPr>
+                <w:rFonts w:ascii="Arial" w:hAnsi="Arial" w:cs="Arial"/>
+                <w:sz w:val="24"/>
+                <w:szCs w:val="24"/>
+              </w:rPr>
+              <w:t>0</w:t>
+            </w:r>
+            <w:r>
+              <w:rPr>
+                <w:rFonts w:ascii="Arial" w:hAnsi="Arial" w:cs="Arial"/>
+                <w:sz w:val="24"/>
+                <w:szCs w:val="24"/>
+              </w:rPr>
+              <w:t xml:space="preserve"> a</w:t>
+            </w:r>
+            <w:r>
+              <w:rPr>
+                <w:rFonts w:ascii="Arial" w:hAnsi="Arial" w:cs="Arial"/>
+                <w:sz w:val="24"/>
+                <w:szCs w:val="24"/>
+              </w:rPr>
+              <w:t>m</w:t>
+            </w:r>
+          </w:p>
+        </w:tc>
+        <w:tc>
+          <w:tcPr>
+            <w:tcW w:w="1535" w:type="dxa"/>
+            <w:vAlign w:val="center"/>
+          </w:tcPr>
+          <w:p>
+            <w:pPr>
+              <w:rPr>
+                <w:rFonts w:ascii="Arial" w:hAnsi="Arial" w:cs="Arial"/>
+                <w:sz w:val="24"/>
+                <w:szCs w:val="24"/>
+              </w:rPr>
+            </w:pPr>
+            <w:r>
+              <w:rPr>
+                <w:rFonts w:ascii="Arial" w:hAnsi="Arial" w:cs="Arial"/>
+                <w:sz w:val="24"/>
+                <w:szCs w:val="24"/>
+              </w:rPr>
+              <w:t>9:</w:t>
+            </w:r>
+            <w:r>
+              <w:rPr>
+                <w:rFonts w:ascii="Arial" w:hAnsi="Arial" w:cs="Arial"/>
+                <w:sz w:val="24"/>
+                <w:szCs w:val="24"/>
+              </w:rPr>
+              <w:t>25</w:t>
+            </w:r>
+            <w:r>
+              <w:rPr>
+                <w:rFonts w:ascii="Arial" w:hAnsi="Arial" w:cs="Arial"/>
+                <w:sz w:val="24"/>
+                <w:szCs w:val="24"/>
+              </w:rPr>
+              <w:t xml:space="preserve"> a</w:t>
+            </w:r>
+            <w:r>
+              <w:rPr>
+                <w:rFonts w:ascii="Arial" w:hAnsi="Arial" w:cs="Arial"/>
+                <w:sz w:val="24"/>
+                <w:szCs w:val="24"/>
+              </w:rPr>
+              <w:t>m</w:t>
+            </w:r>
+          </w:p>
+        </w:tc>
+        <w:tc>
+          <w:tcPr>
+            <w:tcW w:w="2480" w:type="dxa"/>
+            <w:vAlign w:val="center"/>
+          </w:tcPr>
+          <w:p>
+            <w:pPr>
+              <w:rPr>
+                <w:rFonts w:ascii="Arial" w:hAnsi="Arial" w:cs="Arial"/>
+                <w:sz w:val="24"/>
+                <w:szCs w:val="24"/>
+              </w:rPr>
+            </w:pPr>
+            <w:r>
+              <w:rPr>
+                <w:rFonts w:ascii="Arial" w:hAnsi="Arial" w:cs="Arial"/>
+                <w:sz w:val="24"/>
+                <w:szCs w:val="24"/>
+              </w:rPr>
+              <w:t>Completado</w:t>
+            </w:r>
+          </w:p>
+        </w:tc>
+      </w:tr>
+      <w:tr>
+        <w:trPr>
+          <w:jc w:val="center"/>
+        </w:trPr>
+        <w:tc>
+          <w:tcPr>
+            <w:tcW w:w="2955" w:type="dxa"/>
+            <w:vAlign w:val="center"/>
+          </w:tcPr>
+          <w:p>
+            <w:pPr>
+              <w:rPr>
+                <w:rFonts w:ascii="Arial" w:hAnsi="Arial" w:cs="Arial"/>
+                <w:sz w:val="24"/>
+                <w:szCs w:val="24"/>
+              </w:rPr>
+            </w:pPr>
+            <w:r>
+              <w:rPr>
+                <w:rFonts w:ascii="Arial" w:hAnsi="Arial" w:cs="Arial"/>
+                <w:sz w:val="24"/>
+                <w:szCs w:val="24"/>
+              </w:rPr>
+              <w:t xml:space="preserve">Agregar </w:t>
+            </w:r>
+            <w:r>
+              <w:rPr>
+                <w:rFonts w:ascii="Arial" w:hAnsi="Arial" w:cs="Arial"/>
+                <w:sz w:val="24"/>
+                <w:szCs w:val="24"/>
+              </w:rPr>
+              <w:t>EDT</w:t>
+            </w:r>
+            <w:r>
+              <w:rPr>
+                <w:rFonts w:ascii="Arial" w:hAnsi="Arial" w:cs="Arial"/>
+                <w:sz w:val="24"/>
+                <w:szCs w:val="24"/>
+              </w:rPr>
+              <w:t xml:space="preserve"> </w:t>
+            </w:r>
+            <w:r>
+              <w:rPr>
+                <w:rFonts w:ascii="Arial" w:hAnsi="Arial" w:cs="Arial"/>
+                <w:sz w:val="24"/>
+                <w:szCs w:val="24"/>
+              </w:rPr>
+              <w:t xml:space="preserve">a documentación </w:t>
+            </w:r>
+          </w:p>
+        </w:tc>
+        <w:tc>
+          <w:tcPr>
+            <w:tcW w:w="2004" w:type="dxa"/>
+            <w:vAlign w:val="center"/>
+          </w:tcPr>
+          <w:p>
+            <w:pPr>
+              <w:rPr>
+                <w:rFonts w:ascii="Arial" w:hAnsi="Arial" w:cs="Arial"/>
+                <w:sz w:val="24"/>
+                <w:szCs w:val="24"/>
+              </w:rPr>
+            </w:pPr>
+            <w:r>
+              <w:rPr>
+                <w:rFonts w:ascii="Arial" w:hAnsi="Arial" w:cs="Arial"/>
+                <w:sz w:val="24"/>
+                <w:szCs w:val="24"/>
+              </w:rPr>
+              <w:t>Leslie Benítez</w:t>
+            </w:r>
+          </w:p>
+        </w:tc>
+        <w:tc>
+          <w:tcPr>
+            <w:tcW w:w="1150" w:type="dxa"/>
+            <w:vAlign w:val="center"/>
+          </w:tcPr>
+          <w:p>
+            <w:pPr>
+              <w:rPr>
+                <w:rFonts w:ascii="Arial" w:hAnsi="Arial" w:cs="Arial"/>
+                <w:sz w:val="24"/>
+                <w:szCs w:val="24"/>
+              </w:rPr>
+            </w:pPr>
+            <w:r>
+              <w:rPr>
+                <w:rFonts w:ascii="Arial" w:hAnsi="Arial" w:cs="Arial"/>
+                <w:sz w:val="24"/>
+                <w:szCs w:val="24"/>
+              </w:rPr>
+              <w:t>8:1</w:t>
+            </w:r>
+            <w:r>
+              <w:rPr>
+                <w:rFonts w:ascii="Arial" w:hAnsi="Arial" w:cs="Arial"/>
+                <w:sz w:val="24"/>
+                <w:szCs w:val="24"/>
+              </w:rPr>
+              <w:t>0</w:t>
+            </w:r>
+            <w:r>
+              <w:rPr>
+                <w:rFonts w:ascii="Arial" w:hAnsi="Arial" w:cs="Arial"/>
+                <w:sz w:val="24"/>
+                <w:szCs w:val="24"/>
+              </w:rPr>
+              <w:t xml:space="preserve"> am</w:t>
+            </w:r>
+          </w:p>
+        </w:tc>
+        <w:tc>
+          <w:tcPr>
+            <w:tcW w:w="1535" w:type="dxa"/>
+            <w:vAlign w:val="center"/>
+          </w:tcPr>
+          <w:p>
+            <w:pPr>
+              <w:rPr>
+                <w:rFonts w:ascii="Arial" w:hAnsi="Arial" w:cs="Arial"/>
+                <w:sz w:val="24"/>
+                <w:szCs w:val="24"/>
+              </w:rPr>
+            </w:pPr>
+            <w:r>
+              <w:rPr>
+                <w:rFonts w:ascii="Arial" w:hAnsi="Arial" w:cs="Arial"/>
+                <w:sz w:val="24"/>
+                <w:szCs w:val="24"/>
+              </w:rPr>
+              <w:t>8:</w:t>
+            </w:r>
+            <w:r>
+              <w:rPr>
+                <w:rFonts w:ascii="Arial" w:hAnsi="Arial" w:cs="Arial"/>
+                <w:sz w:val="24"/>
+                <w:szCs w:val="24"/>
+              </w:rPr>
+              <w:t>40</w:t>
+            </w:r>
+            <w:r>
+              <w:rPr>
+                <w:rFonts w:ascii="Arial" w:hAnsi="Arial" w:cs="Arial"/>
+                <w:sz w:val="24"/>
+                <w:szCs w:val="24"/>
+              </w:rPr>
+              <w:t xml:space="preserve"> am</w:t>
+            </w:r>
+          </w:p>
+        </w:tc>
+        <w:tc>
+          <w:tcPr>
+            <w:tcW w:w="2480" w:type="dxa"/>
+            <w:vAlign w:val="center"/>
+          </w:tcPr>
+          <w:p>
+            <w:pPr>
+              <w:rPr>
+                <w:rFonts w:ascii="Arial" w:hAnsi="Arial" w:cs="Arial"/>
+                <w:sz w:val="24"/>
+                <w:szCs w:val="24"/>
+              </w:rPr>
+            </w:pPr>
+            <w:r>
+              <w:rPr>
+                <w:rFonts w:ascii="Arial" w:hAnsi="Arial" w:cs="Arial"/>
+                <w:sz w:val="24"/>
+                <w:szCs w:val="24"/>
+              </w:rPr>
+              <w:t>Completado</w:t>
+            </w:r>
+          </w:p>
+        </w:tc>
+      </w:tr>
+      <w:tr>
+        <w:trPr>
+          <w:jc w:val="center"/>
+        </w:trPr>
+        <w:tc>
+          <w:tcPr>
+            <w:tcW w:w="2955" w:type="dxa"/>
+            <w:vAlign w:val="center"/>
+          </w:tcPr>
+          <w:p>
+            <w:pPr>
+              <w:rPr>
+                <w:rFonts w:ascii="Arial" w:hAnsi="Arial" w:cs="Arial"/>
+                <w:sz w:val="24"/>
+                <w:szCs w:val="24"/>
+              </w:rPr>
+            </w:pPr>
+            <w:r>
+              <w:rPr>
+                <w:rFonts w:ascii="Arial" w:hAnsi="Arial" w:cs="Arial"/>
+                <w:sz w:val="24"/>
+                <w:szCs w:val="24"/>
+              </w:rPr>
+              <w:t>Agregar cronograma a documentación</w:t>
+            </w:r>
+          </w:p>
+        </w:tc>
+        <w:tc>
+          <w:tcPr>
+            <w:tcW w:w="2004" w:type="dxa"/>
+            <w:vAlign w:val="center"/>
+          </w:tcPr>
+          <w:p>
+            <w:pPr>
+              <w:rPr>
+                <w:rFonts w:ascii="Arial" w:hAnsi="Arial" w:cs="Arial"/>
+                <w:sz w:val="24"/>
+                <w:szCs w:val="24"/>
+              </w:rPr>
+            </w:pPr>
+            <w:r>
+              <w:rPr>
+                <w:rFonts w:ascii="Arial" w:hAnsi="Arial" w:cs="Arial"/>
+                <w:sz w:val="24"/>
+                <w:szCs w:val="24"/>
+              </w:rPr>
+              <w:t>Leonardo Merino</w:t>
+            </w:r>
+          </w:p>
+        </w:tc>
+        <w:tc>
+          <w:tcPr>
+            <w:tcW w:w="1150" w:type="dxa"/>
+            <w:vAlign w:val="center"/>
+          </w:tcPr>
+          <w:p>
+            <w:pPr>
+              <w:rPr>
+                <w:rFonts w:ascii="Arial" w:hAnsi="Arial" w:cs="Arial"/>
+                <w:sz w:val="24"/>
+                <w:szCs w:val="24"/>
+              </w:rPr>
+            </w:pPr>
+            <w:r>
+              <w:rPr>
+                <w:rFonts w:ascii="Arial" w:hAnsi="Arial" w:cs="Arial"/>
+                <w:sz w:val="24"/>
+                <w:szCs w:val="24"/>
+              </w:rPr>
+              <w:t>8</w:t>
+            </w:r>
+            <w:r>
+              <w:rPr>
+                <w:rFonts w:ascii="Arial" w:hAnsi="Arial" w:cs="Arial"/>
+                <w:sz w:val="24"/>
+                <w:szCs w:val="24"/>
+              </w:rPr>
+              <w:t>:</w:t>
+            </w:r>
+            <w:r>
+              <w:rPr>
+                <w:rFonts w:ascii="Arial" w:hAnsi="Arial" w:cs="Arial"/>
+                <w:sz w:val="24"/>
+                <w:szCs w:val="24"/>
+              </w:rPr>
+              <w:t>1</w:t>
+            </w:r>
+            <w:r>
+              <w:rPr>
+                <w:rFonts w:ascii="Arial" w:hAnsi="Arial" w:cs="Arial"/>
+                <w:sz w:val="24"/>
+                <w:szCs w:val="24"/>
+              </w:rPr>
+              <w:t>0</w:t>
+            </w:r>
+            <w:r>
+              <w:rPr>
+                <w:rFonts w:ascii="Arial" w:hAnsi="Arial" w:cs="Arial"/>
+                <w:sz w:val="24"/>
+                <w:szCs w:val="24"/>
+              </w:rPr>
+              <w:t xml:space="preserve"> a</w:t>
+            </w:r>
+            <w:r>
+              <w:rPr>
+                <w:rFonts w:ascii="Arial" w:hAnsi="Arial" w:cs="Arial"/>
+                <w:sz w:val="24"/>
+                <w:szCs w:val="24"/>
+              </w:rPr>
+              <w:t>m</w:t>
+            </w:r>
+          </w:p>
+        </w:tc>
+        <w:tc>
+          <w:tcPr>
+            <w:tcW w:w="1535" w:type="dxa"/>
+            <w:vAlign w:val="center"/>
+          </w:tcPr>
+          <w:p>
+            <w:pPr>
+              <w:rPr>
+                <w:rFonts w:ascii="Arial" w:hAnsi="Arial" w:cs="Arial"/>
+                <w:sz w:val="24"/>
+                <w:szCs w:val="24"/>
+              </w:rPr>
+            </w:pPr>
+            <w:r>
+              <w:rPr>
+                <w:rFonts w:ascii="Arial" w:hAnsi="Arial" w:cs="Arial"/>
+                <w:sz w:val="24"/>
+                <w:szCs w:val="24"/>
+              </w:rPr>
+              <w:t>9</w:t>
+            </w:r>
+            <w:r>
+              <w:rPr>
+                <w:rFonts w:ascii="Arial" w:hAnsi="Arial" w:cs="Arial"/>
+                <w:sz w:val="24"/>
+                <w:szCs w:val="24"/>
+              </w:rPr>
+              <w:t>:00</w:t>
+            </w:r>
+            <w:r>
+              <w:rPr>
+                <w:rFonts w:ascii="Arial" w:hAnsi="Arial" w:cs="Arial"/>
+                <w:sz w:val="24"/>
+                <w:szCs w:val="24"/>
+              </w:rPr>
+              <w:t xml:space="preserve"> a</w:t>
+            </w:r>
+            <w:r>
+              <w:rPr>
+                <w:rFonts w:ascii="Arial" w:hAnsi="Arial" w:cs="Arial"/>
+                <w:sz w:val="24"/>
+                <w:szCs w:val="24"/>
+              </w:rPr>
+              <w:t>m</w:t>
+            </w:r>
+          </w:p>
+        </w:tc>
+        <w:tc>
+          <w:tcPr>
+            <w:tcW w:w="2480" w:type="dxa"/>
+            <w:vAlign w:val="center"/>
+          </w:tcPr>
+          <w:p>
+            <w:pPr>
+              <w:rPr>
+                <w:rFonts w:ascii="Arial" w:hAnsi="Arial" w:cs="Arial"/>
+                <w:sz w:val="24"/>
+                <w:szCs w:val="24"/>
+              </w:rPr>
+            </w:pPr>
+            <w:r>
+              <w:rPr>
+                <w:rFonts w:ascii="Arial" w:hAnsi="Arial" w:cs="Arial"/>
+                <w:sz w:val="24"/>
+                <w:szCs w:val="24"/>
+              </w:rPr>
+              <w:t>En proceso</w:t>
+            </w:r>
+          </w:p>
+        </w:tc>
+      </w:tr>
+      <w:tr>
+        <w:trPr>
+          <w:jc w:val="center"/>
+        </w:trPr>
+        <w:tc>
+          <w:tcPr>
+            <w:tcW w:w="2955" w:type="dxa"/>
+            <w:vAlign w:val="center"/>
+          </w:tcPr>
+          <w:p>
+            <w:pPr>
+              <w:rPr>
+                <w:rFonts w:ascii="Arial" w:hAnsi="Arial" w:cs="Arial"/>
+                <w:sz w:val="24"/>
+                <w:szCs w:val="24"/>
+              </w:rPr>
+            </w:pPr>
+            <w:r>
+              <w:rPr>
+                <w:rFonts w:ascii="Arial" w:hAnsi="Arial" w:cs="Arial"/>
+                <w:sz w:val="24"/>
+                <w:szCs w:val="24"/>
+              </w:rPr>
+              <w:t xml:space="preserve">Agregar </w:t>
+            </w:r>
+            <w:r>
+              <w:rPr>
+                <w:rFonts w:ascii="Arial" w:hAnsi="Arial" w:cs="Arial"/>
+                <w:sz w:val="24"/>
+                <w:szCs w:val="24"/>
+              </w:rPr>
+              <w:t xml:space="preserve">roles de equipo a documentación </w:t>
+            </w:r>
+          </w:p>
+        </w:tc>
+        <w:tc>
+          <w:tcPr>
+            <w:tcW w:w="2004" w:type="dxa"/>
+            <w:vAlign w:val="center"/>
+          </w:tcPr>
+          <w:p>
+            <w:pPr>
+              <w:rPr>
+                <w:rFonts w:ascii="Arial" w:hAnsi="Arial" w:cs="Arial"/>
+                <w:sz w:val="24"/>
+                <w:szCs w:val="24"/>
+              </w:rPr>
+            </w:pPr>
+            <w:r>
+              <w:rPr>
+                <w:rFonts w:ascii="Arial" w:hAnsi="Arial" w:cs="Arial"/>
+                <w:sz w:val="24"/>
+                <w:szCs w:val="24"/>
+              </w:rPr>
+              <w:t>Fernanda Álvarez</w:t>
+            </w:r>
+          </w:p>
+        </w:tc>
+        <w:tc>
+          <w:tcPr>
+            <w:tcW w:w="1150" w:type="dxa"/>
+            <w:vAlign w:val="center"/>
+          </w:tcPr>
+          <w:p>
+            <w:pPr>
+              <w:rPr>
+                <w:rFonts w:ascii="Arial" w:hAnsi="Arial" w:cs="Arial"/>
+                <w:sz w:val="24"/>
+                <w:szCs w:val="24"/>
+              </w:rPr>
+            </w:pPr>
+            <w:r>
+              <w:rPr>
+                <w:rFonts w:ascii="Arial" w:hAnsi="Arial" w:cs="Arial"/>
+                <w:sz w:val="24"/>
+                <w:szCs w:val="24"/>
+              </w:rPr>
+              <w:t>8:25 am</w:t>
+            </w:r>
+          </w:p>
+        </w:tc>
+        <w:tc>
+          <w:tcPr>
+            <w:tcW w:w="1535" w:type="dxa"/>
+            <w:vAlign w:val="center"/>
+          </w:tcPr>
+          <w:p>
+            <w:pPr>
+              <w:rPr>
+                <w:rFonts w:ascii="Arial" w:hAnsi="Arial" w:cs="Arial"/>
+                <w:sz w:val="24"/>
+                <w:szCs w:val="24"/>
+              </w:rPr>
+            </w:pPr>
+            <w:r>
+              <w:rPr>
+                <w:rFonts w:ascii="Arial" w:hAnsi="Arial" w:cs="Arial"/>
+                <w:sz w:val="24"/>
+                <w:szCs w:val="24"/>
+              </w:rPr>
+              <w:t>9:00</w:t>
+            </w:r>
+          </w:p>
+        </w:tc>
+        <w:tc>
+          <w:tcPr>
+            <w:tcW w:w="2480" w:type="dxa"/>
+            <w:vAlign w:val="center"/>
+          </w:tcPr>
+          <w:p>
+            <w:pPr>
+              <w:rPr>
+                <w:rFonts w:ascii="Arial" w:hAnsi="Arial" w:cs="Arial"/>
+                <w:sz w:val="24"/>
+                <w:szCs w:val="24"/>
+              </w:rPr>
+            </w:pPr>
+            <w:r>
+              <w:rPr>
+                <w:rFonts w:ascii="Arial" w:hAnsi="Arial" w:cs="Arial"/>
+                <w:sz w:val="24"/>
+                <w:szCs w:val="24"/>
+              </w:rPr>
+              <w:t>En proceso</w:t>
+            </w:r>
+          </w:p>
+        </w:tc>
+      </w:tr>
+    </w:tbl>
+    <w:p/>
+    <w:p>
+      <w:pPr>
+        <w:pStyle w:val="titulo1"/>
+        <w:outlineLvl w:val="2"/>
+      </w:pPr>
+      <w:r>
+        <w:rPr>
+          <w:sz w:val="32"/>
+          <w:szCs w:val="32"/>
+        </w:rPr>
+        <w:lastRenderedPageBreak/>
+        <w:t>Gestión de Riesgos e Incidencias</w:t>
+      </w:r>
+    </w:p>
+    <w:tbl>
+      <w:tblPr>
+        <w:tblStyle w:val="Tablaconcuadrcula"/>
+        <w:tblW w:w="0" w:type="auto"/>
+        <w:jc w:val="center"/>
+        <w:tblBorders>
+          <w:top w:val="single" w:sz="4" w:space="0" w:color="7F7F7F" w:themeColor="text1" w:themeTint="80"/>
+          <w:left w:val="single" w:sz="4" w:space="0" w:color="7F7F7F" w:themeColor="text1" w:themeTint="80"/>
+          <w:bottom w:val="single" w:sz="4" w:space="0" w:color="7F7F7F" w:themeColor="text1" w:themeTint="80"/>
+          <w:right w:val="single" w:sz="4" w:space="0" w:color="7F7F7F" w:themeColor="text1" w:themeTint="80"/>
+          <w:insideH w:val="single" w:sz="4" w:space="0" w:color="7F7F7F" w:themeColor="text1" w:themeTint="80"/>
+          <w:insideV w:val="single" w:sz="4" w:space="0" w:color="7F7F7F" w:themeColor="text1" w:themeTint="80"/>
+        </w:tblBorders>
+        <w:tblLook w:val="04A0" w:firstRow="1" w:lastRow="0" w:firstColumn="1" w:lastColumn="0" w:noHBand="0" w:noVBand="1"/>
+      </w:tblPr>
+      <w:tblGrid>
+        <w:gridCol w:w="2834"/>
+        <w:gridCol w:w="2924"/>
+        <w:gridCol w:w="3592"/>
+      </w:tblGrid>
+      <w:tr>
+        <w:trPr>
+          <w:trHeight w:val="300"/>
+          <w:jc w:val="center"/>
+        </w:trPr>
+        <w:tc>
+          <w:tcPr>
+            <w:tcW w:w="2942" w:type="dxa"/>
+            <w:shd w:val="clear" w:color="auto" w:fill="262626" w:themeFill="text1" w:themeFillTint="D9"/>
+            <w:vAlign w:val="center"/>
+          </w:tcPr>
+          <w:p>
+            <w:pPr>
+              <w:jc w:val="center"/>
+              <w:rPr>
+                <w:rFonts w:ascii="Arial" w:hAnsi="Arial" w:cs="Arial"/>
+                <w:b/>
+                <w:bCs/>
+                <w:sz w:val="24"/>
+                <w:szCs w:val="24"/>
+              </w:rPr>
+            </w:pPr>
+            <w:r>
+              <w:rPr>
+                <w:rFonts w:ascii="Arial" w:hAnsi="Arial" w:cs="Arial"/>
+                <w:b/>
+                <w:bCs/>
+                <w:sz w:val="24"/>
+                <w:szCs w:val="24"/>
+              </w:rPr>
+              <w:t>Riesgo / Problema detectado</w:t>
+            </w:r>
+          </w:p>
+        </w:tc>
+        <w:tc>
+          <w:tcPr>
+            <w:tcW w:w="2943" w:type="dxa"/>
+            <w:shd w:val="clear" w:color="auto" w:fill="262626" w:themeFill="text1" w:themeFillTint="D9"/>
+            <w:vAlign w:val="center"/>
+          </w:tcPr>
+          <w:p>
+            <w:pPr>
+              <w:jc w:val="center"/>
+              <w:rPr>
+                <w:rFonts w:ascii="Arial" w:hAnsi="Arial" w:cs="Arial"/>
+                <w:b/>
+                <w:bCs/>
+                <w:sz w:val="24"/>
+                <w:szCs w:val="24"/>
+              </w:rPr>
+            </w:pPr>
+            <w:r>
+              <w:rPr>
+                <w:rFonts w:ascii="Arial" w:hAnsi="Arial" w:cs="Arial"/>
+                <w:b/>
+                <w:bCs/>
+                <w:sz w:val="24"/>
+                <w:szCs w:val="24"/>
+              </w:rPr>
+              <w:t>Impacto en alcance/tiempo/costo</w:t>
+            </w:r>
+          </w:p>
+        </w:tc>
+        <w:tc>
+          <w:tcPr>
+            <w:tcW w:w="3749" w:type="dxa"/>
+            <w:shd w:val="clear" w:color="auto" w:fill="262626" w:themeFill="text1" w:themeFillTint="D9"/>
+            <w:vAlign w:val="center"/>
+          </w:tcPr>
+          <w:p>
+            <w:pPr>
+              <w:jc w:val="center"/>
+              <w:rPr>
+                <w:rFonts w:ascii="Arial" w:hAnsi="Arial" w:cs="Arial"/>
+                <w:b/>
+                <w:bCs/>
+                <w:sz w:val="24"/>
+                <w:szCs w:val="24"/>
+              </w:rPr>
+            </w:pPr>
+            <w:r>
+              <w:rPr>
+                <w:rFonts w:ascii="Arial" w:hAnsi="Arial" w:cs="Arial"/>
+                <w:b/>
+                <w:bCs/>
+                <w:sz w:val="24"/>
+                <w:szCs w:val="24"/>
+              </w:rPr>
+              <w:t>Acción correctiva o preventiva</w:t>
+            </w:r>
+          </w:p>
+        </w:tc>
+      </w:tr>
+      <w:tr>
+        <w:trPr>
+          <w:trHeight w:val="300"/>
+          <w:jc w:val="center"/>
+        </w:trPr>
+        <w:tc>
+          <w:tcPr>
+            <w:tcW w:w="2942" w:type="dxa"/>
+            <w:vAlign w:val="center"/>
+          </w:tcPr>
+          <w:p>
+            <w:pPr>
+              <w:rPr>
+                <w:rFonts w:ascii="Arial" w:hAnsi="Arial" w:cs="Arial"/>
+                <w:sz w:val="24"/>
+                <w:szCs w:val="24"/>
+              </w:rPr>
+            </w:pPr>
+            <w:r>
+              <w:rPr>
+                <w:rFonts w:ascii="Arial" w:hAnsi="Arial" w:cs="Arial"/>
+                <w:sz w:val="24"/>
+                <w:szCs w:val="24"/>
+              </w:rPr>
+              <w:t>--</w:t>
+            </w:r>
+          </w:p>
+        </w:tc>
+        <w:tc>
+          <w:tcPr>
+            <w:tcW w:w="2943" w:type="dxa"/>
+            <w:vAlign w:val="center"/>
+          </w:tcPr>
+          <w:p>
+            <w:pPr>
+              <w:jc w:val="center"/>
+              <w:rPr>
+                <w:rFonts w:ascii="Arial" w:hAnsi="Arial" w:cs="Arial"/>
+                <w:sz w:val="24"/>
+                <w:szCs w:val="24"/>
+              </w:rPr>
+            </w:pPr>
+            <w:r>
+              <w:rPr>
+                <w:rFonts w:ascii="Arial" w:hAnsi="Arial" w:cs="Arial"/>
+                <w:sz w:val="24"/>
+                <w:szCs w:val="24"/>
+              </w:rPr>
+              <w:t>--</w:t>
+            </w:r>
+          </w:p>
+        </w:tc>
+        <w:tc>
+          <w:tcPr>
+            <w:tcW w:w="3749" w:type="dxa"/>
+            <w:vAlign w:val="center"/>
+          </w:tcPr>
+          <w:p>
+            <w:r>
+              <w:rPr>
+                <w:rFonts w:ascii="Arial" w:hAnsi="Arial" w:cs="Arial"/>
+                <w:sz w:val="24"/>
+                <w:szCs w:val="24"/>
+              </w:rPr>
+              <w:t>--</w:t>
+            </w:r>
+          </w:p>
+        </w:tc>
+      </w:tr>
+    </w:tbl>
+    <w:p/>
+    <w:p>
+      <w:r>
+        <w:br w:type="page"/>
+      </w:r>
+    </w:p>
+    <w:tbl>
+      <w:tblPr>
+        <w:tblStyle w:val="Tablaconcuadrcula"/>
+        <w:tblW w:w="9634" w:type="dxa"/>
+        <w:jc w:val="center"/>
+        <w:tblBorders>
+          <w:top w:val="single" w:sz="4" w:space="0" w:color="7F7F7F" w:themeColor="text1" w:themeTint="80"/>
+          <w:left w:val="single" w:sz="4" w:space="0" w:color="7F7F7F" w:themeColor="text1" w:themeTint="80"/>
+          <w:bottom w:val="single" w:sz="4" w:space="0" w:color="7F7F7F" w:themeColor="text1" w:themeTint="80"/>
+          <w:right w:val="single" w:sz="4" w:space="0" w:color="7F7F7F" w:themeColor="text1" w:themeTint="80"/>
+          <w:insideH w:val="single" w:sz="4" w:space="0" w:color="7F7F7F" w:themeColor="text1" w:themeTint="80"/>
+        </w:tblBorders>
+        <w:tblCellMar>
+          <w:top w:w="57" w:type="dxa"/>
+          <w:bottom w:w="57" w:type="dxa"/>
+        </w:tblCellMar>
+        <w:tblLook w:val="04A0" w:firstRow="1" w:lastRow="0" w:firstColumn="1" w:lastColumn="0" w:noHBand="0" w:noVBand="1"/>
+      </w:tblPr>
+      <w:tblGrid>
+        <w:gridCol w:w="5098"/>
+        <w:gridCol w:w="4536"/>
+      </w:tblGrid>
+      <w:tr>
+        <w:trPr>
+          <w:trHeight w:val="583"/>
+          <w:jc w:val="center"/>
+        </w:trPr>
+        <w:tc>
+          <w:tcPr>
+            <w:tcW w:w="9634" w:type="dxa"/>
+            <w:gridSpan w:val="2"/>
+            <w:shd w:val="clear" w:color="auto" w:fill="262626" w:themeFill="text1" w:themeFillTint="D9"/>
+            <w:vAlign w:val="center"/>
+          </w:tcPr>
+          <w:p>
+            <w:pPr>
+              <w:pStyle w:val="Ttulo2"/>
+              <w:rPr>
+                <w:rFonts w:ascii="Aptos" w:hAnsi="Aptos"/>
+                <w:b/>
+                <w:bCs/>
+                <w:color w:val="FFFFFF" w:themeColor="background1"/>
+                <w:sz w:val="28"/>
+                <w:szCs w:val="28"/>
+              </w:rPr>
+            </w:pPr>
+            <w:r>
+              <w:rPr>
+                <w:rFonts w:ascii="Aptos" w:hAnsi="Aptos"/>
+                <w:b/>
+                <w:bCs/>
+                <w:color w:val="FFFFFF" w:themeColor="background1"/>
+                <w:sz w:val="28"/>
+                <w:szCs w:val="28"/>
+              </w:rPr>
+              <w:lastRenderedPageBreak/>
+              <w:t xml:space="preserve">Día </w:t>
+            </w:r>
+            <w:r>
+              <w:rPr>
+                <w:rFonts w:ascii="Aptos" w:hAnsi="Aptos"/>
+                <w:b/>
+                <w:bCs/>
+                <w:color w:val="FFFFFF" w:themeColor="background1"/>
+                <w:sz w:val="28"/>
+                <w:szCs w:val="28"/>
+              </w:rPr>
+              <w:t>5</w:t>
+            </w:r>
+            <w:r>
+              <w:rPr>
+                <w:rFonts w:ascii="Aptos" w:hAnsi="Aptos"/>
+                <w:b/>
+                <w:bCs/>
+                <w:color w:val="FFFFFF" w:themeColor="background1"/>
+                <w:sz w:val="28"/>
+                <w:szCs w:val="28"/>
+              </w:rPr>
+              <w:t>: Agregar EDT a documentación</w:t>
+            </w:r>
+          </w:p>
+        </w:tc>
+      </w:tr>
+      <w:tr>
+        <w:trPr>
+          <w:jc w:val="center"/>
+        </w:trPr>
+        <w:tc>
+          <w:tcPr>
+            <w:tcW w:w="9634" w:type="dxa"/>
+            <w:gridSpan w:val="2"/>
+            <w:vAlign w:val="center"/>
+          </w:tcPr>
+          <w:p>
+            <w:pPr>
+              <w:rPr>
+                <w:rFonts w:ascii="Arial" w:hAnsi="Arial" w:cs="Arial"/>
+                <w:sz w:val="24"/>
+                <w:szCs w:val="24"/>
+              </w:rPr>
+            </w:pPr>
+            <w:r>
+              <w:rPr>
+                <w:rFonts w:ascii="Arial" w:hAnsi="Arial" w:cs="Arial"/>
+                <w:b/>
+                <w:bCs/>
+                <w:sz w:val="24"/>
+                <w:szCs w:val="24"/>
+              </w:rPr>
+              <w:t xml:space="preserve">Nombre del Proyecto: </w:t>
+            </w:r>
+            <w:r>
+              <w:rPr>
+                <w:rFonts w:ascii="Arial" w:hAnsi="Arial" w:cs="Arial"/>
+                <w:sz w:val="24"/>
+                <w:szCs w:val="24"/>
+              </w:rPr>
+              <w:t>Portafolio Digital de Arquitecto</w:t>
+            </w:r>
+          </w:p>
+        </w:tc>
+      </w:tr>
+      <w:tr>
+        <w:trPr>
+          <w:jc w:val="center"/>
+        </w:trPr>
+        <w:tc>
+          <w:tcPr>
+            <w:tcW w:w="5098" w:type="dxa"/>
+            <w:vAlign w:val="center"/>
+          </w:tcPr>
+          <w:p>
+            <w:pPr>
+              <w:rPr>
+                <w:rFonts w:ascii="Arial" w:hAnsi="Arial" w:cs="Arial"/>
+                <w:b/>
+                <w:bCs/>
+                <w:sz w:val="24"/>
+                <w:szCs w:val="24"/>
+              </w:rPr>
+            </w:pPr>
+            <w:r>
+              <w:rPr>
+                <w:rFonts w:ascii="Arial" w:hAnsi="Arial" w:cs="Arial"/>
+                <w:b/>
+                <w:bCs/>
+                <w:sz w:val="24"/>
+                <w:szCs w:val="24"/>
+              </w:rPr>
+              <w:t xml:space="preserve">Equipo No.: </w:t>
+            </w:r>
+            <w:r>
+              <w:rPr>
+                <w:rFonts w:ascii="Arial" w:hAnsi="Arial" w:cs="Arial"/>
+                <w:b/>
+                <w:bCs/>
+                <w:sz w:val="24"/>
+                <w:szCs w:val="24"/>
+              </w:rPr>
+              <w:tab/>
+            </w:r>
+            <w:r>
+              <w:rPr>
+                <w:rFonts w:ascii="Arial" w:hAnsi="Arial" w:cs="Arial"/>
+                <w:sz w:val="24"/>
+                <w:szCs w:val="24"/>
+              </w:rPr>
+              <w:t>6</w:t>
+            </w:r>
+          </w:p>
+        </w:tc>
+        <w:tc>
+          <w:tcPr>
+            <w:tcW w:w="4536" w:type="dxa"/>
+            <w:vAlign w:val="center"/>
+          </w:tcPr>
+          <w:p>
+            <w:pPr>
+              <w:rPr>
+                <w:rFonts w:ascii="Arial" w:hAnsi="Arial" w:cs="Arial"/>
+                <w:b/>
+                <w:bCs/>
+                <w:sz w:val="24"/>
+                <w:szCs w:val="24"/>
+              </w:rPr>
+            </w:pPr>
+            <w:r>
+              <w:rPr>
+                <w:rFonts w:ascii="Arial" w:hAnsi="Arial" w:cs="Arial"/>
+                <w:b/>
+                <w:bCs/>
+                <w:sz w:val="24"/>
+                <w:szCs w:val="24"/>
+              </w:rPr>
+              <w:t>Fecha:</w:t>
+            </w:r>
+            <w:r>
+              <w:rPr>
+                <w:rFonts w:ascii="Arial" w:hAnsi="Arial" w:cs="Arial"/>
+                <w:b/>
+                <w:bCs/>
+                <w:sz w:val="24"/>
+                <w:szCs w:val="24"/>
+              </w:rPr>
+              <w:t xml:space="preserve"> </w:t>
+            </w:r>
+            <w:r>
+              <w:rPr>
+                <w:rFonts w:ascii="Arial" w:hAnsi="Arial" w:cs="Arial"/>
+                <w:sz w:val="24"/>
+                <w:szCs w:val="24"/>
+              </w:rPr>
+              <w:t>2</w:t>
+            </w:r>
+            <w:r>
+              <w:rPr>
+                <w:rFonts w:ascii="Arial" w:hAnsi="Arial" w:cs="Arial"/>
+                <w:sz w:val="24"/>
+                <w:szCs w:val="24"/>
+              </w:rPr>
+              <w:t>2</w:t>
+            </w:r>
+            <w:r>
+              <w:rPr>
+                <w:rFonts w:ascii="Arial" w:hAnsi="Arial" w:cs="Arial"/>
+                <w:sz w:val="24"/>
+                <w:szCs w:val="24"/>
+              </w:rPr>
+              <w:t>/0</w:t>
+            </w:r>
+            <w:r>
+              <w:rPr>
+                <w:rFonts w:ascii="Arial" w:hAnsi="Arial" w:cs="Arial"/>
+                <w:sz w:val="24"/>
+                <w:szCs w:val="24"/>
+              </w:rPr>
+              <w:t>5</w:t>
+            </w:r>
+            <w:r>
+              <w:rPr>
+                <w:rFonts w:ascii="Arial" w:hAnsi="Arial" w:cs="Arial"/>
+                <w:sz w:val="24"/>
+                <w:szCs w:val="24"/>
+              </w:rPr>
+              <w:t>/202</w:t>
+            </w:r>
+            <w:r>
+              <w:rPr>
+                <w:rFonts w:ascii="Arial" w:hAnsi="Arial" w:cs="Arial"/>
+                <w:sz w:val="24"/>
+                <w:szCs w:val="24"/>
+              </w:rPr>
+              <w:t>6</w:t>
+            </w:r>
+          </w:p>
+        </w:tc>
+      </w:tr>
+      <w:tr>
+        <w:trPr>
+          <w:jc w:val="center"/>
+        </w:trPr>
+        <w:tc>
+          <w:tcPr>
+            <w:tcW w:w="5098" w:type="dxa"/>
+            <w:vAlign w:val="center"/>
+          </w:tcPr>
+          <w:p>
+            <w:pPr>
+              <w:rPr>
+                <w:rFonts w:ascii="Arial" w:hAnsi="Arial" w:cs="Arial"/>
+                <w:b/>
+                <w:bCs/>
+                <w:sz w:val="24"/>
+                <w:szCs w:val="24"/>
+              </w:rPr>
+            </w:pPr>
+            <w:r>
+              <w:rPr>
+                <w:rFonts w:ascii="Arial" w:hAnsi="Arial" w:cs="Arial"/>
+                <w:b/>
+                <w:bCs/>
+                <w:sz w:val="24"/>
+                <w:szCs w:val="24"/>
+              </w:rPr>
+              <w:t xml:space="preserve">Número de sesión / Día de trabajo: </w:t>
+            </w:r>
+            <w:r>
+              <w:rPr>
+                <w:rFonts w:ascii="Arial" w:hAnsi="Arial" w:cs="Arial"/>
+                <w:sz w:val="24"/>
+                <w:szCs w:val="24"/>
+              </w:rPr>
+              <w:t>1</w:t>
+            </w:r>
+          </w:p>
+        </w:tc>
+        <w:tc>
+          <w:tcPr>
+            <w:tcW w:w="4536" w:type="dxa"/>
+            <w:vAlign w:val="center"/>
+          </w:tcPr>
+          <w:p>
+            <w:pPr>
+              <w:rPr>
+                <w:rFonts w:ascii="Arial" w:hAnsi="Arial" w:cs="Arial"/>
+                <w:b/>
+                <w:bCs/>
+                <w:sz w:val="24"/>
+                <w:szCs w:val="24"/>
+              </w:rPr>
+            </w:pPr>
+            <w:r>
+              <w:rPr>
+                <w:rFonts w:ascii="Arial" w:hAnsi="Arial" w:cs="Arial"/>
+                <w:b/>
+                <w:bCs/>
+                <w:sz w:val="24"/>
+                <w:szCs w:val="24"/>
+              </w:rPr>
+              <w:t xml:space="preserve">Modalidad: </w:t>
+            </w:r>
+            <w:r>
+              <w:rPr>
+                <w:rFonts w:ascii="Arial" w:hAnsi="Arial" w:cs="Arial"/>
+                <w:sz w:val="24"/>
+                <w:szCs w:val="24"/>
+              </w:rPr>
+              <w:t>Presencial</w:t>
+            </w:r>
+            <w:r>
+              <w:rPr>
+                <w:rFonts w:ascii="Arial" w:hAnsi="Arial" w:cs="Arial"/>
+                <w:sz w:val="24"/>
+                <w:szCs w:val="24"/>
+              </w:rPr>
+              <w:t xml:space="preserve"> / </w:t>
+            </w:r>
+            <w:r>
+              <w:rPr>
+                <w:rFonts w:ascii="Arial" w:hAnsi="Arial" w:cs="Arial"/>
+                <w:sz w:val="24"/>
+                <w:szCs w:val="24"/>
+                <w:shd w:val="clear" w:color="auto" w:fill="F5E4A9" w:themeFill="accent3" w:themeFillTint="66"/>
+              </w:rPr>
+              <w:t>Virtual</w:t>
+            </w:r>
+            <w:r>
+              <w:rPr>
+                <w:rFonts w:ascii="Arial" w:hAnsi="Arial" w:cs="Arial"/>
+                <w:sz w:val="24"/>
+                <w:szCs w:val="24"/>
+              </w:rPr>
+              <w:t xml:space="preserve"> / </w:t>
+            </w:r>
+            <w:r>
+              <w:rPr>
+                <w:rFonts w:ascii="Arial" w:hAnsi="Arial" w:cs="Arial"/>
+                <w:sz w:val="24"/>
+                <w:szCs w:val="24"/>
+              </w:rPr>
+              <w:t>Mixto</w:t>
+            </w:r>
+          </w:p>
+        </w:tc>
+      </w:tr>
+      <w:tr>
+        <w:trPr>
+          <w:jc w:val="center"/>
+        </w:trPr>
+        <w:tc>
+          <w:tcPr>
+            <w:tcW w:w="9634" w:type="dxa"/>
+            <w:gridSpan w:val="2"/>
+            <w:vAlign w:val="center"/>
+          </w:tcPr>
+          <w:p>
+            <w:pPr>
+              <w:rPr>
+                <w:rFonts w:ascii="Arial" w:hAnsi="Arial" w:cs="Arial"/>
+                <w:b/>
+                <w:bCs/>
+                <w:sz w:val="24"/>
+                <w:szCs w:val="24"/>
+              </w:rPr>
+            </w:pPr>
+            <w:r>
+              <w:rPr>
+                <w:rFonts w:ascii="Arial" w:hAnsi="Arial" w:cs="Arial"/>
+                <w:b/>
+                <w:bCs/>
+                <w:sz w:val="24"/>
+                <w:szCs w:val="24"/>
+              </w:rPr>
+              <w:t>Duración de la sesión:</w:t>
+            </w:r>
+            <w:r>
+              <w:rPr>
+                <w:rFonts w:ascii="Arial" w:hAnsi="Arial" w:cs="Arial"/>
+                <w:b/>
+                <w:bCs/>
+                <w:sz w:val="24"/>
+                <w:szCs w:val="24"/>
+              </w:rPr>
+              <w:t xml:space="preserve"> </w:t>
+            </w:r>
+            <w:r>
+              <w:rPr>
+                <w:rFonts w:ascii="Arial" w:hAnsi="Arial" w:cs="Arial"/>
+                <w:sz w:val="24"/>
+                <w:szCs w:val="24"/>
+              </w:rPr>
+              <w:t xml:space="preserve">50 min. </w:t>
+            </w:r>
+          </w:p>
+        </w:tc>
+      </w:tr>
+    </w:tbl>
+    <w:p>
+      <w:pPr>
+        <w:rPr>
+          <w:rFonts w:ascii="Arial" w:hAnsi="Arial" w:cs="Arial"/>
+          <w:sz w:val="24"/>
+          <w:szCs w:val="24"/>
+        </w:rPr>
+      </w:pPr>
+    </w:p>
+    <w:p>
+      <w:pPr>
+        <w:pStyle w:val="titulo1"/>
+        <w:outlineLvl w:val="2"/>
+        <w:rPr>
+          <w:sz w:val="32"/>
+          <w:szCs w:val="72"/>
+        </w:rPr>
+      </w:pPr>
+      <w:r>
+        <w:rPr>
+          <w:sz w:val="32"/>
+          <w:szCs w:val="72"/>
+        </w:rPr>
+        <w:t>Asistencia y Participación</w:t>
+      </w:r>
+    </w:p>
+    <w:tbl>
+      <w:tblPr>
+        <w:tblStyle w:val="Tablaconcuadrcula"/>
+        <w:tblW w:w="10281" w:type="dxa"/>
+        <w:jc w:val="center"/>
+        <w:tblBorders>
+          <w:top w:val="single" w:sz="4" w:space="0" w:color="7F7F7F" w:themeColor="text1" w:themeTint="80"/>
+          <w:left w:val="single" w:sz="4" w:space="0" w:color="7F7F7F" w:themeColor="text1" w:themeTint="80"/>
+          <w:bottom w:val="single" w:sz="4" w:space="0" w:color="7F7F7F" w:themeColor="text1" w:themeTint="80"/>
+          <w:right w:val="single" w:sz="4" w:space="0" w:color="7F7F7F" w:themeColor="text1" w:themeTint="80"/>
+          <w:insideH w:val="single" w:sz="4" w:space="0" w:color="7F7F7F" w:themeColor="text1" w:themeTint="80"/>
+          <w:insideV w:val="single" w:sz="4" w:space="0" w:color="7F7F7F" w:themeColor="text1" w:themeTint="80"/>
+        </w:tblBorders>
+        <w:tblCellMar>
+          <w:top w:w="57" w:type="dxa"/>
+          <w:bottom w:w="57" w:type="dxa"/>
+        </w:tblCellMar>
+        <w:tblLook w:val="04A0" w:firstRow="1" w:lastRow="0" w:firstColumn="1" w:lastColumn="0" w:noHBand="0" w:noVBand="1"/>
+      </w:tblPr>
+      <w:tblGrid>
+        <w:gridCol w:w="1538"/>
+        <w:gridCol w:w="1791"/>
+        <w:gridCol w:w="1563"/>
+        <w:gridCol w:w="3061"/>
+        <w:gridCol w:w="2328"/>
+      </w:tblGrid>
+      <w:tr>
+        <w:trPr>
+          <w:jc w:val="center"/>
+        </w:trPr>
+        <w:tc>
+          <w:tcPr>
+            <w:tcW w:w="1538" w:type="dxa"/>
+            <w:shd w:val="clear" w:color="auto" w:fill="262626" w:themeFill="text1" w:themeFillTint="D9"/>
+            <w:vAlign w:val="center"/>
+          </w:tcPr>
+          <w:p>
+            <w:pPr>
+              <w:jc w:val="center"/>
+              <w:rPr>
+                <w:rFonts w:ascii="Arial" w:hAnsi="Arial" w:cs="Arial"/>
+                <w:b/>
+                <w:bCs/>
+                <w:sz w:val="24"/>
+                <w:szCs w:val="24"/>
+              </w:rPr>
+            </w:pPr>
+            <w:r>
+              <w:rPr>
+                <w:rFonts w:ascii="Arial" w:hAnsi="Arial" w:cs="Arial"/>
+                <w:b/>
+                <w:bCs/>
+                <w:sz w:val="24"/>
+                <w:szCs w:val="24"/>
+              </w:rPr>
+              <w:t>Integrante</w:t>
+            </w:r>
+          </w:p>
+        </w:tc>
+        <w:tc>
+          <w:tcPr>
+            <w:tcW w:w="1791" w:type="dxa"/>
+            <w:shd w:val="clear" w:color="auto" w:fill="262626" w:themeFill="text1" w:themeFillTint="D9"/>
+            <w:vAlign w:val="center"/>
+          </w:tcPr>
+          <w:p>
+            <w:pPr>
+              <w:jc w:val="center"/>
+              <w:rPr>
+                <w:rFonts w:ascii="Arial" w:hAnsi="Arial" w:cs="Arial"/>
+                <w:b/>
+                <w:bCs/>
+                <w:sz w:val="24"/>
+                <w:szCs w:val="24"/>
+              </w:rPr>
+            </w:pPr>
+            <w:r>
+              <w:rPr>
+                <w:rFonts w:ascii="Arial" w:hAnsi="Arial" w:cs="Arial"/>
+                <w:b/>
+                <w:bCs/>
+                <w:sz w:val="24"/>
+                <w:szCs w:val="24"/>
+              </w:rPr>
+              <w:t>Rol</w:t>
+            </w:r>
+          </w:p>
+        </w:tc>
+        <w:tc>
+          <w:tcPr>
+            <w:tcW w:w="1563" w:type="dxa"/>
+            <w:shd w:val="clear" w:color="auto" w:fill="262626" w:themeFill="text1" w:themeFillTint="D9"/>
+            <w:vAlign w:val="center"/>
+          </w:tcPr>
+          <w:p>
+            <w:pPr>
+              <w:jc w:val="center"/>
+              <w:rPr>
+                <w:rFonts w:ascii="Arial" w:hAnsi="Arial" w:cs="Arial"/>
+                <w:b/>
+                <w:bCs/>
+                <w:sz w:val="24"/>
+                <w:szCs w:val="24"/>
+              </w:rPr>
+            </w:pPr>
+            <w:r>
+              <w:rPr>
+                <w:rFonts w:ascii="Arial" w:hAnsi="Arial" w:cs="Arial"/>
+                <w:b/>
+                <w:bCs/>
+                <w:sz w:val="24"/>
+                <w:szCs w:val="24"/>
+              </w:rPr>
+              <w:t>Asistencia (Sí/No)</w:t>
+            </w:r>
+          </w:p>
+        </w:tc>
+        <w:tc>
+          <w:tcPr>
+            <w:tcW w:w="3061" w:type="dxa"/>
+            <w:shd w:val="clear" w:color="auto" w:fill="262626" w:themeFill="text1" w:themeFillTint="D9"/>
+            <w:vAlign w:val="center"/>
+          </w:tcPr>
+          <w:p>
+            <w:pPr>
+              <w:jc w:val="center"/>
+              <w:rPr>
+                <w:rFonts w:ascii="Arial" w:hAnsi="Arial" w:cs="Arial"/>
+                <w:b/>
+                <w:bCs/>
+                <w:sz w:val="24"/>
+                <w:szCs w:val="24"/>
+              </w:rPr>
+            </w:pPr>
+            <w:r>
+              <w:rPr>
+                <w:rFonts w:ascii="Arial" w:hAnsi="Arial" w:cs="Arial"/>
+                <w:b/>
+                <w:bCs/>
+                <w:sz w:val="24"/>
+                <w:szCs w:val="24"/>
+              </w:rPr>
+              <w:t>Actividades</w:t>
+            </w:r>
+          </w:p>
+        </w:tc>
+        <w:tc>
+          <w:tcPr>
+            <w:tcW w:w="2328" w:type="dxa"/>
+            <w:shd w:val="clear" w:color="auto" w:fill="262626" w:themeFill="text1" w:themeFillTint="D9"/>
+            <w:vAlign w:val="center"/>
+          </w:tcPr>
+          <w:p>
+            <w:pPr>
+              <w:jc w:val="center"/>
+              <w:rPr>
+                <w:rFonts w:ascii="Arial" w:hAnsi="Arial" w:cs="Arial"/>
+                <w:b/>
+                <w:bCs/>
+                <w:sz w:val="24"/>
+                <w:szCs w:val="24"/>
+              </w:rPr>
+            </w:pPr>
+            <w:r>
+              <w:rPr>
+                <w:rFonts w:ascii="Arial" w:hAnsi="Arial" w:cs="Arial"/>
+                <w:b/>
+                <w:bCs/>
+                <w:sz w:val="24"/>
+                <w:szCs w:val="24"/>
+              </w:rPr>
+              <w:t>Entregables Esperados</w:t>
+            </w:r>
+          </w:p>
+        </w:tc>
+      </w:tr>
+      <w:tr>
+        <w:trPr>
+          <w:jc w:val="center"/>
+        </w:trPr>
+        <w:tc>
+          <w:tcPr>
+            <w:tcW w:w="1538" w:type="dxa"/>
+            <w:vAlign w:val="center"/>
+          </w:tcPr>
+          <w:p>
+            <w:pPr>
+              <w:rPr>
+                <w:rFonts w:ascii="Arial" w:hAnsi="Arial" w:cs="Arial"/>
+                <w:sz w:val="24"/>
+                <w:szCs w:val="24"/>
+              </w:rPr>
+            </w:pPr>
+            <w:r>
+              <w:rPr>
+                <w:rFonts w:ascii="Arial" w:hAnsi="Arial" w:cs="Arial"/>
+                <w:sz w:val="24"/>
+                <w:szCs w:val="24"/>
+              </w:rPr>
+              <w:t>María Fernanda Barrón Álvarez</w:t>
+            </w:r>
+          </w:p>
+        </w:tc>
+        <w:tc>
+          <w:tcPr>
+            <w:tcW w:w="1791" w:type="dxa"/>
+            <w:vAlign w:val="center"/>
+          </w:tcPr>
+          <w:p>
+            <w:pPr>
+              <w:rPr>
+                <w:rFonts w:ascii="Arial" w:hAnsi="Arial" w:cs="Arial"/>
+                <w:sz w:val="24"/>
+                <w:szCs w:val="24"/>
+              </w:rPr>
+            </w:pPr>
+            <w:r>
+              <w:rPr>
+                <w:rFonts w:ascii="Arial" w:hAnsi="Arial" w:cs="Arial"/>
+                <w:sz w:val="24"/>
+                <w:szCs w:val="24"/>
+              </w:rPr>
+              <w:t>Project Manager</w:t>
+            </w:r>
+          </w:p>
+        </w:tc>
+        <w:tc>
+          <w:tcPr>
+            <w:tcW w:w="1563" w:type="dxa"/>
+            <w:vAlign w:val="center"/>
+          </w:tcPr>
+          <w:p>
+            <w:pPr>
+              <w:rPr>
+                <w:rFonts w:ascii="Arial" w:hAnsi="Arial" w:cs="Arial"/>
+                <w:sz w:val="24"/>
+                <w:szCs w:val="24"/>
+              </w:rPr>
+            </w:pPr>
+            <w:r>
+              <w:rPr>
+                <w:rFonts w:ascii="Arial" w:hAnsi="Arial" w:cs="Arial"/>
+                <w:sz w:val="24"/>
+                <w:szCs w:val="24"/>
+              </w:rPr>
+              <w:t>Sí</w:t>
+            </w:r>
+            <w:r>
+              <w:rPr>
+                <w:rFonts w:ascii="Arial" w:hAnsi="Arial" w:cs="Arial"/>
+                <w:sz w:val="24"/>
+                <w:szCs w:val="24"/>
+              </w:rPr>
+              <w:t xml:space="preserve"> </w:t>
+            </w:r>
+          </w:p>
+        </w:tc>
+        <w:tc>
+          <w:tcPr>
+            <w:tcW w:w="3061" w:type="dxa"/>
+            <w:vAlign w:val="center"/>
+          </w:tcPr>
+          <w:p>
+            <w:pPr>
+              <w:pStyle w:val="Prrafodelista"/>
+              <w:numPr>
+                <w:ilvl w:val="0"/>
+                <w:numId w:val="27"/>
+              </w:numPr>
+              <w:ind w:left="246" w:hanging="218"/>
+              <w:rPr>
+                <w:rFonts w:ascii="Arial" w:hAnsi="Arial" w:cs="Arial"/>
+                <w:sz w:val="24"/>
+                <w:szCs w:val="24"/>
+              </w:rPr>
+            </w:pPr>
+            <w:r>
+              <w:rPr>
+                <w:rFonts w:ascii="Arial" w:hAnsi="Arial" w:cs="Arial"/>
+                <w:sz w:val="24"/>
+                <w:szCs w:val="24"/>
+              </w:rPr>
+              <w:t>Bitácora del día</w:t>
+            </w:r>
+          </w:p>
+          <w:p>
+            <w:pPr>
+              <w:pStyle w:val="Prrafodelista"/>
+              <w:numPr>
+                <w:ilvl w:val="0"/>
+                <w:numId w:val="27"/>
+              </w:numPr>
+              <w:ind w:left="246" w:hanging="218"/>
+              <w:rPr>
+                <w:rFonts w:ascii="Arial" w:hAnsi="Arial" w:cs="Arial"/>
+                <w:sz w:val="24"/>
+                <w:szCs w:val="24"/>
+              </w:rPr>
+            </w:pPr>
+            <w:r>
+              <w:rPr>
+                <w:rFonts w:ascii="Arial" w:hAnsi="Arial" w:cs="Arial"/>
+                <w:sz w:val="24"/>
+                <w:szCs w:val="24"/>
+              </w:rPr>
+              <w:t>Documentación final, punto 8.3.</w:t>
+            </w:r>
+          </w:p>
+        </w:tc>
+        <w:tc>
+          <w:tcPr>
+            <w:tcW w:w="2328" w:type="dxa"/>
+            <w:vAlign w:val="center"/>
+          </w:tcPr>
+          <w:p>
+            <w:pPr>
+              <w:pStyle w:val="Prrafodelista"/>
+              <w:numPr>
+                <w:ilvl w:val="0"/>
+                <w:numId w:val="27"/>
+              </w:numPr>
+              <w:ind w:left="219" w:hanging="219"/>
+              <w:rPr>
+                <w:rFonts w:ascii="Arial" w:hAnsi="Arial" w:cs="Arial"/>
+                <w:sz w:val="24"/>
+                <w:szCs w:val="24"/>
+              </w:rPr>
+            </w:pPr>
+            <w:r>
+              <w:rPr>
+                <w:rFonts w:ascii="Arial" w:hAnsi="Arial" w:cs="Arial"/>
+                <w:sz w:val="24"/>
+                <w:szCs w:val="24"/>
+              </w:rPr>
+              <w:t>Bitácora</w:t>
+            </w:r>
+          </w:p>
+          <w:p>
+            <w:pPr>
+              <w:pStyle w:val="Prrafodelista"/>
+              <w:numPr>
+                <w:ilvl w:val="0"/>
+                <w:numId w:val="27"/>
+              </w:numPr>
+              <w:ind w:left="219" w:hanging="219"/>
+              <w:rPr>
+                <w:rFonts w:ascii="Arial" w:hAnsi="Arial" w:cs="Arial"/>
+                <w:sz w:val="24"/>
+                <w:szCs w:val="24"/>
+              </w:rPr>
+            </w:pPr>
+            <w:r>
+              <w:rPr>
+                <w:rFonts w:ascii="Arial" w:hAnsi="Arial" w:cs="Arial"/>
+                <w:sz w:val="24"/>
+                <w:szCs w:val="24"/>
+              </w:rPr>
+              <w:t>Documentación final</w:t>
+            </w:r>
+          </w:p>
+        </w:tc>
+      </w:tr>
+      <w:tr>
+        <w:trPr>
+          <w:jc w:val="center"/>
+        </w:trPr>
+        <w:tc>
+          <w:tcPr>
+            <w:tcW w:w="1538" w:type="dxa"/>
+            <w:vAlign w:val="center"/>
+          </w:tcPr>
+          <w:p>
+            <w:pPr>
+              <w:rPr>
+                <w:rFonts w:ascii="Arial" w:hAnsi="Arial" w:cs="Arial"/>
+                <w:sz w:val="24"/>
+                <w:szCs w:val="24"/>
+              </w:rPr>
+            </w:pPr>
+            <w:r>
+              <w:rPr>
+                <w:rFonts w:ascii="Arial" w:hAnsi="Arial" w:cs="Arial"/>
+                <w:sz w:val="24"/>
+                <w:szCs w:val="24"/>
+              </w:rPr>
+              <w:t xml:space="preserve">Leslie Miroslava Benítez </w:t>
+            </w:r>
+          </w:p>
+          <w:p>
+            <w:pPr>
+              <w:rPr>
+                <w:rFonts w:ascii="Arial" w:hAnsi="Arial" w:cs="Arial"/>
+                <w:sz w:val="24"/>
+                <w:szCs w:val="24"/>
+              </w:rPr>
+            </w:pPr>
+            <w:r>
+              <w:rPr>
+                <w:rFonts w:ascii="Arial" w:hAnsi="Arial" w:cs="Arial"/>
+                <w:sz w:val="24"/>
+                <w:szCs w:val="24"/>
+              </w:rPr>
+              <w:t>Marín</w:t>
+            </w:r>
+          </w:p>
+        </w:tc>
+        <w:tc>
+          <w:tcPr>
+            <w:tcW w:w="1791" w:type="dxa"/>
+            <w:vAlign w:val="center"/>
+          </w:tcPr>
+          <w:p>
+            <w:pPr>
+              <w:rPr>
+                <w:rFonts w:ascii="Arial" w:hAnsi="Arial" w:cs="Arial"/>
+                <w:sz w:val="24"/>
+                <w:szCs w:val="24"/>
+              </w:rPr>
+            </w:pPr>
+            <w:r>
+              <w:rPr>
+                <w:rFonts w:ascii="Arial" w:hAnsi="Arial" w:cs="Arial"/>
+                <w:sz w:val="24"/>
+                <w:szCs w:val="24"/>
+              </w:rPr>
+              <w:t xml:space="preserve">Desarrolladora </w:t>
+            </w:r>
+            <w:proofErr w:type="spellStart"/>
+            <w:r>
+              <w:rPr>
+                <w:rFonts w:ascii="Arial" w:hAnsi="Arial" w:cs="Arial"/>
+                <w:sz w:val="24"/>
+                <w:szCs w:val="24"/>
+              </w:rPr>
+              <w:t>frontend</w:t>
+            </w:r>
+            <w:proofErr w:type="spellEnd"/>
+          </w:p>
+        </w:tc>
+        <w:tc>
+          <w:tcPr>
+            <w:tcW w:w="1563" w:type="dxa"/>
+            <w:vAlign w:val="center"/>
+          </w:tcPr>
+          <w:p>
+            <w:pPr>
+              <w:rPr>
+                <w:rFonts w:ascii="Arial" w:hAnsi="Arial" w:cs="Arial"/>
+                <w:sz w:val="24"/>
+                <w:szCs w:val="24"/>
+              </w:rPr>
+            </w:pPr>
+            <w:r>
+              <w:rPr>
+                <w:rFonts w:ascii="Arial" w:hAnsi="Arial" w:cs="Arial"/>
+                <w:sz w:val="24"/>
+                <w:szCs w:val="24"/>
+              </w:rPr>
+              <w:t xml:space="preserve">Sí </w:t>
+            </w:r>
+          </w:p>
+        </w:tc>
+        <w:tc>
+          <w:tcPr>
+            <w:tcW w:w="3061" w:type="dxa"/>
+            <w:vAlign w:val="center"/>
+          </w:tcPr>
+          <w:p>
+            <w:pPr>
+              <w:pStyle w:val="Prrafodelista"/>
+              <w:numPr>
+                <w:ilvl w:val="0"/>
+                <w:numId w:val="27"/>
+              </w:numPr>
+              <w:ind w:left="270" w:hanging="184"/>
+              <w:rPr>
+                <w:rFonts w:ascii="Arial" w:hAnsi="Arial" w:cs="Arial"/>
+                <w:sz w:val="24"/>
+                <w:szCs w:val="24"/>
+              </w:rPr>
+            </w:pPr>
+            <w:r>
+              <w:rPr>
+                <w:rFonts w:ascii="Arial" w:hAnsi="Arial" w:cs="Arial"/>
+                <w:sz w:val="24"/>
+                <w:szCs w:val="24"/>
+              </w:rPr>
+              <w:t>Documentación final, punto 8.1.</w:t>
+            </w:r>
+          </w:p>
+        </w:tc>
+        <w:tc>
+          <w:tcPr>
+            <w:tcW w:w="2328" w:type="dxa"/>
+            <w:vAlign w:val="center"/>
+          </w:tcPr>
+          <w:p>
+            <w:pPr>
+              <w:pStyle w:val="Prrafodelista"/>
+              <w:numPr>
+                <w:ilvl w:val="0"/>
+                <w:numId w:val="27"/>
+              </w:numPr>
+              <w:ind w:left="219" w:hanging="218"/>
+              <w:rPr>
+                <w:rFonts w:ascii="Arial" w:hAnsi="Arial" w:cs="Arial"/>
+                <w:sz w:val="24"/>
+                <w:szCs w:val="24"/>
+              </w:rPr>
+            </w:pPr>
+            <w:r>
+              <w:rPr>
+                <w:rFonts w:ascii="Arial" w:hAnsi="Arial" w:cs="Arial"/>
+                <w:sz w:val="24"/>
+                <w:szCs w:val="24"/>
+              </w:rPr>
+              <w:t>Documentación final</w:t>
+            </w:r>
+          </w:p>
+        </w:tc>
+      </w:tr>
+      <w:tr>
+        <w:trPr>
+          <w:jc w:val="center"/>
+        </w:trPr>
+        <w:tc>
+          <w:tcPr>
+            <w:tcW w:w="1538" w:type="dxa"/>
+            <w:vAlign w:val="center"/>
+          </w:tcPr>
+          <w:p>
+            <w:pPr>
+              <w:rPr>
+                <w:rFonts w:ascii="Arial" w:hAnsi="Arial" w:cs="Arial"/>
+                <w:sz w:val="24"/>
+                <w:szCs w:val="24"/>
+              </w:rPr>
+            </w:pPr>
+            <w:r>
+              <w:rPr>
+                <w:rFonts w:ascii="Arial" w:hAnsi="Arial" w:cs="Arial"/>
+                <w:sz w:val="24"/>
+                <w:szCs w:val="24"/>
+              </w:rPr>
+              <w:t>Leonardo Merino Garfias</w:t>
+            </w:r>
+          </w:p>
+        </w:tc>
+        <w:tc>
+          <w:tcPr>
+            <w:tcW w:w="1791" w:type="dxa"/>
+            <w:vAlign w:val="center"/>
+          </w:tcPr>
+          <w:p>
+            <w:pPr>
+              <w:rPr>
+                <w:rFonts w:ascii="Arial" w:hAnsi="Arial" w:cs="Arial"/>
+                <w:sz w:val="24"/>
+                <w:szCs w:val="24"/>
+              </w:rPr>
+            </w:pPr>
+            <w:r>
+              <w:rPr>
+                <w:rFonts w:ascii="Arial" w:hAnsi="Arial" w:cs="Arial"/>
+                <w:sz w:val="24"/>
+                <w:szCs w:val="24"/>
+              </w:rPr>
+              <w:t xml:space="preserve">Desarrollador </w:t>
+            </w:r>
+            <w:proofErr w:type="spellStart"/>
+            <w:r>
+              <w:rPr>
+                <w:rFonts w:ascii="Arial" w:hAnsi="Arial" w:cs="Arial"/>
+                <w:sz w:val="24"/>
+                <w:szCs w:val="24"/>
+              </w:rPr>
+              <w:t>backend</w:t>
+            </w:r>
+            <w:proofErr w:type="spellEnd"/>
+          </w:p>
+        </w:tc>
+        <w:tc>
+          <w:tcPr>
+            <w:tcW w:w="1563" w:type="dxa"/>
+            <w:vAlign w:val="center"/>
+          </w:tcPr>
+          <w:p>
+            <w:pPr>
+              <w:rPr>
+                <w:rFonts w:ascii="Arial" w:hAnsi="Arial" w:cs="Arial"/>
+                <w:sz w:val="24"/>
+                <w:szCs w:val="24"/>
+              </w:rPr>
+            </w:pPr>
+            <w:r>
+              <w:rPr>
+                <w:rFonts w:ascii="Arial" w:hAnsi="Arial" w:cs="Arial"/>
+                <w:sz w:val="24"/>
+                <w:szCs w:val="24"/>
+              </w:rPr>
+              <w:t xml:space="preserve">Sí </w:t>
+            </w:r>
+          </w:p>
+        </w:tc>
+        <w:tc>
+          <w:tcPr>
+            <w:tcW w:w="3061" w:type="dxa"/>
+            <w:vAlign w:val="center"/>
+          </w:tcPr>
+          <w:p>
+            <w:pPr>
+              <w:pStyle w:val="Prrafodelista"/>
+              <w:numPr>
+                <w:ilvl w:val="0"/>
+                <w:numId w:val="27"/>
+              </w:numPr>
+              <w:ind w:left="246" w:hanging="218"/>
+              <w:rPr>
+                <w:rFonts w:ascii="Arial" w:hAnsi="Arial" w:cs="Arial"/>
+                <w:sz w:val="24"/>
+                <w:szCs w:val="24"/>
+              </w:rPr>
+            </w:pPr>
+            <w:r>
+              <w:rPr>
+                <w:rFonts w:ascii="Arial" w:hAnsi="Arial" w:cs="Arial"/>
+                <w:sz w:val="24"/>
+                <w:szCs w:val="24"/>
+              </w:rPr>
+              <w:t>Documentación final, punto 8.2.</w:t>
+            </w:r>
+          </w:p>
+        </w:tc>
+        <w:tc>
+          <w:tcPr>
+            <w:tcW w:w="2328" w:type="dxa"/>
+            <w:vAlign w:val="center"/>
+          </w:tcPr>
+          <w:p>
+            <w:pPr>
+              <w:pStyle w:val="Prrafodelista"/>
+              <w:numPr>
+                <w:ilvl w:val="0"/>
+                <w:numId w:val="27"/>
+              </w:numPr>
+              <w:ind w:left="349" w:hanging="248"/>
+              <w:rPr>
+                <w:rFonts w:ascii="Arial" w:hAnsi="Arial" w:cs="Arial"/>
+                <w:sz w:val="24"/>
+                <w:szCs w:val="24"/>
+              </w:rPr>
+            </w:pPr>
+            <w:r>
+              <w:rPr>
+                <w:rFonts w:ascii="Arial" w:hAnsi="Arial" w:cs="Arial"/>
+                <w:sz w:val="24"/>
+                <w:szCs w:val="24"/>
+              </w:rPr>
+              <w:t>Documentación final</w:t>
+            </w:r>
+          </w:p>
+        </w:tc>
+      </w:tr>
+    </w:tbl>
+    <w:p>
+      <w:pPr>
+        <w:rPr>
+          <w:rFonts w:ascii="Arial" w:hAnsi="Arial" w:cs="Arial"/>
+          <w:sz w:val="24"/>
+          <w:szCs w:val="24"/>
+        </w:rPr>
+      </w:pPr>
+    </w:p>
+    <w:p>
+      <w:pPr>
+        <w:pStyle w:val="titulo1"/>
+        <w:outlineLvl w:val="2"/>
+        <w:rPr>
+          <w:sz w:val="32"/>
+          <w:szCs w:val="72"/>
+        </w:rPr>
+      </w:pPr>
+      <w:r>
+        <w:rPr>
+          <w:sz w:val="32"/>
+          <w:szCs w:val="72"/>
+        </w:rPr>
+        <w:t>A</w:t>
+      </w:r>
+      <w:r>
+        <w:rPr>
+          <w:sz w:val="32"/>
+          <w:szCs w:val="72"/>
+        </w:rPr>
+        <w:t>ctividades Ejecutadas</w:t>
+      </w:r>
+    </w:p>
+    <w:tbl>
+      <w:tblPr>
+        <w:tblStyle w:val="Tablaconcuadrcula"/>
+        <w:tblW w:w="10124" w:type="dxa"/>
+        <w:jc w:val="center"/>
+        <w:tblBorders>
+          <w:top w:val="single" w:sz="4" w:space="0" w:color="7F7F7F" w:themeColor="text1" w:themeTint="80"/>
+          <w:left w:val="single" w:sz="4" w:space="0" w:color="7F7F7F" w:themeColor="text1" w:themeTint="80"/>
+          <w:bottom w:val="single" w:sz="4" w:space="0" w:color="7F7F7F" w:themeColor="text1" w:themeTint="80"/>
+          <w:right w:val="single" w:sz="4" w:space="0" w:color="7F7F7F" w:themeColor="text1" w:themeTint="80"/>
+          <w:insideH w:val="single" w:sz="4" w:space="0" w:color="7F7F7F" w:themeColor="text1" w:themeTint="80"/>
+          <w:insideV w:val="single" w:sz="4" w:space="0" w:color="7F7F7F" w:themeColor="text1" w:themeTint="80"/>
+        </w:tblBorders>
+        <w:tblCellMar>
+          <w:top w:w="57" w:type="dxa"/>
+          <w:bottom w:w="57" w:type="dxa"/>
+        </w:tblCellMar>
+        <w:tblLook w:val="04A0" w:firstRow="1" w:lastRow="0" w:firstColumn="1" w:lastColumn="0" w:noHBand="0" w:noVBand="1"/>
+      </w:tblPr>
+      <w:tblGrid>
+        <w:gridCol w:w="2955"/>
+        <w:gridCol w:w="2004"/>
+        <w:gridCol w:w="1150"/>
+        <w:gridCol w:w="1535"/>
+        <w:gridCol w:w="2480"/>
+      </w:tblGrid>
+      <w:tr>
+        <w:trPr>
+          <w:jc w:val="center"/>
+        </w:trPr>
+        <w:tc>
+          <w:tcPr>
+            <w:tcW w:w="2955" w:type="dxa"/>
+            <w:shd w:val="clear" w:color="auto" w:fill="262626" w:themeFill="text1" w:themeFillTint="D9"/>
+            <w:vAlign w:val="center"/>
+          </w:tcPr>
+          <w:p>
+            <w:pPr>
+              <w:jc w:val="center"/>
+              <w:rPr>
+                <w:rFonts w:ascii="Arial" w:hAnsi="Arial" w:cs="Arial"/>
+                <w:b/>
+                <w:bCs/>
+                <w:sz w:val="24"/>
+                <w:szCs w:val="24"/>
+              </w:rPr>
+            </w:pPr>
+            <w:r>
+              <w:rPr>
+                <w:rFonts w:ascii="Arial" w:hAnsi="Arial" w:cs="Arial"/>
+                <w:b/>
+                <w:bCs/>
+                <w:sz w:val="24"/>
+                <w:szCs w:val="24"/>
+              </w:rPr>
+              <w:t>Actividad</w:t>
+            </w:r>
+          </w:p>
+        </w:tc>
+        <w:tc>
+          <w:tcPr>
+            <w:tcW w:w="2004" w:type="dxa"/>
+            <w:shd w:val="clear" w:color="auto" w:fill="262626" w:themeFill="text1" w:themeFillTint="D9"/>
+            <w:vAlign w:val="center"/>
+          </w:tcPr>
+          <w:p>
+            <w:pPr>
+              <w:jc w:val="center"/>
+              <w:rPr>
+                <w:rFonts w:ascii="Arial" w:hAnsi="Arial" w:cs="Arial"/>
+                <w:b/>
+                <w:bCs/>
+                <w:sz w:val="24"/>
+                <w:szCs w:val="24"/>
+              </w:rPr>
+            </w:pPr>
+            <w:r>
+              <w:rPr>
+                <w:rFonts w:ascii="Arial" w:hAnsi="Arial" w:cs="Arial"/>
+                <w:b/>
+                <w:bCs/>
+                <w:sz w:val="24"/>
+                <w:szCs w:val="24"/>
+              </w:rPr>
+              <w:t>Responsable(s)</w:t>
+            </w:r>
+          </w:p>
+        </w:tc>
+        <w:tc>
+          <w:tcPr>
+            <w:tcW w:w="1150" w:type="dxa"/>
+            <w:shd w:val="clear" w:color="auto" w:fill="262626" w:themeFill="text1" w:themeFillTint="D9"/>
+            <w:vAlign w:val="center"/>
+          </w:tcPr>
+          <w:p>
+            <w:pPr>
+              <w:jc w:val="center"/>
+              <w:rPr>
+                <w:rFonts w:ascii="Arial" w:hAnsi="Arial" w:cs="Arial"/>
+                <w:b/>
+                <w:bCs/>
+                <w:sz w:val="24"/>
+                <w:szCs w:val="24"/>
+              </w:rPr>
+            </w:pPr>
+            <w:proofErr w:type="spellStart"/>
+            <w:r>
+              <w:rPr>
+                <w:rFonts w:ascii="Arial" w:hAnsi="Arial" w:cs="Arial"/>
+                <w:b/>
+                <w:bCs/>
+                <w:sz w:val="24"/>
+                <w:szCs w:val="24"/>
+              </w:rPr>
+              <w:t>Hr</w:t>
+            </w:r>
+            <w:proofErr w:type="spellEnd"/>
+            <w:r>
+              <w:rPr>
+                <w:rFonts w:ascii="Arial" w:hAnsi="Arial" w:cs="Arial"/>
+                <w:b/>
+                <w:bCs/>
+                <w:sz w:val="24"/>
+                <w:szCs w:val="24"/>
+              </w:rPr>
+              <w:t xml:space="preserve">. </w:t>
+            </w:r>
+            <w:proofErr w:type="spellStart"/>
+            <w:r>
+              <w:rPr>
+                <w:rFonts w:ascii="Arial" w:hAnsi="Arial" w:cs="Arial"/>
+                <w:b/>
+                <w:bCs/>
+                <w:sz w:val="24"/>
+                <w:szCs w:val="24"/>
+              </w:rPr>
+              <w:t>Ini</w:t>
+            </w:r>
+            <w:proofErr w:type="spellEnd"/>
+          </w:p>
+        </w:tc>
+        <w:tc>
+          <w:tcPr>
+            <w:tcW w:w="1535" w:type="dxa"/>
+            <w:shd w:val="clear" w:color="auto" w:fill="262626" w:themeFill="text1" w:themeFillTint="D9"/>
+            <w:vAlign w:val="center"/>
+          </w:tcPr>
+          <w:p>
+            <w:pPr>
+              <w:jc w:val="center"/>
+              <w:rPr>
+                <w:rFonts w:ascii="Arial" w:hAnsi="Arial" w:cs="Arial"/>
+                <w:b/>
+                <w:bCs/>
+                <w:sz w:val="24"/>
+                <w:szCs w:val="24"/>
+              </w:rPr>
+            </w:pPr>
+            <w:proofErr w:type="spellStart"/>
+            <w:r>
+              <w:rPr>
+                <w:rFonts w:ascii="Arial" w:hAnsi="Arial" w:cs="Arial"/>
+                <w:b/>
+                <w:bCs/>
+                <w:sz w:val="24"/>
+                <w:szCs w:val="24"/>
+              </w:rPr>
+              <w:t>Hr</w:t>
+            </w:r>
+            <w:proofErr w:type="spellEnd"/>
+            <w:r>
+              <w:rPr>
+                <w:rFonts w:ascii="Arial" w:hAnsi="Arial" w:cs="Arial"/>
+                <w:b/>
+                <w:bCs/>
+                <w:sz w:val="24"/>
+                <w:szCs w:val="24"/>
+              </w:rPr>
+              <w:t>. fin</w:t>
+            </w:r>
+          </w:p>
+        </w:tc>
+        <w:tc>
+          <w:tcPr>
+            <w:tcW w:w="2480" w:type="dxa"/>
+            <w:shd w:val="clear" w:color="auto" w:fill="262626" w:themeFill="text1" w:themeFillTint="D9"/>
+            <w:vAlign w:val="center"/>
+          </w:tcPr>
+          <w:p>
+            <w:pPr>
+              <w:jc w:val="center"/>
+              <w:rPr>
+                <w:rFonts w:ascii="Arial" w:hAnsi="Arial" w:cs="Arial"/>
+                <w:b/>
+                <w:bCs/>
+                <w:sz w:val="24"/>
+                <w:szCs w:val="24"/>
+              </w:rPr>
+            </w:pPr>
+            <w:r>
+              <w:rPr>
+                <w:rFonts w:ascii="Arial" w:hAnsi="Arial" w:cs="Arial"/>
+                <w:b/>
+                <w:bCs/>
+                <w:sz w:val="24"/>
+                <w:szCs w:val="24"/>
+              </w:rPr>
+              <w:t>Estado (Completado / En proceso / Pendiente)</w:t>
+            </w:r>
+          </w:p>
+        </w:tc>
+      </w:tr>
+      <w:tr>
+        <w:trPr>
+          <w:jc w:val="center"/>
+        </w:trPr>
+        <w:tc>
+          <w:tcPr>
+            <w:tcW w:w="2955" w:type="dxa"/>
+            <w:vAlign w:val="center"/>
+          </w:tcPr>
+          <w:p>
+            <w:pPr>
+              <w:rPr>
+                <w:rFonts w:ascii="Arial" w:hAnsi="Arial" w:cs="Arial"/>
+                <w:sz w:val="24"/>
+                <w:szCs w:val="24"/>
+              </w:rPr>
+            </w:pPr>
+            <w:r>
+              <w:rPr>
+                <w:rFonts w:ascii="Arial" w:hAnsi="Arial" w:cs="Arial"/>
+                <w:sz w:val="24"/>
+                <w:szCs w:val="24"/>
+              </w:rPr>
+              <w:t>Bitácora</w:t>
+            </w:r>
+          </w:p>
+        </w:tc>
+        <w:tc>
+          <w:tcPr>
+            <w:tcW w:w="2004" w:type="dxa"/>
+            <w:vAlign w:val="center"/>
+          </w:tcPr>
+          <w:p>
+            <w:pPr>
+              <w:rPr>
+                <w:rFonts w:ascii="Arial" w:hAnsi="Arial" w:cs="Arial"/>
+                <w:sz w:val="24"/>
+                <w:szCs w:val="24"/>
+              </w:rPr>
+            </w:pPr>
+            <w:r>
+              <w:rPr>
+                <w:rFonts w:ascii="Arial" w:hAnsi="Arial" w:cs="Arial"/>
+                <w:sz w:val="24"/>
+                <w:szCs w:val="24"/>
+              </w:rPr>
+              <w:t>Fernanda</w:t>
+            </w:r>
+            <w:r>
+              <w:rPr>
+                <w:rFonts w:ascii="Arial" w:hAnsi="Arial" w:cs="Arial"/>
+                <w:sz w:val="24"/>
+                <w:szCs w:val="24"/>
+              </w:rPr>
+              <w:t xml:space="preserve"> </w:t>
+            </w:r>
+            <w:r>
+              <w:rPr>
+                <w:rFonts w:ascii="Arial" w:hAnsi="Arial" w:cs="Arial"/>
+                <w:sz w:val="24"/>
+                <w:szCs w:val="24"/>
+              </w:rPr>
+              <w:t>Álvarez</w:t>
+            </w:r>
+          </w:p>
+        </w:tc>
+        <w:tc>
+          <w:tcPr>
+            <w:tcW w:w="1150" w:type="dxa"/>
+            <w:vAlign w:val="center"/>
+          </w:tcPr>
+          <w:p>
+            <w:pPr>
+              <w:rPr>
+                <w:rFonts w:ascii="Arial" w:hAnsi="Arial" w:cs="Arial"/>
+                <w:sz w:val="24"/>
+                <w:szCs w:val="24"/>
+              </w:rPr>
+            </w:pPr>
+            <w:r>
+              <w:rPr>
+                <w:rFonts w:ascii="Arial" w:hAnsi="Arial" w:cs="Arial"/>
+                <w:sz w:val="24"/>
+                <w:szCs w:val="24"/>
+              </w:rPr>
+              <w:t>8</w:t>
+            </w:r>
+            <w:r>
+              <w:rPr>
+                <w:rFonts w:ascii="Arial" w:hAnsi="Arial" w:cs="Arial"/>
+                <w:sz w:val="24"/>
+                <w:szCs w:val="24"/>
+              </w:rPr>
+              <w:t>:</w:t>
+            </w:r>
+            <w:r>
+              <w:rPr>
+                <w:rFonts w:ascii="Arial" w:hAnsi="Arial" w:cs="Arial"/>
+                <w:sz w:val="24"/>
+                <w:szCs w:val="24"/>
+              </w:rPr>
+              <w:t>10 a</w:t>
+            </w:r>
+            <w:r>
+              <w:rPr>
+                <w:rFonts w:ascii="Arial" w:hAnsi="Arial" w:cs="Arial"/>
+                <w:sz w:val="24"/>
+                <w:szCs w:val="24"/>
+              </w:rPr>
+              <w:t>m</w:t>
+            </w:r>
+          </w:p>
+        </w:tc>
+        <w:tc>
+          <w:tcPr>
+            <w:tcW w:w="1535" w:type="dxa"/>
+            <w:vAlign w:val="center"/>
+          </w:tcPr>
+          <w:p>
+            <w:pPr>
+              <w:rPr>
+                <w:rFonts w:ascii="Arial" w:hAnsi="Arial" w:cs="Arial"/>
+                <w:sz w:val="24"/>
+                <w:szCs w:val="24"/>
+              </w:rPr>
+            </w:pPr>
+            <w:r>
+              <w:rPr>
+                <w:rFonts w:ascii="Arial" w:hAnsi="Arial" w:cs="Arial"/>
+                <w:sz w:val="24"/>
+                <w:szCs w:val="24"/>
+              </w:rPr>
+              <w:t>9:</w:t>
+            </w:r>
+            <w:r>
+              <w:rPr>
+                <w:rFonts w:ascii="Arial" w:hAnsi="Arial" w:cs="Arial"/>
+                <w:sz w:val="24"/>
+                <w:szCs w:val="24"/>
+              </w:rPr>
+              <w:t>3</w:t>
+            </w:r>
+            <w:r>
+              <w:rPr>
+                <w:rFonts w:ascii="Arial" w:hAnsi="Arial" w:cs="Arial"/>
+                <w:sz w:val="24"/>
+                <w:szCs w:val="24"/>
+              </w:rPr>
+              <w:t>5 a</w:t>
+            </w:r>
+            <w:r>
+              <w:rPr>
+                <w:rFonts w:ascii="Arial" w:hAnsi="Arial" w:cs="Arial"/>
+                <w:sz w:val="24"/>
+                <w:szCs w:val="24"/>
+              </w:rPr>
+              <w:t>m</w:t>
+            </w:r>
+          </w:p>
+        </w:tc>
+        <w:tc>
+          <w:tcPr>
+            <w:tcW w:w="2480" w:type="dxa"/>
+            <w:vAlign w:val="center"/>
+          </w:tcPr>
+          <w:p>
+            <w:pPr>
+              <w:rPr>
+                <w:rFonts w:ascii="Arial" w:hAnsi="Arial" w:cs="Arial"/>
+                <w:sz w:val="24"/>
+                <w:szCs w:val="24"/>
+              </w:rPr>
+            </w:pPr>
+            <w:r>
+              <w:rPr>
+                <w:rFonts w:ascii="Arial" w:hAnsi="Arial" w:cs="Arial"/>
+                <w:sz w:val="24"/>
+                <w:szCs w:val="24"/>
+              </w:rPr>
+              <w:t>Completado</w:t>
+            </w:r>
+          </w:p>
+        </w:tc>
+      </w:tr>
+      <w:tr>
+        <w:trPr>
+          <w:jc w:val="center"/>
+        </w:trPr>
+        <w:tc>
+          <w:tcPr>
+            <w:tcW w:w="2955" w:type="dxa"/>
+            <w:vAlign w:val="center"/>
+          </w:tcPr>
+          <w:p>
+            <w:pPr>
+              <w:rPr>
+                <w:rFonts w:ascii="Arial" w:hAnsi="Arial" w:cs="Arial"/>
+                <w:sz w:val="24"/>
+                <w:szCs w:val="24"/>
+              </w:rPr>
+            </w:pPr>
+            <w:r>
+              <w:rPr>
+                <w:rFonts w:ascii="Arial" w:hAnsi="Arial" w:cs="Arial"/>
+                <w:sz w:val="24"/>
+                <w:szCs w:val="24"/>
+              </w:rPr>
+              <w:t xml:space="preserve">Agregar EDT a documentación </w:t>
+            </w:r>
+          </w:p>
+        </w:tc>
+        <w:tc>
+          <w:tcPr>
+            <w:tcW w:w="2004" w:type="dxa"/>
+            <w:vAlign w:val="center"/>
+          </w:tcPr>
+          <w:p>
+            <w:pPr>
+              <w:rPr>
+                <w:rFonts w:ascii="Arial" w:hAnsi="Arial" w:cs="Arial"/>
+                <w:sz w:val="24"/>
+                <w:szCs w:val="24"/>
+              </w:rPr>
+            </w:pPr>
+            <w:r>
+              <w:rPr>
+                <w:rFonts w:ascii="Arial" w:hAnsi="Arial" w:cs="Arial"/>
+                <w:sz w:val="24"/>
+                <w:szCs w:val="24"/>
+              </w:rPr>
+              <w:t>Leslie Benítez</w:t>
+            </w:r>
+          </w:p>
+        </w:tc>
+        <w:tc>
+          <w:tcPr>
+            <w:tcW w:w="1150" w:type="dxa"/>
+            <w:vAlign w:val="center"/>
+          </w:tcPr>
+          <w:p>
+            <w:pPr>
+              <w:rPr>
+                <w:rFonts w:ascii="Arial" w:hAnsi="Arial" w:cs="Arial"/>
+                <w:sz w:val="24"/>
+                <w:szCs w:val="24"/>
+              </w:rPr>
+            </w:pPr>
+            <w:r>
+              <w:rPr>
+                <w:rFonts w:ascii="Arial" w:hAnsi="Arial" w:cs="Arial"/>
+                <w:sz w:val="24"/>
+                <w:szCs w:val="24"/>
+              </w:rPr>
+              <w:t>8:10 am</w:t>
+            </w:r>
+          </w:p>
+        </w:tc>
+        <w:tc>
+          <w:tcPr>
+            <w:tcW w:w="1535" w:type="dxa"/>
+            <w:vAlign w:val="center"/>
+          </w:tcPr>
+          <w:p>
+            <w:pPr>
+              <w:rPr>
+                <w:rFonts w:ascii="Arial" w:hAnsi="Arial" w:cs="Arial"/>
+                <w:sz w:val="24"/>
+                <w:szCs w:val="24"/>
+              </w:rPr>
+            </w:pPr>
+            <w:r>
+              <w:rPr>
+                <w:rFonts w:ascii="Arial" w:hAnsi="Arial" w:cs="Arial"/>
+                <w:sz w:val="24"/>
+                <w:szCs w:val="24"/>
+              </w:rPr>
+              <w:t>8:40 am</w:t>
+            </w:r>
+          </w:p>
+        </w:tc>
+        <w:tc>
+          <w:tcPr>
+            <w:tcW w:w="2480" w:type="dxa"/>
+            <w:vAlign w:val="center"/>
+          </w:tcPr>
+          <w:p>
+            <w:pPr>
+              <w:rPr>
+                <w:rFonts w:ascii="Arial" w:hAnsi="Arial" w:cs="Arial"/>
+                <w:sz w:val="24"/>
+                <w:szCs w:val="24"/>
+              </w:rPr>
+            </w:pPr>
+            <w:r>
+              <w:rPr>
+                <w:rFonts w:ascii="Arial" w:hAnsi="Arial" w:cs="Arial"/>
+                <w:sz w:val="24"/>
+                <w:szCs w:val="24"/>
+              </w:rPr>
+              <w:t>Completado</w:t>
+            </w:r>
+          </w:p>
+        </w:tc>
+      </w:tr>
+      <w:tr>
+        <w:trPr>
+          <w:jc w:val="center"/>
+        </w:trPr>
+        <w:tc>
+          <w:tcPr>
+            <w:tcW w:w="2955" w:type="dxa"/>
+            <w:vAlign w:val="center"/>
+          </w:tcPr>
+          <w:p>
+            <w:pPr>
+              <w:rPr>
+                <w:rFonts w:ascii="Arial" w:hAnsi="Arial" w:cs="Arial"/>
+                <w:sz w:val="24"/>
+                <w:szCs w:val="24"/>
+              </w:rPr>
+            </w:pPr>
+            <w:r>
+              <w:rPr>
+                <w:rFonts w:ascii="Arial" w:hAnsi="Arial" w:cs="Arial"/>
+                <w:sz w:val="24"/>
+                <w:szCs w:val="24"/>
+              </w:rPr>
+              <w:t>Agregar cronograma a documentación</w:t>
+            </w:r>
+          </w:p>
+        </w:tc>
+        <w:tc>
+          <w:tcPr>
+            <w:tcW w:w="2004" w:type="dxa"/>
+            <w:vAlign w:val="center"/>
+          </w:tcPr>
+          <w:p>
+            <w:pPr>
+              <w:rPr>
+                <w:rFonts w:ascii="Arial" w:hAnsi="Arial" w:cs="Arial"/>
+                <w:sz w:val="24"/>
+                <w:szCs w:val="24"/>
+              </w:rPr>
+            </w:pPr>
+            <w:r>
+              <w:rPr>
+                <w:rFonts w:ascii="Arial" w:hAnsi="Arial" w:cs="Arial"/>
+                <w:sz w:val="24"/>
+                <w:szCs w:val="24"/>
+              </w:rPr>
+              <w:t>Leonardo Merino</w:t>
+            </w:r>
+          </w:p>
+        </w:tc>
+        <w:tc>
+          <w:tcPr>
+            <w:tcW w:w="1150" w:type="dxa"/>
+            <w:vAlign w:val="center"/>
+          </w:tcPr>
+          <w:p>
+            <w:pPr>
+              <w:rPr>
+                <w:rFonts w:ascii="Arial" w:hAnsi="Arial" w:cs="Arial"/>
+                <w:sz w:val="24"/>
+                <w:szCs w:val="24"/>
+              </w:rPr>
+            </w:pPr>
+            <w:r>
+              <w:rPr>
+                <w:rFonts w:ascii="Arial" w:hAnsi="Arial" w:cs="Arial"/>
+                <w:sz w:val="24"/>
+                <w:szCs w:val="24"/>
+              </w:rPr>
+              <w:t>8</w:t>
+            </w:r>
+            <w:r>
+              <w:rPr>
+                <w:rFonts w:ascii="Arial" w:hAnsi="Arial" w:cs="Arial"/>
+                <w:sz w:val="24"/>
+                <w:szCs w:val="24"/>
+              </w:rPr>
+              <w:t>:</w:t>
+            </w:r>
+            <w:r>
+              <w:rPr>
+                <w:rFonts w:ascii="Arial" w:hAnsi="Arial" w:cs="Arial"/>
+                <w:sz w:val="24"/>
+                <w:szCs w:val="24"/>
+              </w:rPr>
+              <w:t>10 a</w:t>
+            </w:r>
+            <w:r>
+              <w:rPr>
+                <w:rFonts w:ascii="Arial" w:hAnsi="Arial" w:cs="Arial"/>
+                <w:sz w:val="24"/>
+                <w:szCs w:val="24"/>
+              </w:rPr>
+              <w:t>m</w:t>
+            </w:r>
+          </w:p>
+        </w:tc>
+        <w:tc>
+          <w:tcPr>
+            <w:tcW w:w="1535" w:type="dxa"/>
+            <w:vAlign w:val="center"/>
+          </w:tcPr>
+          <w:p>
+            <w:pPr>
+              <w:rPr>
+                <w:rFonts w:ascii="Arial" w:hAnsi="Arial" w:cs="Arial"/>
+                <w:sz w:val="24"/>
+                <w:szCs w:val="24"/>
+              </w:rPr>
+            </w:pPr>
+            <w:r>
+              <w:rPr>
+                <w:rFonts w:ascii="Arial" w:hAnsi="Arial" w:cs="Arial"/>
+                <w:sz w:val="24"/>
+                <w:szCs w:val="24"/>
+              </w:rPr>
+              <w:t>9</w:t>
+            </w:r>
+            <w:r>
+              <w:rPr>
+                <w:rFonts w:ascii="Arial" w:hAnsi="Arial" w:cs="Arial"/>
+                <w:sz w:val="24"/>
+                <w:szCs w:val="24"/>
+              </w:rPr>
+              <w:t>:00</w:t>
+            </w:r>
+            <w:r>
+              <w:rPr>
+                <w:rFonts w:ascii="Arial" w:hAnsi="Arial" w:cs="Arial"/>
+                <w:sz w:val="24"/>
+                <w:szCs w:val="24"/>
+              </w:rPr>
+              <w:t xml:space="preserve"> a</w:t>
+            </w:r>
+            <w:r>
+              <w:rPr>
+                <w:rFonts w:ascii="Arial" w:hAnsi="Arial" w:cs="Arial"/>
+                <w:sz w:val="24"/>
+                <w:szCs w:val="24"/>
+              </w:rPr>
+              <w:t>m</w:t>
+            </w:r>
+          </w:p>
+        </w:tc>
+        <w:tc>
+          <w:tcPr>
+            <w:tcW w:w="2480" w:type="dxa"/>
+            <w:vAlign w:val="center"/>
+          </w:tcPr>
+          <w:p>
+            <w:pPr>
+              <w:rPr>
+                <w:rFonts w:ascii="Arial" w:hAnsi="Arial" w:cs="Arial"/>
+                <w:sz w:val="24"/>
+                <w:szCs w:val="24"/>
+              </w:rPr>
+            </w:pPr>
+            <w:r>
+              <w:rPr>
+                <w:rFonts w:ascii="Arial" w:hAnsi="Arial" w:cs="Arial"/>
+                <w:sz w:val="24"/>
+                <w:szCs w:val="24"/>
+              </w:rPr>
+              <w:t>Completado</w:t>
+            </w:r>
+          </w:p>
+        </w:tc>
+      </w:tr>
+      <w:tr>
+        <w:trPr>
+          <w:jc w:val="center"/>
+        </w:trPr>
+        <w:tc>
+          <w:tcPr>
+            <w:tcW w:w="2955" w:type="dxa"/>
+            <w:vAlign w:val="center"/>
+          </w:tcPr>
+          <w:p>
+            <w:pPr>
+              <w:rPr>
+                <w:rFonts w:ascii="Arial" w:hAnsi="Arial" w:cs="Arial"/>
+                <w:sz w:val="24"/>
+                <w:szCs w:val="24"/>
+              </w:rPr>
+            </w:pPr>
+            <w:r>
+              <w:rPr>
+                <w:rFonts w:ascii="Arial" w:hAnsi="Arial" w:cs="Arial"/>
+                <w:sz w:val="24"/>
+                <w:szCs w:val="24"/>
+              </w:rPr>
+              <w:t xml:space="preserve">Agregar roles de equipo a documentación </w:t>
+            </w:r>
+          </w:p>
+        </w:tc>
+        <w:tc>
+          <w:tcPr>
+            <w:tcW w:w="2004" w:type="dxa"/>
+            <w:vAlign w:val="center"/>
+          </w:tcPr>
+          <w:p>
+            <w:pPr>
+              <w:rPr>
+                <w:rFonts w:ascii="Arial" w:hAnsi="Arial" w:cs="Arial"/>
+                <w:sz w:val="24"/>
+                <w:szCs w:val="24"/>
+              </w:rPr>
+            </w:pPr>
+            <w:r>
+              <w:rPr>
+                <w:rFonts w:ascii="Arial" w:hAnsi="Arial" w:cs="Arial"/>
+                <w:sz w:val="24"/>
+                <w:szCs w:val="24"/>
+              </w:rPr>
+              <w:t>Fernanda Álvarez</w:t>
+            </w:r>
+          </w:p>
+        </w:tc>
+        <w:tc>
+          <w:tcPr>
+            <w:tcW w:w="1150" w:type="dxa"/>
+            <w:vAlign w:val="center"/>
+          </w:tcPr>
+          <w:p>
+            <w:pPr>
+              <w:rPr>
+                <w:rFonts w:ascii="Arial" w:hAnsi="Arial" w:cs="Arial"/>
+                <w:sz w:val="24"/>
+                <w:szCs w:val="24"/>
+              </w:rPr>
+            </w:pPr>
+            <w:r>
+              <w:rPr>
+                <w:rFonts w:ascii="Arial" w:hAnsi="Arial" w:cs="Arial"/>
+                <w:sz w:val="24"/>
+                <w:szCs w:val="24"/>
+              </w:rPr>
+              <w:t>8:25 am</w:t>
+            </w:r>
+          </w:p>
+        </w:tc>
+        <w:tc>
+          <w:tcPr>
+            <w:tcW w:w="1535" w:type="dxa"/>
+            <w:vAlign w:val="center"/>
+          </w:tcPr>
+          <w:p>
+            <w:pPr>
+              <w:rPr>
+                <w:rFonts w:ascii="Arial" w:hAnsi="Arial" w:cs="Arial"/>
+                <w:sz w:val="24"/>
+                <w:szCs w:val="24"/>
+              </w:rPr>
+            </w:pPr>
+            <w:r>
+              <w:rPr>
+                <w:rFonts w:ascii="Arial" w:hAnsi="Arial" w:cs="Arial"/>
+                <w:sz w:val="24"/>
+                <w:szCs w:val="24"/>
+              </w:rPr>
+              <w:t>9:00</w:t>
+            </w:r>
+          </w:p>
+        </w:tc>
+        <w:tc>
+          <w:tcPr>
+            <w:tcW w:w="2480" w:type="dxa"/>
+            <w:vAlign w:val="center"/>
+          </w:tcPr>
+          <w:p>
+            <w:pPr>
+              <w:rPr>
+                <w:rFonts w:ascii="Arial" w:hAnsi="Arial" w:cs="Arial"/>
+                <w:sz w:val="24"/>
+                <w:szCs w:val="24"/>
+              </w:rPr>
+            </w:pPr>
+            <w:r>
+              <w:rPr>
+                <w:rFonts w:ascii="Arial" w:hAnsi="Arial" w:cs="Arial"/>
+                <w:sz w:val="24"/>
+                <w:szCs w:val="24"/>
+              </w:rPr>
+              <w:t>Completado</w:t>
+            </w:r>
+          </w:p>
+        </w:tc>
+      </w:tr>
+    </w:tbl>
+    <w:p/>
+    <w:p>
+      <w:pPr>
+        <w:pStyle w:val="titulo1"/>
+        <w:outlineLvl w:val="2"/>
+      </w:pPr>
+      <w:r>
+        <w:rPr>
+          <w:sz w:val="32"/>
+          <w:szCs w:val="32"/>
+        </w:rPr>
+        <w:lastRenderedPageBreak/>
+        <w:t>Gestión de Riesgos e Incidencias</w:t>
+      </w:r>
+    </w:p>
+    <w:tbl>
+      <w:tblPr>
+        <w:tblStyle w:val="Tablaconcuadrcula"/>
+        <w:tblW w:w="0" w:type="auto"/>
+        <w:jc w:val="center"/>
+        <w:tblBorders>
+          <w:top w:val="single" w:sz="4" w:space="0" w:color="7F7F7F" w:themeColor="text1" w:themeTint="80"/>
+          <w:left w:val="single" w:sz="4" w:space="0" w:color="7F7F7F" w:themeColor="text1" w:themeTint="80"/>
+          <w:bottom w:val="single" w:sz="4" w:space="0" w:color="7F7F7F" w:themeColor="text1" w:themeTint="80"/>
+          <w:right w:val="single" w:sz="4" w:space="0" w:color="7F7F7F" w:themeColor="text1" w:themeTint="80"/>
+          <w:insideH w:val="single" w:sz="4" w:space="0" w:color="7F7F7F" w:themeColor="text1" w:themeTint="80"/>
+          <w:insideV w:val="single" w:sz="4" w:space="0" w:color="7F7F7F" w:themeColor="text1" w:themeTint="80"/>
+        </w:tblBorders>
+        <w:tblLook w:val="04A0" w:firstRow="1" w:lastRow="0" w:firstColumn="1" w:lastColumn="0" w:noHBand="0" w:noVBand="1"/>
+      </w:tblPr>
+      <w:tblGrid>
+        <w:gridCol w:w="2834"/>
+        <w:gridCol w:w="2924"/>
+        <w:gridCol w:w="3592"/>
+      </w:tblGrid>
+      <w:tr>
+        <w:trPr>
+          <w:trHeight w:val="300"/>
+          <w:jc w:val="center"/>
+        </w:trPr>
+        <w:tc>
+          <w:tcPr>
+            <w:tcW w:w="2942" w:type="dxa"/>
+            <w:shd w:val="clear" w:color="auto" w:fill="262626" w:themeFill="text1" w:themeFillTint="D9"/>
+            <w:vAlign w:val="center"/>
+          </w:tcPr>
+          <w:p>
+            <w:pPr>
+              <w:jc w:val="center"/>
+              <w:rPr>
+                <w:rFonts w:ascii="Arial" w:hAnsi="Arial" w:cs="Arial"/>
+                <w:b/>
+                <w:bCs/>
+                <w:sz w:val="24"/>
+                <w:szCs w:val="24"/>
+              </w:rPr>
+            </w:pPr>
+            <w:r>
+              <w:rPr>
+                <w:rFonts w:ascii="Arial" w:hAnsi="Arial" w:cs="Arial"/>
+                <w:b/>
+                <w:bCs/>
+                <w:sz w:val="24"/>
+                <w:szCs w:val="24"/>
+              </w:rPr>
+              <w:t>Riesgo / Problema detectado</w:t>
+            </w:r>
+          </w:p>
+        </w:tc>
+        <w:tc>
+          <w:tcPr>
+            <w:tcW w:w="2943" w:type="dxa"/>
+            <w:shd w:val="clear" w:color="auto" w:fill="262626" w:themeFill="text1" w:themeFillTint="D9"/>
+            <w:vAlign w:val="center"/>
+          </w:tcPr>
+          <w:p>
+            <w:pPr>
+              <w:jc w:val="center"/>
+              <w:rPr>
+                <w:rFonts w:ascii="Arial" w:hAnsi="Arial" w:cs="Arial"/>
+                <w:b/>
+                <w:bCs/>
+                <w:sz w:val="24"/>
+                <w:szCs w:val="24"/>
+              </w:rPr>
+            </w:pPr>
+            <w:r>
+              <w:rPr>
+                <w:rFonts w:ascii="Arial" w:hAnsi="Arial" w:cs="Arial"/>
+                <w:b/>
+                <w:bCs/>
+                <w:sz w:val="24"/>
+                <w:szCs w:val="24"/>
+              </w:rPr>
+              <w:t>Impacto en alcance/tiempo/costo</w:t>
+            </w:r>
+          </w:p>
+        </w:tc>
+        <w:tc>
+          <w:tcPr>
+            <w:tcW w:w="3749" w:type="dxa"/>
+            <w:shd w:val="clear" w:color="auto" w:fill="262626" w:themeFill="text1" w:themeFillTint="D9"/>
+            <w:vAlign w:val="center"/>
+          </w:tcPr>
+          <w:p>
+            <w:pPr>
+              <w:jc w:val="center"/>
+              <w:rPr>
+                <w:rFonts w:ascii="Arial" w:hAnsi="Arial" w:cs="Arial"/>
+                <w:b/>
+                <w:bCs/>
+                <w:sz w:val="24"/>
+                <w:szCs w:val="24"/>
+              </w:rPr>
+            </w:pPr>
+            <w:r>
+              <w:rPr>
+                <w:rFonts w:ascii="Arial" w:hAnsi="Arial" w:cs="Arial"/>
+                <w:b/>
+                <w:bCs/>
+                <w:sz w:val="24"/>
+                <w:szCs w:val="24"/>
+              </w:rPr>
+              <w:t>Acción correctiva o preventiva</w:t>
+            </w:r>
+          </w:p>
+        </w:tc>
+      </w:tr>
+      <w:tr>
+        <w:trPr>
+          <w:trHeight w:val="300"/>
+          <w:jc w:val="center"/>
+        </w:trPr>
+        <w:tc>
+          <w:tcPr>
+            <w:tcW w:w="2942" w:type="dxa"/>
+            <w:vAlign w:val="center"/>
+          </w:tcPr>
+          <w:p>
+            <w:pPr>
+              <w:rPr>
+                <w:rFonts w:ascii="Arial" w:hAnsi="Arial" w:cs="Arial"/>
+                <w:sz w:val="24"/>
+                <w:szCs w:val="24"/>
+              </w:rPr>
+            </w:pPr>
+            <w:r>
+              <w:rPr>
+                <w:rFonts w:ascii="Arial" w:hAnsi="Arial" w:cs="Arial"/>
+                <w:sz w:val="24"/>
+                <w:szCs w:val="24"/>
+              </w:rPr>
+              <w:t>--</w:t>
+            </w:r>
+          </w:p>
+        </w:tc>
+        <w:tc>
+          <w:tcPr>
+            <w:tcW w:w="2943" w:type="dxa"/>
+            <w:vAlign w:val="center"/>
+          </w:tcPr>
+          <w:p>
+            <w:pPr>
+              <w:jc w:val="center"/>
+              <w:rPr>
+                <w:rFonts w:ascii="Arial" w:hAnsi="Arial" w:cs="Arial"/>
+                <w:sz w:val="24"/>
+                <w:szCs w:val="24"/>
+              </w:rPr>
+            </w:pPr>
+            <w:r>
+              <w:rPr>
+                <w:rFonts w:ascii="Arial" w:hAnsi="Arial" w:cs="Arial"/>
+                <w:sz w:val="24"/>
+                <w:szCs w:val="24"/>
+              </w:rPr>
+              <w:t>--</w:t>
+            </w:r>
+          </w:p>
+        </w:tc>
+        <w:tc>
+          <w:tcPr>
+            <w:tcW w:w="3749" w:type="dxa"/>
+            <w:vAlign w:val="center"/>
+          </w:tcPr>
+          <w:p>
+            <w:r>
+              <w:rPr>
+                <w:rFonts w:ascii="Arial" w:hAnsi="Arial" w:cs="Arial"/>
+                <w:sz w:val="24"/>
+                <w:szCs w:val="24"/>
+              </w:rPr>
+              <w:t>--</w:t>
+            </w:r>
+          </w:p>
+        </w:tc>
+      </w:tr>
+    </w:tbl>
+    <w:p/>
+    <w:p>
+      <w:r>
+        <w:br w:type="page"/>
+      </w:r>
+    </w:p>
+    <w:p/>
     <w:p>
       <w:pPr>
         <w:pStyle w:val="Ttulo0"/>
@@ -35770,7 +40140,6 @@
       </w:pPr>
       <w:bookmarkStart w:id="59" w:name="_Toc230158473"/>
       <w:r>
-        <w:lastRenderedPageBreak/>
         <w:t>Referencias</w:t>
       </w:r>
       <w:bookmarkEnd w:id="59"/>
@@ -39033,7 +43402,7 @@
   <w:style w:type="paragraph" w:default="1" w:styleId="Normal">
     <w:name w:val="Normal"/>
     <w:qFormat/>
-    <w:rsid w:val="00AD256B"/>
+    <w:rsid w:val="004705B6"/>
   </w:style>
   <w:style w:type="paragraph" w:styleId="Ttulo1">
     <w:name w:val="heading 1"/>

</xml_diff>